<commit_message>
Working through the standards
</commit_message>
<xml_diff>
--- a/StrategicTillage_GC_Analysis_workFlow.docx
+++ b/StrategicTillage_GC_Analysis_workFlow.docx
@@ -51,11 +51,9 @@
           <w:numId w:val="1"/>
         </w:numPr>
       </w:pPr>
-      <w:proofErr w:type="spellStart"/>
       <w:r>
         <w:t>GCAnalysis.R</w:t>
       </w:r>
-      <w:proofErr w:type="spellEnd"/>
     </w:p>
     <w:p>
       <w:pPr>
@@ -65,11 +63,9 @@
           <w:numId w:val="1"/>
         </w:numPr>
       </w:pPr>
-      <w:proofErr w:type="spellStart"/>
       <w:r>
         <w:t>HMR_Analysis.R</w:t>
       </w:r>
-      <w:proofErr w:type="spellEnd"/>
     </w:p>
     <w:p>
       <w:pPr>
@@ -91,11 +87,9 @@
           <w:numId w:val="1"/>
         </w:numPr>
       </w:pPr>
-      <w:proofErr w:type="spellStart"/>
       <w:r>
         <w:t>MassFluxCalculation.R</w:t>
       </w:r>
-      <w:proofErr w:type="spellEnd"/>
     </w:p>
     <w:p>
       <w:pPr>
@@ -105,11 +99,9 @@
           <w:numId w:val="1"/>
         </w:numPr>
       </w:pPr>
-      <w:proofErr w:type="spellStart"/>
       <w:r>
         <w:t>SoilGasFluxStatisticalAnalysis.R</w:t>
       </w:r>
-      <w:proofErr w:type="spellEnd"/>
     </w:p>
     <w:p>
       <w:r>
@@ -118,23 +110,7 @@
     </w:p>
     <w:p>
       <w:r>
-        <w:t xml:space="preserve">The N2O and CO2 emissions are too high.  The N2O emission measure calculated by Alli </w:t>
-      </w:r>
-      <w:proofErr w:type="gramStart"/>
-      <w:r>
-        <w:t>were</w:t>
-      </w:r>
-      <w:proofErr w:type="gramEnd"/>
-      <w:r>
-        <w:t xml:space="preserve"> around </w:t>
-      </w:r>
-      <w:proofErr w:type="gramStart"/>
-      <w:r>
-        <w:t>10  kg</w:t>
-      </w:r>
-      <w:proofErr w:type="gramEnd"/>
-      <w:r>
-        <w:t xml:space="preserve">-N/ha yr. </w:t>
+        <w:t xml:space="preserve">The N2O and CO2 emissions are too high.  The N2O emission measure calculated by Alli were around 10  kg-N/ha yr. </w:t>
       </w:r>
     </w:p>
     <w:p>
@@ -343,31 +319,7 @@
     </w:p>
     <w:p>
       <w:r>
-        <w:t xml:space="preserve">The calibration regression for the GC based on standards </w:t>
-      </w:r>
-      <w:proofErr w:type="gramStart"/>
-      <w:r>
-        <w:t>seem</w:t>
-      </w:r>
-      <w:proofErr w:type="gramEnd"/>
-      <w:r>
-        <w:t xml:space="preserve"> to be irrelevant, as the important aspect affecting the emissions is not the </w:t>
-      </w:r>
-      <w:proofErr w:type="gramStart"/>
-      <w:r>
-        <w:t>particular concentration</w:t>
-      </w:r>
-      <w:proofErr w:type="gramEnd"/>
-      <w:r>
-        <w:t xml:space="preserve"> data point, but the slope of the consequent concentration measurement inside the chamber that </w:t>
-      </w:r>
-      <w:proofErr w:type="gramStart"/>
-      <w:r>
-        <w:t>result</w:t>
-      </w:r>
-      <w:proofErr w:type="gramEnd"/>
-      <w:r>
-        <w:t xml:space="preserve"> in the emission rate.</w:t>
+        <w:t>The calibration regression for the GC based on standards seem to be irrelevant, as the important aspect affecting the emissions is not the particular concentration data point, but the slope of the consequent concentration measurement inside the chamber that result in the emission rate.</w:t>
       </w:r>
     </w:p>
     <w:p>
@@ -1361,15 +1313,7 @@
     <w:p/>
     <w:p>
       <w:r>
-        <w:t xml:space="preserve">Plotting the daily emissions (period emissions) against time </w:t>
-      </w:r>
-      <w:proofErr w:type="gramStart"/>
-      <w:r>
-        <w:t>it is clear that the</w:t>
-      </w:r>
-      <w:proofErr w:type="gramEnd"/>
-      <w:r>
-        <w:t xml:space="preserve"> main factor determining the higher emissions in blocks 1 and 2 are high N2O emission peaks. Those peaks are not present in blocks 3 and 4.</w:t>
+        <w:t>Plotting the daily emissions (period emissions) against time it is clear that the main factor determining the higher emissions in blocks 1 and 2 are high N2O emission peaks. Those peaks are not present in blocks 3 and 4.</w:t>
       </w:r>
     </w:p>
     <w:p/>
@@ -1603,7 +1547,6 @@
       <w:r>
         <w:t xml:space="preserve">In 2021, Sampling date </w:t>
       </w:r>
-      <w:proofErr w:type="gramStart"/>
       <w:r>
         <w:t>20210614</w:t>
       </w:r>
@@ -1611,42 +1554,22 @@
         <w:t xml:space="preserve">, </w:t>
       </w:r>
       <w:r>
-        <w:t xml:space="preserve"> and</w:t>
-      </w:r>
-      <w:proofErr w:type="gramEnd"/>
+        <w:t xml:space="preserve"> and </w:t>
+      </w:r>
+      <w:r>
+        <w:t>20210629</w:t>
+      </w:r>
       <w:r>
         <w:t xml:space="preserve"> </w:t>
       </w:r>
       <w:r>
-        <w:t>20210629</w:t>
+        <w:t>has problems:  The red points in the graph below all belong</w:t>
       </w:r>
       <w:r>
         <w:t xml:space="preserve"> </w:t>
       </w:r>
       <w:r>
-        <w:t>has problems</w:t>
-      </w:r>
-      <w:proofErr w:type="gramStart"/>
-      <w:r>
-        <w:t>:  The</w:t>
-      </w:r>
-      <w:proofErr w:type="gramEnd"/>
-      <w:r>
-        <w:t xml:space="preserve"> red points in the graph below all </w:t>
-      </w:r>
-      <w:proofErr w:type="gramStart"/>
-      <w:r>
-        <w:t>belong</w:t>
-      </w:r>
-      <w:r>
-        <w:t xml:space="preserve"> </w:t>
-      </w:r>
-      <w:r>
-        <w:t xml:space="preserve"> to</w:t>
-      </w:r>
-      <w:proofErr w:type="gramEnd"/>
-      <w:r>
-        <w:t xml:space="preserve"> sampling day </w:t>
+        <w:t xml:space="preserve"> to sampling day </w:t>
       </w:r>
       <w:r>
         <w:t>20210614</w:t>
@@ -1830,49 +1753,7 @@
         <w:rPr>
           <w:highlight w:val="yellow"/>
         </w:rPr>
-        <w:t xml:space="preserve">The final data for the mass flux calculations was taken from f0 and the missing data from “data error” from </w:t>
-      </w:r>
-      <w:proofErr w:type="gramStart"/>
-      <w:r>
-        <w:rPr>
-          <w:highlight w:val="yellow"/>
-        </w:rPr>
-        <w:t>LR.f</w:t>
-      </w:r>
-      <w:proofErr w:type="gramEnd"/>
-      <w:r>
-        <w:rPr>
-          <w:highlight w:val="yellow"/>
-        </w:rPr>
-        <w:t xml:space="preserve">0. For N2O and CH4 all the data </w:t>
-      </w:r>
-      <w:proofErr w:type="gramStart"/>
-      <w:r>
-        <w:rPr>
-          <w:highlight w:val="yellow"/>
-        </w:rPr>
-        <w:t>has to</w:t>
-      </w:r>
-      <w:proofErr w:type="gramEnd"/>
-      <w:r>
-        <w:rPr>
-          <w:highlight w:val="yellow"/>
-        </w:rPr>
-        <w:t xml:space="preserve"> come from </w:t>
-      </w:r>
-      <w:proofErr w:type="gramStart"/>
-      <w:r>
-        <w:rPr>
-          <w:highlight w:val="yellow"/>
-        </w:rPr>
-        <w:t>LR.f</w:t>
-      </w:r>
-      <w:proofErr w:type="gramEnd"/>
-      <w:r>
-        <w:rPr>
-          <w:highlight w:val="yellow"/>
-        </w:rPr>
-        <w:t>0.</w:t>
+        <w:t>The final data for the mass flux calculations was taken from f0 and the missing data from “data error” from LR.f0. For N2O and CH4 all the data has to come from LR.f0.</w:t>
       </w:r>
     </w:p>
     <w:p>
@@ -4234,7 +4115,6 @@
           <w14:ligatures w14:val="none"/>
         </w:rPr>
       </w:pPr>
-      <w:proofErr w:type="gramStart"/>
       <w:r>
         <w:rPr>
           <w:rFonts w:ascii="Lucida Console" w:eastAsia="Times New Roman" w:hAnsi="Lucida Console" w:cs="Courier New"/>
@@ -4244,32 +4124,7 @@
           <w:szCs w:val="20"/>
           <w14:ligatures w14:val="none"/>
         </w:rPr>
-        <w:t>summary(</w:t>
-      </w:r>
-      <w:proofErr w:type="spellStart"/>
-      <w:r>
-        <w:rPr>
-          <w:rFonts w:ascii="Lucida Console" w:eastAsia="Times New Roman" w:hAnsi="Lucida Console" w:cs="Courier New"/>
-          <w:color w:val="0000FF"/>
-          <w:kern w:val="0"/>
-          <w:sz w:val="20"/>
-          <w:szCs w:val="20"/>
-          <w14:ligatures w14:val="none"/>
-        </w:rPr>
-        <w:t>Cumm.Stat.Anal</w:t>
-      </w:r>
-      <w:proofErr w:type="spellEnd"/>
-      <w:proofErr w:type="gramEnd"/>
-      <w:r>
-        <w:rPr>
-          <w:rFonts w:ascii="Lucida Console" w:eastAsia="Times New Roman" w:hAnsi="Lucida Console" w:cs="Courier New"/>
-          <w:color w:val="0000FF"/>
-          <w:kern w:val="0"/>
-          <w:sz w:val="20"/>
-          <w:szCs w:val="20"/>
-          <w14:ligatures w14:val="none"/>
-        </w:rPr>
-        <w:t>)</w:t>
+        <w:t>summary(Cumm.Stat.Anal)</w:t>
       </w:r>
     </w:p>
     <w:p>
@@ -4385,8 +4240,6 @@
           <w14:ligatures w14:val="none"/>
         </w:rPr>
       </w:pPr>
-      <w:proofErr w:type="spellStart"/>
-      <w:proofErr w:type="gramStart"/>
       <w:r>
         <w:rPr>
           <w:rFonts w:ascii="Lucida Console" w:eastAsia="Times New Roman" w:hAnsi="Lucida Console" w:cs="Courier New"/>
@@ -4397,87 +4250,7 @@
           <w:bdr w:val="none" w:sz="0" w:space="0" w:color="auto" w:frame="1"/>
           <w14:ligatures w14:val="none"/>
         </w:rPr>
-        <w:t>lm</w:t>
-      </w:r>
-      <w:proofErr w:type="spellEnd"/>
-      <w:r>
-        <w:rPr>
-          <w:rFonts w:ascii="Lucida Console" w:eastAsia="Times New Roman" w:hAnsi="Lucida Console" w:cs="Courier New"/>
-          <w:color w:val="000000"/>
-          <w:kern w:val="0"/>
-          <w:sz w:val="20"/>
-          <w:szCs w:val="20"/>
-          <w:bdr w:val="none" w:sz="0" w:space="0" w:color="auto" w:frame="1"/>
-          <w14:ligatures w14:val="none"/>
-        </w:rPr>
-        <w:t>(</w:t>
-      </w:r>
-      <w:proofErr w:type="gramEnd"/>
-      <w:r>
-        <w:rPr>
-          <w:rFonts w:ascii="Lucida Console" w:eastAsia="Times New Roman" w:hAnsi="Lucida Console" w:cs="Courier New"/>
-          <w:color w:val="000000"/>
-          <w:kern w:val="0"/>
-          <w:sz w:val="20"/>
-          <w:szCs w:val="20"/>
-          <w:bdr w:val="none" w:sz="0" w:space="0" w:color="auto" w:frame="1"/>
-          <w14:ligatures w14:val="none"/>
-        </w:rPr>
-        <w:t xml:space="preserve">formula = </w:t>
-      </w:r>
-      <w:proofErr w:type="spellStart"/>
-      <w:proofErr w:type="gramStart"/>
-      <w:r>
-        <w:rPr>
-          <w:rFonts w:ascii="Lucida Console" w:eastAsia="Times New Roman" w:hAnsi="Lucida Console" w:cs="Courier New"/>
-          <w:color w:val="000000"/>
-          <w:kern w:val="0"/>
-          <w:sz w:val="20"/>
-          <w:szCs w:val="20"/>
-          <w:bdr w:val="none" w:sz="0" w:space="0" w:color="auto" w:frame="1"/>
-          <w14:ligatures w14:val="none"/>
-        </w:rPr>
-        <w:t>Total.Cum.Emissions</w:t>
-      </w:r>
-      <w:proofErr w:type="spellEnd"/>
-      <w:proofErr w:type="gramEnd"/>
-      <w:r>
-        <w:rPr>
-          <w:rFonts w:ascii="Lucida Console" w:eastAsia="Times New Roman" w:hAnsi="Lucida Console" w:cs="Courier New"/>
-          <w:color w:val="000000"/>
-          <w:kern w:val="0"/>
-          <w:sz w:val="20"/>
-          <w:szCs w:val="20"/>
-          <w:bdr w:val="none" w:sz="0" w:space="0" w:color="auto" w:frame="1"/>
-          <w14:ligatures w14:val="none"/>
-        </w:rPr>
-        <w:t xml:space="preserve"> ~ BLOCK.F + </w:t>
-      </w:r>
-      <w:proofErr w:type="spellStart"/>
-      <w:r>
-        <w:rPr>
-          <w:rFonts w:ascii="Lucida Console" w:eastAsia="Times New Roman" w:hAnsi="Lucida Console" w:cs="Courier New"/>
-          <w:color w:val="000000"/>
-          <w:kern w:val="0"/>
-          <w:sz w:val="20"/>
-          <w:szCs w:val="20"/>
-          <w:bdr w:val="none" w:sz="0" w:space="0" w:color="auto" w:frame="1"/>
-          <w14:ligatures w14:val="none"/>
-        </w:rPr>
-        <w:t>Sampling.Year</w:t>
-      </w:r>
-      <w:proofErr w:type="spellEnd"/>
-      <w:r>
-        <w:rPr>
-          <w:rFonts w:ascii="Lucida Console" w:eastAsia="Times New Roman" w:hAnsi="Lucida Console" w:cs="Courier New"/>
-          <w:color w:val="000000"/>
-          <w:kern w:val="0"/>
-          <w:sz w:val="20"/>
-          <w:szCs w:val="20"/>
-          <w:bdr w:val="none" w:sz="0" w:space="0" w:color="auto" w:frame="1"/>
-          <w14:ligatures w14:val="none"/>
-        </w:rPr>
-        <w:t xml:space="preserve"> + </w:t>
+        <w:t xml:space="preserve">lm(formula = Total.Cum.Emissions ~ BLOCK.F + Sampling.Year + </w:t>
       </w:r>
     </w:p>
     <w:p>
@@ -4523,85 +4296,7 @@
           <w:bdr w:val="none" w:sz="0" w:space="0" w:color="auto" w:frame="1"/>
           <w14:ligatures w14:val="none"/>
         </w:rPr>
-        <w:t xml:space="preserve">    </w:t>
-      </w:r>
-      <w:proofErr w:type="spellStart"/>
-      <w:r>
-        <w:rPr>
-          <w:rFonts w:ascii="Lucida Console" w:eastAsia="Times New Roman" w:hAnsi="Lucida Console" w:cs="Courier New"/>
-          <w:color w:val="000000"/>
-          <w:kern w:val="0"/>
-          <w:sz w:val="20"/>
-          <w:szCs w:val="20"/>
-          <w:bdr w:val="none" w:sz="0" w:space="0" w:color="auto" w:frame="1"/>
-          <w14:ligatures w14:val="none"/>
-        </w:rPr>
-        <w:t>CoverCrop.F</w:t>
-      </w:r>
-      <w:proofErr w:type="spellEnd"/>
-      <w:r>
-        <w:rPr>
-          <w:rFonts w:ascii="Lucida Console" w:eastAsia="Times New Roman" w:hAnsi="Lucida Console" w:cs="Courier New"/>
-          <w:color w:val="000000"/>
-          <w:kern w:val="0"/>
-          <w:sz w:val="20"/>
-          <w:szCs w:val="20"/>
-          <w:bdr w:val="none" w:sz="0" w:space="0" w:color="auto" w:frame="1"/>
-          <w14:ligatures w14:val="none"/>
-        </w:rPr>
-        <w:t xml:space="preserve"> + </w:t>
-      </w:r>
-      <w:proofErr w:type="spellStart"/>
-      <w:r>
-        <w:rPr>
-          <w:rFonts w:ascii="Lucida Console" w:eastAsia="Times New Roman" w:hAnsi="Lucida Console" w:cs="Courier New"/>
-          <w:color w:val="000000"/>
-          <w:kern w:val="0"/>
-          <w:sz w:val="20"/>
-          <w:szCs w:val="20"/>
-          <w:bdr w:val="none" w:sz="0" w:space="0" w:color="auto" w:frame="1"/>
-          <w14:ligatures w14:val="none"/>
-        </w:rPr>
-        <w:t>Treatment.F</w:t>
-      </w:r>
-      <w:proofErr w:type="spellEnd"/>
-      <w:r>
-        <w:rPr>
-          <w:rFonts w:ascii="Lucida Console" w:eastAsia="Times New Roman" w:hAnsi="Lucida Console" w:cs="Courier New"/>
-          <w:color w:val="000000"/>
-          <w:kern w:val="0"/>
-          <w:sz w:val="20"/>
-          <w:szCs w:val="20"/>
-          <w:bdr w:val="none" w:sz="0" w:space="0" w:color="auto" w:frame="1"/>
-          <w14:ligatures w14:val="none"/>
-        </w:rPr>
-        <w:t xml:space="preserve">, data = </w:t>
-      </w:r>
-      <w:proofErr w:type="gramStart"/>
-      <w:r>
-        <w:rPr>
-          <w:rFonts w:ascii="Lucida Console" w:eastAsia="Times New Roman" w:hAnsi="Lucida Console" w:cs="Courier New"/>
-          <w:color w:val="000000"/>
-          <w:kern w:val="0"/>
-          <w:sz w:val="20"/>
-          <w:szCs w:val="20"/>
-          <w:bdr w:val="none" w:sz="0" w:space="0" w:color="auto" w:frame="1"/>
-          <w14:ligatures w14:val="none"/>
-        </w:rPr>
-        <w:t>Cumm.Emm.Analysis</w:t>
-      </w:r>
-      <w:proofErr w:type="gramEnd"/>
-      <w:r>
-        <w:rPr>
-          <w:rFonts w:ascii="Lucida Console" w:eastAsia="Times New Roman" w:hAnsi="Lucida Console" w:cs="Courier New"/>
-          <w:color w:val="000000"/>
-          <w:kern w:val="0"/>
-          <w:sz w:val="20"/>
-          <w:szCs w:val="20"/>
-          <w:bdr w:val="none" w:sz="0" w:space="0" w:color="auto" w:frame="1"/>
-          <w14:ligatures w14:val="none"/>
-        </w:rPr>
-        <w:t>.2)</w:t>
+        <w:t xml:space="preserve">    CoverCrop.F + Treatment.F, data = Cumm.Emm.Analysis.2)</w:t>
       </w:r>
     </w:p>
     <w:p>
@@ -4727,33 +4422,7 @@
           <w:bdr w:val="none" w:sz="0" w:space="0" w:color="auto" w:frame="1"/>
           <w14:ligatures w14:val="none"/>
         </w:rPr>
-        <w:t xml:space="preserve">    Min      1</w:t>
-      </w:r>
-      <w:proofErr w:type="gramStart"/>
-      <w:r>
-        <w:rPr>
-          <w:rFonts w:ascii="Lucida Console" w:eastAsia="Times New Roman" w:hAnsi="Lucida Console" w:cs="Courier New"/>
-          <w:color w:val="000000"/>
-          <w:kern w:val="0"/>
-          <w:sz w:val="20"/>
-          <w:szCs w:val="20"/>
-          <w:bdr w:val="none" w:sz="0" w:space="0" w:color="auto" w:frame="1"/>
-          <w14:ligatures w14:val="none"/>
-        </w:rPr>
-        <w:t>Q  Median</w:t>
-      </w:r>
-      <w:proofErr w:type="gramEnd"/>
-      <w:r>
-        <w:rPr>
-          <w:rFonts w:ascii="Lucida Console" w:eastAsia="Times New Roman" w:hAnsi="Lucida Console" w:cs="Courier New"/>
-          <w:color w:val="000000"/>
-          <w:kern w:val="0"/>
-          <w:sz w:val="20"/>
-          <w:szCs w:val="20"/>
-          <w:bdr w:val="none" w:sz="0" w:space="0" w:color="auto" w:frame="1"/>
-          <w14:ligatures w14:val="none"/>
-        </w:rPr>
-        <w:t xml:space="preserve">      3Q     Max </w:t>
+        <w:t xml:space="preserve">    Min      1Q  Median      3Q     Max </w:t>
       </w:r>
     </w:p>
     <w:p>
@@ -4799,85 +4468,7 @@
           <w:bdr w:val="none" w:sz="0" w:space="0" w:color="auto" w:frame="1"/>
           <w14:ligatures w14:val="none"/>
         </w:rPr>
-        <w:t>-21.</w:t>
-      </w:r>
-      <w:proofErr w:type="gramStart"/>
-      <w:r>
-        <w:rPr>
-          <w:rFonts w:ascii="Lucida Console" w:eastAsia="Times New Roman" w:hAnsi="Lucida Console" w:cs="Courier New"/>
-          <w:color w:val="000000"/>
-          <w:kern w:val="0"/>
-          <w:sz w:val="20"/>
-          <w:szCs w:val="20"/>
-          <w:bdr w:val="none" w:sz="0" w:space="0" w:color="auto" w:frame="1"/>
-          <w14:ligatures w14:val="none"/>
-        </w:rPr>
-        <w:t>204  -</w:t>
-      </w:r>
-      <w:proofErr w:type="gramEnd"/>
-      <w:r>
-        <w:rPr>
-          <w:rFonts w:ascii="Lucida Console" w:eastAsia="Times New Roman" w:hAnsi="Lucida Console" w:cs="Courier New"/>
-          <w:color w:val="000000"/>
-          <w:kern w:val="0"/>
-          <w:sz w:val="20"/>
-          <w:szCs w:val="20"/>
-          <w:bdr w:val="none" w:sz="0" w:space="0" w:color="auto" w:frame="1"/>
-          <w14:ligatures w14:val="none"/>
-        </w:rPr>
-        <w:t>7.</w:t>
-      </w:r>
-      <w:proofErr w:type="gramStart"/>
-      <w:r>
-        <w:rPr>
-          <w:rFonts w:ascii="Lucida Console" w:eastAsia="Times New Roman" w:hAnsi="Lucida Console" w:cs="Courier New"/>
-          <w:color w:val="000000"/>
-          <w:kern w:val="0"/>
-          <w:sz w:val="20"/>
-          <w:szCs w:val="20"/>
-          <w:bdr w:val="none" w:sz="0" w:space="0" w:color="auto" w:frame="1"/>
-          <w14:ligatures w14:val="none"/>
-        </w:rPr>
-        <w:t>452  -</w:t>
-      </w:r>
-      <w:proofErr w:type="gramEnd"/>
-      <w:r>
-        <w:rPr>
-          <w:rFonts w:ascii="Lucida Console" w:eastAsia="Times New Roman" w:hAnsi="Lucida Console" w:cs="Courier New"/>
-          <w:color w:val="000000"/>
-          <w:kern w:val="0"/>
-          <w:sz w:val="20"/>
-          <w:szCs w:val="20"/>
-          <w:bdr w:val="none" w:sz="0" w:space="0" w:color="auto" w:frame="1"/>
-          <w14:ligatures w14:val="none"/>
-        </w:rPr>
-        <w:t xml:space="preserve">0.579   </w:t>
-      </w:r>
-      <w:proofErr w:type="gramStart"/>
-      <w:r>
-        <w:rPr>
-          <w:rFonts w:ascii="Lucida Console" w:eastAsia="Times New Roman" w:hAnsi="Lucida Console" w:cs="Courier New"/>
-          <w:color w:val="000000"/>
-          <w:kern w:val="0"/>
-          <w:sz w:val="20"/>
-          <w:szCs w:val="20"/>
-          <w:bdr w:val="none" w:sz="0" w:space="0" w:color="auto" w:frame="1"/>
-          <w14:ligatures w14:val="none"/>
-        </w:rPr>
-        <w:t>4.777  41.906</w:t>
-      </w:r>
-      <w:proofErr w:type="gramEnd"/>
-      <w:r>
-        <w:rPr>
-          <w:rFonts w:ascii="Lucida Console" w:eastAsia="Times New Roman" w:hAnsi="Lucida Console" w:cs="Courier New"/>
-          <w:color w:val="000000"/>
-          <w:kern w:val="0"/>
-          <w:sz w:val="20"/>
-          <w:szCs w:val="20"/>
-          <w:bdr w:val="none" w:sz="0" w:space="0" w:color="auto" w:frame="1"/>
-          <w14:ligatures w14:val="none"/>
-        </w:rPr>
-        <w:t xml:space="preserve"> </w:t>
+        <w:t xml:space="preserve">-21.204  -7.452  -0.579   4.777  41.906 </w:t>
       </w:r>
     </w:p>
     <w:p>
@@ -5003,33 +4594,7 @@
           <w:bdr w:val="none" w:sz="0" w:space="0" w:color="auto" w:frame="1"/>
           <w14:ligatures w14:val="none"/>
         </w:rPr>
-        <w:t xml:space="preserve">                  Estimate Std. Error t value </w:t>
-      </w:r>
-      <w:proofErr w:type="spellStart"/>
-      <w:r>
-        <w:rPr>
-          <w:rFonts w:ascii="Lucida Console" w:eastAsia="Times New Roman" w:hAnsi="Lucida Console" w:cs="Courier New"/>
-          <w:color w:val="000000"/>
-          <w:kern w:val="0"/>
-          <w:sz w:val="20"/>
-          <w:szCs w:val="20"/>
-          <w:bdr w:val="none" w:sz="0" w:space="0" w:color="auto" w:frame="1"/>
-          <w14:ligatures w14:val="none"/>
-        </w:rPr>
-        <w:t>Pr</w:t>
-      </w:r>
-      <w:proofErr w:type="spellEnd"/>
-      <w:r>
-        <w:rPr>
-          <w:rFonts w:ascii="Lucida Console" w:eastAsia="Times New Roman" w:hAnsi="Lucida Console" w:cs="Courier New"/>
-          <w:color w:val="000000"/>
-          <w:kern w:val="0"/>
-          <w:sz w:val="20"/>
-          <w:szCs w:val="20"/>
-          <w:bdr w:val="none" w:sz="0" w:space="0" w:color="auto" w:frame="1"/>
-          <w14:ligatures w14:val="none"/>
-        </w:rPr>
-        <w:t xml:space="preserve">(&gt;|t|)    </w:t>
+        <w:t xml:space="preserve">                  Estimate Std. Error t value Pr(&gt;|t|)    </w:t>
       </w:r>
     </w:p>
     <w:p>
@@ -5075,59 +4640,7 @@
           <w:bdr w:val="none" w:sz="0" w:space="0" w:color="auto" w:frame="1"/>
           <w14:ligatures w14:val="none"/>
         </w:rPr>
-        <w:t>(</w:t>
-      </w:r>
-      <w:proofErr w:type="gramStart"/>
-      <w:r>
-        <w:rPr>
-          <w:rFonts w:ascii="Lucida Console" w:eastAsia="Times New Roman" w:hAnsi="Lucida Console" w:cs="Courier New"/>
-          <w:color w:val="000000"/>
-          <w:kern w:val="0"/>
-          <w:sz w:val="20"/>
-          <w:szCs w:val="20"/>
-          <w:bdr w:val="none" w:sz="0" w:space="0" w:color="auto" w:frame="1"/>
-          <w14:ligatures w14:val="none"/>
-        </w:rPr>
-        <w:t xml:space="preserve">Intercept)   </w:t>
-      </w:r>
-      <w:proofErr w:type="gramEnd"/>
-      <w:r>
-        <w:rPr>
-          <w:rFonts w:ascii="Lucida Console" w:eastAsia="Times New Roman" w:hAnsi="Lucida Console" w:cs="Courier New"/>
-          <w:color w:val="000000"/>
-          <w:kern w:val="0"/>
-          <w:sz w:val="20"/>
-          <w:szCs w:val="20"/>
-          <w:bdr w:val="none" w:sz="0" w:space="0" w:color="auto" w:frame="1"/>
-          <w14:ligatures w14:val="none"/>
-        </w:rPr>
-        <w:t xml:space="preserve">     17.9614     3.9252   4.576 </w:t>
-      </w:r>
-      <w:proofErr w:type="gramStart"/>
-      <w:r>
-        <w:rPr>
-          <w:rFonts w:ascii="Lucida Console" w:eastAsia="Times New Roman" w:hAnsi="Lucida Console" w:cs="Courier New"/>
-          <w:color w:val="000000"/>
-          <w:kern w:val="0"/>
-          <w:sz w:val="20"/>
-          <w:szCs w:val="20"/>
-          <w:bdr w:val="none" w:sz="0" w:space="0" w:color="auto" w:frame="1"/>
-          <w14:ligatures w14:val="none"/>
-        </w:rPr>
-        <w:t xml:space="preserve">   2e</w:t>
-      </w:r>
-      <w:proofErr w:type="gramEnd"/>
-      <w:r>
-        <w:rPr>
-          <w:rFonts w:ascii="Lucida Console" w:eastAsia="Times New Roman" w:hAnsi="Lucida Console" w:cs="Courier New"/>
-          <w:color w:val="000000"/>
-          <w:kern w:val="0"/>
-          <w:sz w:val="20"/>
-          <w:szCs w:val="20"/>
-          <w:bdr w:val="none" w:sz="0" w:space="0" w:color="auto" w:frame="1"/>
-          <w14:ligatures w14:val="none"/>
-        </w:rPr>
-        <w:t>-05 ***</w:t>
+        <w:t>(Intercept)        17.9614     3.9252   4.576    2e-05 ***</w:t>
       </w:r>
     </w:p>
     <w:p>
@@ -5219,33 +4732,7 @@
           <w:bdr w:val="none" w:sz="0" w:space="0" w:color="auto" w:frame="1"/>
           <w14:ligatures w14:val="none"/>
         </w:rPr>
-        <w:t xml:space="preserve">BLOCK.F3          -14.7355     </w:t>
-      </w:r>
-      <w:proofErr w:type="gramStart"/>
-      <w:r>
-        <w:rPr>
-          <w:rFonts w:ascii="Lucida Console" w:eastAsia="Times New Roman" w:hAnsi="Lucida Console" w:cs="Courier New"/>
-          <w:color w:val="000000"/>
-          <w:kern w:val="0"/>
-          <w:sz w:val="20"/>
-          <w:szCs w:val="20"/>
-          <w:bdr w:val="none" w:sz="0" w:space="0" w:color="auto" w:frame="1"/>
-          <w14:ligatures w14:val="none"/>
-        </w:rPr>
-        <w:t>3.5916  -</w:t>
-      </w:r>
-      <w:proofErr w:type="gramEnd"/>
-      <w:r>
-        <w:rPr>
-          <w:rFonts w:ascii="Lucida Console" w:eastAsia="Times New Roman" w:hAnsi="Lucida Console" w:cs="Courier New"/>
-          <w:color w:val="000000"/>
-          <w:kern w:val="0"/>
-          <w:sz w:val="20"/>
-          <w:szCs w:val="20"/>
-          <w:bdr w:val="none" w:sz="0" w:space="0" w:color="auto" w:frame="1"/>
-          <w14:ligatures w14:val="none"/>
-        </w:rPr>
-        <w:t>4.103 0.000109 ***</w:t>
+        <w:t>BLOCK.F3          -14.7355     3.5916  -4.103 0.000109 ***</w:t>
       </w:r>
     </w:p>
     <w:p>
@@ -5291,33 +4778,7 @@
           <w:bdr w:val="none" w:sz="0" w:space="0" w:color="auto" w:frame="1"/>
           <w14:ligatures w14:val="none"/>
         </w:rPr>
-        <w:t xml:space="preserve">BLOCK.F4          -12.3094     </w:t>
-      </w:r>
-      <w:proofErr w:type="gramStart"/>
-      <w:r>
-        <w:rPr>
-          <w:rFonts w:ascii="Lucida Console" w:eastAsia="Times New Roman" w:hAnsi="Lucida Console" w:cs="Courier New"/>
-          <w:color w:val="000000"/>
-          <w:kern w:val="0"/>
-          <w:sz w:val="20"/>
-          <w:szCs w:val="20"/>
-          <w:bdr w:val="none" w:sz="0" w:space="0" w:color="auto" w:frame="1"/>
-          <w14:ligatures w14:val="none"/>
-        </w:rPr>
-        <w:t>3.5916  -</w:t>
-      </w:r>
-      <w:proofErr w:type="gramEnd"/>
-      <w:r>
-        <w:rPr>
-          <w:rFonts w:ascii="Lucida Console" w:eastAsia="Times New Roman" w:hAnsi="Lucida Console" w:cs="Courier New"/>
-          <w:color w:val="000000"/>
-          <w:kern w:val="0"/>
-          <w:sz w:val="20"/>
-          <w:szCs w:val="20"/>
-          <w:bdr w:val="none" w:sz="0" w:space="0" w:color="auto" w:frame="1"/>
-          <w14:ligatures w14:val="none"/>
-        </w:rPr>
-        <w:t xml:space="preserve">3.427 0.001025 ** </w:t>
+        <w:t xml:space="preserve">BLOCK.F4          -12.3094     3.5916  -3.427 0.001025 ** </w:t>
       </w:r>
     </w:p>
     <w:p>
@@ -5363,59 +4824,7 @@
           <w:bdr w:val="none" w:sz="0" w:space="0" w:color="auto" w:frame="1"/>
           <w14:ligatures w14:val="none"/>
         </w:rPr>
-        <w:t>Sampling.Year</w:t>
-      </w:r>
-      <w:proofErr w:type="gramStart"/>
-      <w:r>
-        <w:rPr>
-          <w:rFonts w:ascii="Lucida Console" w:eastAsia="Times New Roman" w:hAnsi="Lucida Console" w:cs="Courier New"/>
-          <w:color w:val="000000"/>
-          <w:kern w:val="0"/>
-          <w:sz w:val="20"/>
-          <w:szCs w:val="20"/>
-          <w:bdr w:val="none" w:sz="0" w:space="0" w:color="auto" w:frame="1"/>
-          <w14:ligatures w14:val="none"/>
-        </w:rPr>
-        <w:t>2022  -</w:t>
-      </w:r>
-      <w:proofErr w:type="gramEnd"/>
-      <w:r>
-        <w:rPr>
-          <w:rFonts w:ascii="Lucida Console" w:eastAsia="Times New Roman" w:hAnsi="Lucida Console" w:cs="Courier New"/>
-          <w:color w:val="000000"/>
-          <w:kern w:val="0"/>
-          <w:sz w:val="20"/>
-          <w:szCs w:val="20"/>
-          <w:bdr w:val="none" w:sz="0" w:space="0" w:color="auto" w:frame="1"/>
-          <w14:ligatures w14:val="none"/>
-        </w:rPr>
-        <w:t xml:space="preserve">9.7553     </w:t>
-      </w:r>
-      <w:proofErr w:type="gramStart"/>
-      <w:r>
-        <w:rPr>
-          <w:rFonts w:ascii="Lucida Console" w:eastAsia="Times New Roman" w:hAnsi="Lucida Console" w:cs="Courier New"/>
-          <w:color w:val="000000"/>
-          <w:kern w:val="0"/>
-          <w:sz w:val="20"/>
-          <w:szCs w:val="20"/>
-          <w:bdr w:val="none" w:sz="0" w:space="0" w:color="auto" w:frame="1"/>
-          <w14:ligatures w14:val="none"/>
-        </w:rPr>
-        <w:t>2.5396  -</w:t>
-      </w:r>
-      <w:proofErr w:type="gramEnd"/>
-      <w:r>
-        <w:rPr>
-          <w:rFonts w:ascii="Lucida Console" w:eastAsia="Times New Roman" w:hAnsi="Lucida Console" w:cs="Courier New"/>
-          <w:color w:val="000000"/>
-          <w:kern w:val="0"/>
-          <w:sz w:val="20"/>
-          <w:szCs w:val="20"/>
-          <w:bdr w:val="none" w:sz="0" w:space="0" w:color="auto" w:frame="1"/>
-          <w14:ligatures w14:val="none"/>
-        </w:rPr>
-        <w:t>3.841 0.000266 ***</w:t>
+        <w:t>Sampling.Year2022  -9.7553     2.5396  -3.841 0.000266 ***</w:t>
       </w:r>
     </w:p>
     <w:p>
@@ -5451,7 +4860,6 @@
           <w14:ligatures w14:val="none"/>
         </w:rPr>
       </w:pPr>
-      <w:proofErr w:type="spellStart"/>
       <w:r>
         <w:rPr>
           <w:rFonts w:ascii="Lucida Console" w:eastAsia="Times New Roman" w:hAnsi="Lucida Console" w:cs="Courier New"/>
@@ -5462,20 +4870,7 @@
           <w:bdr w:val="none" w:sz="0" w:space="0" w:color="auto" w:frame="1"/>
           <w14:ligatures w14:val="none"/>
         </w:rPr>
-        <w:t>CoverCrop.FClover</w:t>
-      </w:r>
-      <w:proofErr w:type="spellEnd"/>
-      <w:r>
-        <w:rPr>
-          <w:rFonts w:ascii="Lucida Console" w:eastAsia="Times New Roman" w:hAnsi="Lucida Console" w:cs="Courier New"/>
-          <w:color w:val="000000"/>
-          <w:kern w:val="0"/>
-          <w:sz w:val="20"/>
-          <w:szCs w:val="20"/>
-          <w:bdr w:val="none" w:sz="0" w:space="0" w:color="auto" w:frame="1"/>
-          <w14:ligatures w14:val="none"/>
-        </w:rPr>
-        <w:t xml:space="preserve">   3.1667     3.2786   0.966 0.337437    </w:t>
+        <w:t xml:space="preserve">CoverCrop.FClover   3.1667     3.2786   0.966 0.337437    </w:t>
       </w:r>
     </w:p>
     <w:p>
@@ -5511,7 +4906,6 @@
           <w14:ligatures w14:val="none"/>
         </w:rPr>
       </w:pPr>
-      <w:proofErr w:type="spellStart"/>
       <w:r>
         <w:rPr>
           <w:rFonts w:ascii="Lucida Console" w:eastAsia="Times New Roman" w:hAnsi="Lucida Console" w:cs="Courier New"/>
@@ -5522,46 +4916,7 @@
           <w:bdr w:val="none" w:sz="0" w:space="0" w:color="auto" w:frame="1"/>
           <w14:ligatures w14:val="none"/>
         </w:rPr>
-        <w:t>CoverCrop.FTrit</w:t>
-      </w:r>
-      <w:proofErr w:type="spellEnd"/>
-      <w:r>
-        <w:rPr>
-          <w:rFonts w:ascii="Lucida Console" w:eastAsia="Times New Roman" w:hAnsi="Lucida Console" w:cs="Courier New"/>
-          <w:color w:val="000000"/>
-          <w:kern w:val="0"/>
-          <w:sz w:val="20"/>
-          <w:szCs w:val="20"/>
-          <w:bdr w:val="none" w:sz="0" w:space="0" w:color="auto" w:frame="1"/>
-          <w14:ligatures w14:val="none"/>
-        </w:rPr>
-        <w:t xml:space="preserve">    -0.4087     </w:t>
-      </w:r>
-      <w:proofErr w:type="gramStart"/>
-      <w:r>
-        <w:rPr>
-          <w:rFonts w:ascii="Lucida Console" w:eastAsia="Times New Roman" w:hAnsi="Lucida Console" w:cs="Courier New"/>
-          <w:color w:val="000000"/>
-          <w:kern w:val="0"/>
-          <w:sz w:val="20"/>
-          <w:szCs w:val="20"/>
-          <w:bdr w:val="none" w:sz="0" w:space="0" w:color="auto" w:frame="1"/>
-          <w14:ligatures w14:val="none"/>
-        </w:rPr>
-        <w:t>3.2786  -</w:t>
-      </w:r>
-      <w:proofErr w:type="gramEnd"/>
-      <w:r>
-        <w:rPr>
-          <w:rFonts w:ascii="Lucida Console" w:eastAsia="Times New Roman" w:hAnsi="Lucida Console" w:cs="Courier New"/>
-          <w:color w:val="000000"/>
-          <w:kern w:val="0"/>
-          <w:sz w:val="20"/>
-          <w:szCs w:val="20"/>
-          <w:bdr w:val="none" w:sz="0" w:space="0" w:color="auto" w:frame="1"/>
-          <w14:ligatures w14:val="none"/>
-        </w:rPr>
-        <w:t xml:space="preserve">0.125 0.901165    </w:t>
+        <w:t xml:space="preserve">CoverCrop.FTrit    -0.4087     3.2786  -0.125 0.901165    </w:t>
       </w:r>
     </w:p>
     <w:p>
@@ -5597,7 +4952,6 @@
           <w14:ligatures w14:val="none"/>
         </w:rPr>
       </w:pPr>
-      <w:proofErr w:type="spellStart"/>
       <w:r>
         <w:rPr>
           <w:rFonts w:ascii="Lucida Console" w:eastAsia="Times New Roman" w:hAnsi="Lucida Console" w:cs="Courier New"/>
@@ -5608,46 +4962,7 @@
           <w:bdr w:val="none" w:sz="0" w:space="0" w:color="auto" w:frame="1"/>
           <w14:ligatures w14:val="none"/>
         </w:rPr>
-        <w:t>Treatment.FB</w:t>
-      </w:r>
-      <w:proofErr w:type="spellEnd"/>
-      <w:r>
-        <w:rPr>
-          <w:rFonts w:ascii="Lucida Console" w:eastAsia="Times New Roman" w:hAnsi="Lucida Console" w:cs="Courier New"/>
-          <w:color w:val="000000"/>
-          <w:kern w:val="0"/>
-          <w:sz w:val="20"/>
-          <w:szCs w:val="20"/>
-          <w:bdr w:val="none" w:sz="0" w:space="0" w:color="auto" w:frame="1"/>
-          <w14:ligatures w14:val="none"/>
-        </w:rPr>
-        <w:t xml:space="preserve">        6.2892     3.2786   1.918 0.</w:t>
-      </w:r>
-      <w:proofErr w:type="gramStart"/>
-      <w:r>
-        <w:rPr>
-          <w:rFonts w:ascii="Lucida Console" w:eastAsia="Times New Roman" w:hAnsi="Lucida Console" w:cs="Courier New"/>
-          <w:color w:val="000000"/>
-          <w:kern w:val="0"/>
-          <w:sz w:val="20"/>
-          <w:szCs w:val="20"/>
-          <w:bdr w:val="none" w:sz="0" w:space="0" w:color="auto" w:frame="1"/>
-          <w14:ligatures w14:val="none"/>
-        </w:rPr>
-        <w:t>059162 .</w:t>
-      </w:r>
-      <w:proofErr w:type="gramEnd"/>
-      <w:r>
-        <w:rPr>
-          <w:rFonts w:ascii="Lucida Console" w:eastAsia="Times New Roman" w:hAnsi="Lucida Console" w:cs="Courier New"/>
-          <w:color w:val="000000"/>
-          <w:kern w:val="0"/>
-          <w:sz w:val="20"/>
-          <w:szCs w:val="20"/>
-          <w:bdr w:val="none" w:sz="0" w:space="0" w:color="auto" w:frame="1"/>
-          <w14:ligatures w14:val="none"/>
-        </w:rPr>
-        <w:t xml:space="preserve">  </w:t>
+        <w:t xml:space="preserve">Treatment.FB        6.2892     3.2786   1.918 0.059162 .  </w:t>
       </w:r>
     </w:p>
     <w:p>
@@ -5683,7 +4998,6 @@
           <w14:ligatures w14:val="none"/>
         </w:rPr>
       </w:pPr>
-      <w:proofErr w:type="spellStart"/>
       <w:r>
         <w:rPr>
           <w:rFonts w:ascii="Lucida Console" w:eastAsia="Times New Roman" w:hAnsi="Lucida Console" w:cs="Courier New"/>
@@ -5694,20 +5008,7 @@
           <w:bdr w:val="none" w:sz="0" w:space="0" w:color="auto" w:frame="1"/>
           <w14:ligatures w14:val="none"/>
         </w:rPr>
-        <w:t>Treatment.FC</w:t>
-      </w:r>
-      <w:proofErr w:type="spellEnd"/>
-      <w:r>
-        <w:rPr>
-          <w:rFonts w:ascii="Lucida Console" w:eastAsia="Times New Roman" w:hAnsi="Lucida Console" w:cs="Courier New"/>
-          <w:color w:val="000000"/>
-          <w:kern w:val="0"/>
-          <w:sz w:val="20"/>
-          <w:szCs w:val="20"/>
-          <w:bdr w:val="none" w:sz="0" w:space="0" w:color="auto" w:frame="1"/>
-          <w14:ligatures w14:val="none"/>
-        </w:rPr>
-        <w:t xml:space="preserve">        4.1102     3.2786   1.254 0.214146    </w:t>
+        <w:t xml:space="preserve">Treatment.FC        4.1102     3.2786   1.254 0.214146    </w:t>
       </w:r>
     </w:p>
     <w:p>
@@ -5743,7 +5044,6 @@
           <w14:ligatures w14:val="none"/>
         </w:rPr>
       </w:pPr>
-      <w:proofErr w:type="spellStart"/>
       <w:r>
         <w:rPr>
           <w:rFonts w:ascii="Lucida Console" w:eastAsia="Times New Roman" w:hAnsi="Lucida Console" w:cs="Courier New"/>
@@ -5754,46 +5054,7 @@
           <w:bdr w:val="none" w:sz="0" w:space="0" w:color="auto" w:frame="1"/>
           <w14:ligatures w14:val="none"/>
         </w:rPr>
-        <w:t>Treatment.FD</w:t>
-      </w:r>
-      <w:proofErr w:type="spellEnd"/>
-      <w:r>
-        <w:rPr>
-          <w:rFonts w:ascii="Lucida Console" w:eastAsia="Times New Roman" w:hAnsi="Lucida Console" w:cs="Courier New"/>
-          <w:color w:val="000000"/>
-          <w:kern w:val="0"/>
-          <w:sz w:val="20"/>
-          <w:szCs w:val="20"/>
-          <w:bdr w:val="none" w:sz="0" w:space="0" w:color="auto" w:frame="1"/>
-          <w14:ligatures w14:val="none"/>
-        </w:rPr>
-        <w:t xml:space="preserve">       -0.8080     </w:t>
-      </w:r>
-      <w:proofErr w:type="gramStart"/>
-      <w:r>
-        <w:rPr>
-          <w:rFonts w:ascii="Lucida Console" w:eastAsia="Times New Roman" w:hAnsi="Lucida Console" w:cs="Courier New"/>
-          <w:color w:val="000000"/>
-          <w:kern w:val="0"/>
-          <w:sz w:val="20"/>
-          <w:szCs w:val="20"/>
-          <w:bdr w:val="none" w:sz="0" w:space="0" w:color="auto" w:frame="1"/>
-          <w14:ligatures w14:val="none"/>
-        </w:rPr>
-        <w:t>5.0082  -</w:t>
-      </w:r>
-      <w:proofErr w:type="gramEnd"/>
-      <w:r>
-        <w:rPr>
-          <w:rFonts w:ascii="Lucida Console" w:eastAsia="Times New Roman" w:hAnsi="Lucida Console" w:cs="Courier New"/>
-          <w:color w:val="000000"/>
-          <w:kern w:val="0"/>
-          <w:sz w:val="20"/>
-          <w:szCs w:val="20"/>
-          <w:bdr w:val="none" w:sz="0" w:space="0" w:color="auto" w:frame="1"/>
-          <w14:ligatures w14:val="none"/>
-        </w:rPr>
-        <w:t xml:space="preserve">0.161 0.872300    </w:t>
+        <w:t xml:space="preserve">Treatment.FD       -0.8080     5.0082  -0.161 0.872300    </w:t>
       </w:r>
     </w:p>
     <w:p>
@@ -5875,7 +5136,6 @@
           <w14:ligatures w14:val="none"/>
         </w:rPr>
       </w:pPr>
-      <w:proofErr w:type="spellStart"/>
       <w:r>
         <w:rPr>
           <w:rFonts w:ascii="Lucida Console" w:eastAsia="Times New Roman" w:hAnsi="Lucida Console" w:cs="Courier New"/>
@@ -5886,124 +5146,7 @@
           <w:bdr w:val="none" w:sz="0" w:space="0" w:color="auto" w:frame="1"/>
           <w14:ligatures w14:val="none"/>
         </w:rPr>
-        <w:t>Signif</w:t>
-      </w:r>
-      <w:proofErr w:type="spellEnd"/>
-      <w:r>
-        <w:rPr>
-          <w:rFonts w:ascii="Lucida Console" w:eastAsia="Times New Roman" w:hAnsi="Lucida Console" w:cs="Courier New"/>
-          <w:color w:val="000000"/>
-          <w:kern w:val="0"/>
-          <w:sz w:val="20"/>
-          <w:szCs w:val="20"/>
-          <w:bdr w:val="none" w:sz="0" w:space="0" w:color="auto" w:frame="1"/>
-          <w14:ligatures w14:val="none"/>
-        </w:rPr>
-        <w:t>. codes</w:t>
-      </w:r>
-      <w:proofErr w:type="gramStart"/>
-      <w:r>
-        <w:rPr>
-          <w:rFonts w:ascii="Lucida Console" w:eastAsia="Times New Roman" w:hAnsi="Lucida Console" w:cs="Courier New"/>
-          <w:color w:val="000000"/>
-          <w:kern w:val="0"/>
-          <w:sz w:val="20"/>
-          <w:szCs w:val="20"/>
-          <w:bdr w:val="none" w:sz="0" w:space="0" w:color="auto" w:frame="1"/>
-          <w14:ligatures w14:val="none"/>
-        </w:rPr>
-        <w:t>:  0 ‘</w:t>
-      </w:r>
-      <w:proofErr w:type="gramEnd"/>
-      <w:r>
-        <w:rPr>
-          <w:rFonts w:ascii="Lucida Console" w:eastAsia="Times New Roman" w:hAnsi="Lucida Console" w:cs="Courier New"/>
-          <w:color w:val="000000"/>
-          <w:kern w:val="0"/>
-          <w:sz w:val="20"/>
-          <w:szCs w:val="20"/>
-          <w:bdr w:val="none" w:sz="0" w:space="0" w:color="auto" w:frame="1"/>
-          <w14:ligatures w14:val="none"/>
-        </w:rPr>
-        <w:t xml:space="preserve">***’ </w:t>
-      </w:r>
-      <w:proofErr w:type="gramStart"/>
-      <w:r>
-        <w:rPr>
-          <w:rFonts w:ascii="Lucida Console" w:eastAsia="Times New Roman" w:hAnsi="Lucida Console" w:cs="Courier New"/>
-          <w:color w:val="000000"/>
-          <w:kern w:val="0"/>
-          <w:sz w:val="20"/>
-          <w:szCs w:val="20"/>
-          <w:bdr w:val="none" w:sz="0" w:space="0" w:color="auto" w:frame="1"/>
-          <w14:ligatures w14:val="none"/>
-        </w:rPr>
-        <w:t>0.001 ‘*</w:t>
-      </w:r>
-      <w:proofErr w:type="gramEnd"/>
-      <w:r>
-        <w:rPr>
-          <w:rFonts w:ascii="Lucida Console" w:eastAsia="Times New Roman" w:hAnsi="Lucida Console" w:cs="Courier New"/>
-          <w:color w:val="000000"/>
-          <w:kern w:val="0"/>
-          <w:sz w:val="20"/>
-          <w:szCs w:val="20"/>
-          <w:bdr w:val="none" w:sz="0" w:space="0" w:color="auto" w:frame="1"/>
-          <w14:ligatures w14:val="none"/>
-        </w:rPr>
-        <w:t xml:space="preserve">*’ </w:t>
-      </w:r>
-      <w:proofErr w:type="gramStart"/>
-      <w:r>
-        <w:rPr>
-          <w:rFonts w:ascii="Lucida Console" w:eastAsia="Times New Roman" w:hAnsi="Lucida Console" w:cs="Courier New"/>
-          <w:color w:val="000000"/>
-          <w:kern w:val="0"/>
-          <w:sz w:val="20"/>
-          <w:szCs w:val="20"/>
-          <w:bdr w:val="none" w:sz="0" w:space="0" w:color="auto" w:frame="1"/>
-          <w14:ligatures w14:val="none"/>
-        </w:rPr>
-        <w:t>0.01 ‘*</w:t>
-      </w:r>
-      <w:proofErr w:type="gramEnd"/>
-      <w:r>
-        <w:rPr>
-          <w:rFonts w:ascii="Lucida Console" w:eastAsia="Times New Roman" w:hAnsi="Lucida Console" w:cs="Courier New"/>
-          <w:color w:val="000000"/>
-          <w:kern w:val="0"/>
-          <w:sz w:val="20"/>
-          <w:szCs w:val="20"/>
-          <w:bdr w:val="none" w:sz="0" w:space="0" w:color="auto" w:frame="1"/>
-          <w14:ligatures w14:val="none"/>
-        </w:rPr>
-        <w:t xml:space="preserve">’ 0.05 ‘.’ 0.1 </w:t>
-      </w:r>
-      <w:proofErr w:type="gramStart"/>
-      <w:r>
-        <w:rPr>
-          <w:rFonts w:ascii="Lucida Console" w:eastAsia="Times New Roman" w:hAnsi="Lucida Console" w:cs="Courier New"/>
-          <w:color w:val="000000"/>
-          <w:kern w:val="0"/>
-          <w:sz w:val="20"/>
-          <w:szCs w:val="20"/>
-          <w:bdr w:val="none" w:sz="0" w:space="0" w:color="auto" w:frame="1"/>
-          <w14:ligatures w14:val="none"/>
-        </w:rPr>
-        <w:t>‘ ’</w:t>
-      </w:r>
-      <w:proofErr w:type="gramEnd"/>
-      <w:r>
-        <w:rPr>
-          <w:rFonts w:ascii="Lucida Console" w:eastAsia="Times New Roman" w:hAnsi="Lucida Console" w:cs="Courier New"/>
-          <w:color w:val="000000"/>
-          <w:kern w:val="0"/>
-          <w:sz w:val="20"/>
-          <w:szCs w:val="20"/>
-          <w:bdr w:val="none" w:sz="0" w:space="0" w:color="auto" w:frame="1"/>
-          <w14:ligatures w14:val="none"/>
-        </w:rPr>
-        <w:t xml:space="preserve"> 1</w:t>
+        <w:t>Signif. codes:  0 ‘***’ 0.001 ‘**’ 0.01 ‘*’ 0.05 ‘.’ 0.1 ‘ ’ 1</w:t>
       </w:r>
     </w:p>
     <w:p>
@@ -6188,33 +5331,7 @@
           <w:bdr w:val="none" w:sz="0" w:space="0" w:color="auto" w:frame="1"/>
           <w14:ligatures w14:val="none"/>
         </w:rPr>
-        <w:t xml:space="preserve">F-statistic: 5.883 on 9 and 70 </w:t>
-      </w:r>
-      <w:proofErr w:type="gramStart"/>
-      <w:r>
-        <w:rPr>
-          <w:rFonts w:ascii="Lucida Console" w:eastAsia="Times New Roman" w:hAnsi="Lucida Console" w:cs="Courier New"/>
-          <w:color w:val="000000"/>
-          <w:kern w:val="0"/>
-          <w:sz w:val="20"/>
-          <w:szCs w:val="20"/>
-          <w:bdr w:val="none" w:sz="0" w:space="0" w:color="auto" w:frame="1"/>
-          <w14:ligatures w14:val="none"/>
-        </w:rPr>
-        <w:t>DF,  p</w:t>
-      </w:r>
-      <w:proofErr w:type="gramEnd"/>
-      <w:r>
-        <w:rPr>
-          <w:rFonts w:ascii="Lucida Console" w:eastAsia="Times New Roman" w:hAnsi="Lucida Console" w:cs="Courier New"/>
-          <w:color w:val="000000"/>
-          <w:kern w:val="0"/>
-          <w:sz w:val="20"/>
-          <w:szCs w:val="20"/>
-          <w:bdr w:val="none" w:sz="0" w:space="0" w:color="auto" w:frame="1"/>
-          <w14:ligatures w14:val="none"/>
-        </w:rPr>
-        <w:t>-value: 4.438e-06</w:t>
+        <w:t>F-statistic: 5.883 on 9 and 70 DF,  p-value: 4.438e-06</w:t>
       </w:r>
     </w:p>
     <w:p>
@@ -6296,43 +5413,13 @@
           <w:color w:val="0000FF"/>
         </w:rPr>
       </w:pPr>
-      <w:proofErr w:type="spellStart"/>
-      <w:proofErr w:type="gramStart"/>
       <w:r>
         <w:rPr>
           <w:rStyle w:val="gnvwddmdb3b"/>
           <w:rFonts w:ascii="Lucida Console" w:hAnsi="Lucida Console"/>
           <w:color w:val="0000FF"/>
         </w:rPr>
-        <w:t>anova</w:t>
-      </w:r>
-      <w:proofErr w:type="spellEnd"/>
-      <w:r>
-        <w:rPr>
-          <w:rStyle w:val="gnvwddmdb3b"/>
-          <w:rFonts w:ascii="Lucida Console" w:hAnsi="Lucida Console"/>
-          <w:color w:val="0000FF"/>
-        </w:rPr>
-        <w:t>(</w:t>
-      </w:r>
-      <w:proofErr w:type="spellStart"/>
-      <w:r>
-        <w:rPr>
-          <w:rStyle w:val="gnvwddmdb3b"/>
-          <w:rFonts w:ascii="Lucida Console" w:hAnsi="Lucida Console"/>
-          <w:color w:val="0000FF"/>
-        </w:rPr>
-        <w:t>Cumm.Stat.Anal</w:t>
-      </w:r>
-      <w:proofErr w:type="spellEnd"/>
-      <w:proofErr w:type="gramEnd"/>
-      <w:r>
-        <w:rPr>
-          <w:rStyle w:val="gnvwddmdb3b"/>
-          <w:rFonts w:ascii="Lucida Console" w:hAnsi="Lucida Console"/>
-          <w:color w:val="0000FF"/>
-        </w:rPr>
-        <w:t>)</w:t>
+        <w:t>anova(Cumm.Stat.Anal)</w:t>
       </w:r>
     </w:p>
     <w:p>
@@ -6389,21 +5476,30 @@
           <w:color w:val="000000"/>
           <w:bdr w:val="none" w:sz="0" w:space="0" w:color="auto" w:frame="1"/>
         </w:rPr>
-        <w:t xml:space="preserve">Response: </w:t>
-      </w:r>
-      <w:proofErr w:type="spellStart"/>
-      <w:proofErr w:type="gramStart"/>
-      <w:r>
+        <w:t>Response: Total.Cum.Emissions</w:t>
+      </w:r>
+    </w:p>
+    <w:p>
+      <w:pPr>
+        <w:pStyle w:val="HTMLPreformatted"/>
+        <w:shd w:val="clear" w:color="auto" w:fill="FFFFFF"/>
+        <w:wordWrap w:val="0"/>
         <w:rPr>
           <w:rStyle w:val="gnvwddmdl3b"/>
           <w:rFonts w:ascii="Lucida Console" w:hAnsi="Lucida Console"/>
           <w:color w:val="000000"/>
           <w:bdr w:val="none" w:sz="0" w:space="0" w:color="auto" w:frame="1"/>
         </w:rPr>
-        <w:t>Total.Cum.Emissions</w:t>
-      </w:r>
-      <w:proofErr w:type="spellEnd"/>
-      <w:proofErr w:type="gramEnd"/>
+      </w:pPr>
+      <w:r>
+        <w:rPr>
+          <w:rStyle w:val="gnvwddmdl3b"/>
+          <w:rFonts w:ascii="Lucida Console" w:hAnsi="Lucida Console"/>
+          <w:color w:val="000000"/>
+          <w:bdr w:val="none" w:sz="0" w:space="0" w:color="auto" w:frame="1"/>
+        </w:rPr>
+        <w:t xml:space="preserve">              Df Sum Sq Mean Sq F value    Pr(&gt;F)    </w:t>
+      </w:r>
     </w:p>
     <w:p>
       <w:pPr>
@@ -6424,19 +5520,21 @@
           <w:color w:val="000000"/>
           <w:bdr w:val="none" w:sz="0" w:space="0" w:color="auto" w:frame="1"/>
         </w:rPr>
-        <w:t xml:space="preserve">              </w:t>
-      </w:r>
-      <w:proofErr w:type="spellStart"/>
-      <w:r>
+        <w:t>BLOCK.F        3 4224.0 1408.01 10.9154 5.752e-06 ***</w:t>
+      </w:r>
+    </w:p>
+    <w:p>
+      <w:pPr>
+        <w:pStyle w:val="HTMLPreformatted"/>
+        <w:shd w:val="clear" w:color="auto" w:fill="FFFFFF"/>
+        <w:wordWrap w:val="0"/>
         <w:rPr>
           <w:rStyle w:val="gnvwddmdl3b"/>
           <w:rFonts w:ascii="Lucida Console" w:hAnsi="Lucida Console"/>
           <w:color w:val="000000"/>
           <w:bdr w:val="none" w:sz="0" w:space="0" w:color="auto" w:frame="1"/>
         </w:rPr>
-        <w:t>Df</w:t>
-      </w:r>
-      <w:proofErr w:type="spellEnd"/>
+      </w:pPr>
       <w:r>
         <w:rPr>
           <w:rStyle w:val="gnvwddmdl3b"/>
@@ -6444,19 +5542,21 @@
           <w:color w:val="000000"/>
           <w:bdr w:val="none" w:sz="0" w:space="0" w:color="auto" w:frame="1"/>
         </w:rPr>
-        <w:t xml:space="preserve"> Sum Sq Mean Sq F </w:t>
-      </w:r>
-      <w:proofErr w:type="gramStart"/>
-      <w:r>
+        <w:t>Sampling.Year  1 1903.3 1903.32 14.7553 0.0002661 ***</w:t>
+      </w:r>
+    </w:p>
+    <w:p>
+      <w:pPr>
+        <w:pStyle w:val="HTMLPreformatted"/>
+        <w:shd w:val="clear" w:color="auto" w:fill="FFFFFF"/>
+        <w:wordWrap w:val="0"/>
         <w:rPr>
           <w:rStyle w:val="gnvwddmdl3b"/>
           <w:rFonts w:ascii="Lucida Console" w:hAnsi="Lucida Console"/>
           <w:color w:val="000000"/>
           <w:bdr w:val="none" w:sz="0" w:space="0" w:color="auto" w:frame="1"/>
         </w:rPr>
-        <w:t>value</w:t>
-      </w:r>
-      <w:proofErr w:type="gramEnd"/>
+      </w:pPr>
       <w:r>
         <w:rPr>
           <w:rStyle w:val="gnvwddmdl3b"/>
@@ -6464,19 +5564,21 @@
           <w:color w:val="000000"/>
           <w:bdr w:val="none" w:sz="0" w:space="0" w:color="auto" w:frame="1"/>
         </w:rPr>
-        <w:t xml:space="preserve">    </w:t>
-      </w:r>
-      <w:proofErr w:type="spellStart"/>
-      <w:r>
+        <w:t xml:space="preserve">CoverCrop.F    2  103.8   51.89  0.4023 0.6703176    </w:t>
+      </w:r>
+    </w:p>
+    <w:p>
+      <w:pPr>
+        <w:pStyle w:val="HTMLPreformatted"/>
+        <w:shd w:val="clear" w:color="auto" w:fill="FFFFFF"/>
+        <w:wordWrap w:val="0"/>
         <w:rPr>
           <w:rStyle w:val="gnvwddmdl3b"/>
           <w:rFonts w:ascii="Lucida Console" w:hAnsi="Lucida Console"/>
           <w:color w:val="000000"/>
           <w:bdr w:val="none" w:sz="0" w:space="0" w:color="auto" w:frame="1"/>
         </w:rPr>
-        <w:t>Pr</w:t>
-      </w:r>
-      <w:proofErr w:type="spellEnd"/>
+      </w:pPr>
       <w:r>
         <w:rPr>
           <w:rStyle w:val="gnvwddmdl3b"/>
@@ -6484,7 +5586,7 @@
           <w:color w:val="000000"/>
           <w:bdr w:val="none" w:sz="0" w:space="0" w:color="auto" w:frame="1"/>
         </w:rPr>
-        <w:t xml:space="preserve">(&gt;F)    </w:t>
+        <w:t xml:space="preserve">Treatment.F    3  599.2  199.73  1.5484 0.2096975    </w:t>
       </w:r>
     </w:p>
     <w:p>
@@ -6506,7 +5608,7 @@
           <w:color w:val="000000"/>
           <w:bdr w:val="none" w:sz="0" w:space="0" w:color="auto" w:frame="1"/>
         </w:rPr>
-        <w:t>BLOCK.F        3 4224.0 1408.01 10.9154 5.752e-06 ***</w:t>
+        <w:t xml:space="preserve">Residuals     70 9029.5  128.99                      </w:t>
       </w:r>
     </w:p>
     <w:p>
@@ -6521,8 +5623,6 @@
           <w:bdr w:val="none" w:sz="0" w:space="0" w:color="auto" w:frame="1"/>
         </w:rPr>
       </w:pPr>
-      <w:proofErr w:type="spellStart"/>
-      <w:proofErr w:type="gramStart"/>
       <w:r>
         <w:rPr>
           <w:rStyle w:val="gnvwddmdl3b"/>
@@ -6530,9 +5630,19 @@
           <w:color w:val="000000"/>
           <w:bdr w:val="none" w:sz="0" w:space="0" w:color="auto" w:frame="1"/>
         </w:rPr>
-        <w:t>Sampling.Year</w:t>
-      </w:r>
-      <w:proofErr w:type="spellEnd"/>
+        <w:t>---</w:t>
+      </w:r>
+    </w:p>
+    <w:p>
+      <w:pPr>
+        <w:pStyle w:val="HTMLPreformatted"/>
+        <w:shd w:val="clear" w:color="auto" w:fill="FFFFFF"/>
+        <w:wordWrap w:val="0"/>
+        <w:rPr>
+          <w:rFonts w:ascii="Lucida Console" w:hAnsi="Lucida Console"/>
+          <w:color w:val="000000"/>
+        </w:rPr>
+      </w:pPr>
       <w:r>
         <w:rPr>
           <w:rStyle w:val="gnvwddmdl3b"/>
@@ -6540,338 +5650,7 @@
           <w:color w:val="000000"/>
           <w:bdr w:val="none" w:sz="0" w:space="0" w:color="auto" w:frame="1"/>
         </w:rPr>
-        <w:t xml:space="preserve">  1</w:t>
-      </w:r>
-      <w:proofErr w:type="gramEnd"/>
-      <w:r>
-        <w:rPr>
-          <w:rStyle w:val="gnvwddmdl3b"/>
-          <w:rFonts w:ascii="Lucida Console" w:hAnsi="Lucida Console"/>
-          <w:color w:val="000000"/>
-          <w:bdr w:val="none" w:sz="0" w:space="0" w:color="auto" w:frame="1"/>
-        </w:rPr>
-        <w:t xml:space="preserve"> 1903.3 1903.32 14.7553 0.0002661 ***</w:t>
-      </w:r>
-    </w:p>
-    <w:p>
-      <w:pPr>
-        <w:pStyle w:val="HTMLPreformatted"/>
-        <w:shd w:val="clear" w:color="auto" w:fill="FFFFFF"/>
-        <w:wordWrap w:val="0"/>
-        <w:rPr>
-          <w:rStyle w:val="gnvwddmdl3b"/>
-          <w:rFonts w:ascii="Lucida Console" w:hAnsi="Lucida Console"/>
-          <w:color w:val="000000"/>
-          <w:bdr w:val="none" w:sz="0" w:space="0" w:color="auto" w:frame="1"/>
-        </w:rPr>
-      </w:pPr>
-      <w:proofErr w:type="spellStart"/>
-      <w:r>
-        <w:rPr>
-          <w:rStyle w:val="gnvwddmdl3b"/>
-          <w:rFonts w:ascii="Lucida Console" w:hAnsi="Lucida Console"/>
-          <w:color w:val="000000"/>
-          <w:bdr w:val="none" w:sz="0" w:space="0" w:color="auto" w:frame="1"/>
-        </w:rPr>
-        <w:t>CoverCrop.F</w:t>
-      </w:r>
-      <w:proofErr w:type="spellEnd"/>
-      <w:r>
-        <w:rPr>
-          <w:rStyle w:val="gnvwddmdl3b"/>
-          <w:rFonts w:ascii="Lucida Console" w:hAnsi="Lucida Console"/>
-          <w:color w:val="000000"/>
-          <w:bdr w:val="none" w:sz="0" w:space="0" w:color="auto" w:frame="1"/>
-        </w:rPr>
-        <w:t xml:space="preserve">    </w:t>
-      </w:r>
-      <w:proofErr w:type="gramStart"/>
-      <w:r>
-        <w:rPr>
-          <w:rStyle w:val="gnvwddmdl3b"/>
-          <w:rFonts w:ascii="Lucida Console" w:hAnsi="Lucida Console"/>
-          <w:color w:val="000000"/>
-          <w:bdr w:val="none" w:sz="0" w:space="0" w:color="auto" w:frame="1"/>
-        </w:rPr>
-        <w:t>2  103.8</w:t>
-      </w:r>
-      <w:proofErr w:type="gramEnd"/>
-      <w:r>
-        <w:rPr>
-          <w:rStyle w:val="gnvwddmdl3b"/>
-          <w:rFonts w:ascii="Lucida Console" w:hAnsi="Lucida Console"/>
-          <w:color w:val="000000"/>
-          <w:bdr w:val="none" w:sz="0" w:space="0" w:color="auto" w:frame="1"/>
-        </w:rPr>
-        <w:t xml:space="preserve">   </w:t>
-      </w:r>
-      <w:proofErr w:type="gramStart"/>
-      <w:r>
-        <w:rPr>
-          <w:rStyle w:val="gnvwddmdl3b"/>
-          <w:rFonts w:ascii="Lucida Console" w:hAnsi="Lucida Console"/>
-          <w:color w:val="000000"/>
-          <w:bdr w:val="none" w:sz="0" w:space="0" w:color="auto" w:frame="1"/>
-        </w:rPr>
-        <w:t>51.89  0.4023</w:t>
-      </w:r>
-      <w:proofErr w:type="gramEnd"/>
-      <w:r>
-        <w:rPr>
-          <w:rStyle w:val="gnvwddmdl3b"/>
-          <w:rFonts w:ascii="Lucida Console" w:hAnsi="Lucida Console"/>
-          <w:color w:val="000000"/>
-          <w:bdr w:val="none" w:sz="0" w:space="0" w:color="auto" w:frame="1"/>
-        </w:rPr>
-        <w:t xml:space="preserve"> 0.6703176    </w:t>
-      </w:r>
-    </w:p>
-    <w:p>
-      <w:pPr>
-        <w:pStyle w:val="HTMLPreformatted"/>
-        <w:shd w:val="clear" w:color="auto" w:fill="FFFFFF"/>
-        <w:wordWrap w:val="0"/>
-        <w:rPr>
-          <w:rStyle w:val="gnvwddmdl3b"/>
-          <w:rFonts w:ascii="Lucida Console" w:hAnsi="Lucida Console"/>
-          <w:color w:val="000000"/>
-          <w:bdr w:val="none" w:sz="0" w:space="0" w:color="auto" w:frame="1"/>
-        </w:rPr>
-      </w:pPr>
-      <w:proofErr w:type="spellStart"/>
-      <w:r>
-        <w:rPr>
-          <w:rStyle w:val="gnvwddmdl3b"/>
-          <w:rFonts w:ascii="Lucida Console" w:hAnsi="Lucida Console"/>
-          <w:color w:val="000000"/>
-          <w:bdr w:val="none" w:sz="0" w:space="0" w:color="auto" w:frame="1"/>
-        </w:rPr>
-        <w:t>Treatment.F</w:t>
-      </w:r>
-      <w:proofErr w:type="spellEnd"/>
-      <w:r>
-        <w:rPr>
-          <w:rStyle w:val="gnvwddmdl3b"/>
-          <w:rFonts w:ascii="Lucida Console" w:hAnsi="Lucida Console"/>
-          <w:color w:val="000000"/>
-          <w:bdr w:val="none" w:sz="0" w:space="0" w:color="auto" w:frame="1"/>
-        </w:rPr>
-        <w:t xml:space="preserve">    </w:t>
-      </w:r>
-      <w:proofErr w:type="gramStart"/>
-      <w:r>
-        <w:rPr>
-          <w:rStyle w:val="gnvwddmdl3b"/>
-          <w:rFonts w:ascii="Lucida Console" w:hAnsi="Lucida Console"/>
-          <w:color w:val="000000"/>
-          <w:bdr w:val="none" w:sz="0" w:space="0" w:color="auto" w:frame="1"/>
-        </w:rPr>
-        <w:t>3  599.2</w:t>
-      </w:r>
-      <w:proofErr w:type="gramEnd"/>
-      <w:r>
-        <w:rPr>
-          <w:rStyle w:val="gnvwddmdl3b"/>
-          <w:rFonts w:ascii="Lucida Console" w:hAnsi="Lucida Console"/>
-          <w:color w:val="000000"/>
-          <w:bdr w:val="none" w:sz="0" w:space="0" w:color="auto" w:frame="1"/>
-        </w:rPr>
-        <w:t xml:space="preserve">  </w:t>
-      </w:r>
-      <w:proofErr w:type="gramStart"/>
-      <w:r>
-        <w:rPr>
-          <w:rStyle w:val="gnvwddmdl3b"/>
-          <w:rFonts w:ascii="Lucida Console" w:hAnsi="Lucida Console"/>
-          <w:color w:val="000000"/>
-          <w:bdr w:val="none" w:sz="0" w:space="0" w:color="auto" w:frame="1"/>
-        </w:rPr>
-        <w:t>199.73  1.5484</w:t>
-      </w:r>
-      <w:proofErr w:type="gramEnd"/>
-      <w:r>
-        <w:rPr>
-          <w:rStyle w:val="gnvwddmdl3b"/>
-          <w:rFonts w:ascii="Lucida Console" w:hAnsi="Lucida Console"/>
-          <w:color w:val="000000"/>
-          <w:bdr w:val="none" w:sz="0" w:space="0" w:color="auto" w:frame="1"/>
-        </w:rPr>
-        <w:t xml:space="preserve"> 0.2096975    </w:t>
-      </w:r>
-    </w:p>
-    <w:p>
-      <w:pPr>
-        <w:pStyle w:val="HTMLPreformatted"/>
-        <w:shd w:val="clear" w:color="auto" w:fill="FFFFFF"/>
-        <w:wordWrap w:val="0"/>
-        <w:rPr>
-          <w:rStyle w:val="gnvwddmdl3b"/>
-          <w:rFonts w:ascii="Lucida Console" w:hAnsi="Lucida Console"/>
-          <w:color w:val="000000"/>
-          <w:bdr w:val="none" w:sz="0" w:space="0" w:color="auto" w:frame="1"/>
-        </w:rPr>
-      </w:pPr>
-      <w:r>
-        <w:rPr>
-          <w:rStyle w:val="gnvwddmdl3b"/>
-          <w:rFonts w:ascii="Lucida Console" w:hAnsi="Lucida Console"/>
-          <w:color w:val="000000"/>
-          <w:bdr w:val="none" w:sz="0" w:space="0" w:color="auto" w:frame="1"/>
-        </w:rPr>
-        <w:t xml:space="preserve">Residuals     70 </w:t>
-      </w:r>
-      <w:proofErr w:type="gramStart"/>
-      <w:r>
-        <w:rPr>
-          <w:rStyle w:val="gnvwddmdl3b"/>
-          <w:rFonts w:ascii="Lucida Console" w:hAnsi="Lucida Console"/>
-          <w:color w:val="000000"/>
-          <w:bdr w:val="none" w:sz="0" w:space="0" w:color="auto" w:frame="1"/>
-        </w:rPr>
-        <w:t>9029.5  128.99</w:t>
-      </w:r>
-      <w:proofErr w:type="gramEnd"/>
-      <w:r>
-        <w:rPr>
-          <w:rStyle w:val="gnvwddmdl3b"/>
-          <w:rFonts w:ascii="Lucida Console" w:hAnsi="Lucida Console"/>
-          <w:color w:val="000000"/>
-          <w:bdr w:val="none" w:sz="0" w:space="0" w:color="auto" w:frame="1"/>
-        </w:rPr>
-        <w:t xml:space="preserve">                      </w:t>
-      </w:r>
-    </w:p>
-    <w:p>
-      <w:pPr>
-        <w:pStyle w:val="HTMLPreformatted"/>
-        <w:shd w:val="clear" w:color="auto" w:fill="FFFFFF"/>
-        <w:wordWrap w:val="0"/>
-        <w:rPr>
-          <w:rStyle w:val="gnvwddmdl3b"/>
-          <w:rFonts w:ascii="Lucida Console" w:hAnsi="Lucida Console"/>
-          <w:color w:val="000000"/>
-          <w:bdr w:val="none" w:sz="0" w:space="0" w:color="auto" w:frame="1"/>
-        </w:rPr>
-      </w:pPr>
-      <w:r>
-        <w:rPr>
-          <w:rStyle w:val="gnvwddmdl3b"/>
-          <w:rFonts w:ascii="Lucida Console" w:hAnsi="Lucida Console"/>
-          <w:color w:val="000000"/>
-          <w:bdr w:val="none" w:sz="0" w:space="0" w:color="auto" w:frame="1"/>
-        </w:rPr>
-        <w:t>---</w:t>
-      </w:r>
-    </w:p>
-    <w:p>
-      <w:pPr>
-        <w:pStyle w:val="HTMLPreformatted"/>
-        <w:shd w:val="clear" w:color="auto" w:fill="FFFFFF"/>
-        <w:wordWrap w:val="0"/>
-        <w:rPr>
-          <w:rFonts w:ascii="Lucida Console" w:hAnsi="Lucida Console"/>
-          <w:color w:val="000000"/>
-        </w:rPr>
-      </w:pPr>
-      <w:proofErr w:type="spellStart"/>
-      <w:r>
-        <w:rPr>
-          <w:rStyle w:val="gnvwddmdl3b"/>
-          <w:rFonts w:ascii="Lucida Console" w:hAnsi="Lucida Console"/>
-          <w:color w:val="000000"/>
-          <w:bdr w:val="none" w:sz="0" w:space="0" w:color="auto" w:frame="1"/>
-        </w:rPr>
-        <w:t>Signif</w:t>
-      </w:r>
-      <w:proofErr w:type="spellEnd"/>
-      <w:r>
-        <w:rPr>
-          <w:rStyle w:val="gnvwddmdl3b"/>
-          <w:rFonts w:ascii="Lucida Console" w:hAnsi="Lucida Console"/>
-          <w:color w:val="000000"/>
-          <w:bdr w:val="none" w:sz="0" w:space="0" w:color="auto" w:frame="1"/>
-        </w:rPr>
-        <w:t>. codes</w:t>
-      </w:r>
-      <w:proofErr w:type="gramStart"/>
-      <w:r>
-        <w:rPr>
-          <w:rStyle w:val="gnvwddmdl3b"/>
-          <w:rFonts w:ascii="Lucida Console" w:hAnsi="Lucida Console"/>
-          <w:color w:val="000000"/>
-          <w:bdr w:val="none" w:sz="0" w:space="0" w:color="auto" w:frame="1"/>
-        </w:rPr>
-        <w:t>:  0 ‘</w:t>
-      </w:r>
-      <w:proofErr w:type="gramEnd"/>
-      <w:r>
-        <w:rPr>
-          <w:rStyle w:val="gnvwddmdl3b"/>
-          <w:rFonts w:ascii="Lucida Console" w:hAnsi="Lucida Console"/>
-          <w:color w:val="000000"/>
-          <w:bdr w:val="none" w:sz="0" w:space="0" w:color="auto" w:frame="1"/>
-        </w:rPr>
-        <w:t xml:space="preserve">***’ </w:t>
-      </w:r>
-      <w:proofErr w:type="gramStart"/>
-      <w:r>
-        <w:rPr>
-          <w:rStyle w:val="gnvwddmdl3b"/>
-          <w:rFonts w:ascii="Lucida Console" w:hAnsi="Lucida Console"/>
-          <w:color w:val="000000"/>
-          <w:bdr w:val="none" w:sz="0" w:space="0" w:color="auto" w:frame="1"/>
-        </w:rPr>
-        <w:t>0.001 ‘*</w:t>
-      </w:r>
-      <w:proofErr w:type="gramEnd"/>
-      <w:r>
-        <w:rPr>
-          <w:rStyle w:val="gnvwddmdl3b"/>
-          <w:rFonts w:ascii="Lucida Console" w:hAnsi="Lucida Console"/>
-          <w:color w:val="000000"/>
-          <w:bdr w:val="none" w:sz="0" w:space="0" w:color="auto" w:frame="1"/>
-        </w:rPr>
-        <w:t xml:space="preserve">*’ </w:t>
-      </w:r>
-      <w:proofErr w:type="gramStart"/>
-      <w:r>
-        <w:rPr>
-          <w:rStyle w:val="gnvwddmdl3b"/>
-          <w:rFonts w:ascii="Lucida Console" w:hAnsi="Lucida Console"/>
-          <w:color w:val="000000"/>
-          <w:bdr w:val="none" w:sz="0" w:space="0" w:color="auto" w:frame="1"/>
-        </w:rPr>
-        <w:t>0.01 ‘*</w:t>
-      </w:r>
-      <w:proofErr w:type="gramEnd"/>
-      <w:r>
-        <w:rPr>
-          <w:rStyle w:val="gnvwddmdl3b"/>
-          <w:rFonts w:ascii="Lucida Console" w:hAnsi="Lucida Console"/>
-          <w:color w:val="000000"/>
-          <w:bdr w:val="none" w:sz="0" w:space="0" w:color="auto" w:frame="1"/>
-        </w:rPr>
-        <w:t xml:space="preserve">’ 0.05 ‘.’ 0.1 </w:t>
-      </w:r>
-      <w:proofErr w:type="gramStart"/>
-      <w:r>
-        <w:rPr>
-          <w:rStyle w:val="gnvwddmdl3b"/>
-          <w:rFonts w:ascii="Lucida Console" w:hAnsi="Lucida Console"/>
-          <w:color w:val="000000"/>
-          <w:bdr w:val="none" w:sz="0" w:space="0" w:color="auto" w:frame="1"/>
-        </w:rPr>
-        <w:t>‘ ’</w:t>
-      </w:r>
-      <w:proofErr w:type="gramEnd"/>
-      <w:r>
-        <w:rPr>
-          <w:rStyle w:val="gnvwddmdl3b"/>
-          <w:rFonts w:ascii="Lucida Console" w:hAnsi="Lucida Console"/>
-          <w:color w:val="000000"/>
-          <w:bdr w:val="none" w:sz="0" w:space="0" w:color="auto" w:frame="1"/>
-        </w:rPr>
-        <w:t xml:space="preserve"> 1</w:t>
+        <w:t>Signif. codes:  0 ‘***’ 0.001 ‘**’ 0.01 ‘*’ 0.05 ‘.’ 0.1 ‘ ’ 1</w:t>
       </w:r>
     </w:p>
     <w:p>
@@ -7022,13 +5801,8 @@
       </w:r>
     </w:p>
     <w:p>
-      <w:proofErr w:type="gramStart"/>
-      <w:r>
-        <w:t>Daily  emission</w:t>
-      </w:r>
-      <w:proofErr w:type="gramEnd"/>
-      <w:r>
-        <w:t xml:space="preserve"> analysis</w:t>
+      <w:r>
+        <w:t>Daily  emission analysis</w:t>
       </w:r>
     </w:p>
     <w:p>
@@ -7154,6 +5928,1309 @@
         <w:t xml:space="preserve">Checking mas flux calculations  </w:t>
       </w:r>
     </w:p>
+    <w:p>
+      <w:pPr>
+        <w:pStyle w:val="Heading1"/>
+      </w:pPr>
+      <w:r>
+        <w:t>202603</w:t>
+      </w:r>
+      <w:r>
+        <w:t>27 working on standards</w:t>
+      </w:r>
+    </w:p>
+    <w:p>
+      <w:pPr>
+        <w:pStyle w:val="Heading2"/>
+      </w:pPr>
+      <w:r>
+        <w:t>2021</w:t>
+      </w:r>
+      <w:r>
+        <w:t xml:space="preserve"> CO2</w:t>
+      </w:r>
+    </w:p>
+    <w:p>
+      <w:r>
+        <w:t>0 Standard</w:t>
+      </w:r>
+    </w:p>
+    <w:p>
+      <w:r>
+        <w:rPr>
+          <w:noProof/>
+        </w:rPr>
+        <w:lastRenderedPageBreak/>
+        <w:drawing>
+          <wp:inline distT="0" distB="0" distL="0" distR="0" wp14:anchorId="6ABE2C41" wp14:editId="289F9AF5">
+            <wp:extent cx="5943600" cy="3276600"/>
+            <wp:effectExtent l="0" t="0" r="0" b="0"/>
+            <wp:docPr id="2134300632" name="Picture 10"/>
+            <wp:cNvGraphicFramePr>
+              <a:graphicFrameLocks xmlns:a="http://schemas.openxmlformats.org/drawingml/2006/main" noChangeAspect="1"/>
+            </wp:cNvGraphicFramePr>
+            <a:graphic xmlns:a="http://schemas.openxmlformats.org/drawingml/2006/main">
+              <a:graphicData uri="http://schemas.openxmlformats.org/drawingml/2006/picture">
+                <pic:pic xmlns:pic="http://schemas.openxmlformats.org/drawingml/2006/picture">
+                  <pic:nvPicPr>
+                    <pic:cNvPr id="0" name="Picture 8"/>
+                    <pic:cNvPicPr>
+                      <a:picLocks noChangeAspect="1" noChangeArrowheads="1"/>
+                    </pic:cNvPicPr>
+                  </pic:nvPicPr>
+                  <pic:blipFill>
+                    <a:blip r:embed="rId75">
+                      <a:extLst>
+                        <a:ext uri="{28A0092B-C50C-407E-A947-70E740481C1C}">
+                          <a14:useLocalDpi xmlns:a14="http://schemas.microsoft.com/office/drawing/2010/main" val="0"/>
+                        </a:ext>
+                      </a:extLst>
+                    </a:blip>
+                    <a:srcRect/>
+                    <a:stretch>
+                      <a:fillRect/>
+                    </a:stretch>
+                  </pic:blipFill>
+                  <pic:spPr bwMode="auto">
+                    <a:xfrm>
+                      <a:off x="0" y="0"/>
+                      <a:ext cx="5943600" cy="3276600"/>
+                    </a:xfrm>
+                    <a:prstGeom prst="rect">
+                      <a:avLst/>
+                    </a:prstGeom>
+                    <a:noFill/>
+                    <a:ln>
+                      <a:noFill/>
+                    </a:ln>
+                  </pic:spPr>
+                </pic:pic>
+              </a:graphicData>
+            </a:graphic>
+          </wp:inline>
+        </w:drawing>
+      </w:r>
+    </w:p>
+    <w:p/>
+    <w:p>
+      <w:r>
+        <w:t>25% standards highly variable</w:t>
+      </w:r>
+    </w:p>
+    <w:p>
+      <w:r>
+        <w:rPr>
+          <w:noProof/>
+        </w:rPr>
+        <w:drawing>
+          <wp:inline distT="0" distB="0" distL="0" distR="0" wp14:anchorId="7A647CEB" wp14:editId="29868018">
+            <wp:extent cx="5821680" cy="3312890"/>
+            <wp:effectExtent l="0" t="0" r="0" b="0"/>
+            <wp:docPr id="1866793684" name="Picture 16"/>
+            <wp:cNvGraphicFramePr>
+              <a:graphicFrameLocks xmlns:a="http://schemas.openxmlformats.org/drawingml/2006/main" noChangeAspect="1"/>
+            </wp:cNvGraphicFramePr>
+            <a:graphic xmlns:a="http://schemas.openxmlformats.org/drawingml/2006/main">
+              <a:graphicData uri="http://schemas.openxmlformats.org/drawingml/2006/picture">
+                <pic:pic xmlns:pic="http://schemas.openxmlformats.org/drawingml/2006/picture">
+                  <pic:nvPicPr>
+                    <pic:cNvPr id="0" name="Picture 12"/>
+                    <pic:cNvPicPr>
+                      <a:picLocks noChangeAspect="1" noChangeArrowheads="1"/>
+                    </pic:cNvPicPr>
+                  </pic:nvPicPr>
+                  <pic:blipFill>
+                    <a:blip r:embed="rId76">
+                      <a:extLst>
+                        <a:ext uri="{28A0092B-C50C-407E-A947-70E740481C1C}">
+                          <a14:useLocalDpi xmlns:a14="http://schemas.microsoft.com/office/drawing/2010/main" val="0"/>
+                        </a:ext>
+                      </a:extLst>
+                    </a:blip>
+                    <a:srcRect/>
+                    <a:stretch>
+                      <a:fillRect/>
+                    </a:stretch>
+                  </pic:blipFill>
+                  <pic:spPr bwMode="auto">
+                    <a:xfrm>
+                      <a:off x="0" y="0"/>
+                      <a:ext cx="5845314" cy="3326339"/>
+                    </a:xfrm>
+                    <a:prstGeom prst="rect">
+                      <a:avLst/>
+                    </a:prstGeom>
+                    <a:noFill/>
+                  </pic:spPr>
+                </pic:pic>
+              </a:graphicData>
+            </a:graphic>
+          </wp:inline>
+        </w:drawing>
+      </w:r>
+    </w:p>
+    <w:p>
+      <w:r>
+        <w:rPr>
+          <w:noProof/>
+        </w:rPr>
+        <w:lastRenderedPageBreak/>
+        <w:drawing>
+          <wp:inline distT="0" distB="0" distL="0" distR="0" wp14:anchorId="389427EB" wp14:editId="46D84DBC">
+            <wp:extent cx="5943600" cy="3416300"/>
+            <wp:effectExtent l="0" t="0" r="0" b="0"/>
+            <wp:docPr id="1106886041" name="Picture 11"/>
+            <wp:cNvGraphicFramePr>
+              <a:graphicFrameLocks xmlns:a="http://schemas.openxmlformats.org/drawingml/2006/main" noChangeAspect="1"/>
+            </wp:cNvGraphicFramePr>
+            <a:graphic xmlns:a="http://schemas.openxmlformats.org/drawingml/2006/main">
+              <a:graphicData uri="http://schemas.openxmlformats.org/drawingml/2006/picture">
+                <pic:pic xmlns:pic="http://schemas.openxmlformats.org/drawingml/2006/picture">
+                  <pic:nvPicPr>
+                    <pic:cNvPr id="0" name="Picture 9"/>
+                    <pic:cNvPicPr>
+                      <a:picLocks noChangeAspect="1" noChangeArrowheads="1"/>
+                    </pic:cNvPicPr>
+                  </pic:nvPicPr>
+                  <pic:blipFill>
+                    <a:blip r:embed="rId77">
+                      <a:extLst>
+                        <a:ext uri="{28A0092B-C50C-407E-A947-70E740481C1C}">
+                          <a14:useLocalDpi xmlns:a14="http://schemas.microsoft.com/office/drawing/2010/main" val="0"/>
+                        </a:ext>
+                      </a:extLst>
+                    </a:blip>
+                    <a:srcRect/>
+                    <a:stretch>
+                      <a:fillRect/>
+                    </a:stretch>
+                  </pic:blipFill>
+                  <pic:spPr bwMode="auto">
+                    <a:xfrm>
+                      <a:off x="0" y="0"/>
+                      <a:ext cx="5943600" cy="3416300"/>
+                    </a:xfrm>
+                    <a:prstGeom prst="rect">
+                      <a:avLst/>
+                    </a:prstGeom>
+                    <a:noFill/>
+                    <a:ln>
+                      <a:noFill/>
+                    </a:ln>
+                  </pic:spPr>
+                </pic:pic>
+              </a:graphicData>
+            </a:graphic>
+          </wp:inline>
+        </w:drawing>
+      </w:r>
+    </w:p>
+    <w:p>
+      <w:pPr>
+        <w:jc w:val="center"/>
+      </w:pPr>
+    </w:p>
+    <w:p>
+      <w:r>
+        <w:t>50% standards</w:t>
+      </w:r>
+      <w:r>
+        <w:t xml:space="preserve"> highly variable, with a clear outlier</w:t>
+      </w:r>
+    </w:p>
+    <w:p>
+      <w:r>
+        <w:rPr>
+          <w:noProof/>
+        </w:rPr>
+        <w:drawing>
+          <wp:inline distT="0" distB="0" distL="0" distR="0" wp14:anchorId="1CFC4F0A" wp14:editId="0C2522FB">
+            <wp:extent cx="5990409" cy="3408907"/>
+            <wp:effectExtent l="0" t="0" r="0" b="0"/>
+            <wp:docPr id="70821535" name="Picture 18"/>
+            <wp:cNvGraphicFramePr>
+              <a:graphicFrameLocks xmlns:a="http://schemas.openxmlformats.org/drawingml/2006/main" noChangeAspect="1"/>
+            </wp:cNvGraphicFramePr>
+            <a:graphic xmlns:a="http://schemas.openxmlformats.org/drawingml/2006/main">
+              <a:graphicData uri="http://schemas.openxmlformats.org/drawingml/2006/picture">
+                <pic:pic xmlns:pic="http://schemas.openxmlformats.org/drawingml/2006/picture">
+                  <pic:nvPicPr>
+                    <pic:cNvPr id="0" name="Picture 14"/>
+                    <pic:cNvPicPr>
+                      <a:picLocks noChangeAspect="1" noChangeArrowheads="1"/>
+                    </pic:cNvPicPr>
+                  </pic:nvPicPr>
+                  <pic:blipFill>
+                    <a:blip r:embed="rId78">
+                      <a:extLst>
+                        <a:ext uri="{28A0092B-C50C-407E-A947-70E740481C1C}">
+                          <a14:useLocalDpi xmlns:a14="http://schemas.microsoft.com/office/drawing/2010/main" val="0"/>
+                        </a:ext>
+                      </a:extLst>
+                    </a:blip>
+                    <a:srcRect/>
+                    <a:stretch>
+                      <a:fillRect/>
+                    </a:stretch>
+                  </pic:blipFill>
+                  <pic:spPr bwMode="auto">
+                    <a:xfrm>
+                      <a:off x="0" y="0"/>
+                      <a:ext cx="6003929" cy="3416601"/>
+                    </a:xfrm>
+                    <a:prstGeom prst="rect">
+                      <a:avLst/>
+                    </a:prstGeom>
+                    <a:noFill/>
+                  </pic:spPr>
+                </pic:pic>
+              </a:graphicData>
+            </a:graphic>
+          </wp:inline>
+        </w:drawing>
+      </w:r>
+    </w:p>
+    <w:p>
+      <w:r>
+        <w:rPr>
+          <w:noProof/>
+        </w:rPr>
+        <w:lastRenderedPageBreak/>
+        <w:drawing>
+          <wp:inline distT="0" distB="0" distL="0" distR="0" wp14:anchorId="7D4F4286" wp14:editId="5DCB72FD">
+            <wp:extent cx="5943600" cy="3414395"/>
+            <wp:effectExtent l="0" t="0" r="0" b="0"/>
+            <wp:docPr id="652630956" name="Picture 13"/>
+            <wp:cNvGraphicFramePr>
+              <a:graphicFrameLocks xmlns:a="http://schemas.openxmlformats.org/drawingml/2006/main" noChangeAspect="1"/>
+            </wp:cNvGraphicFramePr>
+            <a:graphic xmlns:a="http://schemas.openxmlformats.org/drawingml/2006/main">
+              <a:graphicData uri="http://schemas.openxmlformats.org/drawingml/2006/picture">
+                <pic:pic xmlns:pic="http://schemas.openxmlformats.org/drawingml/2006/picture">
+                  <pic:nvPicPr>
+                    <pic:cNvPr id="0" name="Picture 11"/>
+                    <pic:cNvPicPr>
+                      <a:picLocks noChangeAspect="1" noChangeArrowheads="1"/>
+                    </pic:cNvPicPr>
+                  </pic:nvPicPr>
+                  <pic:blipFill>
+                    <a:blip r:embed="rId79">
+                      <a:extLst>
+                        <a:ext uri="{28A0092B-C50C-407E-A947-70E740481C1C}">
+                          <a14:useLocalDpi xmlns:a14="http://schemas.microsoft.com/office/drawing/2010/main" val="0"/>
+                        </a:ext>
+                      </a:extLst>
+                    </a:blip>
+                    <a:srcRect/>
+                    <a:stretch>
+                      <a:fillRect/>
+                    </a:stretch>
+                  </pic:blipFill>
+                  <pic:spPr bwMode="auto">
+                    <a:xfrm>
+                      <a:off x="0" y="0"/>
+                      <a:ext cx="5943600" cy="3414395"/>
+                    </a:xfrm>
+                    <a:prstGeom prst="rect">
+                      <a:avLst/>
+                    </a:prstGeom>
+                    <a:noFill/>
+                    <a:ln>
+                      <a:noFill/>
+                    </a:ln>
+                  </pic:spPr>
+                </pic:pic>
+              </a:graphicData>
+            </a:graphic>
+          </wp:inline>
+        </w:drawing>
+      </w:r>
+    </w:p>
+    <w:p/>
+    <w:p/>
+    <w:p>
+      <w:r>
+        <w:rPr>
+          <w:noProof/>
+        </w:rPr>
+        <w:drawing>
+          <wp:inline distT="0" distB="0" distL="0" distR="0" wp14:anchorId="7E1861D1" wp14:editId="2C596F3A">
+            <wp:extent cx="5943600" cy="3338195"/>
+            <wp:effectExtent l="0" t="0" r="0" b="0"/>
+            <wp:docPr id="1149502720" name="Picture 12"/>
+            <wp:cNvGraphicFramePr>
+              <a:graphicFrameLocks xmlns:a="http://schemas.openxmlformats.org/drawingml/2006/main" noChangeAspect="1"/>
+            </wp:cNvGraphicFramePr>
+            <a:graphic xmlns:a="http://schemas.openxmlformats.org/drawingml/2006/main">
+              <a:graphicData uri="http://schemas.openxmlformats.org/drawingml/2006/picture">
+                <pic:pic xmlns:pic="http://schemas.openxmlformats.org/drawingml/2006/picture">
+                  <pic:nvPicPr>
+                    <pic:cNvPr id="0" name="Picture 10"/>
+                    <pic:cNvPicPr>
+                      <a:picLocks noChangeAspect="1" noChangeArrowheads="1"/>
+                    </pic:cNvPicPr>
+                  </pic:nvPicPr>
+                  <pic:blipFill>
+                    <a:blip r:embed="rId80">
+                      <a:extLst>
+                        <a:ext uri="{28A0092B-C50C-407E-A947-70E740481C1C}">
+                          <a14:useLocalDpi xmlns:a14="http://schemas.microsoft.com/office/drawing/2010/main" val="0"/>
+                        </a:ext>
+                      </a:extLst>
+                    </a:blip>
+                    <a:srcRect/>
+                    <a:stretch>
+                      <a:fillRect/>
+                    </a:stretch>
+                  </pic:blipFill>
+                  <pic:spPr bwMode="auto">
+                    <a:xfrm>
+                      <a:off x="0" y="0"/>
+                      <a:ext cx="5943600" cy="3338195"/>
+                    </a:xfrm>
+                    <a:prstGeom prst="rect">
+                      <a:avLst/>
+                    </a:prstGeom>
+                    <a:noFill/>
+                    <a:ln>
+                      <a:noFill/>
+                    </a:ln>
+                  </pic:spPr>
+                </pic:pic>
+              </a:graphicData>
+            </a:graphic>
+          </wp:inline>
+        </w:drawing>
+      </w:r>
+    </w:p>
+    <w:p>
+      <w:r>
+        <w:rPr>
+          <w:noProof/>
+        </w:rPr>
+        <w:lastRenderedPageBreak/>
+        <w:drawing>
+          <wp:inline distT="0" distB="0" distL="0" distR="0" wp14:anchorId="12E263AA" wp14:editId="0369D9EE">
+            <wp:extent cx="5943600" cy="3326130"/>
+            <wp:effectExtent l="0" t="0" r="0" b="7620"/>
+            <wp:docPr id="102069150" name="Picture 14"/>
+            <wp:cNvGraphicFramePr>
+              <a:graphicFrameLocks xmlns:a="http://schemas.openxmlformats.org/drawingml/2006/main" noChangeAspect="1"/>
+            </wp:cNvGraphicFramePr>
+            <a:graphic xmlns:a="http://schemas.openxmlformats.org/drawingml/2006/main">
+              <a:graphicData uri="http://schemas.openxmlformats.org/drawingml/2006/picture">
+                <pic:pic xmlns:pic="http://schemas.openxmlformats.org/drawingml/2006/picture">
+                  <pic:nvPicPr>
+                    <pic:cNvPr id="0" name="Picture 12"/>
+                    <pic:cNvPicPr>
+                      <a:picLocks noChangeAspect="1" noChangeArrowheads="1"/>
+                    </pic:cNvPicPr>
+                  </pic:nvPicPr>
+                  <pic:blipFill>
+                    <a:blip r:embed="rId81">
+                      <a:extLst>
+                        <a:ext uri="{28A0092B-C50C-407E-A947-70E740481C1C}">
+                          <a14:useLocalDpi xmlns:a14="http://schemas.microsoft.com/office/drawing/2010/main" val="0"/>
+                        </a:ext>
+                      </a:extLst>
+                    </a:blip>
+                    <a:srcRect/>
+                    <a:stretch>
+                      <a:fillRect/>
+                    </a:stretch>
+                  </pic:blipFill>
+                  <pic:spPr bwMode="auto">
+                    <a:xfrm>
+                      <a:off x="0" y="0"/>
+                      <a:ext cx="5943600" cy="3326130"/>
+                    </a:xfrm>
+                    <a:prstGeom prst="rect">
+                      <a:avLst/>
+                    </a:prstGeom>
+                    <a:noFill/>
+                    <a:ln>
+                      <a:noFill/>
+                    </a:ln>
+                  </pic:spPr>
+                </pic:pic>
+              </a:graphicData>
+            </a:graphic>
+          </wp:inline>
+        </w:drawing>
+      </w:r>
+    </w:p>
+    <w:p/>
+    <w:p/>
+    <w:p/>
+    <w:p/>
+    <w:p>
+      <w:r>
+        <w:t>75</w:t>
+      </w:r>
+      <w:r>
+        <w:t xml:space="preserve"> % Standards</w:t>
+      </w:r>
+    </w:p>
+    <w:p>
+      <w:r>
+        <w:rPr>
+          <w:noProof/>
+        </w:rPr>
+        <w:lastRenderedPageBreak/>
+        <w:drawing>
+          <wp:inline distT="0" distB="0" distL="0" distR="0" wp14:anchorId="50B6FE34" wp14:editId="6493C731">
+            <wp:extent cx="5943600" cy="3371850"/>
+            <wp:effectExtent l="0" t="0" r="0" b="0"/>
+            <wp:docPr id="196678249" name="Picture 6"/>
+            <wp:cNvGraphicFramePr>
+              <a:graphicFrameLocks xmlns:a="http://schemas.openxmlformats.org/drawingml/2006/main" noChangeAspect="1"/>
+            </wp:cNvGraphicFramePr>
+            <a:graphic xmlns:a="http://schemas.openxmlformats.org/drawingml/2006/main">
+              <a:graphicData uri="http://schemas.openxmlformats.org/drawingml/2006/picture">
+                <pic:pic xmlns:pic="http://schemas.openxmlformats.org/drawingml/2006/picture">
+                  <pic:nvPicPr>
+                    <pic:cNvPr id="0" name="Picture 4"/>
+                    <pic:cNvPicPr>
+                      <a:picLocks noChangeAspect="1" noChangeArrowheads="1"/>
+                    </pic:cNvPicPr>
+                  </pic:nvPicPr>
+                  <pic:blipFill>
+                    <a:blip r:embed="rId82">
+                      <a:extLst>
+                        <a:ext uri="{28A0092B-C50C-407E-A947-70E740481C1C}">
+                          <a14:useLocalDpi xmlns:a14="http://schemas.microsoft.com/office/drawing/2010/main" val="0"/>
+                        </a:ext>
+                      </a:extLst>
+                    </a:blip>
+                    <a:srcRect/>
+                    <a:stretch>
+                      <a:fillRect/>
+                    </a:stretch>
+                  </pic:blipFill>
+                  <pic:spPr bwMode="auto">
+                    <a:xfrm>
+                      <a:off x="0" y="0"/>
+                      <a:ext cx="5943600" cy="3371850"/>
+                    </a:xfrm>
+                    <a:prstGeom prst="rect">
+                      <a:avLst/>
+                    </a:prstGeom>
+                    <a:noFill/>
+                    <a:ln>
+                      <a:noFill/>
+                    </a:ln>
+                  </pic:spPr>
+                </pic:pic>
+              </a:graphicData>
+            </a:graphic>
+          </wp:inline>
+        </w:drawing>
+      </w:r>
+    </w:p>
+    <w:p>
+      <w:r>
+        <w:rPr>
+          <w:noProof/>
+        </w:rPr>
+        <w:drawing>
+          <wp:inline distT="0" distB="0" distL="0" distR="0" wp14:anchorId="68E44D9C" wp14:editId="7206BA82">
+            <wp:extent cx="5943600" cy="3385185"/>
+            <wp:effectExtent l="0" t="0" r="0" b="5715"/>
+            <wp:docPr id="1921573599" name="Picture 15"/>
+            <wp:cNvGraphicFramePr>
+              <a:graphicFrameLocks xmlns:a="http://schemas.openxmlformats.org/drawingml/2006/main" noChangeAspect="1"/>
+            </wp:cNvGraphicFramePr>
+            <a:graphic xmlns:a="http://schemas.openxmlformats.org/drawingml/2006/main">
+              <a:graphicData uri="http://schemas.openxmlformats.org/drawingml/2006/picture">
+                <pic:pic xmlns:pic="http://schemas.openxmlformats.org/drawingml/2006/picture">
+                  <pic:nvPicPr>
+                    <pic:cNvPr id="0" name="Picture 13"/>
+                    <pic:cNvPicPr>
+                      <a:picLocks noChangeAspect="1" noChangeArrowheads="1"/>
+                    </pic:cNvPicPr>
+                  </pic:nvPicPr>
+                  <pic:blipFill>
+                    <a:blip r:embed="rId83">
+                      <a:extLst>
+                        <a:ext uri="{28A0092B-C50C-407E-A947-70E740481C1C}">
+                          <a14:useLocalDpi xmlns:a14="http://schemas.microsoft.com/office/drawing/2010/main" val="0"/>
+                        </a:ext>
+                      </a:extLst>
+                    </a:blip>
+                    <a:srcRect/>
+                    <a:stretch>
+                      <a:fillRect/>
+                    </a:stretch>
+                  </pic:blipFill>
+                  <pic:spPr bwMode="auto">
+                    <a:xfrm>
+                      <a:off x="0" y="0"/>
+                      <a:ext cx="5943600" cy="3385185"/>
+                    </a:xfrm>
+                    <a:prstGeom prst="rect">
+                      <a:avLst/>
+                    </a:prstGeom>
+                    <a:noFill/>
+                    <a:ln>
+                      <a:noFill/>
+                    </a:ln>
+                  </pic:spPr>
+                </pic:pic>
+              </a:graphicData>
+            </a:graphic>
+          </wp:inline>
+        </w:drawing>
+      </w:r>
+    </w:p>
+    <w:p/>
+    <w:p/>
+    <w:p/>
+    <w:p/>
+    <w:p/>
+    <w:p>
+      <w:r>
+        <w:t>1</w:t>
+      </w:r>
+      <w:r>
+        <w:t>00</w:t>
+      </w:r>
+      <w:r>
+        <w:t>% Standards</w:t>
+      </w:r>
+    </w:p>
+    <w:p/>
+    <w:p>
+      <w:r>
+        <w:rPr>
+          <w:noProof/>
+        </w:rPr>
+        <w:drawing>
+          <wp:inline distT="0" distB="0" distL="0" distR="0" wp14:anchorId="0173C48F" wp14:editId="46029969">
+            <wp:extent cx="5488185" cy="3123111"/>
+            <wp:effectExtent l="0" t="0" r="0" b="0"/>
+            <wp:docPr id="1032494327" name="Picture 19"/>
+            <wp:cNvGraphicFramePr>
+              <a:graphicFrameLocks xmlns:a="http://schemas.openxmlformats.org/drawingml/2006/main" noChangeAspect="1"/>
+            </wp:cNvGraphicFramePr>
+            <a:graphic xmlns:a="http://schemas.openxmlformats.org/drawingml/2006/main">
+              <a:graphicData uri="http://schemas.openxmlformats.org/drawingml/2006/picture">
+                <pic:pic xmlns:pic="http://schemas.openxmlformats.org/drawingml/2006/picture">
+                  <pic:nvPicPr>
+                    <pic:cNvPr id="0" name="Picture 15"/>
+                    <pic:cNvPicPr>
+                      <a:picLocks noChangeAspect="1" noChangeArrowheads="1"/>
+                    </pic:cNvPicPr>
+                  </pic:nvPicPr>
+                  <pic:blipFill>
+                    <a:blip r:embed="rId84">
+                      <a:extLst>
+                        <a:ext uri="{28A0092B-C50C-407E-A947-70E740481C1C}">
+                          <a14:useLocalDpi xmlns:a14="http://schemas.microsoft.com/office/drawing/2010/main" val="0"/>
+                        </a:ext>
+                      </a:extLst>
+                    </a:blip>
+                    <a:srcRect/>
+                    <a:stretch>
+                      <a:fillRect/>
+                    </a:stretch>
+                  </pic:blipFill>
+                  <pic:spPr bwMode="auto">
+                    <a:xfrm>
+                      <a:off x="0" y="0"/>
+                      <a:ext cx="5499751" cy="3129693"/>
+                    </a:xfrm>
+                    <a:prstGeom prst="rect">
+                      <a:avLst/>
+                    </a:prstGeom>
+                    <a:noFill/>
+                  </pic:spPr>
+                </pic:pic>
+              </a:graphicData>
+            </a:graphic>
+          </wp:inline>
+        </w:drawing>
+      </w:r>
+    </w:p>
+    <w:p/>
+    <w:p/>
+    <w:p>
+      <w:r>
+        <w:rPr>
+          <w:noProof/>
+        </w:rPr>
+        <w:drawing>
+          <wp:inline distT="0" distB="0" distL="0" distR="0" wp14:anchorId="08FA7578" wp14:editId="1DA21463">
+            <wp:extent cx="5943600" cy="3390265"/>
+            <wp:effectExtent l="0" t="0" r="0" b="635"/>
+            <wp:docPr id="292397250" name="Picture 16"/>
+            <wp:cNvGraphicFramePr>
+              <a:graphicFrameLocks xmlns:a="http://schemas.openxmlformats.org/drawingml/2006/main" noChangeAspect="1"/>
+            </wp:cNvGraphicFramePr>
+            <a:graphic xmlns:a="http://schemas.openxmlformats.org/drawingml/2006/main">
+              <a:graphicData uri="http://schemas.openxmlformats.org/drawingml/2006/picture">
+                <pic:pic xmlns:pic="http://schemas.openxmlformats.org/drawingml/2006/picture">
+                  <pic:nvPicPr>
+                    <pic:cNvPr id="0" name="Picture 14"/>
+                    <pic:cNvPicPr>
+                      <a:picLocks noChangeAspect="1" noChangeArrowheads="1"/>
+                    </pic:cNvPicPr>
+                  </pic:nvPicPr>
+                  <pic:blipFill>
+                    <a:blip r:embed="rId85">
+                      <a:extLst>
+                        <a:ext uri="{28A0092B-C50C-407E-A947-70E740481C1C}">
+                          <a14:useLocalDpi xmlns:a14="http://schemas.microsoft.com/office/drawing/2010/main" val="0"/>
+                        </a:ext>
+                      </a:extLst>
+                    </a:blip>
+                    <a:srcRect/>
+                    <a:stretch>
+                      <a:fillRect/>
+                    </a:stretch>
+                  </pic:blipFill>
+                  <pic:spPr bwMode="auto">
+                    <a:xfrm>
+                      <a:off x="0" y="0"/>
+                      <a:ext cx="5943600" cy="3390265"/>
+                    </a:xfrm>
+                    <a:prstGeom prst="rect">
+                      <a:avLst/>
+                    </a:prstGeom>
+                    <a:noFill/>
+                    <a:ln>
+                      <a:noFill/>
+                    </a:ln>
+                  </pic:spPr>
+                </pic:pic>
+              </a:graphicData>
+            </a:graphic>
+          </wp:inline>
+        </w:drawing>
+      </w:r>
+    </w:p>
+    <w:p>
+      <w:r>
+        <w:rPr>
+          <w:noProof/>
+        </w:rPr>
+        <w:lastRenderedPageBreak/>
+        <w:drawing>
+          <wp:inline distT="0" distB="0" distL="0" distR="0" wp14:anchorId="35A16FCC" wp14:editId="6674D53C">
+            <wp:extent cx="5943600" cy="3385185"/>
+            <wp:effectExtent l="0" t="0" r="0" b="5715"/>
+            <wp:docPr id="1235316975" name="Picture 17"/>
+            <wp:cNvGraphicFramePr>
+              <a:graphicFrameLocks xmlns:a="http://schemas.openxmlformats.org/drawingml/2006/main" noChangeAspect="1"/>
+            </wp:cNvGraphicFramePr>
+            <a:graphic xmlns:a="http://schemas.openxmlformats.org/drawingml/2006/main">
+              <a:graphicData uri="http://schemas.openxmlformats.org/drawingml/2006/picture">
+                <pic:pic xmlns:pic="http://schemas.openxmlformats.org/drawingml/2006/picture">
+                  <pic:nvPicPr>
+                    <pic:cNvPr id="0" name="Picture 15"/>
+                    <pic:cNvPicPr>
+                      <a:picLocks noChangeAspect="1" noChangeArrowheads="1"/>
+                    </pic:cNvPicPr>
+                  </pic:nvPicPr>
+                  <pic:blipFill>
+                    <a:blip r:embed="rId86">
+                      <a:extLst>
+                        <a:ext uri="{28A0092B-C50C-407E-A947-70E740481C1C}">
+                          <a14:useLocalDpi xmlns:a14="http://schemas.microsoft.com/office/drawing/2010/main" val="0"/>
+                        </a:ext>
+                      </a:extLst>
+                    </a:blip>
+                    <a:srcRect/>
+                    <a:stretch>
+                      <a:fillRect/>
+                    </a:stretch>
+                  </pic:blipFill>
+                  <pic:spPr bwMode="auto">
+                    <a:xfrm>
+                      <a:off x="0" y="0"/>
+                      <a:ext cx="5943600" cy="3385185"/>
+                    </a:xfrm>
+                    <a:prstGeom prst="rect">
+                      <a:avLst/>
+                    </a:prstGeom>
+                    <a:noFill/>
+                    <a:ln>
+                      <a:noFill/>
+                    </a:ln>
+                  </pic:spPr>
+                </pic:pic>
+              </a:graphicData>
+            </a:graphic>
+          </wp:inline>
+        </w:drawing>
+      </w:r>
+    </w:p>
+    <w:p>
+      <w:r>
+        <w:rPr>
+          <w:noProof/>
+        </w:rPr>
+        <w:drawing>
+          <wp:inline distT="0" distB="0" distL="0" distR="0" wp14:anchorId="054232D2" wp14:editId="34197D09">
+            <wp:extent cx="5943600" cy="3364865"/>
+            <wp:effectExtent l="0" t="0" r="0" b="6985"/>
+            <wp:docPr id="1207996835" name="Picture 18"/>
+            <wp:cNvGraphicFramePr>
+              <a:graphicFrameLocks xmlns:a="http://schemas.openxmlformats.org/drawingml/2006/main" noChangeAspect="1"/>
+            </wp:cNvGraphicFramePr>
+            <a:graphic xmlns:a="http://schemas.openxmlformats.org/drawingml/2006/main">
+              <a:graphicData uri="http://schemas.openxmlformats.org/drawingml/2006/picture">
+                <pic:pic xmlns:pic="http://schemas.openxmlformats.org/drawingml/2006/picture">
+                  <pic:nvPicPr>
+                    <pic:cNvPr id="0" name="Picture 16"/>
+                    <pic:cNvPicPr>
+                      <a:picLocks noChangeAspect="1" noChangeArrowheads="1"/>
+                    </pic:cNvPicPr>
+                  </pic:nvPicPr>
+                  <pic:blipFill>
+                    <a:blip r:embed="rId87">
+                      <a:extLst>
+                        <a:ext uri="{28A0092B-C50C-407E-A947-70E740481C1C}">
+                          <a14:useLocalDpi xmlns:a14="http://schemas.microsoft.com/office/drawing/2010/main" val="0"/>
+                        </a:ext>
+                      </a:extLst>
+                    </a:blip>
+                    <a:srcRect/>
+                    <a:stretch>
+                      <a:fillRect/>
+                    </a:stretch>
+                  </pic:blipFill>
+                  <pic:spPr bwMode="auto">
+                    <a:xfrm>
+                      <a:off x="0" y="0"/>
+                      <a:ext cx="5943600" cy="3364865"/>
+                    </a:xfrm>
+                    <a:prstGeom prst="rect">
+                      <a:avLst/>
+                    </a:prstGeom>
+                    <a:noFill/>
+                    <a:ln>
+                      <a:noFill/>
+                    </a:ln>
+                  </pic:spPr>
+                </pic:pic>
+              </a:graphicData>
+            </a:graphic>
+          </wp:inline>
+        </w:drawing>
+      </w:r>
+    </w:p>
+    <w:p/>
+    <w:p/>
+    <w:p/>
+    <w:p>
+      <w:pPr>
+        <w:pStyle w:val="Heading2"/>
+      </w:pPr>
+      <w:r>
+        <w:lastRenderedPageBreak/>
+        <w:t>2021 N2O standards</w:t>
+      </w:r>
+    </w:p>
+    <w:p>
+      <w:r>
+        <w:rPr>
+          <w:noProof/>
+        </w:rPr>
+        <w:drawing>
+          <wp:inline distT="0" distB="0" distL="0" distR="0" wp14:anchorId="7381501D" wp14:editId="1BA9CF1B">
+            <wp:extent cx="5943600" cy="3267075"/>
+            <wp:effectExtent l="0" t="0" r="0" b="9525"/>
+            <wp:docPr id="1507713050" name="Picture 19"/>
+            <wp:cNvGraphicFramePr>
+              <a:graphicFrameLocks xmlns:a="http://schemas.openxmlformats.org/drawingml/2006/main" noChangeAspect="1"/>
+            </wp:cNvGraphicFramePr>
+            <a:graphic xmlns:a="http://schemas.openxmlformats.org/drawingml/2006/main">
+              <a:graphicData uri="http://schemas.openxmlformats.org/drawingml/2006/picture">
+                <pic:pic xmlns:pic="http://schemas.openxmlformats.org/drawingml/2006/picture">
+                  <pic:nvPicPr>
+                    <pic:cNvPr id="0" name="Picture 17"/>
+                    <pic:cNvPicPr>
+                      <a:picLocks noChangeAspect="1" noChangeArrowheads="1"/>
+                    </pic:cNvPicPr>
+                  </pic:nvPicPr>
+                  <pic:blipFill>
+                    <a:blip r:embed="rId88">
+                      <a:extLst>
+                        <a:ext uri="{28A0092B-C50C-407E-A947-70E740481C1C}">
+                          <a14:useLocalDpi xmlns:a14="http://schemas.microsoft.com/office/drawing/2010/main" val="0"/>
+                        </a:ext>
+                      </a:extLst>
+                    </a:blip>
+                    <a:srcRect/>
+                    <a:stretch>
+                      <a:fillRect/>
+                    </a:stretch>
+                  </pic:blipFill>
+                  <pic:spPr bwMode="auto">
+                    <a:xfrm>
+                      <a:off x="0" y="0"/>
+                      <a:ext cx="5943600" cy="3267075"/>
+                    </a:xfrm>
+                    <a:prstGeom prst="rect">
+                      <a:avLst/>
+                    </a:prstGeom>
+                    <a:noFill/>
+                    <a:ln>
+                      <a:noFill/>
+                    </a:ln>
+                  </pic:spPr>
+                </pic:pic>
+              </a:graphicData>
+            </a:graphic>
+          </wp:inline>
+        </w:drawing>
+      </w:r>
+    </w:p>
+    <w:p>
+      <w:r>
+        <w:rPr>
+          <w:noProof/>
+        </w:rPr>
+        <w:drawing>
+          <wp:inline distT="0" distB="0" distL="0" distR="0" wp14:anchorId="1BE4D5E8" wp14:editId="583FA87C">
+            <wp:extent cx="5943600" cy="3402965"/>
+            <wp:effectExtent l="0" t="0" r="0" b="6985"/>
+            <wp:docPr id="2119980261" name="Picture 20"/>
+            <wp:cNvGraphicFramePr>
+              <a:graphicFrameLocks xmlns:a="http://schemas.openxmlformats.org/drawingml/2006/main" noChangeAspect="1"/>
+            </wp:cNvGraphicFramePr>
+            <a:graphic xmlns:a="http://schemas.openxmlformats.org/drawingml/2006/main">
+              <a:graphicData uri="http://schemas.openxmlformats.org/drawingml/2006/picture">
+                <pic:pic xmlns:pic="http://schemas.openxmlformats.org/drawingml/2006/picture">
+                  <pic:nvPicPr>
+                    <pic:cNvPr id="0" name="Picture 18"/>
+                    <pic:cNvPicPr>
+                      <a:picLocks noChangeAspect="1" noChangeArrowheads="1"/>
+                    </pic:cNvPicPr>
+                  </pic:nvPicPr>
+                  <pic:blipFill>
+                    <a:blip r:embed="rId89">
+                      <a:extLst>
+                        <a:ext uri="{28A0092B-C50C-407E-A947-70E740481C1C}">
+                          <a14:useLocalDpi xmlns:a14="http://schemas.microsoft.com/office/drawing/2010/main" val="0"/>
+                        </a:ext>
+                      </a:extLst>
+                    </a:blip>
+                    <a:srcRect/>
+                    <a:stretch>
+                      <a:fillRect/>
+                    </a:stretch>
+                  </pic:blipFill>
+                  <pic:spPr bwMode="auto">
+                    <a:xfrm>
+                      <a:off x="0" y="0"/>
+                      <a:ext cx="5943600" cy="3402965"/>
+                    </a:xfrm>
+                    <a:prstGeom prst="rect">
+                      <a:avLst/>
+                    </a:prstGeom>
+                    <a:noFill/>
+                    <a:ln>
+                      <a:noFill/>
+                    </a:ln>
+                  </pic:spPr>
+                </pic:pic>
+              </a:graphicData>
+            </a:graphic>
+          </wp:inline>
+        </w:drawing>
+      </w:r>
+    </w:p>
+    <w:p>
+      <w:r>
+        <w:rPr>
+          <w:noProof/>
+        </w:rPr>
+        <w:lastRenderedPageBreak/>
+        <w:drawing>
+          <wp:inline distT="0" distB="0" distL="0" distR="0" wp14:anchorId="3DCC64BA" wp14:editId="5969580F">
+            <wp:extent cx="5943600" cy="3401695"/>
+            <wp:effectExtent l="0" t="0" r="0" b="8255"/>
+            <wp:docPr id="979118498" name="Picture 21"/>
+            <wp:cNvGraphicFramePr>
+              <a:graphicFrameLocks xmlns:a="http://schemas.openxmlformats.org/drawingml/2006/main" noChangeAspect="1"/>
+            </wp:cNvGraphicFramePr>
+            <a:graphic xmlns:a="http://schemas.openxmlformats.org/drawingml/2006/main">
+              <a:graphicData uri="http://schemas.openxmlformats.org/drawingml/2006/picture">
+                <pic:pic xmlns:pic="http://schemas.openxmlformats.org/drawingml/2006/picture">
+                  <pic:nvPicPr>
+                    <pic:cNvPr id="0" name="Picture 19"/>
+                    <pic:cNvPicPr>
+                      <a:picLocks noChangeAspect="1" noChangeArrowheads="1"/>
+                    </pic:cNvPicPr>
+                  </pic:nvPicPr>
+                  <pic:blipFill>
+                    <a:blip r:embed="rId90">
+                      <a:extLst>
+                        <a:ext uri="{28A0092B-C50C-407E-A947-70E740481C1C}">
+                          <a14:useLocalDpi xmlns:a14="http://schemas.microsoft.com/office/drawing/2010/main" val="0"/>
+                        </a:ext>
+                      </a:extLst>
+                    </a:blip>
+                    <a:srcRect/>
+                    <a:stretch>
+                      <a:fillRect/>
+                    </a:stretch>
+                  </pic:blipFill>
+                  <pic:spPr bwMode="auto">
+                    <a:xfrm>
+                      <a:off x="0" y="0"/>
+                      <a:ext cx="5943600" cy="3401695"/>
+                    </a:xfrm>
+                    <a:prstGeom prst="rect">
+                      <a:avLst/>
+                    </a:prstGeom>
+                    <a:noFill/>
+                    <a:ln>
+                      <a:noFill/>
+                    </a:ln>
+                  </pic:spPr>
+                </pic:pic>
+              </a:graphicData>
+            </a:graphic>
+          </wp:inline>
+        </w:drawing>
+      </w:r>
+    </w:p>
+    <w:p>
+      <w:r>
+        <w:rPr>
+          <w:noProof/>
+        </w:rPr>
+        <w:drawing>
+          <wp:inline distT="0" distB="0" distL="0" distR="0" wp14:anchorId="6A826F07" wp14:editId="02D8CB97">
+            <wp:extent cx="5943600" cy="3368040"/>
+            <wp:effectExtent l="0" t="0" r="0" b="3810"/>
+            <wp:docPr id="1745796498" name="Picture 22"/>
+            <wp:cNvGraphicFramePr>
+              <a:graphicFrameLocks xmlns:a="http://schemas.openxmlformats.org/drawingml/2006/main" noChangeAspect="1"/>
+            </wp:cNvGraphicFramePr>
+            <a:graphic xmlns:a="http://schemas.openxmlformats.org/drawingml/2006/main">
+              <a:graphicData uri="http://schemas.openxmlformats.org/drawingml/2006/picture">
+                <pic:pic xmlns:pic="http://schemas.openxmlformats.org/drawingml/2006/picture">
+                  <pic:nvPicPr>
+                    <pic:cNvPr id="0" name="Picture 20"/>
+                    <pic:cNvPicPr>
+                      <a:picLocks noChangeAspect="1" noChangeArrowheads="1"/>
+                    </pic:cNvPicPr>
+                  </pic:nvPicPr>
+                  <pic:blipFill>
+                    <a:blip r:embed="rId91">
+                      <a:extLst>
+                        <a:ext uri="{28A0092B-C50C-407E-A947-70E740481C1C}">
+                          <a14:useLocalDpi xmlns:a14="http://schemas.microsoft.com/office/drawing/2010/main" val="0"/>
+                        </a:ext>
+                      </a:extLst>
+                    </a:blip>
+                    <a:srcRect/>
+                    <a:stretch>
+                      <a:fillRect/>
+                    </a:stretch>
+                  </pic:blipFill>
+                  <pic:spPr bwMode="auto">
+                    <a:xfrm>
+                      <a:off x="0" y="0"/>
+                      <a:ext cx="5943600" cy="3368040"/>
+                    </a:xfrm>
+                    <a:prstGeom prst="rect">
+                      <a:avLst/>
+                    </a:prstGeom>
+                    <a:noFill/>
+                    <a:ln>
+                      <a:noFill/>
+                    </a:ln>
+                  </pic:spPr>
+                </pic:pic>
+              </a:graphicData>
+            </a:graphic>
+          </wp:inline>
+        </w:drawing>
+      </w:r>
+    </w:p>
+    <w:p>
+      <w:r>
+        <w:rPr>
+          <w:noProof/>
+        </w:rPr>
+        <w:lastRenderedPageBreak/>
+        <w:drawing>
+          <wp:inline distT="0" distB="0" distL="0" distR="0" wp14:anchorId="125EF231" wp14:editId="1E71EF57">
+            <wp:extent cx="5943600" cy="3402965"/>
+            <wp:effectExtent l="0" t="0" r="0" b="6985"/>
+            <wp:docPr id="1675314363" name="Picture 23"/>
+            <wp:cNvGraphicFramePr>
+              <a:graphicFrameLocks xmlns:a="http://schemas.openxmlformats.org/drawingml/2006/main" noChangeAspect="1"/>
+            </wp:cNvGraphicFramePr>
+            <a:graphic xmlns:a="http://schemas.openxmlformats.org/drawingml/2006/main">
+              <a:graphicData uri="http://schemas.openxmlformats.org/drawingml/2006/picture">
+                <pic:pic xmlns:pic="http://schemas.openxmlformats.org/drawingml/2006/picture">
+                  <pic:nvPicPr>
+                    <pic:cNvPr id="0" name="Picture 21"/>
+                    <pic:cNvPicPr>
+                      <a:picLocks noChangeAspect="1" noChangeArrowheads="1"/>
+                    </pic:cNvPicPr>
+                  </pic:nvPicPr>
+                  <pic:blipFill>
+                    <a:blip r:embed="rId92">
+                      <a:extLst>
+                        <a:ext uri="{28A0092B-C50C-407E-A947-70E740481C1C}">
+                          <a14:useLocalDpi xmlns:a14="http://schemas.microsoft.com/office/drawing/2010/main" val="0"/>
+                        </a:ext>
+                      </a:extLst>
+                    </a:blip>
+                    <a:srcRect/>
+                    <a:stretch>
+                      <a:fillRect/>
+                    </a:stretch>
+                  </pic:blipFill>
+                  <pic:spPr bwMode="auto">
+                    <a:xfrm>
+                      <a:off x="0" y="0"/>
+                      <a:ext cx="5943600" cy="3402965"/>
+                    </a:xfrm>
+                    <a:prstGeom prst="rect">
+                      <a:avLst/>
+                    </a:prstGeom>
+                    <a:noFill/>
+                    <a:ln>
+                      <a:noFill/>
+                    </a:ln>
+                  </pic:spPr>
+                </pic:pic>
+              </a:graphicData>
+            </a:graphic>
+          </wp:inline>
+        </w:drawing>
+      </w:r>
+    </w:p>
+    <w:p>
+      <w:r>
+        <w:rPr>
+          <w:noProof/>
+        </w:rPr>
+        <w:drawing>
+          <wp:inline distT="0" distB="0" distL="0" distR="0" wp14:anchorId="0D98FF2E" wp14:editId="61339A1E">
+            <wp:extent cx="5943600" cy="3314065"/>
+            <wp:effectExtent l="0" t="0" r="0" b="635"/>
+            <wp:docPr id="1264299186" name="Picture 24"/>
+            <wp:cNvGraphicFramePr>
+              <a:graphicFrameLocks xmlns:a="http://schemas.openxmlformats.org/drawingml/2006/main" noChangeAspect="1"/>
+            </wp:cNvGraphicFramePr>
+            <a:graphic xmlns:a="http://schemas.openxmlformats.org/drawingml/2006/main">
+              <a:graphicData uri="http://schemas.openxmlformats.org/drawingml/2006/picture">
+                <pic:pic xmlns:pic="http://schemas.openxmlformats.org/drawingml/2006/picture">
+                  <pic:nvPicPr>
+                    <pic:cNvPr id="0" name="Picture 22"/>
+                    <pic:cNvPicPr>
+                      <a:picLocks noChangeAspect="1" noChangeArrowheads="1"/>
+                    </pic:cNvPicPr>
+                  </pic:nvPicPr>
+                  <pic:blipFill>
+                    <a:blip r:embed="rId93">
+                      <a:extLst>
+                        <a:ext uri="{28A0092B-C50C-407E-A947-70E740481C1C}">
+                          <a14:useLocalDpi xmlns:a14="http://schemas.microsoft.com/office/drawing/2010/main" val="0"/>
+                        </a:ext>
+                      </a:extLst>
+                    </a:blip>
+                    <a:srcRect/>
+                    <a:stretch>
+                      <a:fillRect/>
+                    </a:stretch>
+                  </pic:blipFill>
+                  <pic:spPr bwMode="auto">
+                    <a:xfrm>
+                      <a:off x="0" y="0"/>
+                      <a:ext cx="5943600" cy="3314065"/>
+                    </a:xfrm>
+                    <a:prstGeom prst="rect">
+                      <a:avLst/>
+                    </a:prstGeom>
+                    <a:noFill/>
+                    <a:ln>
+                      <a:noFill/>
+                    </a:ln>
+                  </pic:spPr>
+                </pic:pic>
+              </a:graphicData>
+            </a:graphic>
+          </wp:inline>
+        </w:drawing>
+      </w:r>
+    </w:p>
+    <w:p>
+      <w:r>
+        <w:rPr>
+          <w:noProof/>
+        </w:rPr>
+        <w:lastRenderedPageBreak/>
+        <w:drawing>
+          <wp:inline distT="0" distB="0" distL="0" distR="0" wp14:anchorId="4CB2CFD7" wp14:editId="19086AFB">
+            <wp:extent cx="5943600" cy="3302635"/>
+            <wp:effectExtent l="0" t="0" r="0" b="0"/>
+            <wp:docPr id="920358613" name="Picture 25"/>
+            <wp:cNvGraphicFramePr>
+              <a:graphicFrameLocks xmlns:a="http://schemas.openxmlformats.org/drawingml/2006/main" noChangeAspect="1"/>
+            </wp:cNvGraphicFramePr>
+            <a:graphic xmlns:a="http://schemas.openxmlformats.org/drawingml/2006/main">
+              <a:graphicData uri="http://schemas.openxmlformats.org/drawingml/2006/picture">
+                <pic:pic xmlns:pic="http://schemas.openxmlformats.org/drawingml/2006/picture">
+                  <pic:nvPicPr>
+                    <pic:cNvPr id="0" name="Picture 23"/>
+                    <pic:cNvPicPr>
+                      <a:picLocks noChangeAspect="1" noChangeArrowheads="1"/>
+                    </pic:cNvPicPr>
+                  </pic:nvPicPr>
+                  <pic:blipFill>
+                    <a:blip r:embed="rId94">
+                      <a:extLst>
+                        <a:ext uri="{28A0092B-C50C-407E-A947-70E740481C1C}">
+                          <a14:useLocalDpi xmlns:a14="http://schemas.microsoft.com/office/drawing/2010/main" val="0"/>
+                        </a:ext>
+                      </a:extLst>
+                    </a:blip>
+                    <a:srcRect/>
+                    <a:stretch>
+                      <a:fillRect/>
+                    </a:stretch>
+                  </pic:blipFill>
+                  <pic:spPr bwMode="auto">
+                    <a:xfrm>
+                      <a:off x="0" y="0"/>
+                      <a:ext cx="5943600" cy="3302635"/>
+                    </a:xfrm>
+                    <a:prstGeom prst="rect">
+                      <a:avLst/>
+                    </a:prstGeom>
+                    <a:noFill/>
+                    <a:ln>
+                      <a:noFill/>
+                    </a:ln>
+                  </pic:spPr>
+                </pic:pic>
+              </a:graphicData>
+            </a:graphic>
+          </wp:inline>
+        </w:drawing>
+      </w:r>
+    </w:p>
+    <w:p>
+      <w:r>
+        <w:rPr>
+          <w:noProof/>
+        </w:rPr>
+        <w:drawing>
+          <wp:inline distT="0" distB="0" distL="0" distR="0" wp14:anchorId="4C57C46C" wp14:editId="610978B0">
+            <wp:extent cx="5943600" cy="3348990"/>
+            <wp:effectExtent l="0" t="0" r="0" b="3810"/>
+            <wp:docPr id="528907116" name="Picture 26"/>
+            <wp:cNvGraphicFramePr>
+              <a:graphicFrameLocks xmlns:a="http://schemas.openxmlformats.org/drawingml/2006/main" noChangeAspect="1"/>
+            </wp:cNvGraphicFramePr>
+            <a:graphic xmlns:a="http://schemas.openxmlformats.org/drawingml/2006/main">
+              <a:graphicData uri="http://schemas.openxmlformats.org/drawingml/2006/picture">
+                <pic:pic xmlns:pic="http://schemas.openxmlformats.org/drawingml/2006/picture">
+                  <pic:nvPicPr>
+                    <pic:cNvPr id="0" name="Picture 24"/>
+                    <pic:cNvPicPr>
+                      <a:picLocks noChangeAspect="1" noChangeArrowheads="1"/>
+                    </pic:cNvPicPr>
+                  </pic:nvPicPr>
+                  <pic:blipFill>
+                    <a:blip r:embed="rId95">
+                      <a:extLst>
+                        <a:ext uri="{28A0092B-C50C-407E-A947-70E740481C1C}">
+                          <a14:useLocalDpi xmlns:a14="http://schemas.microsoft.com/office/drawing/2010/main" val="0"/>
+                        </a:ext>
+                      </a:extLst>
+                    </a:blip>
+                    <a:srcRect/>
+                    <a:stretch>
+                      <a:fillRect/>
+                    </a:stretch>
+                  </pic:blipFill>
+                  <pic:spPr bwMode="auto">
+                    <a:xfrm>
+                      <a:off x="0" y="0"/>
+                      <a:ext cx="5943600" cy="3348990"/>
+                    </a:xfrm>
+                    <a:prstGeom prst="rect">
+                      <a:avLst/>
+                    </a:prstGeom>
+                    <a:noFill/>
+                    <a:ln>
+                      <a:noFill/>
+                    </a:ln>
+                  </pic:spPr>
+                </pic:pic>
+              </a:graphicData>
+            </a:graphic>
+          </wp:inline>
+        </w:drawing>
+      </w:r>
+    </w:p>
+    <w:p>
+      <w:r>
+        <w:rPr>
+          <w:noProof/>
+        </w:rPr>
+        <w:lastRenderedPageBreak/>
+        <w:drawing>
+          <wp:inline distT="0" distB="0" distL="0" distR="0" wp14:anchorId="20113ECE" wp14:editId="075B4BE0">
+            <wp:extent cx="5943600" cy="3364230"/>
+            <wp:effectExtent l="0" t="0" r="0" b="7620"/>
+            <wp:docPr id="1128664918" name="Picture 27"/>
+            <wp:cNvGraphicFramePr>
+              <a:graphicFrameLocks xmlns:a="http://schemas.openxmlformats.org/drawingml/2006/main" noChangeAspect="1"/>
+            </wp:cNvGraphicFramePr>
+            <a:graphic xmlns:a="http://schemas.openxmlformats.org/drawingml/2006/main">
+              <a:graphicData uri="http://schemas.openxmlformats.org/drawingml/2006/picture">
+                <pic:pic xmlns:pic="http://schemas.openxmlformats.org/drawingml/2006/picture">
+                  <pic:nvPicPr>
+                    <pic:cNvPr id="0" name="Picture 25"/>
+                    <pic:cNvPicPr>
+                      <a:picLocks noChangeAspect="1" noChangeArrowheads="1"/>
+                    </pic:cNvPicPr>
+                  </pic:nvPicPr>
+                  <pic:blipFill>
+                    <a:blip r:embed="rId96">
+                      <a:extLst>
+                        <a:ext uri="{28A0092B-C50C-407E-A947-70E740481C1C}">
+                          <a14:useLocalDpi xmlns:a14="http://schemas.microsoft.com/office/drawing/2010/main" val="0"/>
+                        </a:ext>
+                      </a:extLst>
+                    </a:blip>
+                    <a:srcRect/>
+                    <a:stretch>
+                      <a:fillRect/>
+                    </a:stretch>
+                  </pic:blipFill>
+                  <pic:spPr bwMode="auto">
+                    <a:xfrm>
+                      <a:off x="0" y="0"/>
+                      <a:ext cx="5943600" cy="3364230"/>
+                    </a:xfrm>
+                    <a:prstGeom prst="rect">
+                      <a:avLst/>
+                    </a:prstGeom>
+                    <a:noFill/>
+                    <a:ln>
+                      <a:noFill/>
+                    </a:ln>
+                  </pic:spPr>
+                </pic:pic>
+              </a:graphicData>
+            </a:graphic>
+          </wp:inline>
+        </w:drawing>
+      </w:r>
+    </w:p>
+    <w:p/>
     <w:p/>
     <w:sectPr>
       <w:pgSz w:w="12240" w:h="15840"/>
@@ -7663,6 +7740,49 @@
     <w:name w:val="Normal"/>
     <w:qFormat/>
   </w:style>
+  <w:style w:type="paragraph" w:styleId="Heading1">
+    <w:name w:val="heading 1"/>
+    <w:basedOn w:val="Normal"/>
+    <w:next w:val="Normal"/>
+    <w:link w:val="Heading1Char"/>
+    <w:uiPriority w:val="9"/>
+    <w:qFormat/>
+    <w:rsid w:val="00901CBA"/>
+    <w:pPr>
+      <w:keepNext/>
+      <w:keepLines/>
+      <w:spacing w:before="240" w:after="0"/>
+      <w:outlineLvl w:val="0"/>
+    </w:pPr>
+    <w:rPr>
+      <w:rFonts w:asciiTheme="majorHAnsi" w:eastAsiaTheme="majorEastAsia" w:hAnsiTheme="majorHAnsi" w:cstheme="majorBidi"/>
+      <w:color w:val="2F5496" w:themeColor="accent1" w:themeShade="BF"/>
+      <w:sz w:val="32"/>
+      <w:szCs w:val="32"/>
+    </w:rPr>
+  </w:style>
+  <w:style w:type="paragraph" w:styleId="Heading2">
+    <w:name w:val="heading 2"/>
+    <w:basedOn w:val="Normal"/>
+    <w:next w:val="Normal"/>
+    <w:link w:val="Heading2Char"/>
+    <w:uiPriority w:val="9"/>
+    <w:unhideWhenUsed/>
+    <w:qFormat/>
+    <w:rsid w:val="003838EB"/>
+    <w:pPr>
+      <w:keepNext/>
+      <w:keepLines/>
+      <w:spacing w:before="40" w:after="0"/>
+      <w:outlineLvl w:val="1"/>
+    </w:pPr>
+    <w:rPr>
+      <w:rFonts w:asciiTheme="majorHAnsi" w:eastAsiaTheme="majorEastAsia" w:hAnsiTheme="majorHAnsi" w:cstheme="majorBidi"/>
+      <w:color w:val="2F5496" w:themeColor="accent1" w:themeShade="BF"/>
+      <w:sz w:val="26"/>
+      <w:szCs w:val="26"/>
+    </w:rPr>
+  </w:style>
   <w:style w:type="character" w:default="1" w:styleId="DefaultParagraphFont">
     <w:name w:val="Default Paragraph Font"/>
     <w:uiPriority w:val="1"/>
@@ -7762,6 +7882,32 @@
     <w:name w:val="gnvwddmdl3b"/>
     <w:basedOn w:val="DefaultParagraphFont"/>
     <w:rsid w:val="00650D6E"/>
+  </w:style>
+  <w:style w:type="character" w:customStyle="1" w:styleId="Heading1Char">
+    <w:name w:val="Heading 1 Char"/>
+    <w:basedOn w:val="DefaultParagraphFont"/>
+    <w:link w:val="Heading1"/>
+    <w:uiPriority w:val="9"/>
+    <w:rsid w:val="00901CBA"/>
+    <w:rPr>
+      <w:rFonts w:asciiTheme="majorHAnsi" w:eastAsiaTheme="majorEastAsia" w:hAnsiTheme="majorHAnsi" w:cstheme="majorBidi"/>
+      <w:color w:val="2F5496" w:themeColor="accent1" w:themeShade="BF"/>
+      <w:sz w:val="32"/>
+      <w:szCs w:val="32"/>
+    </w:rPr>
+  </w:style>
+  <w:style w:type="character" w:customStyle="1" w:styleId="Heading2Char">
+    <w:name w:val="Heading 2 Char"/>
+    <w:basedOn w:val="DefaultParagraphFont"/>
+    <w:link w:val="Heading2"/>
+    <w:uiPriority w:val="9"/>
+    <w:rsid w:val="003838EB"/>
+    <w:rPr>
+      <w:rFonts w:asciiTheme="majorHAnsi" w:eastAsiaTheme="majorEastAsia" w:hAnsiTheme="majorHAnsi" w:cstheme="majorBidi"/>
+      <w:color w:val="2F5496" w:themeColor="accent1" w:themeShade="BF"/>
+      <w:sz w:val="26"/>
+      <w:szCs w:val="26"/>
+    </w:rPr>
   </w:style>
 </w:styles>
 </file>
@@ -8059,4 +8205,10 @@
     </a:ext>
   </a:extLst>
 </a:theme>
+</file>
+
+<file path=docMetadata/LabelInfo.xml><?xml version="1.0" encoding="utf-8"?>
+<clbl:labelList xmlns:clbl="http://schemas.microsoft.com/office/2020/mipLabelMetadata">
+  <clbl:label id="{7cf48d45-3ddb-4389-a9c1-c115526eb52e}" enabled="0" method="" siteId="{7cf48d45-3ddb-4389-a9c1-c115526eb52e}" removed="1"/>
+</clbl:labelList>
 </file>
</xml_diff>

<commit_message>
Need to redo Standards
The Standards Names PerSTDA and PerSTD are not consistent through out 2021, therefore need to be selected manually!!!!!!
</commit_message>
<xml_diff>
--- a/StrategicTillage_GC_Analysis_workFlow.docx
+++ b/StrategicTillage_GC_Analysis_workFlow.docx
@@ -5944,12 +5944,1797 @@
         <w:pStyle w:val="Heading2"/>
       </w:pPr>
       <w:r>
+        <w:t>S</w:t>
+      </w:r>
+      <w:r>
+        <w:t>tandards concentrations</w:t>
+      </w:r>
+    </w:p>
+    <w:tbl>
+      <w:tblPr>
+        <w:tblW w:w="8312" w:type="dxa"/>
+        <w:tblCellMar>
+          <w:top w:w="15" w:type="dxa"/>
+          <w:bottom w:w="15" w:type="dxa"/>
+        </w:tblCellMar>
+        <w:tblLook w:val="04A0" w:firstRow="1" w:lastRow="0" w:firstColumn="1" w:lastColumn="0" w:noHBand="0" w:noVBand="1"/>
+      </w:tblPr>
+      <w:tblGrid>
+        <w:gridCol w:w="1500"/>
+        <w:gridCol w:w="1360"/>
+        <w:gridCol w:w="959"/>
+        <w:gridCol w:w="1500"/>
+        <w:gridCol w:w="1500"/>
+        <w:gridCol w:w="1493"/>
+      </w:tblGrid>
+      <w:tr>
+        <w:trPr>
+          <w:trHeight w:val="300"/>
+        </w:trPr>
+        <w:tc>
+          <w:tcPr>
+            <w:tcW w:w="1500" w:type="dxa"/>
+            <w:tcBorders>
+              <w:top w:val="single" w:sz="4" w:space="0" w:color="000000"/>
+              <w:left w:val="single" w:sz="4" w:space="0" w:color="000000"/>
+              <w:bottom w:val="single" w:sz="4" w:space="0" w:color="000000"/>
+              <w:right w:val="single" w:sz="4" w:space="0" w:color="000000"/>
+            </w:tcBorders>
+            <w:noWrap/>
+            <w:vAlign w:val="center"/>
+            <w:hideMark/>
+          </w:tcPr>
+          <w:p>
+            <w:pPr>
+              <w:spacing w:after="0" w:line="240" w:lineRule="auto"/>
+              <w:rPr>
+                <w:rFonts w:ascii="Times New Roman" w:eastAsia="Times New Roman" w:hAnsi="Times New Roman" w:cs="Times New Roman"/>
+                <w:kern w:val="0"/>
+                <w:sz w:val="24"/>
+                <w:szCs w:val="24"/>
+                <w14:ligatures w14:val="none"/>
+              </w:rPr>
+            </w:pPr>
+          </w:p>
+        </w:tc>
+        <w:tc>
+          <w:tcPr>
+            <w:tcW w:w="1360" w:type="dxa"/>
+            <w:tcBorders>
+              <w:top w:val="single" w:sz="4" w:space="0" w:color="000000"/>
+              <w:left w:val="single" w:sz="4" w:space="0" w:color="000000"/>
+              <w:bottom w:val="single" w:sz="4" w:space="0" w:color="000000"/>
+              <w:right w:val="single" w:sz="4" w:space="0" w:color="000000"/>
+            </w:tcBorders>
+            <w:noWrap/>
+            <w:vAlign w:val="center"/>
+            <w:hideMark/>
+          </w:tcPr>
+          <w:p>
+            <w:pPr>
+              <w:spacing w:after="0" w:line="240" w:lineRule="auto"/>
+              <w:rPr>
+                <w:rFonts w:ascii="Times New Roman" w:eastAsia="Times New Roman" w:hAnsi="Times New Roman" w:cs="Times New Roman"/>
+                <w:kern w:val="0"/>
+                <w:sz w:val="20"/>
+                <w:szCs w:val="20"/>
+                <w14:ligatures w14:val="none"/>
+              </w:rPr>
+            </w:pPr>
+          </w:p>
+        </w:tc>
+        <w:tc>
+          <w:tcPr>
+            <w:tcW w:w="959" w:type="dxa"/>
+            <w:tcBorders>
+              <w:top w:val="single" w:sz="4" w:space="0" w:color="000000"/>
+              <w:left w:val="single" w:sz="4" w:space="0" w:color="000000"/>
+              <w:bottom w:val="single" w:sz="4" w:space="0" w:color="000000"/>
+              <w:right w:val="single" w:sz="4" w:space="0" w:color="000000"/>
+            </w:tcBorders>
+            <w:noWrap/>
+            <w:vAlign w:val="center"/>
+            <w:hideMark/>
+          </w:tcPr>
+          <w:p>
+            <w:pPr>
+              <w:spacing w:after="0" w:line="240" w:lineRule="auto"/>
+              <w:rPr>
+                <w:rFonts w:ascii="Times New Roman" w:eastAsia="Times New Roman" w:hAnsi="Times New Roman" w:cs="Times New Roman"/>
+                <w:kern w:val="0"/>
+                <w:sz w:val="20"/>
+                <w:szCs w:val="20"/>
+                <w14:ligatures w14:val="none"/>
+              </w:rPr>
+            </w:pPr>
+          </w:p>
+        </w:tc>
+        <w:tc>
+          <w:tcPr>
+            <w:tcW w:w="1500" w:type="dxa"/>
+            <w:tcBorders>
+              <w:top w:val="single" w:sz="4" w:space="0" w:color="000000"/>
+              <w:left w:val="single" w:sz="4" w:space="0" w:color="000000"/>
+              <w:bottom w:val="single" w:sz="4" w:space="0" w:color="000000"/>
+              <w:right w:val="single" w:sz="4" w:space="0" w:color="000000"/>
+            </w:tcBorders>
+            <w:noWrap/>
+            <w:vAlign w:val="center"/>
+            <w:hideMark/>
+          </w:tcPr>
+          <w:p>
+            <w:pPr>
+              <w:spacing w:after="0" w:line="240" w:lineRule="auto"/>
+              <w:rPr>
+                <w:rFonts w:ascii="Calibri" w:eastAsia="Times New Roman" w:hAnsi="Calibri" w:cs="Calibri"/>
+                <w:kern w:val="0"/>
+                <w:sz w:val="24"/>
+                <w:szCs w:val="24"/>
+                <w14:ligatures w14:val="none"/>
+              </w:rPr>
+            </w:pPr>
+            <w:r>
+              <w:rPr>
+                <w:rFonts w:ascii="Calibri" w:eastAsia="Times New Roman" w:hAnsi="Calibri" w:cs="Calibri"/>
+                <w:kern w:val="0"/>
+                <w:sz w:val="24"/>
+                <w:szCs w:val="24"/>
+                <w14:ligatures w14:val="none"/>
+              </w:rPr>
+              <w:t>CH4</w:t>
+            </w:r>
+          </w:p>
+        </w:tc>
+        <w:tc>
+          <w:tcPr>
+            <w:tcW w:w="1500" w:type="dxa"/>
+            <w:tcBorders>
+              <w:top w:val="single" w:sz="4" w:space="0" w:color="000000"/>
+              <w:left w:val="single" w:sz="4" w:space="0" w:color="000000"/>
+              <w:bottom w:val="single" w:sz="4" w:space="0" w:color="000000"/>
+              <w:right w:val="single" w:sz="4" w:space="0" w:color="000000"/>
+            </w:tcBorders>
+            <w:noWrap/>
+            <w:vAlign w:val="center"/>
+            <w:hideMark/>
+          </w:tcPr>
+          <w:p>
+            <w:pPr>
+              <w:spacing w:after="0" w:line="240" w:lineRule="auto"/>
+              <w:rPr>
+                <w:rFonts w:ascii="Calibri" w:eastAsia="Times New Roman" w:hAnsi="Calibri" w:cs="Calibri"/>
+                <w:kern w:val="0"/>
+                <w:sz w:val="24"/>
+                <w:szCs w:val="24"/>
+                <w14:ligatures w14:val="none"/>
+              </w:rPr>
+            </w:pPr>
+            <w:r>
+              <w:rPr>
+                <w:rFonts w:ascii="Calibri" w:eastAsia="Times New Roman" w:hAnsi="Calibri" w:cs="Calibri"/>
+                <w:kern w:val="0"/>
+                <w:sz w:val="24"/>
+                <w:szCs w:val="24"/>
+                <w14:ligatures w14:val="none"/>
+              </w:rPr>
+              <w:t>CO2</w:t>
+            </w:r>
+          </w:p>
+        </w:tc>
+        <w:tc>
+          <w:tcPr>
+            <w:tcW w:w="1493" w:type="dxa"/>
+            <w:tcBorders>
+              <w:top w:val="single" w:sz="4" w:space="0" w:color="000000"/>
+              <w:left w:val="single" w:sz="4" w:space="0" w:color="000000"/>
+              <w:bottom w:val="single" w:sz="4" w:space="0" w:color="000000"/>
+              <w:right w:val="single" w:sz="4" w:space="0" w:color="000000"/>
+            </w:tcBorders>
+            <w:noWrap/>
+            <w:vAlign w:val="center"/>
+            <w:hideMark/>
+          </w:tcPr>
+          <w:p>
+            <w:pPr>
+              <w:spacing w:after="0" w:line="240" w:lineRule="auto"/>
+              <w:rPr>
+                <w:rFonts w:ascii="Calibri" w:eastAsia="Times New Roman" w:hAnsi="Calibri" w:cs="Calibri"/>
+                <w:kern w:val="0"/>
+                <w:sz w:val="24"/>
+                <w:szCs w:val="24"/>
+                <w14:ligatures w14:val="none"/>
+              </w:rPr>
+            </w:pPr>
+            <w:r>
+              <w:rPr>
+                <w:rFonts w:ascii="Calibri" w:eastAsia="Times New Roman" w:hAnsi="Calibri" w:cs="Calibri"/>
+                <w:kern w:val="0"/>
+                <w:sz w:val="24"/>
+                <w:szCs w:val="24"/>
+                <w14:ligatures w14:val="none"/>
+              </w:rPr>
+              <w:t>N2O</w:t>
+            </w:r>
+          </w:p>
+        </w:tc>
+      </w:tr>
+      <w:tr>
+        <w:trPr>
+          <w:trHeight w:val="300"/>
+        </w:trPr>
+        <w:tc>
+          <w:tcPr>
+            <w:tcW w:w="1500" w:type="dxa"/>
+            <w:tcBorders>
+              <w:top w:val="single" w:sz="4" w:space="0" w:color="000000"/>
+              <w:left w:val="single" w:sz="4" w:space="0" w:color="000000"/>
+              <w:bottom w:val="single" w:sz="4" w:space="0" w:color="000000"/>
+              <w:right w:val="single" w:sz="4" w:space="0" w:color="000000"/>
+            </w:tcBorders>
+            <w:noWrap/>
+            <w:vAlign w:val="center"/>
+            <w:hideMark/>
+          </w:tcPr>
+          <w:p>
+            <w:pPr>
+              <w:spacing w:after="0" w:line="240" w:lineRule="auto"/>
+              <w:rPr>
+                <w:rFonts w:ascii="Calibri" w:eastAsia="Times New Roman" w:hAnsi="Calibri" w:cs="Calibri"/>
+                <w:kern w:val="0"/>
+                <w:sz w:val="24"/>
+                <w:szCs w:val="24"/>
+                <w14:ligatures w14:val="none"/>
+              </w:rPr>
+            </w:pPr>
+            <w:r>
+              <w:rPr>
+                <w:rFonts w:ascii="Calibri" w:eastAsia="Times New Roman" w:hAnsi="Calibri" w:cs="Calibri"/>
+                <w:kern w:val="0"/>
+                <w:sz w:val="24"/>
+                <w:szCs w:val="24"/>
+                <w14:ligatures w14:val="none"/>
+              </w:rPr>
+              <w:t>25perSTDA</w:t>
+            </w:r>
+          </w:p>
+        </w:tc>
+        <w:tc>
+          <w:tcPr>
+            <w:tcW w:w="1360" w:type="dxa"/>
+            <w:tcBorders>
+              <w:top w:val="single" w:sz="4" w:space="0" w:color="000000"/>
+              <w:left w:val="single" w:sz="4" w:space="0" w:color="000000"/>
+              <w:bottom w:val="single" w:sz="4" w:space="0" w:color="000000"/>
+              <w:right w:val="single" w:sz="4" w:space="0" w:color="000000"/>
+            </w:tcBorders>
+            <w:noWrap/>
+            <w:vAlign w:val="center"/>
+            <w:hideMark/>
+          </w:tcPr>
+          <w:p>
+            <w:pPr>
+              <w:spacing w:after="0" w:line="240" w:lineRule="auto"/>
+              <w:rPr>
+                <w:rFonts w:ascii="Calibri" w:eastAsia="Times New Roman" w:hAnsi="Calibri" w:cs="Calibri"/>
+                <w:kern w:val="0"/>
+                <w:sz w:val="24"/>
+                <w:szCs w:val="24"/>
+                <w14:ligatures w14:val="none"/>
+              </w:rPr>
+            </w:pPr>
+            <w:r>
+              <w:rPr>
+                <w:rFonts w:ascii="Calibri" w:eastAsia="Times New Roman" w:hAnsi="Calibri" w:cs="Calibri"/>
+                <w:kern w:val="0"/>
+                <w:sz w:val="24"/>
+                <w:szCs w:val="24"/>
+                <w14:ligatures w14:val="none"/>
+              </w:rPr>
+              <w:t xml:space="preserve">ppm </w:t>
+            </w:r>
+          </w:p>
+        </w:tc>
+        <w:tc>
+          <w:tcPr>
+            <w:tcW w:w="959" w:type="dxa"/>
+            <w:tcBorders>
+              <w:top w:val="single" w:sz="4" w:space="0" w:color="000000"/>
+              <w:left w:val="single" w:sz="4" w:space="0" w:color="000000"/>
+              <w:bottom w:val="single" w:sz="4" w:space="0" w:color="000000"/>
+              <w:right w:val="single" w:sz="4" w:space="0" w:color="000000"/>
+            </w:tcBorders>
+            <w:noWrap/>
+            <w:vAlign w:val="center"/>
+            <w:hideMark/>
+          </w:tcPr>
+          <w:p>
+            <w:pPr>
+              <w:spacing w:after="0" w:line="240" w:lineRule="auto"/>
+              <w:rPr>
+                <w:rFonts w:ascii="Calibri" w:eastAsia="Times New Roman" w:hAnsi="Calibri" w:cs="Calibri"/>
+                <w:kern w:val="0"/>
+                <w:sz w:val="24"/>
+                <w:szCs w:val="24"/>
+                <w14:ligatures w14:val="none"/>
+              </w:rPr>
+            </w:pPr>
+            <w:r>
+              <w:rPr>
+                <w:rFonts w:ascii="Calibri" w:eastAsia="Times New Roman" w:hAnsi="Calibri" w:cs="Calibri"/>
+                <w:kern w:val="0"/>
+                <w:sz w:val="24"/>
+                <w:szCs w:val="24"/>
+                <w14:ligatures w14:val="none"/>
+              </w:rPr>
+              <w:t>uL/Lgas</w:t>
+            </w:r>
+          </w:p>
+        </w:tc>
+        <w:tc>
+          <w:tcPr>
+            <w:tcW w:w="1500" w:type="dxa"/>
+            <w:tcBorders>
+              <w:top w:val="single" w:sz="4" w:space="0" w:color="000000"/>
+              <w:left w:val="single" w:sz="4" w:space="0" w:color="000000"/>
+              <w:bottom w:val="single" w:sz="4" w:space="0" w:color="000000"/>
+              <w:right w:val="single" w:sz="4" w:space="0" w:color="000000"/>
+            </w:tcBorders>
+            <w:noWrap/>
+            <w:vAlign w:val="center"/>
+            <w:hideMark/>
+          </w:tcPr>
+          <w:p>
+            <w:pPr>
+              <w:spacing w:after="0" w:line="240" w:lineRule="auto"/>
+              <w:jc w:val="right"/>
+              <w:rPr>
+                <w:rFonts w:ascii="Calibri" w:eastAsia="Times New Roman" w:hAnsi="Calibri" w:cs="Calibri"/>
+                <w:kern w:val="0"/>
+                <w:sz w:val="24"/>
+                <w:szCs w:val="24"/>
+                <w14:ligatures w14:val="none"/>
+              </w:rPr>
+            </w:pPr>
+            <w:r>
+              <w:rPr>
+                <w:rFonts w:ascii="Calibri" w:eastAsia="Times New Roman" w:hAnsi="Calibri" w:cs="Calibri"/>
+                <w:kern w:val="0"/>
+                <w:sz w:val="24"/>
+                <w:szCs w:val="24"/>
+                <w14:ligatures w14:val="none"/>
+              </w:rPr>
+              <w:t>1.25</w:t>
+            </w:r>
+          </w:p>
+        </w:tc>
+        <w:tc>
+          <w:tcPr>
+            <w:tcW w:w="1500" w:type="dxa"/>
+            <w:tcBorders>
+              <w:top w:val="single" w:sz="4" w:space="0" w:color="000000"/>
+              <w:left w:val="single" w:sz="4" w:space="0" w:color="000000"/>
+              <w:bottom w:val="single" w:sz="4" w:space="0" w:color="000000"/>
+              <w:right w:val="single" w:sz="4" w:space="0" w:color="000000"/>
+            </w:tcBorders>
+            <w:noWrap/>
+            <w:vAlign w:val="center"/>
+            <w:hideMark/>
+          </w:tcPr>
+          <w:p>
+            <w:pPr>
+              <w:spacing w:after="0" w:line="240" w:lineRule="auto"/>
+              <w:jc w:val="right"/>
+              <w:rPr>
+                <w:rFonts w:ascii="Calibri" w:eastAsia="Times New Roman" w:hAnsi="Calibri" w:cs="Calibri"/>
+                <w:kern w:val="0"/>
+                <w:sz w:val="24"/>
+                <w:szCs w:val="24"/>
+                <w14:ligatures w14:val="none"/>
+              </w:rPr>
+            </w:pPr>
+            <w:r>
+              <w:rPr>
+                <w:rFonts w:ascii="Calibri" w:eastAsia="Times New Roman" w:hAnsi="Calibri" w:cs="Calibri"/>
+                <w:kern w:val="0"/>
+                <w:sz w:val="24"/>
+                <w:szCs w:val="24"/>
+                <w14:ligatures w14:val="none"/>
+              </w:rPr>
+              <w:t>125</w:t>
+            </w:r>
+          </w:p>
+        </w:tc>
+        <w:tc>
+          <w:tcPr>
+            <w:tcW w:w="1493" w:type="dxa"/>
+            <w:tcBorders>
+              <w:top w:val="single" w:sz="4" w:space="0" w:color="000000"/>
+              <w:left w:val="single" w:sz="4" w:space="0" w:color="000000"/>
+              <w:bottom w:val="single" w:sz="4" w:space="0" w:color="000000"/>
+              <w:right w:val="single" w:sz="4" w:space="0" w:color="000000"/>
+            </w:tcBorders>
+            <w:noWrap/>
+            <w:vAlign w:val="center"/>
+            <w:hideMark/>
+          </w:tcPr>
+          <w:p>
+            <w:pPr>
+              <w:spacing w:after="0" w:line="240" w:lineRule="auto"/>
+              <w:jc w:val="right"/>
+              <w:rPr>
+                <w:rFonts w:ascii="Calibri" w:eastAsia="Times New Roman" w:hAnsi="Calibri" w:cs="Calibri"/>
+                <w:kern w:val="0"/>
+                <w:sz w:val="24"/>
+                <w:szCs w:val="24"/>
+                <w14:ligatures w14:val="none"/>
+              </w:rPr>
+            </w:pPr>
+            <w:r>
+              <w:rPr>
+                <w:rFonts w:ascii="Calibri" w:eastAsia="Times New Roman" w:hAnsi="Calibri" w:cs="Calibri"/>
+                <w:kern w:val="0"/>
+                <w:sz w:val="24"/>
+                <w:szCs w:val="24"/>
+                <w14:ligatures w14:val="none"/>
+              </w:rPr>
+              <w:t>0.25</w:t>
+            </w:r>
+          </w:p>
+        </w:tc>
+      </w:tr>
+      <w:tr>
+        <w:trPr>
+          <w:trHeight w:val="300"/>
+        </w:trPr>
+        <w:tc>
+          <w:tcPr>
+            <w:tcW w:w="1500" w:type="dxa"/>
+            <w:tcBorders>
+              <w:top w:val="single" w:sz="4" w:space="0" w:color="000000"/>
+              <w:left w:val="single" w:sz="4" w:space="0" w:color="000000"/>
+              <w:bottom w:val="single" w:sz="4" w:space="0" w:color="000000"/>
+              <w:right w:val="single" w:sz="4" w:space="0" w:color="000000"/>
+            </w:tcBorders>
+            <w:noWrap/>
+            <w:vAlign w:val="center"/>
+            <w:hideMark/>
+          </w:tcPr>
+          <w:p>
+            <w:pPr>
+              <w:spacing w:after="0" w:line="240" w:lineRule="auto"/>
+              <w:rPr>
+                <w:rFonts w:ascii="Calibri" w:eastAsia="Times New Roman" w:hAnsi="Calibri" w:cs="Calibri"/>
+                <w:kern w:val="0"/>
+                <w:sz w:val="24"/>
+                <w:szCs w:val="24"/>
+                <w14:ligatures w14:val="none"/>
+              </w:rPr>
+            </w:pPr>
+            <w:r>
+              <w:rPr>
+                <w:rFonts w:ascii="Calibri" w:eastAsia="Times New Roman" w:hAnsi="Calibri" w:cs="Calibri"/>
+                <w:kern w:val="0"/>
+                <w:sz w:val="24"/>
+                <w:szCs w:val="24"/>
+                <w14:ligatures w14:val="none"/>
+              </w:rPr>
+              <w:t>50perSTDA</w:t>
+            </w:r>
+          </w:p>
+        </w:tc>
+        <w:tc>
+          <w:tcPr>
+            <w:tcW w:w="1360" w:type="dxa"/>
+            <w:tcBorders>
+              <w:top w:val="single" w:sz="4" w:space="0" w:color="000000"/>
+              <w:left w:val="single" w:sz="4" w:space="0" w:color="000000"/>
+              <w:bottom w:val="single" w:sz="4" w:space="0" w:color="000000"/>
+              <w:right w:val="single" w:sz="4" w:space="0" w:color="000000"/>
+            </w:tcBorders>
+            <w:noWrap/>
+            <w:vAlign w:val="center"/>
+            <w:hideMark/>
+          </w:tcPr>
+          <w:p>
+            <w:pPr>
+              <w:spacing w:after="0" w:line="240" w:lineRule="auto"/>
+              <w:rPr>
+                <w:rFonts w:ascii="Calibri" w:eastAsia="Times New Roman" w:hAnsi="Calibri" w:cs="Calibri"/>
+                <w:kern w:val="0"/>
+                <w:sz w:val="24"/>
+                <w:szCs w:val="24"/>
+                <w14:ligatures w14:val="none"/>
+              </w:rPr>
+            </w:pPr>
+            <w:r>
+              <w:rPr>
+                <w:rFonts w:ascii="Calibri" w:eastAsia="Times New Roman" w:hAnsi="Calibri" w:cs="Calibri"/>
+                <w:kern w:val="0"/>
+                <w:sz w:val="24"/>
+                <w:szCs w:val="24"/>
+                <w14:ligatures w14:val="none"/>
+              </w:rPr>
+              <w:t xml:space="preserve">ppm </w:t>
+            </w:r>
+          </w:p>
+        </w:tc>
+        <w:tc>
+          <w:tcPr>
+            <w:tcW w:w="959" w:type="dxa"/>
+            <w:tcBorders>
+              <w:top w:val="single" w:sz="4" w:space="0" w:color="000000"/>
+              <w:left w:val="single" w:sz="4" w:space="0" w:color="000000"/>
+              <w:bottom w:val="single" w:sz="4" w:space="0" w:color="000000"/>
+              <w:right w:val="single" w:sz="4" w:space="0" w:color="000000"/>
+            </w:tcBorders>
+            <w:noWrap/>
+            <w:vAlign w:val="center"/>
+            <w:hideMark/>
+          </w:tcPr>
+          <w:p>
+            <w:pPr>
+              <w:spacing w:after="0" w:line="240" w:lineRule="auto"/>
+              <w:rPr>
+                <w:rFonts w:ascii="Calibri" w:eastAsia="Times New Roman" w:hAnsi="Calibri" w:cs="Calibri"/>
+                <w:kern w:val="0"/>
+                <w:sz w:val="24"/>
+                <w:szCs w:val="24"/>
+                <w14:ligatures w14:val="none"/>
+              </w:rPr>
+            </w:pPr>
+            <w:r>
+              <w:rPr>
+                <w:rFonts w:ascii="Calibri" w:eastAsia="Times New Roman" w:hAnsi="Calibri" w:cs="Calibri"/>
+                <w:kern w:val="0"/>
+                <w:sz w:val="24"/>
+                <w:szCs w:val="24"/>
+                <w14:ligatures w14:val="none"/>
+              </w:rPr>
+              <w:t>uL/Lgas</w:t>
+            </w:r>
+          </w:p>
+        </w:tc>
+        <w:tc>
+          <w:tcPr>
+            <w:tcW w:w="1500" w:type="dxa"/>
+            <w:tcBorders>
+              <w:top w:val="single" w:sz="4" w:space="0" w:color="000000"/>
+              <w:left w:val="single" w:sz="4" w:space="0" w:color="000000"/>
+              <w:bottom w:val="single" w:sz="4" w:space="0" w:color="000000"/>
+              <w:right w:val="single" w:sz="4" w:space="0" w:color="000000"/>
+            </w:tcBorders>
+            <w:noWrap/>
+            <w:vAlign w:val="center"/>
+            <w:hideMark/>
+          </w:tcPr>
+          <w:p>
+            <w:pPr>
+              <w:spacing w:after="0" w:line="240" w:lineRule="auto"/>
+              <w:jc w:val="right"/>
+              <w:rPr>
+                <w:rFonts w:ascii="Calibri" w:eastAsia="Times New Roman" w:hAnsi="Calibri" w:cs="Calibri"/>
+                <w:kern w:val="0"/>
+                <w:sz w:val="24"/>
+                <w:szCs w:val="24"/>
+                <w14:ligatures w14:val="none"/>
+              </w:rPr>
+            </w:pPr>
+            <w:r>
+              <w:rPr>
+                <w:rFonts w:ascii="Calibri" w:eastAsia="Times New Roman" w:hAnsi="Calibri" w:cs="Calibri"/>
+                <w:kern w:val="0"/>
+                <w:sz w:val="24"/>
+                <w:szCs w:val="24"/>
+                <w14:ligatures w14:val="none"/>
+              </w:rPr>
+              <w:t>2.5</w:t>
+            </w:r>
+          </w:p>
+        </w:tc>
+        <w:tc>
+          <w:tcPr>
+            <w:tcW w:w="1500" w:type="dxa"/>
+            <w:tcBorders>
+              <w:top w:val="single" w:sz="4" w:space="0" w:color="000000"/>
+              <w:left w:val="single" w:sz="4" w:space="0" w:color="000000"/>
+              <w:bottom w:val="single" w:sz="4" w:space="0" w:color="000000"/>
+              <w:right w:val="single" w:sz="4" w:space="0" w:color="000000"/>
+            </w:tcBorders>
+            <w:noWrap/>
+            <w:vAlign w:val="center"/>
+            <w:hideMark/>
+          </w:tcPr>
+          <w:p>
+            <w:pPr>
+              <w:spacing w:after="0" w:line="240" w:lineRule="auto"/>
+              <w:jc w:val="right"/>
+              <w:rPr>
+                <w:rFonts w:ascii="Calibri" w:eastAsia="Times New Roman" w:hAnsi="Calibri" w:cs="Calibri"/>
+                <w:kern w:val="0"/>
+                <w:sz w:val="24"/>
+                <w:szCs w:val="24"/>
+                <w14:ligatures w14:val="none"/>
+              </w:rPr>
+            </w:pPr>
+            <w:r>
+              <w:rPr>
+                <w:rFonts w:ascii="Calibri" w:eastAsia="Times New Roman" w:hAnsi="Calibri" w:cs="Calibri"/>
+                <w:kern w:val="0"/>
+                <w:sz w:val="24"/>
+                <w:szCs w:val="24"/>
+                <w14:ligatures w14:val="none"/>
+              </w:rPr>
+              <w:t>250</w:t>
+            </w:r>
+          </w:p>
+        </w:tc>
+        <w:tc>
+          <w:tcPr>
+            <w:tcW w:w="1493" w:type="dxa"/>
+            <w:tcBorders>
+              <w:top w:val="single" w:sz="4" w:space="0" w:color="000000"/>
+              <w:left w:val="single" w:sz="4" w:space="0" w:color="000000"/>
+              <w:bottom w:val="single" w:sz="4" w:space="0" w:color="000000"/>
+              <w:right w:val="single" w:sz="4" w:space="0" w:color="000000"/>
+            </w:tcBorders>
+            <w:noWrap/>
+            <w:vAlign w:val="center"/>
+            <w:hideMark/>
+          </w:tcPr>
+          <w:p>
+            <w:pPr>
+              <w:spacing w:after="0" w:line="240" w:lineRule="auto"/>
+              <w:jc w:val="right"/>
+              <w:rPr>
+                <w:rFonts w:ascii="Calibri" w:eastAsia="Times New Roman" w:hAnsi="Calibri" w:cs="Calibri"/>
+                <w:kern w:val="0"/>
+                <w:sz w:val="24"/>
+                <w:szCs w:val="24"/>
+                <w14:ligatures w14:val="none"/>
+              </w:rPr>
+            </w:pPr>
+            <w:r>
+              <w:rPr>
+                <w:rFonts w:ascii="Calibri" w:eastAsia="Times New Roman" w:hAnsi="Calibri" w:cs="Calibri"/>
+                <w:kern w:val="0"/>
+                <w:sz w:val="24"/>
+                <w:szCs w:val="24"/>
+                <w14:ligatures w14:val="none"/>
+              </w:rPr>
+              <w:t>0.5</w:t>
+            </w:r>
+          </w:p>
+        </w:tc>
+      </w:tr>
+      <w:tr>
+        <w:trPr>
+          <w:trHeight w:val="300"/>
+        </w:trPr>
+        <w:tc>
+          <w:tcPr>
+            <w:tcW w:w="1500" w:type="dxa"/>
+            <w:tcBorders>
+              <w:top w:val="single" w:sz="4" w:space="0" w:color="000000"/>
+              <w:left w:val="single" w:sz="4" w:space="0" w:color="000000"/>
+              <w:bottom w:val="single" w:sz="4" w:space="0" w:color="000000"/>
+              <w:right w:val="single" w:sz="4" w:space="0" w:color="000000"/>
+            </w:tcBorders>
+            <w:noWrap/>
+            <w:vAlign w:val="center"/>
+            <w:hideMark/>
+          </w:tcPr>
+          <w:p>
+            <w:pPr>
+              <w:spacing w:after="0" w:line="240" w:lineRule="auto"/>
+              <w:rPr>
+                <w:rFonts w:ascii="Calibri" w:eastAsia="Times New Roman" w:hAnsi="Calibri" w:cs="Calibri"/>
+                <w:kern w:val="0"/>
+                <w:sz w:val="24"/>
+                <w:szCs w:val="24"/>
+                <w14:ligatures w14:val="none"/>
+              </w:rPr>
+            </w:pPr>
+            <w:r>
+              <w:rPr>
+                <w:rFonts w:ascii="Calibri" w:eastAsia="Times New Roman" w:hAnsi="Calibri" w:cs="Calibri"/>
+                <w:kern w:val="0"/>
+                <w:sz w:val="24"/>
+                <w:szCs w:val="24"/>
+                <w14:ligatures w14:val="none"/>
+              </w:rPr>
+              <w:t>75perSTDA</w:t>
+            </w:r>
+          </w:p>
+        </w:tc>
+        <w:tc>
+          <w:tcPr>
+            <w:tcW w:w="1360" w:type="dxa"/>
+            <w:tcBorders>
+              <w:top w:val="single" w:sz="4" w:space="0" w:color="000000"/>
+              <w:left w:val="single" w:sz="4" w:space="0" w:color="000000"/>
+              <w:bottom w:val="single" w:sz="4" w:space="0" w:color="000000"/>
+              <w:right w:val="single" w:sz="4" w:space="0" w:color="000000"/>
+            </w:tcBorders>
+            <w:noWrap/>
+            <w:vAlign w:val="center"/>
+            <w:hideMark/>
+          </w:tcPr>
+          <w:p>
+            <w:pPr>
+              <w:spacing w:after="0" w:line="240" w:lineRule="auto"/>
+              <w:rPr>
+                <w:rFonts w:ascii="Calibri" w:eastAsia="Times New Roman" w:hAnsi="Calibri" w:cs="Calibri"/>
+                <w:kern w:val="0"/>
+                <w:sz w:val="24"/>
+                <w:szCs w:val="24"/>
+                <w14:ligatures w14:val="none"/>
+              </w:rPr>
+            </w:pPr>
+            <w:r>
+              <w:rPr>
+                <w:rFonts w:ascii="Calibri" w:eastAsia="Times New Roman" w:hAnsi="Calibri" w:cs="Calibri"/>
+                <w:kern w:val="0"/>
+                <w:sz w:val="24"/>
+                <w:szCs w:val="24"/>
+                <w14:ligatures w14:val="none"/>
+              </w:rPr>
+              <w:t xml:space="preserve">ppm </w:t>
+            </w:r>
+          </w:p>
+        </w:tc>
+        <w:tc>
+          <w:tcPr>
+            <w:tcW w:w="959" w:type="dxa"/>
+            <w:tcBorders>
+              <w:top w:val="single" w:sz="4" w:space="0" w:color="000000"/>
+              <w:left w:val="single" w:sz="4" w:space="0" w:color="000000"/>
+              <w:bottom w:val="single" w:sz="4" w:space="0" w:color="000000"/>
+              <w:right w:val="single" w:sz="4" w:space="0" w:color="000000"/>
+            </w:tcBorders>
+            <w:noWrap/>
+            <w:vAlign w:val="center"/>
+            <w:hideMark/>
+          </w:tcPr>
+          <w:p>
+            <w:pPr>
+              <w:spacing w:after="0" w:line="240" w:lineRule="auto"/>
+              <w:rPr>
+                <w:rFonts w:ascii="Calibri" w:eastAsia="Times New Roman" w:hAnsi="Calibri" w:cs="Calibri"/>
+                <w:kern w:val="0"/>
+                <w:sz w:val="24"/>
+                <w:szCs w:val="24"/>
+                <w14:ligatures w14:val="none"/>
+              </w:rPr>
+            </w:pPr>
+            <w:r>
+              <w:rPr>
+                <w:rFonts w:ascii="Calibri" w:eastAsia="Times New Roman" w:hAnsi="Calibri" w:cs="Calibri"/>
+                <w:kern w:val="0"/>
+                <w:sz w:val="24"/>
+                <w:szCs w:val="24"/>
+                <w14:ligatures w14:val="none"/>
+              </w:rPr>
+              <w:t>uL/Lgas</w:t>
+            </w:r>
+          </w:p>
+        </w:tc>
+        <w:tc>
+          <w:tcPr>
+            <w:tcW w:w="1500" w:type="dxa"/>
+            <w:tcBorders>
+              <w:top w:val="single" w:sz="4" w:space="0" w:color="000000"/>
+              <w:left w:val="single" w:sz="4" w:space="0" w:color="000000"/>
+              <w:bottom w:val="single" w:sz="4" w:space="0" w:color="000000"/>
+              <w:right w:val="single" w:sz="4" w:space="0" w:color="000000"/>
+            </w:tcBorders>
+            <w:noWrap/>
+            <w:vAlign w:val="center"/>
+            <w:hideMark/>
+          </w:tcPr>
+          <w:p>
+            <w:pPr>
+              <w:spacing w:after="0" w:line="240" w:lineRule="auto"/>
+              <w:jc w:val="right"/>
+              <w:rPr>
+                <w:rFonts w:ascii="Calibri" w:eastAsia="Times New Roman" w:hAnsi="Calibri" w:cs="Calibri"/>
+                <w:kern w:val="0"/>
+                <w:sz w:val="24"/>
+                <w:szCs w:val="24"/>
+                <w14:ligatures w14:val="none"/>
+              </w:rPr>
+            </w:pPr>
+            <w:r>
+              <w:rPr>
+                <w:rFonts w:ascii="Calibri" w:eastAsia="Times New Roman" w:hAnsi="Calibri" w:cs="Calibri"/>
+                <w:kern w:val="0"/>
+                <w:sz w:val="24"/>
+                <w:szCs w:val="24"/>
+                <w14:ligatures w14:val="none"/>
+              </w:rPr>
+              <w:t>3.75</w:t>
+            </w:r>
+          </w:p>
+        </w:tc>
+        <w:tc>
+          <w:tcPr>
+            <w:tcW w:w="1500" w:type="dxa"/>
+            <w:tcBorders>
+              <w:top w:val="single" w:sz="4" w:space="0" w:color="000000"/>
+              <w:left w:val="single" w:sz="4" w:space="0" w:color="000000"/>
+              <w:bottom w:val="single" w:sz="4" w:space="0" w:color="000000"/>
+              <w:right w:val="single" w:sz="4" w:space="0" w:color="000000"/>
+            </w:tcBorders>
+            <w:noWrap/>
+            <w:vAlign w:val="center"/>
+            <w:hideMark/>
+          </w:tcPr>
+          <w:p>
+            <w:pPr>
+              <w:spacing w:after="0" w:line="240" w:lineRule="auto"/>
+              <w:jc w:val="right"/>
+              <w:rPr>
+                <w:rFonts w:ascii="Calibri" w:eastAsia="Times New Roman" w:hAnsi="Calibri" w:cs="Calibri"/>
+                <w:kern w:val="0"/>
+                <w:sz w:val="24"/>
+                <w:szCs w:val="24"/>
+                <w14:ligatures w14:val="none"/>
+              </w:rPr>
+            </w:pPr>
+            <w:r>
+              <w:rPr>
+                <w:rFonts w:ascii="Calibri" w:eastAsia="Times New Roman" w:hAnsi="Calibri" w:cs="Calibri"/>
+                <w:kern w:val="0"/>
+                <w:sz w:val="24"/>
+                <w:szCs w:val="24"/>
+                <w14:ligatures w14:val="none"/>
+              </w:rPr>
+              <w:t>375</w:t>
+            </w:r>
+          </w:p>
+        </w:tc>
+        <w:tc>
+          <w:tcPr>
+            <w:tcW w:w="1493" w:type="dxa"/>
+            <w:tcBorders>
+              <w:top w:val="single" w:sz="4" w:space="0" w:color="000000"/>
+              <w:left w:val="single" w:sz="4" w:space="0" w:color="000000"/>
+              <w:bottom w:val="single" w:sz="4" w:space="0" w:color="000000"/>
+              <w:right w:val="single" w:sz="4" w:space="0" w:color="000000"/>
+            </w:tcBorders>
+            <w:noWrap/>
+            <w:vAlign w:val="center"/>
+            <w:hideMark/>
+          </w:tcPr>
+          <w:p>
+            <w:pPr>
+              <w:spacing w:after="0" w:line="240" w:lineRule="auto"/>
+              <w:jc w:val="right"/>
+              <w:rPr>
+                <w:rFonts w:ascii="Calibri" w:eastAsia="Times New Roman" w:hAnsi="Calibri" w:cs="Calibri"/>
+                <w:kern w:val="0"/>
+                <w:sz w:val="24"/>
+                <w:szCs w:val="24"/>
+                <w14:ligatures w14:val="none"/>
+              </w:rPr>
+            </w:pPr>
+            <w:r>
+              <w:rPr>
+                <w:rFonts w:ascii="Calibri" w:eastAsia="Times New Roman" w:hAnsi="Calibri" w:cs="Calibri"/>
+                <w:kern w:val="0"/>
+                <w:sz w:val="24"/>
+                <w:szCs w:val="24"/>
+                <w14:ligatures w14:val="none"/>
+              </w:rPr>
+              <w:t>0.75</w:t>
+            </w:r>
+          </w:p>
+        </w:tc>
+      </w:tr>
+      <w:tr>
+        <w:trPr>
+          <w:trHeight w:val="300"/>
+        </w:trPr>
+        <w:tc>
+          <w:tcPr>
+            <w:tcW w:w="1500" w:type="dxa"/>
+            <w:tcBorders>
+              <w:top w:val="single" w:sz="4" w:space="0" w:color="000000"/>
+              <w:left w:val="single" w:sz="4" w:space="0" w:color="000000"/>
+              <w:bottom w:val="single" w:sz="4" w:space="0" w:color="000000"/>
+              <w:right w:val="single" w:sz="4" w:space="0" w:color="000000"/>
+            </w:tcBorders>
+            <w:noWrap/>
+            <w:vAlign w:val="center"/>
+            <w:hideMark/>
+          </w:tcPr>
+          <w:p>
+            <w:pPr>
+              <w:spacing w:after="0" w:line="240" w:lineRule="auto"/>
+              <w:rPr>
+                <w:rFonts w:ascii="Calibri" w:eastAsia="Times New Roman" w:hAnsi="Calibri" w:cs="Calibri"/>
+                <w:kern w:val="0"/>
+                <w:sz w:val="24"/>
+                <w:szCs w:val="24"/>
+                <w14:ligatures w14:val="none"/>
+              </w:rPr>
+            </w:pPr>
+            <w:r>
+              <w:rPr>
+                <w:rFonts w:ascii="Calibri" w:eastAsia="Times New Roman" w:hAnsi="Calibri" w:cs="Calibri"/>
+                <w:kern w:val="0"/>
+                <w:sz w:val="24"/>
+                <w:szCs w:val="24"/>
+                <w14:ligatures w14:val="none"/>
+              </w:rPr>
+              <w:t>100perSTDA</w:t>
+            </w:r>
+          </w:p>
+        </w:tc>
+        <w:tc>
+          <w:tcPr>
+            <w:tcW w:w="1360" w:type="dxa"/>
+            <w:tcBorders>
+              <w:top w:val="single" w:sz="4" w:space="0" w:color="000000"/>
+              <w:left w:val="single" w:sz="4" w:space="0" w:color="000000"/>
+              <w:bottom w:val="single" w:sz="4" w:space="0" w:color="000000"/>
+              <w:right w:val="single" w:sz="4" w:space="0" w:color="000000"/>
+            </w:tcBorders>
+            <w:noWrap/>
+            <w:vAlign w:val="center"/>
+            <w:hideMark/>
+          </w:tcPr>
+          <w:p>
+            <w:pPr>
+              <w:spacing w:after="0" w:line="240" w:lineRule="auto"/>
+              <w:rPr>
+                <w:rFonts w:ascii="Calibri" w:eastAsia="Times New Roman" w:hAnsi="Calibri" w:cs="Calibri"/>
+                <w:kern w:val="0"/>
+                <w:sz w:val="24"/>
+                <w:szCs w:val="24"/>
+                <w14:ligatures w14:val="none"/>
+              </w:rPr>
+            </w:pPr>
+            <w:r>
+              <w:rPr>
+                <w:rFonts w:ascii="Calibri" w:eastAsia="Times New Roman" w:hAnsi="Calibri" w:cs="Calibri"/>
+                <w:kern w:val="0"/>
+                <w:sz w:val="24"/>
+                <w:szCs w:val="24"/>
+                <w14:ligatures w14:val="none"/>
+              </w:rPr>
+              <w:t xml:space="preserve">ppm </w:t>
+            </w:r>
+          </w:p>
+        </w:tc>
+        <w:tc>
+          <w:tcPr>
+            <w:tcW w:w="959" w:type="dxa"/>
+            <w:tcBorders>
+              <w:top w:val="single" w:sz="4" w:space="0" w:color="000000"/>
+              <w:left w:val="single" w:sz="4" w:space="0" w:color="000000"/>
+              <w:bottom w:val="single" w:sz="4" w:space="0" w:color="000000"/>
+              <w:right w:val="single" w:sz="4" w:space="0" w:color="000000"/>
+            </w:tcBorders>
+            <w:noWrap/>
+            <w:vAlign w:val="center"/>
+            <w:hideMark/>
+          </w:tcPr>
+          <w:p>
+            <w:pPr>
+              <w:spacing w:after="0" w:line="240" w:lineRule="auto"/>
+              <w:rPr>
+                <w:rFonts w:ascii="Calibri" w:eastAsia="Times New Roman" w:hAnsi="Calibri" w:cs="Calibri"/>
+                <w:kern w:val="0"/>
+                <w:sz w:val="24"/>
+                <w:szCs w:val="24"/>
+                <w14:ligatures w14:val="none"/>
+              </w:rPr>
+            </w:pPr>
+            <w:r>
+              <w:rPr>
+                <w:rFonts w:ascii="Calibri" w:eastAsia="Times New Roman" w:hAnsi="Calibri" w:cs="Calibri"/>
+                <w:kern w:val="0"/>
+                <w:sz w:val="24"/>
+                <w:szCs w:val="24"/>
+                <w14:ligatures w14:val="none"/>
+              </w:rPr>
+              <w:t>uL/Lgas</w:t>
+            </w:r>
+          </w:p>
+        </w:tc>
+        <w:tc>
+          <w:tcPr>
+            <w:tcW w:w="1500" w:type="dxa"/>
+            <w:tcBorders>
+              <w:top w:val="single" w:sz="4" w:space="0" w:color="000000"/>
+              <w:left w:val="single" w:sz="4" w:space="0" w:color="000000"/>
+              <w:bottom w:val="single" w:sz="4" w:space="0" w:color="000000"/>
+              <w:right w:val="single" w:sz="4" w:space="0" w:color="000000"/>
+            </w:tcBorders>
+            <w:noWrap/>
+            <w:vAlign w:val="center"/>
+            <w:hideMark/>
+          </w:tcPr>
+          <w:p>
+            <w:pPr>
+              <w:spacing w:after="0" w:line="240" w:lineRule="auto"/>
+              <w:jc w:val="right"/>
+              <w:rPr>
+                <w:rFonts w:ascii="Calibri" w:eastAsia="Times New Roman" w:hAnsi="Calibri" w:cs="Calibri"/>
+                <w:kern w:val="0"/>
+                <w:sz w:val="24"/>
+                <w:szCs w:val="24"/>
+                <w14:ligatures w14:val="none"/>
+              </w:rPr>
+            </w:pPr>
+            <w:r>
+              <w:rPr>
+                <w:rFonts w:ascii="Calibri" w:eastAsia="Times New Roman" w:hAnsi="Calibri" w:cs="Calibri"/>
+                <w:kern w:val="0"/>
+                <w:sz w:val="24"/>
+                <w:szCs w:val="24"/>
+                <w14:ligatures w14:val="none"/>
+              </w:rPr>
+              <w:t>5</w:t>
+            </w:r>
+          </w:p>
+        </w:tc>
+        <w:tc>
+          <w:tcPr>
+            <w:tcW w:w="1500" w:type="dxa"/>
+            <w:tcBorders>
+              <w:top w:val="single" w:sz="4" w:space="0" w:color="000000"/>
+              <w:left w:val="single" w:sz="4" w:space="0" w:color="000000"/>
+              <w:bottom w:val="single" w:sz="4" w:space="0" w:color="000000"/>
+              <w:right w:val="single" w:sz="4" w:space="0" w:color="000000"/>
+            </w:tcBorders>
+            <w:noWrap/>
+            <w:vAlign w:val="center"/>
+            <w:hideMark/>
+          </w:tcPr>
+          <w:p>
+            <w:pPr>
+              <w:spacing w:after="0" w:line="240" w:lineRule="auto"/>
+              <w:jc w:val="right"/>
+              <w:rPr>
+                <w:rFonts w:ascii="Calibri" w:eastAsia="Times New Roman" w:hAnsi="Calibri" w:cs="Calibri"/>
+                <w:kern w:val="0"/>
+                <w:sz w:val="24"/>
+                <w:szCs w:val="24"/>
+                <w14:ligatures w14:val="none"/>
+              </w:rPr>
+            </w:pPr>
+            <w:r>
+              <w:rPr>
+                <w:rFonts w:ascii="Calibri" w:eastAsia="Times New Roman" w:hAnsi="Calibri" w:cs="Calibri"/>
+                <w:kern w:val="0"/>
+                <w:sz w:val="24"/>
+                <w:szCs w:val="24"/>
+                <w14:ligatures w14:val="none"/>
+              </w:rPr>
+              <w:t>500</w:t>
+            </w:r>
+          </w:p>
+        </w:tc>
+        <w:tc>
+          <w:tcPr>
+            <w:tcW w:w="1493" w:type="dxa"/>
+            <w:tcBorders>
+              <w:top w:val="single" w:sz="4" w:space="0" w:color="000000"/>
+              <w:left w:val="single" w:sz="4" w:space="0" w:color="000000"/>
+              <w:bottom w:val="single" w:sz="4" w:space="0" w:color="000000"/>
+              <w:right w:val="single" w:sz="4" w:space="0" w:color="000000"/>
+            </w:tcBorders>
+            <w:noWrap/>
+            <w:vAlign w:val="center"/>
+            <w:hideMark/>
+          </w:tcPr>
+          <w:p>
+            <w:pPr>
+              <w:spacing w:after="0" w:line="240" w:lineRule="auto"/>
+              <w:jc w:val="right"/>
+              <w:rPr>
+                <w:rFonts w:ascii="Calibri" w:eastAsia="Times New Roman" w:hAnsi="Calibri" w:cs="Calibri"/>
+                <w:kern w:val="0"/>
+                <w:sz w:val="24"/>
+                <w:szCs w:val="24"/>
+                <w14:ligatures w14:val="none"/>
+              </w:rPr>
+            </w:pPr>
+            <w:r>
+              <w:rPr>
+                <w:rFonts w:ascii="Calibri" w:eastAsia="Times New Roman" w:hAnsi="Calibri" w:cs="Calibri"/>
+                <w:kern w:val="0"/>
+                <w:sz w:val="24"/>
+                <w:szCs w:val="24"/>
+                <w14:ligatures w14:val="none"/>
+              </w:rPr>
+              <w:t>1</w:t>
+            </w:r>
+          </w:p>
+        </w:tc>
+      </w:tr>
+      <w:tr>
+        <w:trPr>
+          <w:trHeight w:val="300"/>
+        </w:trPr>
+        <w:tc>
+          <w:tcPr>
+            <w:tcW w:w="1500" w:type="dxa"/>
+            <w:tcBorders>
+              <w:top w:val="single" w:sz="4" w:space="0" w:color="000000"/>
+              <w:left w:val="single" w:sz="4" w:space="0" w:color="000000"/>
+              <w:bottom w:val="single" w:sz="4" w:space="0" w:color="000000"/>
+              <w:right w:val="single" w:sz="4" w:space="0" w:color="000000"/>
+            </w:tcBorders>
+            <w:noWrap/>
+            <w:vAlign w:val="center"/>
+          </w:tcPr>
+          <w:p>
+            <w:pPr>
+              <w:spacing w:after="0" w:line="240" w:lineRule="auto"/>
+              <w:rPr>
+                <w:rFonts w:ascii="Calibri" w:eastAsia="Times New Roman" w:hAnsi="Calibri" w:cs="Calibri"/>
+                <w:kern w:val="0"/>
+                <w:sz w:val="24"/>
+                <w:szCs w:val="24"/>
+                <w14:ligatures w14:val="none"/>
+              </w:rPr>
+            </w:pPr>
+            <w:r>
+              <w:rPr>
+                <w:rFonts w:ascii="Calibri" w:eastAsia="Times New Roman" w:hAnsi="Calibri" w:cs="Calibri"/>
+                <w:kern w:val="0"/>
+                <w:sz w:val="24"/>
+                <w:szCs w:val="24"/>
+                <w14:ligatures w14:val="none"/>
+              </w:rPr>
+              <w:t>25perSTD</w:t>
+            </w:r>
+          </w:p>
+        </w:tc>
+        <w:tc>
+          <w:tcPr>
+            <w:tcW w:w="1360" w:type="dxa"/>
+            <w:tcBorders>
+              <w:top w:val="single" w:sz="4" w:space="0" w:color="000000"/>
+              <w:left w:val="single" w:sz="4" w:space="0" w:color="000000"/>
+              <w:bottom w:val="single" w:sz="4" w:space="0" w:color="000000"/>
+              <w:right w:val="single" w:sz="4" w:space="0" w:color="000000"/>
+            </w:tcBorders>
+            <w:noWrap/>
+            <w:vAlign w:val="center"/>
+          </w:tcPr>
+          <w:p>
+            <w:pPr>
+              <w:spacing w:after="0" w:line="240" w:lineRule="auto"/>
+              <w:rPr>
+                <w:rFonts w:ascii="Calibri" w:eastAsia="Times New Roman" w:hAnsi="Calibri" w:cs="Calibri"/>
+                <w:kern w:val="0"/>
+                <w:sz w:val="24"/>
+                <w:szCs w:val="24"/>
+                <w14:ligatures w14:val="none"/>
+              </w:rPr>
+            </w:pPr>
+            <w:r>
+              <w:rPr>
+                <w:rFonts w:ascii="Calibri" w:eastAsia="Times New Roman" w:hAnsi="Calibri" w:cs="Calibri"/>
+                <w:kern w:val="0"/>
+                <w:sz w:val="24"/>
+                <w:szCs w:val="24"/>
+                <w14:ligatures w14:val="none"/>
+              </w:rPr>
+              <w:t xml:space="preserve">ppm </w:t>
+            </w:r>
+          </w:p>
+        </w:tc>
+        <w:tc>
+          <w:tcPr>
+            <w:tcW w:w="959" w:type="dxa"/>
+            <w:tcBorders>
+              <w:top w:val="single" w:sz="4" w:space="0" w:color="000000"/>
+              <w:left w:val="single" w:sz="4" w:space="0" w:color="000000"/>
+              <w:bottom w:val="single" w:sz="4" w:space="0" w:color="000000"/>
+              <w:right w:val="single" w:sz="4" w:space="0" w:color="000000"/>
+            </w:tcBorders>
+            <w:noWrap/>
+            <w:vAlign w:val="center"/>
+          </w:tcPr>
+          <w:p>
+            <w:pPr>
+              <w:spacing w:after="0" w:line="240" w:lineRule="auto"/>
+              <w:rPr>
+                <w:rFonts w:ascii="Calibri" w:eastAsia="Times New Roman" w:hAnsi="Calibri" w:cs="Calibri"/>
+                <w:kern w:val="0"/>
+                <w:sz w:val="24"/>
+                <w:szCs w:val="24"/>
+                <w14:ligatures w14:val="none"/>
+              </w:rPr>
+            </w:pPr>
+            <w:r>
+              <w:rPr>
+                <w:rFonts w:ascii="Calibri" w:eastAsia="Times New Roman" w:hAnsi="Calibri" w:cs="Calibri"/>
+                <w:kern w:val="0"/>
+                <w:sz w:val="24"/>
+                <w:szCs w:val="24"/>
+                <w14:ligatures w14:val="none"/>
+              </w:rPr>
+              <w:t>uL/Lgas</w:t>
+            </w:r>
+          </w:p>
+        </w:tc>
+        <w:tc>
+          <w:tcPr>
+            <w:tcW w:w="1500" w:type="dxa"/>
+            <w:tcBorders>
+              <w:top w:val="single" w:sz="4" w:space="0" w:color="000000"/>
+              <w:left w:val="single" w:sz="4" w:space="0" w:color="000000"/>
+              <w:bottom w:val="single" w:sz="4" w:space="0" w:color="000000"/>
+              <w:right w:val="single" w:sz="4" w:space="0" w:color="000000"/>
+            </w:tcBorders>
+            <w:noWrap/>
+            <w:vAlign w:val="center"/>
+          </w:tcPr>
+          <w:p>
+            <w:pPr>
+              <w:spacing w:after="0" w:line="240" w:lineRule="auto"/>
+              <w:jc w:val="right"/>
+              <w:rPr>
+                <w:rFonts w:ascii="Calibri" w:eastAsia="Times New Roman" w:hAnsi="Calibri" w:cs="Calibri"/>
+                <w:kern w:val="0"/>
+                <w:sz w:val="24"/>
+                <w:szCs w:val="24"/>
+                <w14:ligatures w14:val="none"/>
+              </w:rPr>
+            </w:pPr>
+            <w:r>
+              <w:rPr>
+                <w:rFonts w:ascii="Calibri" w:eastAsia="Times New Roman" w:hAnsi="Calibri" w:cs="Calibri"/>
+                <w:kern w:val="0"/>
+                <w:sz w:val="24"/>
+                <w:szCs w:val="24"/>
+                <w14:ligatures w14:val="none"/>
+              </w:rPr>
+              <w:t>12.5</w:t>
+            </w:r>
+          </w:p>
+        </w:tc>
+        <w:tc>
+          <w:tcPr>
+            <w:tcW w:w="1500" w:type="dxa"/>
+            <w:tcBorders>
+              <w:top w:val="single" w:sz="4" w:space="0" w:color="000000"/>
+              <w:left w:val="single" w:sz="4" w:space="0" w:color="000000"/>
+              <w:bottom w:val="single" w:sz="4" w:space="0" w:color="000000"/>
+              <w:right w:val="single" w:sz="4" w:space="0" w:color="000000"/>
+            </w:tcBorders>
+            <w:noWrap/>
+            <w:vAlign w:val="center"/>
+          </w:tcPr>
+          <w:p>
+            <w:pPr>
+              <w:spacing w:after="0" w:line="240" w:lineRule="auto"/>
+              <w:jc w:val="right"/>
+              <w:rPr>
+                <w:rFonts w:ascii="Calibri" w:eastAsia="Times New Roman" w:hAnsi="Calibri" w:cs="Calibri"/>
+                <w:kern w:val="0"/>
+                <w:sz w:val="24"/>
+                <w:szCs w:val="24"/>
+                <w14:ligatures w14:val="none"/>
+              </w:rPr>
+            </w:pPr>
+            <w:r>
+              <w:rPr>
+                <w:rFonts w:ascii="Calibri" w:eastAsia="Times New Roman" w:hAnsi="Calibri" w:cs="Calibri"/>
+                <w:kern w:val="0"/>
+                <w:sz w:val="24"/>
+                <w:szCs w:val="24"/>
+                <w14:ligatures w14:val="none"/>
+              </w:rPr>
+              <w:t>1250</w:t>
+            </w:r>
+          </w:p>
+        </w:tc>
+        <w:tc>
+          <w:tcPr>
+            <w:tcW w:w="1493" w:type="dxa"/>
+            <w:tcBorders>
+              <w:top w:val="single" w:sz="4" w:space="0" w:color="000000"/>
+              <w:left w:val="single" w:sz="4" w:space="0" w:color="000000"/>
+              <w:bottom w:val="single" w:sz="4" w:space="0" w:color="000000"/>
+              <w:right w:val="single" w:sz="4" w:space="0" w:color="000000"/>
+            </w:tcBorders>
+            <w:noWrap/>
+            <w:vAlign w:val="center"/>
+          </w:tcPr>
+          <w:p>
+            <w:pPr>
+              <w:spacing w:after="0" w:line="240" w:lineRule="auto"/>
+              <w:jc w:val="right"/>
+              <w:rPr>
+                <w:rFonts w:ascii="Calibri" w:eastAsia="Times New Roman" w:hAnsi="Calibri" w:cs="Calibri"/>
+                <w:kern w:val="0"/>
+                <w:sz w:val="24"/>
+                <w:szCs w:val="24"/>
+                <w14:ligatures w14:val="none"/>
+              </w:rPr>
+            </w:pPr>
+            <w:r>
+              <w:rPr>
+                <w:rFonts w:ascii="Calibri" w:eastAsia="Times New Roman" w:hAnsi="Calibri" w:cs="Calibri"/>
+                <w:kern w:val="0"/>
+                <w:sz w:val="24"/>
+                <w:szCs w:val="24"/>
+                <w14:ligatures w14:val="none"/>
+              </w:rPr>
+              <w:t>12.5</w:t>
+            </w:r>
+          </w:p>
+        </w:tc>
+      </w:tr>
+      <w:tr>
+        <w:trPr>
+          <w:trHeight w:val="300"/>
+        </w:trPr>
+        <w:tc>
+          <w:tcPr>
+            <w:tcW w:w="1500" w:type="dxa"/>
+            <w:tcBorders>
+              <w:top w:val="single" w:sz="4" w:space="0" w:color="000000"/>
+              <w:left w:val="single" w:sz="4" w:space="0" w:color="000000"/>
+              <w:bottom w:val="single" w:sz="4" w:space="0" w:color="000000"/>
+              <w:right w:val="single" w:sz="4" w:space="0" w:color="000000"/>
+            </w:tcBorders>
+            <w:noWrap/>
+            <w:vAlign w:val="center"/>
+            <w:hideMark/>
+          </w:tcPr>
+          <w:p>
+            <w:pPr>
+              <w:spacing w:after="0" w:line="240" w:lineRule="auto"/>
+              <w:rPr>
+                <w:rFonts w:ascii="Calibri" w:eastAsia="Times New Roman" w:hAnsi="Calibri" w:cs="Calibri"/>
+                <w:kern w:val="0"/>
+                <w:sz w:val="24"/>
+                <w:szCs w:val="24"/>
+                <w14:ligatures w14:val="none"/>
+              </w:rPr>
+            </w:pPr>
+            <w:r>
+              <w:rPr>
+                <w:rFonts w:ascii="Calibri" w:eastAsia="Times New Roman" w:hAnsi="Calibri" w:cs="Calibri"/>
+                <w:kern w:val="0"/>
+                <w:sz w:val="24"/>
+                <w:szCs w:val="24"/>
+                <w14:ligatures w14:val="none"/>
+              </w:rPr>
+              <w:t>50PerSTD</w:t>
+            </w:r>
+          </w:p>
+        </w:tc>
+        <w:tc>
+          <w:tcPr>
+            <w:tcW w:w="1360" w:type="dxa"/>
+            <w:tcBorders>
+              <w:top w:val="single" w:sz="4" w:space="0" w:color="000000"/>
+              <w:left w:val="single" w:sz="4" w:space="0" w:color="000000"/>
+              <w:bottom w:val="single" w:sz="4" w:space="0" w:color="000000"/>
+              <w:right w:val="single" w:sz="4" w:space="0" w:color="000000"/>
+            </w:tcBorders>
+            <w:noWrap/>
+            <w:vAlign w:val="center"/>
+            <w:hideMark/>
+          </w:tcPr>
+          <w:p>
+            <w:pPr>
+              <w:spacing w:after="0" w:line="240" w:lineRule="auto"/>
+              <w:rPr>
+                <w:rFonts w:ascii="Calibri" w:eastAsia="Times New Roman" w:hAnsi="Calibri" w:cs="Calibri"/>
+                <w:kern w:val="0"/>
+                <w:sz w:val="24"/>
+                <w:szCs w:val="24"/>
+                <w14:ligatures w14:val="none"/>
+              </w:rPr>
+            </w:pPr>
+            <w:r>
+              <w:rPr>
+                <w:rFonts w:ascii="Calibri" w:eastAsia="Times New Roman" w:hAnsi="Calibri" w:cs="Calibri"/>
+                <w:kern w:val="0"/>
+                <w:sz w:val="24"/>
+                <w:szCs w:val="24"/>
+                <w14:ligatures w14:val="none"/>
+              </w:rPr>
+              <w:t xml:space="preserve">ppm </w:t>
+            </w:r>
+          </w:p>
+        </w:tc>
+        <w:tc>
+          <w:tcPr>
+            <w:tcW w:w="959" w:type="dxa"/>
+            <w:tcBorders>
+              <w:top w:val="single" w:sz="4" w:space="0" w:color="000000"/>
+              <w:left w:val="single" w:sz="4" w:space="0" w:color="000000"/>
+              <w:bottom w:val="single" w:sz="4" w:space="0" w:color="000000"/>
+              <w:right w:val="single" w:sz="4" w:space="0" w:color="000000"/>
+            </w:tcBorders>
+            <w:noWrap/>
+            <w:vAlign w:val="center"/>
+            <w:hideMark/>
+          </w:tcPr>
+          <w:p>
+            <w:pPr>
+              <w:spacing w:after="0" w:line="240" w:lineRule="auto"/>
+              <w:rPr>
+                <w:rFonts w:ascii="Calibri" w:eastAsia="Times New Roman" w:hAnsi="Calibri" w:cs="Calibri"/>
+                <w:kern w:val="0"/>
+                <w:sz w:val="24"/>
+                <w:szCs w:val="24"/>
+                <w14:ligatures w14:val="none"/>
+              </w:rPr>
+            </w:pPr>
+            <w:r>
+              <w:rPr>
+                <w:rFonts w:ascii="Calibri" w:eastAsia="Times New Roman" w:hAnsi="Calibri" w:cs="Calibri"/>
+                <w:kern w:val="0"/>
+                <w:sz w:val="24"/>
+                <w:szCs w:val="24"/>
+                <w14:ligatures w14:val="none"/>
+              </w:rPr>
+              <w:t>uL/Lgas</w:t>
+            </w:r>
+          </w:p>
+        </w:tc>
+        <w:tc>
+          <w:tcPr>
+            <w:tcW w:w="1500" w:type="dxa"/>
+            <w:tcBorders>
+              <w:top w:val="single" w:sz="4" w:space="0" w:color="000000"/>
+              <w:left w:val="single" w:sz="4" w:space="0" w:color="000000"/>
+              <w:bottom w:val="single" w:sz="4" w:space="0" w:color="000000"/>
+              <w:right w:val="single" w:sz="4" w:space="0" w:color="000000"/>
+            </w:tcBorders>
+            <w:noWrap/>
+            <w:vAlign w:val="center"/>
+            <w:hideMark/>
+          </w:tcPr>
+          <w:p>
+            <w:pPr>
+              <w:spacing w:after="0" w:line="240" w:lineRule="auto"/>
+              <w:jc w:val="right"/>
+              <w:rPr>
+                <w:rFonts w:ascii="Calibri" w:eastAsia="Times New Roman" w:hAnsi="Calibri" w:cs="Calibri"/>
+                <w:kern w:val="0"/>
+                <w:sz w:val="24"/>
+                <w:szCs w:val="24"/>
+                <w14:ligatures w14:val="none"/>
+              </w:rPr>
+            </w:pPr>
+            <w:r>
+              <w:rPr>
+                <w:rFonts w:ascii="Calibri" w:eastAsia="Times New Roman" w:hAnsi="Calibri" w:cs="Calibri"/>
+                <w:kern w:val="0"/>
+                <w:sz w:val="24"/>
+                <w:szCs w:val="24"/>
+                <w14:ligatures w14:val="none"/>
+              </w:rPr>
+              <w:t>25</w:t>
+            </w:r>
+          </w:p>
+        </w:tc>
+        <w:tc>
+          <w:tcPr>
+            <w:tcW w:w="1500" w:type="dxa"/>
+            <w:tcBorders>
+              <w:top w:val="single" w:sz="4" w:space="0" w:color="000000"/>
+              <w:left w:val="single" w:sz="4" w:space="0" w:color="000000"/>
+              <w:bottom w:val="single" w:sz="4" w:space="0" w:color="000000"/>
+              <w:right w:val="single" w:sz="4" w:space="0" w:color="000000"/>
+            </w:tcBorders>
+            <w:noWrap/>
+            <w:vAlign w:val="center"/>
+            <w:hideMark/>
+          </w:tcPr>
+          <w:p>
+            <w:pPr>
+              <w:spacing w:after="0" w:line="240" w:lineRule="auto"/>
+              <w:jc w:val="right"/>
+              <w:rPr>
+                <w:rFonts w:ascii="Calibri" w:eastAsia="Times New Roman" w:hAnsi="Calibri" w:cs="Calibri"/>
+                <w:kern w:val="0"/>
+                <w:sz w:val="24"/>
+                <w:szCs w:val="24"/>
+                <w14:ligatures w14:val="none"/>
+              </w:rPr>
+            </w:pPr>
+            <w:r>
+              <w:rPr>
+                <w:rFonts w:ascii="Calibri" w:eastAsia="Times New Roman" w:hAnsi="Calibri" w:cs="Calibri"/>
+                <w:kern w:val="0"/>
+                <w:sz w:val="24"/>
+                <w:szCs w:val="24"/>
+                <w14:ligatures w14:val="none"/>
+              </w:rPr>
+              <w:t>2500</w:t>
+            </w:r>
+          </w:p>
+        </w:tc>
+        <w:tc>
+          <w:tcPr>
+            <w:tcW w:w="1493" w:type="dxa"/>
+            <w:tcBorders>
+              <w:top w:val="single" w:sz="4" w:space="0" w:color="000000"/>
+              <w:left w:val="single" w:sz="4" w:space="0" w:color="000000"/>
+              <w:bottom w:val="single" w:sz="4" w:space="0" w:color="000000"/>
+              <w:right w:val="single" w:sz="4" w:space="0" w:color="000000"/>
+            </w:tcBorders>
+            <w:noWrap/>
+            <w:vAlign w:val="center"/>
+            <w:hideMark/>
+          </w:tcPr>
+          <w:p>
+            <w:pPr>
+              <w:spacing w:after="0" w:line="240" w:lineRule="auto"/>
+              <w:jc w:val="right"/>
+              <w:rPr>
+                <w:rFonts w:ascii="Calibri" w:eastAsia="Times New Roman" w:hAnsi="Calibri" w:cs="Calibri"/>
+                <w:kern w:val="0"/>
+                <w:sz w:val="24"/>
+                <w:szCs w:val="24"/>
+                <w14:ligatures w14:val="none"/>
+              </w:rPr>
+            </w:pPr>
+            <w:r>
+              <w:rPr>
+                <w:rFonts w:ascii="Calibri" w:eastAsia="Times New Roman" w:hAnsi="Calibri" w:cs="Calibri"/>
+                <w:kern w:val="0"/>
+                <w:sz w:val="24"/>
+                <w:szCs w:val="24"/>
+                <w14:ligatures w14:val="none"/>
+              </w:rPr>
+              <w:t>25</w:t>
+            </w:r>
+          </w:p>
+        </w:tc>
+      </w:tr>
+      <w:tr>
+        <w:trPr>
+          <w:trHeight w:val="300"/>
+        </w:trPr>
+        <w:tc>
+          <w:tcPr>
+            <w:tcW w:w="1500" w:type="dxa"/>
+            <w:tcBorders>
+              <w:top w:val="single" w:sz="4" w:space="0" w:color="000000"/>
+              <w:left w:val="single" w:sz="4" w:space="0" w:color="000000"/>
+              <w:bottom w:val="single" w:sz="4" w:space="0" w:color="000000"/>
+              <w:right w:val="single" w:sz="4" w:space="0" w:color="000000"/>
+            </w:tcBorders>
+            <w:noWrap/>
+            <w:vAlign w:val="center"/>
+            <w:hideMark/>
+          </w:tcPr>
+          <w:p>
+            <w:pPr>
+              <w:spacing w:after="0" w:line="240" w:lineRule="auto"/>
+              <w:rPr>
+                <w:rFonts w:ascii="Calibri" w:eastAsia="Times New Roman" w:hAnsi="Calibri" w:cs="Calibri"/>
+                <w:kern w:val="0"/>
+                <w:sz w:val="24"/>
+                <w:szCs w:val="24"/>
+                <w14:ligatures w14:val="none"/>
+              </w:rPr>
+            </w:pPr>
+            <w:r>
+              <w:rPr>
+                <w:rFonts w:ascii="Calibri" w:eastAsia="Times New Roman" w:hAnsi="Calibri" w:cs="Calibri"/>
+                <w:kern w:val="0"/>
+                <w:sz w:val="24"/>
+                <w:szCs w:val="24"/>
+                <w14:ligatures w14:val="none"/>
+              </w:rPr>
+              <w:t>100PerSTD</w:t>
+            </w:r>
+          </w:p>
+        </w:tc>
+        <w:tc>
+          <w:tcPr>
+            <w:tcW w:w="1360" w:type="dxa"/>
+            <w:tcBorders>
+              <w:top w:val="single" w:sz="4" w:space="0" w:color="000000"/>
+              <w:left w:val="single" w:sz="4" w:space="0" w:color="000000"/>
+              <w:bottom w:val="single" w:sz="4" w:space="0" w:color="000000"/>
+              <w:right w:val="single" w:sz="4" w:space="0" w:color="000000"/>
+            </w:tcBorders>
+            <w:noWrap/>
+            <w:vAlign w:val="center"/>
+            <w:hideMark/>
+          </w:tcPr>
+          <w:p>
+            <w:pPr>
+              <w:spacing w:after="0" w:line="240" w:lineRule="auto"/>
+              <w:rPr>
+                <w:rFonts w:ascii="Calibri" w:eastAsia="Times New Roman" w:hAnsi="Calibri" w:cs="Calibri"/>
+                <w:kern w:val="0"/>
+                <w:sz w:val="24"/>
+                <w:szCs w:val="24"/>
+                <w14:ligatures w14:val="none"/>
+              </w:rPr>
+            </w:pPr>
+            <w:r>
+              <w:rPr>
+                <w:rFonts w:ascii="Calibri" w:eastAsia="Times New Roman" w:hAnsi="Calibri" w:cs="Calibri"/>
+                <w:kern w:val="0"/>
+                <w:sz w:val="24"/>
+                <w:szCs w:val="24"/>
+                <w14:ligatures w14:val="none"/>
+              </w:rPr>
+              <w:t xml:space="preserve">ppm </w:t>
+            </w:r>
+          </w:p>
+        </w:tc>
+        <w:tc>
+          <w:tcPr>
+            <w:tcW w:w="959" w:type="dxa"/>
+            <w:tcBorders>
+              <w:top w:val="single" w:sz="4" w:space="0" w:color="000000"/>
+              <w:left w:val="single" w:sz="4" w:space="0" w:color="000000"/>
+              <w:bottom w:val="single" w:sz="4" w:space="0" w:color="000000"/>
+              <w:right w:val="single" w:sz="4" w:space="0" w:color="000000"/>
+            </w:tcBorders>
+            <w:noWrap/>
+            <w:vAlign w:val="center"/>
+            <w:hideMark/>
+          </w:tcPr>
+          <w:p>
+            <w:pPr>
+              <w:spacing w:after="0" w:line="240" w:lineRule="auto"/>
+              <w:rPr>
+                <w:rFonts w:ascii="Calibri" w:eastAsia="Times New Roman" w:hAnsi="Calibri" w:cs="Calibri"/>
+                <w:kern w:val="0"/>
+                <w:sz w:val="24"/>
+                <w:szCs w:val="24"/>
+                <w14:ligatures w14:val="none"/>
+              </w:rPr>
+            </w:pPr>
+            <w:r>
+              <w:rPr>
+                <w:rFonts w:ascii="Calibri" w:eastAsia="Times New Roman" w:hAnsi="Calibri" w:cs="Calibri"/>
+                <w:kern w:val="0"/>
+                <w:sz w:val="24"/>
+                <w:szCs w:val="24"/>
+                <w14:ligatures w14:val="none"/>
+              </w:rPr>
+              <w:t>uL/Lgas</w:t>
+            </w:r>
+          </w:p>
+        </w:tc>
+        <w:tc>
+          <w:tcPr>
+            <w:tcW w:w="1500" w:type="dxa"/>
+            <w:tcBorders>
+              <w:top w:val="single" w:sz="4" w:space="0" w:color="000000"/>
+              <w:left w:val="single" w:sz="4" w:space="0" w:color="000000"/>
+              <w:bottom w:val="single" w:sz="4" w:space="0" w:color="000000"/>
+              <w:right w:val="single" w:sz="4" w:space="0" w:color="000000"/>
+            </w:tcBorders>
+            <w:noWrap/>
+            <w:vAlign w:val="center"/>
+            <w:hideMark/>
+          </w:tcPr>
+          <w:p>
+            <w:pPr>
+              <w:spacing w:after="0" w:line="240" w:lineRule="auto"/>
+              <w:jc w:val="right"/>
+              <w:rPr>
+                <w:rFonts w:ascii="Calibri" w:eastAsia="Times New Roman" w:hAnsi="Calibri" w:cs="Calibri"/>
+                <w:kern w:val="0"/>
+                <w:sz w:val="24"/>
+                <w:szCs w:val="24"/>
+                <w14:ligatures w14:val="none"/>
+              </w:rPr>
+            </w:pPr>
+            <w:r>
+              <w:rPr>
+                <w:rFonts w:ascii="Calibri" w:eastAsia="Times New Roman" w:hAnsi="Calibri" w:cs="Calibri"/>
+                <w:kern w:val="0"/>
+                <w:sz w:val="24"/>
+                <w:szCs w:val="24"/>
+                <w14:ligatures w14:val="none"/>
+              </w:rPr>
+              <w:t>50</w:t>
+            </w:r>
+          </w:p>
+        </w:tc>
+        <w:tc>
+          <w:tcPr>
+            <w:tcW w:w="1500" w:type="dxa"/>
+            <w:tcBorders>
+              <w:top w:val="single" w:sz="4" w:space="0" w:color="000000"/>
+              <w:left w:val="single" w:sz="4" w:space="0" w:color="000000"/>
+              <w:bottom w:val="single" w:sz="4" w:space="0" w:color="000000"/>
+              <w:right w:val="single" w:sz="4" w:space="0" w:color="000000"/>
+            </w:tcBorders>
+            <w:noWrap/>
+            <w:vAlign w:val="center"/>
+            <w:hideMark/>
+          </w:tcPr>
+          <w:p>
+            <w:pPr>
+              <w:spacing w:after="0" w:line="240" w:lineRule="auto"/>
+              <w:jc w:val="right"/>
+              <w:rPr>
+                <w:rFonts w:ascii="Calibri" w:eastAsia="Times New Roman" w:hAnsi="Calibri" w:cs="Calibri"/>
+                <w:kern w:val="0"/>
+                <w:sz w:val="24"/>
+                <w:szCs w:val="24"/>
+                <w14:ligatures w14:val="none"/>
+              </w:rPr>
+            </w:pPr>
+            <w:r>
+              <w:rPr>
+                <w:rFonts w:ascii="Calibri" w:eastAsia="Times New Roman" w:hAnsi="Calibri" w:cs="Calibri"/>
+                <w:kern w:val="0"/>
+                <w:sz w:val="24"/>
+                <w:szCs w:val="24"/>
+                <w14:ligatures w14:val="none"/>
+              </w:rPr>
+              <w:t>5000</w:t>
+            </w:r>
+          </w:p>
+        </w:tc>
+        <w:tc>
+          <w:tcPr>
+            <w:tcW w:w="1493" w:type="dxa"/>
+            <w:tcBorders>
+              <w:top w:val="single" w:sz="4" w:space="0" w:color="000000"/>
+              <w:left w:val="single" w:sz="4" w:space="0" w:color="000000"/>
+              <w:bottom w:val="single" w:sz="4" w:space="0" w:color="000000"/>
+              <w:right w:val="single" w:sz="4" w:space="0" w:color="000000"/>
+            </w:tcBorders>
+            <w:noWrap/>
+            <w:vAlign w:val="center"/>
+            <w:hideMark/>
+          </w:tcPr>
+          <w:p>
+            <w:pPr>
+              <w:spacing w:after="0" w:line="240" w:lineRule="auto"/>
+              <w:jc w:val="right"/>
+              <w:rPr>
+                <w:rFonts w:ascii="Calibri" w:eastAsia="Times New Roman" w:hAnsi="Calibri" w:cs="Calibri"/>
+                <w:kern w:val="0"/>
+                <w:sz w:val="24"/>
+                <w:szCs w:val="24"/>
+                <w14:ligatures w14:val="none"/>
+              </w:rPr>
+            </w:pPr>
+            <w:r>
+              <w:rPr>
+                <w:rFonts w:ascii="Calibri" w:eastAsia="Times New Roman" w:hAnsi="Calibri" w:cs="Calibri"/>
+                <w:kern w:val="0"/>
+                <w:sz w:val="24"/>
+                <w:szCs w:val="24"/>
+                <w14:ligatures w14:val="none"/>
+              </w:rPr>
+              <w:t>50</w:t>
+            </w:r>
+          </w:p>
+        </w:tc>
+      </w:tr>
+    </w:tbl>
+    <w:p/>
+    <w:p>
+      <w:pPr>
+        <w:pStyle w:val="Heading2"/>
+      </w:pPr>
+      <w:r>
         <w:t>2021</w:t>
       </w:r>
       <w:r>
         <w:t xml:space="preserve"> CO2</w:t>
       </w:r>
     </w:p>
+    <w:p/>
+    <w:p/>
     <w:p>
       <w:r>
         <w:t>0 Standard</w:t>
@@ -5960,7 +7745,6 @@
         <w:rPr>
           <w:noProof/>
         </w:rPr>
-        <w:lastRenderedPageBreak/>
         <w:drawing>
           <wp:inline distT="0" distB="0" distL="0" distR="0" wp14:anchorId="6ABE2C41" wp14:editId="289F9AF5">
             <wp:extent cx="5943600" cy="3276600"/>
@@ -6022,6 +7806,7 @@
         <w:rPr>
           <w:noProof/>
         </w:rPr>
+        <w:lastRenderedPageBreak/>
         <w:drawing>
           <wp:inline distT="0" distB="0" distL="0" distR="0" wp14:anchorId="7A647CEB" wp14:editId="29868018">
             <wp:extent cx="5821680" cy="3312890"/>
@@ -6074,7 +7859,6 @@
         <w:rPr>
           <w:noProof/>
         </w:rPr>
-        <w:lastRenderedPageBreak/>
         <w:drawing>
           <wp:inline distT="0" distB="0" distL="0" distR="0" wp14:anchorId="389427EB" wp14:editId="46D84DBC">
             <wp:extent cx="5943600" cy="3416300"/>
@@ -6126,6 +7910,62 @@
       </w:r>
     </w:p>
     <w:p>
+      <w:r>
+        <w:rPr>
+          <w:noProof/>
+        </w:rPr>
+        <w:lastRenderedPageBreak/>
+        <w:drawing>
+          <wp:inline distT="0" distB="0" distL="0" distR="0" wp14:anchorId="227FBBF2" wp14:editId="19EA579B">
+            <wp:extent cx="5943600" cy="3309620"/>
+            <wp:effectExtent l="0" t="0" r="0" b="5080"/>
+            <wp:docPr id="771943572" name="Picture 28"/>
+            <wp:cNvGraphicFramePr>
+              <a:graphicFrameLocks xmlns:a="http://schemas.openxmlformats.org/drawingml/2006/main" noChangeAspect="1"/>
+            </wp:cNvGraphicFramePr>
+            <a:graphic xmlns:a="http://schemas.openxmlformats.org/drawingml/2006/main">
+              <a:graphicData uri="http://schemas.openxmlformats.org/drawingml/2006/picture">
+                <pic:pic xmlns:pic="http://schemas.openxmlformats.org/drawingml/2006/picture">
+                  <pic:nvPicPr>
+                    <pic:cNvPr id="0" name="Picture 26"/>
+                    <pic:cNvPicPr>
+                      <a:picLocks noChangeAspect="1" noChangeArrowheads="1"/>
+                    </pic:cNvPicPr>
+                  </pic:nvPicPr>
+                  <pic:blipFill>
+                    <a:blip r:embed="rId78">
+                      <a:extLst>
+                        <a:ext uri="{28A0092B-C50C-407E-A947-70E740481C1C}">
+                          <a14:useLocalDpi xmlns:a14="http://schemas.microsoft.com/office/drawing/2010/main" val="0"/>
+                        </a:ext>
+                      </a:extLst>
+                    </a:blip>
+                    <a:srcRect/>
+                    <a:stretch>
+                      <a:fillRect/>
+                    </a:stretch>
+                  </pic:blipFill>
+                  <pic:spPr bwMode="auto">
+                    <a:xfrm>
+                      <a:off x="0" y="0"/>
+                      <a:ext cx="5943600" cy="3309620"/>
+                    </a:xfrm>
+                    <a:prstGeom prst="rect">
+                      <a:avLst/>
+                    </a:prstGeom>
+                    <a:noFill/>
+                    <a:ln>
+                      <a:noFill/>
+                    </a:ln>
+                  </pic:spPr>
+                </pic:pic>
+              </a:graphicData>
+            </a:graphic>
+          </wp:inline>
+        </w:drawing>
+      </w:r>
+    </w:p>
+    <w:p>
       <w:pPr>
         <w:jc w:val="center"/>
       </w:pPr>
@@ -6161,7 +8001,7 @@
                     </pic:cNvPicPr>
                   </pic:nvPicPr>
                   <pic:blipFill>
-                    <a:blip r:embed="rId78">
+                    <a:blip r:embed="rId79">
                       <a:extLst>
                         <a:ext uri="{28A0092B-C50C-407E-A947-70E740481C1C}">
                           <a14:useLocalDpi xmlns:a14="http://schemas.microsoft.com/office/drawing/2010/main" val="0"/>
@@ -6214,7 +8054,7 @@
                     </pic:cNvPicPr>
                   </pic:nvPicPr>
                   <pic:blipFill>
-                    <a:blip r:embed="rId79">
+                    <a:blip r:embed="rId80">
                       <a:extLst>
                         <a:ext uri="{28A0092B-C50C-407E-A947-70E740481C1C}">
                           <a14:useLocalDpi xmlns:a14="http://schemas.microsoft.com/office/drawing/2010/main" val="0"/>
@@ -6271,7 +8111,7 @@
                     </pic:cNvPicPr>
                   </pic:nvPicPr>
                   <pic:blipFill>
-                    <a:blip r:embed="rId80">
+                    <a:blip r:embed="rId81">
                       <a:extLst>
                         <a:ext uri="{28A0092B-C50C-407E-A947-70E740481C1C}">
                           <a14:useLocalDpi xmlns:a14="http://schemas.microsoft.com/office/drawing/2010/main" val="0"/>
@@ -6327,7 +8167,7 @@
                     </pic:cNvPicPr>
                   </pic:nvPicPr>
                   <pic:blipFill>
-                    <a:blip r:embed="rId81">
+                    <a:blip r:embed="rId82">
                       <a:extLst>
                         <a:ext uri="{28A0092B-C50C-407E-A947-70E740481C1C}">
                           <a14:useLocalDpi xmlns:a14="http://schemas.microsoft.com/office/drawing/2010/main" val="0"/>
@@ -6395,7 +8235,7 @@
                     </pic:cNvPicPr>
                   </pic:nvPicPr>
                   <pic:blipFill>
-                    <a:blip r:embed="rId82">
+                    <a:blip r:embed="rId83">
                       <a:extLst>
                         <a:ext uri="{28A0092B-C50C-407E-A947-70E740481C1C}">
                           <a14:useLocalDpi xmlns:a14="http://schemas.microsoft.com/office/drawing/2010/main" val="0"/>
@@ -6450,7 +8290,7 @@
                     </pic:cNvPicPr>
                   </pic:nvPicPr>
                   <pic:blipFill>
-                    <a:blip r:embed="rId83">
+                    <a:blip r:embed="rId84">
                       <a:extLst>
                         <a:ext uri="{28A0092B-C50C-407E-A947-70E740481C1C}">
                           <a14:useLocalDpi xmlns:a14="http://schemas.microsoft.com/office/drawing/2010/main" val="0"/>
@@ -6522,7 +8362,7 @@
                     </pic:cNvPicPr>
                   </pic:nvPicPr>
                   <pic:blipFill>
-                    <a:blip r:embed="rId84">
+                    <a:blip r:embed="rId85">
                       <a:extLst>
                         <a:ext uri="{28A0092B-C50C-407E-A947-70E740481C1C}">
                           <a14:useLocalDpi xmlns:a14="http://schemas.microsoft.com/office/drawing/2010/main" val="0"/>
@@ -6576,7 +8416,7 @@
                     </pic:cNvPicPr>
                   </pic:nvPicPr>
                   <pic:blipFill>
-                    <a:blip r:embed="rId85">
+                    <a:blip r:embed="rId86">
                       <a:extLst>
                         <a:ext uri="{28A0092B-C50C-407E-A947-70E740481C1C}">
                           <a14:useLocalDpi xmlns:a14="http://schemas.microsoft.com/office/drawing/2010/main" val="0"/>
@@ -6632,7 +8472,7 @@
                     </pic:cNvPicPr>
                   </pic:nvPicPr>
                   <pic:blipFill>
-                    <a:blip r:embed="rId86">
+                    <a:blip r:embed="rId87">
                       <a:extLst>
                         <a:ext uri="{28A0092B-C50C-407E-A947-70E740481C1C}">
                           <a14:useLocalDpi xmlns:a14="http://schemas.microsoft.com/office/drawing/2010/main" val="0"/>
@@ -6687,7 +8527,7 @@
                     </pic:cNvPicPr>
                   </pic:nvPicPr>
                   <pic:blipFill>
-                    <a:blip r:embed="rId87">
+                    <a:blip r:embed="rId88">
                       <a:extLst>
                         <a:ext uri="{28A0092B-C50C-407E-A947-70E740481C1C}">
                           <a14:useLocalDpi xmlns:a14="http://schemas.microsoft.com/office/drawing/2010/main" val="0"/>
@@ -6754,7 +8594,7 @@
                     </pic:cNvPicPr>
                   </pic:nvPicPr>
                   <pic:blipFill>
-                    <a:blip r:embed="rId88">
+                    <a:blip r:embed="rId89">
                       <a:extLst>
                         <a:ext uri="{28A0092B-C50C-407E-A947-70E740481C1C}">
                           <a14:useLocalDpi xmlns:a14="http://schemas.microsoft.com/office/drawing/2010/main" val="0"/>
@@ -6809,7 +8649,7 @@
                     </pic:cNvPicPr>
                   </pic:nvPicPr>
                   <pic:blipFill>
-                    <a:blip r:embed="rId89">
+                    <a:blip r:embed="rId90">
                       <a:extLst>
                         <a:ext uri="{28A0092B-C50C-407E-A947-70E740481C1C}">
                           <a14:useLocalDpi xmlns:a14="http://schemas.microsoft.com/office/drawing/2010/main" val="0"/>
@@ -6865,7 +8705,7 @@
                     </pic:cNvPicPr>
                   </pic:nvPicPr>
                   <pic:blipFill>
-                    <a:blip r:embed="rId90">
+                    <a:blip r:embed="rId91">
                       <a:extLst>
                         <a:ext uri="{28A0092B-C50C-407E-A947-70E740481C1C}">
                           <a14:useLocalDpi xmlns:a14="http://schemas.microsoft.com/office/drawing/2010/main" val="0"/>
@@ -6920,7 +8760,7 @@
                     </pic:cNvPicPr>
                   </pic:nvPicPr>
                   <pic:blipFill>
-                    <a:blip r:embed="rId91">
+                    <a:blip r:embed="rId92">
                       <a:extLst>
                         <a:ext uri="{28A0092B-C50C-407E-A947-70E740481C1C}">
                           <a14:useLocalDpi xmlns:a14="http://schemas.microsoft.com/office/drawing/2010/main" val="0"/>
@@ -6976,7 +8816,7 @@
                     </pic:cNvPicPr>
                   </pic:nvPicPr>
                   <pic:blipFill>
-                    <a:blip r:embed="rId92">
+                    <a:blip r:embed="rId93">
                       <a:extLst>
                         <a:ext uri="{28A0092B-C50C-407E-A947-70E740481C1C}">
                           <a14:useLocalDpi xmlns:a14="http://schemas.microsoft.com/office/drawing/2010/main" val="0"/>
@@ -7031,7 +8871,7 @@
                     </pic:cNvPicPr>
                   </pic:nvPicPr>
                   <pic:blipFill>
-                    <a:blip r:embed="rId93">
+                    <a:blip r:embed="rId94">
                       <a:extLst>
                         <a:ext uri="{28A0092B-C50C-407E-A947-70E740481C1C}">
                           <a14:useLocalDpi xmlns:a14="http://schemas.microsoft.com/office/drawing/2010/main" val="0"/>
@@ -7087,7 +8927,7 @@
                     </pic:cNvPicPr>
                   </pic:nvPicPr>
                   <pic:blipFill>
-                    <a:blip r:embed="rId94">
+                    <a:blip r:embed="rId95">
                       <a:extLst>
                         <a:ext uri="{28A0092B-C50C-407E-A947-70E740481C1C}">
                           <a14:useLocalDpi xmlns:a14="http://schemas.microsoft.com/office/drawing/2010/main" val="0"/>
@@ -7142,7 +8982,7 @@
                     </pic:cNvPicPr>
                   </pic:nvPicPr>
                   <pic:blipFill>
-                    <a:blip r:embed="rId95">
+                    <a:blip r:embed="rId96">
                       <a:extLst>
                         <a:ext uri="{28A0092B-C50C-407E-A947-70E740481C1C}">
                           <a14:useLocalDpi xmlns:a14="http://schemas.microsoft.com/office/drawing/2010/main" val="0"/>
@@ -7198,7 +9038,7 @@
                     </pic:cNvPicPr>
                   </pic:nvPicPr>
                   <pic:blipFill>
-                    <a:blip r:embed="rId96">
+                    <a:blip r:embed="rId97">
                       <a:extLst>
                         <a:ext uri="{28A0092B-C50C-407E-A947-70E740481C1C}">
                           <a14:useLocalDpi xmlns:a14="http://schemas.microsoft.com/office/drawing/2010/main" val="0"/>
@@ -7230,7 +9070,61 @@
         </w:drawing>
       </w:r>
     </w:p>
-    <w:p/>
+    <w:p>
+      <w:pPr>
+        <w:rPr>
+          <w:b/>
+          <w:bCs/>
+          <w:sz w:val="40"/>
+          <w:szCs w:val="40"/>
+        </w:rPr>
+      </w:pPr>
+      <w:r>
+        <w:rPr>
+          <w:b/>
+          <w:bCs/>
+          <w:sz w:val="40"/>
+          <w:szCs w:val="40"/>
+        </w:rPr>
+        <w:t xml:space="preserve">The Standards Names </w:t>
+      </w:r>
+      <w:r>
+        <w:rPr>
+          <w:b/>
+          <w:bCs/>
+          <w:sz w:val="40"/>
+          <w:szCs w:val="40"/>
+        </w:rPr>
+        <w:t xml:space="preserve">PerSTDA and </w:t>
+      </w:r>
+      <w:r>
+        <w:rPr>
+          <w:b/>
+          <w:bCs/>
+          <w:sz w:val="40"/>
+          <w:szCs w:val="40"/>
+        </w:rPr>
+        <w:t>PerSTD</w:t>
+      </w:r>
+      <w:r>
+        <w:rPr>
+          <w:b/>
+          <w:bCs/>
+          <w:sz w:val="40"/>
+          <w:szCs w:val="40"/>
+        </w:rPr>
+        <w:t xml:space="preserve"> are not consistent through out 2021, therefore </w:t>
+      </w:r>
+      <w:r>
+        <w:rPr>
+          <w:b/>
+          <w:bCs/>
+          <w:sz w:val="40"/>
+          <w:szCs w:val="40"/>
+        </w:rPr>
+        <w:t>need to be selected manually!!!!!!</w:t>
+      </w:r>
+    </w:p>
     <w:p/>
     <w:sectPr>
       <w:pgSz w:w="12240" w:h="15840"/>

</xml_diff>

<commit_message>
Editing standards by hand.
</commit_message>
<xml_diff>
--- a/StrategicTillage_GC_Analysis_workFlow.docx
+++ b/StrategicTillage_GC_Analysis_workFlow.docx
@@ -51,9 +51,11 @@
           <w:numId w:val="1"/>
         </w:numPr>
       </w:pPr>
+      <w:proofErr w:type="spellStart"/>
       <w:r>
         <w:t>GCAnalysis.R</w:t>
       </w:r>
+      <w:proofErr w:type="spellEnd"/>
     </w:p>
     <w:p>
       <w:pPr>
@@ -63,9 +65,11 @@
           <w:numId w:val="1"/>
         </w:numPr>
       </w:pPr>
+      <w:proofErr w:type="spellStart"/>
       <w:r>
         <w:t>HMR_Analysis.R</w:t>
       </w:r>
+      <w:proofErr w:type="spellEnd"/>
     </w:p>
     <w:p>
       <w:pPr>
@@ -87,9 +91,11 @@
           <w:numId w:val="1"/>
         </w:numPr>
       </w:pPr>
+      <w:proofErr w:type="spellStart"/>
       <w:r>
         <w:t>MassFluxCalculation.R</w:t>
       </w:r>
+      <w:proofErr w:type="spellEnd"/>
     </w:p>
     <w:p>
       <w:pPr>
@@ -99,9 +105,11 @@
           <w:numId w:val="1"/>
         </w:numPr>
       </w:pPr>
+      <w:proofErr w:type="spellStart"/>
       <w:r>
         <w:t>SoilGasFluxStatisticalAnalysis.R</w:t>
       </w:r>
+      <w:proofErr w:type="spellEnd"/>
     </w:p>
     <w:p>
       <w:r>
@@ -109,8 +117,29 @@
       </w:r>
     </w:p>
     <w:p>
-      <w:r>
-        <w:t xml:space="preserve">The N2O and CO2 emissions are too high.  The N2O emission measure calculated by Alli were around 10  kg-N/ha yr. </w:t>
+      <w:proofErr w:type="gramStart"/>
+      <w:r>
+        <w:t>The N2O</w:t>
+      </w:r>
+      <w:proofErr w:type="gramEnd"/>
+      <w:r>
+        <w:t xml:space="preserve"> and CO2 emissions are too high.  The N2O emission measure calculated by Alli </w:t>
+      </w:r>
+      <w:proofErr w:type="gramStart"/>
+      <w:r>
+        <w:t>were</w:t>
+      </w:r>
+      <w:proofErr w:type="gramEnd"/>
+      <w:r>
+        <w:t xml:space="preserve"> around </w:t>
+      </w:r>
+      <w:proofErr w:type="gramStart"/>
+      <w:r>
+        <w:t>10  kg</w:t>
+      </w:r>
+      <w:proofErr w:type="gramEnd"/>
+      <w:r>
+        <w:t xml:space="preserve">-N/ha yr. </w:t>
       </w:r>
     </w:p>
     <w:p>
@@ -319,7 +348,31 @@
     </w:p>
     <w:p>
       <w:r>
-        <w:t>The calibration regression for the GC based on standards seem to be irrelevant, as the important aspect affecting the emissions is not the particular concentration data point, but the slope of the consequent concentration measurement inside the chamber that result in the emission rate.</w:t>
+        <w:t xml:space="preserve">The calibration regression for the GC based on standards </w:t>
+      </w:r>
+      <w:proofErr w:type="gramStart"/>
+      <w:r>
+        <w:t>seem</w:t>
+      </w:r>
+      <w:proofErr w:type="gramEnd"/>
+      <w:r>
+        <w:t xml:space="preserve"> to be irrelevant, as the important aspect affecting the emissions is not the </w:t>
+      </w:r>
+      <w:proofErr w:type="gramStart"/>
+      <w:r>
+        <w:t>particular concentration</w:t>
+      </w:r>
+      <w:proofErr w:type="gramEnd"/>
+      <w:r>
+        <w:t xml:space="preserve"> data point, but the slope of the consequent concentration measurement inside the chamber that </w:t>
+      </w:r>
+      <w:proofErr w:type="gramStart"/>
+      <w:r>
+        <w:t>result</w:t>
+      </w:r>
+      <w:proofErr w:type="gramEnd"/>
+      <w:r>
+        <w:t xml:space="preserve"> in the emission rate.</w:t>
       </w:r>
     </w:p>
     <w:p>
@@ -785,12 +838,44 @@
     <w:p/>
     <w:p>
       <w:r>
-        <w:t>The data from the GC does not seems to indicate any mayor difference in the results. The high emissions do not seem to be the result of the GC analysis.</w:t>
-      </w:r>
-    </w:p>
-    <w:p>
-      <w:r>
-        <w:t>The intercept in the GC standard calibration has an important effect and is wrong in the linear model with free intercept. With the intercept forces through 0 the calibration improves significantly.  Plot with free intercept.</w:t>
+        <w:t xml:space="preserve">The data from the GC does not </w:t>
+      </w:r>
+      <w:proofErr w:type="gramStart"/>
+      <w:r>
+        <w:t>seems</w:t>
+      </w:r>
+      <w:proofErr w:type="gramEnd"/>
+      <w:r>
+        <w:t xml:space="preserve"> to indicate any mayor difference in the results. The high emissions do not seem to be the result of the GC analysis.</w:t>
+      </w:r>
+    </w:p>
+    <w:p>
+      <w:r>
+        <w:t xml:space="preserve">The </w:t>
+      </w:r>
+      <w:proofErr w:type="gramStart"/>
+      <w:r>
+        <w:t>intercept</w:t>
+      </w:r>
+      <w:proofErr w:type="gramEnd"/>
+      <w:r>
+        <w:t xml:space="preserve"> in the GC standard calibration has an important effect and is wrong in the linear model with free </w:t>
+      </w:r>
+      <w:proofErr w:type="gramStart"/>
+      <w:r>
+        <w:t>intercept</w:t>
+      </w:r>
+      <w:proofErr w:type="gramEnd"/>
+      <w:r>
+        <w:t xml:space="preserve">. With the intercept forces through 0 the calibration improves significantly.  Plot with free </w:t>
+      </w:r>
+      <w:proofErr w:type="gramStart"/>
+      <w:r>
+        <w:t>intercept</w:t>
+      </w:r>
+      <w:proofErr w:type="gramEnd"/>
+      <w:r>
+        <w:t>.</w:t>
       </w:r>
     </w:p>
     <w:p>
@@ -1313,7 +1398,15 @@
     <w:p/>
     <w:p>
       <w:r>
-        <w:t>Plotting the daily emissions (period emissions) against time it is clear that the main factor determining the higher emissions in blocks 1 and 2 are high N2O emission peaks. Those peaks are not present in blocks 3 and 4.</w:t>
+        <w:t xml:space="preserve">Plotting the daily emissions (period emissions) against time </w:t>
+      </w:r>
+      <w:proofErr w:type="gramStart"/>
+      <w:r>
+        <w:t>it is clear that the</w:t>
+      </w:r>
+      <w:proofErr w:type="gramEnd"/>
+      <w:r>
+        <w:t xml:space="preserve"> main factor determining the higher emissions in blocks 1 and 2 are high N2O emission peaks. Those peaks are not present in blocks 3 and 4.</w:t>
       </w:r>
     </w:p>
     <w:p/>
@@ -1547,6 +1640,7 @@
       <w:r>
         <w:t xml:space="preserve">In 2021, Sampling date </w:t>
       </w:r>
+      <w:proofErr w:type="gramStart"/>
       <w:r>
         <w:t>20210614</w:t>
       </w:r>
@@ -1554,7 +1648,11 @@
         <w:t xml:space="preserve">, </w:t>
       </w:r>
       <w:r>
-        <w:t xml:space="preserve"> and </w:t>
+        <w:t xml:space="preserve"> and</w:t>
+      </w:r>
+      <w:proofErr w:type="gramEnd"/>
+      <w:r>
+        <w:t xml:space="preserve"> </w:t>
       </w:r>
       <w:r>
         <w:t>20210629</w:t>
@@ -1563,13 +1661,29 @@
         <w:t xml:space="preserve"> </w:t>
       </w:r>
       <w:r>
-        <w:t>has problems:  The red points in the graph below all belong</w:t>
+        <w:t>has problems</w:t>
+      </w:r>
+      <w:proofErr w:type="gramStart"/>
+      <w:r>
+        <w:t>:  The</w:t>
+      </w:r>
+      <w:proofErr w:type="gramEnd"/>
+      <w:r>
+        <w:t xml:space="preserve"> red points in the graph below all </w:t>
+      </w:r>
+      <w:proofErr w:type="gramStart"/>
+      <w:r>
+        <w:t>belong</w:t>
       </w:r>
       <w:r>
         <w:t xml:space="preserve"> </w:t>
       </w:r>
       <w:r>
-        <w:t xml:space="preserve"> to sampling day </w:t>
+        <w:t xml:space="preserve"> to</w:t>
+      </w:r>
+      <w:proofErr w:type="gramEnd"/>
+      <w:r>
+        <w:t xml:space="preserve"> sampling day </w:t>
       </w:r>
       <w:r>
         <w:t>20210614</w:t>
@@ -1753,7 +1867,49 @@
         <w:rPr>
           <w:highlight w:val="yellow"/>
         </w:rPr>
-        <w:t>The final data for the mass flux calculations was taken from f0 and the missing data from “data error” from LR.f0. For N2O and CH4 all the data has to come from LR.f0.</w:t>
+        <w:t xml:space="preserve">The final data for the mass flux calculations was taken from f0 and the missing data from “data error” from </w:t>
+      </w:r>
+      <w:proofErr w:type="gramStart"/>
+      <w:r>
+        <w:rPr>
+          <w:highlight w:val="yellow"/>
+        </w:rPr>
+        <w:t>LR.f</w:t>
+      </w:r>
+      <w:proofErr w:type="gramEnd"/>
+      <w:r>
+        <w:rPr>
+          <w:highlight w:val="yellow"/>
+        </w:rPr>
+        <w:t xml:space="preserve">0. For N2O and CH4 all the data </w:t>
+      </w:r>
+      <w:proofErr w:type="gramStart"/>
+      <w:r>
+        <w:rPr>
+          <w:highlight w:val="yellow"/>
+        </w:rPr>
+        <w:t>has to</w:t>
+      </w:r>
+      <w:proofErr w:type="gramEnd"/>
+      <w:r>
+        <w:rPr>
+          <w:highlight w:val="yellow"/>
+        </w:rPr>
+        <w:t xml:space="preserve"> come from </w:t>
+      </w:r>
+      <w:proofErr w:type="gramStart"/>
+      <w:r>
+        <w:rPr>
+          <w:highlight w:val="yellow"/>
+        </w:rPr>
+        <w:t>LR.f</w:t>
+      </w:r>
+      <w:proofErr w:type="gramEnd"/>
+      <w:r>
+        <w:rPr>
+          <w:highlight w:val="yellow"/>
+        </w:rPr>
+        <w:t>0.</w:t>
       </w:r>
     </w:p>
     <w:p>
@@ -4115,6 +4271,7 @@
           <w14:ligatures w14:val="none"/>
         </w:rPr>
       </w:pPr>
+      <w:proofErr w:type="gramStart"/>
       <w:r>
         <w:rPr>
           <w:rFonts w:ascii="Lucida Console" w:eastAsia="Times New Roman" w:hAnsi="Lucida Console" w:cs="Courier New"/>
@@ -4124,7 +4281,32 @@
           <w:szCs w:val="20"/>
           <w14:ligatures w14:val="none"/>
         </w:rPr>
-        <w:t>summary(Cumm.Stat.Anal)</w:t>
+        <w:t>summary(</w:t>
+      </w:r>
+      <w:proofErr w:type="spellStart"/>
+      <w:r>
+        <w:rPr>
+          <w:rFonts w:ascii="Lucida Console" w:eastAsia="Times New Roman" w:hAnsi="Lucida Console" w:cs="Courier New"/>
+          <w:color w:val="0000FF"/>
+          <w:kern w:val="0"/>
+          <w:sz w:val="20"/>
+          <w:szCs w:val="20"/>
+          <w14:ligatures w14:val="none"/>
+        </w:rPr>
+        <w:t>Cumm.Stat.Anal</w:t>
+      </w:r>
+      <w:proofErr w:type="spellEnd"/>
+      <w:proofErr w:type="gramEnd"/>
+      <w:r>
+        <w:rPr>
+          <w:rFonts w:ascii="Lucida Console" w:eastAsia="Times New Roman" w:hAnsi="Lucida Console" w:cs="Courier New"/>
+          <w:color w:val="0000FF"/>
+          <w:kern w:val="0"/>
+          <w:sz w:val="20"/>
+          <w:szCs w:val="20"/>
+          <w14:ligatures w14:val="none"/>
+        </w:rPr>
+        <w:t>)</w:t>
       </w:r>
     </w:p>
     <w:p>
@@ -4240,6 +4422,8 @@
           <w14:ligatures w14:val="none"/>
         </w:rPr>
       </w:pPr>
+      <w:proofErr w:type="spellStart"/>
+      <w:proofErr w:type="gramStart"/>
       <w:r>
         <w:rPr>
           <w:rFonts w:ascii="Lucida Console" w:eastAsia="Times New Roman" w:hAnsi="Lucida Console" w:cs="Courier New"/>
@@ -4250,7 +4434,87 @@
           <w:bdr w:val="none" w:sz="0" w:space="0" w:color="auto" w:frame="1"/>
           <w14:ligatures w14:val="none"/>
         </w:rPr>
-        <w:t xml:space="preserve">lm(formula = Total.Cum.Emissions ~ BLOCK.F + Sampling.Year + </w:t>
+        <w:t>lm</w:t>
+      </w:r>
+      <w:proofErr w:type="spellEnd"/>
+      <w:r>
+        <w:rPr>
+          <w:rFonts w:ascii="Lucida Console" w:eastAsia="Times New Roman" w:hAnsi="Lucida Console" w:cs="Courier New"/>
+          <w:color w:val="000000"/>
+          <w:kern w:val="0"/>
+          <w:sz w:val="20"/>
+          <w:szCs w:val="20"/>
+          <w:bdr w:val="none" w:sz="0" w:space="0" w:color="auto" w:frame="1"/>
+          <w14:ligatures w14:val="none"/>
+        </w:rPr>
+        <w:t>(</w:t>
+      </w:r>
+      <w:proofErr w:type="gramEnd"/>
+      <w:r>
+        <w:rPr>
+          <w:rFonts w:ascii="Lucida Console" w:eastAsia="Times New Roman" w:hAnsi="Lucida Console" w:cs="Courier New"/>
+          <w:color w:val="000000"/>
+          <w:kern w:val="0"/>
+          <w:sz w:val="20"/>
+          <w:szCs w:val="20"/>
+          <w:bdr w:val="none" w:sz="0" w:space="0" w:color="auto" w:frame="1"/>
+          <w14:ligatures w14:val="none"/>
+        </w:rPr>
+        <w:t xml:space="preserve">formula = </w:t>
+      </w:r>
+      <w:proofErr w:type="spellStart"/>
+      <w:proofErr w:type="gramStart"/>
+      <w:r>
+        <w:rPr>
+          <w:rFonts w:ascii="Lucida Console" w:eastAsia="Times New Roman" w:hAnsi="Lucida Console" w:cs="Courier New"/>
+          <w:color w:val="000000"/>
+          <w:kern w:val="0"/>
+          <w:sz w:val="20"/>
+          <w:szCs w:val="20"/>
+          <w:bdr w:val="none" w:sz="0" w:space="0" w:color="auto" w:frame="1"/>
+          <w14:ligatures w14:val="none"/>
+        </w:rPr>
+        <w:t>Total.Cum.Emissions</w:t>
+      </w:r>
+      <w:proofErr w:type="spellEnd"/>
+      <w:proofErr w:type="gramEnd"/>
+      <w:r>
+        <w:rPr>
+          <w:rFonts w:ascii="Lucida Console" w:eastAsia="Times New Roman" w:hAnsi="Lucida Console" w:cs="Courier New"/>
+          <w:color w:val="000000"/>
+          <w:kern w:val="0"/>
+          <w:sz w:val="20"/>
+          <w:szCs w:val="20"/>
+          <w:bdr w:val="none" w:sz="0" w:space="0" w:color="auto" w:frame="1"/>
+          <w14:ligatures w14:val="none"/>
+        </w:rPr>
+        <w:t xml:space="preserve"> ~ BLOCK.F + </w:t>
+      </w:r>
+      <w:proofErr w:type="spellStart"/>
+      <w:r>
+        <w:rPr>
+          <w:rFonts w:ascii="Lucida Console" w:eastAsia="Times New Roman" w:hAnsi="Lucida Console" w:cs="Courier New"/>
+          <w:color w:val="000000"/>
+          <w:kern w:val="0"/>
+          <w:sz w:val="20"/>
+          <w:szCs w:val="20"/>
+          <w:bdr w:val="none" w:sz="0" w:space="0" w:color="auto" w:frame="1"/>
+          <w14:ligatures w14:val="none"/>
+        </w:rPr>
+        <w:t>Sampling.Year</w:t>
+      </w:r>
+      <w:proofErr w:type="spellEnd"/>
+      <w:r>
+        <w:rPr>
+          <w:rFonts w:ascii="Lucida Console" w:eastAsia="Times New Roman" w:hAnsi="Lucida Console" w:cs="Courier New"/>
+          <w:color w:val="000000"/>
+          <w:kern w:val="0"/>
+          <w:sz w:val="20"/>
+          <w:szCs w:val="20"/>
+          <w:bdr w:val="none" w:sz="0" w:space="0" w:color="auto" w:frame="1"/>
+          <w14:ligatures w14:val="none"/>
+        </w:rPr>
+        <w:t xml:space="preserve"> + </w:t>
       </w:r>
     </w:p>
     <w:p>
@@ -4296,7 +4560,85 @@
           <w:bdr w:val="none" w:sz="0" w:space="0" w:color="auto" w:frame="1"/>
           <w14:ligatures w14:val="none"/>
         </w:rPr>
-        <w:t xml:space="preserve">    CoverCrop.F + Treatment.F, data = Cumm.Emm.Analysis.2)</w:t>
+        <w:t xml:space="preserve">    </w:t>
+      </w:r>
+      <w:proofErr w:type="spellStart"/>
+      <w:r>
+        <w:rPr>
+          <w:rFonts w:ascii="Lucida Console" w:eastAsia="Times New Roman" w:hAnsi="Lucida Console" w:cs="Courier New"/>
+          <w:color w:val="000000"/>
+          <w:kern w:val="0"/>
+          <w:sz w:val="20"/>
+          <w:szCs w:val="20"/>
+          <w:bdr w:val="none" w:sz="0" w:space="0" w:color="auto" w:frame="1"/>
+          <w14:ligatures w14:val="none"/>
+        </w:rPr>
+        <w:t>CoverCrop.F</w:t>
+      </w:r>
+      <w:proofErr w:type="spellEnd"/>
+      <w:r>
+        <w:rPr>
+          <w:rFonts w:ascii="Lucida Console" w:eastAsia="Times New Roman" w:hAnsi="Lucida Console" w:cs="Courier New"/>
+          <w:color w:val="000000"/>
+          <w:kern w:val="0"/>
+          <w:sz w:val="20"/>
+          <w:szCs w:val="20"/>
+          <w:bdr w:val="none" w:sz="0" w:space="0" w:color="auto" w:frame="1"/>
+          <w14:ligatures w14:val="none"/>
+        </w:rPr>
+        <w:t xml:space="preserve"> + </w:t>
+      </w:r>
+      <w:proofErr w:type="spellStart"/>
+      <w:r>
+        <w:rPr>
+          <w:rFonts w:ascii="Lucida Console" w:eastAsia="Times New Roman" w:hAnsi="Lucida Console" w:cs="Courier New"/>
+          <w:color w:val="000000"/>
+          <w:kern w:val="0"/>
+          <w:sz w:val="20"/>
+          <w:szCs w:val="20"/>
+          <w:bdr w:val="none" w:sz="0" w:space="0" w:color="auto" w:frame="1"/>
+          <w14:ligatures w14:val="none"/>
+        </w:rPr>
+        <w:t>Treatment.F</w:t>
+      </w:r>
+      <w:proofErr w:type="spellEnd"/>
+      <w:r>
+        <w:rPr>
+          <w:rFonts w:ascii="Lucida Console" w:eastAsia="Times New Roman" w:hAnsi="Lucida Console" w:cs="Courier New"/>
+          <w:color w:val="000000"/>
+          <w:kern w:val="0"/>
+          <w:sz w:val="20"/>
+          <w:szCs w:val="20"/>
+          <w:bdr w:val="none" w:sz="0" w:space="0" w:color="auto" w:frame="1"/>
+          <w14:ligatures w14:val="none"/>
+        </w:rPr>
+        <w:t xml:space="preserve">, data = </w:t>
+      </w:r>
+      <w:proofErr w:type="gramStart"/>
+      <w:r>
+        <w:rPr>
+          <w:rFonts w:ascii="Lucida Console" w:eastAsia="Times New Roman" w:hAnsi="Lucida Console" w:cs="Courier New"/>
+          <w:color w:val="000000"/>
+          <w:kern w:val="0"/>
+          <w:sz w:val="20"/>
+          <w:szCs w:val="20"/>
+          <w:bdr w:val="none" w:sz="0" w:space="0" w:color="auto" w:frame="1"/>
+          <w14:ligatures w14:val="none"/>
+        </w:rPr>
+        <w:t>Cumm.Emm.Analysis</w:t>
+      </w:r>
+      <w:proofErr w:type="gramEnd"/>
+      <w:r>
+        <w:rPr>
+          <w:rFonts w:ascii="Lucida Console" w:eastAsia="Times New Roman" w:hAnsi="Lucida Console" w:cs="Courier New"/>
+          <w:color w:val="000000"/>
+          <w:kern w:val="0"/>
+          <w:sz w:val="20"/>
+          <w:szCs w:val="20"/>
+          <w:bdr w:val="none" w:sz="0" w:space="0" w:color="auto" w:frame="1"/>
+          <w14:ligatures w14:val="none"/>
+        </w:rPr>
+        <w:t>.2)</w:t>
       </w:r>
     </w:p>
     <w:p>
@@ -4422,7 +4764,33 @@
           <w:bdr w:val="none" w:sz="0" w:space="0" w:color="auto" w:frame="1"/>
           <w14:ligatures w14:val="none"/>
         </w:rPr>
-        <w:t xml:space="preserve">    Min      1Q  Median      3Q     Max </w:t>
+        <w:t xml:space="preserve">    Min      1</w:t>
+      </w:r>
+      <w:proofErr w:type="gramStart"/>
+      <w:r>
+        <w:rPr>
+          <w:rFonts w:ascii="Lucida Console" w:eastAsia="Times New Roman" w:hAnsi="Lucida Console" w:cs="Courier New"/>
+          <w:color w:val="000000"/>
+          <w:kern w:val="0"/>
+          <w:sz w:val="20"/>
+          <w:szCs w:val="20"/>
+          <w:bdr w:val="none" w:sz="0" w:space="0" w:color="auto" w:frame="1"/>
+          <w14:ligatures w14:val="none"/>
+        </w:rPr>
+        <w:t>Q  Median</w:t>
+      </w:r>
+      <w:proofErr w:type="gramEnd"/>
+      <w:r>
+        <w:rPr>
+          <w:rFonts w:ascii="Lucida Console" w:eastAsia="Times New Roman" w:hAnsi="Lucida Console" w:cs="Courier New"/>
+          <w:color w:val="000000"/>
+          <w:kern w:val="0"/>
+          <w:sz w:val="20"/>
+          <w:szCs w:val="20"/>
+          <w:bdr w:val="none" w:sz="0" w:space="0" w:color="auto" w:frame="1"/>
+          <w14:ligatures w14:val="none"/>
+        </w:rPr>
+        <w:t xml:space="preserve">      3Q     Max </w:t>
       </w:r>
     </w:p>
     <w:p>
@@ -4468,7 +4836,85 @@
           <w:bdr w:val="none" w:sz="0" w:space="0" w:color="auto" w:frame="1"/>
           <w14:ligatures w14:val="none"/>
         </w:rPr>
-        <w:t xml:space="preserve">-21.204  -7.452  -0.579   4.777  41.906 </w:t>
+        <w:t>-21.</w:t>
+      </w:r>
+      <w:proofErr w:type="gramStart"/>
+      <w:r>
+        <w:rPr>
+          <w:rFonts w:ascii="Lucida Console" w:eastAsia="Times New Roman" w:hAnsi="Lucida Console" w:cs="Courier New"/>
+          <w:color w:val="000000"/>
+          <w:kern w:val="0"/>
+          <w:sz w:val="20"/>
+          <w:szCs w:val="20"/>
+          <w:bdr w:val="none" w:sz="0" w:space="0" w:color="auto" w:frame="1"/>
+          <w14:ligatures w14:val="none"/>
+        </w:rPr>
+        <w:t>204  -</w:t>
+      </w:r>
+      <w:proofErr w:type="gramEnd"/>
+      <w:r>
+        <w:rPr>
+          <w:rFonts w:ascii="Lucida Console" w:eastAsia="Times New Roman" w:hAnsi="Lucida Console" w:cs="Courier New"/>
+          <w:color w:val="000000"/>
+          <w:kern w:val="0"/>
+          <w:sz w:val="20"/>
+          <w:szCs w:val="20"/>
+          <w:bdr w:val="none" w:sz="0" w:space="0" w:color="auto" w:frame="1"/>
+          <w14:ligatures w14:val="none"/>
+        </w:rPr>
+        <w:t>7.</w:t>
+      </w:r>
+      <w:proofErr w:type="gramStart"/>
+      <w:r>
+        <w:rPr>
+          <w:rFonts w:ascii="Lucida Console" w:eastAsia="Times New Roman" w:hAnsi="Lucida Console" w:cs="Courier New"/>
+          <w:color w:val="000000"/>
+          <w:kern w:val="0"/>
+          <w:sz w:val="20"/>
+          <w:szCs w:val="20"/>
+          <w:bdr w:val="none" w:sz="0" w:space="0" w:color="auto" w:frame="1"/>
+          <w14:ligatures w14:val="none"/>
+        </w:rPr>
+        <w:t>452  -</w:t>
+      </w:r>
+      <w:proofErr w:type="gramEnd"/>
+      <w:r>
+        <w:rPr>
+          <w:rFonts w:ascii="Lucida Console" w:eastAsia="Times New Roman" w:hAnsi="Lucida Console" w:cs="Courier New"/>
+          <w:color w:val="000000"/>
+          <w:kern w:val="0"/>
+          <w:sz w:val="20"/>
+          <w:szCs w:val="20"/>
+          <w:bdr w:val="none" w:sz="0" w:space="0" w:color="auto" w:frame="1"/>
+          <w14:ligatures w14:val="none"/>
+        </w:rPr>
+        <w:t xml:space="preserve">0.579   </w:t>
+      </w:r>
+      <w:proofErr w:type="gramStart"/>
+      <w:r>
+        <w:rPr>
+          <w:rFonts w:ascii="Lucida Console" w:eastAsia="Times New Roman" w:hAnsi="Lucida Console" w:cs="Courier New"/>
+          <w:color w:val="000000"/>
+          <w:kern w:val="0"/>
+          <w:sz w:val="20"/>
+          <w:szCs w:val="20"/>
+          <w:bdr w:val="none" w:sz="0" w:space="0" w:color="auto" w:frame="1"/>
+          <w14:ligatures w14:val="none"/>
+        </w:rPr>
+        <w:t>4.777  41.906</w:t>
+      </w:r>
+      <w:proofErr w:type="gramEnd"/>
+      <w:r>
+        <w:rPr>
+          <w:rFonts w:ascii="Lucida Console" w:eastAsia="Times New Roman" w:hAnsi="Lucida Console" w:cs="Courier New"/>
+          <w:color w:val="000000"/>
+          <w:kern w:val="0"/>
+          <w:sz w:val="20"/>
+          <w:szCs w:val="20"/>
+          <w:bdr w:val="none" w:sz="0" w:space="0" w:color="auto" w:frame="1"/>
+          <w14:ligatures w14:val="none"/>
+        </w:rPr>
+        <w:t xml:space="preserve"> </w:t>
       </w:r>
     </w:p>
     <w:p>
@@ -4594,7 +5040,33 @@
           <w:bdr w:val="none" w:sz="0" w:space="0" w:color="auto" w:frame="1"/>
           <w14:ligatures w14:val="none"/>
         </w:rPr>
-        <w:t xml:space="preserve">                  Estimate Std. Error t value Pr(&gt;|t|)    </w:t>
+        <w:t xml:space="preserve">                  Estimate Std. Error t value </w:t>
+      </w:r>
+      <w:proofErr w:type="spellStart"/>
+      <w:r>
+        <w:rPr>
+          <w:rFonts w:ascii="Lucida Console" w:eastAsia="Times New Roman" w:hAnsi="Lucida Console" w:cs="Courier New"/>
+          <w:color w:val="000000"/>
+          <w:kern w:val="0"/>
+          <w:sz w:val="20"/>
+          <w:szCs w:val="20"/>
+          <w:bdr w:val="none" w:sz="0" w:space="0" w:color="auto" w:frame="1"/>
+          <w14:ligatures w14:val="none"/>
+        </w:rPr>
+        <w:t>Pr</w:t>
+      </w:r>
+      <w:proofErr w:type="spellEnd"/>
+      <w:r>
+        <w:rPr>
+          <w:rFonts w:ascii="Lucida Console" w:eastAsia="Times New Roman" w:hAnsi="Lucida Console" w:cs="Courier New"/>
+          <w:color w:val="000000"/>
+          <w:kern w:val="0"/>
+          <w:sz w:val="20"/>
+          <w:szCs w:val="20"/>
+          <w:bdr w:val="none" w:sz="0" w:space="0" w:color="auto" w:frame="1"/>
+          <w14:ligatures w14:val="none"/>
+        </w:rPr>
+        <w:t xml:space="preserve">(&gt;|t|)    </w:t>
       </w:r>
     </w:p>
     <w:p>
@@ -4640,7 +5112,59 @@
           <w:bdr w:val="none" w:sz="0" w:space="0" w:color="auto" w:frame="1"/>
           <w14:ligatures w14:val="none"/>
         </w:rPr>
-        <w:t>(Intercept)        17.9614     3.9252   4.576    2e-05 ***</w:t>
+        <w:t>(</w:t>
+      </w:r>
+      <w:proofErr w:type="gramStart"/>
+      <w:r>
+        <w:rPr>
+          <w:rFonts w:ascii="Lucida Console" w:eastAsia="Times New Roman" w:hAnsi="Lucida Console" w:cs="Courier New"/>
+          <w:color w:val="000000"/>
+          <w:kern w:val="0"/>
+          <w:sz w:val="20"/>
+          <w:szCs w:val="20"/>
+          <w:bdr w:val="none" w:sz="0" w:space="0" w:color="auto" w:frame="1"/>
+          <w14:ligatures w14:val="none"/>
+        </w:rPr>
+        <w:t xml:space="preserve">Intercept)   </w:t>
+      </w:r>
+      <w:proofErr w:type="gramEnd"/>
+      <w:r>
+        <w:rPr>
+          <w:rFonts w:ascii="Lucida Console" w:eastAsia="Times New Roman" w:hAnsi="Lucida Console" w:cs="Courier New"/>
+          <w:color w:val="000000"/>
+          <w:kern w:val="0"/>
+          <w:sz w:val="20"/>
+          <w:szCs w:val="20"/>
+          <w:bdr w:val="none" w:sz="0" w:space="0" w:color="auto" w:frame="1"/>
+          <w14:ligatures w14:val="none"/>
+        </w:rPr>
+        <w:t xml:space="preserve">     17.9614     3.9252   4.576 </w:t>
+      </w:r>
+      <w:proofErr w:type="gramStart"/>
+      <w:r>
+        <w:rPr>
+          <w:rFonts w:ascii="Lucida Console" w:eastAsia="Times New Roman" w:hAnsi="Lucida Console" w:cs="Courier New"/>
+          <w:color w:val="000000"/>
+          <w:kern w:val="0"/>
+          <w:sz w:val="20"/>
+          <w:szCs w:val="20"/>
+          <w:bdr w:val="none" w:sz="0" w:space="0" w:color="auto" w:frame="1"/>
+          <w14:ligatures w14:val="none"/>
+        </w:rPr>
+        <w:t xml:space="preserve">   2e</w:t>
+      </w:r>
+      <w:proofErr w:type="gramEnd"/>
+      <w:r>
+        <w:rPr>
+          <w:rFonts w:ascii="Lucida Console" w:eastAsia="Times New Roman" w:hAnsi="Lucida Console" w:cs="Courier New"/>
+          <w:color w:val="000000"/>
+          <w:kern w:val="0"/>
+          <w:sz w:val="20"/>
+          <w:szCs w:val="20"/>
+          <w:bdr w:val="none" w:sz="0" w:space="0" w:color="auto" w:frame="1"/>
+          <w14:ligatures w14:val="none"/>
+        </w:rPr>
+        <w:t>-05 ***</w:t>
       </w:r>
     </w:p>
     <w:p>
@@ -4732,7 +5256,33 @@
           <w:bdr w:val="none" w:sz="0" w:space="0" w:color="auto" w:frame="1"/>
           <w14:ligatures w14:val="none"/>
         </w:rPr>
-        <w:t>BLOCK.F3          -14.7355     3.5916  -4.103 0.000109 ***</w:t>
+        <w:t xml:space="preserve">BLOCK.F3          -14.7355     </w:t>
+      </w:r>
+      <w:proofErr w:type="gramStart"/>
+      <w:r>
+        <w:rPr>
+          <w:rFonts w:ascii="Lucida Console" w:eastAsia="Times New Roman" w:hAnsi="Lucida Console" w:cs="Courier New"/>
+          <w:color w:val="000000"/>
+          <w:kern w:val="0"/>
+          <w:sz w:val="20"/>
+          <w:szCs w:val="20"/>
+          <w:bdr w:val="none" w:sz="0" w:space="0" w:color="auto" w:frame="1"/>
+          <w14:ligatures w14:val="none"/>
+        </w:rPr>
+        <w:t>3.5916  -</w:t>
+      </w:r>
+      <w:proofErr w:type="gramEnd"/>
+      <w:r>
+        <w:rPr>
+          <w:rFonts w:ascii="Lucida Console" w:eastAsia="Times New Roman" w:hAnsi="Lucida Console" w:cs="Courier New"/>
+          <w:color w:val="000000"/>
+          <w:kern w:val="0"/>
+          <w:sz w:val="20"/>
+          <w:szCs w:val="20"/>
+          <w:bdr w:val="none" w:sz="0" w:space="0" w:color="auto" w:frame="1"/>
+          <w14:ligatures w14:val="none"/>
+        </w:rPr>
+        <w:t>4.103 0.000109 ***</w:t>
       </w:r>
     </w:p>
     <w:p>
@@ -4778,7 +5328,33 @@
           <w:bdr w:val="none" w:sz="0" w:space="0" w:color="auto" w:frame="1"/>
           <w14:ligatures w14:val="none"/>
         </w:rPr>
-        <w:t xml:space="preserve">BLOCK.F4          -12.3094     3.5916  -3.427 0.001025 ** </w:t>
+        <w:t xml:space="preserve">BLOCK.F4          -12.3094     </w:t>
+      </w:r>
+      <w:proofErr w:type="gramStart"/>
+      <w:r>
+        <w:rPr>
+          <w:rFonts w:ascii="Lucida Console" w:eastAsia="Times New Roman" w:hAnsi="Lucida Console" w:cs="Courier New"/>
+          <w:color w:val="000000"/>
+          <w:kern w:val="0"/>
+          <w:sz w:val="20"/>
+          <w:szCs w:val="20"/>
+          <w:bdr w:val="none" w:sz="0" w:space="0" w:color="auto" w:frame="1"/>
+          <w14:ligatures w14:val="none"/>
+        </w:rPr>
+        <w:t>3.5916  -</w:t>
+      </w:r>
+      <w:proofErr w:type="gramEnd"/>
+      <w:r>
+        <w:rPr>
+          <w:rFonts w:ascii="Lucida Console" w:eastAsia="Times New Roman" w:hAnsi="Lucida Console" w:cs="Courier New"/>
+          <w:color w:val="000000"/>
+          <w:kern w:val="0"/>
+          <w:sz w:val="20"/>
+          <w:szCs w:val="20"/>
+          <w:bdr w:val="none" w:sz="0" w:space="0" w:color="auto" w:frame="1"/>
+          <w14:ligatures w14:val="none"/>
+        </w:rPr>
+        <w:t xml:space="preserve">3.427 0.001025 ** </w:t>
       </w:r>
     </w:p>
     <w:p>
@@ -4824,7 +5400,59 @@
           <w:bdr w:val="none" w:sz="0" w:space="0" w:color="auto" w:frame="1"/>
           <w14:ligatures w14:val="none"/>
         </w:rPr>
-        <w:t>Sampling.Year2022  -9.7553     2.5396  -3.841 0.000266 ***</w:t>
+        <w:t>Sampling.Year</w:t>
+      </w:r>
+      <w:proofErr w:type="gramStart"/>
+      <w:r>
+        <w:rPr>
+          <w:rFonts w:ascii="Lucida Console" w:eastAsia="Times New Roman" w:hAnsi="Lucida Console" w:cs="Courier New"/>
+          <w:color w:val="000000"/>
+          <w:kern w:val="0"/>
+          <w:sz w:val="20"/>
+          <w:szCs w:val="20"/>
+          <w:bdr w:val="none" w:sz="0" w:space="0" w:color="auto" w:frame="1"/>
+          <w14:ligatures w14:val="none"/>
+        </w:rPr>
+        <w:t>2022  -</w:t>
+      </w:r>
+      <w:proofErr w:type="gramEnd"/>
+      <w:r>
+        <w:rPr>
+          <w:rFonts w:ascii="Lucida Console" w:eastAsia="Times New Roman" w:hAnsi="Lucida Console" w:cs="Courier New"/>
+          <w:color w:val="000000"/>
+          <w:kern w:val="0"/>
+          <w:sz w:val="20"/>
+          <w:szCs w:val="20"/>
+          <w:bdr w:val="none" w:sz="0" w:space="0" w:color="auto" w:frame="1"/>
+          <w14:ligatures w14:val="none"/>
+        </w:rPr>
+        <w:t xml:space="preserve">9.7553     </w:t>
+      </w:r>
+      <w:proofErr w:type="gramStart"/>
+      <w:r>
+        <w:rPr>
+          <w:rFonts w:ascii="Lucida Console" w:eastAsia="Times New Roman" w:hAnsi="Lucida Console" w:cs="Courier New"/>
+          <w:color w:val="000000"/>
+          <w:kern w:val="0"/>
+          <w:sz w:val="20"/>
+          <w:szCs w:val="20"/>
+          <w:bdr w:val="none" w:sz="0" w:space="0" w:color="auto" w:frame="1"/>
+          <w14:ligatures w14:val="none"/>
+        </w:rPr>
+        <w:t>2.5396  -</w:t>
+      </w:r>
+      <w:proofErr w:type="gramEnd"/>
+      <w:r>
+        <w:rPr>
+          <w:rFonts w:ascii="Lucida Console" w:eastAsia="Times New Roman" w:hAnsi="Lucida Console" w:cs="Courier New"/>
+          <w:color w:val="000000"/>
+          <w:kern w:val="0"/>
+          <w:sz w:val="20"/>
+          <w:szCs w:val="20"/>
+          <w:bdr w:val="none" w:sz="0" w:space="0" w:color="auto" w:frame="1"/>
+          <w14:ligatures w14:val="none"/>
+        </w:rPr>
+        <w:t>3.841 0.000266 ***</w:t>
       </w:r>
     </w:p>
     <w:p>
@@ -4860,6 +5488,7 @@
           <w14:ligatures w14:val="none"/>
         </w:rPr>
       </w:pPr>
+      <w:proofErr w:type="spellStart"/>
       <w:r>
         <w:rPr>
           <w:rFonts w:ascii="Lucida Console" w:eastAsia="Times New Roman" w:hAnsi="Lucida Console" w:cs="Courier New"/>
@@ -4870,7 +5499,20 @@
           <w:bdr w:val="none" w:sz="0" w:space="0" w:color="auto" w:frame="1"/>
           <w14:ligatures w14:val="none"/>
         </w:rPr>
-        <w:t xml:space="preserve">CoverCrop.FClover   3.1667     3.2786   0.966 0.337437    </w:t>
+        <w:t>CoverCrop.FClover</w:t>
+      </w:r>
+      <w:proofErr w:type="spellEnd"/>
+      <w:r>
+        <w:rPr>
+          <w:rFonts w:ascii="Lucida Console" w:eastAsia="Times New Roman" w:hAnsi="Lucida Console" w:cs="Courier New"/>
+          <w:color w:val="000000"/>
+          <w:kern w:val="0"/>
+          <w:sz w:val="20"/>
+          <w:szCs w:val="20"/>
+          <w:bdr w:val="none" w:sz="0" w:space="0" w:color="auto" w:frame="1"/>
+          <w14:ligatures w14:val="none"/>
+        </w:rPr>
+        <w:t xml:space="preserve">   3.1667     3.2786   0.966 0.337437    </w:t>
       </w:r>
     </w:p>
     <w:p>
@@ -4906,6 +5548,7 @@
           <w14:ligatures w14:val="none"/>
         </w:rPr>
       </w:pPr>
+      <w:proofErr w:type="spellStart"/>
       <w:r>
         <w:rPr>
           <w:rFonts w:ascii="Lucida Console" w:eastAsia="Times New Roman" w:hAnsi="Lucida Console" w:cs="Courier New"/>
@@ -4916,7 +5559,46 @@
           <w:bdr w:val="none" w:sz="0" w:space="0" w:color="auto" w:frame="1"/>
           <w14:ligatures w14:val="none"/>
         </w:rPr>
-        <w:t xml:space="preserve">CoverCrop.FTrit    -0.4087     3.2786  -0.125 0.901165    </w:t>
+        <w:t>CoverCrop.FTrit</w:t>
+      </w:r>
+      <w:proofErr w:type="spellEnd"/>
+      <w:r>
+        <w:rPr>
+          <w:rFonts w:ascii="Lucida Console" w:eastAsia="Times New Roman" w:hAnsi="Lucida Console" w:cs="Courier New"/>
+          <w:color w:val="000000"/>
+          <w:kern w:val="0"/>
+          <w:sz w:val="20"/>
+          <w:szCs w:val="20"/>
+          <w:bdr w:val="none" w:sz="0" w:space="0" w:color="auto" w:frame="1"/>
+          <w14:ligatures w14:val="none"/>
+        </w:rPr>
+        <w:t xml:space="preserve">    -0.4087     </w:t>
+      </w:r>
+      <w:proofErr w:type="gramStart"/>
+      <w:r>
+        <w:rPr>
+          <w:rFonts w:ascii="Lucida Console" w:eastAsia="Times New Roman" w:hAnsi="Lucida Console" w:cs="Courier New"/>
+          <w:color w:val="000000"/>
+          <w:kern w:val="0"/>
+          <w:sz w:val="20"/>
+          <w:szCs w:val="20"/>
+          <w:bdr w:val="none" w:sz="0" w:space="0" w:color="auto" w:frame="1"/>
+          <w14:ligatures w14:val="none"/>
+        </w:rPr>
+        <w:t>3.2786  -</w:t>
+      </w:r>
+      <w:proofErr w:type="gramEnd"/>
+      <w:r>
+        <w:rPr>
+          <w:rFonts w:ascii="Lucida Console" w:eastAsia="Times New Roman" w:hAnsi="Lucida Console" w:cs="Courier New"/>
+          <w:color w:val="000000"/>
+          <w:kern w:val="0"/>
+          <w:sz w:val="20"/>
+          <w:szCs w:val="20"/>
+          <w:bdr w:val="none" w:sz="0" w:space="0" w:color="auto" w:frame="1"/>
+          <w14:ligatures w14:val="none"/>
+        </w:rPr>
+        <w:t xml:space="preserve">0.125 0.901165    </w:t>
       </w:r>
     </w:p>
     <w:p>
@@ -4952,6 +5634,7 @@
           <w14:ligatures w14:val="none"/>
         </w:rPr>
       </w:pPr>
+      <w:proofErr w:type="spellStart"/>
       <w:r>
         <w:rPr>
           <w:rFonts w:ascii="Lucida Console" w:eastAsia="Times New Roman" w:hAnsi="Lucida Console" w:cs="Courier New"/>
@@ -4962,7 +5645,46 @@
           <w:bdr w:val="none" w:sz="0" w:space="0" w:color="auto" w:frame="1"/>
           <w14:ligatures w14:val="none"/>
         </w:rPr>
-        <w:t xml:space="preserve">Treatment.FB        6.2892     3.2786   1.918 0.059162 .  </w:t>
+        <w:t>Treatment.FB</w:t>
+      </w:r>
+      <w:proofErr w:type="spellEnd"/>
+      <w:r>
+        <w:rPr>
+          <w:rFonts w:ascii="Lucida Console" w:eastAsia="Times New Roman" w:hAnsi="Lucida Console" w:cs="Courier New"/>
+          <w:color w:val="000000"/>
+          <w:kern w:val="0"/>
+          <w:sz w:val="20"/>
+          <w:szCs w:val="20"/>
+          <w:bdr w:val="none" w:sz="0" w:space="0" w:color="auto" w:frame="1"/>
+          <w14:ligatures w14:val="none"/>
+        </w:rPr>
+        <w:t xml:space="preserve">        6.2892     3.2786   1.918 0.</w:t>
+      </w:r>
+      <w:proofErr w:type="gramStart"/>
+      <w:r>
+        <w:rPr>
+          <w:rFonts w:ascii="Lucida Console" w:eastAsia="Times New Roman" w:hAnsi="Lucida Console" w:cs="Courier New"/>
+          <w:color w:val="000000"/>
+          <w:kern w:val="0"/>
+          <w:sz w:val="20"/>
+          <w:szCs w:val="20"/>
+          <w:bdr w:val="none" w:sz="0" w:space="0" w:color="auto" w:frame="1"/>
+          <w14:ligatures w14:val="none"/>
+        </w:rPr>
+        <w:t>059162 .</w:t>
+      </w:r>
+      <w:proofErr w:type="gramEnd"/>
+      <w:r>
+        <w:rPr>
+          <w:rFonts w:ascii="Lucida Console" w:eastAsia="Times New Roman" w:hAnsi="Lucida Console" w:cs="Courier New"/>
+          <w:color w:val="000000"/>
+          <w:kern w:val="0"/>
+          <w:sz w:val="20"/>
+          <w:szCs w:val="20"/>
+          <w:bdr w:val="none" w:sz="0" w:space="0" w:color="auto" w:frame="1"/>
+          <w14:ligatures w14:val="none"/>
+        </w:rPr>
+        <w:t xml:space="preserve">  </w:t>
       </w:r>
     </w:p>
     <w:p>
@@ -4998,6 +5720,7 @@
           <w14:ligatures w14:val="none"/>
         </w:rPr>
       </w:pPr>
+      <w:proofErr w:type="spellStart"/>
       <w:r>
         <w:rPr>
           <w:rFonts w:ascii="Lucida Console" w:eastAsia="Times New Roman" w:hAnsi="Lucida Console" w:cs="Courier New"/>
@@ -5008,7 +5731,20 @@
           <w:bdr w:val="none" w:sz="0" w:space="0" w:color="auto" w:frame="1"/>
           <w14:ligatures w14:val="none"/>
         </w:rPr>
-        <w:t xml:space="preserve">Treatment.FC        4.1102     3.2786   1.254 0.214146    </w:t>
+        <w:t>Treatment.FC</w:t>
+      </w:r>
+      <w:proofErr w:type="spellEnd"/>
+      <w:r>
+        <w:rPr>
+          <w:rFonts w:ascii="Lucida Console" w:eastAsia="Times New Roman" w:hAnsi="Lucida Console" w:cs="Courier New"/>
+          <w:color w:val="000000"/>
+          <w:kern w:val="0"/>
+          <w:sz w:val="20"/>
+          <w:szCs w:val="20"/>
+          <w:bdr w:val="none" w:sz="0" w:space="0" w:color="auto" w:frame="1"/>
+          <w14:ligatures w14:val="none"/>
+        </w:rPr>
+        <w:t xml:space="preserve">        4.1102     3.2786   1.254 0.214146    </w:t>
       </w:r>
     </w:p>
     <w:p>
@@ -5044,6 +5780,7 @@
           <w14:ligatures w14:val="none"/>
         </w:rPr>
       </w:pPr>
+      <w:proofErr w:type="spellStart"/>
       <w:r>
         <w:rPr>
           <w:rFonts w:ascii="Lucida Console" w:eastAsia="Times New Roman" w:hAnsi="Lucida Console" w:cs="Courier New"/>
@@ -5054,7 +5791,46 @@
           <w:bdr w:val="none" w:sz="0" w:space="0" w:color="auto" w:frame="1"/>
           <w14:ligatures w14:val="none"/>
         </w:rPr>
-        <w:t xml:space="preserve">Treatment.FD       -0.8080     5.0082  -0.161 0.872300    </w:t>
+        <w:t>Treatment.FD</w:t>
+      </w:r>
+      <w:proofErr w:type="spellEnd"/>
+      <w:r>
+        <w:rPr>
+          <w:rFonts w:ascii="Lucida Console" w:eastAsia="Times New Roman" w:hAnsi="Lucida Console" w:cs="Courier New"/>
+          <w:color w:val="000000"/>
+          <w:kern w:val="0"/>
+          <w:sz w:val="20"/>
+          <w:szCs w:val="20"/>
+          <w:bdr w:val="none" w:sz="0" w:space="0" w:color="auto" w:frame="1"/>
+          <w14:ligatures w14:val="none"/>
+        </w:rPr>
+        <w:t xml:space="preserve">       -0.8080     </w:t>
+      </w:r>
+      <w:proofErr w:type="gramStart"/>
+      <w:r>
+        <w:rPr>
+          <w:rFonts w:ascii="Lucida Console" w:eastAsia="Times New Roman" w:hAnsi="Lucida Console" w:cs="Courier New"/>
+          <w:color w:val="000000"/>
+          <w:kern w:val="0"/>
+          <w:sz w:val="20"/>
+          <w:szCs w:val="20"/>
+          <w:bdr w:val="none" w:sz="0" w:space="0" w:color="auto" w:frame="1"/>
+          <w14:ligatures w14:val="none"/>
+        </w:rPr>
+        <w:t>5.0082  -</w:t>
+      </w:r>
+      <w:proofErr w:type="gramEnd"/>
+      <w:r>
+        <w:rPr>
+          <w:rFonts w:ascii="Lucida Console" w:eastAsia="Times New Roman" w:hAnsi="Lucida Console" w:cs="Courier New"/>
+          <w:color w:val="000000"/>
+          <w:kern w:val="0"/>
+          <w:sz w:val="20"/>
+          <w:szCs w:val="20"/>
+          <w:bdr w:val="none" w:sz="0" w:space="0" w:color="auto" w:frame="1"/>
+          <w14:ligatures w14:val="none"/>
+        </w:rPr>
+        <w:t xml:space="preserve">0.161 0.872300    </w:t>
       </w:r>
     </w:p>
     <w:p>
@@ -5136,6 +5912,7 @@
           <w14:ligatures w14:val="none"/>
         </w:rPr>
       </w:pPr>
+      <w:proofErr w:type="spellStart"/>
       <w:r>
         <w:rPr>
           <w:rFonts w:ascii="Lucida Console" w:eastAsia="Times New Roman" w:hAnsi="Lucida Console" w:cs="Courier New"/>
@@ -5146,7 +5923,124 @@
           <w:bdr w:val="none" w:sz="0" w:space="0" w:color="auto" w:frame="1"/>
           <w14:ligatures w14:val="none"/>
         </w:rPr>
-        <w:t>Signif. codes:  0 ‘***’ 0.001 ‘**’ 0.01 ‘*’ 0.05 ‘.’ 0.1 ‘ ’ 1</w:t>
+        <w:t>Signif</w:t>
+      </w:r>
+      <w:proofErr w:type="spellEnd"/>
+      <w:r>
+        <w:rPr>
+          <w:rFonts w:ascii="Lucida Console" w:eastAsia="Times New Roman" w:hAnsi="Lucida Console" w:cs="Courier New"/>
+          <w:color w:val="000000"/>
+          <w:kern w:val="0"/>
+          <w:sz w:val="20"/>
+          <w:szCs w:val="20"/>
+          <w:bdr w:val="none" w:sz="0" w:space="0" w:color="auto" w:frame="1"/>
+          <w14:ligatures w14:val="none"/>
+        </w:rPr>
+        <w:t>. codes</w:t>
+      </w:r>
+      <w:proofErr w:type="gramStart"/>
+      <w:r>
+        <w:rPr>
+          <w:rFonts w:ascii="Lucida Console" w:eastAsia="Times New Roman" w:hAnsi="Lucida Console" w:cs="Courier New"/>
+          <w:color w:val="000000"/>
+          <w:kern w:val="0"/>
+          <w:sz w:val="20"/>
+          <w:szCs w:val="20"/>
+          <w:bdr w:val="none" w:sz="0" w:space="0" w:color="auto" w:frame="1"/>
+          <w14:ligatures w14:val="none"/>
+        </w:rPr>
+        <w:t>:  0 ‘</w:t>
+      </w:r>
+      <w:proofErr w:type="gramEnd"/>
+      <w:r>
+        <w:rPr>
+          <w:rFonts w:ascii="Lucida Console" w:eastAsia="Times New Roman" w:hAnsi="Lucida Console" w:cs="Courier New"/>
+          <w:color w:val="000000"/>
+          <w:kern w:val="0"/>
+          <w:sz w:val="20"/>
+          <w:szCs w:val="20"/>
+          <w:bdr w:val="none" w:sz="0" w:space="0" w:color="auto" w:frame="1"/>
+          <w14:ligatures w14:val="none"/>
+        </w:rPr>
+        <w:t xml:space="preserve">***’ </w:t>
+      </w:r>
+      <w:proofErr w:type="gramStart"/>
+      <w:r>
+        <w:rPr>
+          <w:rFonts w:ascii="Lucida Console" w:eastAsia="Times New Roman" w:hAnsi="Lucida Console" w:cs="Courier New"/>
+          <w:color w:val="000000"/>
+          <w:kern w:val="0"/>
+          <w:sz w:val="20"/>
+          <w:szCs w:val="20"/>
+          <w:bdr w:val="none" w:sz="0" w:space="0" w:color="auto" w:frame="1"/>
+          <w14:ligatures w14:val="none"/>
+        </w:rPr>
+        <w:t>0.001 ‘*</w:t>
+      </w:r>
+      <w:proofErr w:type="gramEnd"/>
+      <w:r>
+        <w:rPr>
+          <w:rFonts w:ascii="Lucida Console" w:eastAsia="Times New Roman" w:hAnsi="Lucida Console" w:cs="Courier New"/>
+          <w:color w:val="000000"/>
+          <w:kern w:val="0"/>
+          <w:sz w:val="20"/>
+          <w:szCs w:val="20"/>
+          <w:bdr w:val="none" w:sz="0" w:space="0" w:color="auto" w:frame="1"/>
+          <w14:ligatures w14:val="none"/>
+        </w:rPr>
+        <w:t xml:space="preserve">*’ </w:t>
+      </w:r>
+      <w:proofErr w:type="gramStart"/>
+      <w:r>
+        <w:rPr>
+          <w:rFonts w:ascii="Lucida Console" w:eastAsia="Times New Roman" w:hAnsi="Lucida Console" w:cs="Courier New"/>
+          <w:color w:val="000000"/>
+          <w:kern w:val="0"/>
+          <w:sz w:val="20"/>
+          <w:szCs w:val="20"/>
+          <w:bdr w:val="none" w:sz="0" w:space="0" w:color="auto" w:frame="1"/>
+          <w14:ligatures w14:val="none"/>
+        </w:rPr>
+        <w:t>0.01 ‘*</w:t>
+      </w:r>
+      <w:proofErr w:type="gramEnd"/>
+      <w:r>
+        <w:rPr>
+          <w:rFonts w:ascii="Lucida Console" w:eastAsia="Times New Roman" w:hAnsi="Lucida Console" w:cs="Courier New"/>
+          <w:color w:val="000000"/>
+          <w:kern w:val="0"/>
+          <w:sz w:val="20"/>
+          <w:szCs w:val="20"/>
+          <w:bdr w:val="none" w:sz="0" w:space="0" w:color="auto" w:frame="1"/>
+          <w14:ligatures w14:val="none"/>
+        </w:rPr>
+        <w:t xml:space="preserve">’ 0.05 ‘.’ 0.1 </w:t>
+      </w:r>
+      <w:proofErr w:type="gramStart"/>
+      <w:r>
+        <w:rPr>
+          <w:rFonts w:ascii="Lucida Console" w:eastAsia="Times New Roman" w:hAnsi="Lucida Console" w:cs="Courier New"/>
+          <w:color w:val="000000"/>
+          <w:kern w:val="0"/>
+          <w:sz w:val="20"/>
+          <w:szCs w:val="20"/>
+          <w:bdr w:val="none" w:sz="0" w:space="0" w:color="auto" w:frame="1"/>
+          <w14:ligatures w14:val="none"/>
+        </w:rPr>
+        <w:t>‘ ’</w:t>
+      </w:r>
+      <w:proofErr w:type="gramEnd"/>
+      <w:r>
+        <w:rPr>
+          <w:rFonts w:ascii="Lucida Console" w:eastAsia="Times New Roman" w:hAnsi="Lucida Console" w:cs="Courier New"/>
+          <w:color w:val="000000"/>
+          <w:kern w:val="0"/>
+          <w:sz w:val="20"/>
+          <w:szCs w:val="20"/>
+          <w:bdr w:val="none" w:sz="0" w:space="0" w:color="auto" w:frame="1"/>
+          <w14:ligatures w14:val="none"/>
+        </w:rPr>
+        <w:t xml:space="preserve"> 1</w:t>
       </w:r>
     </w:p>
     <w:p>
@@ -5272,8 +6166,9 @@
           <w:bdr w:val="none" w:sz="0" w:space="0" w:color="auto" w:frame="1"/>
           <w14:ligatures w14:val="none"/>
         </w:rPr>
-        <w:t>Multiple R-squared:  0.4307,</w:t>
-      </w:r>
+        <w:t>Multiple R-squared</w:t>
+      </w:r>
+      <w:proofErr w:type="gramStart"/>
       <w:r>
         <w:rPr>
           <w:rFonts w:ascii="Lucida Console" w:eastAsia="Times New Roman" w:hAnsi="Lucida Console" w:cs="Courier New"/>
@@ -5284,8 +6179,59 @@
           <w:bdr w:val="none" w:sz="0" w:space="0" w:color="auto" w:frame="1"/>
           <w14:ligatures w14:val="none"/>
         </w:rPr>
+        <w:t>:  0.4307</w:t>
+      </w:r>
+      <w:proofErr w:type="gramEnd"/>
+      <w:r>
+        <w:rPr>
+          <w:rFonts w:ascii="Lucida Console" w:eastAsia="Times New Roman" w:hAnsi="Lucida Console" w:cs="Courier New"/>
+          <w:color w:val="000000"/>
+          <w:kern w:val="0"/>
+          <w:sz w:val="20"/>
+          <w:szCs w:val="20"/>
+          <w:bdr w:val="none" w:sz="0" w:space="0" w:color="auto" w:frame="1"/>
+          <w14:ligatures w14:val="none"/>
+        </w:rPr>
+        <w:t>,</w:t>
+      </w:r>
+      <w:r>
+        <w:rPr>
+          <w:rFonts w:ascii="Lucida Console" w:eastAsia="Times New Roman" w:hAnsi="Lucida Console" w:cs="Courier New"/>
+          <w:color w:val="000000"/>
+          <w:kern w:val="0"/>
+          <w:sz w:val="20"/>
+          <w:szCs w:val="20"/>
+          <w:bdr w:val="none" w:sz="0" w:space="0" w:color="auto" w:frame="1"/>
+          <w14:ligatures w14:val="none"/>
+        </w:rPr>
         <w:tab/>
-        <w:t xml:space="preserve">Adjusted R-squared:  0.3575 </w:t>
+        <w:t>Adjusted R-squared</w:t>
+      </w:r>
+      <w:proofErr w:type="gramStart"/>
+      <w:r>
+        <w:rPr>
+          <w:rFonts w:ascii="Lucida Console" w:eastAsia="Times New Roman" w:hAnsi="Lucida Console" w:cs="Courier New"/>
+          <w:color w:val="000000"/>
+          <w:kern w:val="0"/>
+          <w:sz w:val="20"/>
+          <w:szCs w:val="20"/>
+          <w:bdr w:val="none" w:sz="0" w:space="0" w:color="auto" w:frame="1"/>
+          <w14:ligatures w14:val="none"/>
+        </w:rPr>
+        <w:t>:  0.3575</w:t>
+      </w:r>
+      <w:proofErr w:type="gramEnd"/>
+      <w:r>
+        <w:rPr>
+          <w:rFonts w:ascii="Lucida Console" w:eastAsia="Times New Roman" w:hAnsi="Lucida Console" w:cs="Courier New"/>
+          <w:color w:val="000000"/>
+          <w:kern w:val="0"/>
+          <w:sz w:val="20"/>
+          <w:szCs w:val="20"/>
+          <w:bdr w:val="none" w:sz="0" w:space="0" w:color="auto" w:frame="1"/>
+          <w14:ligatures w14:val="none"/>
+        </w:rPr>
+        <w:t xml:space="preserve"> </w:t>
       </w:r>
     </w:p>
     <w:p>
@@ -5331,7 +6277,33 @@
           <w:bdr w:val="none" w:sz="0" w:space="0" w:color="auto" w:frame="1"/>
           <w14:ligatures w14:val="none"/>
         </w:rPr>
-        <w:t>F-statistic: 5.883 on 9 and 70 DF,  p-value: 4.438e-06</w:t>
+        <w:t xml:space="preserve">F-statistic: 5.883 on 9 and 70 </w:t>
+      </w:r>
+      <w:proofErr w:type="gramStart"/>
+      <w:r>
+        <w:rPr>
+          <w:rFonts w:ascii="Lucida Console" w:eastAsia="Times New Roman" w:hAnsi="Lucida Console" w:cs="Courier New"/>
+          <w:color w:val="000000"/>
+          <w:kern w:val="0"/>
+          <w:sz w:val="20"/>
+          <w:szCs w:val="20"/>
+          <w:bdr w:val="none" w:sz="0" w:space="0" w:color="auto" w:frame="1"/>
+          <w14:ligatures w14:val="none"/>
+        </w:rPr>
+        <w:t>DF,  p</w:t>
+      </w:r>
+      <w:proofErr w:type="gramEnd"/>
+      <w:r>
+        <w:rPr>
+          <w:rFonts w:ascii="Lucida Console" w:eastAsia="Times New Roman" w:hAnsi="Lucida Console" w:cs="Courier New"/>
+          <w:color w:val="000000"/>
+          <w:kern w:val="0"/>
+          <w:sz w:val="20"/>
+          <w:szCs w:val="20"/>
+          <w:bdr w:val="none" w:sz="0" w:space="0" w:color="auto" w:frame="1"/>
+          <w14:ligatures w14:val="none"/>
+        </w:rPr>
+        <w:t>-value: 4.438e-06</w:t>
       </w:r>
     </w:p>
     <w:p>
@@ -5413,13 +6385,43 @@
           <w:color w:val="0000FF"/>
         </w:rPr>
       </w:pPr>
+      <w:proofErr w:type="spellStart"/>
+      <w:proofErr w:type="gramStart"/>
       <w:r>
         <w:rPr>
           <w:rStyle w:val="gnvwddmdb3b"/>
           <w:rFonts w:ascii="Lucida Console" w:hAnsi="Lucida Console"/>
           <w:color w:val="0000FF"/>
         </w:rPr>
-        <w:t>anova(Cumm.Stat.Anal)</w:t>
+        <w:t>anova</w:t>
+      </w:r>
+      <w:proofErr w:type="spellEnd"/>
+      <w:r>
+        <w:rPr>
+          <w:rStyle w:val="gnvwddmdb3b"/>
+          <w:rFonts w:ascii="Lucida Console" w:hAnsi="Lucida Console"/>
+          <w:color w:val="0000FF"/>
+        </w:rPr>
+        <w:t>(</w:t>
+      </w:r>
+      <w:proofErr w:type="spellStart"/>
+      <w:r>
+        <w:rPr>
+          <w:rStyle w:val="gnvwddmdb3b"/>
+          <w:rFonts w:ascii="Lucida Console" w:hAnsi="Lucida Console"/>
+          <w:color w:val="0000FF"/>
+        </w:rPr>
+        <w:t>Cumm.Stat.Anal</w:t>
+      </w:r>
+      <w:proofErr w:type="spellEnd"/>
+      <w:proofErr w:type="gramEnd"/>
+      <w:r>
+        <w:rPr>
+          <w:rStyle w:val="gnvwddmdb3b"/>
+          <w:rFonts w:ascii="Lucida Console" w:hAnsi="Lucida Console"/>
+          <w:color w:val="0000FF"/>
+        </w:rPr>
+        <w:t>)</w:t>
       </w:r>
     </w:p>
     <w:p>
@@ -5476,8 +6478,21 @@
           <w:color w:val="000000"/>
           <w:bdr w:val="none" w:sz="0" w:space="0" w:color="auto" w:frame="1"/>
         </w:rPr>
-        <w:t>Response: Total.Cum.Emissions</w:t>
-      </w:r>
+        <w:t xml:space="preserve">Response: </w:t>
+      </w:r>
+      <w:proofErr w:type="spellStart"/>
+      <w:proofErr w:type="gramStart"/>
+      <w:r>
+        <w:rPr>
+          <w:rStyle w:val="gnvwddmdl3b"/>
+          <w:rFonts w:ascii="Lucida Console" w:hAnsi="Lucida Console"/>
+          <w:color w:val="000000"/>
+          <w:bdr w:val="none" w:sz="0" w:space="0" w:color="auto" w:frame="1"/>
+        </w:rPr>
+        <w:t>Total.Cum.Emissions</w:t>
+      </w:r>
+      <w:proofErr w:type="spellEnd"/>
+      <w:proofErr w:type="gramEnd"/>
     </w:p>
     <w:p>
       <w:pPr>
@@ -5498,7 +6513,67 @@
           <w:color w:val="000000"/>
           <w:bdr w:val="none" w:sz="0" w:space="0" w:color="auto" w:frame="1"/>
         </w:rPr>
-        <w:t xml:space="preserve">              Df Sum Sq Mean Sq F value    Pr(&gt;F)    </w:t>
+        <w:t xml:space="preserve">              </w:t>
+      </w:r>
+      <w:proofErr w:type="spellStart"/>
+      <w:r>
+        <w:rPr>
+          <w:rStyle w:val="gnvwddmdl3b"/>
+          <w:rFonts w:ascii="Lucida Console" w:hAnsi="Lucida Console"/>
+          <w:color w:val="000000"/>
+          <w:bdr w:val="none" w:sz="0" w:space="0" w:color="auto" w:frame="1"/>
+        </w:rPr>
+        <w:t>Df</w:t>
+      </w:r>
+      <w:proofErr w:type="spellEnd"/>
+      <w:r>
+        <w:rPr>
+          <w:rStyle w:val="gnvwddmdl3b"/>
+          <w:rFonts w:ascii="Lucida Console" w:hAnsi="Lucida Console"/>
+          <w:color w:val="000000"/>
+          <w:bdr w:val="none" w:sz="0" w:space="0" w:color="auto" w:frame="1"/>
+        </w:rPr>
+        <w:t xml:space="preserve"> Sum Sq Mean Sq F </w:t>
+      </w:r>
+      <w:proofErr w:type="gramStart"/>
+      <w:r>
+        <w:rPr>
+          <w:rStyle w:val="gnvwddmdl3b"/>
+          <w:rFonts w:ascii="Lucida Console" w:hAnsi="Lucida Console"/>
+          <w:color w:val="000000"/>
+          <w:bdr w:val="none" w:sz="0" w:space="0" w:color="auto" w:frame="1"/>
+        </w:rPr>
+        <w:t>value</w:t>
+      </w:r>
+      <w:proofErr w:type="gramEnd"/>
+      <w:r>
+        <w:rPr>
+          <w:rStyle w:val="gnvwddmdl3b"/>
+          <w:rFonts w:ascii="Lucida Console" w:hAnsi="Lucida Console"/>
+          <w:color w:val="000000"/>
+          <w:bdr w:val="none" w:sz="0" w:space="0" w:color="auto" w:frame="1"/>
+        </w:rPr>
+        <w:t xml:space="preserve">    </w:t>
+      </w:r>
+      <w:proofErr w:type="spellStart"/>
+      <w:r>
+        <w:rPr>
+          <w:rStyle w:val="gnvwddmdl3b"/>
+          <w:rFonts w:ascii="Lucida Console" w:hAnsi="Lucida Console"/>
+          <w:color w:val="000000"/>
+          <w:bdr w:val="none" w:sz="0" w:space="0" w:color="auto" w:frame="1"/>
+        </w:rPr>
+        <w:t>Pr</w:t>
+      </w:r>
+      <w:proofErr w:type="spellEnd"/>
+      <w:r>
+        <w:rPr>
+          <w:rStyle w:val="gnvwddmdl3b"/>
+          <w:rFonts w:ascii="Lucida Console" w:hAnsi="Lucida Console"/>
+          <w:color w:val="000000"/>
+          <w:bdr w:val="none" w:sz="0" w:space="0" w:color="auto" w:frame="1"/>
+        </w:rPr>
+        <w:t xml:space="preserve">(&gt;F)    </w:t>
       </w:r>
     </w:p>
     <w:p>
@@ -5535,6 +6610,8 @@
           <w:bdr w:val="none" w:sz="0" w:space="0" w:color="auto" w:frame="1"/>
         </w:rPr>
       </w:pPr>
+      <w:proofErr w:type="spellStart"/>
+      <w:proofErr w:type="gramStart"/>
       <w:r>
         <w:rPr>
           <w:rStyle w:val="gnvwddmdl3b"/>
@@ -5542,7 +6619,27 @@
           <w:color w:val="000000"/>
           <w:bdr w:val="none" w:sz="0" w:space="0" w:color="auto" w:frame="1"/>
         </w:rPr>
-        <w:t>Sampling.Year  1 1903.3 1903.32 14.7553 0.0002661 ***</w:t>
+        <w:t>Sampling.Year</w:t>
+      </w:r>
+      <w:proofErr w:type="spellEnd"/>
+      <w:r>
+        <w:rPr>
+          <w:rStyle w:val="gnvwddmdl3b"/>
+          <w:rFonts w:ascii="Lucida Console" w:hAnsi="Lucida Console"/>
+          <w:color w:val="000000"/>
+          <w:bdr w:val="none" w:sz="0" w:space="0" w:color="auto" w:frame="1"/>
+        </w:rPr>
+        <w:t xml:space="preserve">  1</w:t>
+      </w:r>
+      <w:proofErr w:type="gramEnd"/>
+      <w:r>
+        <w:rPr>
+          <w:rStyle w:val="gnvwddmdl3b"/>
+          <w:rFonts w:ascii="Lucida Console" w:hAnsi="Lucida Console"/>
+          <w:color w:val="000000"/>
+          <w:bdr w:val="none" w:sz="0" w:space="0" w:color="auto" w:frame="1"/>
+        </w:rPr>
+        <w:t xml:space="preserve"> 1903.3 1903.32 14.7553 0.0002661 ***</w:t>
       </w:r>
     </w:p>
     <w:p>
@@ -5557,6 +6654,7 @@
           <w:bdr w:val="none" w:sz="0" w:space="0" w:color="auto" w:frame="1"/>
         </w:rPr>
       </w:pPr>
+      <w:proofErr w:type="spellStart"/>
       <w:r>
         <w:rPr>
           <w:rStyle w:val="gnvwddmdl3b"/>
@@ -5564,7 +6662,57 @@
           <w:color w:val="000000"/>
           <w:bdr w:val="none" w:sz="0" w:space="0" w:color="auto" w:frame="1"/>
         </w:rPr>
-        <w:t xml:space="preserve">CoverCrop.F    2  103.8   51.89  0.4023 0.6703176    </w:t>
+        <w:t>CoverCrop.F</w:t>
+      </w:r>
+      <w:proofErr w:type="spellEnd"/>
+      <w:r>
+        <w:rPr>
+          <w:rStyle w:val="gnvwddmdl3b"/>
+          <w:rFonts w:ascii="Lucida Console" w:hAnsi="Lucida Console"/>
+          <w:color w:val="000000"/>
+          <w:bdr w:val="none" w:sz="0" w:space="0" w:color="auto" w:frame="1"/>
+        </w:rPr>
+        <w:t xml:space="preserve">    </w:t>
+      </w:r>
+      <w:proofErr w:type="gramStart"/>
+      <w:r>
+        <w:rPr>
+          <w:rStyle w:val="gnvwddmdl3b"/>
+          <w:rFonts w:ascii="Lucida Console" w:hAnsi="Lucida Console"/>
+          <w:color w:val="000000"/>
+          <w:bdr w:val="none" w:sz="0" w:space="0" w:color="auto" w:frame="1"/>
+        </w:rPr>
+        <w:t>2  103.8</w:t>
+      </w:r>
+      <w:proofErr w:type="gramEnd"/>
+      <w:r>
+        <w:rPr>
+          <w:rStyle w:val="gnvwddmdl3b"/>
+          <w:rFonts w:ascii="Lucida Console" w:hAnsi="Lucida Console"/>
+          <w:color w:val="000000"/>
+          <w:bdr w:val="none" w:sz="0" w:space="0" w:color="auto" w:frame="1"/>
+        </w:rPr>
+        <w:t xml:space="preserve">   </w:t>
+      </w:r>
+      <w:proofErr w:type="gramStart"/>
+      <w:r>
+        <w:rPr>
+          <w:rStyle w:val="gnvwddmdl3b"/>
+          <w:rFonts w:ascii="Lucida Console" w:hAnsi="Lucida Console"/>
+          <w:color w:val="000000"/>
+          <w:bdr w:val="none" w:sz="0" w:space="0" w:color="auto" w:frame="1"/>
+        </w:rPr>
+        <w:t>51.89  0.4023</w:t>
+      </w:r>
+      <w:proofErr w:type="gramEnd"/>
+      <w:r>
+        <w:rPr>
+          <w:rStyle w:val="gnvwddmdl3b"/>
+          <w:rFonts w:ascii="Lucida Console" w:hAnsi="Lucida Console"/>
+          <w:color w:val="000000"/>
+          <w:bdr w:val="none" w:sz="0" w:space="0" w:color="auto" w:frame="1"/>
+        </w:rPr>
+        <w:t xml:space="preserve"> 0.6703176    </w:t>
       </w:r>
     </w:p>
     <w:p>
@@ -5579,6 +6727,7 @@
           <w:bdr w:val="none" w:sz="0" w:space="0" w:color="auto" w:frame="1"/>
         </w:rPr>
       </w:pPr>
+      <w:proofErr w:type="spellStart"/>
       <w:r>
         <w:rPr>
           <w:rStyle w:val="gnvwddmdl3b"/>
@@ -5586,7 +6735,57 @@
           <w:color w:val="000000"/>
           <w:bdr w:val="none" w:sz="0" w:space="0" w:color="auto" w:frame="1"/>
         </w:rPr>
-        <w:t xml:space="preserve">Treatment.F    3  599.2  199.73  1.5484 0.2096975    </w:t>
+        <w:t>Treatment.F</w:t>
+      </w:r>
+      <w:proofErr w:type="spellEnd"/>
+      <w:r>
+        <w:rPr>
+          <w:rStyle w:val="gnvwddmdl3b"/>
+          <w:rFonts w:ascii="Lucida Console" w:hAnsi="Lucida Console"/>
+          <w:color w:val="000000"/>
+          <w:bdr w:val="none" w:sz="0" w:space="0" w:color="auto" w:frame="1"/>
+        </w:rPr>
+        <w:t xml:space="preserve">    </w:t>
+      </w:r>
+      <w:proofErr w:type="gramStart"/>
+      <w:r>
+        <w:rPr>
+          <w:rStyle w:val="gnvwddmdl3b"/>
+          <w:rFonts w:ascii="Lucida Console" w:hAnsi="Lucida Console"/>
+          <w:color w:val="000000"/>
+          <w:bdr w:val="none" w:sz="0" w:space="0" w:color="auto" w:frame="1"/>
+        </w:rPr>
+        <w:t>3  599.2</w:t>
+      </w:r>
+      <w:proofErr w:type="gramEnd"/>
+      <w:r>
+        <w:rPr>
+          <w:rStyle w:val="gnvwddmdl3b"/>
+          <w:rFonts w:ascii="Lucida Console" w:hAnsi="Lucida Console"/>
+          <w:color w:val="000000"/>
+          <w:bdr w:val="none" w:sz="0" w:space="0" w:color="auto" w:frame="1"/>
+        </w:rPr>
+        <w:t xml:space="preserve">  </w:t>
+      </w:r>
+      <w:proofErr w:type="gramStart"/>
+      <w:r>
+        <w:rPr>
+          <w:rStyle w:val="gnvwddmdl3b"/>
+          <w:rFonts w:ascii="Lucida Console" w:hAnsi="Lucida Console"/>
+          <w:color w:val="000000"/>
+          <w:bdr w:val="none" w:sz="0" w:space="0" w:color="auto" w:frame="1"/>
+        </w:rPr>
+        <w:t>199.73  1.5484</w:t>
+      </w:r>
+      <w:proofErr w:type="gramEnd"/>
+      <w:r>
+        <w:rPr>
+          <w:rStyle w:val="gnvwddmdl3b"/>
+          <w:rFonts w:ascii="Lucida Console" w:hAnsi="Lucida Console"/>
+          <w:color w:val="000000"/>
+          <w:bdr w:val="none" w:sz="0" w:space="0" w:color="auto" w:frame="1"/>
+        </w:rPr>
+        <w:t xml:space="preserve"> 0.2096975    </w:t>
       </w:r>
     </w:p>
     <w:p>
@@ -5608,7 +6807,27 @@
           <w:color w:val="000000"/>
           <w:bdr w:val="none" w:sz="0" w:space="0" w:color="auto" w:frame="1"/>
         </w:rPr>
-        <w:t xml:space="preserve">Residuals     70 9029.5  128.99                      </w:t>
+        <w:t xml:space="preserve">Residuals     70 </w:t>
+      </w:r>
+      <w:proofErr w:type="gramStart"/>
+      <w:r>
+        <w:rPr>
+          <w:rStyle w:val="gnvwddmdl3b"/>
+          <w:rFonts w:ascii="Lucida Console" w:hAnsi="Lucida Console"/>
+          <w:color w:val="000000"/>
+          <w:bdr w:val="none" w:sz="0" w:space="0" w:color="auto" w:frame="1"/>
+        </w:rPr>
+        <w:t>9029.5  128.99</w:t>
+      </w:r>
+      <w:proofErr w:type="gramEnd"/>
+      <w:r>
+        <w:rPr>
+          <w:rStyle w:val="gnvwddmdl3b"/>
+          <w:rFonts w:ascii="Lucida Console" w:hAnsi="Lucida Console"/>
+          <w:color w:val="000000"/>
+          <w:bdr w:val="none" w:sz="0" w:space="0" w:color="auto" w:frame="1"/>
+        </w:rPr>
+        <w:t xml:space="preserve">                      </w:t>
       </w:r>
     </w:p>
     <w:p>
@@ -5643,6 +6862,7 @@
           <w:color w:val="000000"/>
         </w:rPr>
       </w:pPr>
+      <w:proofErr w:type="spellStart"/>
       <w:r>
         <w:rPr>
           <w:rStyle w:val="gnvwddmdl3b"/>
@@ -5650,7 +6870,97 @@
           <w:color w:val="000000"/>
           <w:bdr w:val="none" w:sz="0" w:space="0" w:color="auto" w:frame="1"/>
         </w:rPr>
-        <w:t>Signif. codes:  0 ‘***’ 0.001 ‘**’ 0.01 ‘*’ 0.05 ‘.’ 0.1 ‘ ’ 1</w:t>
+        <w:t>Signif</w:t>
+      </w:r>
+      <w:proofErr w:type="spellEnd"/>
+      <w:r>
+        <w:rPr>
+          <w:rStyle w:val="gnvwddmdl3b"/>
+          <w:rFonts w:ascii="Lucida Console" w:hAnsi="Lucida Console"/>
+          <w:color w:val="000000"/>
+          <w:bdr w:val="none" w:sz="0" w:space="0" w:color="auto" w:frame="1"/>
+        </w:rPr>
+        <w:t>. codes</w:t>
+      </w:r>
+      <w:proofErr w:type="gramStart"/>
+      <w:r>
+        <w:rPr>
+          <w:rStyle w:val="gnvwddmdl3b"/>
+          <w:rFonts w:ascii="Lucida Console" w:hAnsi="Lucida Console"/>
+          <w:color w:val="000000"/>
+          <w:bdr w:val="none" w:sz="0" w:space="0" w:color="auto" w:frame="1"/>
+        </w:rPr>
+        <w:t>:  0 ‘</w:t>
+      </w:r>
+      <w:proofErr w:type="gramEnd"/>
+      <w:r>
+        <w:rPr>
+          <w:rStyle w:val="gnvwddmdl3b"/>
+          <w:rFonts w:ascii="Lucida Console" w:hAnsi="Lucida Console"/>
+          <w:color w:val="000000"/>
+          <w:bdr w:val="none" w:sz="0" w:space="0" w:color="auto" w:frame="1"/>
+        </w:rPr>
+        <w:t xml:space="preserve">***’ </w:t>
+      </w:r>
+      <w:proofErr w:type="gramStart"/>
+      <w:r>
+        <w:rPr>
+          <w:rStyle w:val="gnvwddmdl3b"/>
+          <w:rFonts w:ascii="Lucida Console" w:hAnsi="Lucida Console"/>
+          <w:color w:val="000000"/>
+          <w:bdr w:val="none" w:sz="0" w:space="0" w:color="auto" w:frame="1"/>
+        </w:rPr>
+        <w:t>0.001 ‘*</w:t>
+      </w:r>
+      <w:proofErr w:type="gramEnd"/>
+      <w:r>
+        <w:rPr>
+          <w:rStyle w:val="gnvwddmdl3b"/>
+          <w:rFonts w:ascii="Lucida Console" w:hAnsi="Lucida Console"/>
+          <w:color w:val="000000"/>
+          <w:bdr w:val="none" w:sz="0" w:space="0" w:color="auto" w:frame="1"/>
+        </w:rPr>
+        <w:t xml:space="preserve">*’ </w:t>
+      </w:r>
+      <w:proofErr w:type="gramStart"/>
+      <w:r>
+        <w:rPr>
+          <w:rStyle w:val="gnvwddmdl3b"/>
+          <w:rFonts w:ascii="Lucida Console" w:hAnsi="Lucida Console"/>
+          <w:color w:val="000000"/>
+          <w:bdr w:val="none" w:sz="0" w:space="0" w:color="auto" w:frame="1"/>
+        </w:rPr>
+        <w:t>0.01 ‘*</w:t>
+      </w:r>
+      <w:proofErr w:type="gramEnd"/>
+      <w:r>
+        <w:rPr>
+          <w:rStyle w:val="gnvwddmdl3b"/>
+          <w:rFonts w:ascii="Lucida Console" w:hAnsi="Lucida Console"/>
+          <w:color w:val="000000"/>
+          <w:bdr w:val="none" w:sz="0" w:space="0" w:color="auto" w:frame="1"/>
+        </w:rPr>
+        <w:t xml:space="preserve">’ 0.05 ‘.’ 0.1 </w:t>
+      </w:r>
+      <w:proofErr w:type="gramStart"/>
+      <w:r>
+        <w:rPr>
+          <w:rStyle w:val="gnvwddmdl3b"/>
+          <w:rFonts w:ascii="Lucida Console" w:hAnsi="Lucida Console"/>
+          <w:color w:val="000000"/>
+          <w:bdr w:val="none" w:sz="0" w:space="0" w:color="auto" w:frame="1"/>
+        </w:rPr>
+        <w:t>‘ ’</w:t>
+      </w:r>
+      <w:proofErr w:type="gramEnd"/>
+      <w:r>
+        <w:rPr>
+          <w:rStyle w:val="gnvwddmdl3b"/>
+          <w:rFonts w:ascii="Lucida Console" w:hAnsi="Lucida Console"/>
+          <w:color w:val="000000"/>
+          <w:bdr w:val="none" w:sz="0" w:space="0" w:color="auto" w:frame="1"/>
+        </w:rPr>
+        <w:t xml:space="preserve"> 1</w:t>
       </w:r>
     </w:p>
     <w:p>
@@ -5801,8 +7111,13 @@
       </w:r>
     </w:p>
     <w:p>
-      <w:r>
-        <w:t>Daily  emission analysis</w:t>
+      <w:proofErr w:type="gramStart"/>
+      <w:r>
+        <w:t>Daily  emission</w:t>
+      </w:r>
+      <w:proofErr w:type="gramEnd"/>
+      <w:r>
+        <w:t xml:space="preserve"> analysis</w:t>
       </w:r>
     </w:p>
     <w:p>
@@ -6258,6 +7573,7 @@
                 <w14:ligatures w14:val="none"/>
               </w:rPr>
             </w:pPr>
+            <w:proofErr w:type="spellStart"/>
             <w:r>
               <w:rPr>
                 <w:rFonts w:ascii="Calibri" w:eastAsia="Times New Roman" w:hAnsi="Calibri" w:cs="Calibri"/>
@@ -6266,8 +7582,31 @@
                 <w:szCs w:val="24"/>
                 <w14:ligatures w14:val="none"/>
               </w:rPr>
-              <w:t>uL/Lgas</w:t>
+              <w:t>uL</w:t>
             </w:r>
+            <w:proofErr w:type="spellEnd"/>
+            <w:r>
+              <w:rPr>
+                <w:rFonts w:ascii="Calibri" w:eastAsia="Times New Roman" w:hAnsi="Calibri" w:cs="Calibri"/>
+                <w:kern w:val="0"/>
+                <w:sz w:val="24"/>
+                <w:szCs w:val="24"/>
+                <w14:ligatures w14:val="none"/>
+              </w:rPr>
+              <w:t>/</w:t>
+            </w:r>
+            <w:proofErr w:type="spellStart"/>
+            <w:r>
+              <w:rPr>
+                <w:rFonts w:ascii="Calibri" w:eastAsia="Times New Roman" w:hAnsi="Calibri" w:cs="Calibri"/>
+                <w:kern w:val="0"/>
+                <w:sz w:val="24"/>
+                <w:szCs w:val="24"/>
+                <w14:ligatures w14:val="none"/>
+              </w:rPr>
+              <w:t>Lgas</w:t>
+            </w:r>
+            <w:proofErr w:type="spellEnd"/>
           </w:p>
         </w:tc>
         <w:tc>
@@ -6482,6 +7821,7 @@
                 <w14:ligatures w14:val="none"/>
               </w:rPr>
             </w:pPr>
+            <w:proofErr w:type="spellStart"/>
             <w:r>
               <w:rPr>
                 <w:rFonts w:ascii="Calibri" w:eastAsia="Times New Roman" w:hAnsi="Calibri" w:cs="Calibri"/>
@@ -6490,8 +7830,31 @@
                 <w:szCs w:val="24"/>
                 <w14:ligatures w14:val="none"/>
               </w:rPr>
-              <w:t>uL/Lgas</w:t>
+              <w:t>uL</w:t>
             </w:r>
+            <w:proofErr w:type="spellEnd"/>
+            <w:r>
+              <w:rPr>
+                <w:rFonts w:ascii="Calibri" w:eastAsia="Times New Roman" w:hAnsi="Calibri" w:cs="Calibri"/>
+                <w:kern w:val="0"/>
+                <w:sz w:val="24"/>
+                <w:szCs w:val="24"/>
+                <w14:ligatures w14:val="none"/>
+              </w:rPr>
+              <w:t>/</w:t>
+            </w:r>
+            <w:proofErr w:type="spellStart"/>
+            <w:r>
+              <w:rPr>
+                <w:rFonts w:ascii="Calibri" w:eastAsia="Times New Roman" w:hAnsi="Calibri" w:cs="Calibri"/>
+                <w:kern w:val="0"/>
+                <w:sz w:val="24"/>
+                <w:szCs w:val="24"/>
+                <w14:ligatures w14:val="none"/>
+              </w:rPr>
+              <w:t>Lgas</w:t>
+            </w:r>
+            <w:proofErr w:type="spellEnd"/>
           </w:p>
         </w:tc>
         <w:tc>
@@ -6706,6 +8069,7 @@
                 <w14:ligatures w14:val="none"/>
               </w:rPr>
             </w:pPr>
+            <w:proofErr w:type="spellStart"/>
             <w:r>
               <w:rPr>
                 <w:rFonts w:ascii="Calibri" w:eastAsia="Times New Roman" w:hAnsi="Calibri" w:cs="Calibri"/>
@@ -6714,8 +8078,31 @@
                 <w:szCs w:val="24"/>
                 <w14:ligatures w14:val="none"/>
               </w:rPr>
-              <w:t>uL/Lgas</w:t>
+              <w:t>uL</w:t>
             </w:r>
+            <w:proofErr w:type="spellEnd"/>
+            <w:r>
+              <w:rPr>
+                <w:rFonts w:ascii="Calibri" w:eastAsia="Times New Roman" w:hAnsi="Calibri" w:cs="Calibri"/>
+                <w:kern w:val="0"/>
+                <w:sz w:val="24"/>
+                <w:szCs w:val="24"/>
+                <w14:ligatures w14:val="none"/>
+              </w:rPr>
+              <w:t>/</w:t>
+            </w:r>
+            <w:proofErr w:type="spellStart"/>
+            <w:r>
+              <w:rPr>
+                <w:rFonts w:ascii="Calibri" w:eastAsia="Times New Roman" w:hAnsi="Calibri" w:cs="Calibri"/>
+                <w:kern w:val="0"/>
+                <w:sz w:val="24"/>
+                <w:szCs w:val="24"/>
+                <w14:ligatures w14:val="none"/>
+              </w:rPr>
+              <w:t>Lgas</w:t>
+            </w:r>
+            <w:proofErr w:type="spellEnd"/>
           </w:p>
         </w:tc>
         <w:tc>
@@ -6930,6 +8317,7 @@
                 <w14:ligatures w14:val="none"/>
               </w:rPr>
             </w:pPr>
+            <w:proofErr w:type="spellStart"/>
             <w:r>
               <w:rPr>
                 <w:rFonts w:ascii="Calibri" w:eastAsia="Times New Roman" w:hAnsi="Calibri" w:cs="Calibri"/>
@@ -6938,8 +8326,31 @@
                 <w:szCs w:val="24"/>
                 <w14:ligatures w14:val="none"/>
               </w:rPr>
-              <w:t>uL/Lgas</w:t>
+              <w:t>uL</w:t>
             </w:r>
+            <w:proofErr w:type="spellEnd"/>
+            <w:r>
+              <w:rPr>
+                <w:rFonts w:ascii="Calibri" w:eastAsia="Times New Roman" w:hAnsi="Calibri" w:cs="Calibri"/>
+                <w:kern w:val="0"/>
+                <w:sz w:val="24"/>
+                <w:szCs w:val="24"/>
+                <w14:ligatures w14:val="none"/>
+              </w:rPr>
+              <w:t>/</w:t>
+            </w:r>
+            <w:proofErr w:type="spellStart"/>
+            <w:r>
+              <w:rPr>
+                <w:rFonts w:ascii="Calibri" w:eastAsia="Times New Roman" w:hAnsi="Calibri" w:cs="Calibri"/>
+                <w:kern w:val="0"/>
+                <w:sz w:val="24"/>
+                <w:szCs w:val="24"/>
+                <w14:ligatures w14:val="none"/>
+              </w:rPr>
+              <w:t>Lgas</w:t>
+            </w:r>
+            <w:proofErr w:type="spellEnd"/>
           </w:p>
         </w:tc>
         <w:tc>
@@ -7151,6 +8562,7 @@
                 <w14:ligatures w14:val="none"/>
               </w:rPr>
             </w:pPr>
+            <w:proofErr w:type="spellStart"/>
             <w:r>
               <w:rPr>
                 <w:rFonts w:ascii="Calibri" w:eastAsia="Times New Roman" w:hAnsi="Calibri" w:cs="Calibri"/>
@@ -7159,8 +8571,31 @@
                 <w:szCs w:val="24"/>
                 <w14:ligatures w14:val="none"/>
               </w:rPr>
-              <w:t>uL/Lgas</w:t>
+              <w:t>uL</w:t>
             </w:r>
+            <w:proofErr w:type="spellEnd"/>
+            <w:r>
+              <w:rPr>
+                <w:rFonts w:ascii="Calibri" w:eastAsia="Times New Roman" w:hAnsi="Calibri" w:cs="Calibri"/>
+                <w:kern w:val="0"/>
+                <w:sz w:val="24"/>
+                <w:szCs w:val="24"/>
+                <w14:ligatures w14:val="none"/>
+              </w:rPr>
+              <w:t>/</w:t>
+            </w:r>
+            <w:proofErr w:type="spellStart"/>
+            <w:r>
+              <w:rPr>
+                <w:rFonts w:ascii="Calibri" w:eastAsia="Times New Roman" w:hAnsi="Calibri" w:cs="Calibri"/>
+                <w:kern w:val="0"/>
+                <w:sz w:val="24"/>
+                <w:szCs w:val="24"/>
+                <w14:ligatures w14:val="none"/>
+              </w:rPr>
+              <w:t>Lgas</w:t>
+            </w:r>
+            <w:proofErr w:type="spellEnd"/>
           </w:p>
         </w:tc>
         <w:tc>
@@ -7372,6 +8807,7 @@
                 <w14:ligatures w14:val="none"/>
               </w:rPr>
             </w:pPr>
+            <w:proofErr w:type="spellStart"/>
             <w:r>
               <w:rPr>
                 <w:rFonts w:ascii="Calibri" w:eastAsia="Times New Roman" w:hAnsi="Calibri" w:cs="Calibri"/>
@@ -7380,8 +8816,31 @@
                 <w:szCs w:val="24"/>
                 <w14:ligatures w14:val="none"/>
               </w:rPr>
-              <w:t>uL/Lgas</w:t>
+              <w:t>uL</w:t>
             </w:r>
+            <w:proofErr w:type="spellEnd"/>
+            <w:r>
+              <w:rPr>
+                <w:rFonts w:ascii="Calibri" w:eastAsia="Times New Roman" w:hAnsi="Calibri" w:cs="Calibri"/>
+                <w:kern w:val="0"/>
+                <w:sz w:val="24"/>
+                <w:szCs w:val="24"/>
+                <w14:ligatures w14:val="none"/>
+              </w:rPr>
+              <w:t>/</w:t>
+            </w:r>
+            <w:proofErr w:type="spellStart"/>
+            <w:r>
+              <w:rPr>
+                <w:rFonts w:ascii="Calibri" w:eastAsia="Times New Roman" w:hAnsi="Calibri" w:cs="Calibri"/>
+                <w:kern w:val="0"/>
+                <w:sz w:val="24"/>
+                <w:szCs w:val="24"/>
+                <w14:ligatures w14:val="none"/>
+              </w:rPr>
+              <w:t>Lgas</w:t>
+            </w:r>
+            <w:proofErr w:type="spellEnd"/>
           </w:p>
         </w:tc>
         <w:tc>
@@ -7596,6 +9055,7 @@
                 <w14:ligatures w14:val="none"/>
               </w:rPr>
             </w:pPr>
+            <w:proofErr w:type="spellStart"/>
             <w:r>
               <w:rPr>
                 <w:rFonts w:ascii="Calibri" w:eastAsia="Times New Roman" w:hAnsi="Calibri" w:cs="Calibri"/>
@@ -7604,8 +9064,31 @@
                 <w:szCs w:val="24"/>
                 <w14:ligatures w14:val="none"/>
               </w:rPr>
-              <w:t>uL/Lgas</w:t>
+              <w:t>uL</w:t>
             </w:r>
+            <w:proofErr w:type="spellEnd"/>
+            <w:r>
+              <w:rPr>
+                <w:rFonts w:ascii="Calibri" w:eastAsia="Times New Roman" w:hAnsi="Calibri" w:cs="Calibri"/>
+                <w:kern w:val="0"/>
+                <w:sz w:val="24"/>
+                <w:szCs w:val="24"/>
+                <w14:ligatures w14:val="none"/>
+              </w:rPr>
+              <w:t>/</w:t>
+            </w:r>
+            <w:proofErr w:type="spellStart"/>
+            <w:r>
+              <w:rPr>
+                <w:rFonts w:ascii="Calibri" w:eastAsia="Times New Roman" w:hAnsi="Calibri" w:cs="Calibri"/>
+                <w:kern w:val="0"/>
+                <w:sz w:val="24"/>
+                <w:szCs w:val="24"/>
+                <w14:ligatures w14:val="none"/>
+              </w:rPr>
+              <w:t>Lgas</w:t>
+            </w:r>
+            <w:proofErr w:type="spellEnd"/>
           </w:p>
         </w:tc>
         <w:tc>
@@ -9088,6 +10571,7 @@
         </w:rPr>
         <w:t xml:space="preserve">The Standards Names </w:t>
       </w:r>
+      <w:proofErr w:type="spellStart"/>
       <w:r>
         <w:rPr>
           <w:b/>
@@ -9095,8 +10579,9 @@
           <w:sz w:val="40"/>
           <w:szCs w:val="40"/>
         </w:rPr>
-        <w:t xml:space="preserve">PerSTDA and </w:t>
-      </w:r>
+        <w:t>PerSTDA</w:t>
+      </w:r>
+      <w:proofErr w:type="spellEnd"/>
       <w:r>
         <w:rPr>
           <w:b/>
@@ -9104,8 +10589,9 @@
           <w:sz w:val="40"/>
           <w:szCs w:val="40"/>
         </w:rPr>
-        <w:t>PerSTD</w:t>
-      </w:r>
+        <w:t xml:space="preserve"> and </w:t>
+      </w:r>
+      <w:proofErr w:type="spellStart"/>
       <w:r>
         <w:rPr>
           <w:b/>
@@ -9113,8 +10599,9 @@
           <w:sz w:val="40"/>
           <w:szCs w:val="40"/>
         </w:rPr>
-        <w:t xml:space="preserve"> are not consistent through out 2021, therefore </w:t>
-      </w:r>
+        <w:t>PerSTD</w:t>
+      </w:r>
+      <w:proofErr w:type="spellEnd"/>
       <w:r>
         <w:rPr>
           <w:b/>
@@ -9122,7 +10609,254 @@
           <w:sz w:val="40"/>
           <w:szCs w:val="40"/>
         </w:rPr>
+        <w:t xml:space="preserve"> are not consistent </w:t>
+      </w:r>
+      <w:proofErr w:type="spellStart"/>
+      <w:proofErr w:type="gramStart"/>
+      <w:r>
+        <w:rPr>
+          <w:b/>
+          <w:bCs/>
+          <w:sz w:val="40"/>
+          <w:szCs w:val="40"/>
+        </w:rPr>
+        <w:t>through out</w:t>
+      </w:r>
+      <w:proofErr w:type="spellEnd"/>
+      <w:proofErr w:type="gramEnd"/>
+      <w:r>
+        <w:rPr>
+          <w:b/>
+          <w:bCs/>
+          <w:sz w:val="40"/>
+          <w:szCs w:val="40"/>
+        </w:rPr>
+        <w:t xml:space="preserve"> 2021, therefore </w:t>
+      </w:r>
+      <w:r>
+        <w:rPr>
+          <w:b/>
+          <w:bCs/>
+          <w:sz w:val="40"/>
+          <w:szCs w:val="40"/>
+        </w:rPr>
         <w:t>need to be selected manually!!!!!!</w:t>
+      </w:r>
+    </w:p>
+    <w:p>
+      <w:pPr>
+        <w:rPr>
+          <w:b/>
+          <w:bCs/>
+          <w:sz w:val="40"/>
+          <w:szCs w:val="40"/>
+        </w:rPr>
+      </w:pPr>
+      <w:r>
+        <w:rPr>
+          <w:b/>
+          <w:bCs/>
+          <w:sz w:val="40"/>
+          <w:szCs w:val="40"/>
+        </w:rPr>
+        <w:br w:type="page"/>
+      </w:r>
+    </w:p>
+    <w:p>
+      <w:pPr>
+        <w:rPr>
+          <w:b/>
+          <w:bCs/>
+          <w:sz w:val="40"/>
+          <w:szCs w:val="40"/>
+        </w:rPr>
+      </w:pPr>
+      <w:r>
+        <w:rPr>
+          <w:b/>
+          <w:bCs/>
+          <w:sz w:val="40"/>
+          <w:szCs w:val="40"/>
+        </w:rPr>
+        <w:lastRenderedPageBreak/>
+        <w:t>Checking standards manually</w:t>
+      </w:r>
+    </w:p>
+    <w:p>
+      <w:pPr>
+        <w:rPr>
+          <w:sz w:val="24"/>
+          <w:szCs w:val="24"/>
+        </w:rPr>
+      </w:pPr>
+      <w:r>
+        <w:rPr>
+          <w:sz w:val="24"/>
+          <w:szCs w:val="24"/>
+        </w:rPr>
+        <w:t>2021-06-04</w:t>
+      </w:r>
+    </w:p>
+    <w:p>
+      <w:pPr>
+        <w:rPr>
+          <w:sz w:val="24"/>
+          <w:szCs w:val="24"/>
+        </w:rPr>
+      </w:pPr>
+      <w:r>
+        <w:rPr>
+          <w:sz w:val="24"/>
+          <w:szCs w:val="24"/>
+        </w:rPr>
+        <w:t>Has 3 outliers</w:t>
+      </w:r>
+    </w:p>
+    <w:p>
+      <w:pPr>
+        <w:rPr>
+          <w:sz w:val="24"/>
+          <w:szCs w:val="24"/>
+        </w:rPr>
+      </w:pPr>
+      <w:r>
+        <w:rPr>
+          <w:noProof/>
+          <w:sz w:val="24"/>
+          <w:szCs w:val="24"/>
+        </w:rPr>
+        <w:drawing>
+          <wp:inline distT="0" distB="0" distL="0" distR="0" wp14:anchorId="1D3576AA" wp14:editId="01406889">
+            <wp:extent cx="5538626" cy="2909295"/>
+            <wp:effectExtent l="0" t="0" r="5080" b="5715"/>
+            <wp:docPr id="974695768" name="Picture 1"/>
+            <wp:cNvGraphicFramePr>
+              <a:graphicFrameLocks xmlns:a="http://schemas.openxmlformats.org/drawingml/2006/main" noChangeAspect="1"/>
+            </wp:cNvGraphicFramePr>
+            <a:graphic xmlns:a="http://schemas.openxmlformats.org/drawingml/2006/main">
+              <a:graphicData uri="http://schemas.openxmlformats.org/drawingml/2006/picture">
+                <pic:pic xmlns:pic="http://schemas.openxmlformats.org/drawingml/2006/picture">
+                  <pic:nvPicPr>
+                    <pic:cNvPr id="0" name="Picture 2"/>
+                    <pic:cNvPicPr>
+                      <a:picLocks noChangeAspect="1" noChangeArrowheads="1"/>
+                    </pic:cNvPicPr>
+                  </pic:nvPicPr>
+                  <pic:blipFill>
+                    <a:blip r:embed="rId98" cstate="print">
+                      <a:extLst>
+                        <a:ext uri="{28A0092B-C50C-407E-A947-70E740481C1C}">
+                          <a14:useLocalDpi xmlns:a14="http://schemas.microsoft.com/office/drawing/2010/main" val="0"/>
+                        </a:ext>
+                      </a:extLst>
+                    </a:blip>
+                    <a:srcRect/>
+                    <a:stretch>
+                      <a:fillRect/>
+                    </a:stretch>
+                  </pic:blipFill>
+                  <pic:spPr bwMode="auto">
+                    <a:xfrm>
+                      <a:off x="0" y="0"/>
+                      <a:ext cx="5550987" cy="2915788"/>
+                    </a:xfrm>
+                    <a:prstGeom prst="rect">
+                      <a:avLst/>
+                    </a:prstGeom>
+                    <a:noFill/>
+                  </pic:spPr>
+                </pic:pic>
+              </a:graphicData>
+            </a:graphic>
+          </wp:inline>
+        </w:drawing>
+      </w:r>
+    </w:p>
+    <w:p>
+      <w:pPr>
+        <w:rPr>
+          <w:sz w:val="24"/>
+          <w:szCs w:val="24"/>
+        </w:rPr>
+      </w:pPr>
+    </w:p>
+    <w:p>
+      <w:pPr>
+        <w:rPr>
+          <w:sz w:val="24"/>
+          <w:szCs w:val="24"/>
+        </w:rPr>
+      </w:pPr>
+      <w:r>
+        <w:rPr>
+          <w:noProof/>
+          <w:sz w:val="24"/>
+          <w:szCs w:val="24"/>
+        </w:rPr>
+        <w:drawing>
+          <wp:inline distT="0" distB="0" distL="0" distR="0" wp14:anchorId="66226ADA" wp14:editId="55821A4F">
+            <wp:extent cx="5615189" cy="2949511"/>
+            <wp:effectExtent l="0" t="0" r="5080" b="3810"/>
+            <wp:docPr id="1282884717" name="Picture 3"/>
+            <wp:cNvGraphicFramePr>
+              <a:graphicFrameLocks xmlns:a="http://schemas.openxmlformats.org/drawingml/2006/main" noChangeAspect="1"/>
+            </wp:cNvGraphicFramePr>
+            <a:graphic xmlns:a="http://schemas.openxmlformats.org/drawingml/2006/main">
+              <a:graphicData uri="http://schemas.openxmlformats.org/drawingml/2006/picture">
+                <pic:pic xmlns:pic="http://schemas.openxmlformats.org/drawingml/2006/picture">
+                  <pic:nvPicPr>
+                    <pic:cNvPr id="0" name="Picture 3"/>
+                    <pic:cNvPicPr>
+                      <a:picLocks noChangeAspect="1" noChangeArrowheads="1"/>
+                    </pic:cNvPicPr>
+                  </pic:nvPicPr>
+                  <pic:blipFill>
+                    <a:blip r:embed="rId99" cstate="print">
+                      <a:extLst>
+                        <a:ext uri="{28A0092B-C50C-407E-A947-70E740481C1C}">
+                          <a14:useLocalDpi xmlns:a14="http://schemas.microsoft.com/office/drawing/2010/main" val="0"/>
+                        </a:ext>
+                      </a:extLst>
+                    </a:blip>
+                    <a:srcRect/>
+                    <a:stretch>
+                      <a:fillRect/>
+                    </a:stretch>
+                  </pic:blipFill>
+                  <pic:spPr bwMode="auto">
+                    <a:xfrm>
+                      <a:off x="0" y="0"/>
+                      <a:ext cx="5649612" cy="2967593"/>
+                    </a:xfrm>
+                    <a:prstGeom prst="rect">
+                      <a:avLst/>
+                    </a:prstGeom>
+                    <a:noFill/>
+                  </pic:spPr>
+                </pic:pic>
+              </a:graphicData>
+            </a:graphic>
+          </wp:inline>
+        </w:drawing>
+      </w:r>
+    </w:p>
+    <w:p>
+      <w:r>
+        <w:t xml:space="preserve">Removed </w:t>
+      </w:r>
+      <w:proofErr w:type="gramStart"/>
+      <w:r>
+        <w:t xml:space="preserve">records </w:t>
+      </w:r>
+      <w:r>
+        <w:t xml:space="preserve"> 118</w:t>
+      </w:r>
+      <w:proofErr w:type="gramEnd"/>
+      <w:r>
+        <w:t xml:space="preserve">, 193, </w:t>
+      </w:r>
+      <w:r>
+        <w:t xml:space="preserve">85 </w:t>
       </w:r>
     </w:p>
     <w:p/>

</xml_diff>

<commit_message>
Continue hand verification of standards
</commit_message>
<xml_diff>
--- a/StrategicTillage_GC_Analysis_workFlow.docx
+++ b/StrategicTillage_GC_Analysis_workFlow.docx
@@ -51,11 +51,9 @@
           <w:numId w:val="1"/>
         </w:numPr>
       </w:pPr>
-      <w:proofErr w:type="spellStart"/>
       <w:r>
         <w:t>GCAnalysis.R</w:t>
       </w:r>
-      <w:proofErr w:type="spellEnd"/>
     </w:p>
     <w:p>
       <w:pPr>
@@ -65,11 +63,9 @@
           <w:numId w:val="1"/>
         </w:numPr>
       </w:pPr>
-      <w:proofErr w:type="spellStart"/>
       <w:r>
         <w:t>HMR_Analysis.R</w:t>
       </w:r>
-      <w:proofErr w:type="spellEnd"/>
     </w:p>
     <w:p>
       <w:pPr>
@@ -91,11 +87,9 @@
           <w:numId w:val="1"/>
         </w:numPr>
       </w:pPr>
-      <w:proofErr w:type="spellStart"/>
       <w:r>
         <w:t>MassFluxCalculation.R</w:t>
       </w:r>
-      <w:proofErr w:type="spellEnd"/>
     </w:p>
     <w:p>
       <w:pPr>
@@ -105,11 +99,9 @@
           <w:numId w:val="1"/>
         </w:numPr>
       </w:pPr>
-      <w:proofErr w:type="spellStart"/>
       <w:r>
         <w:t>SoilGasFluxStatisticalAnalysis.R</w:t>
       </w:r>
-      <w:proofErr w:type="spellEnd"/>
     </w:p>
     <w:p>
       <w:r>
@@ -117,29 +109,8 @@
       </w:r>
     </w:p>
     <w:p>
-      <w:proofErr w:type="gramStart"/>
-      <w:r>
-        <w:t>The N2O</w:t>
-      </w:r>
-      <w:proofErr w:type="gramEnd"/>
-      <w:r>
-        <w:t xml:space="preserve"> and CO2 emissions are too high.  The N2O emission measure calculated by Alli </w:t>
-      </w:r>
-      <w:proofErr w:type="gramStart"/>
-      <w:r>
-        <w:t>were</w:t>
-      </w:r>
-      <w:proofErr w:type="gramEnd"/>
-      <w:r>
-        <w:t xml:space="preserve"> around </w:t>
-      </w:r>
-      <w:proofErr w:type="gramStart"/>
-      <w:r>
-        <w:t>10  kg</w:t>
-      </w:r>
-      <w:proofErr w:type="gramEnd"/>
-      <w:r>
-        <w:t xml:space="preserve">-N/ha yr. </w:t>
+      <w:r>
+        <w:t xml:space="preserve">The N2O and CO2 emissions are too high.  The N2O emission measure calculated by Alli were around 10  kg-N/ha yr. </w:t>
       </w:r>
     </w:p>
     <w:p>
@@ -348,31 +319,7 @@
     </w:p>
     <w:p>
       <w:r>
-        <w:t xml:space="preserve">The calibration regression for the GC based on standards </w:t>
-      </w:r>
-      <w:proofErr w:type="gramStart"/>
-      <w:r>
-        <w:t>seem</w:t>
-      </w:r>
-      <w:proofErr w:type="gramEnd"/>
-      <w:r>
-        <w:t xml:space="preserve"> to be irrelevant, as the important aspect affecting the emissions is not the </w:t>
-      </w:r>
-      <w:proofErr w:type="gramStart"/>
-      <w:r>
-        <w:t>particular concentration</w:t>
-      </w:r>
-      <w:proofErr w:type="gramEnd"/>
-      <w:r>
-        <w:t xml:space="preserve"> data point, but the slope of the consequent concentration measurement inside the chamber that </w:t>
-      </w:r>
-      <w:proofErr w:type="gramStart"/>
-      <w:r>
-        <w:t>result</w:t>
-      </w:r>
-      <w:proofErr w:type="gramEnd"/>
-      <w:r>
-        <w:t xml:space="preserve"> in the emission rate.</w:t>
+        <w:t>The calibration regression for the GC based on standards seem to be irrelevant, as the important aspect affecting the emissions is not the particular concentration data point, but the slope of the consequent concentration measurement inside the chamber that result in the emission rate.</w:t>
       </w:r>
     </w:p>
     <w:p>
@@ -838,44 +785,12 @@
     <w:p/>
     <w:p>
       <w:r>
-        <w:t xml:space="preserve">The data from the GC does not </w:t>
-      </w:r>
-      <w:proofErr w:type="gramStart"/>
-      <w:r>
-        <w:t>seems</w:t>
-      </w:r>
-      <w:proofErr w:type="gramEnd"/>
-      <w:r>
-        <w:t xml:space="preserve"> to indicate any mayor difference in the results. The high emissions do not seem to be the result of the GC analysis.</w:t>
-      </w:r>
-    </w:p>
-    <w:p>
-      <w:r>
-        <w:t xml:space="preserve">The </w:t>
-      </w:r>
-      <w:proofErr w:type="gramStart"/>
-      <w:r>
-        <w:t>intercept</w:t>
-      </w:r>
-      <w:proofErr w:type="gramEnd"/>
-      <w:r>
-        <w:t xml:space="preserve"> in the GC standard calibration has an important effect and is wrong in the linear model with free </w:t>
-      </w:r>
-      <w:proofErr w:type="gramStart"/>
-      <w:r>
-        <w:t>intercept</w:t>
-      </w:r>
-      <w:proofErr w:type="gramEnd"/>
-      <w:r>
-        <w:t xml:space="preserve">. With the intercept forces through 0 the calibration improves significantly.  Plot with free </w:t>
-      </w:r>
-      <w:proofErr w:type="gramStart"/>
-      <w:r>
-        <w:t>intercept</w:t>
-      </w:r>
-      <w:proofErr w:type="gramEnd"/>
-      <w:r>
-        <w:t>.</w:t>
+        <w:t>The data from the GC does not seems to indicate any mayor difference in the results. The high emissions do not seem to be the result of the GC analysis.</w:t>
+      </w:r>
+    </w:p>
+    <w:p>
+      <w:r>
+        <w:t>The intercept in the GC standard calibration has an important effect and is wrong in the linear model with free intercept. With the intercept forces through 0 the calibration improves significantly.  Plot with free intercept.</w:t>
       </w:r>
     </w:p>
     <w:p>
@@ -1398,15 +1313,7 @@
     <w:p/>
     <w:p>
       <w:r>
-        <w:t xml:space="preserve">Plotting the daily emissions (period emissions) against time </w:t>
-      </w:r>
-      <w:proofErr w:type="gramStart"/>
-      <w:r>
-        <w:t>it is clear that the</w:t>
-      </w:r>
-      <w:proofErr w:type="gramEnd"/>
-      <w:r>
-        <w:t xml:space="preserve"> main factor determining the higher emissions in blocks 1 and 2 are high N2O emission peaks. Those peaks are not present in blocks 3 and 4.</w:t>
+        <w:t>Plotting the daily emissions (period emissions) against time it is clear that the main factor determining the higher emissions in blocks 1 and 2 are high N2O emission peaks. Those peaks are not present in blocks 3 and 4.</w:t>
       </w:r>
     </w:p>
     <w:p/>
@@ -1640,7 +1547,6 @@
       <w:r>
         <w:t xml:space="preserve">In 2021, Sampling date </w:t>
       </w:r>
-      <w:proofErr w:type="gramStart"/>
       <w:r>
         <w:t>20210614</w:t>
       </w:r>
@@ -1648,42 +1554,22 @@
         <w:t xml:space="preserve">, </w:t>
       </w:r>
       <w:r>
-        <w:t xml:space="preserve"> and</w:t>
-      </w:r>
-      <w:proofErr w:type="gramEnd"/>
+        <w:t xml:space="preserve"> and </w:t>
+      </w:r>
+      <w:r>
+        <w:t>20210629</w:t>
+      </w:r>
       <w:r>
         <w:t xml:space="preserve"> </w:t>
       </w:r>
       <w:r>
-        <w:t>20210629</w:t>
+        <w:t>has problems:  The red points in the graph below all belong</w:t>
       </w:r>
       <w:r>
         <w:t xml:space="preserve"> </w:t>
       </w:r>
       <w:r>
-        <w:t>has problems</w:t>
-      </w:r>
-      <w:proofErr w:type="gramStart"/>
-      <w:r>
-        <w:t>:  The</w:t>
-      </w:r>
-      <w:proofErr w:type="gramEnd"/>
-      <w:r>
-        <w:t xml:space="preserve"> red points in the graph below all </w:t>
-      </w:r>
-      <w:proofErr w:type="gramStart"/>
-      <w:r>
-        <w:t>belong</w:t>
-      </w:r>
-      <w:r>
-        <w:t xml:space="preserve"> </w:t>
-      </w:r>
-      <w:r>
-        <w:t xml:space="preserve"> to</w:t>
-      </w:r>
-      <w:proofErr w:type="gramEnd"/>
-      <w:r>
-        <w:t xml:space="preserve"> sampling day </w:t>
+        <w:t xml:space="preserve"> to sampling day </w:t>
       </w:r>
       <w:r>
         <w:t>20210614</w:t>
@@ -1867,49 +1753,7 @@
         <w:rPr>
           <w:highlight w:val="yellow"/>
         </w:rPr>
-        <w:t xml:space="preserve">The final data for the mass flux calculations was taken from f0 and the missing data from “data error” from </w:t>
-      </w:r>
-      <w:proofErr w:type="gramStart"/>
-      <w:r>
-        <w:rPr>
-          <w:highlight w:val="yellow"/>
-        </w:rPr>
-        <w:t>LR.f</w:t>
-      </w:r>
-      <w:proofErr w:type="gramEnd"/>
-      <w:r>
-        <w:rPr>
-          <w:highlight w:val="yellow"/>
-        </w:rPr>
-        <w:t xml:space="preserve">0. For N2O and CH4 all the data </w:t>
-      </w:r>
-      <w:proofErr w:type="gramStart"/>
-      <w:r>
-        <w:rPr>
-          <w:highlight w:val="yellow"/>
-        </w:rPr>
-        <w:t>has to</w:t>
-      </w:r>
-      <w:proofErr w:type="gramEnd"/>
-      <w:r>
-        <w:rPr>
-          <w:highlight w:val="yellow"/>
-        </w:rPr>
-        <w:t xml:space="preserve"> come from </w:t>
-      </w:r>
-      <w:proofErr w:type="gramStart"/>
-      <w:r>
-        <w:rPr>
-          <w:highlight w:val="yellow"/>
-        </w:rPr>
-        <w:t>LR.f</w:t>
-      </w:r>
-      <w:proofErr w:type="gramEnd"/>
-      <w:r>
-        <w:rPr>
-          <w:highlight w:val="yellow"/>
-        </w:rPr>
-        <w:t>0.</w:t>
+        <w:t>The final data for the mass flux calculations was taken from f0 and the missing data from “data error” from LR.f0. For N2O and CH4 all the data has to come from LR.f0.</w:t>
       </w:r>
     </w:p>
     <w:p>
@@ -4271,7 +4115,6 @@
           <w14:ligatures w14:val="none"/>
         </w:rPr>
       </w:pPr>
-      <w:proofErr w:type="gramStart"/>
       <w:r>
         <w:rPr>
           <w:rFonts w:ascii="Lucida Console" w:eastAsia="Times New Roman" w:hAnsi="Lucida Console" w:cs="Courier New"/>
@@ -4281,32 +4124,7 @@
           <w:szCs w:val="20"/>
           <w14:ligatures w14:val="none"/>
         </w:rPr>
-        <w:t>summary(</w:t>
-      </w:r>
-      <w:proofErr w:type="spellStart"/>
-      <w:r>
-        <w:rPr>
-          <w:rFonts w:ascii="Lucida Console" w:eastAsia="Times New Roman" w:hAnsi="Lucida Console" w:cs="Courier New"/>
-          <w:color w:val="0000FF"/>
-          <w:kern w:val="0"/>
-          <w:sz w:val="20"/>
-          <w:szCs w:val="20"/>
-          <w14:ligatures w14:val="none"/>
-        </w:rPr>
-        <w:t>Cumm.Stat.Anal</w:t>
-      </w:r>
-      <w:proofErr w:type="spellEnd"/>
-      <w:proofErr w:type="gramEnd"/>
-      <w:r>
-        <w:rPr>
-          <w:rFonts w:ascii="Lucida Console" w:eastAsia="Times New Roman" w:hAnsi="Lucida Console" w:cs="Courier New"/>
-          <w:color w:val="0000FF"/>
-          <w:kern w:val="0"/>
-          <w:sz w:val="20"/>
-          <w:szCs w:val="20"/>
-          <w14:ligatures w14:val="none"/>
-        </w:rPr>
-        <w:t>)</w:t>
+        <w:t>summary(Cumm.Stat.Anal)</w:t>
       </w:r>
     </w:p>
     <w:p>
@@ -4422,8 +4240,6 @@
           <w14:ligatures w14:val="none"/>
         </w:rPr>
       </w:pPr>
-      <w:proofErr w:type="spellStart"/>
-      <w:proofErr w:type="gramStart"/>
       <w:r>
         <w:rPr>
           <w:rFonts w:ascii="Lucida Console" w:eastAsia="Times New Roman" w:hAnsi="Lucida Console" w:cs="Courier New"/>
@@ -4434,87 +4250,7 @@
           <w:bdr w:val="none" w:sz="0" w:space="0" w:color="auto" w:frame="1"/>
           <w14:ligatures w14:val="none"/>
         </w:rPr>
-        <w:t>lm</w:t>
-      </w:r>
-      <w:proofErr w:type="spellEnd"/>
-      <w:r>
-        <w:rPr>
-          <w:rFonts w:ascii="Lucida Console" w:eastAsia="Times New Roman" w:hAnsi="Lucida Console" w:cs="Courier New"/>
-          <w:color w:val="000000"/>
-          <w:kern w:val="0"/>
-          <w:sz w:val="20"/>
-          <w:szCs w:val="20"/>
-          <w:bdr w:val="none" w:sz="0" w:space="0" w:color="auto" w:frame="1"/>
-          <w14:ligatures w14:val="none"/>
-        </w:rPr>
-        <w:t>(</w:t>
-      </w:r>
-      <w:proofErr w:type="gramEnd"/>
-      <w:r>
-        <w:rPr>
-          <w:rFonts w:ascii="Lucida Console" w:eastAsia="Times New Roman" w:hAnsi="Lucida Console" w:cs="Courier New"/>
-          <w:color w:val="000000"/>
-          <w:kern w:val="0"/>
-          <w:sz w:val="20"/>
-          <w:szCs w:val="20"/>
-          <w:bdr w:val="none" w:sz="0" w:space="0" w:color="auto" w:frame="1"/>
-          <w14:ligatures w14:val="none"/>
-        </w:rPr>
-        <w:t xml:space="preserve">formula = </w:t>
-      </w:r>
-      <w:proofErr w:type="spellStart"/>
-      <w:proofErr w:type="gramStart"/>
-      <w:r>
-        <w:rPr>
-          <w:rFonts w:ascii="Lucida Console" w:eastAsia="Times New Roman" w:hAnsi="Lucida Console" w:cs="Courier New"/>
-          <w:color w:val="000000"/>
-          <w:kern w:val="0"/>
-          <w:sz w:val="20"/>
-          <w:szCs w:val="20"/>
-          <w:bdr w:val="none" w:sz="0" w:space="0" w:color="auto" w:frame="1"/>
-          <w14:ligatures w14:val="none"/>
-        </w:rPr>
-        <w:t>Total.Cum.Emissions</w:t>
-      </w:r>
-      <w:proofErr w:type="spellEnd"/>
-      <w:proofErr w:type="gramEnd"/>
-      <w:r>
-        <w:rPr>
-          <w:rFonts w:ascii="Lucida Console" w:eastAsia="Times New Roman" w:hAnsi="Lucida Console" w:cs="Courier New"/>
-          <w:color w:val="000000"/>
-          <w:kern w:val="0"/>
-          <w:sz w:val="20"/>
-          <w:szCs w:val="20"/>
-          <w:bdr w:val="none" w:sz="0" w:space="0" w:color="auto" w:frame="1"/>
-          <w14:ligatures w14:val="none"/>
-        </w:rPr>
-        <w:t xml:space="preserve"> ~ BLOCK.F + </w:t>
-      </w:r>
-      <w:proofErr w:type="spellStart"/>
-      <w:r>
-        <w:rPr>
-          <w:rFonts w:ascii="Lucida Console" w:eastAsia="Times New Roman" w:hAnsi="Lucida Console" w:cs="Courier New"/>
-          <w:color w:val="000000"/>
-          <w:kern w:val="0"/>
-          <w:sz w:val="20"/>
-          <w:szCs w:val="20"/>
-          <w:bdr w:val="none" w:sz="0" w:space="0" w:color="auto" w:frame="1"/>
-          <w14:ligatures w14:val="none"/>
-        </w:rPr>
-        <w:t>Sampling.Year</w:t>
-      </w:r>
-      <w:proofErr w:type="spellEnd"/>
-      <w:r>
-        <w:rPr>
-          <w:rFonts w:ascii="Lucida Console" w:eastAsia="Times New Roman" w:hAnsi="Lucida Console" w:cs="Courier New"/>
-          <w:color w:val="000000"/>
-          <w:kern w:val="0"/>
-          <w:sz w:val="20"/>
-          <w:szCs w:val="20"/>
-          <w:bdr w:val="none" w:sz="0" w:space="0" w:color="auto" w:frame="1"/>
-          <w14:ligatures w14:val="none"/>
-        </w:rPr>
-        <w:t xml:space="preserve"> + </w:t>
+        <w:t xml:space="preserve">lm(formula = Total.Cum.Emissions ~ BLOCK.F + Sampling.Year + </w:t>
       </w:r>
     </w:p>
     <w:p>
@@ -4560,85 +4296,7 @@
           <w:bdr w:val="none" w:sz="0" w:space="0" w:color="auto" w:frame="1"/>
           <w14:ligatures w14:val="none"/>
         </w:rPr>
-        <w:t xml:space="preserve">    </w:t>
-      </w:r>
-      <w:proofErr w:type="spellStart"/>
-      <w:r>
-        <w:rPr>
-          <w:rFonts w:ascii="Lucida Console" w:eastAsia="Times New Roman" w:hAnsi="Lucida Console" w:cs="Courier New"/>
-          <w:color w:val="000000"/>
-          <w:kern w:val="0"/>
-          <w:sz w:val="20"/>
-          <w:szCs w:val="20"/>
-          <w:bdr w:val="none" w:sz="0" w:space="0" w:color="auto" w:frame="1"/>
-          <w14:ligatures w14:val="none"/>
-        </w:rPr>
-        <w:t>CoverCrop.F</w:t>
-      </w:r>
-      <w:proofErr w:type="spellEnd"/>
-      <w:r>
-        <w:rPr>
-          <w:rFonts w:ascii="Lucida Console" w:eastAsia="Times New Roman" w:hAnsi="Lucida Console" w:cs="Courier New"/>
-          <w:color w:val="000000"/>
-          <w:kern w:val="0"/>
-          <w:sz w:val="20"/>
-          <w:szCs w:val="20"/>
-          <w:bdr w:val="none" w:sz="0" w:space="0" w:color="auto" w:frame="1"/>
-          <w14:ligatures w14:val="none"/>
-        </w:rPr>
-        <w:t xml:space="preserve"> + </w:t>
-      </w:r>
-      <w:proofErr w:type="spellStart"/>
-      <w:r>
-        <w:rPr>
-          <w:rFonts w:ascii="Lucida Console" w:eastAsia="Times New Roman" w:hAnsi="Lucida Console" w:cs="Courier New"/>
-          <w:color w:val="000000"/>
-          <w:kern w:val="0"/>
-          <w:sz w:val="20"/>
-          <w:szCs w:val="20"/>
-          <w:bdr w:val="none" w:sz="0" w:space="0" w:color="auto" w:frame="1"/>
-          <w14:ligatures w14:val="none"/>
-        </w:rPr>
-        <w:t>Treatment.F</w:t>
-      </w:r>
-      <w:proofErr w:type="spellEnd"/>
-      <w:r>
-        <w:rPr>
-          <w:rFonts w:ascii="Lucida Console" w:eastAsia="Times New Roman" w:hAnsi="Lucida Console" w:cs="Courier New"/>
-          <w:color w:val="000000"/>
-          <w:kern w:val="0"/>
-          <w:sz w:val="20"/>
-          <w:szCs w:val="20"/>
-          <w:bdr w:val="none" w:sz="0" w:space="0" w:color="auto" w:frame="1"/>
-          <w14:ligatures w14:val="none"/>
-        </w:rPr>
-        <w:t xml:space="preserve">, data = </w:t>
-      </w:r>
-      <w:proofErr w:type="gramStart"/>
-      <w:r>
-        <w:rPr>
-          <w:rFonts w:ascii="Lucida Console" w:eastAsia="Times New Roman" w:hAnsi="Lucida Console" w:cs="Courier New"/>
-          <w:color w:val="000000"/>
-          <w:kern w:val="0"/>
-          <w:sz w:val="20"/>
-          <w:szCs w:val="20"/>
-          <w:bdr w:val="none" w:sz="0" w:space="0" w:color="auto" w:frame="1"/>
-          <w14:ligatures w14:val="none"/>
-        </w:rPr>
-        <w:t>Cumm.Emm.Analysis</w:t>
-      </w:r>
-      <w:proofErr w:type="gramEnd"/>
-      <w:r>
-        <w:rPr>
-          <w:rFonts w:ascii="Lucida Console" w:eastAsia="Times New Roman" w:hAnsi="Lucida Console" w:cs="Courier New"/>
-          <w:color w:val="000000"/>
-          <w:kern w:val="0"/>
-          <w:sz w:val="20"/>
-          <w:szCs w:val="20"/>
-          <w:bdr w:val="none" w:sz="0" w:space="0" w:color="auto" w:frame="1"/>
-          <w14:ligatures w14:val="none"/>
-        </w:rPr>
-        <w:t>.2)</w:t>
+        <w:t xml:space="preserve">    CoverCrop.F + Treatment.F, data = Cumm.Emm.Analysis.2)</w:t>
       </w:r>
     </w:p>
     <w:p>
@@ -4764,33 +4422,7 @@
           <w:bdr w:val="none" w:sz="0" w:space="0" w:color="auto" w:frame="1"/>
           <w14:ligatures w14:val="none"/>
         </w:rPr>
-        <w:t xml:space="preserve">    Min      1</w:t>
-      </w:r>
-      <w:proofErr w:type="gramStart"/>
-      <w:r>
-        <w:rPr>
-          <w:rFonts w:ascii="Lucida Console" w:eastAsia="Times New Roman" w:hAnsi="Lucida Console" w:cs="Courier New"/>
-          <w:color w:val="000000"/>
-          <w:kern w:val="0"/>
-          <w:sz w:val="20"/>
-          <w:szCs w:val="20"/>
-          <w:bdr w:val="none" w:sz="0" w:space="0" w:color="auto" w:frame="1"/>
-          <w14:ligatures w14:val="none"/>
-        </w:rPr>
-        <w:t>Q  Median</w:t>
-      </w:r>
-      <w:proofErr w:type="gramEnd"/>
-      <w:r>
-        <w:rPr>
-          <w:rFonts w:ascii="Lucida Console" w:eastAsia="Times New Roman" w:hAnsi="Lucida Console" w:cs="Courier New"/>
-          <w:color w:val="000000"/>
-          <w:kern w:val="0"/>
-          <w:sz w:val="20"/>
-          <w:szCs w:val="20"/>
-          <w:bdr w:val="none" w:sz="0" w:space="0" w:color="auto" w:frame="1"/>
-          <w14:ligatures w14:val="none"/>
-        </w:rPr>
-        <w:t xml:space="preserve">      3Q     Max </w:t>
+        <w:t xml:space="preserve">    Min      1Q  Median      3Q     Max </w:t>
       </w:r>
     </w:p>
     <w:p>
@@ -4836,85 +4468,7 @@
           <w:bdr w:val="none" w:sz="0" w:space="0" w:color="auto" w:frame="1"/>
           <w14:ligatures w14:val="none"/>
         </w:rPr>
-        <w:t>-21.</w:t>
-      </w:r>
-      <w:proofErr w:type="gramStart"/>
-      <w:r>
-        <w:rPr>
-          <w:rFonts w:ascii="Lucida Console" w:eastAsia="Times New Roman" w:hAnsi="Lucida Console" w:cs="Courier New"/>
-          <w:color w:val="000000"/>
-          <w:kern w:val="0"/>
-          <w:sz w:val="20"/>
-          <w:szCs w:val="20"/>
-          <w:bdr w:val="none" w:sz="0" w:space="0" w:color="auto" w:frame="1"/>
-          <w14:ligatures w14:val="none"/>
-        </w:rPr>
-        <w:t>204  -</w:t>
-      </w:r>
-      <w:proofErr w:type="gramEnd"/>
-      <w:r>
-        <w:rPr>
-          <w:rFonts w:ascii="Lucida Console" w:eastAsia="Times New Roman" w:hAnsi="Lucida Console" w:cs="Courier New"/>
-          <w:color w:val="000000"/>
-          <w:kern w:val="0"/>
-          <w:sz w:val="20"/>
-          <w:szCs w:val="20"/>
-          <w:bdr w:val="none" w:sz="0" w:space="0" w:color="auto" w:frame="1"/>
-          <w14:ligatures w14:val="none"/>
-        </w:rPr>
-        <w:t>7.</w:t>
-      </w:r>
-      <w:proofErr w:type="gramStart"/>
-      <w:r>
-        <w:rPr>
-          <w:rFonts w:ascii="Lucida Console" w:eastAsia="Times New Roman" w:hAnsi="Lucida Console" w:cs="Courier New"/>
-          <w:color w:val="000000"/>
-          <w:kern w:val="0"/>
-          <w:sz w:val="20"/>
-          <w:szCs w:val="20"/>
-          <w:bdr w:val="none" w:sz="0" w:space="0" w:color="auto" w:frame="1"/>
-          <w14:ligatures w14:val="none"/>
-        </w:rPr>
-        <w:t>452  -</w:t>
-      </w:r>
-      <w:proofErr w:type="gramEnd"/>
-      <w:r>
-        <w:rPr>
-          <w:rFonts w:ascii="Lucida Console" w:eastAsia="Times New Roman" w:hAnsi="Lucida Console" w:cs="Courier New"/>
-          <w:color w:val="000000"/>
-          <w:kern w:val="0"/>
-          <w:sz w:val="20"/>
-          <w:szCs w:val="20"/>
-          <w:bdr w:val="none" w:sz="0" w:space="0" w:color="auto" w:frame="1"/>
-          <w14:ligatures w14:val="none"/>
-        </w:rPr>
-        <w:t xml:space="preserve">0.579   </w:t>
-      </w:r>
-      <w:proofErr w:type="gramStart"/>
-      <w:r>
-        <w:rPr>
-          <w:rFonts w:ascii="Lucida Console" w:eastAsia="Times New Roman" w:hAnsi="Lucida Console" w:cs="Courier New"/>
-          <w:color w:val="000000"/>
-          <w:kern w:val="0"/>
-          <w:sz w:val="20"/>
-          <w:szCs w:val="20"/>
-          <w:bdr w:val="none" w:sz="0" w:space="0" w:color="auto" w:frame="1"/>
-          <w14:ligatures w14:val="none"/>
-        </w:rPr>
-        <w:t>4.777  41.906</w:t>
-      </w:r>
-      <w:proofErr w:type="gramEnd"/>
-      <w:r>
-        <w:rPr>
-          <w:rFonts w:ascii="Lucida Console" w:eastAsia="Times New Roman" w:hAnsi="Lucida Console" w:cs="Courier New"/>
-          <w:color w:val="000000"/>
-          <w:kern w:val="0"/>
-          <w:sz w:val="20"/>
-          <w:szCs w:val="20"/>
-          <w:bdr w:val="none" w:sz="0" w:space="0" w:color="auto" w:frame="1"/>
-          <w14:ligatures w14:val="none"/>
-        </w:rPr>
-        <w:t xml:space="preserve"> </w:t>
+        <w:t xml:space="preserve">-21.204  -7.452  -0.579   4.777  41.906 </w:t>
       </w:r>
     </w:p>
     <w:p>
@@ -5040,33 +4594,7 @@
           <w:bdr w:val="none" w:sz="0" w:space="0" w:color="auto" w:frame="1"/>
           <w14:ligatures w14:val="none"/>
         </w:rPr>
-        <w:t xml:space="preserve">                  Estimate Std. Error t value </w:t>
-      </w:r>
-      <w:proofErr w:type="spellStart"/>
-      <w:r>
-        <w:rPr>
-          <w:rFonts w:ascii="Lucida Console" w:eastAsia="Times New Roman" w:hAnsi="Lucida Console" w:cs="Courier New"/>
-          <w:color w:val="000000"/>
-          <w:kern w:val="0"/>
-          <w:sz w:val="20"/>
-          <w:szCs w:val="20"/>
-          <w:bdr w:val="none" w:sz="0" w:space="0" w:color="auto" w:frame="1"/>
-          <w14:ligatures w14:val="none"/>
-        </w:rPr>
-        <w:t>Pr</w:t>
-      </w:r>
-      <w:proofErr w:type="spellEnd"/>
-      <w:r>
-        <w:rPr>
-          <w:rFonts w:ascii="Lucida Console" w:eastAsia="Times New Roman" w:hAnsi="Lucida Console" w:cs="Courier New"/>
-          <w:color w:val="000000"/>
-          <w:kern w:val="0"/>
-          <w:sz w:val="20"/>
-          <w:szCs w:val="20"/>
-          <w:bdr w:val="none" w:sz="0" w:space="0" w:color="auto" w:frame="1"/>
-          <w14:ligatures w14:val="none"/>
-        </w:rPr>
-        <w:t xml:space="preserve">(&gt;|t|)    </w:t>
+        <w:t xml:space="preserve">                  Estimate Std. Error t value Pr(&gt;|t|)    </w:t>
       </w:r>
     </w:p>
     <w:p>
@@ -5112,59 +4640,7 @@
           <w:bdr w:val="none" w:sz="0" w:space="0" w:color="auto" w:frame="1"/>
           <w14:ligatures w14:val="none"/>
         </w:rPr>
-        <w:t>(</w:t>
-      </w:r>
-      <w:proofErr w:type="gramStart"/>
-      <w:r>
-        <w:rPr>
-          <w:rFonts w:ascii="Lucida Console" w:eastAsia="Times New Roman" w:hAnsi="Lucida Console" w:cs="Courier New"/>
-          <w:color w:val="000000"/>
-          <w:kern w:val="0"/>
-          <w:sz w:val="20"/>
-          <w:szCs w:val="20"/>
-          <w:bdr w:val="none" w:sz="0" w:space="0" w:color="auto" w:frame="1"/>
-          <w14:ligatures w14:val="none"/>
-        </w:rPr>
-        <w:t xml:space="preserve">Intercept)   </w:t>
-      </w:r>
-      <w:proofErr w:type="gramEnd"/>
-      <w:r>
-        <w:rPr>
-          <w:rFonts w:ascii="Lucida Console" w:eastAsia="Times New Roman" w:hAnsi="Lucida Console" w:cs="Courier New"/>
-          <w:color w:val="000000"/>
-          <w:kern w:val="0"/>
-          <w:sz w:val="20"/>
-          <w:szCs w:val="20"/>
-          <w:bdr w:val="none" w:sz="0" w:space="0" w:color="auto" w:frame="1"/>
-          <w14:ligatures w14:val="none"/>
-        </w:rPr>
-        <w:t xml:space="preserve">     17.9614     3.9252   4.576 </w:t>
-      </w:r>
-      <w:proofErr w:type="gramStart"/>
-      <w:r>
-        <w:rPr>
-          <w:rFonts w:ascii="Lucida Console" w:eastAsia="Times New Roman" w:hAnsi="Lucida Console" w:cs="Courier New"/>
-          <w:color w:val="000000"/>
-          <w:kern w:val="0"/>
-          <w:sz w:val="20"/>
-          <w:szCs w:val="20"/>
-          <w:bdr w:val="none" w:sz="0" w:space="0" w:color="auto" w:frame="1"/>
-          <w14:ligatures w14:val="none"/>
-        </w:rPr>
-        <w:t xml:space="preserve">   2e</w:t>
-      </w:r>
-      <w:proofErr w:type="gramEnd"/>
-      <w:r>
-        <w:rPr>
-          <w:rFonts w:ascii="Lucida Console" w:eastAsia="Times New Roman" w:hAnsi="Lucida Console" w:cs="Courier New"/>
-          <w:color w:val="000000"/>
-          <w:kern w:val="0"/>
-          <w:sz w:val="20"/>
-          <w:szCs w:val="20"/>
-          <w:bdr w:val="none" w:sz="0" w:space="0" w:color="auto" w:frame="1"/>
-          <w14:ligatures w14:val="none"/>
-        </w:rPr>
-        <w:t>-05 ***</w:t>
+        <w:t>(Intercept)        17.9614     3.9252   4.576    2e-05 ***</w:t>
       </w:r>
     </w:p>
     <w:p>
@@ -5256,33 +4732,7 @@
           <w:bdr w:val="none" w:sz="0" w:space="0" w:color="auto" w:frame="1"/>
           <w14:ligatures w14:val="none"/>
         </w:rPr>
-        <w:t xml:space="preserve">BLOCK.F3          -14.7355     </w:t>
-      </w:r>
-      <w:proofErr w:type="gramStart"/>
-      <w:r>
-        <w:rPr>
-          <w:rFonts w:ascii="Lucida Console" w:eastAsia="Times New Roman" w:hAnsi="Lucida Console" w:cs="Courier New"/>
-          <w:color w:val="000000"/>
-          <w:kern w:val="0"/>
-          <w:sz w:val="20"/>
-          <w:szCs w:val="20"/>
-          <w:bdr w:val="none" w:sz="0" w:space="0" w:color="auto" w:frame="1"/>
-          <w14:ligatures w14:val="none"/>
-        </w:rPr>
-        <w:t>3.5916  -</w:t>
-      </w:r>
-      <w:proofErr w:type="gramEnd"/>
-      <w:r>
-        <w:rPr>
-          <w:rFonts w:ascii="Lucida Console" w:eastAsia="Times New Roman" w:hAnsi="Lucida Console" w:cs="Courier New"/>
-          <w:color w:val="000000"/>
-          <w:kern w:val="0"/>
-          <w:sz w:val="20"/>
-          <w:szCs w:val="20"/>
-          <w:bdr w:val="none" w:sz="0" w:space="0" w:color="auto" w:frame="1"/>
-          <w14:ligatures w14:val="none"/>
-        </w:rPr>
-        <w:t>4.103 0.000109 ***</w:t>
+        <w:t>BLOCK.F3          -14.7355     3.5916  -4.103 0.000109 ***</w:t>
       </w:r>
     </w:p>
     <w:p>
@@ -5328,33 +4778,7 @@
           <w:bdr w:val="none" w:sz="0" w:space="0" w:color="auto" w:frame="1"/>
           <w14:ligatures w14:val="none"/>
         </w:rPr>
-        <w:t xml:space="preserve">BLOCK.F4          -12.3094     </w:t>
-      </w:r>
-      <w:proofErr w:type="gramStart"/>
-      <w:r>
-        <w:rPr>
-          <w:rFonts w:ascii="Lucida Console" w:eastAsia="Times New Roman" w:hAnsi="Lucida Console" w:cs="Courier New"/>
-          <w:color w:val="000000"/>
-          <w:kern w:val="0"/>
-          <w:sz w:val="20"/>
-          <w:szCs w:val="20"/>
-          <w:bdr w:val="none" w:sz="0" w:space="0" w:color="auto" w:frame="1"/>
-          <w14:ligatures w14:val="none"/>
-        </w:rPr>
-        <w:t>3.5916  -</w:t>
-      </w:r>
-      <w:proofErr w:type="gramEnd"/>
-      <w:r>
-        <w:rPr>
-          <w:rFonts w:ascii="Lucida Console" w:eastAsia="Times New Roman" w:hAnsi="Lucida Console" w:cs="Courier New"/>
-          <w:color w:val="000000"/>
-          <w:kern w:val="0"/>
-          <w:sz w:val="20"/>
-          <w:szCs w:val="20"/>
-          <w:bdr w:val="none" w:sz="0" w:space="0" w:color="auto" w:frame="1"/>
-          <w14:ligatures w14:val="none"/>
-        </w:rPr>
-        <w:t xml:space="preserve">3.427 0.001025 ** </w:t>
+        <w:t xml:space="preserve">BLOCK.F4          -12.3094     3.5916  -3.427 0.001025 ** </w:t>
       </w:r>
     </w:p>
     <w:p>
@@ -5400,59 +4824,7 @@
           <w:bdr w:val="none" w:sz="0" w:space="0" w:color="auto" w:frame="1"/>
           <w14:ligatures w14:val="none"/>
         </w:rPr>
-        <w:t>Sampling.Year</w:t>
-      </w:r>
-      <w:proofErr w:type="gramStart"/>
-      <w:r>
-        <w:rPr>
-          <w:rFonts w:ascii="Lucida Console" w:eastAsia="Times New Roman" w:hAnsi="Lucida Console" w:cs="Courier New"/>
-          <w:color w:val="000000"/>
-          <w:kern w:val="0"/>
-          <w:sz w:val="20"/>
-          <w:szCs w:val="20"/>
-          <w:bdr w:val="none" w:sz="0" w:space="0" w:color="auto" w:frame="1"/>
-          <w14:ligatures w14:val="none"/>
-        </w:rPr>
-        <w:t>2022  -</w:t>
-      </w:r>
-      <w:proofErr w:type="gramEnd"/>
-      <w:r>
-        <w:rPr>
-          <w:rFonts w:ascii="Lucida Console" w:eastAsia="Times New Roman" w:hAnsi="Lucida Console" w:cs="Courier New"/>
-          <w:color w:val="000000"/>
-          <w:kern w:val="0"/>
-          <w:sz w:val="20"/>
-          <w:szCs w:val="20"/>
-          <w:bdr w:val="none" w:sz="0" w:space="0" w:color="auto" w:frame="1"/>
-          <w14:ligatures w14:val="none"/>
-        </w:rPr>
-        <w:t xml:space="preserve">9.7553     </w:t>
-      </w:r>
-      <w:proofErr w:type="gramStart"/>
-      <w:r>
-        <w:rPr>
-          <w:rFonts w:ascii="Lucida Console" w:eastAsia="Times New Roman" w:hAnsi="Lucida Console" w:cs="Courier New"/>
-          <w:color w:val="000000"/>
-          <w:kern w:val="0"/>
-          <w:sz w:val="20"/>
-          <w:szCs w:val="20"/>
-          <w:bdr w:val="none" w:sz="0" w:space="0" w:color="auto" w:frame="1"/>
-          <w14:ligatures w14:val="none"/>
-        </w:rPr>
-        <w:t>2.5396  -</w:t>
-      </w:r>
-      <w:proofErr w:type="gramEnd"/>
-      <w:r>
-        <w:rPr>
-          <w:rFonts w:ascii="Lucida Console" w:eastAsia="Times New Roman" w:hAnsi="Lucida Console" w:cs="Courier New"/>
-          <w:color w:val="000000"/>
-          <w:kern w:val="0"/>
-          <w:sz w:val="20"/>
-          <w:szCs w:val="20"/>
-          <w:bdr w:val="none" w:sz="0" w:space="0" w:color="auto" w:frame="1"/>
-          <w14:ligatures w14:val="none"/>
-        </w:rPr>
-        <w:t>3.841 0.000266 ***</w:t>
+        <w:t>Sampling.Year2022  -9.7553     2.5396  -3.841 0.000266 ***</w:t>
       </w:r>
     </w:p>
     <w:p>
@@ -5488,7 +4860,6 @@
           <w14:ligatures w14:val="none"/>
         </w:rPr>
       </w:pPr>
-      <w:proofErr w:type="spellStart"/>
       <w:r>
         <w:rPr>
           <w:rFonts w:ascii="Lucida Console" w:eastAsia="Times New Roman" w:hAnsi="Lucida Console" w:cs="Courier New"/>
@@ -5499,20 +4870,7 @@
           <w:bdr w:val="none" w:sz="0" w:space="0" w:color="auto" w:frame="1"/>
           <w14:ligatures w14:val="none"/>
         </w:rPr>
-        <w:t>CoverCrop.FClover</w:t>
-      </w:r>
-      <w:proofErr w:type="spellEnd"/>
-      <w:r>
-        <w:rPr>
-          <w:rFonts w:ascii="Lucida Console" w:eastAsia="Times New Roman" w:hAnsi="Lucida Console" w:cs="Courier New"/>
-          <w:color w:val="000000"/>
-          <w:kern w:val="0"/>
-          <w:sz w:val="20"/>
-          <w:szCs w:val="20"/>
-          <w:bdr w:val="none" w:sz="0" w:space="0" w:color="auto" w:frame="1"/>
-          <w14:ligatures w14:val="none"/>
-        </w:rPr>
-        <w:t xml:space="preserve">   3.1667     3.2786   0.966 0.337437    </w:t>
+        <w:t xml:space="preserve">CoverCrop.FClover   3.1667     3.2786   0.966 0.337437    </w:t>
       </w:r>
     </w:p>
     <w:p>
@@ -5548,7 +4906,6 @@
           <w14:ligatures w14:val="none"/>
         </w:rPr>
       </w:pPr>
-      <w:proofErr w:type="spellStart"/>
       <w:r>
         <w:rPr>
           <w:rFonts w:ascii="Lucida Console" w:eastAsia="Times New Roman" w:hAnsi="Lucida Console" w:cs="Courier New"/>
@@ -5559,46 +4916,7 @@
           <w:bdr w:val="none" w:sz="0" w:space="0" w:color="auto" w:frame="1"/>
           <w14:ligatures w14:val="none"/>
         </w:rPr>
-        <w:t>CoverCrop.FTrit</w:t>
-      </w:r>
-      <w:proofErr w:type="spellEnd"/>
-      <w:r>
-        <w:rPr>
-          <w:rFonts w:ascii="Lucida Console" w:eastAsia="Times New Roman" w:hAnsi="Lucida Console" w:cs="Courier New"/>
-          <w:color w:val="000000"/>
-          <w:kern w:val="0"/>
-          <w:sz w:val="20"/>
-          <w:szCs w:val="20"/>
-          <w:bdr w:val="none" w:sz="0" w:space="0" w:color="auto" w:frame="1"/>
-          <w14:ligatures w14:val="none"/>
-        </w:rPr>
-        <w:t xml:space="preserve">    -0.4087     </w:t>
-      </w:r>
-      <w:proofErr w:type="gramStart"/>
-      <w:r>
-        <w:rPr>
-          <w:rFonts w:ascii="Lucida Console" w:eastAsia="Times New Roman" w:hAnsi="Lucida Console" w:cs="Courier New"/>
-          <w:color w:val="000000"/>
-          <w:kern w:val="0"/>
-          <w:sz w:val="20"/>
-          <w:szCs w:val="20"/>
-          <w:bdr w:val="none" w:sz="0" w:space="0" w:color="auto" w:frame="1"/>
-          <w14:ligatures w14:val="none"/>
-        </w:rPr>
-        <w:t>3.2786  -</w:t>
-      </w:r>
-      <w:proofErr w:type="gramEnd"/>
-      <w:r>
-        <w:rPr>
-          <w:rFonts w:ascii="Lucida Console" w:eastAsia="Times New Roman" w:hAnsi="Lucida Console" w:cs="Courier New"/>
-          <w:color w:val="000000"/>
-          <w:kern w:val="0"/>
-          <w:sz w:val="20"/>
-          <w:szCs w:val="20"/>
-          <w:bdr w:val="none" w:sz="0" w:space="0" w:color="auto" w:frame="1"/>
-          <w14:ligatures w14:val="none"/>
-        </w:rPr>
-        <w:t xml:space="preserve">0.125 0.901165    </w:t>
+        <w:t xml:space="preserve">CoverCrop.FTrit    -0.4087     3.2786  -0.125 0.901165    </w:t>
       </w:r>
     </w:p>
     <w:p>
@@ -5634,7 +4952,6 @@
           <w14:ligatures w14:val="none"/>
         </w:rPr>
       </w:pPr>
-      <w:proofErr w:type="spellStart"/>
       <w:r>
         <w:rPr>
           <w:rFonts w:ascii="Lucida Console" w:eastAsia="Times New Roman" w:hAnsi="Lucida Console" w:cs="Courier New"/>
@@ -5645,46 +4962,7 @@
           <w:bdr w:val="none" w:sz="0" w:space="0" w:color="auto" w:frame="1"/>
           <w14:ligatures w14:val="none"/>
         </w:rPr>
-        <w:t>Treatment.FB</w:t>
-      </w:r>
-      <w:proofErr w:type="spellEnd"/>
-      <w:r>
-        <w:rPr>
-          <w:rFonts w:ascii="Lucida Console" w:eastAsia="Times New Roman" w:hAnsi="Lucida Console" w:cs="Courier New"/>
-          <w:color w:val="000000"/>
-          <w:kern w:val="0"/>
-          <w:sz w:val="20"/>
-          <w:szCs w:val="20"/>
-          <w:bdr w:val="none" w:sz="0" w:space="0" w:color="auto" w:frame="1"/>
-          <w14:ligatures w14:val="none"/>
-        </w:rPr>
-        <w:t xml:space="preserve">        6.2892     3.2786   1.918 0.</w:t>
-      </w:r>
-      <w:proofErr w:type="gramStart"/>
-      <w:r>
-        <w:rPr>
-          <w:rFonts w:ascii="Lucida Console" w:eastAsia="Times New Roman" w:hAnsi="Lucida Console" w:cs="Courier New"/>
-          <w:color w:val="000000"/>
-          <w:kern w:val="0"/>
-          <w:sz w:val="20"/>
-          <w:szCs w:val="20"/>
-          <w:bdr w:val="none" w:sz="0" w:space="0" w:color="auto" w:frame="1"/>
-          <w14:ligatures w14:val="none"/>
-        </w:rPr>
-        <w:t>059162 .</w:t>
-      </w:r>
-      <w:proofErr w:type="gramEnd"/>
-      <w:r>
-        <w:rPr>
-          <w:rFonts w:ascii="Lucida Console" w:eastAsia="Times New Roman" w:hAnsi="Lucida Console" w:cs="Courier New"/>
-          <w:color w:val="000000"/>
-          <w:kern w:val="0"/>
-          <w:sz w:val="20"/>
-          <w:szCs w:val="20"/>
-          <w:bdr w:val="none" w:sz="0" w:space="0" w:color="auto" w:frame="1"/>
-          <w14:ligatures w14:val="none"/>
-        </w:rPr>
-        <w:t xml:space="preserve">  </w:t>
+        <w:t xml:space="preserve">Treatment.FB        6.2892     3.2786   1.918 0.059162 .  </w:t>
       </w:r>
     </w:p>
     <w:p>
@@ -5720,7 +4998,6 @@
           <w14:ligatures w14:val="none"/>
         </w:rPr>
       </w:pPr>
-      <w:proofErr w:type="spellStart"/>
       <w:r>
         <w:rPr>
           <w:rFonts w:ascii="Lucida Console" w:eastAsia="Times New Roman" w:hAnsi="Lucida Console" w:cs="Courier New"/>
@@ -5731,20 +5008,7 @@
           <w:bdr w:val="none" w:sz="0" w:space="0" w:color="auto" w:frame="1"/>
           <w14:ligatures w14:val="none"/>
         </w:rPr>
-        <w:t>Treatment.FC</w:t>
-      </w:r>
-      <w:proofErr w:type="spellEnd"/>
-      <w:r>
-        <w:rPr>
-          <w:rFonts w:ascii="Lucida Console" w:eastAsia="Times New Roman" w:hAnsi="Lucida Console" w:cs="Courier New"/>
-          <w:color w:val="000000"/>
-          <w:kern w:val="0"/>
-          <w:sz w:val="20"/>
-          <w:szCs w:val="20"/>
-          <w:bdr w:val="none" w:sz="0" w:space="0" w:color="auto" w:frame="1"/>
-          <w14:ligatures w14:val="none"/>
-        </w:rPr>
-        <w:t xml:space="preserve">        4.1102     3.2786   1.254 0.214146    </w:t>
+        <w:t xml:space="preserve">Treatment.FC        4.1102     3.2786   1.254 0.214146    </w:t>
       </w:r>
     </w:p>
     <w:p>
@@ -5780,7 +5044,6 @@
           <w14:ligatures w14:val="none"/>
         </w:rPr>
       </w:pPr>
-      <w:proofErr w:type="spellStart"/>
       <w:r>
         <w:rPr>
           <w:rFonts w:ascii="Lucida Console" w:eastAsia="Times New Roman" w:hAnsi="Lucida Console" w:cs="Courier New"/>
@@ -5791,46 +5054,7 @@
           <w:bdr w:val="none" w:sz="0" w:space="0" w:color="auto" w:frame="1"/>
           <w14:ligatures w14:val="none"/>
         </w:rPr>
-        <w:t>Treatment.FD</w:t>
-      </w:r>
-      <w:proofErr w:type="spellEnd"/>
-      <w:r>
-        <w:rPr>
-          <w:rFonts w:ascii="Lucida Console" w:eastAsia="Times New Roman" w:hAnsi="Lucida Console" w:cs="Courier New"/>
-          <w:color w:val="000000"/>
-          <w:kern w:val="0"/>
-          <w:sz w:val="20"/>
-          <w:szCs w:val="20"/>
-          <w:bdr w:val="none" w:sz="0" w:space="0" w:color="auto" w:frame="1"/>
-          <w14:ligatures w14:val="none"/>
-        </w:rPr>
-        <w:t xml:space="preserve">       -0.8080     </w:t>
-      </w:r>
-      <w:proofErr w:type="gramStart"/>
-      <w:r>
-        <w:rPr>
-          <w:rFonts w:ascii="Lucida Console" w:eastAsia="Times New Roman" w:hAnsi="Lucida Console" w:cs="Courier New"/>
-          <w:color w:val="000000"/>
-          <w:kern w:val="0"/>
-          <w:sz w:val="20"/>
-          <w:szCs w:val="20"/>
-          <w:bdr w:val="none" w:sz="0" w:space="0" w:color="auto" w:frame="1"/>
-          <w14:ligatures w14:val="none"/>
-        </w:rPr>
-        <w:t>5.0082  -</w:t>
-      </w:r>
-      <w:proofErr w:type="gramEnd"/>
-      <w:r>
-        <w:rPr>
-          <w:rFonts w:ascii="Lucida Console" w:eastAsia="Times New Roman" w:hAnsi="Lucida Console" w:cs="Courier New"/>
-          <w:color w:val="000000"/>
-          <w:kern w:val="0"/>
-          <w:sz w:val="20"/>
-          <w:szCs w:val="20"/>
-          <w:bdr w:val="none" w:sz="0" w:space="0" w:color="auto" w:frame="1"/>
-          <w14:ligatures w14:val="none"/>
-        </w:rPr>
-        <w:t xml:space="preserve">0.161 0.872300    </w:t>
+        <w:t xml:space="preserve">Treatment.FD       -0.8080     5.0082  -0.161 0.872300    </w:t>
       </w:r>
     </w:p>
     <w:p>
@@ -5912,7 +5136,6 @@
           <w14:ligatures w14:val="none"/>
         </w:rPr>
       </w:pPr>
-      <w:proofErr w:type="spellStart"/>
       <w:r>
         <w:rPr>
           <w:rFonts w:ascii="Lucida Console" w:eastAsia="Times New Roman" w:hAnsi="Lucida Console" w:cs="Courier New"/>
@@ -5923,124 +5146,7 @@
           <w:bdr w:val="none" w:sz="0" w:space="0" w:color="auto" w:frame="1"/>
           <w14:ligatures w14:val="none"/>
         </w:rPr>
-        <w:t>Signif</w:t>
-      </w:r>
-      <w:proofErr w:type="spellEnd"/>
-      <w:r>
-        <w:rPr>
-          <w:rFonts w:ascii="Lucida Console" w:eastAsia="Times New Roman" w:hAnsi="Lucida Console" w:cs="Courier New"/>
-          <w:color w:val="000000"/>
-          <w:kern w:val="0"/>
-          <w:sz w:val="20"/>
-          <w:szCs w:val="20"/>
-          <w:bdr w:val="none" w:sz="0" w:space="0" w:color="auto" w:frame="1"/>
-          <w14:ligatures w14:val="none"/>
-        </w:rPr>
-        <w:t>. codes</w:t>
-      </w:r>
-      <w:proofErr w:type="gramStart"/>
-      <w:r>
-        <w:rPr>
-          <w:rFonts w:ascii="Lucida Console" w:eastAsia="Times New Roman" w:hAnsi="Lucida Console" w:cs="Courier New"/>
-          <w:color w:val="000000"/>
-          <w:kern w:val="0"/>
-          <w:sz w:val="20"/>
-          <w:szCs w:val="20"/>
-          <w:bdr w:val="none" w:sz="0" w:space="0" w:color="auto" w:frame="1"/>
-          <w14:ligatures w14:val="none"/>
-        </w:rPr>
-        <w:t>:  0 ‘</w:t>
-      </w:r>
-      <w:proofErr w:type="gramEnd"/>
-      <w:r>
-        <w:rPr>
-          <w:rFonts w:ascii="Lucida Console" w:eastAsia="Times New Roman" w:hAnsi="Lucida Console" w:cs="Courier New"/>
-          <w:color w:val="000000"/>
-          <w:kern w:val="0"/>
-          <w:sz w:val="20"/>
-          <w:szCs w:val="20"/>
-          <w:bdr w:val="none" w:sz="0" w:space="0" w:color="auto" w:frame="1"/>
-          <w14:ligatures w14:val="none"/>
-        </w:rPr>
-        <w:t xml:space="preserve">***’ </w:t>
-      </w:r>
-      <w:proofErr w:type="gramStart"/>
-      <w:r>
-        <w:rPr>
-          <w:rFonts w:ascii="Lucida Console" w:eastAsia="Times New Roman" w:hAnsi="Lucida Console" w:cs="Courier New"/>
-          <w:color w:val="000000"/>
-          <w:kern w:val="0"/>
-          <w:sz w:val="20"/>
-          <w:szCs w:val="20"/>
-          <w:bdr w:val="none" w:sz="0" w:space="0" w:color="auto" w:frame="1"/>
-          <w14:ligatures w14:val="none"/>
-        </w:rPr>
-        <w:t>0.001 ‘*</w:t>
-      </w:r>
-      <w:proofErr w:type="gramEnd"/>
-      <w:r>
-        <w:rPr>
-          <w:rFonts w:ascii="Lucida Console" w:eastAsia="Times New Roman" w:hAnsi="Lucida Console" w:cs="Courier New"/>
-          <w:color w:val="000000"/>
-          <w:kern w:val="0"/>
-          <w:sz w:val="20"/>
-          <w:szCs w:val="20"/>
-          <w:bdr w:val="none" w:sz="0" w:space="0" w:color="auto" w:frame="1"/>
-          <w14:ligatures w14:val="none"/>
-        </w:rPr>
-        <w:t xml:space="preserve">*’ </w:t>
-      </w:r>
-      <w:proofErr w:type="gramStart"/>
-      <w:r>
-        <w:rPr>
-          <w:rFonts w:ascii="Lucida Console" w:eastAsia="Times New Roman" w:hAnsi="Lucida Console" w:cs="Courier New"/>
-          <w:color w:val="000000"/>
-          <w:kern w:val="0"/>
-          <w:sz w:val="20"/>
-          <w:szCs w:val="20"/>
-          <w:bdr w:val="none" w:sz="0" w:space="0" w:color="auto" w:frame="1"/>
-          <w14:ligatures w14:val="none"/>
-        </w:rPr>
-        <w:t>0.01 ‘*</w:t>
-      </w:r>
-      <w:proofErr w:type="gramEnd"/>
-      <w:r>
-        <w:rPr>
-          <w:rFonts w:ascii="Lucida Console" w:eastAsia="Times New Roman" w:hAnsi="Lucida Console" w:cs="Courier New"/>
-          <w:color w:val="000000"/>
-          <w:kern w:val="0"/>
-          <w:sz w:val="20"/>
-          <w:szCs w:val="20"/>
-          <w:bdr w:val="none" w:sz="0" w:space="0" w:color="auto" w:frame="1"/>
-          <w14:ligatures w14:val="none"/>
-        </w:rPr>
-        <w:t xml:space="preserve">’ 0.05 ‘.’ 0.1 </w:t>
-      </w:r>
-      <w:proofErr w:type="gramStart"/>
-      <w:r>
-        <w:rPr>
-          <w:rFonts w:ascii="Lucida Console" w:eastAsia="Times New Roman" w:hAnsi="Lucida Console" w:cs="Courier New"/>
-          <w:color w:val="000000"/>
-          <w:kern w:val="0"/>
-          <w:sz w:val="20"/>
-          <w:szCs w:val="20"/>
-          <w:bdr w:val="none" w:sz="0" w:space="0" w:color="auto" w:frame="1"/>
-          <w14:ligatures w14:val="none"/>
-        </w:rPr>
-        <w:t>‘ ’</w:t>
-      </w:r>
-      <w:proofErr w:type="gramEnd"/>
-      <w:r>
-        <w:rPr>
-          <w:rFonts w:ascii="Lucida Console" w:eastAsia="Times New Roman" w:hAnsi="Lucida Console" w:cs="Courier New"/>
-          <w:color w:val="000000"/>
-          <w:kern w:val="0"/>
-          <w:sz w:val="20"/>
-          <w:szCs w:val="20"/>
-          <w:bdr w:val="none" w:sz="0" w:space="0" w:color="auto" w:frame="1"/>
-          <w14:ligatures w14:val="none"/>
-        </w:rPr>
-        <w:t xml:space="preserve"> 1</w:t>
+        <w:t>Signif. codes:  0 ‘***’ 0.001 ‘**’ 0.01 ‘*’ 0.05 ‘.’ 0.1 ‘ ’ 1</w:t>
       </w:r>
     </w:p>
     <w:p>
@@ -6166,9 +5272,8 @@
           <w:bdr w:val="none" w:sz="0" w:space="0" w:color="auto" w:frame="1"/>
           <w14:ligatures w14:val="none"/>
         </w:rPr>
-        <w:t>Multiple R-squared</w:t>
-      </w:r>
-      <w:proofErr w:type="gramStart"/>
+        <w:t>Multiple R-squared:  0.4307,</w:t>
+      </w:r>
       <w:r>
         <w:rPr>
           <w:rFonts w:ascii="Lucida Console" w:eastAsia="Times New Roman" w:hAnsi="Lucida Console" w:cs="Courier New"/>
@@ -6179,59 +5284,8 @@
           <w:bdr w:val="none" w:sz="0" w:space="0" w:color="auto" w:frame="1"/>
           <w14:ligatures w14:val="none"/>
         </w:rPr>
-        <w:t>:  0.4307</w:t>
-      </w:r>
-      <w:proofErr w:type="gramEnd"/>
-      <w:r>
-        <w:rPr>
-          <w:rFonts w:ascii="Lucida Console" w:eastAsia="Times New Roman" w:hAnsi="Lucida Console" w:cs="Courier New"/>
-          <w:color w:val="000000"/>
-          <w:kern w:val="0"/>
-          <w:sz w:val="20"/>
-          <w:szCs w:val="20"/>
-          <w:bdr w:val="none" w:sz="0" w:space="0" w:color="auto" w:frame="1"/>
-          <w14:ligatures w14:val="none"/>
-        </w:rPr>
-        <w:t>,</w:t>
-      </w:r>
-      <w:r>
-        <w:rPr>
-          <w:rFonts w:ascii="Lucida Console" w:eastAsia="Times New Roman" w:hAnsi="Lucida Console" w:cs="Courier New"/>
-          <w:color w:val="000000"/>
-          <w:kern w:val="0"/>
-          <w:sz w:val="20"/>
-          <w:szCs w:val="20"/>
-          <w:bdr w:val="none" w:sz="0" w:space="0" w:color="auto" w:frame="1"/>
-          <w14:ligatures w14:val="none"/>
-        </w:rPr>
         <w:tab/>
-        <w:t>Adjusted R-squared</w:t>
-      </w:r>
-      <w:proofErr w:type="gramStart"/>
-      <w:r>
-        <w:rPr>
-          <w:rFonts w:ascii="Lucida Console" w:eastAsia="Times New Roman" w:hAnsi="Lucida Console" w:cs="Courier New"/>
-          <w:color w:val="000000"/>
-          <w:kern w:val="0"/>
-          <w:sz w:val="20"/>
-          <w:szCs w:val="20"/>
-          <w:bdr w:val="none" w:sz="0" w:space="0" w:color="auto" w:frame="1"/>
-          <w14:ligatures w14:val="none"/>
-        </w:rPr>
-        <w:t>:  0.3575</w:t>
-      </w:r>
-      <w:proofErr w:type="gramEnd"/>
-      <w:r>
-        <w:rPr>
-          <w:rFonts w:ascii="Lucida Console" w:eastAsia="Times New Roman" w:hAnsi="Lucida Console" w:cs="Courier New"/>
-          <w:color w:val="000000"/>
-          <w:kern w:val="0"/>
-          <w:sz w:val="20"/>
-          <w:szCs w:val="20"/>
-          <w:bdr w:val="none" w:sz="0" w:space="0" w:color="auto" w:frame="1"/>
-          <w14:ligatures w14:val="none"/>
-        </w:rPr>
-        <w:t xml:space="preserve"> </w:t>
+        <w:t xml:space="preserve">Adjusted R-squared:  0.3575 </w:t>
       </w:r>
     </w:p>
     <w:p>
@@ -6277,33 +5331,7 @@
           <w:bdr w:val="none" w:sz="0" w:space="0" w:color="auto" w:frame="1"/>
           <w14:ligatures w14:val="none"/>
         </w:rPr>
-        <w:t xml:space="preserve">F-statistic: 5.883 on 9 and 70 </w:t>
-      </w:r>
-      <w:proofErr w:type="gramStart"/>
-      <w:r>
-        <w:rPr>
-          <w:rFonts w:ascii="Lucida Console" w:eastAsia="Times New Roman" w:hAnsi="Lucida Console" w:cs="Courier New"/>
-          <w:color w:val="000000"/>
-          <w:kern w:val="0"/>
-          <w:sz w:val="20"/>
-          <w:szCs w:val="20"/>
-          <w:bdr w:val="none" w:sz="0" w:space="0" w:color="auto" w:frame="1"/>
-          <w14:ligatures w14:val="none"/>
-        </w:rPr>
-        <w:t>DF,  p</w:t>
-      </w:r>
-      <w:proofErr w:type="gramEnd"/>
-      <w:r>
-        <w:rPr>
-          <w:rFonts w:ascii="Lucida Console" w:eastAsia="Times New Roman" w:hAnsi="Lucida Console" w:cs="Courier New"/>
-          <w:color w:val="000000"/>
-          <w:kern w:val="0"/>
-          <w:sz w:val="20"/>
-          <w:szCs w:val="20"/>
-          <w:bdr w:val="none" w:sz="0" w:space="0" w:color="auto" w:frame="1"/>
-          <w14:ligatures w14:val="none"/>
-        </w:rPr>
-        <w:t>-value: 4.438e-06</w:t>
+        <w:t>F-statistic: 5.883 on 9 and 70 DF,  p-value: 4.438e-06</w:t>
       </w:r>
     </w:p>
     <w:p>
@@ -6385,43 +5413,13 @@
           <w:color w:val="0000FF"/>
         </w:rPr>
       </w:pPr>
-      <w:proofErr w:type="spellStart"/>
-      <w:proofErr w:type="gramStart"/>
       <w:r>
         <w:rPr>
           <w:rStyle w:val="gnvwddmdb3b"/>
           <w:rFonts w:ascii="Lucida Console" w:hAnsi="Lucida Console"/>
           <w:color w:val="0000FF"/>
         </w:rPr>
-        <w:t>anova</w:t>
-      </w:r>
-      <w:proofErr w:type="spellEnd"/>
-      <w:r>
-        <w:rPr>
-          <w:rStyle w:val="gnvwddmdb3b"/>
-          <w:rFonts w:ascii="Lucida Console" w:hAnsi="Lucida Console"/>
-          <w:color w:val="0000FF"/>
-        </w:rPr>
-        <w:t>(</w:t>
-      </w:r>
-      <w:proofErr w:type="spellStart"/>
-      <w:r>
-        <w:rPr>
-          <w:rStyle w:val="gnvwddmdb3b"/>
-          <w:rFonts w:ascii="Lucida Console" w:hAnsi="Lucida Console"/>
-          <w:color w:val="0000FF"/>
-        </w:rPr>
-        <w:t>Cumm.Stat.Anal</w:t>
-      </w:r>
-      <w:proofErr w:type="spellEnd"/>
-      <w:proofErr w:type="gramEnd"/>
-      <w:r>
-        <w:rPr>
-          <w:rStyle w:val="gnvwddmdb3b"/>
-          <w:rFonts w:ascii="Lucida Console" w:hAnsi="Lucida Console"/>
-          <w:color w:val="0000FF"/>
-        </w:rPr>
-        <w:t>)</w:t>
+        <w:t>anova(Cumm.Stat.Anal)</w:t>
       </w:r>
     </w:p>
     <w:p>
@@ -6478,21 +5476,30 @@
           <w:color w:val="000000"/>
           <w:bdr w:val="none" w:sz="0" w:space="0" w:color="auto" w:frame="1"/>
         </w:rPr>
-        <w:t xml:space="preserve">Response: </w:t>
-      </w:r>
-      <w:proofErr w:type="spellStart"/>
-      <w:proofErr w:type="gramStart"/>
-      <w:r>
+        <w:t>Response: Total.Cum.Emissions</w:t>
+      </w:r>
+    </w:p>
+    <w:p>
+      <w:pPr>
+        <w:pStyle w:val="HTMLPreformatted"/>
+        <w:shd w:val="clear" w:color="auto" w:fill="FFFFFF"/>
+        <w:wordWrap w:val="0"/>
         <w:rPr>
           <w:rStyle w:val="gnvwddmdl3b"/>
           <w:rFonts w:ascii="Lucida Console" w:hAnsi="Lucida Console"/>
           <w:color w:val="000000"/>
           <w:bdr w:val="none" w:sz="0" w:space="0" w:color="auto" w:frame="1"/>
         </w:rPr>
-        <w:t>Total.Cum.Emissions</w:t>
-      </w:r>
-      <w:proofErr w:type="spellEnd"/>
-      <w:proofErr w:type="gramEnd"/>
+      </w:pPr>
+      <w:r>
+        <w:rPr>
+          <w:rStyle w:val="gnvwddmdl3b"/>
+          <w:rFonts w:ascii="Lucida Console" w:hAnsi="Lucida Console"/>
+          <w:color w:val="000000"/>
+          <w:bdr w:val="none" w:sz="0" w:space="0" w:color="auto" w:frame="1"/>
+        </w:rPr>
+        <w:t xml:space="preserve">              Df Sum Sq Mean Sq F value    Pr(&gt;F)    </w:t>
+      </w:r>
     </w:p>
     <w:p>
       <w:pPr>
@@ -6513,19 +5520,21 @@
           <w:color w:val="000000"/>
           <w:bdr w:val="none" w:sz="0" w:space="0" w:color="auto" w:frame="1"/>
         </w:rPr>
-        <w:t xml:space="preserve">              </w:t>
-      </w:r>
-      <w:proofErr w:type="spellStart"/>
-      <w:r>
+        <w:t>BLOCK.F        3 4224.0 1408.01 10.9154 5.752e-06 ***</w:t>
+      </w:r>
+    </w:p>
+    <w:p>
+      <w:pPr>
+        <w:pStyle w:val="HTMLPreformatted"/>
+        <w:shd w:val="clear" w:color="auto" w:fill="FFFFFF"/>
+        <w:wordWrap w:val="0"/>
         <w:rPr>
           <w:rStyle w:val="gnvwddmdl3b"/>
           <w:rFonts w:ascii="Lucida Console" w:hAnsi="Lucida Console"/>
           <w:color w:val="000000"/>
           <w:bdr w:val="none" w:sz="0" w:space="0" w:color="auto" w:frame="1"/>
         </w:rPr>
-        <w:t>Df</w:t>
-      </w:r>
-      <w:proofErr w:type="spellEnd"/>
+      </w:pPr>
       <w:r>
         <w:rPr>
           <w:rStyle w:val="gnvwddmdl3b"/>
@@ -6533,19 +5542,21 @@
           <w:color w:val="000000"/>
           <w:bdr w:val="none" w:sz="0" w:space="0" w:color="auto" w:frame="1"/>
         </w:rPr>
-        <w:t xml:space="preserve"> Sum Sq Mean Sq F </w:t>
-      </w:r>
-      <w:proofErr w:type="gramStart"/>
-      <w:r>
+        <w:t>Sampling.Year  1 1903.3 1903.32 14.7553 0.0002661 ***</w:t>
+      </w:r>
+    </w:p>
+    <w:p>
+      <w:pPr>
+        <w:pStyle w:val="HTMLPreformatted"/>
+        <w:shd w:val="clear" w:color="auto" w:fill="FFFFFF"/>
+        <w:wordWrap w:val="0"/>
         <w:rPr>
           <w:rStyle w:val="gnvwddmdl3b"/>
           <w:rFonts w:ascii="Lucida Console" w:hAnsi="Lucida Console"/>
           <w:color w:val="000000"/>
           <w:bdr w:val="none" w:sz="0" w:space="0" w:color="auto" w:frame="1"/>
         </w:rPr>
-        <w:t>value</w:t>
-      </w:r>
-      <w:proofErr w:type="gramEnd"/>
+      </w:pPr>
       <w:r>
         <w:rPr>
           <w:rStyle w:val="gnvwddmdl3b"/>
@@ -6553,19 +5564,21 @@
           <w:color w:val="000000"/>
           <w:bdr w:val="none" w:sz="0" w:space="0" w:color="auto" w:frame="1"/>
         </w:rPr>
-        <w:t xml:space="preserve">    </w:t>
-      </w:r>
-      <w:proofErr w:type="spellStart"/>
-      <w:r>
+        <w:t xml:space="preserve">CoverCrop.F    2  103.8   51.89  0.4023 0.6703176    </w:t>
+      </w:r>
+    </w:p>
+    <w:p>
+      <w:pPr>
+        <w:pStyle w:val="HTMLPreformatted"/>
+        <w:shd w:val="clear" w:color="auto" w:fill="FFFFFF"/>
+        <w:wordWrap w:val="0"/>
         <w:rPr>
           <w:rStyle w:val="gnvwddmdl3b"/>
           <w:rFonts w:ascii="Lucida Console" w:hAnsi="Lucida Console"/>
           <w:color w:val="000000"/>
           <w:bdr w:val="none" w:sz="0" w:space="0" w:color="auto" w:frame="1"/>
         </w:rPr>
-        <w:t>Pr</w:t>
-      </w:r>
-      <w:proofErr w:type="spellEnd"/>
+      </w:pPr>
       <w:r>
         <w:rPr>
           <w:rStyle w:val="gnvwddmdl3b"/>
@@ -6573,7 +5586,7 @@
           <w:color w:val="000000"/>
           <w:bdr w:val="none" w:sz="0" w:space="0" w:color="auto" w:frame="1"/>
         </w:rPr>
-        <w:t xml:space="preserve">(&gt;F)    </w:t>
+        <w:t xml:space="preserve">Treatment.F    3  599.2  199.73  1.5484 0.2096975    </w:t>
       </w:r>
     </w:p>
     <w:p>
@@ -6595,7 +5608,7 @@
           <w:color w:val="000000"/>
           <w:bdr w:val="none" w:sz="0" w:space="0" w:color="auto" w:frame="1"/>
         </w:rPr>
-        <w:t>BLOCK.F        3 4224.0 1408.01 10.9154 5.752e-06 ***</w:t>
+        <w:t xml:space="preserve">Residuals     70 9029.5  128.99                      </w:t>
       </w:r>
     </w:p>
     <w:p>
@@ -6610,8 +5623,6 @@
           <w:bdr w:val="none" w:sz="0" w:space="0" w:color="auto" w:frame="1"/>
         </w:rPr>
       </w:pPr>
-      <w:proofErr w:type="spellStart"/>
-      <w:proofErr w:type="gramStart"/>
       <w:r>
         <w:rPr>
           <w:rStyle w:val="gnvwddmdl3b"/>
@@ -6619,9 +5630,19 @@
           <w:color w:val="000000"/>
           <w:bdr w:val="none" w:sz="0" w:space="0" w:color="auto" w:frame="1"/>
         </w:rPr>
-        <w:t>Sampling.Year</w:t>
-      </w:r>
-      <w:proofErr w:type="spellEnd"/>
+        <w:t>---</w:t>
+      </w:r>
+    </w:p>
+    <w:p>
+      <w:pPr>
+        <w:pStyle w:val="HTMLPreformatted"/>
+        <w:shd w:val="clear" w:color="auto" w:fill="FFFFFF"/>
+        <w:wordWrap w:val="0"/>
+        <w:rPr>
+          <w:rFonts w:ascii="Lucida Console" w:hAnsi="Lucida Console"/>
+          <w:color w:val="000000"/>
+        </w:rPr>
+      </w:pPr>
       <w:r>
         <w:rPr>
           <w:rStyle w:val="gnvwddmdl3b"/>
@@ -6629,338 +5650,7 @@
           <w:color w:val="000000"/>
           <w:bdr w:val="none" w:sz="0" w:space="0" w:color="auto" w:frame="1"/>
         </w:rPr>
-        <w:t xml:space="preserve">  1</w:t>
-      </w:r>
-      <w:proofErr w:type="gramEnd"/>
-      <w:r>
-        <w:rPr>
-          <w:rStyle w:val="gnvwddmdl3b"/>
-          <w:rFonts w:ascii="Lucida Console" w:hAnsi="Lucida Console"/>
-          <w:color w:val="000000"/>
-          <w:bdr w:val="none" w:sz="0" w:space="0" w:color="auto" w:frame="1"/>
-        </w:rPr>
-        <w:t xml:space="preserve"> 1903.3 1903.32 14.7553 0.0002661 ***</w:t>
-      </w:r>
-    </w:p>
-    <w:p>
-      <w:pPr>
-        <w:pStyle w:val="HTMLPreformatted"/>
-        <w:shd w:val="clear" w:color="auto" w:fill="FFFFFF"/>
-        <w:wordWrap w:val="0"/>
-        <w:rPr>
-          <w:rStyle w:val="gnvwddmdl3b"/>
-          <w:rFonts w:ascii="Lucida Console" w:hAnsi="Lucida Console"/>
-          <w:color w:val="000000"/>
-          <w:bdr w:val="none" w:sz="0" w:space="0" w:color="auto" w:frame="1"/>
-        </w:rPr>
-      </w:pPr>
-      <w:proofErr w:type="spellStart"/>
-      <w:r>
-        <w:rPr>
-          <w:rStyle w:val="gnvwddmdl3b"/>
-          <w:rFonts w:ascii="Lucida Console" w:hAnsi="Lucida Console"/>
-          <w:color w:val="000000"/>
-          <w:bdr w:val="none" w:sz="0" w:space="0" w:color="auto" w:frame="1"/>
-        </w:rPr>
-        <w:t>CoverCrop.F</w:t>
-      </w:r>
-      <w:proofErr w:type="spellEnd"/>
-      <w:r>
-        <w:rPr>
-          <w:rStyle w:val="gnvwddmdl3b"/>
-          <w:rFonts w:ascii="Lucida Console" w:hAnsi="Lucida Console"/>
-          <w:color w:val="000000"/>
-          <w:bdr w:val="none" w:sz="0" w:space="0" w:color="auto" w:frame="1"/>
-        </w:rPr>
-        <w:t xml:space="preserve">    </w:t>
-      </w:r>
-      <w:proofErr w:type="gramStart"/>
-      <w:r>
-        <w:rPr>
-          <w:rStyle w:val="gnvwddmdl3b"/>
-          <w:rFonts w:ascii="Lucida Console" w:hAnsi="Lucida Console"/>
-          <w:color w:val="000000"/>
-          <w:bdr w:val="none" w:sz="0" w:space="0" w:color="auto" w:frame="1"/>
-        </w:rPr>
-        <w:t>2  103.8</w:t>
-      </w:r>
-      <w:proofErr w:type="gramEnd"/>
-      <w:r>
-        <w:rPr>
-          <w:rStyle w:val="gnvwddmdl3b"/>
-          <w:rFonts w:ascii="Lucida Console" w:hAnsi="Lucida Console"/>
-          <w:color w:val="000000"/>
-          <w:bdr w:val="none" w:sz="0" w:space="0" w:color="auto" w:frame="1"/>
-        </w:rPr>
-        <w:t xml:space="preserve">   </w:t>
-      </w:r>
-      <w:proofErr w:type="gramStart"/>
-      <w:r>
-        <w:rPr>
-          <w:rStyle w:val="gnvwddmdl3b"/>
-          <w:rFonts w:ascii="Lucida Console" w:hAnsi="Lucida Console"/>
-          <w:color w:val="000000"/>
-          <w:bdr w:val="none" w:sz="0" w:space="0" w:color="auto" w:frame="1"/>
-        </w:rPr>
-        <w:t>51.89  0.4023</w:t>
-      </w:r>
-      <w:proofErr w:type="gramEnd"/>
-      <w:r>
-        <w:rPr>
-          <w:rStyle w:val="gnvwddmdl3b"/>
-          <w:rFonts w:ascii="Lucida Console" w:hAnsi="Lucida Console"/>
-          <w:color w:val="000000"/>
-          <w:bdr w:val="none" w:sz="0" w:space="0" w:color="auto" w:frame="1"/>
-        </w:rPr>
-        <w:t xml:space="preserve"> 0.6703176    </w:t>
-      </w:r>
-    </w:p>
-    <w:p>
-      <w:pPr>
-        <w:pStyle w:val="HTMLPreformatted"/>
-        <w:shd w:val="clear" w:color="auto" w:fill="FFFFFF"/>
-        <w:wordWrap w:val="0"/>
-        <w:rPr>
-          <w:rStyle w:val="gnvwddmdl3b"/>
-          <w:rFonts w:ascii="Lucida Console" w:hAnsi="Lucida Console"/>
-          <w:color w:val="000000"/>
-          <w:bdr w:val="none" w:sz="0" w:space="0" w:color="auto" w:frame="1"/>
-        </w:rPr>
-      </w:pPr>
-      <w:proofErr w:type="spellStart"/>
-      <w:r>
-        <w:rPr>
-          <w:rStyle w:val="gnvwddmdl3b"/>
-          <w:rFonts w:ascii="Lucida Console" w:hAnsi="Lucida Console"/>
-          <w:color w:val="000000"/>
-          <w:bdr w:val="none" w:sz="0" w:space="0" w:color="auto" w:frame="1"/>
-        </w:rPr>
-        <w:t>Treatment.F</w:t>
-      </w:r>
-      <w:proofErr w:type="spellEnd"/>
-      <w:r>
-        <w:rPr>
-          <w:rStyle w:val="gnvwddmdl3b"/>
-          <w:rFonts w:ascii="Lucida Console" w:hAnsi="Lucida Console"/>
-          <w:color w:val="000000"/>
-          <w:bdr w:val="none" w:sz="0" w:space="0" w:color="auto" w:frame="1"/>
-        </w:rPr>
-        <w:t xml:space="preserve">    </w:t>
-      </w:r>
-      <w:proofErr w:type="gramStart"/>
-      <w:r>
-        <w:rPr>
-          <w:rStyle w:val="gnvwddmdl3b"/>
-          <w:rFonts w:ascii="Lucida Console" w:hAnsi="Lucida Console"/>
-          <w:color w:val="000000"/>
-          <w:bdr w:val="none" w:sz="0" w:space="0" w:color="auto" w:frame="1"/>
-        </w:rPr>
-        <w:t>3  599.2</w:t>
-      </w:r>
-      <w:proofErr w:type="gramEnd"/>
-      <w:r>
-        <w:rPr>
-          <w:rStyle w:val="gnvwddmdl3b"/>
-          <w:rFonts w:ascii="Lucida Console" w:hAnsi="Lucida Console"/>
-          <w:color w:val="000000"/>
-          <w:bdr w:val="none" w:sz="0" w:space="0" w:color="auto" w:frame="1"/>
-        </w:rPr>
-        <w:t xml:space="preserve">  </w:t>
-      </w:r>
-      <w:proofErr w:type="gramStart"/>
-      <w:r>
-        <w:rPr>
-          <w:rStyle w:val="gnvwddmdl3b"/>
-          <w:rFonts w:ascii="Lucida Console" w:hAnsi="Lucida Console"/>
-          <w:color w:val="000000"/>
-          <w:bdr w:val="none" w:sz="0" w:space="0" w:color="auto" w:frame="1"/>
-        </w:rPr>
-        <w:t>199.73  1.5484</w:t>
-      </w:r>
-      <w:proofErr w:type="gramEnd"/>
-      <w:r>
-        <w:rPr>
-          <w:rStyle w:val="gnvwddmdl3b"/>
-          <w:rFonts w:ascii="Lucida Console" w:hAnsi="Lucida Console"/>
-          <w:color w:val="000000"/>
-          <w:bdr w:val="none" w:sz="0" w:space="0" w:color="auto" w:frame="1"/>
-        </w:rPr>
-        <w:t xml:space="preserve"> 0.2096975    </w:t>
-      </w:r>
-    </w:p>
-    <w:p>
-      <w:pPr>
-        <w:pStyle w:val="HTMLPreformatted"/>
-        <w:shd w:val="clear" w:color="auto" w:fill="FFFFFF"/>
-        <w:wordWrap w:val="0"/>
-        <w:rPr>
-          <w:rStyle w:val="gnvwddmdl3b"/>
-          <w:rFonts w:ascii="Lucida Console" w:hAnsi="Lucida Console"/>
-          <w:color w:val="000000"/>
-          <w:bdr w:val="none" w:sz="0" w:space="0" w:color="auto" w:frame="1"/>
-        </w:rPr>
-      </w:pPr>
-      <w:r>
-        <w:rPr>
-          <w:rStyle w:val="gnvwddmdl3b"/>
-          <w:rFonts w:ascii="Lucida Console" w:hAnsi="Lucida Console"/>
-          <w:color w:val="000000"/>
-          <w:bdr w:val="none" w:sz="0" w:space="0" w:color="auto" w:frame="1"/>
-        </w:rPr>
-        <w:t xml:space="preserve">Residuals     70 </w:t>
-      </w:r>
-      <w:proofErr w:type="gramStart"/>
-      <w:r>
-        <w:rPr>
-          <w:rStyle w:val="gnvwddmdl3b"/>
-          <w:rFonts w:ascii="Lucida Console" w:hAnsi="Lucida Console"/>
-          <w:color w:val="000000"/>
-          <w:bdr w:val="none" w:sz="0" w:space="0" w:color="auto" w:frame="1"/>
-        </w:rPr>
-        <w:t>9029.5  128.99</w:t>
-      </w:r>
-      <w:proofErr w:type="gramEnd"/>
-      <w:r>
-        <w:rPr>
-          <w:rStyle w:val="gnvwddmdl3b"/>
-          <w:rFonts w:ascii="Lucida Console" w:hAnsi="Lucida Console"/>
-          <w:color w:val="000000"/>
-          <w:bdr w:val="none" w:sz="0" w:space="0" w:color="auto" w:frame="1"/>
-        </w:rPr>
-        <w:t xml:space="preserve">                      </w:t>
-      </w:r>
-    </w:p>
-    <w:p>
-      <w:pPr>
-        <w:pStyle w:val="HTMLPreformatted"/>
-        <w:shd w:val="clear" w:color="auto" w:fill="FFFFFF"/>
-        <w:wordWrap w:val="0"/>
-        <w:rPr>
-          <w:rStyle w:val="gnvwddmdl3b"/>
-          <w:rFonts w:ascii="Lucida Console" w:hAnsi="Lucida Console"/>
-          <w:color w:val="000000"/>
-          <w:bdr w:val="none" w:sz="0" w:space="0" w:color="auto" w:frame="1"/>
-        </w:rPr>
-      </w:pPr>
-      <w:r>
-        <w:rPr>
-          <w:rStyle w:val="gnvwddmdl3b"/>
-          <w:rFonts w:ascii="Lucida Console" w:hAnsi="Lucida Console"/>
-          <w:color w:val="000000"/>
-          <w:bdr w:val="none" w:sz="0" w:space="0" w:color="auto" w:frame="1"/>
-        </w:rPr>
-        <w:t>---</w:t>
-      </w:r>
-    </w:p>
-    <w:p>
-      <w:pPr>
-        <w:pStyle w:val="HTMLPreformatted"/>
-        <w:shd w:val="clear" w:color="auto" w:fill="FFFFFF"/>
-        <w:wordWrap w:val="0"/>
-        <w:rPr>
-          <w:rFonts w:ascii="Lucida Console" w:hAnsi="Lucida Console"/>
-          <w:color w:val="000000"/>
-        </w:rPr>
-      </w:pPr>
-      <w:proofErr w:type="spellStart"/>
-      <w:r>
-        <w:rPr>
-          <w:rStyle w:val="gnvwddmdl3b"/>
-          <w:rFonts w:ascii="Lucida Console" w:hAnsi="Lucida Console"/>
-          <w:color w:val="000000"/>
-          <w:bdr w:val="none" w:sz="0" w:space="0" w:color="auto" w:frame="1"/>
-        </w:rPr>
-        <w:t>Signif</w:t>
-      </w:r>
-      <w:proofErr w:type="spellEnd"/>
-      <w:r>
-        <w:rPr>
-          <w:rStyle w:val="gnvwddmdl3b"/>
-          <w:rFonts w:ascii="Lucida Console" w:hAnsi="Lucida Console"/>
-          <w:color w:val="000000"/>
-          <w:bdr w:val="none" w:sz="0" w:space="0" w:color="auto" w:frame="1"/>
-        </w:rPr>
-        <w:t>. codes</w:t>
-      </w:r>
-      <w:proofErr w:type="gramStart"/>
-      <w:r>
-        <w:rPr>
-          <w:rStyle w:val="gnvwddmdl3b"/>
-          <w:rFonts w:ascii="Lucida Console" w:hAnsi="Lucida Console"/>
-          <w:color w:val="000000"/>
-          <w:bdr w:val="none" w:sz="0" w:space="0" w:color="auto" w:frame="1"/>
-        </w:rPr>
-        <w:t>:  0 ‘</w:t>
-      </w:r>
-      <w:proofErr w:type="gramEnd"/>
-      <w:r>
-        <w:rPr>
-          <w:rStyle w:val="gnvwddmdl3b"/>
-          <w:rFonts w:ascii="Lucida Console" w:hAnsi="Lucida Console"/>
-          <w:color w:val="000000"/>
-          <w:bdr w:val="none" w:sz="0" w:space="0" w:color="auto" w:frame="1"/>
-        </w:rPr>
-        <w:t xml:space="preserve">***’ </w:t>
-      </w:r>
-      <w:proofErr w:type="gramStart"/>
-      <w:r>
-        <w:rPr>
-          <w:rStyle w:val="gnvwddmdl3b"/>
-          <w:rFonts w:ascii="Lucida Console" w:hAnsi="Lucida Console"/>
-          <w:color w:val="000000"/>
-          <w:bdr w:val="none" w:sz="0" w:space="0" w:color="auto" w:frame="1"/>
-        </w:rPr>
-        <w:t>0.001 ‘*</w:t>
-      </w:r>
-      <w:proofErr w:type="gramEnd"/>
-      <w:r>
-        <w:rPr>
-          <w:rStyle w:val="gnvwddmdl3b"/>
-          <w:rFonts w:ascii="Lucida Console" w:hAnsi="Lucida Console"/>
-          <w:color w:val="000000"/>
-          <w:bdr w:val="none" w:sz="0" w:space="0" w:color="auto" w:frame="1"/>
-        </w:rPr>
-        <w:t xml:space="preserve">*’ </w:t>
-      </w:r>
-      <w:proofErr w:type="gramStart"/>
-      <w:r>
-        <w:rPr>
-          <w:rStyle w:val="gnvwddmdl3b"/>
-          <w:rFonts w:ascii="Lucida Console" w:hAnsi="Lucida Console"/>
-          <w:color w:val="000000"/>
-          <w:bdr w:val="none" w:sz="0" w:space="0" w:color="auto" w:frame="1"/>
-        </w:rPr>
-        <w:t>0.01 ‘*</w:t>
-      </w:r>
-      <w:proofErr w:type="gramEnd"/>
-      <w:r>
-        <w:rPr>
-          <w:rStyle w:val="gnvwddmdl3b"/>
-          <w:rFonts w:ascii="Lucida Console" w:hAnsi="Lucida Console"/>
-          <w:color w:val="000000"/>
-          <w:bdr w:val="none" w:sz="0" w:space="0" w:color="auto" w:frame="1"/>
-        </w:rPr>
-        <w:t xml:space="preserve">’ 0.05 ‘.’ 0.1 </w:t>
-      </w:r>
-      <w:proofErr w:type="gramStart"/>
-      <w:r>
-        <w:rPr>
-          <w:rStyle w:val="gnvwddmdl3b"/>
-          <w:rFonts w:ascii="Lucida Console" w:hAnsi="Lucida Console"/>
-          <w:color w:val="000000"/>
-          <w:bdr w:val="none" w:sz="0" w:space="0" w:color="auto" w:frame="1"/>
-        </w:rPr>
-        <w:t>‘ ’</w:t>
-      </w:r>
-      <w:proofErr w:type="gramEnd"/>
-      <w:r>
-        <w:rPr>
-          <w:rStyle w:val="gnvwddmdl3b"/>
-          <w:rFonts w:ascii="Lucida Console" w:hAnsi="Lucida Console"/>
-          <w:color w:val="000000"/>
-          <w:bdr w:val="none" w:sz="0" w:space="0" w:color="auto" w:frame="1"/>
-        </w:rPr>
-        <w:t xml:space="preserve"> 1</w:t>
+        <w:t>Signif. codes:  0 ‘***’ 0.001 ‘**’ 0.01 ‘*’ 0.05 ‘.’ 0.1 ‘ ’ 1</w:t>
       </w:r>
     </w:p>
     <w:p>
@@ -7111,13 +5801,8 @@
       </w:r>
     </w:p>
     <w:p>
-      <w:proofErr w:type="gramStart"/>
-      <w:r>
-        <w:t>Daily  emission</w:t>
-      </w:r>
-      <w:proofErr w:type="gramEnd"/>
-      <w:r>
-        <w:t xml:space="preserve"> analysis</w:t>
+      <w:r>
+        <w:t>Daily  emission analysis</w:t>
       </w:r>
     </w:p>
     <w:p>
@@ -7573,7 +6258,6 @@
                 <w14:ligatures w14:val="none"/>
               </w:rPr>
             </w:pPr>
-            <w:proofErr w:type="spellStart"/>
             <w:r>
               <w:rPr>
                 <w:rFonts w:ascii="Calibri" w:eastAsia="Times New Roman" w:hAnsi="Calibri" w:cs="Calibri"/>
@@ -7582,31 +6266,8 @@
                 <w:szCs w:val="24"/>
                 <w14:ligatures w14:val="none"/>
               </w:rPr>
-              <w:t>uL</w:t>
+              <w:t>uL/Lgas</w:t>
             </w:r>
-            <w:proofErr w:type="spellEnd"/>
-            <w:r>
-              <w:rPr>
-                <w:rFonts w:ascii="Calibri" w:eastAsia="Times New Roman" w:hAnsi="Calibri" w:cs="Calibri"/>
-                <w:kern w:val="0"/>
-                <w:sz w:val="24"/>
-                <w:szCs w:val="24"/>
-                <w14:ligatures w14:val="none"/>
-              </w:rPr>
-              <w:t>/</w:t>
-            </w:r>
-            <w:proofErr w:type="spellStart"/>
-            <w:r>
-              <w:rPr>
-                <w:rFonts w:ascii="Calibri" w:eastAsia="Times New Roman" w:hAnsi="Calibri" w:cs="Calibri"/>
-                <w:kern w:val="0"/>
-                <w:sz w:val="24"/>
-                <w:szCs w:val="24"/>
-                <w14:ligatures w14:val="none"/>
-              </w:rPr>
-              <w:t>Lgas</w:t>
-            </w:r>
-            <w:proofErr w:type="spellEnd"/>
           </w:p>
         </w:tc>
         <w:tc>
@@ -7821,7 +6482,6 @@
                 <w14:ligatures w14:val="none"/>
               </w:rPr>
             </w:pPr>
-            <w:proofErr w:type="spellStart"/>
             <w:r>
               <w:rPr>
                 <w:rFonts w:ascii="Calibri" w:eastAsia="Times New Roman" w:hAnsi="Calibri" w:cs="Calibri"/>
@@ -7830,31 +6490,8 @@
                 <w:szCs w:val="24"/>
                 <w14:ligatures w14:val="none"/>
               </w:rPr>
-              <w:t>uL</w:t>
+              <w:t>uL/Lgas</w:t>
             </w:r>
-            <w:proofErr w:type="spellEnd"/>
-            <w:r>
-              <w:rPr>
-                <w:rFonts w:ascii="Calibri" w:eastAsia="Times New Roman" w:hAnsi="Calibri" w:cs="Calibri"/>
-                <w:kern w:val="0"/>
-                <w:sz w:val="24"/>
-                <w:szCs w:val="24"/>
-                <w14:ligatures w14:val="none"/>
-              </w:rPr>
-              <w:t>/</w:t>
-            </w:r>
-            <w:proofErr w:type="spellStart"/>
-            <w:r>
-              <w:rPr>
-                <w:rFonts w:ascii="Calibri" w:eastAsia="Times New Roman" w:hAnsi="Calibri" w:cs="Calibri"/>
-                <w:kern w:val="0"/>
-                <w:sz w:val="24"/>
-                <w:szCs w:val="24"/>
-                <w14:ligatures w14:val="none"/>
-              </w:rPr>
-              <w:t>Lgas</w:t>
-            </w:r>
-            <w:proofErr w:type="spellEnd"/>
           </w:p>
         </w:tc>
         <w:tc>
@@ -8069,7 +6706,6 @@
                 <w14:ligatures w14:val="none"/>
               </w:rPr>
             </w:pPr>
-            <w:proofErr w:type="spellStart"/>
             <w:r>
               <w:rPr>
                 <w:rFonts w:ascii="Calibri" w:eastAsia="Times New Roman" w:hAnsi="Calibri" w:cs="Calibri"/>
@@ -8078,31 +6714,8 @@
                 <w:szCs w:val="24"/>
                 <w14:ligatures w14:val="none"/>
               </w:rPr>
-              <w:t>uL</w:t>
+              <w:t>uL/Lgas</w:t>
             </w:r>
-            <w:proofErr w:type="spellEnd"/>
-            <w:r>
-              <w:rPr>
-                <w:rFonts w:ascii="Calibri" w:eastAsia="Times New Roman" w:hAnsi="Calibri" w:cs="Calibri"/>
-                <w:kern w:val="0"/>
-                <w:sz w:val="24"/>
-                <w:szCs w:val="24"/>
-                <w14:ligatures w14:val="none"/>
-              </w:rPr>
-              <w:t>/</w:t>
-            </w:r>
-            <w:proofErr w:type="spellStart"/>
-            <w:r>
-              <w:rPr>
-                <w:rFonts w:ascii="Calibri" w:eastAsia="Times New Roman" w:hAnsi="Calibri" w:cs="Calibri"/>
-                <w:kern w:val="0"/>
-                <w:sz w:val="24"/>
-                <w:szCs w:val="24"/>
-                <w14:ligatures w14:val="none"/>
-              </w:rPr>
-              <w:t>Lgas</w:t>
-            </w:r>
-            <w:proofErr w:type="spellEnd"/>
           </w:p>
         </w:tc>
         <w:tc>
@@ -8317,7 +6930,6 @@
                 <w14:ligatures w14:val="none"/>
               </w:rPr>
             </w:pPr>
-            <w:proofErr w:type="spellStart"/>
             <w:r>
               <w:rPr>
                 <w:rFonts w:ascii="Calibri" w:eastAsia="Times New Roman" w:hAnsi="Calibri" w:cs="Calibri"/>
@@ -8326,31 +6938,8 @@
                 <w:szCs w:val="24"/>
                 <w14:ligatures w14:val="none"/>
               </w:rPr>
-              <w:t>uL</w:t>
+              <w:t>uL/Lgas</w:t>
             </w:r>
-            <w:proofErr w:type="spellEnd"/>
-            <w:r>
-              <w:rPr>
-                <w:rFonts w:ascii="Calibri" w:eastAsia="Times New Roman" w:hAnsi="Calibri" w:cs="Calibri"/>
-                <w:kern w:val="0"/>
-                <w:sz w:val="24"/>
-                <w:szCs w:val="24"/>
-                <w14:ligatures w14:val="none"/>
-              </w:rPr>
-              <w:t>/</w:t>
-            </w:r>
-            <w:proofErr w:type="spellStart"/>
-            <w:r>
-              <w:rPr>
-                <w:rFonts w:ascii="Calibri" w:eastAsia="Times New Roman" w:hAnsi="Calibri" w:cs="Calibri"/>
-                <w:kern w:val="0"/>
-                <w:sz w:val="24"/>
-                <w:szCs w:val="24"/>
-                <w14:ligatures w14:val="none"/>
-              </w:rPr>
-              <w:t>Lgas</w:t>
-            </w:r>
-            <w:proofErr w:type="spellEnd"/>
           </w:p>
         </w:tc>
         <w:tc>
@@ -8562,7 +7151,6 @@
                 <w14:ligatures w14:val="none"/>
               </w:rPr>
             </w:pPr>
-            <w:proofErr w:type="spellStart"/>
             <w:r>
               <w:rPr>
                 <w:rFonts w:ascii="Calibri" w:eastAsia="Times New Roman" w:hAnsi="Calibri" w:cs="Calibri"/>
@@ -8571,31 +7159,8 @@
                 <w:szCs w:val="24"/>
                 <w14:ligatures w14:val="none"/>
               </w:rPr>
-              <w:t>uL</w:t>
+              <w:t>uL/Lgas</w:t>
             </w:r>
-            <w:proofErr w:type="spellEnd"/>
-            <w:r>
-              <w:rPr>
-                <w:rFonts w:ascii="Calibri" w:eastAsia="Times New Roman" w:hAnsi="Calibri" w:cs="Calibri"/>
-                <w:kern w:val="0"/>
-                <w:sz w:val="24"/>
-                <w:szCs w:val="24"/>
-                <w14:ligatures w14:val="none"/>
-              </w:rPr>
-              <w:t>/</w:t>
-            </w:r>
-            <w:proofErr w:type="spellStart"/>
-            <w:r>
-              <w:rPr>
-                <w:rFonts w:ascii="Calibri" w:eastAsia="Times New Roman" w:hAnsi="Calibri" w:cs="Calibri"/>
-                <w:kern w:val="0"/>
-                <w:sz w:val="24"/>
-                <w:szCs w:val="24"/>
-                <w14:ligatures w14:val="none"/>
-              </w:rPr>
-              <w:t>Lgas</w:t>
-            </w:r>
-            <w:proofErr w:type="spellEnd"/>
           </w:p>
         </w:tc>
         <w:tc>
@@ -8807,7 +7372,6 @@
                 <w14:ligatures w14:val="none"/>
               </w:rPr>
             </w:pPr>
-            <w:proofErr w:type="spellStart"/>
             <w:r>
               <w:rPr>
                 <w:rFonts w:ascii="Calibri" w:eastAsia="Times New Roman" w:hAnsi="Calibri" w:cs="Calibri"/>
@@ -8816,31 +7380,8 @@
                 <w:szCs w:val="24"/>
                 <w14:ligatures w14:val="none"/>
               </w:rPr>
-              <w:t>uL</w:t>
+              <w:t>uL/Lgas</w:t>
             </w:r>
-            <w:proofErr w:type="spellEnd"/>
-            <w:r>
-              <w:rPr>
-                <w:rFonts w:ascii="Calibri" w:eastAsia="Times New Roman" w:hAnsi="Calibri" w:cs="Calibri"/>
-                <w:kern w:val="0"/>
-                <w:sz w:val="24"/>
-                <w:szCs w:val="24"/>
-                <w14:ligatures w14:val="none"/>
-              </w:rPr>
-              <w:t>/</w:t>
-            </w:r>
-            <w:proofErr w:type="spellStart"/>
-            <w:r>
-              <w:rPr>
-                <w:rFonts w:ascii="Calibri" w:eastAsia="Times New Roman" w:hAnsi="Calibri" w:cs="Calibri"/>
-                <w:kern w:val="0"/>
-                <w:sz w:val="24"/>
-                <w:szCs w:val="24"/>
-                <w14:ligatures w14:val="none"/>
-              </w:rPr>
-              <w:t>Lgas</w:t>
-            </w:r>
-            <w:proofErr w:type="spellEnd"/>
           </w:p>
         </w:tc>
         <w:tc>
@@ -9055,7 +7596,6 @@
                 <w14:ligatures w14:val="none"/>
               </w:rPr>
             </w:pPr>
-            <w:proofErr w:type="spellStart"/>
             <w:r>
               <w:rPr>
                 <w:rFonts w:ascii="Calibri" w:eastAsia="Times New Roman" w:hAnsi="Calibri" w:cs="Calibri"/>
@@ -9064,31 +7604,8 @@
                 <w:szCs w:val="24"/>
                 <w14:ligatures w14:val="none"/>
               </w:rPr>
-              <w:t>uL</w:t>
+              <w:t>uL/Lgas</w:t>
             </w:r>
-            <w:proofErr w:type="spellEnd"/>
-            <w:r>
-              <w:rPr>
-                <w:rFonts w:ascii="Calibri" w:eastAsia="Times New Roman" w:hAnsi="Calibri" w:cs="Calibri"/>
-                <w:kern w:val="0"/>
-                <w:sz w:val="24"/>
-                <w:szCs w:val="24"/>
-                <w14:ligatures w14:val="none"/>
-              </w:rPr>
-              <w:t>/</w:t>
-            </w:r>
-            <w:proofErr w:type="spellStart"/>
-            <w:r>
-              <w:rPr>
-                <w:rFonts w:ascii="Calibri" w:eastAsia="Times New Roman" w:hAnsi="Calibri" w:cs="Calibri"/>
-                <w:kern w:val="0"/>
-                <w:sz w:val="24"/>
-                <w:szCs w:val="24"/>
-                <w14:ligatures w14:val="none"/>
-              </w:rPr>
-              <w:t>Lgas</w:t>
-            </w:r>
-            <w:proofErr w:type="spellEnd"/>
           </w:p>
         </w:tc>
         <w:tc>
@@ -10571,7 +9088,6 @@
         </w:rPr>
         <w:t xml:space="preserve">The Standards Names </w:t>
       </w:r>
-      <w:proofErr w:type="spellStart"/>
       <w:r>
         <w:rPr>
           <w:b/>
@@ -10579,9 +9095,8 @@
           <w:sz w:val="40"/>
           <w:szCs w:val="40"/>
         </w:rPr>
-        <w:t>PerSTDA</w:t>
-      </w:r>
-      <w:proofErr w:type="spellEnd"/>
+        <w:t xml:space="preserve">PerSTDA and PerSTD are not consistent through out 2021, therefore </w:t>
+      </w:r>
       <w:r>
         <w:rPr>
           <w:b/>
@@ -10589,19 +9104,18 @@
           <w:sz w:val="40"/>
           <w:szCs w:val="40"/>
         </w:rPr>
-        <w:t xml:space="preserve"> and </w:t>
-      </w:r>
-      <w:proofErr w:type="spellStart"/>
-      <w:r>
+        <w:t>need to be selected manually!!!!!!</w:t>
+      </w:r>
+    </w:p>
+    <w:p>
+      <w:pPr>
         <w:rPr>
           <w:b/>
           <w:bCs/>
           <w:sz w:val="40"/>
           <w:szCs w:val="40"/>
         </w:rPr>
-        <w:t>PerSTD</w:t>
-      </w:r>
-      <w:proofErr w:type="spellEnd"/>
+      </w:pPr>
       <w:r>
         <w:rPr>
           <w:b/>
@@ -10609,21 +9123,18 @@
           <w:sz w:val="40"/>
           <w:szCs w:val="40"/>
         </w:rPr>
-        <w:t xml:space="preserve"> are not consistent </w:t>
-      </w:r>
-      <w:proofErr w:type="spellStart"/>
-      <w:proofErr w:type="gramStart"/>
-      <w:r>
+        <w:br w:type="page"/>
+      </w:r>
+    </w:p>
+    <w:p>
+      <w:pPr>
         <w:rPr>
           <w:b/>
           <w:bCs/>
           <w:sz w:val="40"/>
           <w:szCs w:val="40"/>
         </w:rPr>
-        <w:t>through out</w:t>
-      </w:r>
-      <w:proofErr w:type="spellEnd"/>
-      <w:proofErr w:type="gramEnd"/>
+      </w:pPr>
       <w:r>
         <w:rPr>
           <w:b/>
@@ -10631,53 +9142,6 @@
           <w:sz w:val="40"/>
           <w:szCs w:val="40"/>
         </w:rPr>
-        <w:t xml:space="preserve"> 2021, therefore </w:t>
-      </w:r>
-      <w:r>
-        <w:rPr>
-          <w:b/>
-          <w:bCs/>
-          <w:sz w:val="40"/>
-          <w:szCs w:val="40"/>
-        </w:rPr>
-        <w:t>need to be selected manually!!!!!!</w:t>
-      </w:r>
-    </w:p>
-    <w:p>
-      <w:pPr>
-        <w:rPr>
-          <w:b/>
-          <w:bCs/>
-          <w:sz w:val="40"/>
-          <w:szCs w:val="40"/>
-        </w:rPr>
-      </w:pPr>
-      <w:r>
-        <w:rPr>
-          <w:b/>
-          <w:bCs/>
-          <w:sz w:val="40"/>
-          <w:szCs w:val="40"/>
-        </w:rPr>
-        <w:br w:type="page"/>
-      </w:r>
-    </w:p>
-    <w:p>
-      <w:pPr>
-        <w:rPr>
-          <w:b/>
-          <w:bCs/>
-          <w:sz w:val="40"/>
-          <w:szCs w:val="40"/>
-        </w:rPr>
-      </w:pPr>
-      <w:r>
-        <w:rPr>
-          <w:b/>
-          <w:bCs/>
-          <w:sz w:val="40"/>
-          <w:szCs w:val="40"/>
-        </w:rPr>
         <w:lastRenderedPageBreak/>
         <w:t>Checking standards manually</w:t>
       </w:r>
@@ -10710,6 +9174,16 @@
           <w:szCs w:val="24"/>
         </w:rPr>
         <w:t>Has 3 outliers</w:t>
+      </w:r>
+      <w:r>
+        <w:rPr>
+          <w:sz w:val="24"/>
+          <w:szCs w:val="24"/>
+        </w:rPr>
+        <w:t xml:space="preserve"> </w:t>
+      </w:r>
+      <w:r>
+        <w:t>118, 85, 87</w:t>
       </w:r>
     </w:p>
     <w:p>
@@ -10844,19 +9318,772 @@
       <w:r>
         <w:t xml:space="preserve">Removed </w:t>
       </w:r>
-      <w:proofErr w:type="gramStart"/>
       <w:r>
         <w:t xml:space="preserve">records </w:t>
       </w:r>
       <w:r>
-        <w:t xml:space="preserve"> 118</w:t>
-      </w:r>
-      <w:proofErr w:type="gramEnd"/>
-      <w:r>
-        <w:t xml:space="preserve">, 193, </w:t>
-      </w:r>
-      <w:r>
-        <w:t xml:space="preserve">85 </w:t>
+        <w:t xml:space="preserve">118, </w:t>
+      </w:r>
+      <w:r>
+        <w:t>85</w:t>
+      </w:r>
+      <w:r>
+        <w:t>, 87</w:t>
+      </w:r>
+    </w:p>
+    <w:p>
+      <w:r>
+        <w:br w:type="page"/>
+      </w:r>
+    </w:p>
+    <w:p>
+      <w:pPr>
+        <w:rPr>
+          <w:sz w:val="24"/>
+          <w:szCs w:val="24"/>
+        </w:rPr>
+      </w:pPr>
+      <w:r>
+        <w:rPr>
+          <w:sz w:val="24"/>
+          <w:szCs w:val="24"/>
+        </w:rPr>
+        <w:lastRenderedPageBreak/>
+        <w:t>2021-06-</w:t>
+      </w:r>
+      <w:r>
+        <w:rPr>
+          <w:sz w:val="24"/>
+          <w:szCs w:val="24"/>
+        </w:rPr>
+        <w:t>1</w:t>
+      </w:r>
+      <w:r>
+        <w:rPr>
+          <w:sz w:val="24"/>
+          <w:szCs w:val="24"/>
+        </w:rPr>
+        <w:t>4</w:t>
+      </w:r>
+    </w:p>
+    <w:p>
+      <w:pPr>
+        <w:rPr>
+          <w:sz w:val="24"/>
+          <w:szCs w:val="24"/>
+        </w:rPr>
+      </w:pPr>
+      <w:r>
+        <w:rPr>
+          <w:sz w:val="24"/>
+          <w:szCs w:val="24"/>
+        </w:rPr>
+        <w:t xml:space="preserve">Has tow outliers 472 ,473 </w:t>
+      </w:r>
+    </w:p>
+    <w:p>
+      <w:pPr>
+        <w:rPr>
+          <w:sz w:val="24"/>
+          <w:szCs w:val="24"/>
+        </w:rPr>
+      </w:pPr>
+      <w:r>
+        <w:rPr>
+          <w:noProof/>
+          <w:sz w:val="24"/>
+          <w:szCs w:val="24"/>
+        </w:rPr>
+        <w:drawing>
+          <wp:inline distT="0" distB="0" distL="0" distR="0" wp14:anchorId="208EBC83" wp14:editId="151378AA">
+            <wp:extent cx="5920280" cy="3109766"/>
+            <wp:effectExtent l="0" t="0" r="4445" b="0"/>
+            <wp:docPr id="892945241" name="Picture 7"/>
+            <wp:cNvGraphicFramePr>
+              <a:graphicFrameLocks xmlns:a="http://schemas.openxmlformats.org/drawingml/2006/main" noChangeAspect="1"/>
+            </wp:cNvGraphicFramePr>
+            <a:graphic xmlns:a="http://schemas.openxmlformats.org/drawingml/2006/main">
+              <a:graphicData uri="http://schemas.openxmlformats.org/drawingml/2006/picture">
+                <pic:pic xmlns:pic="http://schemas.openxmlformats.org/drawingml/2006/picture">
+                  <pic:nvPicPr>
+                    <pic:cNvPr id="0" name="Picture 6"/>
+                    <pic:cNvPicPr>
+                      <a:picLocks noChangeAspect="1" noChangeArrowheads="1"/>
+                    </pic:cNvPicPr>
+                  </pic:nvPicPr>
+                  <pic:blipFill>
+                    <a:blip r:embed="rId100" cstate="print">
+                      <a:extLst>
+                        <a:ext uri="{28A0092B-C50C-407E-A947-70E740481C1C}">
+                          <a14:useLocalDpi xmlns:a14="http://schemas.microsoft.com/office/drawing/2010/main" val="0"/>
+                        </a:ext>
+                      </a:extLst>
+                    </a:blip>
+                    <a:srcRect/>
+                    <a:stretch>
+                      <a:fillRect/>
+                    </a:stretch>
+                  </pic:blipFill>
+                  <pic:spPr bwMode="auto">
+                    <a:xfrm>
+                      <a:off x="0" y="0"/>
+                      <a:ext cx="5963247" cy="3132335"/>
+                    </a:xfrm>
+                    <a:prstGeom prst="rect">
+                      <a:avLst/>
+                    </a:prstGeom>
+                    <a:noFill/>
+                  </pic:spPr>
+                </pic:pic>
+              </a:graphicData>
+            </a:graphic>
+          </wp:inline>
+        </w:drawing>
+      </w:r>
+      <w:r>
+        <w:rPr>
+          <w:noProof/>
+          <w:sz w:val="24"/>
+          <w:szCs w:val="24"/>
+        </w:rPr>
+        <w:drawing>
+          <wp:inline distT="0" distB="0" distL="0" distR="0" wp14:anchorId="383B5F6B" wp14:editId="0FA60D55">
+            <wp:extent cx="5792903" cy="3042861"/>
+            <wp:effectExtent l="0" t="0" r="0" b="5715"/>
+            <wp:docPr id="1866479463" name="Picture 8"/>
+            <wp:cNvGraphicFramePr>
+              <a:graphicFrameLocks xmlns:a="http://schemas.openxmlformats.org/drawingml/2006/main" noChangeAspect="1"/>
+            </wp:cNvGraphicFramePr>
+            <a:graphic xmlns:a="http://schemas.openxmlformats.org/drawingml/2006/main">
+              <a:graphicData uri="http://schemas.openxmlformats.org/drawingml/2006/picture">
+                <pic:pic xmlns:pic="http://schemas.openxmlformats.org/drawingml/2006/picture">
+                  <pic:nvPicPr>
+                    <pic:cNvPr id="0" name="Picture 7"/>
+                    <pic:cNvPicPr>
+                      <a:picLocks noChangeAspect="1" noChangeArrowheads="1"/>
+                    </pic:cNvPicPr>
+                  </pic:nvPicPr>
+                  <pic:blipFill>
+                    <a:blip r:embed="rId101" cstate="print">
+                      <a:extLst>
+                        <a:ext uri="{28A0092B-C50C-407E-A947-70E740481C1C}">
+                          <a14:useLocalDpi xmlns:a14="http://schemas.microsoft.com/office/drawing/2010/main" val="0"/>
+                        </a:ext>
+                      </a:extLst>
+                    </a:blip>
+                    <a:srcRect/>
+                    <a:stretch>
+                      <a:fillRect/>
+                    </a:stretch>
+                  </pic:blipFill>
+                  <pic:spPr bwMode="auto">
+                    <a:xfrm>
+                      <a:off x="0" y="0"/>
+                      <a:ext cx="5849442" cy="3072560"/>
+                    </a:xfrm>
+                    <a:prstGeom prst="rect">
+                      <a:avLst/>
+                    </a:prstGeom>
+                    <a:noFill/>
+                  </pic:spPr>
+                </pic:pic>
+              </a:graphicData>
+            </a:graphic>
+          </wp:inline>
+        </w:drawing>
+      </w:r>
+    </w:p>
+    <w:p>
+      <w:pPr>
+        <w:rPr>
+          <w:sz w:val="24"/>
+          <w:szCs w:val="24"/>
+        </w:rPr>
+      </w:pPr>
+      <w:r>
+        <w:t>Removed records</w:t>
+      </w:r>
+      <w:r>
+        <w:t xml:space="preserve"> </w:t>
+      </w:r>
+      <w:r>
+        <w:rPr>
+          <w:sz w:val="24"/>
+          <w:szCs w:val="24"/>
+        </w:rPr>
+        <w:t>472 ,473</w:t>
+      </w:r>
+    </w:p>
+    <w:p>
+      <w:pPr>
+        <w:rPr>
+          <w:sz w:val="24"/>
+          <w:szCs w:val="24"/>
+        </w:rPr>
+      </w:pPr>
+      <w:r>
+        <w:rPr>
+          <w:sz w:val="24"/>
+          <w:szCs w:val="24"/>
+        </w:rPr>
+        <w:br w:type="page"/>
+      </w:r>
+    </w:p>
+    <w:p>
+      <w:pPr>
+        <w:rPr>
+          <w:sz w:val="24"/>
+          <w:szCs w:val="24"/>
+        </w:rPr>
+      </w:pPr>
+      <w:r>
+        <w:rPr>
+          <w:sz w:val="24"/>
+          <w:szCs w:val="24"/>
+        </w:rPr>
+        <w:lastRenderedPageBreak/>
+        <w:t>2021-06-16</w:t>
+      </w:r>
+    </w:p>
+    <w:p>
+      <w:pPr>
+        <w:rPr>
+          <w:sz w:val="24"/>
+          <w:szCs w:val="24"/>
+        </w:rPr>
+      </w:pPr>
+      <w:r>
+        <w:rPr>
+          <w:sz w:val="24"/>
+          <w:szCs w:val="24"/>
+        </w:rPr>
+        <w:t>Outlier 500,</w:t>
+      </w:r>
+    </w:p>
+    <w:p>
+      <w:pPr>
+        <w:rPr>
+          <w:sz w:val="24"/>
+          <w:szCs w:val="24"/>
+        </w:rPr>
+      </w:pPr>
+      <w:r>
+        <w:rPr>
+          <w:noProof/>
+          <w:sz w:val="24"/>
+          <w:szCs w:val="24"/>
+        </w:rPr>
+        <w:drawing>
+          <wp:inline distT="0" distB="0" distL="0" distR="0" wp14:anchorId="62C334A8" wp14:editId="539B66B7">
+            <wp:extent cx="6451587" cy="3388848"/>
+            <wp:effectExtent l="0" t="0" r="6985" b="2540"/>
+            <wp:docPr id="641025951" name="Picture 9"/>
+            <wp:cNvGraphicFramePr>
+              <a:graphicFrameLocks xmlns:a="http://schemas.openxmlformats.org/drawingml/2006/main" noChangeAspect="1"/>
+            </wp:cNvGraphicFramePr>
+            <a:graphic xmlns:a="http://schemas.openxmlformats.org/drawingml/2006/main">
+              <a:graphicData uri="http://schemas.openxmlformats.org/drawingml/2006/picture">
+                <pic:pic xmlns:pic="http://schemas.openxmlformats.org/drawingml/2006/picture">
+                  <pic:nvPicPr>
+                    <pic:cNvPr id="0" name="Picture 8"/>
+                    <pic:cNvPicPr>
+                      <a:picLocks noChangeAspect="1" noChangeArrowheads="1"/>
+                    </pic:cNvPicPr>
+                  </pic:nvPicPr>
+                  <pic:blipFill>
+                    <a:blip r:embed="rId102" cstate="print">
+                      <a:extLst>
+                        <a:ext uri="{28A0092B-C50C-407E-A947-70E740481C1C}">
+                          <a14:useLocalDpi xmlns:a14="http://schemas.microsoft.com/office/drawing/2010/main" val="0"/>
+                        </a:ext>
+                      </a:extLst>
+                    </a:blip>
+                    <a:srcRect/>
+                    <a:stretch>
+                      <a:fillRect/>
+                    </a:stretch>
+                  </pic:blipFill>
+                  <pic:spPr bwMode="auto">
+                    <a:xfrm>
+                      <a:off x="0" y="0"/>
+                      <a:ext cx="6490338" cy="3409203"/>
+                    </a:xfrm>
+                    <a:prstGeom prst="rect">
+                      <a:avLst/>
+                    </a:prstGeom>
+                    <a:noFill/>
+                  </pic:spPr>
+                </pic:pic>
+              </a:graphicData>
+            </a:graphic>
+          </wp:inline>
+        </w:drawing>
+      </w:r>
+    </w:p>
+    <w:p>
+      <w:r>
+        <w:rPr>
+          <w:noProof/>
+        </w:rPr>
+        <w:drawing>
+          <wp:inline distT="0" distB="0" distL="0" distR="0" wp14:anchorId="6B89A9CE" wp14:editId="50127B5D">
+            <wp:extent cx="6550301" cy="3440700"/>
+            <wp:effectExtent l="0" t="0" r="3175" b="7620"/>
+            <wp:docPr id="773800271" name="Picture 10"/>
+            <wp:cNvGraphicFramePr>
+              <a:graphicFrameLocks xmlns:a="http://schemas.openxmlformats.org/drawingml/2006/main" noChangeAspect="1"/>
+            </wp:cNvGraphicFramePr>
+            <a:graphic xmlns:a="http://schemas.openxmlformats.org/drawingml/2006/main">
+              <a:graphicData uri="http://schemas.openxmlformats.org/drawingml/2006/picture">
+                <pic:pic xmlns:pic="http://schemas.openxmlformats.org/drawingml/2006/picture">
+                  <pic:nvPicPr>
+                    <pic:cNvPr id="0" name="Picture 9"/>
+                    <pic:cNvPicPr>
+                      <a:picLocks noChangeAspect="1" noChangeArrowheads="1"/>
+                    </pic:cNvPicPr>
+                  </pic:nvPicPr>
+                  <pic:blipFill>
+                    <a:blip r:embed="rId103" cstate="print">
+                      <a:extLst>
+                        <a:ext uri="{28A0092B-C50C-407E-A947-70E740481C1C}">
+                          <a14:useLocalDpi xmlns:a14="http://schemas.microsoft.com/office/drawing/2010/main" val="0"/>
+                        </a:ext>
+                      </a:extLst>
+                    </a:blip>
+                    <a:srcRect/>
+                    <a:stretch>
+                      <a:fillRect/>
+                    </a:stretch>
+                  </pic:blipFill>
+                  <pic:spPr bwMode="auto">
+                    <a:xfrm>
+                      <a:off x="0" y="0"/>
+                      <a:ext cx="6576465" cy="3454443"/>
+                    </a:xfrm>
+                    <a:prstGeom prst="rect">
+                      <a:avLst/>
+                    </a:prstGeom>
+                    <a:noFill/>
+                  </pic:spPr>
+                </pic:pic>
+              </a:graphicData>
+            </a:graphic>
+          </wp:inline>
+        </w:drawing>
+      </w:r>
+    </w:p>
+    <w:p>
+      <w:pPr>
+        <w:rPr>
+          <w:sz w:val="24"/>
+          <w:szCs w:val="24"/>
+        </w:rPr>
+      </w:pPr>
+      <w:r>
+        <w:rPr>
+          <w:sz w:val="24"/>
+          <w:szCs w:val="24"/>
+        </w:rPr>
+        <w:t>Remove</w:t>
+      </w:r>
+      <w:r>
+        <w:rPr>
+          <w:sz w:val="24"/>
+          <w:szCs w:val="24"/>
+        </w:rPr>
+        <w:t xml:space="preserve"> 500</w:t>
+      </w:r>
+    </w:p>
+    <w:p>
+      <w:pPr>
+        <w:rPr>
+          <w:sz w:val="24"/>
+          <w:szCs w:val="24"/>
+        </w:rPr>
+      </w:pPr>
+      <w:r>
+        <w:rPr>
+          <w:sz w:val="24"/>
+          <w:szCs w:val="24"/>
+        </w:rPr>
+        <w:br w:type="page"/>
+      </w:r>
+    </w:p>
+    <w:p>
+      <w:pPr>
+        <w:rPr>
+          <w:sz w:val="24"/>
+          <w:szCs w:val="24"/>
+        </w:rPr>
+      </w:pPr>
+      <w:r>
+        <w:rPr>
+          <w:sz w:val="24"/>
+          <w:szCs w:val="24"/>
+        </w:rPr>
+        <w:lastRenderedPageBreak/>
+        <w:t>2021-06-21</w:t>
+      </w:r>
+    </w:p>
+    <w:p>
+      <w:pPr>
+        <w:rPr>
+          <w:sz w:val="24"/>
+          <w:szCs w:val="24"/>
+        </w:rPr>
+      </w:pPr>
+      <w:r>
+        <w:rPr>
+          <w:sz w:val="24"/>
+          <w:szCs w:val="24"/>
+        </w:rPr>
+        <w:t>OK</w:t>
+      </w:r>
+    </w:p>
+    <w:p>
+      <w:pPr>
+        <w:rPr>
+          <w:sz w:val="24"/>
+          <w:szCs w:val="24"/>
+        </w:rPr>
+      </w:pPr>
+      <w:r>
+        <w:rPr>
+          <w:noProof/>
+          <w:sz w:val="24"/>
+          <w:szCs w:val="24"/>
+        </w:rPr>
+        <w:drawing>
+          <wp:inline distT="0" distB="0" distL="0" distR="0" wp14:anchorId="2DADA9EB" wp14:editId="760BF362">
+            <wp:extent cx="6546160" cy="3438525"/>
+            <wp:effectExtent l="0" t="0" r="7620" b="0"/>
+            <wp:docPr id="20357841" name="Picture 11"/>
+            <wp:cNvGraphicFramePr>
+              <a:graphicFrameLocks xmlns:a="http://schemas.openxmlformats.org/drawingml/2006/main" noChangeAspect="1"/>
+            </wp:cNvGraphicFramePr>
+            <a:graphic xmlns:a="http://schemas.openxmlformats.org/drawingml/2006/main">
+              <a:graphicData uri="http://schemas.openxmlformats.org/drawingml/2006/picture">
+                <pic:pic xmlns:pic="http://schemas.openxmlformats.org/drawingml/2006/picture">
+                  <pic:nvPicPr>
+                    <pic:cNvPr id="0" name="Picture 10"/>
+                    <pic:cNvPicPr>
+                      <a:picLocks noChangeAspect="1" noChangeArrowheads="1"/>
+                    </pic:cNvPicPr>
+                  </pic:nvPicPr>
+                  <pic:blipFill>
+                    <a:blip r:embed="rId104" cstate="print">
+                      <a:extLst>
+                        <a:ext uri="{28A0092B-C50C-407E-A947-70E740481C1C}">
+                          <a14:useLocalDpi xmlns:a14="http://schemas.microsoft.com/office/drawing/2010/main" val="0"/>
+                        </a:ext>
+                      </a:extLst>
+                    </a:blip>
+                    <a:srcRect/>
+                    <a:stretch>
+                      <a:fillRect/>
+                    </a:stretch>
+                  </pic:blipFill>
+                  <pic:spPr bwMode="auto">
+                    <a:xfrm>
+                      <a:off x="0" y="0"/>
+                      <a:ext cx="6561880" cy="3446783"/>
+                    </a:xfrm>
+                    <a:prstGeom prst="rect">
+                      <a:avLst/>
+                    </a:prstGeom>
+                    <a:noFill/>
+                  </pic:spPr>
+                </pic:pic>
+              </a:graphicData>
+            </a:graphic>
+          </wp:inline>
+        </w:drawing>
+      </w:r>
+    </w:p>
+    <w:p>
+      <w:pPr>
+        <w:rPr>
+          <w:sz w:val="24"/>
+          <w:szCs w:val="24"/>
+        </w:rPr>
+      </w:pPr>
+    </w:p>
+    <w:p>
+      <w:pPr>
+        <w:rPr>
+          <w:sz w:val="24"/>
+          <w:szCs w:val="24"/>
+        </w:rPr>
+      </w:pPr>
+      <w:r>
+        <w:rPr>
+          <w:noProof/>
+          <w:sz w:val="24"/>
+          <w:szCs w:val="24"/>
+        </w:rPr>
+        <w:drawing>
+          <wp:inline distT="0" distB="0" distL="0" distR="0" wp14:anchorId="6D566D1B" wp14:editId="3112F25C">
+            <wp:extent cx="6496050" cy="3412203"/>
+            <wp:effectExtent l="0" t="0" r="0" b="0"/>
+            <wp:docPr id="233984703" name="Picture 12"/>
+            <wp:cNvGraphicFramePr>
+              <a:graphicFrameLocks xmlns:a="http://schemas.openxmlformats.org/drawingml/2006/main" noChangeAspect="1"/>
+            </wp:cNvGraphicFramePr>
+            <a:graphic xmlns:a="http://schemas.openxmlformats.org/drawingml/2006/main">
+              <a:graphicData uri="http://schemas.openxmlformats.org/drawingml/2006/picture">
+                <pic:pic xmlns:pic="http://schemas.openxmlformats.org/drawingml/2006/picture">
+                  <pic:nvPicPr>
+                    <pic:cNvPr id="0" name="Picture 11"/>
+                    <pic:cNvPicPr>
+                      <a:picLocks noChangeAspect="1" noChangeArrowheads="1"/>
+                    </pic:cNvPicPr>
+                  </pic:nvPicPr>
+                  <pic:blipFill>
+                    <a:blip r:embed="rId105" cstate="print">
+                      <a:extLst>
+                        <a:ext uri="{28A0092B-C50C-407E-A947-70E740481C1C}">
+                          <a14:useLocalDpi xmlns:a14="http://schemas.microsoft.com/office/drawing/2010/main" val="0"/>
+                        </a:ext>
+                      </a:extLst>
+                    </a:blip>
+                    <a:srcRect/>
+                    <a:stretch>
+                      <a:fillRect/>
+                    </a:stretch>
+                  </pic:blipFill>
+                  <pic:spPr bwMode="auto">
+                    <a:xfrm>
+                      <a:off x="0" y="0"/>
+                      <a:ext cx="6534047" cy="3432162"/>
+                    </a:xfrm>
+                    <a:prstGeom prst="rect">
+                      <a:avLst/>
+                    </a:prstGeom>
+                    <a:noFill/>
+                  </pic:spPr>
+                </pic:pic>
+              </a:graphicData>
+            </a:graphic>
+          </wp:inline>
+        </w:drawing>
+      </w:r>
+    </w:p>
+    <w:p>
+      <w:pPr>
+        <w:rPr>
+          <w:sz w:val="24"/>
+          <w:szCs w:val="24"/>
+        </w:rPr>
+      </w:pPr>
+      <w:r>
+        <w:rPr>
+          <w:sz w:val="24"/>
+          <w:szCs w:val="24"/>
+        </w:rPr>
+        <w:br w:type="page"/>
+      </w:r>
+    </w:p>
+    <w:p>
+      <w:pPr>
+        <w:rPr>
+          <w:sz w:val="24"/>
+          <w:szCs w:val="24"/>
+        </w:rPr>
+      </w:pPr>
+      <w:r>
+        <w:rPr>
+          <w:sz w:val="24"/>
+          <w:szCs w:val="24"/>
+        </w:rPr>
+        <w:lastRenderedPageBreak/>
+        <w:t>2021-06-23</w:t>
+      </w:r>
+    </w:p>
+    <w:p>
+      <w:pPr>
+        <w:rPr>
+          <w:sz w:val="24"/>
+          <w:szCs w:val="24"/>
+        </w:rPr>
+      </w:pPr>
+      <w:r>
+        <w:rPr>
+          <w:sz w:val="24"/>
+          <w:szCs w:val="24"/>
+        </w:rPr>
+        <w:t xml:space="preserve">Outlier </w:t>
+      </w:r>
+      <w:r>
+        <w:rPr>
+          <w:sz w:val="24"/>
+          <w:szCs w:val="24"/>
+        </w:rPr>
+        <w:t>945</w:t>
+      </w:r>
+    </w:p>
+    <w:p>
+      <w:pPr>
+        <w:rPr>
+          <w:sz w:val="24"/>
+          <w:szCs w:val="24"/>
+        </w:rPr>
+      </w:pPr>
+      <w:r>
+        <w:rPr>
+          <w:noProof/>
+          <w:sz w:val="24"/>
+          <w:szCs w:val="24"/>
+        </w:rPr>
+        <w:drawing>
+          <wp:inline distT="0" distB="0" distL="0" distR="0" wp14:anchorId="4F54E33B" wp14:editId="4FD17B26">
+            <wp:extent cx="6552563" cy="3441888"/>
+            <wp:effectExtent l="0" t="0" r="1270" b="6350"/>
+            <wp:docPr id="1695618964" name="Picture 13"/>
+            <wp:cNvGraphicFramePr>
+              <a:graphicFrameLocks xmlns:a="http://schemas.openxmlformats.org/drawingml/2006/main" noChangeAspect="1"/>
+            </wp:cNvGraphicFramePr>
+            <a:graphic xmlns:a="http://schemas.openxmlformats.org/drawingml/2006/main">
+              <a:graphicData uri="http://schemas.openxmlformats.org/drawingml/2006/picture">
+                <pic:pic xmlns:pic="http://schemas.openxmlformats.org/drawingml/2006/picture">
+                  <pic:nvPicPr>
+                    <pic:cNvPr id="0" name="Picture 12"/>
+                    <pic:cNvPicPr>
+                      <a:picLocks noChangeAspect="1" noChangeArrowheads="1"/>
+                    </pic:cNvPicPr>
+                  </pic:nvPicPr>
+                  <pic:blipFill>
+                    <a:blip r:embed="rId106" cstate="print">
+                      <a:extLst>
+                        <a:ext uri="{28A0092B-C50C-407E-A947-70E740481C1C}">
+                          <a14:useLocalDpi xmlns:a14="http://schemas.microsoft.com/office/drawing/2010/main" val="0"/>
+                        </a:ext>
+                      </a:extLst>
+                    </a:blip>
+                    <a:srcRect/>
+                    <a:stretch>
+                      <a:fillRect/>
+                    </a:stretch>
+                  </pic:blipFill>
+                  <pic:spPr bwMode="auto">
+                    <a:xfrm>
+                      <a:off x="0" y="0"/>
+                      <a:ext cx="6586409" cy="3459667"/>
+                    </a:xfrm>
+                    <a:prstGeom prst="rect">
+                      <a:avLst/>
+                    </a:prstGeom>
+                    <a:noFill/>
+                  </pic:spPr>
+                </pic:pic>
+              </a:graphicData>
+            </a:graphic>
+          </wp:inline>
+        </w:drawing>
+      </w:r>
+    </w:p>
+    <w:p>
+      <w:r>
+        <w:rPr>
+          <w:noProof/>
+        </w:rPr>
+        <w:drawing>
+          <wp:inline distT="0" distB="0" distL="0" distR="0" wp14:anchorId="39BD92F8" wp14:editId="45814F99">
+            <wp:extent cx="6567920" cy="3449955"/>
+            <wp:effectExtent l="0" t="0" r="4445" b="0"/>
+            <wp:docPr id="562063475" name="Picture 14"/>
+            <wp:cNvGraphicFramePr>
+              <a:graphicFrameLocks xmlns:a="http://schemas.openxmlformats.org/drawingml/2006/main" noChangeAspect="1"/>
+            </wp:cNvGraphicFramePr>
+            <a:graphic xmlns:a="http://schemas.openxmlformats.org/drawingml/2006/main">
+              <a:graphicData uri="http://schemas.openxmlformats.org/drawingml/2006/picture">
+                <pic:pic xmlns:pic="http://schemas.openxmlformats.org/drawingml/2006/picture">
+                  <pic:nvPicPr>
+                    <pic:cNvPr id="0" name="Picture 13"/>
+                    <pic:cNvPicPr>
+                      <a:picLocks noChangeAspect="1" noChangeArrowheads="1"/>
+                    </pic:cNvPicPr>
+                  </pic:nvPicPr>
+                  <pic:blipFill>
+                    <a:blip r:embed="rId107" cstate="print">
+                      <a:extLst>
+                        <a:ext uri="{28A0092B-C50C-407E-A947-70E740481C1C}">
+                          <a14:useLocalDpi xmlns:a14="http://schemas.microsoft.com/office/drawing/2010/main" val="0"/>
+                        </a:ext>
+                      </a:extLst>
+                    </a:blip>
+                    <a:srcRect/>
+                    <a:stretch>
+                      <a:fillRect/>
+                    </a:stretch>
+                  </pic:blipFill>
+                  <pic:spPr bwMode="auto">
+                    <a:xfrm>
+                      <a:off x="0" y="0"/>
+                      <a:ext cx="6618073" cy="3476299"/>
+                    </a:xfrm>
+                    <a:prstGeom prst="rect">
+                      <a:avLst/>
+                    </a:prstGeom>
+                    <a:noFill/>
+                  </pic:spPr>
+                </pic:pic>
+              </a:graphicData>
+            </a:graphic>
+          </wp:inline>
+        </w:drawing>
+      </w:r>
+    </w:p>
+    <w:p>
+      <w:pPr>
+        <w:rPr>
+          <w:sz w:val="24"/>
+          <w:szCs w:val="24"/>
+        </w:rPr>
+      </w:pPr>
+      <w:r>
+        <w:rPr>
+          <w:sz w:val="24"/>
+          <w:szCs w:val="24"/>
+        </w:rPr>
+        <w:t>Remove</w:t>
+      </w:r>
+      <w:r>
+        <w:rPr>
+          <w:sz w:val="24"/>
+          <w:szCs w:val="24"/>
+        </w:rPr>
+        <w:t xml:space="preserve"> 945</w:t>
+      </w:r>
+    </w:p>
+    <w:p>
+      <w:pPr>
+        <w:rPr>
+          <w:sz w:val="24"/>
+          <w:szCs w:val="24"/>
+        </w:rPr>
+      </w:pPr>
+      <w:r>
+        <w:rPr>
+          <w:sz w:val="24"/>
+          <w:szCs w:val="24"/>
+        </w:rPr>
+        <w:br w:type="page"/>
+      </w:r>
+    </w:p>
+    <w:p>
+      <w:pPr>
+        <w:rPr>
+          <w:sz w:val="24"/>
+          <w:szCs w:val="24"/>
+        </w:rPr>
+      </w:pPr>
+      <w:r>
+        <w:rPr>
+          <w:sz w:val="24"/>
+          <w:szCs w:val="24"/>
+        </w:rPr>
+        <w:lastRenderedPageBreak/>
+        <w:t>2021-06-29</w:t>
       </w:r>
     </w:p>
     <w:p/>

</xml_diff>

<commit_message>
updating standards by hand
</commit_message>
<xml_diff>
--- a/StrategicTillage_GC_Analysis_workFlow.docx
+++ b/StrategicTillage_GC_Analysis_workFlow.docx
@@ -51,9 +51,11 @@
           <w:numId w:val="1"/>
         </w:numPr>
       </w:pPr>
+      <w:proofErr w:type="spellStart"/>
       <w:r>
         <w:t>GCAnalysis.R</w:t>
       </w:r>
+      <w:proofErr w:type="spellEnd"/>
     </w:p>
     <w:p>
       <w:pPr>
@@ -63,9 +65,11 @@
           <w:numId w:val="1"/>
         </w:numPr>
       </w:pPr>
+      <w:proofErr w:type="spellStart"/>
       <w:r>
         <w:t>HMR_Analysis.R</w:t>
       </w:r>
+      <w:proofErr w:type="spellEnd"/>
     </w:p>
     <w:p>
       <w:pPr>
@@ -87,9 +91,11 @@
           <w:numId w:val="1"/>
         </w:numPr>
       </w:pPr>
+      <w:proofErr w:type="spellStart"/>
       <w:r>
         <w:t>MassFluxCalculation.R</w:t>
       </w:r>
+      <w:proofErr w:type="spellEnd"/>
     </w:p>
     <w:p>
       <w:pPr>
@@ -99,9 +105,11 @@
           <w:numId w:val="1"/>
         </w:numPr>
       </w:pPr>
+      <w:proofErr w:type="spellStart"/>
       <w:r>
         <w:t>SoilGasFluxStatisticalAnalysis.R</w:t>
       </w:r>
+      <w:proofErr w:type="spellEnd"/>
     </w:p>
     <w:p>
       <w:r>
@@ -109,8 +117,29 @@
       </w:r>
     </w:p>
     <w:p>
-      <w:r>
-        <w:t xml:space="preserve">The N2O and CO2 emissions are too high.  The N2O emission measure calculated by Alli were around 10  kg-N/ha yr. </w:t>
+      <w:proofErr w:type="gramStart"/>
+      <w:r>
+        <w:t>The N2O</w:t>
+      </w:r>
+      <w:proofErr w:type="gramEnd"/>
+      <w:r>
+        <w:t xml:space="preserve"> and CO2 emissions are too high.  The N2O emission measure calculated by Alli </w:t>
+      </w:r>
+      <w:proofErr w:type="gramStart"/>
+      <w:r>
+        <w:t>were</w:t>
+      </w:r>
+      <w:proofErr w:type="gramEnd"/>
+      <w:r>
+        <w:t xml:space="preserve"> around </w:t>
+      </w:r>
+      <w:proofErr w:type="gramStart"/>
+      <w:r>
+        <w:t>10  kg</w:t>
+      </w:r>
+      <w:proofErr w:type="gramEnd"/>
+      <w:r>
+        <w:t xml:space="preserve">-N/ha yr. </w:t>
       </w:r>
     </w:p>
     <w:p>
@@ -319,7 +348,31 @@
     </w:p>
     <w:p>
       <w:r>
-        <w:t>The calibration regression for the GC based on standards seem to be irrelevant, as the important aspect affecting the emissions is not the particular concentration data point, but the slope of the consequent concentration measurement inside the chamber that result in the emission rate.</w:t>
+        <w:t xml:space="preserve">The calibration regression for the GC based on standards </w:t>
+      </w:r>
+      <w:proofErr w:type="gramStart"/>
+      <w:r>
+        <w:t>seem</w:t>
+      </w:r>
+      <w:proofErr w:type="gramEnd"/>
+      <w:r>
+        <w:t xml:space="preserve"> to be irrelevant, as the important aspect affecting the emissions is not the </w:t>
+      </w:r>
+      <w:proofErr w:type="gramStart"/>
+      <w:r>
+        <w:t>particular concentration</w:t>
+      </w:r>
+      <w:proofErr w:type="gramEnd"/>
+      <w:r>
+        <w:t xml:space="preserve"> data point, but the slope of the consequent concentration measurement inside the chamber that </w:t>
+      </w:r>
+      <w:proofErr w:type="gramStart"/>
+      <w:r>
+        <w:t>result</w:t>
+      </w:r>
+      <w:proofErr w:type="gramEnd"/>
+      <w:r>
+        <w:t xml:space="preserve"> in the emission rate.</w:t>
       </w:r>
     </w:p>
     <w:p>
@@ -785,12 +838,44 @@
     <w:p/>
     <w:p>
       <w:r>
-        <w:t>The data from the GC does not seems to indicate any mayor difference in the results. The high emissions do not seem to be the result of the GC analysis.</w:t>
-      </w:r>
-    </w:p>
-    <w:p>
-      <w:r>
-        <w:t>The intercept in the GC standard calibration has an important effect and is wrong in the linear model with free intercept. With the intercept forces through 0 the calibration improves significantly.  Plot with free intercept.</w:t>
+        <w:t xml:space="preserve">The data from the GC does not </w:t>
+      </w:r>
+      <w:proofErr w:type="gramStart"/>
+      <w:r>
+        <w:t>seems</w:t>
+      </w:r>
+      <w:proofErr w:type="gramEnd"/>
+      <w:r>
+        <w:t xml:space="preserve"> to indicate any mayor difference in the results. The high emissions do not seem to be the result of the GC analysis.</w:t>
+      </w:r>
+    </w:p>
+    <w:p>
+      <w:r>
+        <w:t xml:space="preserve">The </w:t>
+      </w:r>
+      <w:proofErr w:type="gramStart"/>
+      <w:r>
+        <w:t>intercept</w:t>
+      </w:r>
+      <w:proofErr w:type="gramEnd"/>
+      <w:r>
+        <w:t xml:space="preserve"> in the GC standard calibration has an important effect and is wrong in the linear model with free </w:t>
+      </w:r>
+      <w:proofErr w:type="gramStart"/>
+      <w:r>
+        <w:t>intercept</w:t>
+      </w:r>
+      <w:proofErr w:type="gramEnd"/>
+      <w:r>
+        <w:t xml:space="preserve">. With the intercept forces through 0 the calibration improves significantly.  Plot with free </w:t>
+      </w:r>
+      <w:proofErr w:type="gramStart"/>
+      <w:r>
+        <w:t>intercept</w:t>
+      </w:r>
+      <w:proofErr w:type="gramEnd"/>
+      <w:r>
+        <w:t>.</w:t>
       </w:r>
     </w:p>
     <w:p>
@@ -1313,7 +1398,15 @@
     <w:p/>
     <w:p>
       <w:r>
-        <w:t>Plotting the daily emissions (period emissions) against time it is clear that the main factor determining the higher emissions in blocks 1 and 2 are high N2O emission peaks. Those peaks are not present in blocks 3 and 4.</w:t>
+        <w:t xml:space="preserve">Plotting the daily emissions (period emissions) against time </w:t>
+      </w:r>
+      <w:proofErr w:type="gramStart"/>
+      <w:r>
+        <w:t>it is clear that the</w:t>
+      </w:r>
+      <w:proofErr w:type="gramEnd"/>
+      <w:r>
+        <w:t xml:space="preserve"> main factor determining the higher emissions in blocks 1 and 2 are high N2O emission peaks. Those peaks are not present in blocks 3 and 4.</w:t>
       </w:r>
     </w:p>
     <w:p/>
@@ -1547,6 +1640,7 @@
       <w:r>
         <w:t xml:space="preserve">In 2021, Sampling date </w:t>
       </w:r>
+      <w:proofErr w:type="gramStart"/>
       <w:r>
         <w:t>20210614</w:t>
       </w:r>
@@ -1554,7 +1648,11 @@
         <w:t xml:space="preserve">, </w:t>
       </w:r>
       <w:r>
-        <w:t xml:space="preserve"> and </w:t>
+        <w:t xml:space="preserve"> and</w:t>
+      </w:r>
+      <w:proofErr w:type="gramEnd"/>
+      <w:r>
+        <w:t xml:space="preserve"> </w:t>
       </w:r>
       <w:r>
         <w:t>20210629</w:t>
@@ -1563,13 +1661,29 @@
         <w:t xml:space="preserve"> </w:t>
       </w:r>
       <w:r>
-        <w:t>has problems:  The red points in the graph below all belong</w:t>
+        <w:t>has problems</w:t>
+      </w:r>
+      <w:proofErr w:type="gramStart"/>
+      <w:r>
+        <w:t>:  The</w:t>
+      </w:r>
+      <w:proofErr w:type="gramEnd"/>
+      <w:r>
+        <w:t xml:space="preserve"> red points in the graph below all </w:t>
+      </w:r>
+      <w:proofErr w:type="gramStart"/>
+      <w:r>
+        <w:t>belong</w:t>
       </w:r>
       <w:r>
         <w:t xml:space="preserve"> </w:t>
       </w:r>
       <w:r>
-        <w:t xml:space="preserve"> to sampling day </w:t>
+        <w:t xml:space="preserve"> to</w:t>
+      </w:r>
+      <w:proofErr w:type="gramEnd"/>
+      <w:r>
+        <w:t xml:space="preserve"> sampling day </w:t>
       </w:r>
       <w:r>
         <w:t>20210614</w:t>
@@ -1753,7 +1867,49 @@
         <w:rPr>
           <w:highlight w:val="yellow"/>
         </w:rPr>
-        <w:t>The final data for the mass flux calculations was taken from f0 and the missing data from “data error” from LR.f0. For N2O and CH4 all the data has to come from LR.f0.</w:t>
+        <w:t xml:space="preserve">The final data for the mass flux calculations was taken from f0 and the missing data from “data error” from </w:t>
+      </w:r>
+      <w:proofErr w:type="gramStart"/>
+      <w:r>
+        <w:rPr>
+          <w:highlight w:val="yellow"/>
+        </w:rPr>
+        <w:t>LR.f</w:t>
+      </w:r>
+      <w:proofErr w:type="gramEnd"/>
+      <w:r>
+        <w:rPr>
+          <w:highlight w:val="yellow"/>
+        </w:rPr>
+        <w:t xml:space="preserve">0. For N2O and CH4 all the data </w:t>
+      </w:r>
+      <w:proofErr w:type="gramStart"/>
+      <w:r>
+        <w:rPr>
+          <w:highlight w:val="yellow"/>
+        </w:rPr>
+        <w:t>has to</w:t>
+      </w:r>
+      <w:proofErr w:type="gramEnd"/>
+      <w:r>
+        <w:rPr>
+          <w:highlight w:val="yellow"/>
+        </w:rPr>
+        <w:t xml:space="preserve"> come from </w:t>
+      </w:r>
+      <w:proofErr w:type="gramStart"/>
+      <w:r>
+        <w:rPr>
+          <w:highlight w:val="yellow"/>
+        </w:rPr>
+        <w:t>LR.f</w:t>
+      </w:r>
+      <w:proofErr w:type="gramEnd"/>
+      <w:r>
+        <w:rPr>
+          <w:highlight w:val="yellow"/>
+        </w:rPr>
+        <w:t>0.</w:t>
       </w:r>
     </w:p>
     <w:p>
@@ -4115,6 +4271,7 @@
           <w14:ligatures w14:val="none"/>
         </w:rPr>
       </w:pPr>
+      <w:proofErr w:type="gramStart"/>
       <w:r>
         <w:rPr>
           <w:rFonts w:ascii="Lucida Console" w:eastAsia="Times New Roman" w:hAnsi="Lucida Console" w:cs="Courier New"/>
@@ -4124,7 +4281,32 @@
           <w:szCs w:val="20"/>
           <w14:ligatures w14:val="none"/>
         </w:rPr>
-        <w:t>summary(Cumm.Stat.Anal)</w:t>
+        <w:t>summary(</w:t>
+      </w:r>
+      <w:proofErr w:type="spellStart"/>
+      <w:r>
+        <w:rPr>
+          <w:rFonts w:ascii="Lucida Console" w:eastAsia="Times New Roman" w:hAnsi="Lucida Console" w:cs="Courier New"/>
+          <w:color w:val="0000FF"/>
+          <w:kern w:val="0"/>
+          <w:sz w:val="20"/>
+          <w:szCs w:val="20"/>
+          <w14:ligatures w14:val="none"/>
+        </w:rPr>
+        <w:t>Cumm.Stat.Anal</w:t>
+      </w:r>
+      <w:proofErr w:type="spellEnd"/>
+      <w:proofErr w:type="gramEnd"/>
+      <w:r>
+        <w:rPr>
+          <w:rFonts w:ascii="Lucida Console" w:eastAsia="Times New Roman" w:hAnsi="Lucida Console" w:cs="Courier New"/>
+          <w:color w:val="0000FF"/>
+          <w:kern w:val="0"/>
+          <w:sz w:val="20"/>
+          <w:szCs w:val="20"/>
+          <w14:ligatures w14:val="none"/>
+        </w:rPr>
+        <w:t>)</w:t>
       </w:r>
     </w:p>
     <w:p>
@@ -4240,6 +4422,8 @@
           <w14:ligatures w14:val="none"/>
         </w:rPr>
       </w:pPr>
+      <w:proofErr w:type="spellStart"/>
+      <w:proofErr w:type="gramStart"/>
       <w:r>
         <w:rPr>
           <w:rFonts w:ascii="Lucida Console" w:eastAsia="Times New Roman" w:hAnsi="Lucida Console" w:cs="Courier New"/>
@@ -4250,7 +4434,87 @@
           <w:bdr w:val="none" w:sz="0" w:space="0" w:color="auto" w:frame="1"/>
           <w14:ligatures w14:val="none"/>
         </w:rPr>
-        <w:t xml:space="preserve">lm(formula = Total.Cum.Emissions ~ BLOCK.F + Sampling.Year + </w:t>
+        <w:t>lm</w:t>
+      </w:r>
+      <w:proofErr w:type="spellEnd"/>
+      <w:r>
+        <w:rPr>
+          <w:rFonts w:ascii="Lucida Console" w:eastAsia="Times New Roman" w:hAnsi="Lucida Console" w:cs="Courier New"/>
+          <w:color w:val="000000"/>
+          <w:kern w:val="0"/>
+          <w:sz w:val="20"/>
+          <w:szCs w:val="20"/>
+          <w:bdr w:val="none" w:sz="0" w:space="0" w:color="auto" w:frame="1"/>
+          <w14:ligatures w14:val="none"/>
+        </w:rPr>
+        <w:t>(</w:t>
+      </w:r>
+      <w:proofErr w:type="gramEnd"/>
+      <w:r>
+        <w:rPr>
+          <w:rFonts w:ascii="Lucida Console" w:eastAsia="Times New Roman" w:hAnsi="Lucida Console" w:cs="Courier New"/>
+          <w:color w:val="000000"/>
+          <w:kern w:val="0"/>
+          <w:sz w:val="20"/>
+          <w:szCs w:val="20"/>
+          <w:bdr w:val="none" w:sz="0" w:space="0" w:color="auto" w:frame="1"/>
+          <w14:ligatures w14:val="none"/>
+        </w:rPr>
+        <w:t xml:space="preserve">formula = </w:t>
+      </w:r>
+      <w:proofErr w:type="spellStart"/>
+      <w:proofErr w:type="gramStart"/>
+      <w:r>
+        <w:rPr>
+          <w:rFonts w:ascii="Lucida Console" w:eastAsia="Times New Roman" w:hAnsi="Lucida Console" w:cs="Courier New"/>
+          <w:color w:val="000000"/>
+          <w:kern w:val="0"/>
+          <w:sz w:val="20"/>
+          <w:szCs w:val="20"/>
+          <w:bdr w:val="none" w:sz="0" w:space="0" w:color="auto" w:frame="1"/>
+          <w14:ligatures w14:val="none"/>
+        </w:rPr>
+        <w:t>Total.Cum.Emissions</w:t>
+      </w:r>
+      <w:proofErr w:type="spellEnd"/>
+      <w:proofErr w:type="gramEnd"/>
+      <w:r>
+        <w:rPr>
+          <w:rFonts w:ascii="Lucida Console" w:eastAsia="Times New Roman" w:hAnsi="Lucida Console" w:cs="Courier New"/>
+          <w:color w:val="000000"/>
+          <w:kern w:val="0"/>
+          <w:sz w:val="20"/>
+          <w:szCs w:val="20"/>
+          <w:bdr w:val="none" w:sz="0" w:space="0" w:color="auto" w:frame="1"/>
+          <w14:ligatures w14:val="none"/>
+        </w:rPr>
+        <w:t xml:space="preserve"> ~ BLOCK.F + </w:t>
+      </w:r>
+      <w:proofErr w:type="spellStart"/>
+      <w:r>
+        <w:rPr>
+          <w:rFonts w:ascii="Lucida Console" w:eastAsia="Times New Roman" w:hAnsi="Lucida Console" w:cs="Courier New"/>
+          <w:color w:val="000000"/>
+          <w:kern w:val="0"/>
+          <w:sz w:val="20"/>
+          <w:szCs w:val="20"/>
+          <w:bdr w:val="none" w:sz="0" w:space="0" w:color="auto" w:frame="1"/>
+          <w14:ligatures w14:val="none"/>
+        </w:rPr>
+        <w:t>Sampling.Year</w:t>
+      </w:r>
+      <w:proofErr w:type="spellEnd"/>
+      <w:r>
+        <w:rPr>
+          <w:rFonts w:ascii="Lucida Console" w:eastAsia="Times New Roman" w:hAnsi="Lucida Console" w:cs="Courier New"/>
+          <w:color w:val="000000"/>
+          <w:kern w:val="0"/>
+          <w:sz w:val="20"/>
+          <w:szCs w:val="20"/>
+          <w:bdr w:val="none" w:sz="0" w:space="0" w:color="auto" w:frame="1"/>
+          <w14:ligatures w14:val="none"/>
+        </w:rPr>
+        <w:t xml:space="preserve"> + </w:t>
       </w:r>
     </w:p>
     <w:p>
@@ -4296,7 +4560,85 @@
           <w:bdr w:val="none" w:sz="0" w:space="0" w:color="auto" w:frame="1"/>
           <w14:ligatures w14:val="none"/>
         </w:rPr>
-        <w:t xml:space="preserve">    CoverCrop.F + Treatment.F, data = Cumm.Emm.Analysis.2)</w:t>
+        <w:t xml:space="preserve">    </w:t>
+      </w:r>
+      <w:proofErr w:type="spellStart"/>
+      <w:r>
+        <w:rPr>
+          <w:rFonts w:ascii="Lucida Console" w:eastAsia="Times New Roman" w:hAnsi="Lucida Console" w:cs="Courier New"/>
+          <w:color w:val="000000"/>
+          <w:kern w:val="0"/>
+          <w:sz w:val="20"/>
+          <w:szCs w:val="20"/>
+          <w:bdr w:val="none" w:sz="0" w:space="0" w:color="auto" w:frame="1"/>
+          <w14:ligatures w14:val="none"/>
+        </w:rPr>
+        <w:t>CoverCrop.F</w:t>
+      </w:r>
+      <w:proofErr w:type="spellEnd"/>
+      <w:r>
+        <w:rPr>
+          <w:rFonts w:ascii="Lucida Console" w:eastAsia="Times New Roman" w:hAnsi="Lucida Console" w:cs="Courier New"/>
+          <w:color w:val="000000"/>
+          <w:kern w:val="0"/>
+          <w:sz w:val="20"/>
+          <w:szCs w:val="20"/>
+          <w:bdr w:val="none" w:sz="0" w:space="0" w:color="auto" w:frame="1"/>
+          <w14:ligatures w14:val="none"/>
+        </w:rPr>
+        <w:t xml:space="preserve"> + </w:t>
+      </w:r>
+      <w:proofErr w:type="spellStart"/>
+      <w:r>
+        <w:rPr>
+          <w:rFonts w:ascii="Lucida Console" w:eastAsia="Times New Roman" w:hAnsi="Lucida Console" w:cs="Courier New"/>
+          <w:color w:val="000000"/>
+          <w:kern w:val="0"/>
+          <w:sz w:val="20"/>
+          <w:szCs w:val="20"/>
+          <w:bdr w:val="none" w:sz="0" w:space="0" w:color="auto" w:frame="1"/>
+          <w14:ligatures w14:val="none"/>
+        </w:rPr>
+        <w:t>Treatment.F</w:t>
+      </w:r>
+      <w:proofErr w:type="spellEnd"/>
+      <w:r>
+        <w:rPr>
+          <w:rFonts w:ascii="Lucida Console" w:eastAsia="Times New Roman" w:hAnsi="Lucida Console" w:cs="Courier New"/>
+          <w:color w:val="000000"/>
+          <w:kern w:val="0"/>
+          <w:sz w:val="20"/>
+          <w:szCs w:val="20"/>
+          <w:bdr w:val="none" w:sz="0" w:space="0" w:color="auto" w:frame="1"/>
+          <w14:ligatures w14:val="none"/>
+        </w:rPr>
+        <w:t xml:space="preserve">, data = </w:t>
+      </w:r>
+      <w:proofErr w:type="gramStart"/>
+      <w:r>
+        <w:rPr>
+          <w:rFonts w:ascii="Lucida Console" w:eastAsia="Times New Roman" w:hAnsi="Lucida Console" w:cs="Courier New"/>
+          <w:color w:val="000000"/>
+          <w:kern w:val="0"/>
+          <w:sz w:val="20"/>
+          <w:szCs w:val="20"/>
+          <w:bdr w:val="none" w:sz="0" w:space="0" w:color="auto" w:frame="1"/>
+          <w14:ligatures w14:val="none"/>
+        </w:rPr>
+        <w:t>Cumm.Emm.Analysis</w:t>
+      </w:r>
+      <w:proofErr w:type="gramEnd"/>
+      <w:r>
+        <w:rPr>
+          <w:rFonts w:ascii="Lucida Console" w:eastAsia="Times New Roman" w:hAnsi="Lucida Console" w:cs="Courier New"/>
+          <w:color w:val="000000"/>
+          <w:kern w:val="0"/>
+          <w:sz w:val="20"/>
+          <w:szCs w:val="20"/>
+          <w:bdr w:val="none" w:sz="0" w:space="0" w:color="auto" w:frame="1"/>
+          <w14:ligatures w14:val="none"/>
+        </w:rPr>
+        <w:t>.2)</w:t>
       </w:r>
     </w:p>
     <w:p>
@@ -4422,7 +4764,33 @@
           <w:bdr w:val="none" w:sz="0" w:space="0" w:color="auto" w:frame="1"/>
           <w14:ligatures w14:val="none"/>
         </w:rPr>
-        <w:t xml:space="preserve">    Min      1Q  Median      3Q     Max </w:t>
+        <w:t xml:space="preserve">    Min      1</w:t>
+      </w:r>
+      <w:proofErr w:type="gramStart"/>
+      <w:r>
+        <w:rPr>
+          <w:rFonts w:ascii="Lucida Console" w:eastAsia="Times New Roman" w:hAnsi="Lucida Console" w:cs="Courier New"/>
+          <w:color w:val="000000"/>
+          <w:kern w:val="0"/>
+          <w:sz w:val="20"/>
+          <w:szCs w:val="20"/>
+          <w:bdr w:val="none" w:sz="0" w:space="0" w:color="auto" w:frame="1"/>
+          <w14:ligatures w14:val="none"/>
+        </w:rPr>
+        <w:t>Q  Median</w:t>
+      </w:r>
+      <w:proofErr w:type="gramEnd"/>
+      <w:r>
+        <w:rPr>
+          <w:rFonts w:ascii="Lucida Console" w:eastAsia="Times New Roman" w:hAnsi="Lucida Console" w:cs="Courier New"/>
+          <w:color w:val="000000"/>
+          <w:kern w:val="0"/>
+          <w:sz w:val="20"/>
+          <w:szCs w:val="20"/>
+          <w:bdr w:val="none" w:sz="0" w:space="0" w:color="auto" w:frame="1"/>
+          <w14:ligatures w14:val="none"/>
+        </w:rPr>
+        <w:t xml:space="preserve">      3Q     Max </w:t>
       </w:r>
     </w:p>
     <w:p>
@@ -4468,7 +4836,85 @@
           <w:bdr w:val="none" w:sz="0" w:space="0" w:color="auto" w:frame="1"/>
           <w14:ligatures w14:val="none"/>
         </w:rPr>
-        <w:t xml:space="preserve">-21.204  -7.452  -0.579   4.777  41.906 </w:t>
+        <w:t>-21.</w:t>
+      </w:r>
+      <w:proofErr w:type="gramStart"/>
+      <w:r>
+        <w:rPr>
+          <w:rFonts w:ascii="Lucida Console" w:eastAsia="Times New Roman" w:hAnsi="Lucida Console" w:cs="Courier New"/>
+          <w:color w:val="000000"/>
+          <w:kern w:val="0"/>
+          <w:sz w:val="20"/>
+          <w:szCs w:val="20"/>
+          <w:bdr w:val="none" w:sz="0" w:space="0" w:color="auto" w:frame="1"/>
+          <w14:ligatures w14:val="none"/>
+        </w:rPr>
+        <w:t>204  -</w:t>
+      </w:r>
+      <w:proofErr w:type="gramEnd"/>
+      <w:r>
+        <w:rPr>
+          <w:rFonts w:ascii="Lucida Console" w:eastAsia="Times New Roman" w:hAnsi="Lucida Console" w:cs="Courier New"/>
+          <w:color w:val="000000"/>
+          <w:kern w:val="0"/>
+          <w:sz w:val="20"/>
+          <w:szCs w:val="20"/>
+          <w:bdr w:val="none" w:sz="0" w:space="0" w:color="auto" w:frame="1"/>
+          <w14:ligatures w14:val="none"/>
+        </w:rPr>
+        <w:t>7.</w:t>
+      </w:r>
+      <w:proofErr w:type="gramStart"/>
+      <w:r>
+        <w:rPr>
+          <w:rFonts w:ascii="Lucida Console" w:eastAsia="Times New Roman" w:hAnsi="Lucida Console" w:cs="Courier New"/>
+          <w:color w:val="000000"/>
+          <w:kern w:val="0"/>
+          <w:sz w:val="20"/>
+          <w:szCs w:val="20"/>
+          <w:bdr w:val="none" w:sz="0" w:space="0" w:color="auto" w:frame="1"/>
+          <w14:ligatures w14:val="none"/>
+        </w:rPr>
+        <w:t>452  -</w:t>
+      </w:r>
+      <w:proofErr w:type="gramEnd"/>
+      <w:r>
+        <w:rPr>
+          <w:rFonts w:ascii="Lucida Console" w:eastAsia="Times New Roman" w:hAnsi="Lucida Console" w:cs="Courier New"/>
+          <w:color w:val="000000"/>
+          <w:kern w:val="0"/>
+          <w:sz w:val="20"/>
+          <w:szCs w:val="20"/>
+          <w:bdr w:val="none" w:sz="0" w:space="0" w:color="auto" w:frame="1"/>
+          <w14:ligatures w14:val="none"/>
+        </w:rPr>
+        <w:t xml:space="preserve">0.579   </w:t>
+      </w:r>
+      <w:proofErr w:type="gramStart"/>
+      <w:r>
+        <w:rPr>
+          <w:rFonts w:ascii="Lucida Console" w:eastAsia="Times New Roman" w:hAnsi="Lucida Console" w:cs="Courier New"/>
+          <w:color w:val="000000"/>
+          <w:kern w:val="0"/>
+          <w:sz w:val="20"/>
+          <w:szCs w:val="20"/>
+          <w:bdr w:val="none" w:sz="0" w:space="0" w:color="auto" w:frame="1"/>
+          <w14:ligatures w14:val="none"/>
+        </w:rPr>
+        <w:t>4.777  41.906</w:t>
+      </w:r>
+      <w:proofErr w:type="gramEnd"/>
+      <w:r>
+        <w:rPr>
+          <w:rFonts w:ascii="Lucida Console" w:eastAsia="Times New Roman" w:hAnsi="Lucida Console" w:cs="Courier New"/>
+          <w:color w:val="000000"/>
+          <w:kern w:val="0"/>
+          <w:sz w:val="20"/>
+          <w:szCs w:val="20"/>
+          <w:bdr w:val="none" w:sz="0" w:space="0" w:color="auto" w:frame="1"/>
+          <w14:ligatures w14:val="none"/>
+        </w:rPr>
+        <w:t xml:space="preserve"> </w:t>
       </w:r>
     </w:p>
     <w:p>
@@ -4594,7 +5040,33 @@
           <w:bdr w:val="none" w:sz="0" w:space="0" w:color="auto" w:frame="1"/>
           <w14:ligatures w14:val="none"/>
         </w:rPr>
-        <w:t xml:space="preserve">                  Estimate Std. Error t value Pr(&gt;|t|)    </w:t>
+        <w:t xml:space="preserve">                  Estimate Std. Error t value </w:t>
+      </w:r>
+      <w:proofErr w:type="spellStart"/>
+      <w:r>
+        <w:rPr>
+          <w:rFonts w:ascii="Lucida Console" w:eastAsia="Times New Roman" w:hAnsi="Lucida Console" w:cs="Courier New"/>
+          <w:color w:val="000000"/>
+          <w:kern w:val="0"/>
+          <w:sz w:val="20"/>
+          <w:szCs w:val="20"/>
+          <w:bdr w:val="none" w:sz="0" w:space="0" w:color="auto" w:frame="1"/>
+          <w14:ligatures w14:val="none"/>
+        </w:rPr>
+        <w:t>Pr</w:t>
+      </w:r>
+      <w:proofErr w:type="spellEnd"/>
+      <w:r>
+        <w:rPr>
+          <w:rFonts w:ascii="Lucida Console" w:eastAsia="Times New Roman" w:hAnsi="Lucida Console" w:cs="Courier New"/>
+          <w:color w:val="000000"/>
+          <w:kern w:val="0"/>
+          <w:sz w:val="20"/>
+          <w:szCs w:val="20"/>
+          <w:bdr w:val="none" w:sz="0" w:space="0" w:color="auto" w:frame="1"/>
+          <w14:ligatures w14:val="none"/>
+        </w:rPr>
+        <w:t xml:space="preserve">(&gt;|t|)    </w:t>
       </w:r>
     </w:p>
     <w:p>
@@ -4640,7 +5112,59 @@
           <w:bdr w:val="none" w:sz="0" w:space="0" w:color="auto" w:frame="1"/>
           <w14:ligatures w14:val="none"/>
         </w:rPr>
-        <w:t>(Intercept)        17.9614     3.9252   4.576    2e-05 ***</w:t>
+        <w:t>(</w:t>
+      </w:r>
+      <w:proofErr w:type="gramStart"/>
+      <w:r>
+        <w:rPr>
+          <w:rFonts w:ascii="Lucida Console" w:eastAsia="Times New Roman" w:hAnsi="Lucida Console" w:cs="Courier New"/>
+          <w:color w:val="000000"/>
+          <w:kern w:val="0"/>
+          <w:sz w:val="20"/>
+          <w:szCs w:val="20"/>
+          <w:bdr w:val="none" w:sz="0" w:space="0" w:color="auto" w:frame="1"/>
+          <w14:ligatures w14:val="none"/>
+        </w:rPr>
+        <w:t xml:space="preserve">Intercept)   </w:t>
+      </w:r>
+      <w:proofErr w:type="gramEnd"/>
+      <w:r>
+        <w:rPr>
+          <w:rFonts w:ascii="Lucida Console" w:eastAsia="Times New Roman" w:hAnsi="Lucida Console" w:cs="Courier New"/>
+          <w:color w:val="000000"/>
+          <w:kern w:val="0"/>
+          <w:sz w:val="20"/>
+          <w:szCs w:val="20"/>
+          <w:bdr w:val="none" w:sz="0" w:space="0" w:color="auto" w:frame="1"/>
+          <w14:ligatures w14:val="none"/>
+        </w:rPr>
+        <w:t xml:space="preserve">     17.9614     3.9252   4.576 </w:t>
+      </w:r>
+      <w:proofErr w:type="gramStart"/>
+      <w:r>
+        <w:rPr>
+          <w:rFonts w:ascii="Lucida Console" w:eastAsia="Times New Roman" w:hAnsi="Lucida Console" w:cs="Courier New"/>
+          <w:color w:val="000000"/>
+          <w:kern w:val="0"/>
+          <w:sz w:val="20"/>
+          <w:szCs w:val="20"/>
+          <w:bdr w:val="none" w:sz="0" w:space="0" w:color="auto" w:frame="1"/>
+          <w14:ligatures w14:val="none"/>
+        </w:rPr>
+        <w:t xml:space="preserve">   2e</w:t>
+      </w:r>
+      <w:proofErr w:type="gramEnd"/>
+      <w:r>
+        <w:rPr>
+          <w:rFonts w:ascii="Lucida Console" w:eastAsia="Times New Roman" w:hAnsi="Lucida Console" w:cs="Courier New"/>
+          <w:color w:val="000000"/>
+          <w:kern w:val="0"/>
+          <w:sz w:val="20"/>
+          <w:szCs w:val="20"/>
+          <w:bdr w:val="none" w:sz="0" w:space="0" w:color="auto" w:frame="1"/>
+          <w14:ligatures w14:val="none"/>
+        </w:rPr>
+        <w:t>-05 ***</w:t>
       </w:r>
     </w:p>
     <w:p>
@@ -4732,7 +5256,33 @@
           <w:bdr w:val="none" w:sz="0" w:space="0" w:color="auto" w:frame="1"/>
           <w14:ligatures w14:val="none"/>
         </w:rPr>
-        <w:t>BLOCK.F3          -14.7355     3.5916  -4.103 0.000109 ***</w:t>
+        <w:t xml:space="preserve">BLOCK.F3          -14.7355     </w:t>
+      </w:r>
+      <w:proofErr w:type="gramStart"/>
+      <w:r>
+        <w:rPr>
+          <w:rFonts w:ascii="Lucida Console" w:eastAsia="Times New Roman" w:hAnsi="Lucida Console" w:cs="Courier New"/>
+          <w:color w:val="000000"/>
+          <w:kern w:val="0"/>
+          <w:sz w:val="20"/>
+          <w:szCs w:val="20"/>
+          <w:bdr w:val="none" w:sz="0" w:space="0" w:color="auto" w:frame="1"/>
+          <w14:ligatures w14:val="none"/>
+        </w:rPr>
+        <w:t>3.5916  -</w:t>
+      </w:r>
+      <w:proofErr w:type="gramEnd"/>
+      <w:r>
+        <w:rPr>
+          <w:rFonts w:ascii="Lucida Console" w:eastAsia="Times New Roman" w:hAnsi="Lucida Console" w:cs="Courier New"/>
+          <w:color w:val="000000"/>
+          <w:kern w:val="0"/>
+          <w:sz w:val="20"/>
+          <w:szCs w:val="20"/>
+          <w:bdr w:val="none" w:sz="0" w:space="0" w:color="auto" w:frame="1"/>
+          <w14:ligatures w14:val="none"/>
+        </w:rPr>
+        <w:t>4.103 0.000109 ***</w:t>
       </w:r>
     </w:p>
     <w:p>
@@ -4778,7 +5328,33 @@
           <w:bdr w:val="none" w:sz="0" w:space="0" w:color="auto" w:frame="1"/>
           <w14:ligatures w14:val="none"/>
         </w:rPr>
-        <w:t xml:space="preserve">BLOCK.F4          -12.3094     3.5916  -3.427 0.001025 ** </w:t>
+        <w:t xml:space="preserve">BLOCK.F4          -12.3094     </w:t>
+      </w:r>
+      <w:proofErr w:type="gramStart"/>
+      <w:r>
+        <w:rPr>
+          <w:rFonts w:ascii="Lucida Console" w:eastAsia="Times New Roman" w:hAnsi="Lucida Console" w:cs="Courier New"/>
+          <w:color w:val="000000"/>
+          <w:kern w:val="0"/>
+          <w:sz w:val="20"/>
+          <w:szCs w:val="20"/>
+          <w:bdr w:val="none" w:sz="0" w:space="0" w:color="auto" w:frame="1"/>
+          <w14:ligatures w14:val="none"/>
+        </w:rPr>
+        <w:t>3.5916  -</w:t>
+      </w:r>
+      <w:proofErr w:type="gramEnd"/>
+      <w:r>
+        <w:rPr>
+          <w:rFonts w:ascii="Lucida Console" w:eastAsia="Times New Roman" w:hAnsi="Lucida Console" w:cs="Courier New"/>
+          <w:color w:val="000000"/>
+          <w:kern w:val="0"/>
+          <w:sz w:val="20"/>
+          <w:szCs w:val="20"/>
+          <w:bdr w:val="none" w:sz="0" w:space="0" w:color="auto" w:frame="1"/>
+          <w14:ligatures w14:val="none"/>
+        </w:rPr>
+        <w:t xml:space="preserve">3.427 0.001025 ** </w:t>
       </w:r>
     </w:p>
     <w:p>
@@ -4824,7 +5400,59 @@
           <w:bdr w:val="none" w:sz="0" w:space="0" w:color="auto" w:frame="1"/>
           <w14:ligatures w14:val="none"/>
         </w:rPr>
-        <w:t>Sampling.Year2022  -9.7553     2.5396  -3.841 0.000266 ***</w:t>
+        <w:t>Sampling.Year</w:t>
+      </w:r>
+      <w:proofErr w:type="gramStart"/>
+      <w:r>
+        <w:rPr>
+          <w:rFonts w:ascii="Lucida Console" w:eastAsia="Times New Roman" w:hAnsi="Lucida Console" w:cs="Courier New"/>
+          <w:color w:val="000000"/>
+          <w:kern w:val="0"/>
+          <w:sz w:val="20"/>
+          <w:szCs w:val="20"/>
+          <w:bdr w:val="none" w:sz="0" w:space="0" w:color="auto" w:frame="1"/>
+          <w14:ligatures w14:val="none"/>
+        </w:rPr>
+        <w:t>2022  -</w:t>
+      </w:r>
+      <w:proofErr w:type="gramEnd"/>
+      <w:r>
+        <w:rPr>
+          <w:rFonts w:ascii="Lucida Console" w:eastAsia="Times New Roman" w:hAnsi="Lucida Console" w:cs="Courier New"/>
+          <w:color w:val="000000"/>
+          <w:kern w:val="0"/>
+          <w:sz w:val="20"/>
+          <w:szCs w:val="20"/>
+          <w:bdr w:val="none" w:sz="0" w:space="0" w:color="auto" w:frame="1"/>
+          <w14:ligatures w14:val="none"/>
+        </w:rPr>
+        <w:t xml:space="preserve">9.7553     </w:t>
+      </w:r>
+      <w:proofErr w:type="gramStart"/>
+      <w:r>
+        <w:rPr>
+          <w:rFonts w:ascii="Lucida Console" w:eastAsia="Times New Roman" w:hAnsi="Lucida Console" w:cs="Courier New"/>
+          <w:color w:val="000000"/>
+          <w:kern w:val="0"/>
+          <w:sz w:val="20"/>
+          <w:szCs w:val="20"/>
+          <w:bdr w:val="none" w:sz="0" w:space="0" w:color="auto" w:frame="1"/>
+          <w14:ligatures w14:val="none"/>
+        </w:rPr>
+        <w:t>2.5396  -</w:t>
+      </w:r>
+      <w:proofErr w:type="gramEnd"/>
+      <w:r>
+        <w:rPr>
+          <w:rFonts w:ascii="Lucida Console" w:eastAsia="Times New Roman" w:hAnsi="Lucida Console" w:cs="Courier New"/>
+          <w:color w:val="000000"/>
+          <w:kern w:val="0"/>
+          <w:sz w:val="20"/>
+          <w:szCs w:val="20"/>
+          <w:bdr w:val="none" w:sz="0" w:space="0" w:color="auto" w:frame="1"/>
+          <w14:ligatures w14:val="none"/>
+        </w:rPr>
+        <w:t>3.841 0.000266 ***</w:t>
       </w:r>
     </w:p>
     <w:p>
@@ -4860,6 +5488,7 @@
           <w14:ligatures w14:val="none"/>
         </w:rPr>
       </w:pPr>
+      <w:proofErr w:type="spellStart"/>
       <w:r>
         <w:rPr>
           <w:rFonts w:ascii="Lucida Console" w:eastAsia="Times New Roman" w:hAnsi="Lucida Console" w:cs="Courier New"/>
@@ -4870,7 +5499,20 @@
           <w:bdr w:val="none" w:sz="0" w:space="0" w:color="auto" w:frame="1"/>
           <w14:ligatures w14:val="none"/>
         </w:rPr>
-        <w:t xml:space="preserve">CoverCrop.FClover   3.1667     3.2786   0.966 0.337437    </w:t>
+        <w:t>CoverCrop.FClover</w:t>
+      </w:r>
+      <w:proofErr w:type="spellEnd"/>
+      <w:r>
+        <w:rPr>
+          <w:rFonts w:ascii="Lucida Console" w:eastAsia="Times New Roman" w:hAnsi="Lucida Console" w:cs="Courier New"/>
+          <w:color w:val="000000"/>
+          <w:kern w:val="0"/>
+          <w:sz w:val="20"/>
+          <w:szCs w:val="20"/>
+          <w:bdr w:val="none" w:sz="0" w:space="0" w:color="auto" w:frame="1"/>
+          <w14:ligatures w14:val="none"/>
+        </w:rPr>
+        <w:t xml:space="preserve">   3.1667     3.2786   0.966 0.337437    </w:t>
       </w:r>
     </w:p>
     <w:p>
@@ -4906,6 +5548,7 @@
           <w14:ligatures w14:val="none"/>
         </w:rPr>
       </w:pPr>
+      <w:proofErr w:type="spellStart"/>
       <w:r>
         <w:rPr>
           <w:rFonts w:ascii="Lucida Console" w:eastAsia="Times New Roman" w:hAnsi="Lucida Console" w:cs="Courier New"/>
@@ -4916,7 +5559,46 @@
           <w:bdr w:val="none" w:sz="0" w:space="0" w:color="auto" w:frame="1"/>
           <w14:ligatures w14:val="none"/>
         </w:rPr>
-        <w:t xml:space="preserve">CoverCrop.FTrit    -0.4087     3.2786  -0.125 0.901165    </w:t>
+        <w:t>CoverCrop.FTrit</w:t>
+      </w:r>
+      <w:proofErr w:type="spellEnd"/>
+      <w:r>
+        <w:rPr>
+          <w:rFonts w:ascii="Lucida Console" w:eastAsia="Times New Roman" w:hAnsi="Lucida Console" w:cs="Courier New"/>
+          <w:color w:val="000000"/>
+          <w:kern w:val="0"/>
+          <w:sz w:val="20"/>
+          <w:szCs w:val="20"/>
+          <w:bdr w:val="none" w:sz="0" w:space="0" w:color="auto" w:frame="1"/>
+          <w14:ligatures w14:val="none"/>
+        </w:rPr>
+        <w:t xml:space="preserve">    -0.4087     </w:t>
+      </w:r>
+      <w:proofErr w:type="gramStart"/>
+      <w:r>
+        <w:rPr>
+          <w:rFonts w:ascii="Lucida Console" w:eastAsia="Times New Roman" w:hAnsi="Lucida Console" w:cs="Courier New"/>
+          <w:color w:val="000000"/>
+          <w:kern w:val="0"/>
+          <w:sz w:val="20"/>
+          <w:szCs w:val="20"/>
+          <w:bdr w:val="none" w:sz="0" w:space="0" w:color="auto" w:frame="1"/>
+          <w14:ligatures w14:val="none"/>
+        </w:rPr>
+        <w:t>3.2786  -</w:t>
+      </w:r>
+      <w:proofErr w:type="gramEnd"/>
+      <w:r>
+        <w:rPr>
+          <w:rFonts w:ascii="Lucida Console" w:eastAsia="Times New Roman" w:hAnsi="Lucida Console" w:cs="Courier New"/>
+          <w:color w:val="000000"/>
+          <w:kern w:val="0"/>
+          <w:sz w:val="20"/>
+          <w:szCs w:val="20"/>
+          <w:bdr w:val="none" w:sz="0" w:space="0" w:color="auto" w:frame="1"/>
+          <w14:ligatures w14:val="none"/>
+        </w:rPr>
+        <w:t xml:space="preserve">0.125 0.901165    </w:t>
       </w:r>
     </w:p>
     <w:p>
@@ -4952,6 +5634,7 @@
           <w14:ligatures w14:val="none"/>
         </w:rPr>
       </w:pPr>
+      <w:proofErr w:type="spellStart"/>
       <w:r>
         <w:rPr>
           <w:rFonts w:ascii="Lucida Console" w:eastAsia="Times New Roman" w:hAnsi="Lucida Console" w:cs="Courier New"/>
@@ -4962,7 +5645,46 @@
           <w:bdr w:val="none" w:sz="0" w:space="0" w:color="auto" w:frame="1"/>
           <w14:ligatures w14:val="none"/>
         </w:rPr>
-        <w:t xml:space="preserve">Treatment.FB        6.2892     3.2786   1.918 0.059162 .  </w:t>
+        <w:t>Treatment.FB</w:t>
+      </w:r>
+      <w:proofErr w:type="spellEnd"/>
+      <w:r>
+        <w:rPr>
+          <w:rFonts w:ascii="Lucida Console" w:eastAsia="Times New Roman" w:hAnsi="Lucida Console" w:cs="Courier New"/>
+          <w:color w:val="000000"/>
+          <w:kern w:val="0"/>
+          <w:sz w:val="20"/>
+          <w:szCs w:val="20"/>
+          <w:bdr w:val="none" w:sz="0" w:space="0" w:color="auto" w:frame="1"/>
+          <w14:ligatures w14:val="none"/>
+        </w:rPr>
+        <w:t xml:space="preserve">        6.2892     3.2786   1.918 0.</w:t>
+      </w:r>
+      <w:proofErr w:type="gramStart"/>
+      <w:r>
+        <w:rPr>
+          <w:rFonts w:ascii="Lucida Console" w:eastAsia="Times New Roman" w:hAnsi="Lucida Console" w:cs="Courier New"/>
+          <w:color w:val="000000"/>
+          <w:kern w:val="0"/>
+          <w:sz w:val="20"/>
+          <w:szCs w:val="20"/>
+          <w:bdr w:val="none" w:sz="0" w:space="0" w:color="auto" w:frame="1"/>
+          <w14:ligatures w14:val="none"/>
+        </w:rPr>
+        <w:t>059162 .</w:t>
+      </w:r>
+      <w:proofErr w:type="gramEnd"/>
+      <w:r>
+        <w:rPr>
+          <w:rFonts w:ascii="Lucida Console" w:eastAsia="Times New Roman" w:hAnsi="Lucida Console" w:cs="Courier New"/>
+          <w:color w:val="000000"/>
+          <w:kern w:val="0"/>
+          <w:sz w:val="20"/>
+          <w:szCs w:val="20"/>
+          <w:bdr w:val="none" w:sz="0" w:space="0" w:color="auto" w:frame="1"/>
+          <w14:ligatures w14:val="none"/>
+        </w:rPr>
+        <w:t xml:space="preserve">  </w:t>
       </w:r>
     </w:p>
     <w:p>
@@ -4998,6 +5720,7 @@
           <w14:ligatures w14:val="none"/>
         </w:rPr>
       </w:pPr>
+      <w:proofErr w:type="spellStart"/>
       <w:r>
         <w:rPr>
           <w:rFonts w:ascii="Lucida Console" w:eastAsia="Times New Roman" w:hAnsi="Lucida Console" w:cs="Courier New"/>
@@ -5008,7 +5731,20 @@
           <w:bdr w:val="none" w:sz="0" w:space="0" w:color="auto" w:frame="1"/>
           <w14:ligatures w14:val="none"/>
         </w:rPr>
-        <w:t xml:space="preserve">Treatment.FC        4.1102     3.2786   1.254 0.214146    </w:t>
+        <w:t>Treatment.FC</w:t>
+      </w:r>
+      <w:proofErr w:type="spellEnd"/>
+      <w:r>
+        <w:rPr>
+          <w:rFonts w:ascii="Lucida Console" w:eastAsia="Times New Roman" w:hAnsi="Lucida Console" w:cs="Courier New"/>
+          <w:color w:val="000000"/>
+          <w:kern w:val="0"/>
+          <w:sz w:val="20"/>
+          <w:szCs w:val="20"/>
+          <w:bdr w:val="none" w:sz="0" w:space="0" w:color="auto" w:frame="1"/>
+          <w14:ligatures w14:val="none"/>
+        </w:rPr>
+        <w:t xml:space="preserve">        4.1102     3.2786   1.254 0.214146    </w:t>
       </w:r>
     </w:p>
     <w:p>
@@ -5044,6 +5780,7 @@
           <w14:ligatures w14:val="none"/>
         </w:rPr>
       </w:pPr>
+      <w:proofErr w:type="spellStart"/>
       <w:r>
         <w:rPr>
           <w:rFonts w:ascii="Lucida Console" w:eastAsia="Times New Roman" w:hAnsi="Lucida Console" w:cs="Courier New"/>
@@ -5054,7 +5791,46 @@
           <w:bdr w:val="none" w:sz="0" w:space="0" w:color="auto" w:frame="1"/>
           <w14:ligatures w14:val="none"/>
         </w:rPr>
-        <w:t xml:space="preserve">Treatment.FD       -0.8080     5.0082  -0.161 0.872300    </w:t>
+        <w:t>Treatment.FD</w:t>
+      </w:r>
+      <w:proofErr w:type="spellEnd"/>
+      <w:r>
+        <w:rPr>
+          <w:rFonts w:ascii="Lucida Console" w:eastAsia="Times New Roman" w:hAnsi="Lucida Console" w:cs="Courier New"/>
+          <w:color w:val="000000"/>
+          <w:kern w:val="0"/>
+          <w:sz w:val="20"/>
+          <w:szCs w:val="20"/>
+          <w:bdr w:val="none" w:sz="0" w:space="0" w:color="auto" w:frame="1"/>
+          <w14:ligatures w14:val="none"/>
+        </w:rPr>
+        <w:t xml:space="preserve">       -0.8080     </w:t>
+      </w:r>
+      <w:proofErr w:type="gramStart"/>
+      <w:r>
+        <w:rPr>
+          <w:rFonts w:ascii="Lucida Console" w:eastAsia="Times New Roman" w:hAnsi="Lucida Console" w:cs="Courier New"/>
+          <w:color w:val="000000"/>
+          <w:kern w:val="0"/>
+          <w:sz w:val="20"/>
+          <w:szCs w:val="20"/>
+          <w:bdr w:val="none" w:sz="0" w:space="0" w:color="auto" w:frame="1"/>
+          <w14:ligatures w14:val="none"/>
+        </w:rPr>
+        <w:t>5.0082  -</w:t>
+      </w:r>
+      <w:proofErr w:type="gramEnd"/>
+      <w:r>
+        <w:rPr>
+          <w:rFonts w:ascii="Lucida Console" w:eastAsia="Times New Roman" w:hAnsi="Lucida Console" w:cs="Courier New"/>
+          <w:color w:val="000000"/>
+          <w:kern w:val="0"/>
+          <w:sz w:val="20"/>
+          <w:szCs w:val="20"/>
+          <w:bdr w:val="none" w:sz="0" w:space="0" w:color="auto" w:frame="1"/>
+          <w14:ligatures w14:val="none"/>
+        </w:rPr>
+        <w:t xml:space="preserve">0.161 0.872300    </w:t>
       </w:r>
     </w:p>
     <w:p>
@@ -5136,6 +5912,7 @@
           <w14:ligatures w14:val="none"/>
         </w:rPr>
       </w:pPr>
+      <w:proofErr w:type="spellStart"/>
       <w:r>
         <w:rPr>
           <w:rFonts w:ascii="Lucida Console" w:eastAsia="Times New Roman" w:hAnsi="Lucida Console" w:cs="Courier New"/>
@@ -5146,7 +5923,124 @@
           <w:bdr w:val="none" w:sz="0" w:space="0" w:color="auto" w:frame="1"/>
           <w14:ligatures w14:val="none"/>
         </w:rPr>
-        <w:t>Signif. codes:  0 ‘***’ 0.001 ‘**’ 0.01 ‘*’ 0.05 ‘.’ 0.1 ‘ ’ 1</w:t>
+        <w:t>Signif</w:t>
+      </w:r>
+      <w:proofErr w:type="spellEnd"/>
+      <w:r>
+        <w:rPr>
+          <w:rFonts w:ascii="Lucida Console" w:eastAsia="Times New Roman" w:hAnsi="Lucida Console" w:cs="Courier New"/>
+          <w:color w:val="000000"/>
+          <w:kern w:val="0"/>
+          <w:sz w:val="20"/>
+          <w:szCs w:val="20"/>
+          <w:bdr w:val="none" w:sz="0" w:space="0" w:color="auto" w:frame="1"/>
+          <w14:ligatures w14:val="none"/>
+        </w:rPr>
+        <w:t>. codes</w:t>
+      </w:r>
+      <w:proofErr w:type="gramStart"/>
+      <w:r>
+        <w:rPr>
+          <w:rFonts w:ascii="Lucida Console" w:eastAsia="Times New Roman" w:hAnsi="Lucida Console" w:cs="Courier New"/>
+          <w:color w:val="000000"/>
+          <w:kern w:val="0"/>
+          <w:sz w:val="20"/>
+          <w:szCs w:val="20"/>
+          <w:bdr w:val="none" w:sz="0" w:space="0" w:color="auto" w:frame="1"/>
+          <w14:ligatures w14:val="none"/>
+        </w:rPr>
+        <w:t>:  0 ‘</w:t>
+      </w:r>
+      <w:proofErr w:type="gramEnd"/>
+      <w:r>
+        <w:rPr>
+          <w:rFonts w:ascii="Lucida Console" w:eastAsia="Times New Roman" w:hAnsi="Lucida Console" w:cs="Courier New"/>
+          <w:color w:val="000000"/>
+          <w:kern w:val="0"/>
+          <w:sz w:val="20"/>
+          <w:szCs w:val="20"/>
+          <w:bdr w:val="none" w:sz="0" w:space="0" w:color="auto" w:frame="1"/>
+          <w14:ligatures w14:val="none"/>
+        </w:rPr>
+        <w:t xml:space="preserve">***’ </w:t>
+      </w:r>
+      <w:proofErr w:type="gramStart"/>
+      <w:r>
+        <w:rPr>
+          <w:rFonts w:ascii="Lucida Console" w:eastAsia="Times New Roman" w:hAnsi="Lucida Console" w:cs="Courier New"/>
+          <w:color w:val="000000"/>
+          <w:kern w:val="0"/>
+          <w:sz w:val="20"/>
+          <w:szCs w:val="20"/>
+          <w:bdr w:val="none" w:sz="0" w:space="0" w:color="auto" w:frame="1"/>
+          <w14:ligatures w14:val="none"/>
+        </w:rPr>
+        <w:t>0.001 ‘*</w:t>
+      </w:r>
+      <w:proofErr w:type="gramEnd"/>
+      <w:r>
+        <w:rPr>
+          <w:rFonts w:ascii="Lucida Console" w:eastAsia="Times New Roman" w:hAnsi="Lucida Console" w:cs="Courier New"/>
+          <w:color w:val="000000"/>
+          <w:kern w:val="0"/>
+          <w:sz w:val="20"/>
+          <w:szCs w:val="20"/>
+          <w:bdr w:val="none" w:sz="0" w:space="0" w:color="auto" w:frame="1"/>
+          <w14:ligatures w14:val="none"/>
+        </w:rPr>
+        <w:t xml:space="preserve">*’ </w:t>
+      </w:r>
+      <w:proofErr w:type="gramStart"/>
+      <w:r>
+        <w:rPr>
+          <w:rFonts w:ascii="Lucida Console" w:eastAsia="Times New Roman" w:hAnsi="Lucida Console" w:cs="Courier New"/>
+          <w:color w:val="000000"/>
+          <w:kern w:val="0"/>
+          <w:sz w:val="20"/>
+          <w:szCs w:val="20"/>
+          <w:bdr w:val="none" w:sz="0" w:space="0" w:color="auto" w:frame="1"/>
+          <w14:ligatures w14:val="none"/>
+        </w:rPr>
+        <w:t>0.01 ‘*</w:t>
+      </w:r>
+      <w:proofErr w:type="gramEnd"/>
+      <w:r>
+        <w:rPr>
+          <w:rFonts w:ascii="Lucida Console" w:eastAsia="Times New Roman" w:hAnsi="Lucida Console" w:cs="Courier New"/>
+          <w:color w:val="000000"/>
+          <w:kern w:val="0"/>
+          <w:sz w:val="20"/>
+          <w:szCs w:val="20"/>
+          <w:bdr w:val="none" w:sz="0" w:space="0" w:color="auto" w:frame="1"/>
+          <w14:ligatures w14:val="none"/>
+        </w:rPr>
+        <w:t xml:space="preserve">’ 0.05 ‘.’ 0.1 </w:t>
+      </w:r>
+      <w:proofErr w:type="gramStart"/>
+      <w:r>
+        <w:rPr>
+          <w:rFonts w:ascii="Lucida Console" w:eastAsia="Times New Roman" w:hAnsi="Lucida Console" w:cs="Courier New"/>
+          <w:color w:val="000000"/>
+          <w:kern w:val="0"/>
+          <w:sz w:val="20"/>
+          <w:szCs w:val="20"/>
+          <w:bdr w:val="none" w:sz="0" w:space="0" w:color="auto" w:frame="1"/>
+          <w14:ligatures w14:val="none"/>
+        </w:rPr>
+        <w:t>‘ ’</w:t>
+      </w:r>
+      <w:proofErr w:type="gramEnd"/>
+      <w:r>
+        <w:rPr>
+          <w:rFonts w:ascii="Lucida Console" w:eastAsia="Times New Roman" w:hAnsi="Lucida Console" w:cs="Courier New"/>
+          <w:color w:val="000000"/>
+          <w:kern w:val="0"/>
+          <w:sz w:val="20"/>
+          <w:szCs w:val="20"/>
+          <w:bdr w:val="none" w:sz="0" w:space="0" w:color="auto" w:frame="1"/>
+          <w14:ligatures w14:val="none"/>
+        </w:rPr>
+        <w:t xml:space="preserve"> 1</w:t>
       </w:r>
     </w:p>
     <w:p>
@@ -5272,8 +6166,9 @@
           <w:bdr w:val="none" w:sz="0" w:space="0" w:color="auto" w:frame="1"/>
           <w14:ligatures w14:val="none"/>
         </w:rPr>
-        <w:t>Multiple R-squared:  0.4307,</w:t>
-      </w:r>
+        <w:t>Multiple R-squared</w:t>
+      </w:r>
+      <w:proofErr w:type="gramStart"/>
       <w:r>
         <w:rPr>
           <w:rFonts w:ascii="Lucida Console" w:eastAsia="Times New Roman" w:hAnsi="Lucida Console" w:cs="Courier New"/>
@@ -5284,8 +6179,59 @@
           <w:bdr w:val="none" w:sz="0" w:space="0" w:color="auto" w:frame="1"/>
           <w14:ligatures w14:val="none"/>
         </w:rPr>
+        <w:t>:  0.4307</w:t>
+      </w:r>
+      <w:proofErr w:type="gramEnd"/>
+      <w:r>
+        <w:rPr>
+          <w:rFonts w:ascii="Lucida Console" w:eastAsia="Times New Roman" w:hAnsi="Lucida Console" w:cs="Courier New"/>
+          <w:color w:val="000000"/>
+          <w:kern w:val="0"/>
+          <w:sz w:val="20"/>
+          <w:szCs w:val="20"/>
+          <w:bdr w:val="none" w:sz="0" w:space="0" w:color="auto" w:frame="1"/>
+          <w14:ligatures w14:val="none"/>
+        </w:rPr>
+        <w:t>,</w:t>
+      </w:r>
+      <w:r>
+        <w:rPr>
+          <w:rFonts w:ascii="Lucida Console" w:eastAsia="Times New Roman" w:hAnsi="Lucida Console" w:cs="Courier New"/>
+          <w:color w:val="000000"/>
+          <w:kern w:val="0"/>
+          <w:sz w:val="20"/>
+          <w:szCs w:val="20"/>
+          <w:bdr w:val="none" w:sz="0" w:space="0" w:color="auto" w:frame="1"/>
+          <w14:ligatures w14:val="none"/>
+        </w:rPr>
         <w:tab/>
-        <w:t xml:space="preserve">Adjusted R-squared:  0.3575 </w:t>
+        <w:t>Adjusted R-squared</w:t>
+      </w:r>
+      <w:proofErr w:type="gramStart"/>
+      <w:r>
+        <w:rPr>
+          <w:rFonts w:ascii="Lucida Console" w:eastAsia="Times New Roman" w:hAnsi="Lucida Console" w:cs="Courier New"/>
+          <w:color w:val="000000"/>
+          <w:kern w:val="0"/>
+          <w:sz w:val="20"/>
+          <w:szCs w:val="20"/>
+          <w:bdr w:val="none" w:sz="0" w:space="0" w:color="auto" w:frame="1"/>
+          <w14:ligatures w14:val="none"/>
+        </w:rPr>
+        <w:t>:  0.3575</w:t>
+      </w:r>
+      <w:proofErr w:type="gramEnd"/>
+      <w:r>
+        <w:rPr>
+          <w:rFonts w:ascii="Lucida Console" w:eastAsia="Times New Roman" w:hAnsi="Lucida Console" w:cs="Courier New"/>
+          <w:color w:val="000000"/>
+          <w:kern w:val="0"/>
+          <w:sz w:val="20"/>
+          <w:szCs w:val="20"/>
+          <w:bdr w:val="none" w:sz="0" w:space="0" w:color="auto" w:frame="1"/>
+          <w14:ligatures w14:val="none"/>
+        </w:rPr>
+        <w:t xml:space="preserve"> </w:t>
       </w:r>
     </w:p>
     <w:p>
@@ -5331,7 +6277,33 @@
           <w:bdr w:val="none" w:sz="0" w:space="0" w:color="auto" w:frame="1"/>
           <w14:ligatures w14:val="none"/>
         </w:rPr>
-        <w:t>F-statistic: 5.883 on 9 and 70 DF,  p-value: 4.438e-06</w:t>
+        <w:t xml:space="preserve">F-statistic: 5.883 on 9 and 70 </w:t>
+      </w:r>
+      <w:proofErr w:type="gramStart"/>
+      <w:r>
+        <w:rPr>
+          <w:rFonts w:ascii="Lucida Console" w:eastAsia="Times New Roman" w:hAnsi="Lucida Console" w:cs="Courier New"/>
+          <w:color w:val="000000"/>
+          <w:kern w:val="0"/>
+          <w:sz w:val="20"/>
+          <w:szCs w:val="20"/>
+          <w:bdr w:val="none" w:sz="0" w:space="0" w:color="auto" w:frame="1"/>
+          <w14:ligatures w14:val="none"/>
+        </w:rPr>
+        <w:t>DF,  p</w:t>
+      </w:r>
+      <w:proofErr w:type="gramEnd"/>
+      <w:r>
+        <w:rPr>
+          <w:rFonts w:ascii="Lucida Console" w:eastAsia="Times New Roman" w:hAnsi="Lucida Console" w:cs="Courier New"/>
+          <w:color w:val="000000"/>
+          <w:kern w:val="0"/>
+          <w:sz w:val="20"/>
+          <w:szCs w:val="20"/>
+          <w:bdr w:val="none" w:sz="0" w:space="0" w:color="auto" w:frame="1"/>
+          <w14:ligatures w14:val="none"/>
+        </w:rPr>
+        <w:t>-value: 4.438e-06</w:t>
       </w:r>
     </w:p>
     <w:p>
@@ -5413,13 +6385,43 @@
           <w:color w:val="0000FF"/>
         </w:rPr>
       </w:pPr>
+      <w:proofErr w:type="spellStart"/>
+      <w:proofErr w:type="gramStart"/>
       <w:r>
         <w:rPr>
           <w:rStyle w:val="gnvwddmdb3b"/>
           <w:rFonts w:ascii="Lucida Console" w:hAnsi="Lucida Console"/>
           <w:color w:val="0000FF"/>
         </w:rPr>
-        <w:t>anova(Cumm.Stat.Anal)</w:t>
+        <w:t>anova</w:t>
+      </w:r>
+      <w:proofErr w:type="spellEnd"/>
+      <w:r>
+        <w:rPr>
+          <w:rStyle w:val="gnvwddmdb3b"/>
+          <w:rFonts w:ascii="Lucida Console" w:hAnsi="Lucida Console"/>
+          <w:color w:val="0000FF"/>
+        </w:rPr>
+        <w:t>(</w:t>
+      </w:r>
+      <w:proofErr w:type="spellStart"/>
+      <w:r>
+        <w:rPr>
+          <w:rStyle w:val="gnvwddmdb3b"/>
+          <w:rFonts w:ascii="Lucida Console" w:hAnsi="Lucida Console"/>
+          <w:color w:val="0000FF"/>
+        </w:rPr>
+        <w:t>Cumm.Stat.Anal</w:t>
+      </w:r>
+      <w:proofErr w:type="spellEnd"/>
+      <w:proofErr w:type="gramEnd"/>
+      <w:r>
+        <w:rPr>
+          <w:rStyle w:val="gnvwddmdb3b"/>
+          <w:rFonts w:ascii="Lucida Console" w:hAnsi="Lucida Console"/>
+          <w:color w:val="0000FF"/>
+        </w:rPr>
+        <w:t>)</w:t>
       </w:r>
     </w:p>
     <w:p>
@@ -5476,8 +6478,21 @@
           <w:color w:val="000000"/>
           <w:bdr w:val="none" w:sz="0" w:space="0" w:color="auto" w:frame="1"/>
         </w:rPr>
-        <w:t>Response: Total.Cum.Emissions</w:t>
-      </w:r>
+        <w:t xml:space="preserve">Response: </w:t>
+      </w:r>
+      <w:proofErr w:type="spellStart"/>
+      <w:proofErr w:type="gramStart"/>
+      <w:r>
+        <w:rPr>
+          <w:rStyle w:val="gnvwddmdl3b"/>
+          <w:rFonts w:ascii="Lucida Console" w:hAnsi="Lucida Console"/>
+          <w:color w:val="000000"/>
+          <w:bdr w:val="none" w:sz="0" w:space="0" w:color="auto" w:frame="1"/>
+        </w:rPr>
+        <w:t>Total.Cum.Emissions</w:t>
+      </w:r>
+      <w:proofErr w:type="spellEnd"/>
+      <w:proofErr w:type="gramEnd"/>
     </w:p>
     <w:p>
       <w:pPr>
@@ -5498,7 +6513,67 @@
           <w:color w:val="000000"/>
           <w:bdr w:val="none" w:sz="0" w:space="0" w:color="auto" w:frame="1"/>
         </w:rPr>
-        <w:t xml:space="preserve">              Df Sum Sq Mean Sq F value    Pr(&gt;F)    </w:t>
+        <w:t xml:space="preserve">              </w:t>
+      </w:r>
+      <w:proofErr w:type="spellStart"/>
+      <w:r>
+        <w:rPr>
+          <w:rStyle w:val="gnvwddmdl3b"/>
+          <w:rFonts w:ascii="Lucida Console" w:hAnsi="Lucida Console"/>
+          <w:color w:val="000000"/>
+          <w:bdr w:val="none" w:sz="0" w:space="0" w:color="auto" w:frame="1"/>
+        </w:rPr>
+        <w:t>Df</w:t>
+      </w:r>
+      <w:proofErr w:type="spellEnd"/>
+      <w:r>
+        <w:rPr>
+          <w:rStyle w:val="gnvwddmdl3b"/>
+          <w:rFonts w:ascii="Lucida Console" w:hAnsi="Lucida Console"/>
+          <w:color w:val="000000"/>
+          <w:bdr w:val="none" w:sz="0" w:space="0" w:color="auto" w:frame="1"/>
+        </w:rPr>
+        <w:t xml:space="preserve"> Sum Sq Mean Sq F </w:t>
+      </w:r>
+      <w:proofErr w:type="gramStart"/>
+      <w:r>
+        <w:rPr>
+          <w:rStyle w:val="gnvwddmdl3b"/>
+          <w:rFonts w:ascii="Lucida Console" w:hAnsi="Lucida Console"/>
+          <w:color w:val="000000"/>
+          <w:bdr w:val="none" w:sz="0" w:space="0" w:color="auto" w:frame="1"/>
+        </w:rPr>
+        <w:t>value</w:t>
+      </w:r>
+      <w:proofErr w:type="gramEnd"/>
+      <w:r>
+        <w:rPr>
+          <w:rStyle w:val="gnvwddmdl3b"/>
+          <w:rFonts w:ascii="Lucida Console" w:hAnsi="Lucida Console"/>
+          <w:color w:val="000000"/>
+          <w:bdr w:val="none" w:sz="0" w:space="0" w:color="auto" w:frame="1"/>
+        </w:rPr>
+        <w:t xml:space="preserve">    </w:t>
+      </w:r>
+      <w:proofErr w:type="spellStart"/>
+      <w:r>
+        <w:rPr>
+          <w:rStyle w:val="gnvwddmdl3b"/>
+          <w:rFonts w:ascii="Lucida Console" w:hAnsi="Lucida Console"/>
+          <w:color w:val="000000"/>
+          <w:bdr w:val="none" w:sz="0" w:space="0" w:color="auto" w:frame="1"/>
+        </w:rPr>
+        <w:t>Pr</w:t>
+      </w:r>
+      <w:proofErr w:type="spellEnd"/>
+      <w:r>
+        <w:rPr>
+          <w:rStyle w:val="gnvwddmdl3b"/>
+          <w:rFonts w:ascii="Lucida Console" w:hAnsi="Lucida Console"/>
+          <w:color w:val="000000"/>
+          <w:bdr w:val="none" w:sz="0" w:space="0" w:color="auto" w:frame="1"/>
+        </w:rPr>
+        <w:t xml:space="preserve">(&gt;F)    </w:t>
       </w:r>
     </w:p>
     <w:p>
@@ -5535,6 +6610,8 @@
           <w:bdr w:val="none" w:sz="0" w:space="0" w:color="auto" w:frame="1"/>
         </w:rPr>
       </w:pPr>
+      <w:proofErr w:type="spellStart"/>
+      <w:proofErr w:type="gramStart"/>
       <w:r>
         <w:rPr>
           <w:rStyle w:val="gnvwddmdl3b"/>
@@ -5542,7 +6619,27 @@
           <w:color w:val="000000"/>
           <w:bdr w:val="none" w:sz="0" w:space="0" w:color="auto" w:frame="1"/>
         </w:rPr>
-        <w:t>Sampling.Year  1 1903.3 1903.32 14.7553 0.0002661 ***</w:t>
+        <w:t>Sampling.Year</w:t>
+      </w:r>
+      <w:proofErr w:type="spellEnd"/>
+      <w:r>
+        <w:rPr>
+          <w:rStyle w:val="gnvwddmdl3b"/>
+          <w:rFonts w:ascii="Lucida Console" w:hAnsi="Lucida Console"/>
+          <w:color w:val="000000"/>
+          <w:bdr w:val="none" w:sz="0" w:space="0" w:color="auto" w:frame="1"/>
+        </w:rPr>
+        <w:t xml:space="preserve">  1</w:t>
+      </w:r>
+      <w:proofErr w:type="gramEnd"/>
+      <w:r>
+        <w:rPr>
+          <w:rStyle w:val="gnvwddmdl3b"/>
+          <w:rFonts w:ascii="Lucida Console" w:hAnsi="Lucida Console"/>
+          <w:color w:val="000000"/>
+          <w:bdr w:val="none" w:sz="0" w:space="0" w:color="auto" w:frame="1"/>
+        </w:rPr>
+        <w:t xml:space="preserve"> 1903.3 1903.32 14.7553 0.0002661 ***</w:t>
       </w:r>
     </w:p>
     <w:p>
@@ -5557,6 +6654,7 @@
           <w:bdr w:val="none" w:sz="0" w:space="0" w:color="auto" w:frame="1"/>
         </w:rPr>
       </w:pPr>
+      <w:proofErr w:type="spellStart"/>
       <w:r>
         <w:rPr>
           <w:rStyle w:val="gnvwddmdl3b"/>
@@ -5564,7 +6662,57 @@
           <w:color w:val="000000"/>
           <w:bdr w:val="none" w:sz="0" w:space="0" w:color="auto" w:frame="1"/>
         </w:rPr>
-        <w:t xml:space="preserve">CoverCrop.F    2  103.8   51.89  0.4023 0.6703176    </w:t>
+        <w:t>CoverCrop.F</w:t>
+      </w:r>
+      <w:proofErr w:type="spellEnd"/>
+      <w:r>
+        <w:rPr>
+          <w:rStyle w:val="gnvwddmdl3b"/>
+          <w:rFonts w:ascii="Lucida Console" w:hAnsi="Lucida Console"/>
+          <w:color w:val="000000"/>
+          <w:bdr w:val="none" w:sz="0" w:space="0" w:color="auto" w:frame="1"/>
+        </w:rPr>
+        <w:t xml:space="preserve">    </w:t>
+      </w:r>
+      <w:proofErr w:type="gramStart"/>
+      <w:r>
+        <w:rPr>
+          <w:rStyle w:val="gnvwddmdl3b"/>
+          <w:rFonts w:ascii="Lucida Console" w:hAnsi="Lucida Console"/>
+          <w:color w:val="000000"/>
+          <w:bdr w:val="none" w:sz="0" w:space="0" w:color="auto" w:frame="1"/>
+        </w:rPr>
+        <w:t>2  103.8</w:t>
+      </w:r>
+      <w:proofErr w:type="gramEnd"/>
+      <w:r>
+        <w:rPr>
+          <w:rStyle w:val="gnvwddmdl3b"/>
+          <w:rFonts w:ascii="Lucida Console" w:hAnsi="Lucida Console"/>
+          <w:color w:val="000000"/>
+          <w:bdr w:val="none" w:sz="0" w:space="0" w:color="auto" w:frame="1"/>
+        </w:rPr>
+        <w:t xml:space="preserve">   </w:t>
+      </w:r>
+      <w:proofErr w:type="gramStart"/>
+      <w:r>
+        <w:rPr>
+          <w:rStyle w:val="gnvwddmdl3b"/>
+          <w:rFonts w:ascii="Lucida Console" w:hAnsi="Lucida Console"/>
+          <w:color w:val="000000"/>
+          <w:bdr w:val="none" w:sz="0" w:space="0" w:color="auto" w:frame="1"/>
+        </w:rPr>
+        <w:t>51.89  0.4023</w:t>
+      </w:r>
+      <w:proofErr w:type="gramEnd"/>
+      <w:r>
+        <w:rPr>
+          <w:rStyle w:val="gnvwddmdl3b"/>
+          <w:rFonts w:ascii="Lucida Console" w:hAnsi="Lucida Console"/>
+          <w:color w:val="000000"/>
+          <w:bdr w:val="none" w:sz="0" w:space="0" w:color="auto" w:frame="1"/>
+        </w:rPr>
+        <w:t xml:space="preserve"> 0.6703176    </w:t>
       </w:r>
     </w:p>
     <w:p>
@@ -5579,6 +6727,7 @@
           <w:bdr w:val="none" w:sz="0" w:space="0" w:color="auto" w:frame="1"/>
         </w:rPr>
       </w:pPr>
+      <w:proofErr w:type="spellStart"/>
       <w:r>
         <w:rPr>
           <w:rStyle w:val="gnvwddmdl3b"/>
@@ -5586,7 +6735,57 @@
           <w:color w:val="000000"/>
           <w:bdr w:val="none" w:sz="0" w:space="0" w:color="auto" w:frame="1"/>
         </w:rPr>
-        <w:t xml:space="preserve">Treatment.F    3  599.2  199.73  1.5484 0.2096975    </w:t>
+        <w:t>Treatment.F</w:t>
+      </w:r>
+      <w:proofErr w:type="spellEnd"/>
+      <w:r>
+        <w:rPr>
+          <w:rStyle w:val="gnvwddmdl3b"/>
+          <w:rFonts w:ascii="Lucida Console" w:hAnsi="Lucida Console"/>
+          <w:color w:val="000000"/>
+          <w:bdr w:val="none" w:sz="0" w:space="0" w:color="auto" w:frame="1"/>
+        </w:rPr>
+        <w:t xml:space="preserve">    </w:t>
+      </w:r>
+      <w:proofErr w:type="gramStart"/>
+      <w:r>
+        <w:rPr>
+          <w:rStyle w:val="gnvwddmdl3b"/>
+          <w:rFonts w:ascii="Lucida Console" w:hAnsi="Lucida Console"/>
+          <w:color w:val="000000"/>
+          <w:bdr w:val="none" w:sz="0" w:space="0" w:color="auto" w:frame="1"/>
+        </w:rPr>
+        <w:t>3  599.2</w:t>
+      </w:r>
+      <w:proofErr w:type="gramEnd"/>
+      <w:r>
+        <w:rPr>
+          <w:rStyle w:val="gnvwddmdl3b"/>
+          <w:rFonts w:ascii="Lucida Console" w:hAnsi="Lucida Console"/>
+          <w:color w:val="000000"/>
+          <w:bdr w:val="none" w:sz="0" w:space="0" w:color="auto" w:frame="1"/>
+        </w:rPr>
+        <w:t xml:space="preserve">  </w:t>
+      </w:r>
+      <w:proofErr w:type="gramStart"/>
+      <w:r>
+        <w:rPr>
+          <w:rStyle w:val="gnvwddmdl3b"/>
+          <w:rFonts w:ascii="Lucida Console" w:hAnsi="Lucida Console"/>
+          <w:color w:val="000000"/>
+          <w:bdr w:val="none" w:sz="0" w:space="0" w:color="auto" w:frame="1"/>
+        </w:rPr>
+        <w:t>199.73  1.5484</w:t>
+      </w:r>
+      <w:proofErr w:type="gramEnd"/>
+      <w:r>
+        <w:rPr>
+          <w:rStyle w:val="gnvwddmdl3b"/>
+          <w:rFonts w:ascii="Lucida Console" w:hAnsi="Lucida Console"/>
+          <w:color w:val="000000"/>
+          <w:bdr w:val="none" w:sz="0" w:space="0" w:color="auto" w:frame="1"/>
+        </w:rPr>
+        <w:t xml:space="preserve"> 0.2096975    </w:t>
       </w:r>
     </w:p>
     <w:p>
@@ -5608,7 +6807,27 @@
           <w:color w:val="000000"/>
           <w:bdr w:val="none" w:sz="0" w:space="0" w:color="auto" w:frame="1"/>
         </w:rPr>
-        <w:t xml:space="preserve">Residuals     70 9029.5  128.99                      </w:t>
+        <w:t xml:space="preserve">Residuals     70 </w:t>
+      </w:r>
+      <w:proofErr w:type="gramStart"/>
+      <w:r>
+        <w:rPr>
+          <w:rStyle w:val="gnvwddmdl3b"/>
+          <w:rFonts w:ascii="Lucida Console" w:hAnsi="Lucida Console"/>
+          <w:color w:val="000000"/>
+          <w:bdr w:val="none" w:sz="0" w:space="0" w:color="auto" w:frame="1"/>
+        </w:rPr>
+        <w:t>9029.5  128.99</w:t>
+      </w:r>
+      <w:proofErr w:type="gramEnd"/>
+      <w:r>
+        <w:rPr>
+          <w:rStyle w:val="gnvwddmdl3b"/>
+          <w:rFonts w:ascii="Lucida Console" w:hAnsi="Lucida Console"/>
+          <w:color w:val="000000"/>
+          <w:bdr w:val="none" w:sz="0" w:space="0" w:color="auto" w:frame="1"/>
+        </w:rPr>
+        <w:t xml:space="preserve">                      </w:t>
       </w:r>
     </w:p>
     <w:p>
@@ -5643,6 +6862,7 @@
           <w:color w:val="000000"/>
         </w:rPr>
       </w:pPr>
+      <w:proofErr w:type="spellStart"/>
       <w:r>
         <w:rPr>
           <w:rStyle w:val="gnvwddmdl3b"/>
@@ -5650,7 +6870,97 @@
           <w:color w:val="000000"/>
           <w:bdr w:val="none" w:sz="0" w:space="0" w:color="auto" w:frame="1"/>
         </w:rPr>
-        <w:t>Signif. codes:  0 ‘***’ 0.001 ‘**’ 0.01 ‘*’ 0.05 ‘.’ 0.1 ‘ ’ 1</w:t>
+        <w:t>Signif</w:t>
+      </w:r>
+      <w:proofErr w:type="spellEnd"/>
+      <w:r>
+        <w:rPr>
+          <w:rStyle w:val="gnvwddmdl3b"/>
+          <w:rFonts w:ascii="Lucida Console" w:hAnsi="Lucida Console"/>
+          <w:color w:val="000000"/>
+          <w:bdr w:val="none" w:sz="0" w:space="0" w:color="auto" w:frame="1"/>
+        </w:rPr>
+        <w:t>. codes</w:t>
+      </w:r>
+      <w:proofErr w:type="gramStart"/>
+      <w:r>
+        <w:rPr>
+          <w:rStyle w:val="gnvwddmdl3b"/>
+          <w:rFonts w:ascii="Lucida Console" w:hAnsi="Lucida Console"/>
+          <w:color w:val="000000"/>
+          <w:bdr w:val="none" w:sz="0" w:space="0" w:color="auto" w:frame="1"/>
+        </w:rPr>
+        <w:t>:  0 ‘</w:t>
+      </w:r>
+      <w:proofErr w:type="gramEnd"/>
+      <w:r>
+        <w:rPr>
+          <w:rStyle w:val="gnvwddmdl3b"/>
+          <w:rFonts w:ascii="Lucida Console" w:hAnsi="Lucida Console"/>
+          <w:color w:val="000000"/>
+          <w:bdr w:val="none" w:sz="0" w:space="0" w:color="auto" w:frame="1"/>
+        </w:rPr>
+        <w:t xml:space="preserve">***’ </w:t>
+      </w:r>
+      <w:proofErr w:type="gramStart"/>
+      <w:r>
+        <w:rPr>
+          <w:rStyle w:val="gnvwddmdl3b"/>
+          <w:rFonts w:ascii="Lucida Console" w:hAnsi="Lucida Console"/>
+          <w:color w:val="000000"/>
+          <w:bdr w:val="none" w:sz="0" w:space="0" w:color="auto" w:frame="1"/>
+        </w:rPr>
+        <w:t>0.001 ‘*</w:t>
+      </w:r>
+      <w:proofErr w:type="gramEnd"/>
+      <w:r>
+        <w:rPr>
+          <w:rStyle w:val="gnvwddmdl3b"/>
+          <w:rFonts w:ascii="Lucida Console" w:hAnsi="Lucida Console"/>
+          <w:color w:val="000000"/>
+          <w:bdr w:val="none" w:sz="0" w:space="0" w:color="auto" w:frame="1"/>
+        </w:rPr>
+        <w:t xml:space="preserve">*’ </w:t>
+      </w:r>
+      <w:proofErr w:type="gramStart"/>
+      <w:r>
+        <w:rPr>
+          <w:rStyle w:val="gnvwddmdl3b"/>
+          <w:rFonts w:ascii="Lucida Console" w:hAnsi="Lucida Console"/>
+          <w:color w:val="000000"/>
+          <w:bdr w:val="none" w:sz="0" w:space="0" w:color="auto" w:frame="1"/>
+        </w:rPr>
+        <w:t>0.01 ‘*</w:t>
+      </w:r>
+      <w:proofErr w:type="gramEnd"/>
+      <w:r>
+        <w:rPr>
+          <w:rStyle w:val="gnvwddmdl3b"/>
+          <w:rFonts w:ascii="Lucida Console" w:hAnsi="Lucida Console"/>
+          <w:color w:val="000000"/>
+          <w:bdr w:val="none" w:sz="0" w:space="0" w:color="auto" w:frame="1"/>
+        </w:rPr>
+        <w:t xml:space="preserve">’ 0.05 ‘.’ 0.1 </w:t>
+      </w:r>
+      <w:proofErr w:type="gramStart"/>
+      <w:r>
+        <w:rPr>
+          <w:rStyle w:val="gnvwddmdl3b"/>
+          <w:rFonts w:ascii="Lucida Console" w:hAnsi="Lucida Console"/>
+          <w:color w:val="000000"/>
+          <w:bdr w:val="none" w:sz="0" w:space="0" w:color="auto" w:frame="1"/>
+        </w:rPr>
+        <w:t>‘ ’</w:t>
+      </w:r>
+      <w:proofErr w:type="gramEnd"/>
+      <w:r>
+        <w:rPr>
+          <w:rStyle w:val="gnvwddmdl3b"/>
+          <w:rFonts w:ascii="Lucida Console" w:hAnsi="Lucida Console"/>
+          <w:color w:val="000000"/>
+          <w:bdr w:val="none" w:sz="0" w:space="0" w:color="auto" w:frame="1"/>
+        </w:rPr>
+        <w:t xml:space="preserve"> 1</w:t>
       </w:r>
     </w:p>
     <w:p>
@@ -5801,8 +7111,13 @@
       </w:r>
     </w:p>
     <w:p>
-      <w:r>
-        <w:t>Daily  emission analysis</w:t>
+      <w:proofErr w:type="gramStart"/>
+      <w:r>
+        <w:t>Daily  emission</w:t>
+      </w:r>
+      <w:proofErr w:type="gramEnd"/>
+      <w:r>
+        <w:t xml:space="preserve"> analysis</w:t>
       </w:r>
     </w:p>
     <w:p>
@@ -6258,6 +7573,7 @@
                 <w14:ligatures w14:val="none"/>
               </w:rPr>
             </w:pPr>
+            <w:proofErr w:type="spellStart"/>
             <w:r>
               <w:rPr>
                 <w:rFonts w:ascii="Calibri" w:eastAsia="Times New Roman" w:hAnsi="Calibri" w:cs="Calibri"/>
@@ -6266,8 +7582,31 @@
                 <w:szCs w:val="24"/>
                 <w14:ligatures w14:val="none"/>
               </w:rPr>
-              <w:t>uL/Lgas</w:t>
+              <w:t>uL</w:t>
             </w:r>
+            <w:proofErr w:type="spellEnd"/>
+            <w:r>
+              <w:rPr>
+                <w:rFonts w:ascii="Calibri" w:eastAsia="Times New Roman" w:hAnsi="Calibri" w:cs="Calibri"/>
+                <w:kern w:val="0"/>
+                <w:sz w:val="24"/>
+                <w:szCs w:val="24"/>
+                <w14:ligatures w14:val="none"/>
+              </w:rPr>
+              <w:t>/</w:t>
+            </w:r>
+            <w:proofErr w:type="spellStart"/>
+            <w:r>
+              <w:rPr>
+                <w:rFonts w:ascii="Calibri" w:eastAsia="Times New Roman" w:hAnsi="Calibri" w:cs="Calibri"/>
+                <w:kern w:val="0"/>
+                <w:sz w:val="24"/>
+                <w:szCs w:val="24"/>
+                <w14:ligatures w14:val="none"/>
+              </w:rPr>
+              <w:t>Lgas</w:t>
+            </w:r>
+            <w:proofErr w:type="spellEnd"/>
           </w:p>
         </w:tc>
         <w:tc>
@@ -6482,6 +7821,7 @@
                 <w14:ligatures w14:val="none"/>
               </w:rPr>
             </w:pPr>
+            <w:proofErr w:type="spellStart"/>
             <w:r>
               <w:rPr>
                 <w:rFonts w:ascii="Calibri" w:eastAsia="Times New Roman" w:hAnsi="Calibri" w:cs="Calibri"/>
@@ -6490,8 +7830,31 @@
                 <w:szCs w:val="24"/>
                 <w14:ligatures w14:val="none"/>
               </w:rPr>
-              <w:t>uL/Lgas</w:t>
+              <w:t>uL</w:t>
             </w:r>
+            <w:proofErr w:type="spellEnd"/>
+            <w:r>
+              <w:rPr>
+                <w:rFonts w:ascii="Calibri" w:eastAsia="Times New Roman" w:hAnsi="Calibri" w:cs="Calibri"/>
+                <w:kern w:val="0"/>
+                <w:sz w:val="24"/>
+                <w:szCs w:val="24"/>
+                <w14:ligatures w14:val="none"/>
+              </w:rPr>
+              <w:t>/</w:t>
+            </w:r>
+            <w:proofErr w:type="spellStart"/>
+            <w:r>
+              <w:rPr>
+                <w:rFonts w:ascii="Calibri" w:eastAsia="Times New Roman" w:hAnsi="Calibri" w:cs="Calibri"/>
+                <w:kern w:val="0"/>
+                <w:sz w:val="24"/>
+                <w:szCs w:val="24"/>
+                <w14:ligatures w14:val="none"/>
+              </w:rPr>
+              <w:t>Lgas</w:t>
+            </w:r>
+            <w:proofErr w:type="spellEnd"/>
           </w:p>
         </w:tc>
         <w:tc>
@@ -6706,6 +8069,7 @@
                 <w14:ligatures w14:val="none"/>
               </w:rPr>
             </w:pPr>
+            <w:proofErr w:type="spellStart"/>
             <w:r>
               <w:rPr>
                 <w:rFonts w:ascii="Calibri" w:eastAsia="Times New Roman" w:hAnsi="Calibri" w:cs="Calibri"/>
@@ -6714,8 +8078,31 @@
                 <w:szCs w:val="24"/>
                 <w14:ligatures w14:val="none"/>
               </w:rPr>
-              <w:t>uL/Lgas</w:t>
+              <w:t>uL</w:t>
             </w:r>
+            <w:proofErr w:type="spellEnd"/>
+            <w:r>
+              <w:rPr>
+                <w:rFonts w:ascii="Calibri" w:eastAsia="Times New Roman" w:hAnsi="Calibri" w:cs="Calibri"/>
+                <w:kern w:val="0"/>
+                <w:sz w:val="24"/>
+                <w:szCs w:val="24"/>
+                <w14:ligatures w14:val="none"/>
+              </w:rPr>
+              <w:t>/</w:t>
+            </w:r>
+            <w:proofErr w:type="spellStart"/>
+            <w:r>
+              <w:rPr>
+                <w:rFonts w:ascii="Calibri" w:eastAsia="Times New Roman" w:hAnsi="Calibri" w:cs="Calibri"/>
+                <w:kern w:val="0"/>
+                <w:sz w:val="24"/>
+                <w:szCs w:val="24"/>
+                <w14:ligatures w14:val="none"/>
+              </w:rPr>
+              <w:t>Lgas</w:t>
+            </w:r>
+            <w:proofErr w:type="spellEnd"/>
           </w:p>
         </w:tc>
         <w:tc>
@@ -6930,6 +8317,7 @@
                 <w14:ligatures w14:val="none"/>
               </w:rPr>
             </w:pPr>
+            <w:proofErr w:type="spellStart"/>
             <w:r>
               <w:rPr>
                 <w:rFonts w:ascii="Calibri" w:eastAsia="Times New Roman" w:hAnsi="Calibri" w:cs="Calibri"/>
@@ -6938,8 +8326,31 @@
                 <w:szCs w:val="24"/>
                 <w14:ligatures w14:val="none"/>
               </w:rPr>
-              <w:t>uL/Lgas</w:t>
+              <w:t>uL</w:t>
             </w:r>
+            <w:proofErr w:type="spellEnd"/>
+            <w:r>
+              <w:rPr>
+                <w:rFonts w:ascii="Calibri" w:eastAsia="Times New Roman" w:hAnsi="Calibri" w:cs="Calibri"/>
+                <w:kern w:val="0"/>
+                <w:sz w:val="24"/>
+                <w:szCs w:val="24"/>
+                <w14:ligatures w14:val="none"/>
+              </w:rPr>
+              <w:t>/</w:t>
+            </w:r>
+            <w:proofErr w:type="spellStart"/>
+            <w:r>
+              <w:rPr>
+                <w:rFonts w:ascii="Calibri" w:eastAsia="Times New Roman" w:hAnsi="Calibri" w:cs="Calibri"/>
+                <w:kern w:val="0"/>
+                <w:sz w:val="24"/>
+                <w:szCs w:val="24"/>
+                <w14:ligatures w14:val="none"/>
+              </w:rPr>
+              <w:t>Lgas</w:t>
+            </w:r>
+            <w:proofErr w:type="spellEnd"/>
           </w:p>
         </w:tc>
         <w:tc>
@@ -7151,6 +8562,7 @@
                 <w14:ligatures w14:val="none"/>
               </w:rPr>
             </w:pPr>
+            <w:proofErr w:type="spellStart"/>
             <w:r>
               <w:rPr>
                 <w:rFonts w:ascii="Calibri" w:eastAsia="Times New Roman" w:hAnsi="Calibri" w:cs="Calibri"/>
@@ -7159,8 +8571,31 @@
                 <w:szCs w:val="24"/>
                 <w14:ligatures w14:val="none"/>
               </w:rPr>
-              <w:t>uL/Lgas</w:t>
+              <w:t>uL</w:t>
             </w:r>
+            <w:proofErr w:type="spellEnd"/>
+            <w:r>
+              <w:rPr>
+                <w:rFonts w:ascii="Calibri" w:eastAsia="Times New Roman" w:hAnsi="Calibri" w:cs="Calibri"/>
+                <w:kern w:val="0"/>
+                <w:sz w:val="24"/>
+                <w:szCs w:val="24"/>
+                <w14:ligatures w14:val="none"/>
+              </w:rPr>
+              <w:t>/</w:t>
+            </w:r>
+            <w:proofErr w:type="spellStart"/>
+            <w:r>
+              <w:rPr>
+                <w:rFonts w:ascii="Calibri" w:eastAsia="Times New Roman" w:hAnsi="Calibri" w:cs="Calibri"/>
+                <w:kern w:val="0"/>
+                <w:sz w:val="24"/>
+                <w:szCs w:val="24"/>
+                <w14:ligatures w14:val="none"/>
+              </w:rPr>
+              <w:t>Lgas</w:t>
+            </w:r>
+            <w:proofErr w:type="spellEnd"/>
           </w:p>
         </w:tc>
         <w:tc>
@@ -7372,6 +8807,7 @@
                 <w14:ligatures w14:val="none"/>
               </w:rPr>
             </w:pPr>
+            <w:proofErr w:type="spellStart"/>
             <w:r>
               <w:rPr>
                 <w:rFonts w:ascii="Calibri" w:eastAsia="Times New Roman" w:hAnsi="Calibri" w:cs="Calibri"/>
@@ -7380,8 +8816,31 @@
                 <w:szCs w:val="24"/>
                 <w14:ligatures w14:val="none"/>
               </w:rPr>
-              <w:t>uL/Lgas</w:t>
+              <w:t>uL</w:t>
             </w:r>
+            <w:proofErr w:type="spellEnd"/>
+            <w:r>
+              <w:rPr>
+                <w:rFonts w:ascii="Calibri" w:eastAsia="Times New Roman" w:hAnsi="Calibri" w:cs="Calibri"/>
+                <w:kern w:val="0"/>
+                <w:sz w:val="24"/>
+                <w:szCs w:val="24"/>
+                <w14:ligatures w14:val="none"/>
+              </w:rPr>
+              <w:t>/</w:t>
+            </w:r>
+            <w:proofErr w:type="spellStart"/>
+            <w:r>
+              <w:rPr>
+                <w:rFonts w:ascii="Calibri" w:eastAsia="Times New Roman" w:hAnsi="Calibri" w:cs="Calibri"/>
+                <w:kern w:val="0"/>
+                <w:sz w:val="24"/>
+                <w:szCs w:val="24"/>
+                <w14:ligatures w14:val="none"/>
+              </w:rPr>
+              <w:t>Lgas</w:t>
+            </w:r>
+            <w:proofErr w:type="spellEnd"/>
           </w:p>
         </w:tc>
         <w:tc>
@@ -7596,6 +9055,7 @@
                 <w14:ligatures w14:val="none"/>
               </w:rPr>
             </w:pPr>
+            <w:proofErr w:type="spellStart"/>
             <w:r>
               <w:rPr>
                 <w:rFonts w:ascii="Calibri" w:eastAsia="Times New Roman" w:hAnsi="Calibri" w:cs="Calibri"/>
@@ -7604,8 +9064,31 @@
                 <w:szCs w:val="24"/>
                 <w14:ligatures w14:val="none"/>
               </w:rPr>
-              <w:t>uL/Lgas</w:t>
+              <w:t>uL</w:t>
             </w:r>
+            <w:proofErr w:type="spellEnd"/>
+            <w:r>
+              <w:rPr>
+                <w:rFonts w:ascii="Calibri" w:eastAsia="Times New Roman" w:hAnsi="Calibri" w:cs="Calibri"/>
+                <w:kern w:val="0"/>
+                <w:sz w:val="24"/>
+                <w:szCs w:val="24"/>
+                <w14:ligatures w14:val="none"/>
+              </w:rPr>
+              <w:t>/</w:t>
+            </w:r>
+            <w:proofErr w:type="spellStart"/>
+            <w:r>
+              <w:rPr>
+                <w:rFonts w:ascii="Calibri" w:eastAsia="Times New Roman" w:hAnsi="Calibri" w:cs="Calibri"/>
+                <w:kern w:val="0"/>
+                <w:sz w:val="24"/>
+                <w:szCs w:val="24"/>
+                <w14:ligatures w14:val="none"/>
+              </w:rPr>
+              <w:t>Lgas</w:t>
+            </w:r>
+            <w:proofErr w:type="spellEnd"/>
           </w:p>
         </w:tc>
         <w:tc>
@@ -9088,6 +10571,7 @@
         </w:rPr>
         <w:t xml:space="preserve">The Standards Names </w:t>
       </w:r>
+      <w:proofErr w:type="spellStart"/>
       <w:r>
         <w:rPr>
           <w:b/>
@@ -9095,7 +10579,59 @@
           <w:sz w:val="40"/>
           <w:szCs w:val="40"/>
         </w:rPr>
-        <w:t xml:space="preserve">PerSTDA and PerSTD are not consistent through out 2021, therefore </w:t>
+        <w:t>PerSTDA</w:t>
+      </w:r>
+      <w:proofErr w:type="spellEnd"/>
+      <w:r>
+        <w:rPr>
+          <w:b/>
+          <w:bCs/>
+          <w:sz w:val="40"/>
+          <w:szCs w:val="40"/>
+        </w:rPr>
+        <w:t xml:space="preserve"> and </w:t>
+      </w:r>
+      <w:proofErr w:type="spellStart"/>
+      <w:r>
+        <w:rPr>
+          <w:b/>
+          <w:bCs/>
+          <w:sz w:val="40"/>
+          <w:szCs w:val="40"/>
+        </w:rPr>
+        <w:t>PerSTD</w:t>
+      </w:r>
+      <w:proofErr w:type="spellEnd"/>
+      <w:r>
+        <w:rPr>
+          <w:b/>
+          <w:bCs/>
+          <w:sz w:val="40"/>
+          <w:szCs w:val="40"/>
+        </w:rPr>
+        <w:t xml:space="preserve"> are not consistent </w:t>
+      </w:r>
+      <w:proofErr w:type="spellStart"/>
+      <w:proofErr w:type="gramStart"/>
+      <w:r>
+        <w:rPr>
+          <w:b/>
+          <w:bCs/>
+          <w:sz w:val="40"/>
+          <w:szCs w:val="40"/>
+        </w:rPr>
+        <w:t>through out</w:t>
+      </w:r>
+      <w:proofErr w:type="spellEnd"/>
+      <w:proofErr w:type="gramEnd"/>
+      <w:r>
+        <w:rPr>
+          <w:b/>
+          <w:bCs/>
+          <w:sz w:val="40"/>
+          <w:szCs w:val="40"/>
+        </w:rPr>
+        <w:t xml:space="preserve"> 2021, therefore </w:t>
       </w:r>
       <w:r>
         <w:rPr>
@@ -9501,10 +11037,7 @@
         </w:rPr>
       </w:pPr>
       <w:r>
-        <w:t>Removed records</w:t>
-      </w:r>
-      <w:r>
-        <w:t xml:space="preserve"> </w:t>
+        <w:t xml:space="preserve">Removed records </w:t>
       </w:r>
       <w:r>
         <w:rPr>
@@ -9684,14 +11217,7 @@
           <w:sz w:val="24"/>
           <w:szCs w:val="24"/>
         </w:rPr>
-        <w:t>Remove</w:t>
-      </w:r>
-      <w:r>
-        <w:rPr>
-          <w:sz w:val="24"/>
-          <w:szCs w:val="24"/>
-        </w:rPr>
-        <w:t xml:space="preserve"> 500</w:t>
+        <w:t>Remove 500</w:t>
       </w:r>
     </w:p>
     <w:p>
@@ -10045,45 +11571,503 @@
           <w:sz w:val="24"/>
           <w:szCs w:val="24"/>
         </w:rPr>
-        <w:t>Remove</w:t>
-      </w:r>
-      <w:r>
+        <w:t>Remove 945</w:t>
+      </w:r>
+    </w:p>
+    <w:p>
+      <w:pPr>
         <w:rPr>
           <w:sz w:val="24"/>
           <w:szCs w:val="24"/>
         </w:rPr>
-        <w:t xml:space="preserve"> 945</w:t>
-      </w:r>
-    </w:p>
-    <w:p>
-      <w:pPr>
+      </w:pPr>
+      <w:r>
         <w:rPr>
           <w:sz w:val="24"/>
           <w:szCs w:val="24"/>
         </w:rPr>
-      </w:pPr>
-      <w:r>
+        <w:br w:type="page"/>
+      </w:r>
+    </w:p>
+    <w:p>
+      <w:pPr>
         <w:rPr>
           <w:sz w:val="24"/>
           <w:szCs w:val="24"/>
         </w:rPr>
-        <w:br w:type="page"/>
-      </w:r>
-    </w:p>
-    <w:p>
-      <w:pPr>
+      </w:pPr>
+      <w:r>
         <w:rPr>
           <w:sz w:val="24"/>
           <w:szCs w:val="24"/>
         </w:rPr>
-      </w:pPr>
-      <w:r>
+        <w:lastRenderedPageBreak/>
+        <w:t>2021-06-29</w:t>
+      </w:r>
+    </w:p>
+    <w:p>
+      <w:pPr>
         <w:rPr>
           <w:sz w:val="24"/>
           <w:szCs w:val="24"/>
         </w:rPr>
+      </w:pPr>
+      <w:r>
+        <w:rPr>
+          <w:sz w:val="24"/>
+          <w:szCs w:val="24"/>
+        </w:rPr>
+        <w:t xml:space="preserve">Outliers </w:t>
+      </w:r>
+      <w:proofErr w:type="gramStart"/>
+      <w:r>
+        <w:rPr>
+          <w:sz w:val="24"/>
+          <w:szCs w:val="24"/>
+        </w:rPr>
+        <w:t>1091 ,</w:t>
+      </w:r>
+      <w:proofErr w:type="gramEnd"/>
+      <w:r>
+        <w:rPr>
+          <w:sz w:val="24"/>
+          <w:szCs w:val="24"/>
+        </w:rPr>
+        <w:t xml:space="preserve"> 1113</w:t>
+      </w:r>
+    </w:p>
+    <w:p>
+      <w:r>
+        <w:rPr>
+          <w:noProof/>
+        </w:rPr>
+        <w:drawing>
+          <wp:inline distT="0" distB="0" distL="0" distR="0" wp14:anchorId="383D68F7" wp14:editId="2200CF96">
+            <wp:extent cx="6000432" cy="3151868"/>
+            <wp:effectExtent l="0" t="0" r="635" b="0"/>
+            <wp:docPr id="585069078" name="Picture 1"/>
+            <wp:cNvGraphicFramePr>
+              <a:graphicFrameLocks xmlns:a="http://schemas.openxmlformats.org/drawingml/2006/main" noChangeAspect="1"/>
+            </wp:cNvGraphicFramePr>
+            <a:graphic xmlns:a="http://schemas.openxmlformats.org/drawingml/2006/main">
+              <a:graphicData uri="http://schemas.openxmlformats.org/drawingml/2006/picture">
+                <pic:pic xmlns:pic="http://schemas.openxmlformats.org/drawingml/2006/picture">
+                  <pic:nvPicPr>
+                    <pic:cNvPr id="0" name="Picture 2"/>
+                    <pic:cNvPicPr>
+                      <a:picLocks noChangeAspect="1" noChangeArrowheads="1"/>
+                    </pic:cNvPicPr>
+                  </pic:nvPicPr>
+                  <pic:blipFill>
+                    <a:blip r:embed="rId108" cstate="print">
+                      <a:extLst>
+                        <a:ext uri="{28A0092B-C50C-407E-A947-70E740481C1C}">
+                          <a14:useLocalDpi xmlns:a14="http://schemas.microsoft.com/office/drawing/2010/main" val="0"/>
+                        </a:ext>
+                      </a:extLst>
+                    </a:blip>
+                    <a:srcRect/>
+                    <a:stretch>
+                      <a:fillRect/>
+                    </a:stretch>
+                  </pic:blipFill>
+                  <pic:spPr bwMode="auto">
+                    <a:xfrm>
+                      <a:off x="0" y="0"/>
+                      <a:ext cx="6035901" cy="3170499"/>
+                    </a:xfrm>
+                    <a:prstGeom prst="rect">
+                      <a:avLst/>
+                    </a:prstGeom>
+                    <a:noFill/>
+                  </pic:spPr>
+                </pic:pic>
+              </a:graphicData>
+            </a:graphic>
+          </wp:inline>
+        </w:drawing>
+      </w:r>
+    </w:p>
+    <w:p>
+      <w:r>
+        <w:rPr>
+          <w:noProof/>
+        </w:rPr>
+        <w:drawing>
+          <wp:inline distT="0" distB="0" distL="0" distR="0" wp14:anchorId="7D2858B4" wp14:editId="267F1960">
+            <wp:extent cx="5924362" cy="3111911"/>
+            <wp:effectExtent l="0" t="0" r="635" b="0"/>
+            <wp:docPr id="1296010905" name="Picture 2"/>
+            <wp:cNvGraphicFramePr>
+              <a:graphicFrameLocks xmlns:a="http://schemas.openxmlformats.org/drawingml/2006/main" noChangeAspect="1"/>
+            </wp:cNvGraphicFramePr>
+            <a:graphic xmlns:a="http://schemas.openxmlformats.org/drawingml/2006/main">
+              <a:graphicData uri="http://schemas.openxmlformats.org/drawingml/2006/picture">
+                <pic:pic xmlns:pic="http://schemas.openxmlformats.org/drawingml/2006/picture">
+                  <pic:nvPicPr>
+                    <pic:cNvPr id="0" name="Picture 3"/>
+                    <pic:cNvPicPr>
+                      <a:picLocks noChangeAspect="1" noChangeArrowheads="1"/>
+                    </pic:cNvPicPr>
+                  </pic:nvPicPr>
+                  <pic:blipFill>
+                    <a:blip r:embed="rId109" cstate="print">
+                      <a:extLst>
+                        <a:ext uri="{28A0092B-C50C-407E-A947-70E740481C1C}">
+                          <a14:useLocalDpi xmlns:a14="http://schemas.microsoft.com/office/drawing/2010/main" val="0"/>
+                        </a:ext>
+                      </a:extLst>
+                    </a:blip>
+                    <a:srcRect/>
+                    <a:stretch>
+                      <a:fillRect/>
+                    </a:stretch>
+                  </pic:blipFill>
+                  <pic:spPr bwMode="auto">
+                    <a:xfrm>
+                      <a:off x="0" y="0"/>
+                      <a:ext cx="5972012" cy="3136940"/>
+                    </a:xfrm>
+                    <a:prstGeom prst="rect">
+                      <a:avLst/>
+                    </a:prstGeom>
+                    <a:noFill/>
+                  </pic:spPr>
+                </pic:pic>
+              </a:graphicData>
+            </a:graphic>
+          </wp:inline>
+        </w:drawing>
+      </w:r>
+    </w:p>
+    <w:p>
+      <w:pPr>
+        <w:rPr>
+          <w:sz w:val="24"/>
+          <w:szCs w:val="24"/>
+        </w:rPr>
+      </w:pPr>
+      <w:r>
+        <w:rPr>
+          <w:sz w:val="24"/>
+          <w:szCs w:val="24"/>
+        </w:rPr>
+        <w:t>Removed 1091, 1113</w:t>
+      </w:r>
+    </w:p>
+    <w:p>
+      <w:pPr>
+        <w:rPr>
+          <w:sz w:val="24"/>
+          <w:szCs w:val="24"/>
+        </w:rPr>
+      </w:pPr>
+      <w:r>
+        <w:rPr>
+          <w:sz w:val="24"/>
+          <w:szCs w:val="24"/>
+        </w:rPr>
+        <w:br w:type="page"/>
+      </w:r>
+    </w:p>
+    <w:p>
+      <w:pPr>
+        <w:rPr>
+          <w:sz w:val="24"/>
+          <w:szCs w:val="24"/>
+        </w:rPr>
+      </w:pPr>
+      <w:r>
+        <w:rPr>
+          <w:sz w:val="24"/>
+          <w:szCs w:val="24"/>
+        </w:rPr>
         <w:lastRenderedPageBreak/>
-        <w:t>2021-06-29</w:t>
+        <w:t>2021-07-02</w:t>
+      </w:r>
+    </w:p>
+    <w:p>
+      <w:pPr>
+        <w:rPr>
+          <w:sz w:val="24"/>
+          <w:szCs w:val="24"/>
+        </w:rPr>
+      </w:pPr>
+      <w:r>
+        <w:rPr>
+          <w:sz w:val="24"/>
+          <w:szCs w:val="24"/>
+        </w:rPr>
+        <w:t>Ok</w:t>
+      </w:r>
+    </w:p>
+    <w:p>
+      <w:pPr>
+        <w:rPr>
+          <w:sz w:val="24"/>
+          <w:szCs w:val="24"/>
+        </w:rPr>
+      </w:pPr>
+      <w:r>
+        <w:rPr>
+          <w:noProof/>
+          <w:sz w:val="24"/>
+          <w:szCs w:val="24"/>
+        </w:rPr>
+        <w:drawing>
+          <wp:inline distT="0" distB="0" distL="0" distR="0" wp14:anchorId="4490DC43" wp14:editId="1AFD01F4">
+            <wp:extent cx="5923542" cy="3111481"/>
+            <wp:effectExtent l="0" t="0" r="1270" b="0"/>
+            <wp:docPr id="1456867327" name="Picture 3"/>
+            <wp:cNvGraphicFramePr>
+              <a:graphicFrameLocks xmlns:a="http://schemas.openxmlformats.org/drawingml/2006/main" noChangeAspect="1"/>
+            </wp:cNvGraphicFramePr>
+            <a:graphic xmlns:a="http://schemas.openxmlformats.org/drawingml/2006/main">
+              <a:graphicData uri="http://schemas.openxmlformats.org/drawingml/2006/picture">
+                <pic:pic xmlns:pic="http://schemas.openxmlformats.org/drawingml/2006/picture">
+                  <pic:nvPicPr>
+                    <pic:cNvPr id="0" name="Picture 4"/>
+                    <pic:cNvPicPr>
+                      <a:picLocks noChangeAspect="1" noChangeArrowheads="1"/>
+                    </pic:cNvPicPr>
+                  </pic:nvPicPr>
+                  <pic:blipFill>
+                    <a:blip r:embed="rId110" cstate="print">
+                      <a:extLst>
+                        <a:ext uri="{28A0092B-C50C-407E-A947-70E740481C1C}">
+                          <a14:useLocalDpi xmlns:a14="http://schemas.microsoft.com/office/drawing/2010/main" val="0"/>
+                        </a:ext>
+                      </a:extLst>
+                    </a:blip>
+                    <a:srcRect/>
+                    <a:stretch>
+                      <a:fillRect/>
+                    </a:stretch>
+                  </pic:blipFill>
+                  <pic:spPr bwMode="auto">
+                    <a:xfrm>
+                      <a:off x="0" y="0"/>
+                      <a:ext cx="5963310" cy="3132370"/>
+                    </a:xfrm>
+                    <a:prstGeom prst="rect">
+                      <a:avLst/>
+                    </a:prstGeom>
+                    <a:noFill/>
+                  </pic:spPr>
+                </pic:pic>
+              </a:graphicData>
+            </a:graphic>
+          </wp:inline>
+        </w:drawing>
+      </w:r>
+    </w:p>
+    <w:p>
+      <w:pPr>
+        <w:rPr>
+          <w:sz w:val="24"/>
+          <w:szCs w:val="24"/>
+        </w:rPr>
+      </w:pPr>
+      <w:r>
+        <w:rPr>
+          <w:noProof/>
+          <w:sz w:val="24"/>
+          <w:szCs w:val="24"/>
+        </w:rPr>
+        <w:drawing>
+          <wp:inline distT="0" distB="0" distL="0" distR="0" wp14:anchorId="2DF4B1BB" wp14:editId="38BA91C5">
+            <wp:extent cx="5914945" cy="3106964"/>
+            <wp:effectExtent l="0" t="0" r="0" b="0"/>
+            <wp:docPr id="640746513" name="Picture 4"/>
+            <wp:cNvGraphicFramePr>
+              <a:graphicFrameLocks xmlns:a="http://schemas.openxmlformats.org/drawingml/2006/main" noChangeAspect="1"/>
+            </wp:cNvGraphicFramePr>
+            <a:graphic xmlns:a="http://schemas.openxmlformats.org/drawingml/2006/main">
+              <a:graphicData uri="http://schemas.openxmlformats.org/drawingml/2006/picture">
+                <pic:pic xmlns:pic="http://schemas.openxmlformats.org/drawingml/2006/picture">
+                  <pic:nvPicPr>
+                    <pic:cNvPr id="0" name="Picture 5"/>
+                    <pic:cNvPicPr>
+                      <a:picLocks noChangeAspect="1" noChangeArrowheads="1"/>
+                    </pic:cNvPicPr>
+                  </pic:nvPicPr>
+                  <pic:blipFill>
+                    <a:blip r:embed="rId111" cstate="print">
+                      <a:extLst>
+                        <a:ext uri="{28A0092B-C50C-407E-A947-70E740481C1C}">
+                          <a14:useLocalDpi xmlns:a14="http://schemas.microsoft.com/office/drawing/2010/main" val="0"/>
+                        </a:ext>
+                      </a:extLst>
+                    </a:blip>
+                    <a:srcRect/>
+                    <a:stretch>
+                      <a:fillRect/>
+                    </a:stretch>
+                  </pic:blipFill>
+                  <pic:spPr bwMode="auto">
+                    <a:xfrm>
+                      <a:off x="0" y="0"/>
+                      <a:ext cx="5950000" cy="3125377"/>
+                    </a:xfrm>
+                    <a:prstGeom prst="rect">
+                      <a:avLst/>
+                    </a:prstGeom>
+                    <a:noFill/>
+                  </pic:spPr>
+                </pic:pic>
+              </a:graphicData>
+            </a:graphic>
+          </wp:inline>
+        </w:drawing>
+      </w:r>
+    </w:p>
+    <w:p>
+      <w:r>
+        <w:br w:type="page"/>
+      </w:r>
+    </w:p>
+    <w:p>
+      <w:r>
+        <w:lastRenderedPageBreak/>
+        <w:t>2021-07-07</w:t>
+      </w:r>
+    </w:p>
+    <w:p>
+      <w:r>
+        <w:t>2021-07-</w:t>
+      </w:r>
+      <w:proofErr w:type="gramStart"/>
+      <w:r>
+        <w:t>07  Missing</w:t>
+      </w:r>
+      <w:proofErr w:type="gramEnd"/>
+      <w:r>
+        <w:t xml:space="preserve"> </w:t>
+      </w:r>
+      <w:proofErr w:type="gramStart"/>
+      <w:r>
+        <w:t>20210702b3b407b2peakareas.pdf ????</w:t>
+      </w:r>
+      <w:proofErr w:type="gramEnd"/>
+    </w:p>
+    <w:p>
+      <w:r>
+        <w:rPr>
+          <w:noProof/>
+        </w:rPr>
+        <w:drawing>
+          <wp:inline distT="0" distB="0" distL="0" distR="0" wp14:anchorId="1432B9C9" wp14:editId="2CBCA7D5">
+            <wp:extent cx="5901992" cy="3100160"/>
+            <wp:effectExtent l="0" t="0" r="3810" b="5080"/>
+            <wp:docPr id="49117494" name="Picture 5"/>
+            <wp:cNvGraphicFramePr>
+              <a:graphicFrameLocks xmlns:a="http://schemas.openxmlformats.org/drawingml/2006/main" noChangeAspect="1"/>
+            </wp:cNvGraphicFramePr>
+            <a:graphic xmlns:a="http://schemas.openxmlformats.org/drawingml/2006/main">
+              <a:graphicData uri="http://schemas.openxmlformats.org/drawingml/2006/picture">
+                <pic:pic xmlns:pic="http://schemas.openxmlformats.org/drawingml/2006/picture">
+                  <pic:nvPicPr>
+                    <pic:cNvPr id="0" name="Picture 6"/>
+                    <pic:cNvPicPr>
+                      <a:picLocks noChangeAspect="1" noChangeArrowheads="1"/>
+                    </pic:cNvPicPr>
+                  </pic:nvPicPr>
+                  <pic:blipFill>
+                    <a:blip r:embed="rId112" cstate="print">
+                      <a:extLst>
+                        <a:ext uri="{28A0092B-C50C-407E-A947-70E740481C1C}">
+                          <a14:useLocalDpi xmlns:a14="http://schemas.microsoft.com/office/drawing/2010/main" val="0"/>
+                        </a:ext>
+                      </a:extLst>
+                    </a:blip>
+                    <a:srcRect/>
+                    <a:stretch>
+                      <a:fillRect/>
+                    </a:stretch>
+                  </pic:blipFill>
+                  <pic:spPr bwMode="auto">
+                    <a:xfrm>
+                      <a:off x="0" y="0"/>
+                      <a:ext cx="5934574" cy="3117274"/>
+                    </a:xfrm>
+                    <a:prstGeom prst="rect">
+                      <a:avLst/>
+                    </a:prstGeom>
+                    <a:noFill/>
+                  </pic:spPr>
+                </pic:pic>
+              </a:graphicData>
+            </a:graphic>
+          </wp:inline>
+        </w:drawing>
+      </w:r>
+    </w:p>
+    <w:p>
+      <w:r>
+        <w:rPr>
+          <w:noProof/>
+        </w:rPr>
+        <w:drawing>
+          <wp:inline distT="0" distB="0" distL="0" distR="0" wp14:anchorId="51B190A0" wp14:editId="1574A9E1">
+            <wp:extent cx="5910108" cy="3104424"/>
+            <wp:effectExtent l="0" t="0" r="0" b="1270"/>
+            <wp:docPr id="950939801" name="Picture 6"/>
+            <wp:cNvGraphicFramePr>
+              <a:graphicFrameLocks xmlns:a="http://schemas.openxmlformats.org/drawingml/2006/main" noChangeAspect="1"/>
+            </wp:cNvGraphicFramePr>
+            <a:graphic xmlns:a="http://schemas.openxmlformats.org/drawingml/2006/main">
+              <a:graphicData uri="http://schemas.openxmlformats.org/drawingml/2006/picture">
+                <pic:pic xmlns:pic="http://schemas.openxmlformats.org/drawingml/2006/picture">
+                  <pic:nvPicPr>
+                    <pic:cNvPr id="0" name="Picture 7"/>
+                    <pic:cNvPicPr>
+                      <a:picLocks noChangeAspect="1" noChangeArrowheads="1"/>
+                    </pic:cNvPicPr>
+                  </pic:nvPicPr>
+                  <pic:blipFill>
+                    <a:blip r:embed="rId113" cstate="print">
+                      <a:extLst>
+                        <a:ext uri="{28A0092B-C50C-407E-A947-70E740481C1C}">
+                          <a14:useLocalDpi xmlns:a14="http://schemas.microsoft.com/office/drawing/2010/main" val="0"/>
+                        </a:ext>
+                      </a:extLst>
+                    </a:blip>
+                    <a:srcRect/>
+                    <a:stretch>
+                      <a:fillRect/>
+                    </a:stretch>
+                  </pic:blipFill>
+                  <pic:spPr bwMode="auto">
+                    <a:xfrm>
+                      <a:off x="0" y="0"/>
+                      <a:ext cx="5938500" cy="3119338"/>
+                    </a:xfrm>
+                    <a:prstGeom prst="rect">
+                      <a:avLst/>
+                    </a:prstGeom>
+                    <a:noFill/>
+                  </pic:spPr>
+                </pic:pic>
+              </a:graphicData>
+            </a:graphic>
+          </wp:inline>
+        </w:drawing>
+      </w:r>
+    </w:p>
+    <w:p>
+      <w:r>
+        <w:t xml:space="preserve">Records 1424 and 1435 are </w:t>
+      </w:r>
+      <w:r>
+        <w:t xml:space="preserve">strange. They are </w:t>
+      </w:r>
+      <w:proofErr w:type="gramStart"/>
+      <w:r>
+        <w:t>from</w:t>
+      </w:r>
+      <w:proofErr w:type="gramEnd"/>
+      <w:r>
+        <w:t xml:space="preserve"> a new standard. And are strangely consistent</w:t>
       </w:r>
     </w:p>
     <w:p/>

</xml_diff>

<commit_message>
continue verifying standards manually
</commit_message>
<xml_diff>
--- a/StrategicTillage_GC_Analysis_workFlow.docx
+++ b/StrategicTillage_GC_Analysis_workFlow.docx
@@ -51,11 +51,9 @@
           <w:numId w:val="1"/>
         </w:numPr>
       </w:pPr>
-      <w:proofErr w:type="spellStart"/>
       <w:r>
         <w:t>GCAnalysis.R</w:t>
       </w:r>
-      <w:proofErr w:type="spellEnd"/>
     </w:p>
     <w:p>
       <w:pPr>
@@ -65,11 +63,9 @@
           <w:numId w:val="1"/>
         </w:numPr>
       </w:pPr>
-      <w:proofErr w:type="spellStart"/>
       <w:r>
         <w:t>HMR_Analysis.R</w:t>
       </w:r>
-      <w:proofErr w:type="spellEnd"/>
     </w:p>
     <w:p>
       <w:pPr>
@@ -91,11 +87,9 @@
           <w:numId w:val="1"/>
         </w:numPr>
       </w:pPr>
-      <w:proofErr w:type="spellStart"/>
       <w:r>
         <w:t>MassFluxCalculation.R</w:t>
       </w:r>
-      <w:proofErr w:type="spellEnd"/>
     </w:p>
     <w:p>
       <w:pPr>
@@ -105,11 +99,9 @@
           <w:numId w:val="1"/>
         </w:numPr>
       </w:pPr>
-      <w:proofErr w:type="spellStart"/>
       <w:r>
         <w:t>SoilGasFluxStatisticalAnalysis.R</w:t>
       </w:r>
-      <w:proofErr w:type="spellEnd"/>
     </w:p>
     <w:p>
       <w:r>
@@ -851,31 +843,7 @@
     </w:p>
     <w:p>
       <w:r>
-        <w:t xml:space="preserve">The </w:t>
-      </w:r>
-      <w:proofErr w:type="gramStart"/>
-      <w:r>
-        <w:t>intercept</w:t>
-      </w:r>
-      <w:proofErr w:type="gramEnd"/>
-      <w:r>
-        <w:t xml:space="preserve"> in the GC standard calibration has an important effect and is wrong in the linear model with free </w:t>
-      </w:r>
-      <w:proofErr w:type="gramStart"/>
-      <w:r>
-        <w:t>intercept</w:t>
-      </w:r>
-      <w:proofErr w:type="gramEnd"/>
-      <w:r>
-        <w:t xml:space="preserve">. With the intercept forces through 0 the calibration improves significantly.  Plot with free </w:t>
-      </w:r>
-      <w:proofErr w:type="gramStart"/>
-      <w:r>
-        <w:t>intercept</w:t>
-      </w:r>
-      <w:proofErr w:type="gramEnd"/>
-      <w:r>
-        <w:t>.</w:t>
+        <w:t>The intercept in the GC standard calibration has an important effect and is wrong in the linear model with free intercept. With the intercept forces through 0 the calibration improves significantly.  Plot with free intercept.</w:t>
       </w:r>
     </w:p>
     <w:p>
@@ -4281,21 +4249,8 @@
           <w:szCs w:val="20"/>
           <w14:ligatures w14:val="none"/>
         </w:rPr>
-        <w:t>summary(</w:t>
-      </w:r>
-      <w:proofErr w:type="spellStart"/>
-      <w:r>
-        <w:rPr>
-          <w:rFonts w:ascii="Lucida Console" w:eastAsia="Times New Roman" w:hAnsi="Lucida Console" w:cs="Courier New"/>
-          <w:color w:val="0000FF"/>
-          <w:kern w:val="0"/>
-          <w:sz w:val="20"/>
-          <w:szCs w:val="20"/>
-          <w14:ligatures w14:val="none"/>
-        </w:rPr>
-        <w:t>Cumm.Stat.Anal</w:t>
-      </w:r>
-      <w:proofErr w:type="spellEnd"/>
+        <w:t>summary(Cumm.Stat.Anal</w:t>
+      </w:r>
       <w:proofErr w:type="gramEnd"/>
       <w:r>
         <w:rPr>
@@ -4422,7 +4377,6 @@
           <w14:ligatures w14:val="none"/>
         </w:rPr>
       </w:pPr>
-      <w:proofErr w:type="spellStart"/>
       <w:proofErr w:type="gramStart"/>
       <w:r>
         <w:rPr>
@@ -4434,9 +4388,9 @@
           <w:bdr w:val="none" w:sz="0" w:space="0" w:color="auto" w:frame="1"/>
           <w14:ligatures w14:val="none"/>
         </w:rPr>
-        <w:t>lm</w:t>
-      </w:r>
-      <w:proofErr w:type="spellEnd"/>
+        <w:t>lm(</w:t>
+      </w:r>
+      <w:proofErr w:type="gramEnd"/>
       <w:r>
         <w:rPr>
           <w:rFonts w:ascii="Lucida Console" w:eastAsia="Times New Roman" w:hAnsi="Lucida Console" w:cs="Courier New"/>
@@ -4447,9 +4401,9 @@
           <w:bdr w:val="none" w:sz="0" w:space="0" w:color="auto" w:frame="1"/>
           <w14:ligatures w14:val="none"/>
         </w:rPr>
-        <w:t>(</w:t>
-      </w:r>
-      <w:proofErr w:type="gramEnd"/>
+        <w:t xml:space="preserve">formula = </w:t>
+      </w:r>
+      <w:proofErr w:type="gramStart"/>
       <w:r>
         <w:rPr>
           <w:rFonts w:ascii="Lucida Console" w:eastAsia="Times New Roman" w:hAnsi="Lucida Console" w:cs="Courier New"/>
@@ -4460,10 +4414,9 @@
           <w:bdr w:val="none" w:sz="0" w:space="0" w:color="auto" w:frame="1"/>
           <w14:ligatures w14:val="none"/>
         </w:rPr>
-        <w:t xml:space="preserve">formula = </w:t>
-      </w:r>
-      <w:proofErr w:type="spellStart"/>
-      <w:proofErr w:type="gramStart"/>
+        <w:t>Total.Cum.Emissions</w:t>
+      </w:r>
+      <w:proofErr w:type="gramEnd"/>
       <w:r>
         <w:rPr>
           <w:rFonts w:ascii="Lucida Console" w:eastAsia="Times New Roman" w:hAnsi="Lucida Console" w:cs="Courier New"/>
@@ -4474,47 +4427,7 @@
           <w:bdr w:val="none" w:sz="0" w:space="0" w:color="auto" w:frame="1"/>
           <w14:ligatures w14:val="none"/>
         </w:rPr>
-        <w:t>Total.Cum.Emissions</w:t>
-      </w:r>
-      <w:proofErr w:type="spellEnd"/>
-      <w:proofErr w:type="gramEnd"/>
-      <w:r>
-        <w:rPr>
-          <w:rFonts w:ascii="Lucida Console" w:eastAsia="Times New Roman" w:hAnsi="Lucida Console" w:cs="Courier New"/>
-          <w:color w:val="000000"/>
-          <w:kern w:val="0"/>
-          <w:sz w:val="20"/>
-          <w:szCs w:val="20"/>
-          <w:bdr w:val="none" w:sz="0" w:space="0" w:color="auto" w:frame="1"/>
-          <w14:ligatures w14:val="none"/>
-        </w:rPr>
-        <w:t xml:space="preserve"> ~ BLOCK.F + </w:t>
-      </w:r>
-      <w:proofErr w:type="spellStart"/>
-      <w:r>
-        <w:rPr>
-          <w:rFonts w:ascii="Lucida Console" w:eastAsia="Times New Roman" w:hAnsi="Lucida Console" w:cs="Courier New"/>
-          <w:color w:val="000000"/>
-          <w:kern w:val="0"/>
-          <w:sz w:val="20"/>
-          <w:szCs w:val="20"/>
-          <w:bdr w:val="none" w:sz="0" w:space="0" w:color="auto" w:frame="1"/>
-          <w14:ligatures w14:val="none"/>
-        </w:rPr>
-        <w:t>Sampling.Year</w:t>
-      </w:r>
-      <w:proofErr w:type="spellEnd"/>
-      <w:r>
-        <w:rPr>
-          <w:rFonts w:ascii="Lucida Console" w:eastAsia="Times New Roman" w:hAnsi="Lucida Console" w:cs="Courier New"/>
-          <w:color w:val="000000"/>
-          <w:kern w:val="0"/>
-          <w:sz w:val="20"/>
-          <w:szCs w:val="20"/>
-          <w:bdr w:val="none" w:sz="0" w:space="0" w:color="auto" w:frame="1"/>
-          <w14:ligatures w14:val="none"/>
-        </w:rPr>
-        <w:t xml:space="preserve"> + </w:t>
+        <w:t xml:space="preserve"> ~ BLOCK.F + Sampling.Year + </w:t>
       </w:r>
     </w:p>
     <w:p>
@@ -4560,59 +4473,7 @@
           <w:bdr w:val="none" w:sz="0" w:space="0" w:color="auto" w:frame="1"/>
           <w14:ligatures w14:val="none"/>
         </w:rPr>
-        <w:t xml:space="preserve">    </w:t>
-      </w:r>
-      <w:proofErr w:type="spellStart"/>
-      <w:r>
-        <w:rPr>
-          <w:rFonts w:ascii="Lucida Console" w:eastAsia="Times New Roman" w:hAnsi="Lucida Console" w:cs="Courier New"/>
-          <w:color w:val="000000"/>
-          <w:kern w:val="0"/>
-          <w:sz w:val="20"/>
-          <w:szCs w:val="20"/>
-          <w:bdr w:val="none" w:sz="0" w:space="0" w:color="auto" w:frame="1"/>
-          <w14:ligatures w14:val="none"/>
-        </w:rPr>
-        <w:t>CoverCrop.F</w:t>
-      </w:r>
-      <w:proofErr w:type="spellEnd"/>
-      <w:r>
-        <w:rPr>
-          <w:rFonts w:ascii="Lucida Console" w:eastAsia="Times New Roman" w:hAnsi="Lucida Console" w:cs="Courier New"/>
-          <w:color w:val="000000"/>
-          <w:kern w:val="0"/>
-          <w:sz w:val="20"/>
-          <w:szCs w:val="20"/>
-          <w:bdr w:val="none" w:sz="0" w:space="0" w:color="auto" w:frame="1"/>
-          <w14:ligatures w14:val="none"/>
-        </w:rPr>
-        <w:t xml:space="preserve"> + </w:t>
-      </w:r>
-      <w:proofErr w:type="spellStart"/>
-      <w:r>
-        <w:rPr>
-          <w:rFonts w:ascii="Lucida Console" w:eastAsia="Times New Roman" w:hAnsi="Lucida Console" w:cs="Courier New"/>
-          <w:color w:val="000000"/>
-          <w:kern w:val="0"/>
-          <w:sz w:val="20"/>
-          <w:szCs w:val="20"/>
-          <w:bdr w:val="none" w:sz="0" w:space="0" w:color="auto" w:frame="1"/>
-          <w14:ligatures w14:val="none"/>
-        </w:rPr>
-        <w:t>Treatment.F</w:t>
-      </w:r>
-      <w:proofErr w:type="spellEnd"/>
-      <w:r>
-        <w:rPr>
-          <w:rFonts w:ascii="Lucida Console" w:eastAsia="Times New Roman" w:hAnsi="Lucida Console" w:cs="Courier New"/>
-          <w:color w:val="000000"/>
-          <w:kern w:val="0"/>
-          <w:sz w:val="20"/>
-          <w:szCs w:val="20"/>
-          <w:bdr w:val="none" w:sz="0" w:space="0" w:color="auto" w:frame="1"/>
-          <w14:ligatures w14:val="none"/>
-        </w:rPr>
-        <w:t xml:space="preserve">, data = </w:t>
+        <w:t xml:space="preserve">    CoverCrop.F + Treatment.F, data = </w:t>
       </w:r>
       <w:proofErr w:type="gramStart"/>
       <w:r>
@@ -5040,33 +4901,7 @@
           <w:bdr w:val="none" w:sz="0" w:space="0" w:color="auto" w:frame="1"/>
           <w14:ligatures w14:val="none"/>
         </w:rPr>
-        <w:t xml:space="preserve">                  Estimate Std. Error t value </w:t>
-      </w:r>
-      <w:proofErr w:type="spellStart"/>
-      <w:r>
-        <w:rPr>
-          <w:rFonts w:ascii="Lucida Console" w:eastAsia="Times New Roman" w:hAnsi="Lucida Console" w:cs="Courier New"/>
-          <w:color w:val="000000"/>
-          <w:kern w:val="0"/>
-          <w:sz w:val="20"/>
-          <w:szCs w:val="20"/>
-          <w:bdr w:val="none" w:sz="0" w:space="0" w:color="auto" w:frame="1"/>
-          <w14:ligatures w14:val="none"/>
-        </w:rPr>
-        <w:t>Pr</w:t>
-      </w:r>
-      <w:proofErr w:type="spellEnd"/>
-      <w:r>
-        <w:rPr>
-          <w:rFonts w:ascii="Lucida Console" w:eastAsia="Times New Roman" w:hAnsi="Lucida Console" w:cs="Courier New"/>
-          <w:color w:val="000000"/>
-          <w:kern w:val="0"/>
-          <w:sz w:val="20"/>
-          <w:szCs w:val="20"/>
-          <w:bdr w:val="none" w:sz="0" w:space="0" w:color="auto" w:frame="1"/>
-          <w14:ligatures w14:val="none"/>
-        </w:rPr>
-        <w:t xml:space="preserve">(&gt;|t|)    </w:t>
+        <w:t xml:space="preserve">                  Estimate Std. Error t value Pr(&gt;|t|)    </w:t>
       </w:r>
     </w:p>
     <w:p>
@@ -5488,7 +5323,6 @@
           <w14:ligatures w14:val="none"/>
         </w:rPr>
       </w:pPr>
-      <w:proofErr w:type="spellStart"/>
       <w:r>
         <w:rPr>
           <w:rFonts w:ascii="Lucida Console" w:eastAsia="Times New Roman" w:hAnsi="Lucida Console" w:cs="Courier New"/>
@@ -5499,20 +5333,7 @@
           <w:bdr w:val="none" w:sz="0" w:space="0" w:color="auto" w:frame="1"/>
           <w14:ligatures w14:val="none"/>
         </w:rPr>
-        <w:t>CoverCrop.FClover</w:t>
-      </w:r>
-      <w:proofErr w:type="spellEnd"/>
-      <w:r>
-        <w:rPr>
-          <w:rFonts w:ascii="Lucida Console" w:eastAsia="Times New Roman" w:hAnsi="Lucida Console" w:cs="Courier New"/>
-          <w:color w:val="000000"/>
-          <w:kern w:val="0"/>
-          <w:sz w:val="20"/>
-          <w:szCs w:val="20"/>
-          <w:bdr w:val="none" w:sz="0" w:space="0" w:color="auto" w:frame="1"/>
-          <w14:ligatures w14:val="none"/>
-        </w:rPr>
-        <w:t xml:space="preserve">   3.1667     3.2786   0.966 0.337437    </w:t>
+        <w:t xml:space="preserve">CoverCrop.FClover   3.1667     3.2786   0.966 0.337437    </w:t>
       </w:r>
     </w:p>
     <w:p>
@@ -5548,7 +5369,6 @@
           <w14:ligatures w14:val="none"/>
         </w:rPr>
       </w:pPr>
-      <w:proofErr w:type="spellStart"/>
       <w:r>
         <w:rPr>
           <w:rFonts w:ascii="Lucida Console" w:eastAsia="Times New Roman" w:hAnsi="Lucida Console" w:cs="Courier New"/>
@@ -5559,20 +5379,7 @@
           <w:bdr w:val="none" w:sz="0" w:space="0" w:color="auto" w:frame="1"/>
           <w14:ligatures w14:val="none"/>
         </w:rPr>
-        <w:t>CoverCrop.FTrit</w:t>
-      </w:r>
-      <w:proofErr w:type="spellEnd"/>
-      <w:r>
-        <w:rPr>
-          <w:rFonts w:ascii="Lucida Console" w:eastAsia="Times New Roman" w:hAnsi="Lucida Console" w:cs="Courier New"/>
-          <w:color w:val="000000"/>
-          <w:kern w:val="0"/>
-          <w:sz w:val="20"/>
-          <w:szCs w:val="20"/>
-          <w:bdr w:val="none" w:sz="0" w:space="0" w:color="auto" w:frame="1"/>
-          <w14:ligatures w14:val="none"/>
-        </w:rPr>
-        <w:t xml:space="preserve">    -0.4087     </w:t>
+        <w:t xml:space="preserve">CoverCrop.FTrit    -0.4087     </w:t>
       </w:r>
       <w:proofErr w:type="gramStart"/>
       <w:r>
@@ -5634,7 +5441,6 @@
           <w14:ligatures w14:val="none"/>
         </w:rPr>
       </w:pPr>
-      <w:proofErr w:type="spellStart"/>
       <w:r>
         <w:rPr>
           <w:rFonts w:ascii="Lucida Console" w:eastAsia="Times New Roman" w:hAnsi="Lucida Console" w:cs="Courier New"/>
@@ -5645,20 +5451,7 @@
           <w:bdr w:val="none" w:sz="0" w:space="0" w:color="auto" w:frame="1"/>
           <w14:ligatures w14:val="none"/>
         </w:rPr>
-        <w:t>Treatment.FB</w:t>
-      </w:r>
-      <w:proofErr w:type="spellEnd"/>
-      <w:r>
-        <w:rPr>
-          <w:rFonts w:ascii="Lucida Console" w:eastAsia="Times New Roman" w:hAnsi="Lucida Console" w:cs="Courier New"/>
-          <w:color w:val="000000"/>
-          <w:kern w:val="0"/>
-          <w:sz w:val="20"/>
-          <w:szCs w:val="20"/>
-          <w:bdr w:val="none" w:sz="0" w:space="0" w:color="auto" w:frame="1"/>
-          <w14:ligatures w14:val="none"/>
-        </w:rPr>
-        <w:t xml:space="preserve">        6.2892     3.2786   1.918 0.</w:t>
+        <w:t>Treatment.FB        6.2892     3.2786   1.918 0.</w:t>
       </w:r>
       <w:proofErr w:type="gramStart"/>
       <w:r>
@@ -5720,7 +5513,6 @@
           <w14:ligatures w14:val="none"/>
         </w:rPr>
       </w:pPr>
-      <w:proofErr w:type="spellStart"/>
       <w:r>
         <w:rPr>
           <w:rFonts w:ascii="Lucida Console" w:eastAsia="Times New Roman" w:hAnsi="Lucida Console" w:cs="Courier New"/>
@@ -5731,20 +5523,7 @@
           <w:bdr w:val="none" w:sz="0" w:space="0" w:color="auto" w:frame="1"/>
           <w14:ligatures w14:val="none"/>
         </w:rPr>
-        <w:t>Treatment.FC</w:t>
-      </w:r>
-      <w:proofErr w:type="spellEnd"/>
-      <w:r>
-        <w:rPr>
-          <w:rFonts w:ascii="Lucida Console" w:eastAsia="Times New Roman" w:hAnsi="Lucida Console" w:cs="Courier New"/>
-          <w:color w:val="000000"/>
-          <w:kern w:val="0"/>
-          <w:sz w:val="20"/>
-          <w:szCs w:val="20"/>
-          <w:bdr w:val="none" w:sz="0" w:space="0" w:color="auto" w:frame="1"/>
-          <w14:ligatures w14:val="none"/>
-        </w:rPr>
-        <w:t xml:space="preserve">        4.1102     3.2786   1.254 0.214146    </w:t>
+        <w:t xml:space="preserve">Treatment.FC        4.1102     3.2786   1.254 0.214146    </w:t>
       </w:r>
     </w:p>
     <w:p>
@@ -5780,7 +5559,6 @@
           <w14:ligatures w14:val="none"/>
         </w:rPr>
       </w:pPr>
-      <w:proofErr w:type="spellStart"/>
       <w:r>
         <w:rPr>
           <w:rFonts w:ascii="Lucida Console" w:eastAsia="Times New Roman" w:hAnsi="Lucida Console" w:cs="Courier New"/>
@@ -5791,20 +5569,7 @@
           <w:bdr w:val="none" w:sz="0" w:space="0" w:color="auto" w:frame="1"/>
           <w14:ligatures w14:val="none"/>
         </w:rPr>
-        <w:t>Treatment.FD</w:t>
-      </w:r>
-      <w:proofErr w:type="spellEnd"/>
-      <w:r>
-        <w:rPr>
-          <w:rFonts w:ascii="Lucida Console" w:eastAsia="Times New Roman" w:hAnsi="Lucida Console" w:cs="Courier New"/>
-          <w:color w:val="000000"/>
-          <w:kern w:val="0"/>
-          <w:sz w:val="20"/>
-          <w:szCs w:val="20"/>
-          <w:bdr w:val="none" w:sz="0" w:space="0" w:color="auto" w:frame="1"/>
-          <w14:ligatures w14:val="none"/>
-        </w:rPr>
-        <w:t xml:space="preserve">       -0.8080     </w:t>
+        <w:t xml:space="preserve">Treatment.FD       -0.8080     </w:t>
       </w:r>
       <w:proofErr w:type="gramStart"/>
       <w:r>
@@ -5912,7 +5677,6 @@
           <w14:ligatures w14:val="none"/>
         </w:rPr>
       </w:pPr>
-      <w:proofErr w:type="spellStart"/>
       <w:r>
         <w:rPr>
           <w:rFonts w:ascii="Lucida Console" w:eastAsia="Times New Roman" w:hAnsi="Lucida Console" w:cs="Courier New"/>
@@ -5923,20 +5687,7 @@
           <w:bdr w:val="none" w:sz="0" w:space="0" w:color="auto" w:frame="1"/>
           <w14:ligatures w14:val="none"/>
         </w:rPr>
-        <w:t>Signif</w:t>
-      </w:r>
-      <w:proofErr w:type="spellEnd"/>
-      <w:r>
-        <w:rPr>
-          <w:rFonts w:ascii="Lucida Console" w:eastAsia="Times New Roman" w:hAnsi="Lucida Console" w:cs="Courier New"/>
-          <w:color w:val="000000"/>
-          <w:kern w:val="0"/>
-          <w:sz w:val="20"/>
-          <w:szCs w:val="20"/>
-          <w:bdr w:val="none" w:sz="0" w:space="0" w:color="auto" w:frame="1"/>
-          <w14:ligatures w14:val="none"/>
-        </w:rPr>
-        <w:t>. codes</w:t>
+        <w:t>Signif. codes</w:t>
       </w:r>
       <w:proofErr w:type="gramStart"/>
       <w:r>
@@ -6385,7 +6136,6 @@
           <w:color w:val="0000FF"/>
         </w:rPr>
       </w:pPr>
-      <w:proofErr w:type="spellStart"/>
       <w:proofErr w:type="gramStart"/>
       <w:r>
         <w:rPr>
@@ -6393,27 +6143,8 @@
           <w:rFonts w:ascii="Lucida Console" w:hAnsi="Lucida Console"/>
           <w:color w:val="0000FF"/>
         </w:rPr>
-        <w:t>anova</w:t>
-      </w:r>
-      <w:proofErr w:type="spellEnd"/>
-      <w:r>
-        <w:rPr>
-          <w:rStyle w:val="gnvwddmdb3b"/>
-          <w:rFonts w:ascii="Lucida Console" w:hAnsi="Lucida Console"/>
-          <w:color w:val="0000FF"/>
-        </w:rPr>
-        <w:t>(</w:t>
-      </w:r>
-      <w:proofErr w:type="spellStart"/>
-      <w:r>
-        <w:rPr>
-          <w:rStyle w:val="gnvwddmdb3b"/>
-          <w:rFonts w:ascii="Lucida Console" w:hAnsi="Lucida Console"/>
-          <w:color w:val="0000FF"/>
-        </w:rPr>
-        <w:t>Cumm.Stat.Anal</w:t>
-      </w:r>
-      <w:proofErr w:type="spellEnd"/>
+        <w:t>anova(Cumm.Stat.Anal</w:t>
+      </w:r>
       <w:proofErr w:type="gramEnd"/>
       <w:r>
         <w:rPr>
@@ -6480,7 +6211,6 @@
         </w:rPr>
         <w:t xml:space="preserve">Response: </w:t>
       </w:r>
-      <w:proofErr w:type="spellStart"/>
       <w:proofErr w:type="gramStart"/>
       <w:r>
         <w:rPr>
@@ -6491,7 +6221,6 @@
         </w:rPr>
         <w:t>Total.Cum.Emissions</w:t>
       </w:r>
-      <w:proofErr w:type="spellEnd"/>
       <w:proofErr w:type="gramEnd"/>
     </w:p>
     <w:p>
@@ -6513,9 +6242,9 @@
           <w:color w:val="000000"/>
           <w:bdr w:val="none" w:sz="0" w:space="0" w:color="auto" w:frame="1"/>
         </w:rPr>
-        <w:t xml:space="preserve">              </w:t>
-      </w:r>
-      <w:proofErr w:type="spellStart"/>
+        <w:t xml:space="preserve">              Df Sum Sq Mean Sq F </w:t>
+      </w:r>
+      <w:proofErr w:type="gramStart"/>
       <w:r>
         <w:rPr>
           <w:rStyle w:val="gnvwddmdl3b"/>
@@ -6523,9 +6252,9 @@
           <w:color w:val="000000"/>
           <w:bdr w:val="none" w:sz="0" w:space="0" w:color="auto" w:frame="1"/>
         </w:rPr>
-        <w:t>Df</w:t>
-      </w:r>
-      <w:proofErr w:type="spellEnd"/>
+        <w:t>value</w:t>
+      </w:r>
+      <w:proofErr w:type="gramEnd"/>
       <w:r>
         <w:rPr>
           <w:rStyle w:val="gnvwddmdl3b"/>
@@ -6533,47 +6262,7 @@
           <w:color w:val="000000"/>
           <w:bdr w:val="none" w:sz="0" w:space="0" w:color="auto" w:frame="1"/>
         </w:rPr>
-        <w:t xml:space="preserve"> Sum Sq Mean Sq F </w:t>
-      </w:r>
-      <w:proofErr w:type="gramStart"/>
-      <w:r>
-        <w:rPr>
-          <w:rStyle w:val="gnvwddmdl3b"/>
-          <w:rFonts w:ascii="Lucida Console" w:hAnsi="Lucida Console"/>
-          <w:color w:val="000000"/>
-          <w:bdr w:val="none" w:sz="0" w:space="0" w:color="auto" w:frame="1"/>
-        </w:rPr>
-        <w:t>value</w:t>
-      </w:r>
-      <w:proofErr w:type="gramEnd"/>
-      <w:r>
-        <w:rPr>
-          <w:rStyle w:val="gnvwddmdl3b"/>
-          <w:rFonts w:ascii="Lucida Console" w:hAnsi="Lucida Console"/>
-          <w:color w:val="000000"/>
-          <w:bdr w:val="none" w:sz="0" w:space="0" w:color="auto" w:frame="1"/>
-        </w:rPr>
-        <w:t xml:space="preserve">    </w:t>
-      </w:r>
-      <w:proofErr w:type="spellStart"/>
-      <w:r>
-        <w:rPr>
-          <w:rStyle w:val="gnvwddmdl3b"/>
-          <w:rFonts w:ascii="Lucida Console" w:hAnsi="Lucida Console"/>
-          <w:color w:val="000000"/>
-          <w:bdr w:val="none" w:sz="0" w:space="0" w:color="auto" w:frame="1"/>
-        </w:rPr>
-        <w:t>Pr</w:t>
-      </w:r>
-      <w:proofErr w:type="spellEnd"/>
-      <w:r>
-        <w:rPr>
-          <w:rStyle w:val="gnvwddmdl3b"/>
-          <w:rFonts w:ascii="Lucida Console" w:hAnsi="Lucida Console"/>
-          <w:color w:val="000000"/>
-          <w:bdr w:val="none" w:sz="0" w:space="0" w:color="auto" w:frame="1"/>
-        </w:rPr>
-        <w:t xml:space="preserve">(&gt;F)    </w:t>
+        <w:t xml:space="preserve">    Pr(&gt;F)    </w:t>
       </w:r>
     </w:p>
     <w:p>
@@ -6610,7 +6299,6 @@
           <w:bdr w:val="none" w:sz="0" w:space="0" w:color="auto" w:frame="1"/>
         </w:rPr>
       </w:pPr>
-      <w:proofErr w:type="spellStart"/>
       <w:proofErr w:type="gramStart"/>
       <w:r>
         <w:rPr>
@@ -6619,17 +6307,7 @@
           <w:color w:val="000000"/>
           <w:bdr w:val="none" w:sz="0" w:space="0" w:color="auto" w:frame="1"/>
         </w:rPr>
-        <w:t>Sampling.Year</w:t>
-      </w:r>
-      <w:proofErr w:type="spellEnd"/>
-      <w:r>
-        <w:rPr>
-          <w:rStyle w:val="gnvwddmdl3b"/>
-          <w:rFonts w:ascii="Lucida Console" w:hAnsi="Lucida Console"/>
-          <w:color w:val="000000"/>
-          <w:bdr w:val="none" w:sz="0" w:space="0" w:color="auto" w:frame="1"/>
-        </w:rPr>
-        <w:t xml:space="preserve">  1</w:t>
+        <w:t>Sampling.Year  1</w:t>
       </w:r>
       <w:proofErr w:type="gramEnd"/>
       <w:r>
@@ -6654,7 +6332,6 @@
           <w:bdr w:val="none" w:sz="0" w:space="0" w:color="auto" w:frame="1"/>
         </w:rPr>
       </w:pPr>
-      <w:proofErr w:type="spellStart"/>
       <w:r>
         <w:rPr>
           <w:rStyle w:val="gnvwddmdl3b"/>
@@ -6662,17 +6339,7 @@
           <w:color w:val="000000"/>
           <w:bdr w:val="none" w:sz="0" w:space="0" w:color="auto" w:frame="1"/>
         </w:rPr>
-        <w:t>CoverCrop.F</w:t>
-      </w:r>
-      <w:proofErr w:type="spellEnd"/>
-      <w:r>
-        <w:rPr>
-          <w:rStyle w:val="gnvwddmdl3b"/>
-          <w:rFonts w:ascii="Lucida Console" w:hAnsi="Lucida Console"/>
-          <w:color w:val="000000"/>
-          <w:bdr w:val="none" w:sz="0" w:space="0" w:color="auto" w:frame="1"/>
-        </w:rPr>
-        <w:t xml:space="preserve">    </w:t>
+        <w:t xml:space="preserve">CoverCrop.F    </w:t>
       </w:r>
       <w:proofErr w:type="gramStart"/>
       <w:r>
@@ -6727,7 +6394,6 @@
           <w:bdr w:val="none" w:sz="0" w:space="0" w:color="auto" w:frame="1"/>
         </w:rPr>
       </w:pPr>
-      <w:proofErr w:type="spellStart"/>
       <w:r>
         <w:rPr>
           <w:rStyle w:val="gnvwddmdl3b"/>
@@ -6735,17 +6401,7 @@
           <w:color w:val="000000"/>
           <w:bdr w:val="none" w:sz="0" w:space="0" w:color="auto" w:frame="1"/>
         </w:rPr>
-        <w:t>Treatment.F</w:t>
-      </w:r>
-      <w:proofErr w:type="spellEnd"/>
-      <w:r>
-        <w:rPr>
-          <w:rStyle w:val="gnvwddmdl3b"/>
-          <w:rFonts w:ascii="Lucida Console" w:hAnsi="Lucida Console"/>
-          <w:color w:val="000000"/>
-          <w:bdr w:val="none" w:sz="0" w:space="0" w:color="auto" w:frame="1"/>
-        </w:rPr>
-        <w:t xml:space="preserve">    </w:t>
+        <w:t xml:space="preserve">Treatment.F    </w:t>
       </w:r>
       <w:proofErr w:type="gramStart"/>
       <w:r>
@@ -6862,7 +6518,6 @@
           <w:color w:val="000000"/>
         </w:rPr>
       </w:pPr>
-      <w:proofErr w:type="spellStart"/>
       <w:r>
         <w:rPr>
           <w:rStyle w:val="gnvwddmdl3b"/>
@@ -6870,17 +6525,7 @@
           <w:color w:val="000000"/>
           <w:bdr w:val="none" w:sz="0" w:space="0" w:color="auto" w:frame="1"/>
         </w:rPr>
-        <w:t>Signif</w:t>
-      </w:r>
-      <w:proofErr w:type="spellEnd"/>
-      <w:r>
-        <w:rPr>
-          <w:rStyle w:val="gnvwddmdl3b"/>
-          <w:rFonts w:ascii="Lucida Console" w:hAnsi="Lucida Console"/>
-          <w:color w:val="000000"/>
-          <w:bdr w:val="none" w:sz="0" w:space="0" w:color="auto" w:frame="1"/>
-        </w:rPr>
-        <w:t>. codes</w:t>
+        <w:t>Signif. codes</w:t>
       </w:r>
       <w:proofErr w:type="gramStart"/>
       <w:r>
@@ -7573,7 +7218,6 @@
                 <w14:ligatures w14:val="none"/>
               </w:rPr>
             </w:pPr>
-            <w:proofErr w:type="spellStart"/>
             <w:r>
               <w:rPr>
                 <w:rFonts w:ascii="Calibri" w:eastAsia="Times New Roman" w:hAnsi="Calibri" w:cs="Calibri"/>
@@ -7582,31 +7226,8 @@
                 <w:szCs w:val="24"/>
                 <w14:ligatures w14:val="none"/>
               </w:rPr>
-              <w:t>uL</w:t>
+              <w:t>uL/Lgas</w:t>
             </w:r>
-            <w:proofErr w:type="spellEnd"/>
-            <w:r>
-              <w:rPr>
-                <w:rFonts w:ascii="Calibri" w:eastAsia="Times New Roman" w:hAnsi="Calibri" w:cs="Calibri"/>
-                <w:kern w:val="0"/>
-                <w:sz w:val="24"/>
-                <w:szCs w:val="24"/>
-                <w14:ligatures w14:val="none"/>
-              </w:rPr>
-              <w:t>/</w:t>
-            </w:r>
-            <w:proofErr w:type="spellStart"/>
-            <w:r>
-              <w:rPr>
-                <w:rFonts w:ascii="Calibri" w:eastAsia="Times New Roman" w:hAnsi="Calibri" w:cs="Calibri"/>
-                <w:kern w:val="0"/>
-                <w:sz w:val="24"/>
-                <w:szCs w:val="24"/>
-                <w14:ligatures w14:val="none"/>
-              </w:rPr>
-              <w:t>Lgas</w:t>
-            </w:r>
-            <w:proofErr w:type="spellEnd"/>
           </w:p>
         </w:tc>
         <w:tc>
@@ -7821,7 +7442,6 @@
                 <w14:ligatures w14:val="none"/>
               </w:rPr>
             </w:pPr>
-            <w:proofErr w:type="spellStart"/>
             <w:r>
               <w:rPr>
                 <w:rFonts w:ascii="Calibri" w:eastAsia="Times New Roman" w:hAnsi="Calibri" w:cs="Calibri"/>
@@ -7830,31 +7450,8 @@
                 <w:szCs w:val="24"/>
                 <w14:ligatures w14:val="none"/>
               </w:rPr>
-              <w:t>uL</w:t>
+              <w:t>uL/Lgas</w:t>
             </w:r>
-            <w:proofErr w:type="spellEnd"/>
-            <w:r>
-              <w:rPr>
-                <w:rFonts w:ascii="Calibri" w:eastAsia="Times New Roman" w:hAnsi="Calibri" w:cs="Calibri"/>
-                <w:kern w:val="0"/>
-                <w:sz w:val="24"/>
-                <w:szCs w:val="24"/>
-                <w14:ligatures w14:val="none"/>
-              </w:rPr>
-              <w:t>/</w:t>
-            </w:r>
-            <w:proofErr w:type="spellStart"/>
-            <w:r>
-              <w:rPr>
-                <w:rFonts w:ascii="Calibri" w:eastAsia="Times New Roman" w:hAnsi="Calibri" w:cs="Calibri"/>
-                <w:kern w:val="0"/>
-                <w:sz w:val="24"/>
-                <w:szCs w:val="24"/>
-                <w14:ligatures w14:val="none"/>
-              </w:rPr>
-              <w:t>Lgas</w:t>
-            </w:r>
-            <w:proofErr w:type="spellEnd"/>
           </w:p>
         </w:tc>
         <w:tc>
@@ -8069,7 +7666,6 @@
                 <w14:ligatures w14:val="none"/>
               </w:rPr>
             </w:pPr>
-            <w:proofErr w:type="spellStart"/>
             <w:r>
               <w:rPr>
                 <w:rFonts w:ascii="Calibri" w:eastAsia="Times New Roman" w:hAnsi="Calibri" w:cs="Calibri"/>
@@ -8078,31 +7674,8 @@
                 <w:szCs w:val="24"/>
                 <w14:ligatures w14:val="none"/>
               </w:rPr>
-              <w:t>uL</w:t>
+              <w:t>uL/Lgas</w:t>
             </w:r>
-            <w:proofErr w:type="spellEnd"/>
-            <w:r>
-              <w:rPr>
-                <w:rFonts w:ascii="Calibri" w:eastAsia="Times New Roman" w:hAnsi="Calibri" w:cs="Calibri"/>
-                <w:kern w:val="0"/>
-                <w:sz w:val="24"/>
-                <w:szCs w:val="24"/>
-                <w14:ligatures w14:val="none"/>
-              </w:rPr>
-              <w:t>/</w:t>
-            </w:r>
-            <w:proofErr w:type="spellStart"/>
-            <w:r>
-              <w:rPr>
-                <w:rFonts w:ascii="Calibri" w:eastAsia="Times New Roman" w:hAnsi="Calibri" w:cs="Calibri"/>
-                <w:kern w:val="0"/>
-                <w:sz w:val="24"/>
-                <w:szCs w:val="24"/>
-                <w14:ligatures w14:val="none"/>
-              </w:rPr>
-              <w:t>Lgas</w:t>
-            </w:r>
-            <w:proofErr w:type="spellEnd"/>
           </w:p>
         </w:tc>
         <w:tc>
@@ -8317,7 +7890,6 @@
                 <w14:ligatures w14:val="none"/>
               </w:rPr>
             </w:pPr>
-            <w:proofErr w:type="spellStart"/>
             <w:r>
               <w:rPr>
                 <w:rFonts w:ascii="Calibri" w:eastAsia="Times New Roman" w:hAnsi="Calibri" w:cs="Calibri"/>
@@ -8326,31 +7898,8 @@
                 <w:szCs w:val="24"/>
                 <w14:ligatures w14:val="none"/>
               </w:rPr>
-              <w:t>uL</w:t>
+              <w:t>uL/Lgas</w:t>
             </w:r>
-            <w:proofErr w:type="spellEnd"/>
-            <w:r>
-              <w:rPr>
-                <w:rFonts w:ascii="Calibri" w:eastAsia="Times New Roman" w:hAnsi="Calibri" w:cs="Calibri"/>
-                <w:kern w:val="0"/>
-                <w:sz w:val="24"/>
-                <w:szCs w:val="24"/>
-                <w14:ligatures w14:val="none"/>
-              </w:rPr>
-              <w:t>/</w:t>
-            </w:r>
-            <w:proofErr w:type="spellStart"/>
-            <w:r>
-              <w:rPr>
-                <w:rFonts w:ascii="Calibri" w:eastAsia="Times New Roman" w:hAnsi="Calibri" w:cs="Calibri"/>
-                <w:kern w:val="0"/>
-                <w:sz w:val="24"/>
-                <w:szCs w:val="24"/>
-                <w14:ligatures w14:val="none"/>
-              </w:rPr>
-              <w:t>Lgas</w:t>
-            </w:r>
-            <w:proofErr w:type="spellEnd"/>
           </w:p>
         </w:tc>
         <w:tc>
@@ -8562,7 +8111,6 @@
                 <w14:ligatures w14:val="none"/>
               </w:rPr>
             </w:pPr>
-            <w:proofErr w:type="spellStart"/>
             <w:r>
               <w:rPr>
                 <w:rFonts w:ascii="Calibri" w:eastAsia="Times New Roman" w:hAnsi="Calibri" w:cs="Calibri"/>
@@ -8571,31 +8119,8 @@
                 <w:szCs w:val="24"/>
                 <w14:ligatures w14:val="none"/>
               </w:rPr>
-              <w:t>uL</w:t>
+              <w:t>uL/Lgas</w:t>
             </w:r>
-            <w:proofErr w:type="spellEnd"/>
-            <w:r>
-              <w:rPr>
-                <w:rFonts w:ascii="Calibri" w:eastAsia="Times New Roman" w:hAnsi="Calibri" w:cs="Calibri"/>
-                <w:kern w:val="0"/>
-                <w:sz w:val="24"/>
-                <w:szCs w:val="24"/>
-                <w14:ligatures w14:val="none"/>
-              </w:rPr>
-              <w:t>/</w:t>
-            </w:r>
-            <w:proofErr w:type="spellStart"/>
-            <w:r>
-              <w:rPr>
-                <w:rFonts w:ascii="Calibri" w:eastAsia="Times New Roman" w:hAnsi="Calibri" w:cs="Calibri"/>
-                <w:kern w:val="0"/>
-                <w:sz w:val="24"/>
-                <w:szCs w:val="24"/>
-                <w14:ligatures w14:val="none"/>
-              </w:rPr>
-              <w:t>Lgas</w:t>
-            </w:r>
-            <w:proofErr w:type="spellEnd"/>
           </w:p>
         </w:tc>
         <w:tc>
@@ -8807,7 +8332,6 @@
                 <w14:ligatures w14:val="none"/>
               </w:rPr>
             </w:pPr>
-            <w:proofErr w:type="spellStart"/>
             <w:r>
               <w:rPr>
                 <w:rFonts w:ascii="Calibri" w:eastAsia="Times New Roman" w:hAnsi="Calibri" w:cs="Calibri"/>
@@ -8816,31 +8340,8 @@
                 <w:szCs w:val="24"/>
                 <w14:ligatures w14:val="none"/>
               </w:rPr>
-              <w:t>uL</w:t>
+              <w:t>uL/Lgas</w:t>
             </w:r>
-            <w:proofErr w:type="spellEnd"/>
-            <w:r>
-              <w:rPr>
-                <w:rFonts w:ascii="Calibri" w:eastAsia="Times New Roman" w:hAnsi="Calibri" w:cs="Calibri"/>
-                <w:kern w:val="0"/>
-                <w:sz w:val="24"/>
-                <w:szCs w:val="24"/>
-                <w14:ligatures w14:val="none"/>
-              </w:rPr>
-              <w:t>/</w:t>
-            </w:r>
-            <w:proofErr w:type="spellStart"/>
-            <w:r>
-              <w:rPr>
-                <w:rFonts w:ascii="Calibri" w:eastAsia="Times New Roman" w:hAnsi="Calibri" w:cs="Calibri"/>
-                <w:kern w:val="0"/>
-                <w:sz w:val="24"/>
-                <w:szCs w:val="24"/>
-                <w14:ligatures w14:val="none"/>
-              </w:rPr>
-              <w:t>Lgas</w:t>
-            </w:r>
-            <w:proofErr w:type="spellEnd"/>
           </w:p>
         </w:tc>
         <w:tc>
@@ -9055,7 +8556,6 @@
                 <w14:ligatures w14:val="none"/>
               </w:rPr>
             </w:pPr>
-            <w:proofErr w:type="spellStart"/>
             <w:r>
               <w:rPr>
                 <w:rFonts w:ascii="Calibri" w:eastAsia="Times New Roman" w:hAnsi="Calibri" w:cs="Calibri"/>
@@ -9064,31 +8564,8 @@
                 <w:szCs w:val="24"/>
                 <w14:ligatures w14:val="none"/>
               </w:rPr>
-              <w:t>uL</w:t>
+              <w:t>uL/Lgas</w:t>
             </w:r>
-            <w:proofErr w:type="spellEnd"/>
-            <w:r>
-              <w:rPr>
-                <w:rFonts w:ascii="Calibri" w:eastAsia="Times New Roman" w:hAnsi="Calibri" w:cs="Calibri"/>
-                <w:kern w:val="0"/>
-                <w:sz w:val="24"/>
-                <w:szCs w:val="24"/>
-                <w14:ligatures w14:val="none"/>
-              </w:rPr>
-              <w:t>/</w:t>
-            </w:r>
-            <w:proofErr w:type="spellStart"/>
-            <w:r>
-              <w:rPr>
-                <w:rFonts w:ascii="Calibri" w:eastAsia="Times New Roman" w:hAnsi="Calibri" w:cs="Calibri"/>
-                <w:kern w:val="0"/>
-                <w:sz w:val="24"/>
-                <w:szCs w:val="24"/>
-                <w14:ligatures w14:val="none"/>
-              </w:rPr>
-              <w:t>Lgas</w:t>
-            </w:r>
-            <w:proofErr w:type="spellEnd"/>
           </w:p>
         </w:tc>
         <w:tc>
@@ -10571,7 +10048,6 @@
         </w:rPr>
         <w:t xml:space="preserve">The Standards Names </w:t>
       </w:r>
-      <w:proofErr w:type="spellStart"/>
       <w:r>
         <w:rPr>
           <w:b/>
@@ -10579,9 +10055,9 @@
           <w:sz w:val="40"/>
           <w:szCs w:val="40"/>
         </w:rPr>
-        <w:t>PerSTDA</w:t>
-      </w:r>
-      <w:proofErr w:type="spellEnd"/>
+        <w:t xml:space="preserve">PerSTDA and PerSTD are not consistent </w:t>
+      </w:r>
+      <w:proofErr w:type="gramStart"/>
       <w:r>
         <w:rPr>
           <w:b/>
@@ -10589,40 +10065,8 @@
           <w:sz w:val="40"/>
           <w:szCs w:val="40"/>
         </w:rPr>
-        <w:t xml:space="preserve"> and </w:t>
-      </w:r>
-      <w:proofErr w:type="spellStart"/>
-      <w:r>
-        <w:rPr>
-          <w:b/>
-          <w:bCs/>
-          <w:sz w:val="40"/>
-          <w:szCs w:val="40"/>
-        </w:rPr>
-        <w:t>PerSTD</w:t>
-      </w:r>
-      <w:proofErr w:type="spellEnd"/>
-      <w:r>
-        <w:rPr>
-          <w:b/>
-          <w:bCs/>
-          <w:sz w:val="40"/>
-          <w:szCs w:val="40"/>
-        </w:rPr>
-        <w:t xml:space="preserve"> are not consistent </w:t>
-      </w:r>
-      <w:proofErr w:type="spellStart"/>
-      <w:proofErr w:type="gramStart"/>
-      <w:r>
-        <w:rPr>
-          <w:b/>
-          <w:bCs/>
-          <w:sz w:val="40"/>
-          <w:szCs w:val="40"/>
-        </w:rPr>
         <w:t>through out</w:t>
       </w:r>
-      <w:proofErr w:type="spellEnd"/>
       <w:proofErr w:type="gramEnd"/>
       <w:r>
         <w:rPr>
@@ -12068,6 +11512,287 @@
       <w:proofErr w:type="gramEnd"/>
       <w:r>
         <w:t xml:space="preserve"> a new standard. And are strangely consistent</w:t>
+      </w:r>
+    </w:p>
+    <w:p>
+      <w:r>
+        <w:br w:type="page"/>
+      </w:r>
+    </w:p>
+    <w:p>
+      <w:r>
+        <w:lastRenderedPageBreak/>
+        <w:t>2021-07-15</w:t>
+      </w:r>
+    </w:p>
+    <w:p>
+      <w:r>
+        <w:rPr>
+          <w:noProof/>
+        </w:rPr>
+        <w:drawing>
+          <wp:inline distT="0" distB="0" distL="0" distR="0" wp14:anchorId="49E061A1" wp14:editId="09BFCEEF">
+            <wp:extent cx="5911664" cy="3105241"/>
+            <wp:effectExtent l="0" t="0" r="0" b="0"/>
+            <wp:docPr id="2106566007" name="Picture 1"/>
+            <wp:cNvGraphicFramePr>
+              <a:graphicFrameLocks xmlns:a="http://schemas.openxmlformats.org/drawingml/2006/main" noChangeAspect="1"/>
+            </wp:cNvGraphicFramePr>
+            <a:graphic xmlns:a="http://schemas.openxmlformats.org/drawingml/2006/main">
+              <a:graphicData uri="http://schemas.openxmlformats.org/drawingml/2006/picture">
+                <pic:pic xmlns:pic="http://schemas.openxmlformats.org/drawingml/2006/picture">
+                  <pic:nvPicPr>
+                    <pic:cNvPr id="0" name="Picture 2"/>
+                    <pic:cNvPicPr>
+                      <a:picLocks noChangeAspect="1" noChangeArrowheads="1"/>
+                    </pic:cNvPicPr>
+                  </pic:nvPicPr>
+                  <pic:blipFill>
+                    <a:blip r:embed="rId114" cstate="print">
+                      <a:extLst>
+                        <a:ext uri="{28A0092B-C50C-407E-A947-70E740481C1C}">
+                          <a14:useLocalDpi xmlns:a14="http://schemas.microsoft.com/office/drawing/2010/main" val="0"/>
+                        </a:ext>
+                      </a:extLst>
+                    </a:blip>
+                    <a:srcRect/>
+                    <a:stretch>
+                      <a:fillRect/>
+                    </a:stretch>
+                  </pic:blipFill>
+                  <pic:spPr bwMode="auto">
+                    <a:xfrm>
+                      <a:off x="0" y="0"/>
+                      <a:ext cx="5950333" cy="3125553"/>
+                    </a:xfrm>
+                    <a:prstGeom prst="rect">
+                      <a:avLst/>
+                    </a:prstGeom>
+                    <a:noFill/>
+                  </pic:spPr>
+                </pic:pic>
+              </a:graphicData>
+            </a:graphic>
+          </wp:inline>
+        </w:drawing>
+      </w:r>
+    </w:p>
+    <w:p>
+      <w:r>
+        <w:rPr>
+          <w:noProof/>
+        </w:rPr>
+        <w:drawing>
+          <wp:inline distT="0" distB="0" distL="0" distR="0" wp14:anchorId="272075AA" wp14:editId="02BD5966">
+            <wp:extent cx="5930488" cy="3115129"/>
+            <wp:effectExtent l="0" t="0" r="0" b="9525"/>
+            <wp:docPr id="6657915" name="Picture 2"/>
+            <wp:cNvGraphicFramePr>
+              <a:graphicFrameLocks xmlns:a="http://schemas.openxmlformats.org/drawingml/2006/main" noChangeAspect="1"/>
+            </wp:cNvGraphicFramePr>
+            <a:graphic xmlns:a="http://schemas.openxmlformats.org/drawingml/2006/main">
+              <a:graphicData uri="http://schemas.openxmlformats.org/drawingml/2006/picture">
+                <pic:pic xmlns:pic="http://schemas.openxmlformats.org/drawingml/2006/picture">
+                  <pic:nvPicPr>
+                    <pic:cNvPr id="0" name="Picture 3"/>
+                    <pic:cNvPicPr>
+                      <a:picLocks noChangeAspect="1" noChangeArrowheads="1"/>
+                    </pic:cNvPicPr>
+                  </pic:nvPicPr>
+                  <pic:blipFill>
+                    <a:blip r:embed="rId115" cstate="print">
+                      <a:extLst>
+                        <a:ext uri="{28A0092B-C50C-407E-A947-70E740481C1C}">
+                          <a14:useLocalDpi xmlns:a14="http://schemas.microsoft.com/office/drawing/2010/main" val="0"/>
+                        </a:ext>
+                      </a:extLst>
+                    </a:blip>
+                    <a:srcRect/>
+                    <a:stretch>
+                      <a:fillRect/>
+                    </a:stretch>
+                  </pic:blipFill>
+                  <pic:spPr bwMode="auto">
+                    <a:xfrm>
+                      <a:off x="0" y="0"/>
+                      <a:ext cx="5965340" cy="3133436"/>
+                    </a:xfrm>
+                    <a:prstGeom prst="rect">
+                      <a:avLst/>
+                    </a:prstGeom>
+                    <a:noFill/>
+                  </pic:spPr>
+                </pic:pic>
+              </a:graphicData>
+            </a:graphic>
+          </wp:inline>
+        </w:drawing>
+      </w:r>
+    </w:p>
+    <w:p>
+      <w:r>
+        <w:t xml:space="preserve">Records 1510, </w:t>
+      </w:r>
+      <w:r>
+        <w:t xml:space="preserve">1521, </w:t>
+      </w:r>
+      <w:proofErr w:type="gramStart"/>
+      <w:r>
+        <w:t>1596 ,</w:t>
+      </w:r>
+      <w:proofErr w:type="gramEnd"/>
+      <w:r>
+        <w:t xml:space="preserve"> 1607 </w:t>
+      </w:r>
+      <w:r>
+        <w:t xml:space="preserve">and 1435 are strange. They are </w:t>
+      </w:r>
+      <w:proofErr w:type="gramStart"/>
+      <w:r>
+        <w:t>from</w:t>
+      </w:r>
+      <w:proofErr w:type="gramEnd"/>
+      <w:r>
+        <w:t xml:space="preserve"> a new standard. And are strangely consistent</w:t>
+      </w:r>
+      <w:r>
+        <w:t>.</w:t>
+      </w:r>
+    </w:p>
+    <w:p>
+      <w:r>
+        <w:br w:type="page"/>
+      </w:r>
+    </w:p>
+    <w:p>
+      <w:r>
+        <w:lastRenderedPageBreak/>
+        <w:t>2021-07-20</w:t>
+      </w:r>
+    </w:p>
+    <w:p>
+      <w:r>
+        <w:rPr>
+          <w:noProof/>
+        </w:rPr>
+        <w:drawing>
+          <wp:inline distT="0" distB="0" distL="0" distR="0" wp14:anchorId="1F6D13A2" wp14:editId="51BFA235">
+            <wp:extent cx="5885153" cy="3091315"/>
+            <wp:effectExtent l="0" t="0" r="1905" b="0"/>
+            <wp:docPr id="557926163" name="Picture 1"/>
+            <wp:cNvGraphicFramePr>
+              <a:graphicFrameLocks xmlns:a="http://schemas.openxmlformats.org/drawingml/2006/main" noChangeAspect="1"/>
+            </wp:cNvGraphicFramePr>
+            <a:graphic xmlns:a="http://schemas.openxmlformats.org/drawingml/2006/main">
+              <a:graphicData uri="http://schemas.openxmlformats.org/drawingml/2006/picture">
+                <pic:pic xmlns:pic="http://schemas.openxmlformats.org/drawingml/2006/picture">
+                  <pic:nvPicPr>
+                    <pic:cNvPr id="0" name="Picture 2"/>
+                    <pic:cNvPicPr>
+                      <a:picLocks noChangeAspect="1" noChangeArrowheads="1"/>
+                    </pic:cNvPicPr>
+                  </pic:nvPicPr>
+                  <pic:blipFill>
+                    <a:blip r:embed="rId116" cstate="print">
+                      <a:extLst>
+                        <a:ext uri="{28A0092B-C50C-407E-A947-70E740481C1C}">
+                          <a14:useLocalDpi xmlns:a14="http://schemas.microsoft.com/office/drawing/2010/main" val="0"/>
+                        </a:ext>
+                      </a:extLst>
+                    </a:blip>
+                    <a:srcRect/>
+                    <a:stretch>
+                      <a:fillRect/>
+                    </a:stretch>
+                  </pic:blipFill>
+                  <pic:spPr bwMode="auto">
+                    <a:xfrm>
+                      <a:off x="0" y="0"/>
+                      <a:ext cx="5910580" cy="3104671"/>
+                    </a:xfrm>
+                    <a:prstGeom prst="rect">
+                      <a:avLst/>
+                    </a:prstGeom>
+                    <a:noFill/>
+                  </pic:spPr>
+                </pic:pic>
+              </a:graphicData>
+            </a:graphic>
+          </wp:inline>
+        </w:drawing>
+      </w:r>
+    </w:p>
+    <w:p>
+      <w:r>
+        <w:rPr>
+          <w:noProof/>
+        </w:rPr>
+        <w:drawing>
+          <wp:inline distT="0" distB="0" distL="0" distR="0" wp14:anchorId="6EC5F94C" wp14:editId="7F8ACD62">
+            <wp:extent cx="5923632" cy="3111527"/>
+            <wp:effectExtent l="0" t="0" r="1270" b="0"/>
+            <wp:docPr id="69257954" name="Picture 2"/>
+            <wp:cNvGraphicFramePr>
+              <a:graphicFrameLocks xmlns:a="http://schemas.openxmlformats.org/drawingml/2006/main" noChangeAspect="1"/>
+            </wp:cNvGraphicFramePr>
+            <a:graphic xmlns:a="http://schemas.openxmlformats.org/drawingml/2006/main">
+              <a:graphicData uri="http://schemas.openxmlformats.org/drawingml/2006/picture">
+                <pic:pic xmlns:pic="http://schemas.openxmlformats.org/drawingml/2006/picture">
+                  <pic:nvPicPr>
+                    <pic:cNvPr id="0" name="Picture 3"/>
+                    <pic:cNvPicPr>
+                      <a:picLocks noChangeAspect="1" noChangeArrowheads="1"/>
+                    </pic:cNvPicPr>
+                  </pic:nvPicPr>
+                  <pic:blipFill>
+                    <a:blip r:embed="rId117" cstate="print">
+                      <a:extLst>
+                        <a:ext uri="{28A0092B-C50C-407E-A947-70E740481C1C}">
+                          <a14:useLocalDpi xmlns:a14="http://schemas.microsoft.com/office/drawing/2010/main" val="0"/>
+                        </a:ext>
+                      </a:extLst>
+                    </a:blip>
+                    <a:srcRect/>
+                    <a:stretch>
+                      <a:fillRect/>
+                    </a:stretch>
+                  </pic:blipFill>
+                  <pic:spPr bwMode="auto">
+                    <a:xfrm>
+                      <a:off x="0" y="0"/>
+                      <a:ext cx="5951308" cy="3126064"/>
+                    </a:xfrm>
+                    <a:prstGeom prst="rect">
+                      <a:avLst/>
+                    </a:prstGeom>
+                    <a:noFill/>
+                  </pic:spPr>
+                </pic:pic>
+              </a:graphicData>
+            </a:graphic>
+          </wp:inline>
+        </w:drawing>
+      </w:r>
+    </w:p>
+    <w:p>
+      <w:r>
+        <w:t xml:space="preserve">1768 and 1779 </w:t>
+      </w:r>
+      <w:proofErr w:type="gramStart"/>
+      <w:r>
+        <w:t>seemed  switched</w:t>
+      </w:r>
+      <w:proofErr w:type="gramEnd"/>
+      <w:r>
+        <w:t>; 50 is 100 and 100 is 50.</w:t>
+      </w:r>
+    </w:p>
+    <w:p>
+      <w:r>
+        <w:t>1693 and 1682 are way off</w:t>
+      </w:r>
+      <w:r>
+        <w:br w:type="page"/>
       </w:r>
     </w:p>
     <w:p/>

</xml_diff>

<commit_message>
Finished checking Standards by hand
</commit_message>
<xml_diff>
--- a/StrategicTillage_GC_Analysis_workFlow.docx
+++ b/StrategicTillage_GC_Analysis_workFlow.docx
@@ -109,29 +109,8 @@
       </w:r>
     </w:p>
     <w:p>
-      <w:proofErr w:type="gramStart"/>
-      <w:r>
-        <w:t>The N2O</w:t>
-      </w:r>
-      <w:proofErr w:type="gramEnd"/>
-      <w:r>
-        <w:t xml:space="preserve"> and CO2 emissions are too high.  The N2O emission measure calculated by Alli </w:t>
-      </w:r>
-      <w:proofErr w:type="gramStart"/>
-      <w:r>
-        <w:t>were</w:t>
-      </w:r>
-      <w:proofErr w:type="gramEnd"/>
-      <w:r>
-        <w:t xml:space="preserve"> around </w:t>
-      </w:r>
-      <w:proofErr w:type="gramStart"/>
-      <w:r>
-        <w:t>10  kg</w:t>
-      </w:r>
-      <w:proofErr w:type="gramEnd"/>
-      <w:r>
-        <w:t xml:space="preserve">-N/ha yr. </w:t>
+      <w:r>
+        <w:t xml:space="preserve">The N2O and CO2 emissions are too high.  The N2O emission measure calculated by Alli were around 10  kg-N/ha yr. </w:t>
       </w:r>
     </w:p>
     <w:p>
@@ -340,31 +319,7 @@
     </w:p>
     <w:p>
       <w:r>
-        <w:t xml:space="preserve">The calibration regression for the GC based on standards </w:t>
-      </w:r>
-      <w:proofErr w:type="gramStart"/>
-      <w:r>
-        <w:t>seem</w:t>
-      </w:r>
-      <w:proofErr w:type="gramEnd"/>
-      <w:r>
-        <w:t xml:space="preserve"> to be irrelevant, as the important aspect affecting the emissions is not the </w:t>
-      </w:r>
-      <w:proofErr w:type="gramStart"/>
-      <w:r>
-        <w:t>particular concentration</w:t>
-      </w:r>
-      <w:proofErr w:type="gramEnd"/>
-      <w:r>
-        <w:t xml:space="preserve"> data point, but the slope of the consequent concentration measurement inside the chamber that </w:t>
-      </w:r>
-      <w:proofErr w:type="gramStart"/>
-      <w:r>
-        <w:t>result</w:t>
-      </w:r>
-      <w:proofErr w:type="gramEnd"/>
-      <w:r>
-        <w:t xml:space="preserve"> in the emission rate.</w:t>
+        <w:t>The calibration regression for the GC based on standards seem to be irrelevant, as the important aspect affecting the emissions is not the particular concentration data point, but the slope of the consequent concentration measurement inside the chamber that result in the emission rate.</w:t>
       </w:r>
     </w:p>
     <w:p>
@@ -830,15 +785,7 @@
     <w:p/>
     <w:p>
       <w:r>
-        <w:t xml:space="preserve">The data from the GC does not </w:t>
-      </w:r>
-      <w:proofErr w:type="gramStart"/>
-      <w:r>
-        <w:t>seems</w:t>
-      </w:r>
-      <w:proofErr w:type="gramEnd"/>
-      <w:r>
-        <w:t xml:space="preserve"> to indicate any mayor difference in the results. The high emissions do not seem to be the result of the GC analysis.</w:t>
+        <w:t>The data from the GC does not seems to indicate any mayor difference in the results. The high emissions do not seem to be the result of the GC analysis.</w:t>
       </w:r>
     </w:p>
     <w:p>
@@ -1366,15 +1313,7 @@
     <w:p/>
     <w:p>
       <w:r>
-        <w:t xml:space="preserve">Plotting the daily emissions (period emissions) against time </w:t>
-      </w:r>
-      <w:proofErr w:type="gramStart"/>
-      <w:r>
-        <w:t>it is clear that the</w:t>
-      </w:r>
-      <w:proofErr w:type="gramEnd"/>
-      <w:r>
-        <w:t xml:space="preserve"> main factor determining the higher emissions in blocks 1 and 2 are high N2O emission peaks. Those peaks are not present in blocks 3 and 4.</w:t>
+        <w:t>Plotting the daily emissions (period emissions) against time it is clear that the main factor determining the higher emissions in blocks 1 and 2 are high N2O emission peaks. Those peaks are not present in blocks 3 and 4.</w:t>
       </w:r>
     </w:p>
     <w:p/>
@@ -1608,7 +1547,6 @@
       <w:r>
         <w:t xml:space="preserve">In 2021, Sampling date </w:t>
       </w:r>
-      <w:proofErr w:type="gramStart"/>
       <w:r>
         <w:t>20210614</w:t>
       </w:r>
@@ -1616,42 +1554,22 @@
         <w:t xml:space="preserve">, </w:t>
       </w:r>
       <w:r>
-        <w:t xml:space="preserve"> and</w:t>
-      </w:r>
-      <w:proofErr w:type="gramEnd"/>
+        <w:t xml:space="preserve"> and </w:t>
+      </w:r>
+      <w:r>
+        <w:t>20210629</w:t>
+      </w:r>
       <w:r>
         <w:t xml:space="preserve"> </w:t>
       </w:r>
       <w:r>
-        <w:t>20210629</w:t>
+        <w:t>has problems:  The red points in the graph below all belong</w:t>
       </w:r>
       <w:r>
         <w:t xml:space="preserve"> </w:t>
       </w:r>
       <w:r>
-        <w:t>has problems</w:t>
-      </w:r>
-      <w:proofErr w:type="gramStart"/>
-      <w:r>
-        <w:t>:  The</w:t>
-      </w:r>
-      <w:proofErr w:type="gramEnd"/>
-      <w:r>
-        <w:t xml:space="preserve"> red points in the graph below all </w:t>
-      </w:r>
-      <w:proofErr w:type="gramStart"/>
-      <w:r>
-        <w:t>belong</w:t>
-      </w:r>
-      <w:r>
-        <w:t xml:space="preserve"> </w:t>
-      </w:r>
-      <w:r>
-        <w:t xml:space="preserve"> to</w:t>
-      </w:r>
-      <w:proofErr w:type="gramEnd"/>
-      <w:r>
-        <w:t xml:space="preserve"> sampling day </w:t>
+        <w:t xml:space="preserve"> to sampling day </w:t>
       </w:r>
       <w:r>
         <w:t>20210614</w:t>
@@ -1835,49 +1753,7 @@
         <w:rPr>
           <w:highlight w:val="yellow"/>
         </w:rPr>
-        <w:t xml:space="preserve">The final data for the mass flux calculations was taken from f0 and the missing data from “data error” from </w:t>
-      </w:r>
-      <w:proofErr w:type="gramStart"/>
-      <w:r>
-        <w:rPr>
-          <w:highlight w:val="yellow"/>
-        </w:rPr>
-        <w:t>LR.f</w:t>
-      </w:r>
-      <w:proofErr w:type="gramEnd"/>
-      <w:r>
-        <w:rPr>
-          <w:highlight w:val="yellow"/>
-        </w:rPr>
-        <w:t xml:space="preserve">0. For N2O and CH4 all the data </w:t>
-      </w:r>
-      <w:proofErr w:type="gramStart"/>
-      <w:r>
-        <w:rPr>
-          <w:highlight w:val="yellow"/>
-        </w:rPr>
-        <w:t>has to</w:t>
-      </w:r>
-      <w:proofErr w:type="gramEnd"/>
-      <w:r>
-        <w:rPr>
-          <w:highlight w:val="yellow"/>
-        </w:rPr>
-        <w:t xml:space="preserve"> come from </w:t>
-      </w:r>
-      <w:proofErr w:type="gramStart"/>
-      <w:r>
-        <w:rPr>
-          <w:highlight w:val="yellow"/>
-        </w:rPr>
-        <w:t>LR.f</w:t>
-      </w:r>
-      <w:proofErr w:type="gramEnd"/>
-      <w:r>
-        <w:rPr>
-          <w:highlight w:val="yellow"/>
-        </w:rPr>
-        <w:t>0.</w:t>
+        <w:t>The final data for the mass flux calculations was taken from f0 and the missing data from “data error” from LR.f0. For N2O and CH4 all the data has to come from LR.f0.</w:t>
       </w:r>
     </w:p>
     <w:p>
@@ -4239,7 +4115,6 @@
           <w14:ligatures w14:val="none"/>
         </w:rPr>
       </w:pPr>
-      <w:proofErr w:type="gramStart"/>
       <w:r>
         <w:rPr>
           <w:rFonts w:ascii="Lucida Console" w:eastAsia="Times New Roman" w:hAnsi="Lucida Console" w:cs="Courier New"/>
@@ -4249,19 +4124,7 @@
           <w:szCs w:val="20"/>
           <w14:ligatures w14:val="none"/>
         </w:rPr>
-        <w:t>summary(Cumm.Stat.Anal</w:t>
-      </w:r>
-      <w:proofErr w:type="gramEnd"/>
-      <w:r>
-        <w:rPr>
-          <w:rFonts w:ascii="Lucida Console" w:eastAsia="Times New Roman" w:hAnsi="Lucida Console" w:cs="Courier New"/>
-          <w:color w:val="0000FF"/>
-          <w:kern w:val="0"/>
-          <w:sz w:val="20"/>
-          <w:szCs w:val="20"/>
-          <w14:ligatures w14:val="none"/>
-        </w:rPr>
-        <w:t>)</w:t>
+        <w:t>summary(Cumm.Stat.Anal)</w:t>
       </w:r>
     </w:p>
     <w:p>
@@ -4377,7 +4240,6 @@
           <w14:ligatures w14:val="none"/>
         </w:rPr>
       </w:pPr>
-      <w:proofErr w:type="gramStart"/>
       <w:r>
         <w:rPr>
           <w:rFonts w:ascii="Lucida Console" w:eastAsia="Times New Roman" w:hAnsi="Lucida Console" w:cs="Courier New"/>
@@ -4388,46 +4250,7 @@
           <w:bdr w:val="none" w:sz="0" w:space="0" w:color="auto" w:frame="1"/>
           <w14:ligatures w14:val="none"/>
         </w:rPr>
-        <w:t>lm(</w:t>
-      </w:r>
-      <w:proofErr w:type="gramEnd"/>
-      <w:r>
-        <w:rPr>
-          <w:rFonts w:ascii="Lucida Console" w:eastAsia="Times New Roman" w:hAnsi="Lucida Console" w:cs="Courier New"/>
-          <w:color w:val="000000"/>
-          <w:kern w:val="0"/>
-          <w:sz w:val="20"/>
-          <w:szCs w:val="20"/>
-          <w:bdr w:val="none" w:sz="0" w:space="0" w:color="auto" w:frame="1"/>
-          <w14:ligatures w14:val="none"/>
-        </w:rPr>
-        <w:t xml:space="preserve">formula = </w:t>
-      </w:r>
-      <w:proofErr w:type="gramStart"/>
-      <w:r>
-        <w:rPr>
-          <w:rFonts w:ascii="Lucida Console" w:eastAsia="Times New Roman" w:hAnsi="Lucida Console" w:cs="Courier New"/>
-          <w:color w:val="000000"/>
-          <w:kern w:val="0"/>
-          <w:sz w:val="20"/>
-          <w:szCs w:val="20"/>
-          <w:bdr w:val="none" w:sz="0" w:space="0" w:color="auto" w:frame="1"/>
-          <w14:ligatures w14:val="none"/>
-        </w:rPr>
-        <w:t>Total.Cum.Emissions</w:t>
-      </w:r>
-      <w:proofErr w:type="gramEnd"/>
-      <w:r>
-        <w:rPr>
-          <w:rFonts w:ascii="Lucida Console" w:eastAsia="Times New Roman" w:hAnsi="Lucida Console" w:cs="Courier New"/>
-          <w:color w:val="000000"/>
-          <w:kern w:val="0"/>
-          <w:sz w:val="20"/>
-          <w:szCs w:val="20"/>
-          <w:bdr w:val="none" w:sz="0" w:space="0" w:color="auto" w:frame="1"/>
-          <w14:ligatures w14:val="none"/>
-        </w:rPr>
-        <w:t xml:space="preserve"> ~ BLOCK.F + Sampling.Year + </w:t>
+        <w:t xml:space="preserve">lm(formula = Total.Cum.Emissions ~ BLOCK.F + Sampling.Year + </w:t>
       </w:r>
     </w:p>
     <w:p>
@@ -4473,33 +4296,7 @@
           <w:bdr w:val="none" w:sz="0" w:space="0" w:color="auto" w:frame="1"/>
           <w14:ligatures w14:val="none"/>
         </w:rPr>
-        <w:t xml:space="preserve">    CoverCrop.F + Treatment.F, data = </w:t>
-      </w:r>
-      <w:proofErr w:type="gramStart"/>
-      <w:r>
-        <w:rPr>
-          <w:rFonts w:ascii="Lucida Console" w:eastAsia="Times New Roman" w:hAnsi="Lucida Console" w:cs="Courier New"/>
-          <w:color w:val="000000"/>
-          <w:kern w:val="0"/>
-          <w:sz w:val="20"/>
-          <w:szCs w:val="20"/>
-          <w:bdr w:val="none" w:sz="0" w:space="0" w:color="auto" w:frame="1"/>
-          <w14:ligatures w14:val="none"/>
-        </w:rPr>
-        <w:t>Cumm.Emm.Analysis</w:t>
-      </w:r>
-      <w:proofErr w:type="gramEnd"/>
-      <w:r>
-        <w:rPr>
-          <w:rFonts w:ascii="Lucida Console" w:eastAsia="Times New Roman" w:hAnsi="Lucida Console" w:cs="Courier New"/>
-          <w:color w:val="000000"/>
-          <w:kern w:val="0"/>
-          <w:sz w:val="20"/>
-          <w:szCs w:val="20"/>
-          <w:bdr w:val="none" w:sz="0" w:space="0" w:color="auto" w:frame="1"/>
-          <w14:ligatures w14:val="none"/>
-        </w:rPr>
-        <w:t>.2)</w:t>
+        <w:t xml:space="preserve">    CoverCrop.F + Treatment.F, data = Cumm.Emm.Analysis.2)</w:t>
       </w:r>
     </w:p>
     <w:p>
@@ -4625,33 +4422,7 @@
           <w:bdr w:val="none" w:sz="0" w:space="0" w:color="auto" w:frame="1"/>
           <w14:ligatures w14:val="none"/>
         </w:rPr>
-        <w:t xml:space="preserve">    Min      1</w:t>
-      </w:r>
-      <w:proofErr w:type="gramStart"/>
-      <w:r>
-        <w:rPr>
-          <w:rFonts w:ascii="Lucida Console" w:eastAsia="Times New Roman" w:hAnsi="Lucida Console" w:cs="Courier New"/>
-          <w:color w:val="000000"/>
-          <w:kern w:val="0"/>
-          <w:sz w:val="20"/>
-          <w:szCs w:val="20"/>
-          <w:bdr w:val="none" w:sz="0" w:space="0" w:color="auto" w:frame="1"/>
-          <w14:ligatures w14:val="none"/>
-        </w:rPr>
-        <w:t>Q  Median</w:t>
-      </w:r>
-      <w:proofErr w:type="gramEnd"/>
-      <w:r>
-        <w:rPr>
-          <w:rFonts w:ascii="Lucida Console" w:eastAsia="Times New Roman" w:hAnsi="Lucida Console" w:cs="Courier New"/>
-          <w:color w:val="000000"/>
-          <w:kern w:val="0"/>
-          <w:sz w:val="20"/>
-          <w:szCs w:val="20"/>
-          <w:bdr w:val="none" w:sz="0" w:space="0" w:color="auto" w:frame="1"/>
-          <w14:ligatures w14:val="none"/>
-        </w:rPr>
-        <w:t xml:space="preserve">      3Q     Max </w:t>
+        <w:t xml:space="preserve">    Min      1Q  Median      3Q     Max </w:t>
       </w:r>
     </w:p>
     <w:p>
@@ -4697,85 +4468,7 @@
           <w:bdr w:val="none" w:sz="0" w:space="0" w:color="auto" w:frame="1"/>
           <w14:ligatures w14:val="none"/>
         </w:rPr>
-        <w:t>-21.</w:t>
-      </w:r>
-      <w:proofErr w:type="gramStart"/>
-      <w:r>
-        <w:rPr>
-          <w:rFonts w:ascii="Lucida Console" w:eastAsia="Times New Roman" w:hAnsi="Lucida Console" w:cs="Courier New"/>
-          <w:color w:val="000000"/>
-          <w:kern w:val="0"/>
-          <w:sz w:val="20"/>
-          <w:szCs w:val="20"/>
-          <w:bdr w:val="none" w:sz="0" w:space="0" w:color="auto" w:frame="1"/>
-          <w14:ligatures w14:val="none"/>
-        </w:rPr>
-        <w:t>204  -</w:t>
-      </w:r>
-      <w:proofErr w:type="gramEnd"/>
-      <w:r>
-        <w:rPr>
-          <w:rFonts w:ascii="Lucida Console" w:eastAsia="Times New Roman" w:hAnsi="Lucida Console" w:cs="Courier New"/>
-          <w:color w:val="000000"/>
-          <w:kern w:val="0"/>
-          <w:sz w:val="20"/>
-          <w:szCs w:val="20"/>
-          <w:bdr w:val="none" w:sz="0" w:space="0" w:color="auto" w:frame="1"/>
-          <w14:ligatures w14:val="none"/>
-        </w:rPr>
-        <w:t>7.</w:t>
-      </w:r>
-      <w:proofErr w:type="gramStart"/>
-      <w:r>
-        <w:rPr>
-          <w:rFonts w:ascii="Lucida Console" w:eastAsia="Times New Roman" w:hAnsi="Lucida Console" w:cs="Courier New"/>
-          <w:color w:val="000000"/>
-          <w:kern w:val="0"/>
-          <w:sz w:val="20"/>
-          <w:szCs w:val="20"/>
-          <w:bdr w:val="none" w:sz="0" w:space="0" w:color="auto" w:frame="1"/>
-          <w14:ligatures w14:val="none"/>
-        </w:rPr>
-        <w:t>452  -</w:t>
-      </w:r>
-      <w:proofErr w:type="gramEnd"/>
-      <w:r>
-        <w:rPr>
-          <w:rFonts w:ascii="Lucida Console" w:eastAsia="Times New Roman" w:hAnsi="Lucida Console" w:cs="Courier New"/>
-          <w:color w:val="000000"/>
-          <w:kern w:val="0"/>
-          <w:sz w:val="20"/>
-          <w:szCs w:val="20"/>
-          <w:bdr w:val="none" w:sz="0" w:space="0" w:color="auto" w:frame="1"/>
-          <w14:ligatures w14:val="none"/>
-        </w:rPr>
-        <w:t xml:space="preserve">0.579   </w:t>
-      </w:r>
-      <w:proofErr w:type="gramStart"/>
-      <w:r>
-        <w:rPr>
-          <w:rFonts w:ascii="Lucida Console" w:eastAsia="Times New Roman" w:hAnsi="Lucida Console" w:cs="Courier New"/>
-          <w:color w:val="000000"/>
-          <w:kern w:val="0"/>
-          <w:sz w:val="20"/>
-          <w:szCs w:val="20"/>
-          <w:bdr w:val="none" w:sz="0" w:space="0" w:color="auto" w:frame="1"/>
-          <w14:ligatures w14:val="none"/>
-        </w:rPr>
-        <w:t>4.777  41.906</w:t>
-      </w:r>
-      <w:proofErr w:type="gramEnd"/>
-      <w:r>
-        <w:rPr>
-          <w:rFonts w:ascii="Lucida Console" w:eastAsia="Times New Roman" w:hAnsi="Lucida Console" w:cs="Courier New"/>
-          <w:color w:val="000000"/>
-          <w:kern w:val="0"/>
-          <w:sz w:val="20"/>
-          <w:szCs w:val="20"/>
-          <w:bdr w:val="none" w:sz="0" w:space="0" w:color="auto" w:frame="1"/>
-          <w14:ligatures w14:val="none"/>
-        </w:rPr>
-        <w:t xml:space="preserve"> </w:t>
+        <w:t xml:space="preserve">-21.204  -7.452  -0.579   4.777  41.906 </w:t>
       </w:r>
     </w:p>
     <w:p>
@@ -4947,59 +4640,7 @@
           <w:bdr w:val="none" w:sz="0" w:space="0" w:color="auto" w:frame="1"/>
           <w14:ligatures w14:val="none"/>
         </w:rPr>
-        <w:t>(</w:t>
-      </w:r>
-      <w:proofErr w:type="gramStart"/>
-      <w:r>
-        <w:rPr>
-          <w:rFonts w:ascii="Lucida Console" w:eastAsia="Times New Roman" w:hAnsi="Lucida Console" w:cs="Courier New"/>
-          <w:color w:val="000000"/>
-          <w:kern w:val="0"/>
-          <w:sz w:val="20"/>
-          <w:szCs w:val="20"/>
-          <w:bdr w:val="none" w:sz="0" w:space="0" w:color="auto" w:frame="1"/>
-          <w14:ligatures w14:val="none"/>
-        </w:rPr>
-        <w:t xml:space="preserve">Intercept)   </w:t>
-      </w:r>
-      <w:proofErr w:type="gramEnd"/>
-      <w:r>
-        <w:rPr>
-          <w:rFonts w:ascii="Lucida Console" w:eastAsia="Times New Roman" w:hAnsi="Lucida Console" w:cs="Courier New"/>
-          <w:color w:val="000000"/>
-          <w:kern w:val="0"/>
-          <w:sz w:val="20"/>
-          <w:szCs w:val="20"/>
-          <w:bdr w:val="none" w:sz="0" w:space="0" w:color="auto" w:frame="1"/>
-          <w14:ligatures w14:val="none"/>
-        </w:rPr>
-        <w:t xml:space="preserve">     17.9614     3.9252   4.576 </w:t>
-      </w:r>
-      <w:proofErr w:type="gramStart"/>
-      <w:r>
-        <w:rPr>
-          <w:rFonts w:ascii="Lucida Console" w:eastAsia="Times New Roman" w:hAnsi="Lucida Console" w:cs="Courier New"/>
-          <w:color w:val="000000"/>
-          <w:kern w:val="0"/>
-          <w:sz w:val="20"/>
-          <w:szCs w:val="20"/>
-          <w:bdr w:val="none" w:sz="0" w:space="0" w:color="auto" w:frame="1"/>
-          <w14:ligatures w14:val="none"/>
-        </w:rPr>
-        <w:t xml:space="preserve">   2e</w:t>
-      </w:r>
-      <w:proofErr w:type="gramEnd"/>
-      <w:r>
-        <w:rPr>
-          <w:rFonts w:ascii="Lucida Console" w:eastAsia="Times New Roman" w:hAnsi="Lucida Console" w:cs="Courier New"/>
-          <w:color w:val="000000"/>
-          <w:kern w:val="0"/>
-          <w:sz w:val="20"/>
-          <w:szCs w:val="20"/>
-          <w:bdr w:val="none" w:sz="0" w:space="0" w:color="auto" w:frame="1"/>
-          <w14:ligatures w14:val="none"/>
-        </w:rPr>
-        <w:t>-05 ***</w:t>
+        <w:t>(Intercept)        17.9614     3.9252   4.576    2e-05 ***</w:t>
       </w:r>
     </w:p>
     <w:p>
@@ -5091,33 +4732,7 @@
           <w:bdr w:val="none" w:sz="0" w:space="0" w:color="auto" w:frame="1"/>
           <w14:ligatures w14:val="none"/>
         </w:rPr>
-        <w:t xml:space="preserve">BLOCK.F3          -14.7355     </w:t>
-      </w:r>
-      <w:proofErr w:type="gramStart"/>
-      <w:r>
-        <w:rPr>
-          <w:rFonts w:ascii="Lucida Console" w:eastAsia="Times New Roman" w:hAnsi="Lucida Console" w:cs="Courier New"/>
-          <w:color w:val="000000"/>
-          <w:kern w:val="0"/>
-          <w:sz w:val="20"/>
-          <w:szCs w:val="20"/>
-          <w:bdr w:val="none" w:sz="0" w:space="0" w:color="auto" w:frame="1"/>
-          <w14:ligatures w14:val="none"/>
-        </w:rPr>
-        <w:t>3.5916  -</w:t>
-      </w:r>
-      <w:proofErr w:type="gramEnd"/>
-      <w:r>
-        <w:rPr>
-          <w:rFonts w:ascii="Lucida Console" w:eastAsia="Times New Roman" w:hAnsi="Lucida Console" w:cs="Courier New"/>
-          <w:color w:val="000000"/>
-          <w:kern w:val="0"/>
-          <w:sz w:val="20"/>
-          <w:szCs w:val="20"/>
-          <w:bdr w:val="none" w:sz="0" w:space="0" w:color="auto" w:frame="1"/>
-          <w14:ligatures w14:val="none"/>
-        </w:rPr>
-        <w:t>4.103 0.000109 ***</w:t>
+        <w:t>BLOCK.F3          -14.7355     3.5916  -4.103 0.000109 ***</w:t>
       </w:r>
     </w:p>
     <w:p>
@@ -5163,33 +4778,7 @@
           <w:bdr w:val="none" w:sz="0" w:space="0" w:color="auto" w:frame="1"/>
           <w14:ligatures w14:val="none"/>
         </w:rPr>
-        <w:t xml:space="preserve">BLOCK.F4          -12.3094     </w:t>
-      </w:r>
-      <w:proofErr w:type="gramStart"/>
-      <w:r>
-        <w:rPr>
-          <w:rFonts w:ascii="Lucida Console" w:eastAsia="Times New Roman" w:hAnsi="Lucida Console" w:cs="Courier New"/>
-          <w:color w:val="000000"/>
-          <w:kern w:val="0"/>
-          <w:sz w:val="20"/>
-          <w:szCs w:val="20"/>
-          <w:bdr w:val="none" w:sz="0" w:space="0" w:color="auto" w:frame="1"/>
-          <w14:ligatures w14:val="none"/>
-        </w:rPr>
-        <w:t>3.5916  -</w:t>
-      </w:r>
-      <w:proofErr w:type="gramEnd"/>
-      <w:r>
-        <w:rPr>
-          <w:rFonts w:ascii="Lucida Console" w:eastAsia="Times New Roman" w:hAnsi="Lucida Console" w:cs="Courier New"/>
-          <w:color w:val="000000"/>
-          <w:kern w:val="0"/>
-          <w:sz w:val="20"/>
-          <w:szCs w:val="20"/>
-          <w:bdr w:val="none" w:sz="0" w:space="0" w:color="auto" w:frame="1"/>
-          <w14:ligatures w14:val="none"/>
-        </w:rPr>
-        <w:t xml:space="preserve">3.427 0.001025 ** </w:t>
+        <w:t xml:space="preserve">BLOCK.F4          -12.3094     3.5916  -3.427 0.001025 ** </w:t>
       </w:r>
     </w:p>
     <w:p>
@@ -5235,59 +4824,7 @@
           <w:bdr w:val="none" w:sz="0" w:space="0" w:color="auto" w:frame="1"/>
           <w14:ligatures w14:val="none"/>
         </w:rPr>
-        <w:t>Sampling.Year</w:t>
-      </w:r>
-      <w:proofErr w:type="gramStart"/>
-      <w:r>
-        <w:rPr>
-          <w:rFonts w:ascii="Lucida Console" w:eastAsia="Times New Roman" w:hAnsi="Lucida Console" w:cs="Courier New"/>
-          <w:color w:val="000000"/>
-          <w:kern w:val="0"/>
-          <w:sz w:val="20"/>
-          <w:szCs w:val="20"/>
-          <w:bdr w:val="none" w:sz="0" w:space="0" w:color="auto" w:frame="1"/>
-          <w14:ligatures w14:val="none"/>
-        </w:rPr>
-        <w:t>2022  -</w:t>
-      </w:r>
-      <w:proofErr w:type="gramEnd"/>
-      <w:r>
-        <w:rPr>
-          <w:rFonts w:ascii="Lucida Console" w:eastAsia="Times New Roman" w:hAnsi="Lucida Console" w:cs="Courier New"/>
-          <w:color w:val="000000"/>
-          <w:kern w:val="0"/>
-          <w:sz w:val="20"/>
-          <w:szCs w:val="20"/>
-          <w:bdr w:val="none" w:sz="0" w:space="0" w:color="auto" w:frame="1"/>
-          <w14:ligatures w14:val="none"/>
-        </w:rPr>
-        <w:t xml:space="preserve">9.7553     </w:t>
-      </w:r>
-      <w:proofErr w:type="gramStart"/>
-      <w:r>
-        <w:rPr>
-          <w:rFonts w:ascii="Lucida Console" w:eastAsia="Times New Roman" w:hAnsi="Lucida Console" w:cs="Courier New"/>
-          <w:color w:val="000000"/>
-          <w:kern w:val="0"/>
-          <w:sz w:val="20"/>
-          <w:szCs w:val="20"/>
-          <w:bdr w:val="none" w:sz="0" w:space="0" w:color="auto" w:frame="1"/>
-          <w14:ligatures w14:val="none"/>
-        </w:rPr>
-        <w:t>2.5396  -</w:t>
-      </w:r>
-      <w:proofErr w:type="gramEnd"/>
-      <w:r>
-        <w:rPr>
-          <w:rFonts w:ascii="Lucida Console" w:eastAsia="Times New Roman" w:hAnsi="Lucida Console" w:cs="Courier New"/>
-          <w:color w:val="000000"/>
-          <w:kern w:val="0"/>
-          <w:sz w:val="20"/>
-          <w:szCs w:val="20"/>
-          <w:bdr w:val="none" w:sz="0" w:space="0" w:color="auto" w:frame="1"/>
-          <w14:ligatures w14:val="none"/>
-        </w:rPr>
-        <w:t>3.841 0.000266 ***</w:t>
+        <w:t>Sampling.Year2022  -9.7553     2.5396  -3.841 0.000266 ***</w:t>
       </w:r>
     </w:p>
     <w:p>
@@ -5379,33 +4916,7 @@
           <w:bdr w:val="none" w:sz="0" w:space="0" w:color="auto" w:frame="1"/>
           <w14:ligatures w14:val="none"/>
         </w:rPr>
-        <w:t xml:space="preserve">CoverCrop.FTrit    -0.4087     </w:t>
-      </w:r>
-      <w:proofErr w:type="gramStart"/>
-      <w:r>
-        <w:rPr>
-          <w:rFonts w:ascii="Lucida Console" w:eastAsia="Times New Roman" w:hAnsi="Lucida Console" w:cs="Courier New"/>
-          <w:color w:val="000000"/>
-          <w:kern w:val="0"/>
-          <w:sz w:val="20"/>
-          <w:szCs w:val="20"/>
-          <w:bdr w:val="none" w:sz="0" w:space="0" w:color="auto" w:frame="1"/>
-          <w14:ligatures w14:val="none"/>
-        </w:rPr>
-        <w:t>3.2786  -</w:t>
-      </w:r>
-      <w:proofErr w:type="gramEnd"/>
-      <w:r>
-        <w:rPr>
-          <w:rFonts w:ascii="Lucida Console" w:eastAsia="Times New Roman" w:hAnsi="Lucida Console" w:cs="Courier New"/>
-          <w:color w:val="000000"/>
-          <w:kern w:val="0"/>
-          <w:sz w:val="20"/>
-          <w:szCs w:val="20"/>
-          <w:bdr w:val="none" w:sz="0" w:space="0" w:color="auto" w:frame="1"/>
-          <w14:ligatures w14:val="none"/>
-        </w:rPr>
-        <w:t xml:space="preserve">0.125 0.901165    </w:t>
+        <w:t xml:space="preserve">CoverCrop.FTrit    -0.4087     3.2786  -0.125 0.901165    </w:t>
       </w:r>
     </w:p>
     <w:p>
@@ -5451,33 +4962,7 @@
           <w:bdr w:val="none" w:sz="0" w:space="0" w:color="auto" w:frame="1"/>
           <w14:ligatures w14:val="none"/>
         </w:rPr>
-        <w:t>Treatment.FB        6.2892     3.2786   1.918 0.</w:t>
-      </w:r>
-      <w:proofErr w:type="gramStart"/>
-      <w:r>
-        <w:rPr>
-          <w:rFonts w:ascii="Lucida Console" w:eastAsia="Times New Roman" w:hAnsi="Lucida Console" w:cs="Courier New"/>
-          <w:color w:val="000000"/>
-          <w:kern w:val="0"/>
-          <w:sz w:val="20"/>
-          <w:szCs w:val="20"/>
-          <w:bdr w:val="none" w:sz="0" w:space="0" w:color="auto" w:frame="1"/>
-          <w14:ligatures w14:val="none"/>
-        </w:rPr>
-        <w:t>059162 .</w:t>
-      </w:r>
-      <w:proofErr w:type="gramEnd"/>
-      <w:r>
-        <w:rPr>
-          <w:rFonts w:ascii="Lucida Console" w:eastAsia="Times New Roman" w:hAnsi="Lucida Console" w:cs="Courier New"/>
-          <w:color w:val="000000"/>
-          <w:kern w:val="0"/>
-          <w:sz w:val="20"/>
-          <w:szCs w:val="20"/>
-          <w:bdr w:val="none" w:sz="0" w:space="0" w:color="auto" w:frame="1"/>
-          <w14:ligatures w14:val="none"/>
-        </w:rPr>
-        <w:t xml:space="preserve">  </w:t>
+        <w:t xml:space="preserve">Treatment.FB        6.2892     3.2786   1.918 0.059162 .  </w:t>
       </w:r>
     </w:p>
     <w:p>
@@ -5569,33 +5054,7 @@
           <w:bdr w:val="none" w:sz="0" w:space="0" w:color="auto" w:frame="1"/>
           <w14:ligatures w14:val="none"/>
         </w:rPr>
-        <w:t xml:space="preserve">Treatment.FD       -0.8080     </w:t>
-      </w:r>
-      <w:proofErr w:type="gramStart"/>
-      <w:r>
-        <w:rPr>
-          <w:rFonts w:ascii="Lucida Console" w:eastAsia="Times New Roman" w:hAnsi="Lucida Console" w:cs="Courier New"/>
-          <w:color w:val="000000"/>
-          <w:kern w:val="0"/>
-          <w:sz w:val="20"/>
-          <w:szCs w:val="20"/>
-          <w:bdr w:val="none" w:sz="0" w:space="0" w:color="auto" w:frame="1"/>
-          <w14:ligatures w14:val="none"/>
-        </w:rPr>
-        <w:t>5.0082  -</w:t>
-      </w:r>
-      <w:proofErr w:type="gramEnd"/>
-      <w:r>
-        <w:rPr>
-          <w:rFonts w:ascii="Lucida Console" w:eastAsia="Times New Roman" w:hAnsi="Lucida Console" w:cs="Courier New"/>
-          <w:color w:val="000000"/>
-          <w:kern w:val="0"/>
-          <w:sz w:val="20"/>
-          <w:szCs w:val="20"/>
-          <w:bdr w:val="none" w:sz="0" w:space="0" w:color="auto" w:frame="1"/>
-          <w14:ligatures w14:val="none"/>
-        </w:rPr>
-        <w:t xml:space="preserve">0.161 0.872300    </w:t>
+        <w:t xml:space="preserve">Treatment.FD       -0.8080     5.0082  -0.161 0.872300    </w:t>
       </w:r>
     </w:p>
     <w:p>
@@ -5687,111 +5146,7 @@
           <w:bdr w:val="none" w:sz="0" w:space="0" w:color="auto" w:frame="1"/>
           <w14:ligatures w14:val="none"/>
         </w:rPr>
-        <w:t>Signif. codes</w:t>
-      </w:r>
-      <w:proofErr w:type="gramStart"/>
-      <w:r>
-        <w:rPr>
-          <w:rFonts w:ascii="Lucida Console" w:eastAsia="Times New Roman" w:hAnsi="Lucida Console" w:cs="Courier New"/>
-          <w:color w:val="000000"/>
-          <w:kern w:val="0"/>
-          <w:sz w:val="20"/>
-          <w:szCs w:val="20"/>
-          <w:bdr w:val="none" w:sz="0" w:space="0" w:color="auto" w:frame="1"/>
-          <w14:ligatures w14:val="none"/>
-        </w:rPr>
-        <w:t>:  0 ‘</w:t>
-      </w:r>
-      <w:proofErr w:type="gramEnd"/>
-      <w:r>
-        <w:rPr>
-          <w:rFonts w:ascii="Lucida Console" w:eastAsia="Times New Roman" w:hAnsi="Lucida Console" w:cs="Courier New"/>
-          <w:color w:val="000000"/>
-          <w:kern w:val="0"/>
-          <w:sz w:val="20"/>
-          <w:szCs w:val="20"/>
-          <w:bdr w:val="none" w:sz="0" w:space="0" w:color="auto" w:frame="1"/>
-          <w14:ligatures w14:val="none"/>
-        </w:rPr>
-        <w:t xml:space="preserve">***’ </w:t>
-      </w:r>
-      <w:proofErr w:type="gramStart"/>
-      <w:r>
-        <w:rPr>
-          <w:rFonts w:ascii="Lucida Console" w:eastAsia="Times New Roman" w:hAnsi="Lucida Console" w:cs="Courier New"/>
-          <w:color w:val="000000"/>
-          <w:kern w:val="0"/>
-          <w:sz w:val="20"/>
-          <w:szCs w:val="20"/>
-          <w:bdr w:val="none" w:sz="0" w:space="0" w:color="auto" w:frame="1"/>
-          <w14:ligatures w14:val="none"/>
-        </w:rPr>
-        <w:t>0.001 ‘*</w:t>
-      </w:r>
-      <w:proofErr w:type="gramEnd"/>
-      <w:r>
-        <w:rPr>
-          <w:rFonts w:ascii="Lucida Console" w:eastAsia="Times New Roman" w:hAnsi="Lucida Console" w:cs="Courier New"/>
-          <w:color w:val="000000"/>
-          <w:kern w:val="0"/>
-          <w:sz w:val="20"/>
-          <w:szCs w:val="20"/>
-          <w:bdr w:val="none" w:sz="0" w:space="0" w:color="auto" w:frame="1"/>
-          <w14:ligatures w14:val="none"/>
-        </w:rPr>
-        <w:t xml:space="preserve">*’ </w:t>
-      </w:r>
-      <w:proofErr w:type="gramStart"/>
-      <w:r>
-        <w:rPr>
-          <w:rFonts w:ascii="Lucida Console" w:eastAsia="Times New Roman" w:hAnsi="Lucida Console" w:cs="Courier New"/>
-          <w:color w:val="000000"/>
-          <w:kern w:val="0"/>
-          <w:sz w:val="20"/>
-          <w:szCs w:val="20"/>
-          <w:bdr w:val="none" w:sz="0" w:space="0" w:color="auto" w:frame="1"/>
-          <w14:ligatures w14:val="none"/>
-        </w:rPr>
-        <w:t>0.01 ‘*</w:t>
-      </w:r>
-      <w:proofErr w:type="gramEnd"/>
-      <w:r>
-        <w:rPr>
-          <w:rFonts w:ascii="Lucida Console" w:eastAsia="Times New Roman" w:hAnsi="Lucida Console" w:cs="Courier New"/>
-          <w:color w:val="000000"/>
-          <w:kern w:val="0"/>
-          <w:sz w:val="20"/>
-          <w:szCs w:val="20"/>
-          <w:bdr w:val="none" w:sz="0" w:space="0" w:color="auto" w:frame="1"/>
-          <w14:ligatures w14:val="none"/>
-        </w:rPr>
-        <w:t xml:space="preserve">’ 0.05 ‘.’ 0.1 </w:t>
-      </w:r>
-      <w:proofErr w:type="gramStart"/>
-      <w:r>
-        <w:rPr>
-          <w:rFonts w:ascii="Lucida Console" w:eastAsia="Times New Roman" w:hAnsi="Lucida Console" w:cs="Courier New"/>
-          <w:color w:val="000000"/>
-          <w:kern w:val="0"/>
-          <w:sz w:val="20"/>
-          <w:szCs w:val="20"/>
-          <w:bdr w:val="none" w:sz="0" w:space="0" w:color="auto" w:frame="1"/>
-          <w14:ligatures w14:val="none"/>
-        </w:rPr>
-        <w:t>‘ ’</w:t>
-      </w:r>
-      <w:proofErr w:type="gramEnd"/>
-      <w:r>
-        <w:rPr>
-          <w:rFonts w:ascii="Lucida Console" w:eastAsia="Times New Roman" w:hAnsi="Lucida Console" w:cs="Courier New"/>
-          <w:color w:val="000000"/>
-          <w:kern w:val="0"/>
-          <w:sz w:val="20"/>
-          <w:szCs w:val="20"/>
-          <w:bdr w:val="none" w:sz="0" w:space="0" w:color="auto" w:frame="1"/>
-          <w14:ligatures w14:val="none"/>
-        </w:rPr>
-        <w:t xml:space="preserve"> 1</w:t>
+        <w:t>Signif. codes:  0 ‘***’ 0.001 ‘**’ 0.01 ‘*’ 0.05 ‘.’ 0.1 ‘ ’ 1</w:t>
       </w:r>
     </w:p>
     <w:p>
@@ -5917,9 +5272,8 @@
           <w:bdr w:val="none" w:sz="0" w:space="0" w:color="auto" w:frame="1"/>
           <w14:ligatures w14:val="none"/>
         </w:rPr>
-        <w:t>Multiple R-squared</w:t>
-      </w:r>
-      <w:proofErr w:type="gramStart"/>
+        <w:t>Multiple R-squared:  0.4307,</w:t>
+      </w:r>
       <w:r>
         <w:rPr>
           <w:rFonts w:ascii="Lucida Console" w:eastAsia="Times New Roman" w:hAnsi="Lucida Console" w:cs="Courier New"/>
@@ -5930,59 +5284,8 @@
           <w:bdr w:val="none" w:sz="0" w:space="0" w:color="auto" w:frame="1"/>
           <w14:ligatures w14:val="none"/>
         </w:rPr>
-        <w:t>:  0.4307</w:t>
-      </w:r>
-      <w:proofErr w:type="gramEnd"/>
-      <w:r>
-        <w:rPr>
-          <w:rFonts w:ascii="Lucida Console" w:eastAsia="Times New Roman" w:hAnsi="Lucida Console" w:cs="Courier New"/>
-          <w:color w:val="000000"/>
-          <w:kern w:val="0"/>
-          <w:sz w:val="20"/>
-          <w:szCs w:val="20"/>
-          <w:bdr w:val="none" w:sz="0" w:space="0" w:color="auto" w:frame="1"/>
-          <w14:ligatures w14:val="none"/>
-        </w:rPr>
-        <w:t>,</w:t>
-      </w:r>
-      <w:r>
-        <w:rPr>
-          <w:rFonts w:ascii="Lucida Console" w:eastAsia="Times New Roman" w:hAnsi="Lucida Console" w:cs="Courier New"/>
-          <w:color w:val="000000"/>
-          <w:kern w:val="0"/>
-          <w:sz w:val="20"/>
-          <w:szCs w:val="20"/>
-          <w:bdr w:val="none" w:sz="0" w:space="0" w:color="auto" w:frame="1"/>
-          <w14:ligatures w14:val="none"/>
-        </w:rPr>
         <w:tab/>
-        <w:t>Adjusted R-squared</w:t>
-      </w:r>
-      <w:proofErr w:type="gramStart"/>
-      <w:r>
-        <w:rPr>
-          <w:rFonts w:ascii="Lucida Console" w:eastAsia="Times New Roman" w:hAnsi="Lucida Console" w:cs="Courier New"/>
-          <w:color w:val="000000"/>
-          <w:kern w:val="0"/>
-          <w:sz w:val="20"/>
-          <w:szCs w:val="20"/>
-          <w:bdr w:val="none" w:sz="0" w:space="0" w:color="auto" w:frame="1"/>
-          <w14:ligatures w14:val="none"/>
-        </w:rPr>
-        <w:t>:  0.3575</w:t>
-      </w:r>
-      <w:proofErr w:type="gramEnd"/>
-      <w:r>
-        <w:rPr>
-          <w:rFonts w:ascii="Lucida Console" w:eastAsia="Times New Roman" w:hAnsi="Lucida Console" w:cs="Courier New"/>
-          <w:color w:val="000000"/>
-          <w:kern w:val="0"/>
-          <w:sz w:val="20"/>
-          <w:szCs w:val="20"/>
-          <w:bdr w:val="none" w:sz="0" w:space="0" w:color="auto" w:frame="1"/>
-          <w14:ligatures w14:val="none"/>
-        </w:rPr>
-        <w:t xml:space="preserve"> </w:t>
+        <w:t xml:space="preserve">Adjusted R-squared:  0.3575 </w:t>
       </w:r>
     </w:p>
     <w:p>
@@ -6028,33 +5331,7 @@
           <w:bdr w:val="none" w:sz="0" w:space="0" w:color="auto" w:frame="1"/>
           <w14:ligatures w14:val="none"/>
         </w:rPr>
-        <w:t xml:space="preserve">F-statistic: 5.883 on 9 and 70 </w:t>
-      </w:r>
-      <w:proofErr w:type="gramStart"/>
-      <w:r>
-        <w:rPr>
-          <w:rFonts w:ascii="Lucida Console" w:eastAsia="Times New Roman" w:hAnsi="Lucida Console" w:cs="Courier New"/>
-          <w:color w:val="000000"/>
-          <w:kern w:val="0"/>
-          <w:sz w:val="20"/>
-          <w:szCs w:val="20"/>
-          <w:bdr w:val="none" w:sz="0" w:space="0" w:color="auto" w:frame="1"/>
-          <w14:ligatures w14:val="none"/>
-        </w:rPr>
-        <w:t>DF,  p</w:t>
-      </w:r>
-      <w:proofErr w:type="gramEnd"/>
-      <w:r>
-        <w:rPr>
-          <w:rFonts w:ascii="Lucida Console" w:eastAsia="Times New Roman" w:hAnsi="Lucida Console" w:cs="Courier New"/>
-          <w:color w:val="000000"/>
-          <w:kern w:val="0"/>
-          <w:sz w:val="20"/>
-          <w:szCs w:val="20"/>
-          <w:bdr w:val="none" w:sz="0" w:space="0" w:color="auto" w:frame="1"/>
-          <w14:ligatures w14:val="none"/>
-        </w:rPr>
-        <w:t>-value: 4.438e-06</w:t>
+        <w:t>F-statistic: 5.883 on 9 and 70 DF,  p-value: 4.438e-06</w:t>
       </w:r>
     </w:p>
     <w:p>
@@ -6136,23 +5413,13 @@
           <w:color w:val="0000FF"/>
         </w:rPr>
       </w:pPr>
-      <w:proofErr w:type="gramStart"/>
       <w:r>
         <w:rPr>
           <w:rStyle w:val="gnvwddmdb3b"/>
           <w:rFonts w:ascii="Lucida Console" w:hAnsi="Lucida Console"/>
           <w:color w:val="0000FF"/>
         </w:rPr>
-        <w:t>anova(Cumm.Stat.Anal</w:t>
-      </w:r>
-      <w:proofErr w:type="gramEnd"/>
-      <w:r>
-        <w:rPr>
-          <w:rStyle w:val="gnvwddmdb3b"/>
-          <w:rFonts w:ascii="Lucida Console" w:hAnsi="Lucida Console"/>
-          <w:color w:val="0000FF"/>
-        </w:rPr>
-        <w:t>)</w:t>
+        <w:t>anova(Cumm.Stat.Anal)</w:t>
       </w:r>
     </w:p>
     <w:p>
@@ -6209,19 +5476,30 @@
           <w:color w:val="000000"/>
           <w:bdr w:val="none" w:sz="0" w:space="0" w:color="auto" w:frame="1"/>
         </w:rPr>
-        <w:t xml:space="preserve">Response: </w:t>
-      </w:r>
-      <w:proofErr w:type="gramStart"/>
-      <w:r>
+        <w:t>Response: Total.Cum.Emissions</w:t>
+      </w:r>
+    </w:p>
+    <w:p>
+      <w:pPr>
+        <w:pStyle w:val="HTMLPreformatted"/>
+        <w:shd w:val="clear" w:color="auto" w:fill="FFFFFF"/>
+        <w:wordWrap w:val="0"/>
         <w:rPr>
           <w:rStyle w:val="gnvwddmdl3b"/>
           <w:rFonts w:ascii="Lucida Console" w:hAnsi="Lucida Console"/>
           <w:color w:val="000000"/>
           <w:bdr w:val="none" w:sz="0" w:space="0" w:color="auto" w:frame="1"/>
         </w:rPr>
-        <w:t>Total.Cum.Emissions</w:t>
-      </w:r>
-      <w:proofErr w:type="gramEnd"/>
+      </w:pPr>
+      <w:r>
+        <w:rPr>
+          <w:rStyle w:val="gnvwddmdl3b"/>
+          <w:rFonts w:ascii="Lucida Console" w:hAnsi="Lucida Console"/>
+          <w:color w:val="000000"/>
+          <w:bdr w:val="none" w:sz="0" w:space="0" w:color="auto" w:frame="1"/>
+        </w:rPr>
+        <w:t xml:space="preserve">              Df Sum Sq Mean Sq F value    Pr(&gt;F)    </w:t>
+      </w:r>
     </w:p>
     <w:p>
       <w:pPr>
@@ -6242,19 +5520,21 @@
           <w:color w:val="000000"/>
           <w:bdr w:val="none" w:sz="0" w:space="0" w:color="auto" w:frame="1"/>
         </w:rPr>
-        <w:t xml:space="preserve">              Df Sum Sq Mean Sq F </w:t>
-      </w:r>
-      <w:proofErr w:type="gramStart"/>
-      <w:r>
+        <w:t>BLOCK.F        3 4224.0 1408.01 10.9154 5.752e-06 ***</w:t>
+      </w:r>
+    </w:p>
+    <w:p>
+      <w:pPr>
+        <w:pStyle w:val="HTMLPreformatted"/>
+        <w:shd w:val="clear" w:color="auto" w:fill="FFFFFF"/>
+        <w:wordWrap w:val="0"/>
         <w:rPr>
           <w:rStyle w:val="gnvwddmdl3b"/>
           <w:rFonts w:ascii="Lucida Console" w:hAnsi="Lucida Console"/>
           <w:color w:val="000000"/>
           <w:bdr w:val="none" w:sz="0" w:space="0" w:color="auto" w:frame="1"/>
         </w:rPr>
-        <w:t>value</w:t>
-      </w:r>
-      <w:proofErr w:type="gramEnd"/>
+      </w:pPr>
       <w:r>
         <w:rPr>
           <w:rStyle w:val="gnvwddmdl3b"/>
@@ -6262,7 +5542,7 @@
           <w:color w:val="000000"/>
           <w:bdr w:val="none" w:sz="0" w:space="0" w:color="auto" w:frame="1"/>
         </w:rPr>
-        <w:t xml:space="preserve">    Pr(&gt;F)    </w:t>
+        <w:t>Sampling.Year  1 1903.3 1903.32 14.7553 0.0002661 ***</w:t>
       </w:r>
     </w:p>
     <w:p>
@@ -6284,7 +5564,7 @@
           <w:color w:val="000000"/>
           <w:bdr w:val="none" w:sz="0" w:space="0" w:color="auto" w:frame="1"/>
         </w:rPr>
-        <w:t>BLOCK.F        3 4224.0 1408.01 10.9154 5.752e-06 ***</w:t>
+        <w:t xml:space="preserve">CoverCrop.F    2  103.8   51.89  0.4023 0.6703176    </w:t>
       </w:r>
     </w:p>
     <w:p>
@@ -6299,7 +5579,6 @@
           <w:bdr w:val="none" w:sz="0" w:space="0" w:color="auto" w:frame="1"/>
         </w:rPr>
       </w:pPr>
-      <w:proofErr w:type="gramStart"/>
       <w:r>
         <w:rPr>
           <w:rStyle w:val="gnvwddmdl3b"/>
@@ -6307,17 +5586,29 @@
           <w:color w:val="000000"/>
           <w:bdr w:val="none" w:sz="0" w:space="0" w:color="auto" w:frame="1"/>
         </w:rPr>
-        <w:t>Sampling.Year  1</w:t>
-      </w:r>
-      <w:proofErr w:type="gramEnd"/>
-      <w:r>
+        <w:t xml:space="preserve">Treatment.F    3  599.2  199.73  1.5484 0.2096975    </w:t>
+      </w:r>
+    </w:p>
+    <w:p>
+      <w:pPr>
+        <w:pStyle w:val="HTMLPreformatted"/>
+        <w:shd w:val="clear" w:color="auto" w:fill="FFFFFF"/>
+        <w:wordWrap w:val="0"/>
         <w:rPr>
           <w:rStyle w:val="gnvwddmdl3b"/>
           <w:rFonts w:ascii="Lucida Console" w:hAnsi="Lucida Console"/>
           <w:color w:val="000000"/>
           <w:bdr w:val="none" w:sz="0" w:space="0" w:color="auto" w:frame="1"/>
         </w:rPr>
-        <w:t xml:space="preserve"> 1903.3 1903.32 14.7553 0.0002661 ***</w:t>
+      </w:pPr>
+      <w:r>
+        <w:rPr>
+          <w:rStyle w:val="gnvwddmdl3b"/>
+          <w:rFonts w:ascii="Lucida Console" w:hAnsi="Lucida Console"/>
+          <w:color w:val="000000"/>
+          <w:bdr w:val="none" w:sz="0" w:space="0" w:color="auto" w:frame="1"/>
+        </w:rPr>
+        <w:t xml:space="preserve">Residuals     70 9029.5  128.99                      </w:t>
       </w:r>
     </w:p>
     <w:p>
@@ -6339,9 +5630,19 @@
           <w:color w:val="000000"/>
           <w:bdr w:val="none" w:sz="0" w:space="0" w:color="auto" w:frame="1"/>
         </w:rPr>
-        <w:t xml:space="preserve">CoverCrop.F    </w:t>
-      </w:r>
-      <w:proofErr w:type="gramStart"/>
+        <w:t>---</w:t>
+      </w:r>
+    </w:p>
+    <w:p>
+      <w:pPr>
+        <w:pStyle w:val="HTMLPreformatted"/>
+        <w:shd w:val="clear" w:color="auto" w:fill="FFFFFF"/>
+        <w:wordWrap w:val="0"/>
+        <w:rPr>
+          <w:rFonts w:ascii="Lucida Console" w:hAnsi="Lucida Console"/>
+          <w:color w:val="000000"/>
+        </w:rPr>
+      </w:pPr>
       <w:r>
         <w:rPr>
           <w:rStyle w:val="gnvwddmdl3b"/>
@@ -6349,263 +5650,7 @@
           <w:color w:val="000000"/>
           <w:bdr w:val="none" w:sz="0" w:space="0" w:color="auto" w:frame="1"/>
         </w:rPr>
-        <w:t>2  103.8</w:t>
-      </w:r>
-      <w:proofErr w:type="gramEnd"/>
-      <w:r>
-        <w:rPr>
-          <w:rStyle w:val="gnvwddmdl3b"/>
-          <w:rFonts w:ascii="Lucida Console" w:hAnsi="Lucida Console"/>
-          <w:color w:val="000000"/>
-          <w:bdr w:val="none" w:sz="0" w:space="0" w:color="auto" w:frame="1"/>
-        </w:rPr>
-        <w:t xml:space="preserve">   </w:t>
-      </w:r>
-      <w:proofErr w:type="gramStart"/>
-      <w:r>
-        <w:rPr>
-          <w:rStyle w:val="gnvwddmdl3b"/>
-          <w:rFonts w:ascii="Lucida Console" w:hAnsi="Lucida Console"/>
-          <w:color w:val="000000"/>
-          <w:bdr w:val="none" w:sz="0" w:space="0" w:color="auto" w:frame="1"/>
-        </w:rPr>
-        <w:t>51.89  0.4023</w:t>
-      </w:r>
-      <w:proofErr w:type="gramEnd"/>
-      <w:r>
-        <w:rPr>
-          <w:rStyle w:val="gnvwddmdl3b"/>
-          <w:rFonts w:ascii="Lucida Console" w:hAnsi="Lucida Console"/>
-          <w:color w:val="000000"/>
-          <w:bdr w:val="none" w:sz="0" w:space="0" w:color="auto" w:frame="1"/>
-        </w:rPr>
-        <w:t xml:space="preserve"> 0.6703176    </w:t>
-      </w:r>
-    </w:p>
-    <w:p>
-      <w:pPr>
-        <w:pStyle w:val="HTMLPreformatted"/>
-        <w:shd w:val="clear" w:color="auto" w:fill="FFFFFF"/>
-        <w:wordWrap w:val="0"/>
-        <w:rPr>
-          <w:rStyle w:val="gnvwddmdl3b"/>
-          <w:rFonts w:ascii="Lucida Console" w:hAnsi="Lucida Console"/>
-          <w:color w:val="000000"/>
-          <w:bdr w:val="none" w:sz="0" w:space="0" w:color="auto" w:frame="1"/>
-        </w:rPr>
-      </w:pPr>
-      <w:r>
-        <w:rPr>
-          <w:rStyle w:val="gnvwddmdl3b"/>
-          <w:rFonts w:ascii="Lucida Console" w:hAnsi="Lucida Console"/>
-          <w:color w:val="000000"/>
-          <w:bdr w:val="none" w:sz="0" w:space="0" w:color="auto" w:frame="1"/>
-        </w:rPr>
-        <w:t xml:space="preserve">Treatment.F    </w:t>
-      </w:r>
-      <w:proofErr w:type="gramStart"/>
-      <w:r>
-        <w:rPr>
-          <w:rStyle w:val="gnvwddmdl3b"/>
-          <w:rFonts w:ascii="Lucida Console" w:hAnsi="Lucida Console"/>
-          <w:color w:val="000000"/>
-          <w:bdr w:val="none" w:sz="0" w:space="0" w:color="auto" w:frame="1"/>
-        </w:rPr>
-        <w:t>3  599.2</w:t>
-      </w:r>
-      <w:proofErr w:type="gramEnd"/>
-      <w:r>
-        <w:rPr>
-          <w:rStyle w:val="gnvwddmdl3b"/>
-          <w:rFonts w:ascii="Lucida Console" w:hAnsi="Lucida Console"/>
-          <w:color w:val="000000"/>
-          <w:bdr w:val="none" w:sz="0" w:space="0" w:color="auto" w:frame="1"/>
-        </w:rPr>
-        <w:t xml:space="preserve">  </w:t>
-      </w:r>
-      <w:proofErr w:type="gramStart"/>
-      <w:r>
-        <w:rPr>
-          <w:rStyle w:val="gnvwddmdl3b"/>
-          <w:rFonts w:ascii="Lucida Console" w:hAnsi="Lucida Console"/>
-          <w:color w:val="000000"/>
-          <w:bdr w:val="none" w:sz="0" w:space="0" w:color="auto" w:frame="1"/>
-        </w:rPr>
-        <w:t>199.73  1.5484</w:t>
-      </w:r>
-      <w:proofErr w:type="gramEnd"/>
-      <w:r>
-        <w:rPr>
-          <w:rStyle w:val="gnvwddmdl3b"/>
-          <w:rFonts w:ascii="Lucida Console" w:hAnsi="Lucida Console"/>
-          <w:color w:val="000000"/>
-          <w:bdr w:val="none" w:sz="0" w:space="0" w:color="auto" w:frame="1"/>
-        </w:rPr>
-        <w:t xml:space="preserve"> 0.2096975    </w:t>
-      </w:r>
-    </w:p>
-    <w:p>
-      <w:pPr>
-        <w:pStyle w:val="HTMLPreformatted"/>
-        <w:shd w:val="clear" w:color="auto" w:fill="FFFFFF"/>
-        <w:wordWrap w:val="0"/>
-        <w:rPr>
-          <w:rStyle w:val="gnvwddmdl3b"/>
-          <w:rFonts w:ascii="Lucida Console" w:hAnsi="Lucida Console"/>
-          <w:color w:val="000000"/>
-          <w:bdr w:val="none" w:sz="0" w:space="0" w:color="auto" w:frame="1"/>
-        </w:rPr>
-      </w:pPr>
-      <w:r>
-        <w:rPr>
-          <w:rStyle w:val="gnvwddmdl3b"/>
-          <w:rFonts w:ascii="Lucida Console" w:hAnsi="Lucida Console"/>
-          <w:color w:val="000000"/>
-          <w:bdr w:val="none" w:sz="0" w:space="0" w:color="auto" w:frame="1"/>
-        </w:rPr>
-        <w:t xml:space="preserve">Residuals     70 </w:t>
-      </w:r>
-      <w:proofErr w:type="gramStart"/>
-      <w:r>
-        <w:rPr>
-          <w:rStyle w:val="gnvwddmdl3b"/>
-          <w:rFonts w:ascii="Lucida Console" w:hAnsi="Lucida Console"/>
-          <w:color w:val="000000"/>
-          <w:bdr w:val="none" w:sz="0" w:space="0" w:color="auto" w:frame="1"/>
-        </w:rPr>
-        <w:t>9029.5  128.99</w:t>
-      </w:r>
-      <w:proofErr w:type="gramEnd"/>
-      <w:r>
-        <w:rPr>
-          <w:rStyle w:val="gnvwddmdl3b"/>
-          <w:rFonts w:ascii="Lucida Console" w:hAnsi="Lucida Console"/>
-          <w:color w:val="000000"/>
-          <w:bdr w:val="none" w:sz="0" w:space="0" w:color="auto" w:frame="1"/>
-        </w:rPr>
-        <w:t xml:space="preserve">                      </w:t>
-      </w:r>
-    </w:p>
-    <w:p>
-      <w:pPr>
-        <w:pStyle w:val="HTMLPreformatted"/>
-        <w:shd w:val="clear" w:color="auto" w:fill="FFFFFF"/>
-        <w:wordWrap w:val="0"/>
-        <w:rPr>
-          <w:rStyle w:val="gnvwddmdl3b"/>
-          <w:rFonts w:ascii="Lucida Console" w:hAnsi="Lucida Console"/>
-          <w:color w:val="000000"/>
-          <w:bdr w:val="none" w:sz="0" w:space="0" w:color="auto" w:frame="1"/>
-        </w:rPr>
-      </w:pPr>
-      <w:r>
-        <w:rPr>
-          <w:rStyle w:val="gnvwddmdl3b"/>
-          <w:rFonts w:ascii="Lucida Console" w:hAnsi="Lucida Console"/>
-          <w:color w:val="000000"/>
-          <w:bdr w:val="none" w:sz="0" w:space="0" w:color="auto" w:frame="1"/>
-        </w:rPr>
-        <w:t>---</w:t>
-      </w:r>
-    </w:p>
-    <w:p>
-      <w:pPr>
-        <w:pStyle w:val="HTMLPreformatted"/>
-        <w:shd w:val="clear" w:color="auto" w:fill="FFFFFF"/>
-        <w:wordWrap w:val="0"/>
-        <w:rPr>
-          <w:rFonts w:ascii="Lucida Console" w:hAnsi="Lucida Console"/>
-          <w:color w:val="000000"/>
-        </w:rPr>
-      </w:pPr>
-      <w:r>
-        <w:rPr>
-          <w:rStyle w:val="gnvwddmdl3b"/>
-          <w:rFonts w:ascii="Lucida Console" w:hAnsi="Lucida Console"/>
-          <w:color w:val="000000"/>
-          <w:bdr w:val="none" w:sz="0" w:space="0" w:color="auto" w:frame="1"/>
-        </w:rPr>
-        <w:t>Signif. codes</w:t>
-      </w:r>
-      <w:proofErr w:type="gramStart"/>
-      <w:r>
-        <w:rPr>
-          <w:rStyle w:val="gnvwddmdl3b"/>
-          <w:rFonts w:ascii="Lucida Console" w:hAnsi="Lucida Console"/>
-          <w:color w:val="000000"/>
-          <w:bdr w:val="none" w:sz="0" w:space="0" w:color="auto" w:frame="1"/>
-        </w:rPr>
-        <w:t>:  0 ‘</w:t>
-      </w:r>
-      <w:proofErr w:type="gramEnd"/>
-      <w:r>
-        <w:rPr>
-          <w:rStyle w:val="gnvwddmdl3b"/>
-          <w:rFonts w:ascii="Lucida Console" w:hAnsi="Lucida Console"/>
-          <w:color w:val="000000"/>
-          <w:bdr w:val="none" w:sz="0" w:space="0" w:color="auto" w:frame="1"/>
-        </w:rPr>
-        <w:t xml:space="preserve">***’ </w:t>
-      </w:r>
-      <w:proofErr w:type="gramStart"/>
-      <w:r>
-        <w:rPr>
-          <w:rStyle w:val="gnvwddmdl3b"/>
-          <w:rFonts w:ascii="Lucida Console" w:hAnsi="Lucida Console"/>
-          <w:color w:val="000000"/>
-          <w:bdr w:val="none" w:sz="0" w:space="0" w:color="auto" w:frame="1"/>
-        </w:rPr>
-        <w:t>0.001 ‘*</w:t>
-      </w:r>
-      <w:proofErr w:type="gramEnd"/>
-      <w:r>
-        <w:rPr>
-          <w:rStyle w:val="gnvwddmdl3b"/>
-          <w:rFonts w:ascii="Lucida Console" w:hAnsi="Lucida Console"/>
-          <w:color w:val="000000"/>
-          <w:bdr w:val="none" w:sz="0" w:space="0" w:color="auto" w:frame="1"/>
-        </w:rPr>
-        <w:t xml:space="preserve">*’ </w:t>
-      </w:r>
-      <w:proofErr w:type="gramStart"/>
-      <w:r>
-        <w:rPr>
-          <w:rStyle w:val="gnvwddmdl3b"/>
-          <w:rFonts w:ascii="Lucida Console" w:hAnsi="Lucida Console"/>
-          <w:color w:val="000000"/>
-          <w:bdr w:val="none" w:sz="0" w:space="0" w:color="auto" w:frame="1"/>
-        </w:rPr>
-        <w:t>0.01 ‘*</w:t>
-      </w:r>
-      <w:proofErr w:type="gramEnd"/>
-      <w:r>
-        <w:rPr>
-          <w:rStyle w:val="gnvwddmdl3b"/>
-          <w:rFonts w:ascii="Lucida Console" w:hAnsi="Lucida Console"/>
-          <w:color w:val="000000"/>
-          <w:bdr w:val="none" w:sz="0" w:space="0" w:color="auto" w:frame="1"/>
-        </w:rPr>
-        <w:t xml:space="preserve">’ 0.05 ‘.’ 0.1 </w:t>
-      </w:r>
-      <w:proofErr w:type="gramStart"/>
-      <w:r>
-        <w:rPr>
-          <w:rStyle w:val="gnvwddmdl3b"/>
-          <w:rFonts w:ascii="Lucida Console" w:hAnsi="Lucida Console"/>
-          <w:color w:val="000000"/>
-          <w:bdr w:val="none" w:sz="0" w:space="0" w:color="auto" w:frame="1"/>
-        </w:rPr>
-        <w:t>‘ ’</w:t>
-      </w:r>
-      <w:proofErr w:type="gramEnd"/>
-      <w:r>
-        <w:rPr>
-          <w:rStyle w:val="gnvwddmdl3b"/>
-          <w:rFonts w:ascii="Lucida Console" w:hAnsi="Lucida Console"/>
-          <w:color w:val="000000"/>
-          <w:bdr w:val="none" w:sz="0" w:space="0" w:color="auto" w:frame="1"/>
-        </w:rPr>
-        <w:t xml:space="preserve"> 1</w:t>
+        <w:t>Signif. codes:  0 ‘***’ 0.001 ‘**’ 0.01 ‘*’ 0.05 ‘.’ 0.1 ‘ ’ 1</w:t>
       </w:r>
     </w:p>
     <w:p>
@@ -6756,13 +5801,8 @@
       </w:r>
     </w:p>
     <w:p>
-      <w:proofErr w:type="gramStart"/>
-      <w:r>
-        <w:t>Daily  emission</w:t>
-      </w:r>
-      <w:proofErr w:type="gramEnd"/>
-      <w:r>
-        <w:t xml:space="preserve"> analysis</w:t>
+      <w:r>
+        <w:t>Daily  emission analysis</w:t>
       </w:r>
     </w:p>
     <w:p>
@@ -10055,9 +9095,8 @@
           <w:sz w:val="40"/>
           <w:szCs w:val="40"/>
         </w:rPr>
-        <w:t xml:space="preserve">PerSTDA and PerSTD are not consistent </w:t>
-      </w:r>
-      <w:proofErr w:type="gramStart"/>
+        <w:t xml:space="preserve">PerSTDA and PerSTD are not consistent through out 2021, therefore </w:t>
+      </w:r>
       <w:r>
         <w:rPr>
           <w:b/>
@@ -10065,18 +9104,18 @@
           <w:sz w:val="40"/>
           <w:szCs w:val="40"/>
         </w:rPr>
-        <w:t>through out</w:t>
-      </w:r>
-      <w:proofErr w:type="gramEnd"/>
-      <w:r>
+        <w:t>need to be selected manually!!!!!!</w:t>
+      </w:r>
+    </w:p>
+    <w:p>
+      <w:pPr>
         <w:rPr>
           <w:b/>
           <w:bCs/>
           <w:sz w:val="40"/>
           <w:szCs w:val="40"/>
         </w:rPr>
-        <w:t xml:space="preserve"> 2021, therefore </w:t>
-      </w:r>
+      </w:pPr>
       <w:r>
         <w:rPr>
           <w:b/>
@@ -10084,7 +9123,7 @@
           <w:sz w:val="40"/>
           <w:szCs w:val="40"/>
         </w:rPr>
-        <w:t>need to be selected manually!!!!!!</w:t>
+        <w:br w:type="page"/>
       </w:r>
     </w:p>
     <w:p>
@@ -10103,25 +9142,6 @@
           <w:sz w:val="40"/>
           <w:szCs w:val="40"/>
         </w:rPr>
-        <w:br w:type="page"/>
-      </w:r>
-    </w:p>
-    <w:p>
-      <w:pPr>
-        <w:rPr>
-          <w:b/>
-          <w:bCs/>
-          <w:sz w:val="40"/>
-          <w:szCs w:val="40"/>
-        </w:rPr>
-      </w:pPr>
-      <w:r>
-        <w:rPr>
-          <w:b/>
-          <w:bCs/>
-          <w:sz w:val="40"/>
-          <w:szCs w:val="40"/>
-        </w:rPr>
         <w:lastRenderedPageBreak/>
         <w:t>Checking standards manually</w:t>
       </w:r>
@@ -11063,21 +10083,12 @@
         </w:rPr>
         <w:t xml:space="preserve">Outliers </w:t>
       </w:r>
-      <w:proofErr w:type="gramStart"/>
       <w:r>
         <w:rPr>
           <w:sz w:val="24"/>
           <w:szCs w:val="24"/>
         </w:rPr>
-        <w:t>1091 ,</w:t>
-      </w:r>
-      <w:proofErr w:type="gramEnd"/>
-      <w:r>
-        <w:rPr>
-          <w:sz w:val="24"/>
-          <w:szCs w:val="24"/>
-        </w:rPr>
-        <w:t xml:space="preserve"> 1113</w:t>
+        <w:t>1091 , 1113</w:t>
       </w:r>
     </w:p>
     <w:p>
@@ -11378,21 +10389,8 @@
     </w:p>
     <w:p>
       <w:r>
-        <w:t>2021-07-</w:t>
-      </w:r>
-      <w:proofErr w:type="gramStart"/>
-      <w:r>
-        <w:t>07  Missing</w:t>
-      </w:r>
-      <w:proofErr w:type="gramEnd"/>
-      <w:r>
-        <w:t xml:space="preserve"> </w:t>
-      </w:r>
-      <w:proofErr w:type="gramStart"/>
-      <w:r>
-        <w:t>20210702b3b407b2peakareas.pdf ????</w:t>
-      </w:r>
-      <w:proofErr w:type="gramEnd"/>
+        <w:t>2021-07-07  Missing 20210702b3b407b2peakareas.pdf ????</w:t>
+      </w:r>
     </w:p>
     <w:p>
       <w:r>
@@ -11503,15 +10501,7 @@
         <w:t xml:space="preserve">Records 1424 and 1435 are </w:t>
       </w:r>
       <w:r>
-        <w:t xml:space="preserve">strange. They are </w:t>
-      </w:r>
-      <w:proofErr w:type="gramStart"/>
-      <w:r>
-        <w:t>from</w:t>
-      </w:r>
-      <w:proofErr w:type="gramEnd"/>
-      <w:r>
-        <w:t xml:space="preserve"> a new standard. And are strangely consistent</w:t>
+        <w:t>strange. They are from a new standard. And are strangely consistent</w:t>
       </w:r>
     </w:p>
     <w:p>
@@ -11634,26 +10624,10 @@
         <w:t xml:space="preserve">Records 1510, </w:t>
       </w:r>
       <w:r>
-        <w:t xml:space="preserve">1521, </w:t>
-      </w:r>
-      <w:proofErr w:type="gramStart"/>
-      <w:r>
-        <w:t>1596 ,</w:t>
-      </w:r>
-      <w:proofErr w:type="gramEnd"/>
-      <w:r>
-        <w:t xml:space="preserve"> 1607 </w:t>
-      </w:r>
-      <w:r>
-        <w:t xml:space="preserve">and 1435 are strange. They are </w:t>
-      </w:r>
-      <w:proofErr w:type="gramStart"/>
-      <w:r>
-        <w:t>from</w:t>
-      </w:r>
-      <w:proofErr w:type="gramEnd"/>
-      <w:r>
-        <w:t xml:space="preserve"> a new standard. And are strangely consistent</w:t>
+        <w:t xml:space="preserve">1521, 1596 , 1607 </w:t>
+      </w:r>
+      <w:r>
+        <w:t>and 1435 are strange. They are from a new standard. And are strangely consistent</w:t>
       </w:r>
       <w:r>
         <w:t>.</w:t>
@@ -11776,15 +10750,7 @@
     </w:p>
     <w:p>
       <w:r>
-        <w:t xml:space="preserve">1768 and 1779 </w:t>
-      </w:r>
-      <w:proofErr w:type="gramStart"/>
-      <w:r>
-        <w:t>seemed  switched</w:t>
-      </w:r>
-      <w:proofErr w:type="gramEnd"/>
-      <w:r>
-        <w:t>; 50 is 100 and 100 is 50.</w:t>
+        <w:t>1768 and 1779 seemed  switched; 50 is 100 and 100 is 50.</w:t>
       </w:r>
     </w:p>
     <w:p>
@@ -11795,6 +10761,982 @@
         <w:br w:type="page"/>
       </w:r>
     </w:p>
+    <w:p>
+      <w:r>
+        <w:lastRenderedPageBreak/>
+        <w:t>2021-07-30</w:t>
+      </w:r>
+    </w:p>
+    <w:p>
+      <w:r>
+        <w:rPr>
+          <w:noProof/>
+        </w:rPr>
+        <w:drawing>
+          <wp:inline distT="0" distB="0" distL="0" distR="0" wp14:anchorId="060964B7" wp14:editId="7458D117">
+            <wp:extent cx="5901878" cy="3100101"/>
+            <wp:effectExtent l="0" t="0" r="3810" b="5080"/>
+            <wp:docPr id="1079996179" name="Picture 3"/>
+            <wp:cNvGraphicFramePr>
+              <a:graphicFrameLocks xmlns:a="http://schemas.openxmlformats.org/drawingml/2006/main" noChangeAspect="1"/>
+            </wp:cNvGraphicFramePr>
+            <a:graphic xmlns:a="http://schemas.openxmlformats.org/drawingml/2006/main">
+              <a:graphicData uri="http://schemas.openxmlformats.org/drawingml/2006/picture">
+                <pic:pic xmlns:pic="http://schemas.openxmlformats.org/drawingml/2006/picture">
+                  <pic:nvPicPr>
+                    <pic:cNvPr id="0" name="Picture 4"/>
+                    <pic:cNvPicPr>
+                      <a:picLocks noChangeAspect="1" noChangeArrowheads="1"/>
+                    </pic:cNvPicPr>
+                  </pic:nvPicPr>
+                  <pic:blipFill>
+                    <a:blip r:embed="rId118" cstate="print">
+                      <a:extLst>
+                        <a:ext uri="{28A0092B-C50C-407E-A947-70E740481C1C}">
+                          <a14:useLocalDpi xmlns:a14="http://schemas.microsoft.com/office/drawing/2010/main" val="0"/>
+                        </a:ext>
+                      </a:extLst>
+                    </a:blip>
+                    <a:srcRect/>
+                    <a:stretch>
+                      <a:fillRect/>
+                    </a:stretch>
+                  </pic:blipFill>
+                  <pic:spPr bwMode="auto">
+                    <a:xfrm>
+                      <a:off x="0" y="0"/>
+                      <a:ext cx="5921171" cy="3110235"/>
+                    </a:xfrm>
+                    <a:prstGeom prst="rect">
+                      <a:avLst/>
+                    </a:prstGeom>
+                    <a:noFill/>
+                  </pic:spPr>
+                </pic:pic>
+              </a:graphicData>
+            </a:graphic>
+          </wp:inline>
+        </w:drawing>
+      </w:r>
+    </w:p>
+    <w:p>
+      <w:r>
+        <w:rPr>
+          <w:noProof/>
+        </w:rPr>
+        <w:drawing>
+          <wp:inline distT="0" distB="0" distL="0" distR="0" wp14:anchorId="22182B73" wp14:editId="181557A9">
+            <wp:extent cx="5773711" cy="3032778"/>
+            <wp:effectExtent l="0" t="0" r="0" b="0"/>
+            <wp:docPr id="499735505" name="Picture 4"/>
+            <wp:cNvGraphicFramePr>
+              <a:graphicFrameLocks xmlns:a="http://schemas.openxmlformats.org/drawingml/2006/main" noChangeAspect="1"/>
+            </wp:cNvGraphicFramePr>
+            <a:graphic xmlns:a="http://schemas.openxmlformats.org/drawingml/2006/main">
+              <a:graphicData uri="http://schemas.openxmlformats.org/drawingml/2006/picture">
+                <pic:pic xmlns:pic="http://schemas.openxmlformats.org/drawingml/2006/picture">
+                  <pic:nvPicPr>
+                    <pic:cNvPr id="0" name="Picture 5"/>
+                    <pic:cNvPicPr>
+                      <a:picLocks noChangeAspect="1" noChangeArrowheads="1"/>
+                    </pic:cNvPicPr>
+                  </pic:nvPicPr>
+                  <pic:blipFill>
+                    <a:blip r:embed="rId119" cstate="print">
+                      <a:extLst>
+                        <a:ext uri="{28A0092B-C50C-407E-A947-70E740481C1C}">
+                          <a14:useLocalDpi xmlns:a14="http://schemas.microsoft.com/office/drawing/2010/main" val="0"/>
+                        </a:ext>
+                      </a:extLst>
+                    </a:blip>
+                    <a:srcRect/>
+                    <a:stretch>
+                      <a:fillRect/>
+                    </a:stretch>
+                  </pic:blipFill>
+                  <pic:spPr bwMode="auto">
+                    <a:xfrm>
+                      <a:off x="0" y="0"/>
+                      <a:ext cx="5808574" cy="3051090"/>
+                    </a:xfrm>
+                    <a:prstGeom prst="rect">
+                      <a:avLst/>
+                    </a:prstGeom>
+                    <a:noFill/>
+                  </pic:spPr>
+                </pic:pic>
+              </a:graphicData>
+            </a:graphic>
+          </wp:inline>
+        </w:drawing>
+      </w:r>
+    </w:p>
+    <w:p>
+      <w:r>
+        <w:t>OK</w:t>
+      </w:r>
+    </w:p>
+    <w:p>
+      <w:r>
+        <w:br w:type="page"/>
+      </w:r>
+    </w:p>
+    <w:p>
+      <w:r>
+        <w:lastRenderedPageBreak/>
+        <w:t>2021-08-05</w:t>
+      </w:r>
+    </w:p>
+    <w:p>
+      <w:r>
+        <w:rPr>
+          <w:noProof/>
+        </w:rPr>
+        <w:drawing>
+          <wp:inline distT="0" distB="0" distL="0" distR="0" wp14:anchorId="748A6A36" wp14:editId="213F320A">
+            <wp:extent cx="5863241" cy="3079806"/>
+            <wp:effectExtent l="0" t="0" r="4445" b="6350"/>
+            <wp:docPr id="1670076091" name="Picture 5"/>
+            <wp:cNvGraphicFramePr>
+              <a:graphicFrameLocks xmlns:a="http://schemas.openxmlformats.org/drawingml/2006/main" noChangeAspect="1"/>
+            </wp:cNvGraphicFramePr>
+            <a:graphic xmlns:a="http://schemas.openxmlformats.org/drawingml/2006/main">
+              <a:graphicData uri="http://schemas.openxmlformats.org/drawingml/2006/picture">
+                <pic:pic xmlns:pic="http://schemas.openxmlformats.org/drawingml/2006/picture">
+                  <pic:nvPicPr>
+                    <pic:cNvPr id="0" name="Picture 6"/>
+                    <pic:cNvPicPr>
+                      <a:picLocks noChangeAspect="1" noChangeArrowheads="1"/>
+                    </pic:cNvPicPr>
+                  </pic:nvPicPr>
+                  <pic:blipFill>
+                    <a:blip r:embed="rId120" cstate="print">
+                      <a:extLst>
+                        <a:ext uri="{28A0092B-C50C-407E-A947-70E740481C1C}">
+                          <a14:useLocalDpi xmlns:a14="http://schemas.microsoft.com/office/drawing/2010/main" val="0"/>
+                        </a:ext>
+                      </a:extLst>
+                    </a:blip>
+                    <a:srcRect/>
+                    <a:stretch>
+                      <a:fillRect/>
+                    </a:stretch>
+                  </pic:blipFill>
+                  <pic:spPr bwMode="auto">
+                    <a:xfrm>
+                      <a:off x="0" y="0"/>
+                      <a:ext cx="5876825" cy="3086941"/>
+                    </a:xfrm>
+                    <a:prstGeom prst="rect">
+                      <a:avLst/>
+                    </a:prstGeom>
+                    <a:noFill/>
+                  </pic:spPr>
+                </pic:pic>
+              </a:graphicData>
+            </a:graphic>
+          </wp:inline>
+        </w:drawing>
+      </w:r>
+    </w:p>
+    <w:p>
+      <w:r>
+        <w:rPr>
+          <w:noProof/>
+        </w:rPr>
+        <w:drawing>
+          <wp:inline distT="0" distB="0" distL="0" distR="0" wp14:anchorId="65115127" wp14:editId="2E7C6D55">
+            <wp:extent cx="5884417" cy="3090929"/>
+            <wp:effectExtent l="0" t="0" r="2540" b="0"/>
+            <wp:docPr id="1189509001" name="Picture 6"/>
+            <wp:cNvGraphicFramePr>
+              <a:graphicFrameLocks xmlns:a="http://schemas.openxmlformats.org/drawingml/2006/main" noChangeAspect="1"/>
+            </wp:cNvGraphicFramePr>
+            <a:graphic xmlns:a="http://schemas.openxmlformats.org/drawingml/2006/main">
+              <a:graphicData uri="http://schemas.openxmlformats.org/drawingml/2006/picture">
+                <pic:pic xmlns:pic="http://schemas.openxmlformats.org/drawingml/2006/picture">
+                  <pic:nvPicPr>
+                    <pic:cNvPr id="0" name="Picture 7"/>
+                    <pic:cNvPicPr>
+                      <a:picLocks noChangeAspect="1" noChangeArrowheads="1"/>
+                    </pic:cNvPicPr>
+                  </pic:nvPicPr>
+                  <pic:blipFill>
+                    <a:blip r:embed="rId121" cstate="print">
+                      <a:extLst>
+                        <a:ext uri="{28A0092B-C50C-407E-A947-70E740481C1C}">
+                          <a14:useLocalDpi xmlns:a14="http://schemas.microsoft.com/office/drawing/2010/main" val="0"/>
+                        </a:ext>
+                      </a:extLst>
+                    </a:blip>
+                    <a:srcRect/>
+                    <a:stretch>
+                      <a:fillRect/>
+                    </a:stretch>
+                  </pic:blipFill>
+                  <pic:spPr bwMode="auto">
+                    <a:xfrm>
+                      <a:off x="0" y="0"/>
+                      <a:ext cx="5921576" cy="3110447"/>
+                    </a:xfrm>
+                    <a:prstGeom prst="rect">
+                      <a:avLst/>
+                    </a:prstGeom>
+                    <a:noFill/>
+                  </pic:spPr>
+                </pic:pic>
+              </a:graphicData>
+            </a:graphic>
+          </wp:inline>
+        </w:drawing>
+      </w:r>
+    </w:p>
+    <w:p>
+      <w:r>
+        <w:t>OK</w:t>
+      </w:r>
+    </w:p>
+    <w:p>
+      <w:r>
+        <w:br w:type="page"/>
+      </w:r>
+    </w:p>
+    <w:p>
+      <w:r>
+        <w:lastRenderedPageBreak/>
+        <w:t>2021-08-12</w:t>
+      </w:r>
+    </w:p>
+    <w:p>
+      <w:r>
+        <w:rPr>
+          <w:noProof/>
+        </w:rPr>
+        <w:drawing>
+          <wp:inline distT="0" distB="0" distL="0" distR="0" wp14:anchorId="1E6BB15A" wp14:editId="767CD54B">
+            <wp:extent cx="6004909" cy="3154220"/>
+            <wp:effectExtent l="0" t="0" r="0" b="8255"/>
+            <wp:docPr id="1458270005" name="Picture 7"/>
+            <wp:cNvGraphicFramePr>
+              <a:graphicFrameLocks xmlns:a="http://schemas.openxmlformats.org/drawingml/2006/main" noChangeAspect="1"/>
+            </wp:cNvGraphicFramePr>
+            <a:graphic xmlns:a="http://schemas.openxmlformats.org/drawingml/2006/main">
+              <a:graphicData uri="http://schemas.openxmlformats.org/drawingml/2006/picture">
+                <pic:pic xmlns:pic="http://schemas.openxmlformats.org/drawingml/2006/picture">
+                  <pic:nvPicPr>
+                    <pic:cNvPr id="0" name="Picture 8"/>
+                    <pic:cNvPicPr>
+                      <a:picLocks noChangeAspect="1" noChangeArrowheads="1"/>
+                    </pic:cNvPicPr>
+                  </pic:nvPicPr>
+                  <pic:blipFill>
+                    <a:blip r:embed="rId122" cstate="print">
+                      <a:extLst>
+                        <a:ext uri="{28A0092B-C50C-407E-A947-70E740481C1C}">
+                          <a14:useLocalDpi xmlns:a14="http://schemas.microsoft.com/office/drawing/2010/main" val="0"/>
+                        </a:ext>
+                      </a:extLst>
+                    </a:blip>
+                    <a:srcRect/>
+                    <a:stretch>
+                      <a:fillRect/>
+                    </a:stretch>
+                  </pic:blipFill>
+                  <pic:spPr bwMode="auto">
+                    <a:xfrm>
+                      <a:off x="0" y="0"/>
+                      <a:ext cx="6034405" cy="3169713"/>
+                    </a:xfrm>
+                    <a:prstGeom prst="rect">
+                      <a:avLst/>
+                    </a:prstGeom>
+                    <a:noFill/>
+                  </pic:spPr>
+                </pic:pic>
+              </a:graphicData>
+            </a:graphic>
+          </wp:inline>
+        </w:drawing>
+      </w:r>
+    </w:p>
+    <w:p>
+      <w:r>
+        <w:rPr>
+          <w:noProof/>
+        </w:rPr>
+        <w:drawing>
+          <wp:inline distT="0" distB="0" distL="0" distR="0" wp14:anchorId="235F71EB" wp14:editId="29E1F1B8">
+            <wp:extent cx="5939622" cy="3119926"/>
+            <wp:effectExtent l="0" t="0" r="4445" b="4445"/>
+            <wp:docPr id="810287942" name="Picture 8"/>
+            <wp:cNvGraphicFramePr>
+              <a:graphicFrameLocks xmlns:a="http://schemas.openxmlformats.org/drawingml/2006/main" noChangeAspect="1"/>
+            </wp:cNvGraphicFramePr>
+            <a:graphic xmlns:a="http://schemas.openxmlformats.org/drawingml/2006/main">
+              <a:graphicData uri="http://schemas.openxmlformats.org/drawingml/2006/picture">
+                <pic:pic xmlns:pic="http://schemas.openxmlformats.org/drawingml/2006/picture">
+                  <pic:nvPicPr>
+                    <pic:cNvPr id="0" name="Picture 9"/>
+                    <pic:cNvPicPr>
+                      <a:picLocks noChangeAspect="1" noChangeArrowheads="1"/>
+                    </pic:cNvPicPr>
+                  </pic:nvPicPr>
+                  <pic:blipFill>
+                    <a:blip r:embed="rId123" cstate="print">
+                      <a:extLst>
+                        <a:ext uri="{28A0092B-C50C-407E-A947-70E740481C1C}">
+                          <a14:useLocalDpi xmlns:a14="http://schemas.microsoft.com/office/drawing/2010/main" val="0"/>
+                        </a:ext>
+                      </a:extLst>
+                    </a:blip>
+                    <a:srcRect/>
+                    <a:stretch>
+                      <a:fillRect/>
+                    </a:stretch>
+                  </pic:blipFill>
+                  <pic:spPr bwMode="auto">
+                    <a:xfrm>
+                      <a:off x="0" y="0"/>
+                      <a:ext cx="5964770" cy="3133136"/>
+                    </a:xfrm>
+                    <a:prstGeom prst="rect">
+                      <a:avLst/>
+                    </a:prstGeom>
+                    <a:noFill/>
+                  </pic:spPr>
+                </pic:pic>
+              </a:graphicData>
+            </a:graphic>
+          </wp:inline>
+        </w:drawing>
+      </w:r>
+    </w:p>
+    <w:p>
+      <w:r>
+        <w:t>OK</w:t>
+      </w:r>
+    </w:p>
+    <w:p>
+      <w:r>
+        <w:br w:type="page"/>
+      </w:r>
+    </w:p>
+    <w:p>
+      <w:r>
+        <w:lastRenderedPageBreak/>
+        <w:t>2021-08-19</w:t>
+      </w:r>
+    </w:p>
+    <w:p>
+      <w:r>
+        <w:rPr>
+          <w:noProof/>
+        </w:rPr>
+        <w:drawing>
+          <wp:inline distT="0" distB="0" distL="0" distR="0" wp14:anchorId="788FEA22" wp14:editId="5F5E892B">
+            <wp:extent cx="5991162" cy="3147000"/>
+            <wp:effectExtent l="0" t="0" r="0" b="0"/>
+            <wp:docPr id="1556293564" name="Picture 9"/>
+            <wp:cNvGraphicFramePr>
+              <a:graphicFrameLocks xmlns:a="http://schemas.openxmlformats.org/drawingml/2006/main" noChangeAspect="1"/>
+            </wp:cNvGraphicFramePr>
+            <a:graphic xmlns:a="http://schemas.openxmlformats.org/drawingml/2006/main">
+              <a:graphicData uri="http://schemas.openxmlformats.org/drawingml/2006/picture">
+                <pic:pic xmlns:pic="http://schemas.openxmlformats.org/drawingml/2006/picture">
+                  <pic:nvPicPr>
+                    <pic:cNvPr id="0" name="Picture 10"/>
+                    <pic:cNvPicPr>
+                      <a:picLocks noChangeAspect="1" noChangeArrowheads="1"/>
+                    </pic:cNvPicPr>
+                  </pic:nvPicPr>
+                  <pic:blipFill>
+                    <a:blip r:embed="rId124" cstate="print">
+                      <a:extLst>
+                        <a:ext uri="{28A0092B-C50C-407E-A947-70E740481C1C}">
+                          <a14:useLocalDpi xmlns:a14="http://schemas.microsoft.com/office/drawing/2010/main" val="0"/>
+                        </a:ext>
+                      </a:extLst>
+                    </a:blip>
+                    <a:srcRect/>
+                    <a:stretch>
+                      <a:fillRect/>
+                    </a:stretch>
+                  </pic:blipFill>
+                  <pic:spPr bwMode="auto">
+                    <a:xfrm flipV="1">
+                      <a:off x="0" y="0"/>
+                      <a:ext cx="6055133" cy="3180602"/>
+                    </a:xfrm>
+                    <a:prstGeom prst="rect">
+                      <a:avLst/>
+                    </a:prstGeom>
+                    <a:noFill/>
+                  </pic:spPr>
+                </pic:pic>
+              </a:graphicData>
+            </a:graphic>
+          </wp:inline>
+        </w:drawing>
+      </w:r>
+    </w:p>
+    <w:p>
+      <w:r>
+        <w:rPr>
+          <w:noProof/>
+        </w:rPr>
+        <w:drawing>
+          <wp:inline distT="0" distB="0" distL="0" distR="0" wp14:anchorId="761A8558" wp14:editId="7F461F37">
+            <wp:extent cx="5927636" cy="3113631"/>
+            <wp:effectExtent l="0" t="0" r="0" b="0"/>
+            <wp:docPr id="1897826746" name="Picture 10"/>
+            <wp:cNvGraphicFramePr>
+              <a:graphicFrameLocks xmlns:a="http://schemas.openxmlformats.org/drawingml/2006/main" noChangeAspect="1"/>
+            </wp:cNvGraphicFramePr>
+            <a:graphic xmlns:a="http://schemas.openxmlformats.org/drawingml/2006/main">
+              <a:graphicData uri="http://schemas.openxmlformats.org/drawingml/2006/picture">
+                <pic:pic xmlns:pic="http://schemas.openxmlformats.org/drawingml/2006/picture">
+                  <pic:nvPicPr>
+                    <pic:cNvPr id="0" name="Picture 11"/>
+                    <pic:cNvPicPr>
+                      <a:picLocks noChangeAspect="1" noChangeArrowheads="1"/>
+                    </pic:cNvPicPr>
+                  </pic:nvPicPr>
+                  <pic:blipFill>
+                    <a:blip r:embed="rId125" cstate="print">
+                      <a:extLst>
+                        <a:ext uri="{28A0092B-C50C-407E-A947-70E740481C1C}">
+                          <a14:useLocalDpi xmlns:a14="http://schemas.microsoft.com/office/drawing/2010/main" val="0"/>
+                        </a:ext>
+                      </a:extLst>
+                    </a:blip>
+                    <a:srcRect/>
+                    <a:stretch>
+                      <a:fillRect/>
+                    </a:stretch>
+                  </pic:blipFill>
+                  <pic:spPr bwMode="auto">
+                    <a:xfrm>
+                      <a:off x="0" y="0"/>
+                      <a:ext cx="5958400" cy="3129790"/>
+                    </a:xfrm>
+                    <a:prstGeom prst="rect">
+                      <a:avLst/>
+                    </a:prstGeom>
+                    <a:noFill/>
+                  </pic:spPr>
+                </pic:pic>
+              </a:graphicData>
+            </a:graphic>
+          </wp:inline>
+        </w:drawing>
+      </w:r>
+    </w:p>
+    <w:p>
+      <w:r>
+        <w:t>OK</w:t>
+      </w:r>
+    </w:p>
+    <w:p>
+      <w:r>
+        <w:br w:type="page"/>
+      </w:r>
+    </w:p>
+    <w:p>
+      <w:r>
+        <w:lastRenderedPageBreak/>
+        <w:t>2021-09-02</w:t>
+      </w:r>
+    </w:p>
+    <w:p>
+      <w:r>
+        <w:t>Record 2638 is an outlier</w:t>
+      </w:r>
+    </w:p>
+    <w:p>
+      <w:r>
+        <w:rPr>
+          <w:noProof/>
+        </w:rPr>
+        <w:drawing>
+          <wp:inline distT="0" distB="0" distL="0" distR="0" wp14:anchorId="489FD780" wp14:editId="1484C053">
+            <wp:extent cx="5953393" cy="3127160"/>
+            <wp:effectExtent l="0" t="0" r="0" b="0"/>
+            <wp:docPr id="1275767529" name="Picture 11"/>
+            <wp:cNvGraphicFramePr>
+              <a:graphicFrameLocks xmlns:a="http://schemas.openxmlformats.org/drawingml/2006/main" noChangeAspect="1"/>
+            </wp:cNvGraphicFramePr>
+            <a:graphic xmlns:a="http://schemas.openxmlformats.org/drawingml/2006/main">
+              <a:graphicData uri="http://schemas.openxmlformats.org/drawingml/2006/picture">
+                <pic:pic xmlns:pic="http://schemas.openxmlformats.org/drawingml/2006/picture">
+                  <pic:nvPicPr>
+                    <pic:cNvPr id="0" name="Picture 12"/>
+                    <pic:cNvPicPr>
+                      <a:picLocks noChangeAspect="1" noChangeArrowheads="1"/>
+                    </pic:cNvPicPr>
+                  </pic:nvPicPr>
+                  <pic:blipFill>
+                    <a:blip r:embed="rId126" cstate="print">
+                      <a:extLst>
+                        <a:ext uri="{28A0092B-C50C-407E-A947-70E740481C1C}">
+                          <a14:useLocalDpi xmlns:a14="http://schemas.microsoft.com/office/drawing/2010/main" val="0"/>
+                        </a:ext>
+                      </a:extLst>
+                    </a:blip>
+                    <a:srcRect/>
+                    <a:stretch>
+                      <a:fillRect/>
+                    </a:stretch>
+                  </pic:blipFill>
+                  <pic:spPr bwMode="auto">
+                    <a:xfrm>
+                      <a:off x="0" y="0"/>
+                      <a:ext cx="5986578" cy="3144591"/>
+                    </a:xfrm>
+                    <a:prstGeom prst="rect">
+                      <a:avLst/>
+                    </a:prstGeom>
+                    <a:noFill/>
+                  </pic:spPr>
+                </pic:pic>
+              </a:graphicData>
+            </a:graphic>
+          </wp:inline>
+        </w:drawing>
+      </w:r>
+    </w:p>
+    <w:p>
+      <w:r>
+        <w:rPr>
+          <w:noProof/>
+        </w:rPr>
+        <w:drawing>
+          <wp:inline distT="0" distB="0" distL="0" distR="0" wp14:anchorId="1EAB0CE0" wp14:editId="2FFD4968">
+            <wp:extent cx="5940514" cy="3120395"/>
+            <wp:effectExtent l="0" t="0" r="3175" b="3810"/>
+            <wp:docPr id="1872532874" name="Picture 12"/>
+            <wp:cNvGraphicFramePr>
+              <a:graphicFrameLocks xmlns:a="http://schemas.openxmlformats.org/drawingml/2006/main" noChangeAspect="1"/>
+            </wp:cNvGraphicFramePr>
+            <a:graphic xmlns:a="http://schemas.openxmlformats.org/drawingml/2006/main">
+              <a:graphicData uri="http://schemas.openxmlformats.org/drawingml/2006/picture">
+                <pic:pic xmlns:pic="http://schemas.openxmlformats.org/drawingml/2006/picture">
+                  <pic:nvPicPr>
+                    <pic:cNvPr id="0" name="Picture 13"/>
+                    <pic:cNvPicPr>
+                      <a:picLocks noChangeAspect="1" noChangeArrowheads="1"/>
+                    </pic:cNvPicPr>
+                  </pic:nvPicPr>
+                  <pic:blipFill>
+                    <a:blip r:embed="rId127" cstate="print">
+                      <a:extLst>
+                        <a:ext uri="{28A0092B-C50C-407E-A947-70E740481C1C}">
+                          <a14:useLocalDpi xmlns:a14="http://schemas.microsoft.com/office/drawing/2010/main" val="0"/>
+                        </a:ext>
+                      </a:extLst>
+                    </a:blip>
+                    <a:srcRect/>
+                    <a:stretch>
+                      <a:fillRect/>
+                    </a:stretch>
+                  </pic:blipFill>
+                  <pic:spPr bwMode="auto">
+                    <a:xfrm>
+                      <a:off x="0" y="0"/>
+                      <a:ext cx="5960626" cy="3130959"/>
+                    </a:xfrm>
+                    <a:prstGeom prst="rect">
+                      <a:avLst/>
+                    </a:prstGeom>
+                    <a:noFill/>
+                  </pic:spPr>
+                </pic:pic>
+              </a:graphicData>
+            </a:graphic>
+          </wp:inline>
+        </w:drawing>
+      </w:r>
+    </w:p>
+    <w:p>
+      <w:r>
+        <w:t>Remove outlier row name 2638</w:t>
+      </w:r>
+    </w:p>
+    <w:p>
+      <w:r>
+        <w:br w:type="page"/>
+      </w:r>
+    </w:p>
+    <w:p>
+      <w:r>
+        <w:lastRenderedPageBreak/>
+        <w:t>2021-09-17</w:t>
+      </w:r>
+    </w:p>
+    <w:p>
+      <w:r>
+        <w:rPr>
+          <w:noProof/>
+        </w:rPr>
+        <w:drawing>
+          <wp:inline distT="0" distB="0" distL="0" distR="0" wp14:anchorId="7B83053C" wp14:editId="112A10B7">
+            <wp:extent cx="5992030" cy="3147455"/>
+            <wp:effectExtent l="0" t="0" r="8890" b="0"/>
+            <wp:docPr id="795309546" name="Picture 13"/>
+            <wp:cNvGraphicFramePr>
+              <a:graphicFrameLocks xmlns:a="http://schemas.openxmlformats.org/drawingml/2006/main" noChangeAspect="1"/>
+            </wp:cNvGraphicFramePr>
+            <a:graphic xmlns:a="http://schemas.openxmlformats.org/drawingml/2006/main">
+              <a:graphicData uri="http://schemas.openxmlformats.org/drawingml/2006/picture">
+                <pic:pic xmlns:pic="http://schemas.openxmlformats.org/drawingml/2006/picture">
+                  <pic:nvPicPr>
+                    <pic:cNvPr id="0" name="Picture 14"/>
+                    <pic:cNvPicPr>
+                      <a:picLocks noChangeAspect="1" noChangeArrowheads="1"/>
+                    </pic:cNvPicPr>
+                  </pic:nvPicPr>
+                  <pic:blipFill>
+                    <a:blip r:embed="rId128" cstate="print">
+                      <a:extLst>
+                        <a:ext uri="{28A0092B-C50C-407E-A947-70E740481C1C}">
+                          <a14:useLocalDpi xmlns:a14="http://schemas.microsoft.com/office/drawing/2010/main" val="0"/>
+                        </a:ext>
+                      </a:extLst>
+                    </a:blip>
+                    <a:srcRect/>
+                    <a:stretch>
+                      <a:fillRect/>
+                    </a:stretch>
+                  </pic:blipFill>
+                  <pic:spPr bwMode="auto">
+                    <a:xfrm>
+                      <a:off x="0" y="0"/>
+                      <a:ext cx="6016811" cy="3160472"/>
+                    </a:xfrm>
+                    <a:prstGeom prst="rect">
+                      <a:avLst/>
+                    </a:prstGeom>
+                    <a:noFill/>
+                  </pic:spPr>
+                </pic:pic>
+              </a:graphicData>
+            </a:graphic>
+          </wp:inline>
+        </w:drawing>
+      </w:r>
+    </w:p>
+    <w:p>
+      <w:r>
+        <w:rPr>
+          <w:noProof/>
+        </w:rPr>
+        <w:drawing>
+          <wp:inline distT="0" distB="0" distL="0" distR="0" wp14:anchorId="2E937A06" wp14:editId="4EB9BA38">
+            <wp:extent cx="5940514" cy="3120395"/>
+            <wp:effectExtent l="0" t="0" r="3175" b="3810"/>
+            <wp:docPr id="33162856" name="Picture 14"/>
+            <wp:cNvGraphicFramePr>
+              <a:graphicFrameLocks xmlns:a="http://schemas.openxmlformats.org/drawingml/2006/main" noChangeAspect="1"/>
+            </wp:cNvGraphicFramePr>
+            <a:graphic xmlns:a="http://schemas.openxmlformats.org/drawingml/2006/main">
+              <a:graphicData uri="http://schemas.openxmlformats.org/drawingml/2006/picture">
+                <pic:pic xmlns:pic="http://schemas.openxmlformats.org/drawingml/2006/picture">
+                  <pic:nvPicPr>
+                    <pic:cNvPr id="0" name="Picture 15"/>
+                    <pic:cNvPicPr>
+                      <a:picLocks noChangeAspect="1" noChangeArrowheads="1"/>
+                    </pic:cNvPicPr>
+                  </pic:nvPicPr>
+                  <pic:blipFill>
+                    <a:blip r:embed="rId129" cstate="print">
+                      <a:extLst>
+                        <a:ext uri="{28A0092B-C50C-407E-A947-70E740481C1C}">
+                          <a14:useLocalDpi xmlns:a14="http://schemas.microsoft.com/office/drawing/2010/main" val="0"/>
+                        </a:ext>
+                      </a:extLst>
+                    </a:blip>
+                    <a:srcRect/>
+                    <a:stretch>
+                      <a:fillRect/>
+                    </a:stretch>
+                  </pic:blipFill>
+                  <pic:spPr bwMode="auto">
+                    <a:xfrm>
+                      <a:off x="0" y="0"/>
+                      <a:ext cx="5957225" cy="3129173"/>
+                    </a:xfrm>
+                    <a:prstGeom prst="rect">
+                      <a:avLst/>
+                    </a:prstGeom>
+                    <a:noFill/>
+                  </pic:spPr>
+                </pic:pic>
+              </a:graphicData>
+            </a:graphic>
+          </wp:inline>
+        </w:drawing>
+      </w:r>
+    </w:p>
+    <w:p>
+      <w:r>
+        <w:t>Switch records  2810, 2724,  2799 and 2713</w:t>
+      </w:r>
+    </w:p>
+    <w:p>
+      <w:r>
+        <w:br w:type="page"/>
+      </w:r>
+    </w:p>
+    <w:p>
+      <w:r>
+        <w:lastRenderedPageBreak/>
+        <w:t>2021-09-29</w:t>
+      </w:r>
+    </w:p>
+    <w:p>
+      <w:r>
+        <w:t xml:space="preserve">20210929B1B2peakareas1 is missing!!!!!!!!  </w:t>
+      </w:r>
+    </w:p>
+    <w:p>
+      <w:r>
+        <w:t xml:space="preserve">20210929B1B2peakareas2 is missing!!!!!!!!  </w:t>
+      </w:r>
+    </w:p>
+    <w:p>
+      <w:r>
+        <w:rPr>
+          <w:noProof/>
+        </w:rPr>
+        <w:drawing>
+          <wp:inline distT="0" distB="0" distL="0" distR="0" wp14:anchorId="60F032B8" wp14:editId="5317C894">
+            <wp:extent cx="5953393" cy="3127160"/>
+            <wp:effectExtent l="0" t="0" r="0" b="0"/>
+            <wp:docPr id="1078102120" name="Picture 15"/>
+            <wp:cNvGraphicFramePr>
+              <a:graphicFrameLocks xmlns:a="http://schemas.openxmlformats.org/drawingml/2006/main" noChangeAspect="1"/>
+            </wp:cNvGraphicFramePr>
+            <a:graphic xmlns:a="http://schemas.openxmlformats.org/drawingml/2006/main">
+              <a:graphicData uri="http://schemas.openxmlformats.org/drawingml/2006/picture">
+                <pic:pic xmlns:pic="http://schemas.openxmlformats.org/drawingml/2006/picture">
+                  <pic:nvPicPr>
+                    <pic:cNvPr id="0" name="Picture 16"/>
+                    <pic:cNvPicPr>
+                      <a:picLocks noChangeAspect="1" noChangeArrowheads="1"/>
+                    </pic:cNvPicPr>
+                  </pic:nvPicPr>
+                  <pic:blipFill>
+                    <a:blip r:embed="rId130" cstate="print">
+                      <a:extLst>
+                        <a:ext uri="{28A0092B-C50C-407E-A947-70E740481C1C}">
+                          <a14:useLocalDpi xmlns:a14="http://schemas.microsoft.com/office/drawing/2010/main" val="0"/>
+                        </a:ext>
+                      </a:extLst>
+                    </a:blip>
+                    <a:srcRect/>
+                    <a:stretch>
+                      <a:fillRect/>
+                    </a:stretch>
+                  </pic:blipFill>
+                  <pic:spPr bwMode="auto">
+                    <a:xfrm>
+                      <a:off x="0" y="0"/>
+                      <a:ext cx="5981555" cy="3141953"/>
+                    </a:xfrm>
+                    <a:prstGeom prst="rect">
+                      <a:avLst/>
+                    </a:prstGeom>
+                    <a:noFill/>
+                  </pic:spPr>
+                </pic:pic>
+              </a:graphicData>
+            </a:graphic>
+          </wp:inline>
+        </w:drawing>
+      </w:r>
+    </w:p>
+    <w:p>
+      <w:r>
+        <w:rPr>
+          <w:noProof/>
+        </w:rPr>
+        <w:drawing>
+          <wp:inline distT="0" distB="0" distL="0" distR="0" wp14:anchorId="08A3E548" wp14:editId="01358211">
+            <wp:extent cx="5927636" cy="3113631"/>
+            <wp:effectExtent l="0" t="0" r="0" b="0"/>
+            <wp:docPr id="222819260" name="Picture 16"/>
+            <wp:cNvGraphicFramePr>
+              <a:graphicFrameLocks xmlns:a="http://schemas.openxmlformats.org/drawingml/2006/main" noChangeAspect="1"/>
+            </wp:cNvGraphicFramePr>
+            <a:graphic xmlns:a="http://schemas.openxmlformats.org/drawingml/2006/main">
+              <a:graphicData uri="http://schemas.openxmlformats.org/drawingml/2006/picture">
+                <pic:pic xmlns:pic="http://schemas.openxmlformats.org/drawingml/2006/picture">
+                  <pic:nvPicPr>
+                    <pic:cNvPr id="0" name="Picture 17"/>
+                    <pic:cNvPicPr>
+                      <a:picLocks noChangeAspect="1" noChangeArrowheads="1"/>
+                    </pic:cNvPicPr>
+                  </pic:nvPicPr>
+                  <pic:blipFill>
+                    <a:blip r:embed="rId131" cstate="print">
+                      <a:extLst>
+                        <a:ext uri="{28A0092B-C50C-407E-A947-70E740481C1C}">
+                          <a14:useLocalDpi xmlns:a14="http://schemas.microsoft.com/office/drawing/2010/main" val="0"/>
+                        </a:ext>
+                      </a:extLst>
+                    </a:blip>
+                    <a:srcRect/>
+                    <a:stretch>
+                      <a:fillRect/>
+                    </a:stretch>
+                  </pic:blipFill>
+                  <pic:spPr bwMode="auto">
+                    <a:xfrm flipV="1">
+                      <a:off x="0" y="0"/>
+                      <a:ext cx="5956956" cy="3129032"/>
+                    </a:xfrm>
+                    <a:prstGeom prst="rect">
+                      <a:avLst/>
+                    </a:prstGeom>
+                    <a:noFill/>
+                  </pic:spPr>
+                </pic:pic>
+              </a:graphicData>
+            </a:graphic>
+          </wp:inline>
+        </w:drawing>
+      </w:r>
+    </w:p>
+    <w:p>
+      <w:r>
+        <w:t xml:space="preserve">20210929B1B2peakareas1 is missing!!!!!!!!  </w:t>
+      </w:r>
+    </w:p>
+    <w:p>
+      <w:r>
+        <w:t xml:space="preserve">20210929B1B2peakareas2 is missing!!!!!!!!  </w:t>
+      </w:r>
+    </w:p>
+    <w:p>
+      <w:r>
+        <w:br w:type="page"/>
+      </w:r>
+    </w:p>
+    <w:p>
+      <w:r>
+        <w:lastRenderedPageBreak/>
+        <w:t>2021-10-27</w:t>
+      </w:r>
+    </w:p>
+    <w:p>
+      <w:r>
+        <w:rPr>
+          <w:noProof/>
+        </w:rPr>
+        <w:drawing>
+          <wp:inline distT="0" distB="0" distL="0" distR="0" wp14:anchorId="2CA78E8D" wp14:editId="2600707B">
+            <wp:extent cx="5914757" cy="3106866"/>
+            <wp:effectExtent l="0" t="0" r="0" b="0"/>
+            <wp:docPr id="2045251952" name="Picture 17"/>
+            <wp:cNvGraphicFramePr>
+              <a:graphicFrameLocks xmlns:a="http://schemas.openxmlformats.org/drawingml/2006/main" noChangeAspect="1"/>
+            </wp:cNvGraphicFramePr>
+            <a:graphic xmlns:a="http://schemas.openxmlformats.org/drawingml/2006/main">
+              <a:graphicData uri="http://schemas.openxmlformats.org/drawingml/2006/picture">
+                <pic:pic xmlns:pic="http://schemas.openxmlformats.org/drawingml/2006/picture">
+                  <pic:nvPicPr>
+                    <pic:cNvPr id="0" name="Picture 18"/>
+                    <pic:cNvPicPr>
+                      <a:picLocks noChangeAspect="1" noChangeArrowheads="1"/>
+                    </pic:cNvPicPr>
+                  </pic:nvPicPr>
+                  <pic:blipFill>
+                    <a:blip r:embed="rId132" cstate="print">
+                      <a:extLst>
+                        <a:ext uri="{28A0092B-C50C-407E-A947-70E740481C1C}">
+                          <a14:useLocalDpi xmlns:a14="http://schemas.microsoft.com/office/drawing/2010/main" val="0"/>
+                        </a:ext>
+                      </a:extLst>
+                    </a:blip>
+                    <a:srcRect/>
+                    <a:stretch>
+                      <a:fillRect/>
+                    </a:stretch>
+                  </pic:blipFill>
+                  <pic:spPr bwMode="auto">
+                    <a:xfrm>
+                      <a:off x="0" y="0"/>
+                      <a:ext cx="5940926" cy="3120612"/>
+                    </a:xfrm>
+                    <a:prstGeom prst="rect">
+                      <a:avLst/>
+                    </a:prstGeom>
+                    <a:noFill/>
+                  </pic:spPr>
+                </pic:pic>
+              </a:graphicData>
+            </a:graphic>
+          </wp:inline>
+        </w:drawing>
+      </w:r>
+    </w:p>
+    <w:p>
+      <w:r>
+        <w:rPr>
+          <w:noProof/>
+        </w:rPr>
+        <w:drawing>
+          <wp:inline distT="0" distB="0" distL="0" distR="0" wp14:anchorId="282425A3" wp14:editId="331AEBA2">
+            <wp:extent cx="5966272" cy="3133925"/>
+            <wp:effectExtent l="0" t="0" r="0" b="0"/>
+            <wp:docPr id="1484669868" name="Picture 18"/>
+            <wp:cNvGraphicFramePr>
+              <a:graphicFrameLocks xmlns:a="http://schemas.openxmlformats.org/drawingml/2006/main" noChangeAspect="1"/>
+            </wp:cNvGraphicFramePr>
+            <a:graphic xmlns:a="http://schemas.openxmlformats.org/drawingml/2006/main">
+              <a:graphicData uri="http://schemas.openxmlformats.org/drawingml/2006/picture">
+                <pic:pic xmlns:pic="http://schemas.openxmlformats.org/drawingml/2006/picture">
+                  <pic:nvPicPr>
+                    <pic:cNvPr id="0" name="Picture 19"/>
+                    <pic:cNvPicPr>
+                      <a:picLocks noChangeAspect="1" noChangeArrowheads="1"/>
+                    </pic:cNvPicPr>
+                  </pic:nvPicPr>
+                  <pic:blipFill>
+                    <a:blip r:embed="rId133" cstate="print">
+                      <a:extLst>
+                        <a:ext uri="{28A0092B-C50C-407E-A947-70E740481C1C}">
+                          <a14:useLocalDpi xmlns:a14="http://schemas.microsoft.com/office/drawing/2010/main" val="0"/>
+                        </a:ext>
+                      </a:extLst>
+                    </a:blip>
+                    <a:srcRect/>
+                    <a:stretch>
+                      <a:fillRect/>
+                    </a:stretch>
+                  </pic:blipFill>
+                  <pic:spPr bwMode="auto">
+                    <a:xfrm>
+                      <a:off x="0" y="0"/>
+                      <a:ext cx="5987925" cy="3145299"/>
+                    </a:xfrm>
+                    <a:prstGeom prst="rect">
+                      <a:avLst/>
+                    </a:prstGeom>
+                    <a:noFill/>
+                  </pic:spPr>
+                </pic:pic>
+              </a:graphicData>
+            </a:graphic>
+          </wp:inline>
+        </w:drawing>
+      </w:r>
+    </w:p>
+    <w:p>
+      <w:r>
+        <w:t>OK</w:t>
+      </w:r>
+    </w:p>
+    <w:p/>
     <w:p/>
     <w:sectPr>
       <w:pgSz w:w="12240" w:h="15840"/>

</xml_diff>

<commit_message>
working on standards for 2022
</commit_message>
<xml_diff>
--- a/StrategicTillage_GC_Analysis_workFlow.docx
+++ b/StrategicTillage_GC_Analysis_workFlow.docx
@@ -51,9 +51,11 @@
           <w:numId w:val="1"/>
         </w:numPr>
       </w:pPr>
+      <w:proofErr w:type="spellStart"/>
       <w:r>
         <w:t>GCAnalysis.R</w:t>
       </w:r>
+      <w:proofErr w:type="spellEnd"/>
     </w:p>
     <w:p>
       <w:pPr>
@@ -63,9 +65,11 @@
           <w:numId w:val="1"/>
         </w:numPr>
       </w:pPr>
+      <w:proofErr w:type="spellStart"/>
       <w:r>
         <w:t>HMR_Analysis.R</w:t>
       </w:r>
+      <w:proofErr w:type="spellEnd"/>
     </w:p>
     <w:p>
       <w:pPr>
@@ -87,9 +91,11 @@
           <w:numId w:val="1"/>
         </w:numPr>
       </w:pPr>
+      <w:proofErr w:type="spellStart"/>
       <w:r>
         <w:t>MassFluxCalculation.R</w:t>
       </w:r>
+      <w:proofErr w:type="spellEnd"/>
     </w:p>
     <w:p>
       <w:pPr>
@@ -99,9 +105,11 @@
           <w:numId w:val="1"/>
         </w:numPr>
       </w:pPr>
+      <w:proofErr w:type="spellStart"/>
       <w:r>
         <w:t>SoilGasFluxStatisticalAnalysis.R</w:t>
       </w:r>
+      <w:proofErr w:type="spellEnd"/>
     </w:p>
     <w:p>
       <w:r>
@@ -109,8 +117,29 @@
       </w:r>
     </w:p>
     <w:p>
-      <w:r>
-        <w:t xml:space="preserve">The N2O and CO2 emissions are too high.  The N2O emission measure calculated by Alli were around 10  kg-N/ha yr. </w:t>
+      <w:proofErr w:type="gramStart"/>
+      <w:r>
+        <w:t>The N2O</w:t>
+      </w:r>
+      <w:proofErr w:type="gramEnd"/>
+      <w:r>
+        <w:t xml:space="preserve"> and CO2 emissions are too high.  The N2O emission measure calculated by Alli </w:t>
+      </w:r>
+      <w:proofErr w:type="gramStart"/>
+      <w:r>
+        <w:t>were</w:t>
+      </w:r>
+      <w:proofErr w:type="gramEnd"/>
+      <w:r>
+        <w:t xml:space="preserve"> around </w:t>
+      </w:r>
+      <w:proofErr w:type="gramStart"/>
+      <w:r>
+        <w:t>10  kg</w:t>
+      </w:r>
+      <w:proofErr w:type="gramEnd"/>
+      <w:r>
+        <w:t xml:space="preserve">-N/ha yr. </w:t>
       </w:r>
     </w:p>
     <w:p>
@@ -319,7 +348,31 @@
     </w:p>
     <w:p>
       <w:r>
-        <w:t>The calibration regression for the GC based on standards seem to be irrelevant, as the important aspect affecting the emissions is not the particular concentration data point, but the slope of the consequent concentration measurement inside the chamber that result in the emission rate.</w:t>
+        <w:t xml:space="preserve">The calibration regression for the GC based on standards </w:t>
+      </w:r>
+      <w:proofErr w:type="gramStart"/>
+      <w:r>
+        <w:t>seem</w:t>
+      </w:r>
+      <w:proofErr w:type="gramEnd"/>
+      <w:r>
+        <w:t xml:space="preserve"> to be irrelevant, as the important aspect affecting the emissions is not the </w:t>
+      </w:r>
+      <w:proofErr w:type="gramStart"/>
+      <w:r>
+        <w:t>particular concentration</w:t>
+      </w:r>
+      <w:proofErr w:type="gramEnd"/>
+      <w:r>
+        <w:t xml:space="preserve"> data point, but the slope of the consequent concentration measurement inside the chamber that </w:t>
+      </w:r>
+      <w:proofErr w:type="gramStart"/>
+      <w:r>
+        <w:t>result</w:t>
+      </w:r>
+      <w:proofErr w:type="gramEnd"/>
+      <w:r>
+        <w:t xml:space="preserve"> in the emission rate.</w:t>
       </w:r>
     </w:p>
     <w:p>
@@ -785,7 +838,15 @@
     <w:p/>
     <w:p>
       <w:r>
-        <w:t>The data from the GC does not seems to indicate any mayor difference in the results. The high emissions do not seem to be the result of the GC analysis.</w:t>
+        <w:t xml:space="preserve">The data from the GC does not </w:t>
+      </w:r>
+      <w:proofErr w:type="gramStart"/>
+      <w:r>
+        <w:t>seems</w:t>
+      </w:r>
+      <w:proofErr w:type="gramEnd"/>
+      <w:r>
+        <w:t xml:space="preserve"> to indicate any mayor difference in the results. The high emissions do not seem to be the result of the GC analysis.</w:t>
       </w:r>
     </w:p>
     <w:p>
@@ -1313,7 +1374,15 @@
     <w:p/>
     <w:p>
       <w:r>
-        <w:t>Plotting the daily emissions (period emissions) against time it is clear that the main factor determining the higher emissions in blocks 1 and 2 are high N2O emission peaks. Those peaks are not present in blocks 3 and 4.</w:t>
+        <w:t xml:space="preserve">Plotting the daily emissions (period emissions) against time </w:t>
+      </w:r>
+      <w:proofErr w:type="gramStart"/>
+      <w:r>
+        <w:t>it is clear that the</w:t>
+      </w:r>
+      <w:proofErr w:type="gramEnd"/>
+      <w:r>
+        <w:t xml:space="preserve"> main factor determining the higher emissions in blocks 1 and 2 are high N2O emission peaks. Those peaks are not present in blocks 3 and 4.</w:t>
       </w:r>
     </w:p>
     <w:p/>
@@ -1547,6 +1616,7 @@
       <w:r>
         <w:t xml:space="preserve">In 2021, Sampling date </w:t>
       </w:r>
+      <w:proofErr w:type="gramStart"/>
       <w:r>
         <w:t>20210614</w:t>
       </w:r>
@@ -1554,7 +1624,11 @@
         <w:t xml:space="preserve">, </w:t>
       </w:r>
       <w:r>
-        <w:t xml:space="preserve"> and </w:t>
+        <w:t xml:space="preserve"> and</w:t>
+      </w:r>
+      <w:proofErr w:type="gramEnd"/>
+      <w:r>
+        <w:t xml:space="preserve"> </w:t>
       </w:r>
       <w:r>
         <w:t>20210629</w:t>
@@ -1563,13 +1637,29 @@
         <w:t xml:space="preserve"> </w:t>
       </w:r>
       <w:r>
-        <w:t>has problems:  The red points in the graph below all belong</w:t>
+        <w:t>has problems</w:t>
+      </w:r>
+      <w:proofErr w:type="gramStart"/>
+      <w:r>
+        <w:t>:  The</w:t>
+      </w:r>
+      <w:proofErr w:type="gramEnd"/>
+      <w:r>
+        <w:t xml:space="preserve"> red points in the graph below all </w:t>
+      </w:r>
+      <w:proofErr w:type="gramStart"/>
+      <w:r>
+        <w:t>belong</w:t>
       </w:r>
       <w:r>
         <w:t xml:space="preserve"> </w:t>
       </w:r>
       <w:r>
-        <w:t xml:space="preserve"> to sampling day </w:t>
+        <w:t xml:space="preserve"> to</w:t>
+      </w:r>
+      <w:proofErr w:type="gramEnd"/>
+      <w:r>
+        <w:t xml:space="preserve"> sampling day </w:t>
       </w:r>
       <w:r>
         <w:t>20210614</w:t>
@@ -1753,7 +1843,49 @@
         <w:rPr>
           <w:highlight w:val="yellow"/>
         </w:rPr>
-        <w:t>The final data for the mass flux calculations was taken from f0 and the missing data from “data error” from LR.f0. For N2O and CH4 all the data has to come from LR.f0.</w:t>
+        <w:t xml:space="preserve">The final data for the mass flux calculations was taken from f0 and the missing data from “data error” from </w:t>
+      </w:r>
+      <w:proofErr w:type="gramStart"/>
+      <w:r>
+        <w:rPr>
+          <w:highlight w:val="yellow"/>
+        </w:rPr>
+        <w:t>LR.f</w:t>
+      </w:r>
+      <w:proofErr w:type="gramEnd"/>
+      <w:r>
+        <w:rPr>
+          <w:highlight w:val="yellow"/>
+        </w:rPr>
+        <w:t xml:space="preserve">0. For N2O and CH4 all the data </w:t>
+      </w:r>
+      <w:proofErr w:type="gramStart"/>
+      <w:r>
+        <w:rPr>
+          <w:highlight w:val="yellow"/>
+        </w:rPr>
+        <w:t>has to</w:t>
+      </w:r>
+      <w:proofErr w:type="gramEnd"/>
+      <w:r>
+        <w:rPr>
+          <w:highlight w:val="yellow"/>
+        </w:rPr>
+        <w:t xml:space="preserve"> come from </w:t>
+      </w:r>
+      <w:proofErr w:type="gramStart"/>
+      <w:r>
+        <w:rPr>
+          <w:highlight w:val="yellow"/>
+        </w:rPr>
+        <w:t>LR.f</w:t>
+      </w:r>
+      <w:proofErr w:type="gramEnd"/>
+      <w:r>
+        <w:rPr>
+          <w:highlight w:val="yellow"/>
+        </w:rPr>
+        <w:t>0.</w:t>
       </w:r>
     </w:p>
     <w:p>
@@ -4115,6 +4247,7 @@
           <w14:ligatures w14:val="none"/>
         </w:rPr>
       </w:pPr>
+      <w:proofErr w:type="gramStart"/>
       <w:r>
         <w:rPr>
           <w:rFonts w:ascii="Lucida Console" w:eastAsia="Times New Roman" w:hAnsi="Lucida Console" w:cs="Courier New"/>
@@ -4124,7 +4257,32 @@
           <w:szCs w:val="20"/>
           <w14:ligatures w14:val="none"/>
         </w:rPr>
-        <w:t>summary(Cumm.Stat.Anal)</w:t>
+        <w:t>summary(</w:t>
+      </w:r>
+      <w:proofErr w:type="spellStart"/>
+      <w:r>
+        <w:rPr>
+          <w:rFonts w:ascii="Lucida Console" w:eastAsia="Times New Roman" w:hAnsi="Lucida Console" w:cs="Courier New"/>
+          <w:color w:val="0000FF"/>
+          <w:kern w:val="0"/>
+          <w:sz w:val="20"/>
+          <w:szCs w:val="20"/>
+          <w14:ligatures w14:val="none"/>
+        </w:rPr>
+        <w:t>Cumm.Stat.Anal</w:t>
+      </w:r>
+      <w:proofErr w:type="spellEnd"/>
+      <w:proofErr w:type="gramEnd"/>
+      <w:r>
+        <w:rPr>
+          <w:rFonts w:ascii="Lucida Console" w:eastAsia="Times New Roman" w:hAnsi="Lucida Console" w:cs="Courier New"/>
+          <w:color w:val="0000FF"/>
+          <w:kern w:val="0"/>
+          <w:sz w:val="20"/>
+          <w:szCs w:val="20"/>
+          <w14:ligatures w14:val="none"/>
+        </w:rPr>
+        <w:t>)</w:t>
       </w:r>
     </w:p>
     <w:p>
@@ -4240,6 +4398,8 @@
           <w14:ligatures w14:val="none"/>
         </w:rPr>
       </w:pPr>
+      <w:proofErr w:type="spellStart"/>
+      <w:proofErr w:type="gramStart"/>
       <w:r>
         <w:rPr>
           <w:rFonts w:ascii="Lucida Console" w:eastAsia="Times New Roman" w:hAnsi="Lucida Console" w:cs="Courier New"/>
@@ -4250,7 +4410,87 @@
           <w:bdr w:val="none" w:sz="0" w:space="0" w:color="auto" w:frame="1"/>
           <w14:ligatures w14:val="none"/>
         </w:rPr>
-        <w:t xml:space="preserve">lm(formula = Total.Cum.Emissions ~ BLOCK.F + Sampling.Year + </w:t>
+        <w:t>lm</w:t>
+      </w:r>
+      <w:proofErr w:type="spellEnd"/>
+      <w:r>
+        <w:rPr>
+          <w:rFonts w:ascii="Lucida Console" w:eastAsia="Times New Roman" w:hAnsi="Lucida Console" w:cs="Courier New"/>
+          <w:color w:val="000000"/>
+          <w:kern w:val="0"/>
+          <w:sz w:val="20"/>
+          <w:szCs w:val="20"/>
+          <w:bdr w:val="none" w:sz="0" w:space="0" w:color="auto" w:frame="1"/>
+          <w14:ligatures w14:val="none"/>
+        </w:rPr>
+        <w:t>(</w:t>
+      </w:r>
+      <w:proofErr w:type="gramEnd"/>
+      <w:r>
+        <w:rPr>
+          <w:rFonts w:ascii="Lucida Console" w:eastAsia="Times New Roman" w:hAnsi="Lucida Console" w:cs="Courier New"/>
+          <w:color w:val="000000"/>
+          <w:kern w:val="0"/>
+          <w:sz w:val="20"/>
+          <w:szCs w:val="20"/>
+          <w:bdr w:val="none" w:sz="0" w:space="0" w:color="auto" w:frame="1"/>
+          <w14:ligatures w14:val="none"/>
+        </w:rPr>
+        <w:t xml:space="preserve">formula = </w:t>
+      </w:r>
+      <w:proofErr w:type="spellStart"/>
+      <w:proofErr w:type="gramStart"/>
+      <w:r>
+        <w:rPr>
+          <w:rFonts w:ascii="Lucida Console" w:eastAsia="Times New Roman" w:hAnsi="Lucida Console" w:cs="Courier New"/>
+          <w:color w:val="000000"/>
+          <w:kern w:val="0"/>
+          <w:sz w:val="20"/>
+          <w:szCs w:val="20"/>
+          <w:bdr w:val="none" w:sz="0" w:space="0" w:color="auto" w:frame="1"/>
+          <w14:ligatures w14:val="none"/>
+        </w:rPr>
+        <w:t>Total.Cum.Emissions</w:t>
+      </w:r>
+      <w:proofErr w:type="spellEnd"/>
+      <w:proofErr w:type="gramEnd"/>
+      <w:r>
+        <w:rPr>
+          <w:rFonts w:ascii="Lucida Console" w:eastAsia="Times New Roman" w:hAnsi="Lucida Console" w:cs="Courier New"/>
+          <w:color w:val="000000"/>
+          <w:kern w:val="0"/>
+          <w:sz w:val="20"/>
+          <w:szCs w:val="20"/>
+          <w:bdr w:val="none" w:sz="0" w:space="0" w:color="auto" w:frame="1"/>
+          <w14:ligatures w14:val="none"/>
+        </w:rPr>
+        <w:t xml:space="preserve"> ~ BLOCK.F + </w:t>
+      </w:r>
+      <w:proofErr w:type="spellStart"/>
+      <w:r>
+        <w:rPr>
+          <w:rFonts w:ascii="Lucida Console" w:eastAsia="Times New Roman" w:hAnsi="Lucida Console" w:cs="Courier New"/>
+          <w:color w:val="000000"/>
+          <w:kern w:val="0"/>
+          <w:sz w:val="20"/>
+          <w:szCs w:val="20"/>
+          <w:bdr w:val="none" w:sz="0" w:space="0" w:color="auto" w:frame="1"/>
+          <w14:ligatures w14:val="none"/>
+        </w:rPr>
+        <w:t>Sampling.Year</w:t>
+      </w:r>
+      <w:proofErr w:type="spellEnd"/>
+      <w:r>
+        <w:rPr>
+          <w:rFonts w:ascii="Lucida Console" w:eastAsia="Times New Roman" w:hAnsi="Lucida Console" w:cs="Courier New"/>
+          <w:color w:val="000000"/>
+          <w:kern w:val="0"/>
+          <w:sz w:val="20"/>
+          <w:szCs w:val="20"/>
+          <w:bdr w:val="none" w:sz="0" w:space="0" w:color="auto" w:frame="1"/>
+          <w14:ligatures w14:val="none"/>
+        </w:rPr>
+        <w:t xml:space="preserve"> + </w:t>
       </w:r>
     </w:p>
     <w:p>
@@ -4296,7 +4536,85 @@
           <w:bdr w:val="none" w:sz="0" w:space="0" w:color="auto" w:frame="1"/>
           <w14:ligatures w14:val="none"/>
         </w:rPr>
-        <w:t xml:space="preserve">    CoverCrop.F + Treatment.F, data = Cumm.Emm.Analysis.2)</w:t>
+        <w:t xml:space="preserve">    </w:t>
+      </w:r>
+      <w:proofErr w:type="spellStart"/>
+      <w:r>
+        <w:rPr>
+          <w:rFonts w:ascii="Lucida Console" w:eastAsia="Times New Roman" w:hAnsi="Lucida Console" w:cs="Courier New"/>
+          <w:color w:val="000000"/>
+          <w:kern w:val="0"/>
+          <w:sz w:val="20"/>
+          <w:szCs w:val="20"/>
+          <w:bdr w:val="none" w:sz="0" w:space="0" w:color="auto" w:frame="1"/>
+          <w14:ligatures w14:val="none"/>
+        </w:rPr>
+        <w:t>CoverCrop.F</w:t>
+      </w:r>
+      <w:proofErr w:type="spellEnd"/>
+      <w:r>
+        <w:rPr>
+          <w:rFonts w:ascii="Lucida Console" w:eastAsia="Times New Roman" w:hAnsi="Lucida Console" w:cs="Courier New"/>
+          <w:color w:val="000000"/>
+          <w:kern w:val="0"/>
+          <w:sz w:val="20"/>
+          <w:szCs w:val="20"/>
+          <w:bdr w:val="none" w:sz="0" w:space="0" w:color="auto" w:frame="1"/>
+          <w14:ligatures w14:val="none"/>
+        </w:rPr>
+        <w:t xml:space="preserve"> + </w:t>
+      </w:r>
+      <w:proofErr w:type="spellStart"/>
+      <w:r>
+        <w:rPr>
+          <w:rFonts w:ascii="Lucida Console" w:eastAsia="Times New Roman" w:hAnsi="Lucida Console" w:cs="Courier New"/>
+          <w:color w:val="000000"/>
+          <w:kern w:val="0"/>
+          <w:sz w:val="20"/>
+          <w:szCs w:val="20"/>
+          <w:bdr w:val="none" w:sz="0" w:space="0" w:color="auto" w:frame="1"/>
+          <w14:ligatures w14:val="none"/>
+        </w:rPr>
+        <w:t>Treatment.F</w:t>
+      </w:r>
+      <w:proofErr w:type="spellEnd"/>
+      <w:r>
+        <w:rPr>
+          <w:rFonts w:ascii="Lucida Console" w:eastAsia="Times New Roman" w:hAnsi="Lucida Console" w:cs="Courier New"/>
+          <w:color w:val="000000"/>
+          <w:kern w:val="0"/>
+          <w:sz w:val="20"/>
+          <w:szCs w:val="20"/>
+          <w:bdr w:val="none" w:sz="0" w:space="0" w:color="auto" w:frame="1"/>
+          <w14:ligatures w14:val="none"/>
+        </w:rPr>
+        <w:t xml:space="preserve">, data = </w:t>
+      </w:r>
+      <w:proofErr w:type="gramStart"/>
+      <w:r>
+        <w:rPr>
+          <w:rFonts w:ascii="Lucida Console" w:eastAsia="Times New Roman" w:hAnsi="Lucida Console" w:cs="Courier New"/>
+          <w:color w:val="000000"/>
+          <w:kern w:val="0"/>
+          <w:sz w:val="20"/>
+          <w:szCs w:val="20"/>
+          <w:bdr w:val="none" w:sz="0" w:space="0" w:color="auto" w:frame="1"/>
+          <w14:ligatures w14:val="none"/>
+        </w:rPr>
+        <w:t>Cumm.Emm.Analysis</w:t>
+      </w:r>
+      <w:proofErr w:type="gramEnd"/>
+      <w:r>
+        <w:rPr>
+          <w:rFonts w:ascii="Lucida Console" w:eastAsia="Times New Roman" w:hAnsi="Lucida Console" w:cs="Courier New"/>
+          <w:color w:val="000000"/>
+          <w:kern w:val="0"/>
+          <w:sz w:val="20"/>
+          <w:szCs w:val="20"/>
+          <w:bdr w:val="none" w:sz="0" w:space="0" w:color="auto" w:frame="1"/>
+          <w14:ligatures w14:val="none"/>
+        </w:rPr>
+        <w:t>.2)</w:t>
       </w:r>
     </w:p>
     <w:p>
@@ -4422,7 +4740,33 @@
           <w:bdr w:val="none" w:sz="0" w:space="0" w:color="auto" w:frame="1"/>
           <w14:ligatures w14:val="none"/>
         </w:rPr>
-        <w:t xml:space="preserve">    Min      1Q  Median      3Q     Max </w:t>
+        <w:t xml:space="preserve">    Min      1</w:t>
+      </w:r>
+      <w:proofErr w:type="gramStart"/>
+      <w:r>
+        <w:rPr>
+          <w:rFonts w:ascii="Lucida Console" w:eastAsia="Times New Roman" w:hAnsi="Lucida Console" w:cs="Courier New"/>
+          <w:color w:val="000000"/>
+          <w:kern w:val="0"/>
+          <w:sz w:val="20"/>
+          <w:szCs w:val="20"/>
+          <w:bdr w:val="none" w:sz="0" w:space="0" w:color="auto" w:frame="1"/>
+          <w14:ligatures w14:val="none"/>
+        </w:rPr>
+        <w:t>Q  Median</w:t>
+      </w:r>
+      <w:proofErr w:type="gramEnd"/>
+      <w:r>
+        <w:rPr>
+          <w:rFonts w:ascii="Lucida Console" w:eastAsia="Times New Roman" w:hAnsi="Lucida Console" w:cs="Courier New"/>
+          <w:color w:val="000000"/>
+          <w:kern w:val="0"/>
+          <w:sz w:val="20"/>
+          <w:szCs w:val="20"/>
+          <w:bdr w:val="none" w:sz="0" w:space="0" w:color="auto" w:frame="1"/>
+          <w14:ligatures w14:val="none"/>
+        </w:rPr>
+        <w:t xml:space="preserve">      3Q     Max </w:t>
       </w:r>
     </w:p>
     <w:p>
@@ -4468,7 +4812,85 @@
           <w:bdr w:val="none" w:sz="0" w:space="0" w:color="auto" w:frame="1"/>
           <w14:ligatures w14:val="none"/>
         </w:rPr>
-        <w:t xml:space="preserve">-21.204  -7.452  -0.579   4.777  41.906 </w:t>
+        <w:t>-21.</w:t>
+      </w:r>
+      <w:proofErr w:type="gramStart"/>
+      <w:r>
+        <w:rPr>
+          <w:rFonts w:ascii="Lucida Console" w:eastAsia="Times New Roman" w:hAnsi="Lucida Console" w:cs="Courier New"/>
+          <w:color w:val="000000"/>
+          <w:kern w:val="0"/>
+          <w:sz w:val="20"/>
+          <w:szCs w:val="20"/>
+          <w:bdr w:val="none" w:sz="0" w:space="0" w:color="auto" w:frame="1"/>
+          <w14:ligatures w14:val="none"/>
+        </w:rPr>
+        <w:t>204  -</w:t>
+      </w:r>
+      <w:proofErr w:type="gramEnd"/>
+      <w:r>
+        <w:rPr>
+          <w:rFonts w:ascii="Lucida Console" w:eastAsia="Times New Roman" w:hAnsi="Lucida Console" w:cs="Courier New"/>
+          <w:color w:val="000000"/>
+          <w:kern w:val="0"/>
+          <w:sz w:val="20"/>
+          <w:szCs w:val="20"/>
+          <w:bdr w:val="none" w:sz="0" w:space="0" w:color="auto" w:frame="1"/>
+          <w14:ligatures w14:val="none"/>
+        </w:rPr>
+        <w:t>7.</w:t>
+      </w:r>
+      <w:proofErr w:type="gramStart"/>
+      <w:r>
+        <w:rPr>
+          <w:rFonts w:ascii="Lucida Console" w:eastAsia="Times New Roman" w:hAnsi="Lucida Console" w:cs="Courier New"/>
+          <w:color w:val="000000"/>
+          <w:kern w:val="0"/>
+          <w:sz w:val="20"/>
+          <w:szCs w:val="20"/>
+          <w:bdr w:val="none" w:sz="0" w:space="0" w:color="auto" w:frame="1"/>
+          <w14:ligatures w14:val="none"/>
+        </w:rPr>
+        <w:t>452  -</w:t>
+      </w:r>
+      <w:proofErr w:type="gramEnd"/>
+      <w:r>
+        <w:rPr>
+          <w:rFonts w:ascii="Lucida Console" w:eastAsia="Times New Roman" w:hAnsi="Lucida Console" w:cs="Courier New"/>
+          <w:color w:val="000000"/>
+          <w:kern w:val="0"/>
+          <w:sz w:val="20"/>
+          <w:szCs w:val="20"/>
+          <w:bdr w:val="none" w:sz="0" w:space="0" w:color="auto" w:frame="1"/>
+          <w14:ligatures w14:val="none"/>
+        </w:rPr>
+        <w:t xml:space="preserve">0.579   </w:t>
+      </w:r>
+      <w:proofErr w:type="gramStart"/>
+      <w:r>
+        <w:rPr>
+          <w:rFonts w:ascii="Lucida Console" w:eastAsia="Times New Roman" w:hAnsi="Lucida Console" w:cs="Courier New"/>
+          <w:color w:val="000000"/>
+          <w:kern w:val="0"/>
+          <w:sz w:val="20"/>
+          <w:szCs w:val="20"/>
+          <w:bdr w:val="none" w:sz="0" w:space="0" w:color="auto" w:frame="1"/>
+          <w14:ligatures w14:val="none"/>
+        </w:rPr>
+        <w:t>4.777  41.906</w:t>
+      </w:r>
+      <w:proofErr w:type="gramEnd"/>
+      <w:r>
+        <w:rPr>
+          <w:rFonts w:ascii="Lucida Console" w:eastAsia="Times New Roman" w:hAnsi="Lucida Console" w:cs="Courier New"/>
+          <w:color w:val="000000"/>
+          <w:kern w:val="0"/>
+          <w:sz w:val="20"/>
+          <w:szCs w:val="20"/>
+          <w:bdr w:val="none" w:sz="0" w:space="0" w:color="auto" w:frame="1"/>
+          <w14:ligatures w14:val="none"/>
+        </w:rPr>
+        <w:t xml:space="preserve"> </w:t>
       </w:r>
     </w:p>
     <w:p>
@@ -4594,7 +5016,33 @@
           <w:bdr w:val="none" w:sz="0" w:space="0" w:color="auto" w:frame="1"/>
           <w14:ligatures w14:val="none"/>
         </w:rPr>
-        <w:t xml:space="preserve">                  Estimate Std. Error t value Pr(&gt;|t|)    </w:t>
+        <w:t xml:space="preserve">                  Estimate Std. Error t value </w:t>
+      </w:r>
+      <w:proofErr w:type="spellStart"/>
+      <w:r>
+        <w:rPr>
+          <w:rFonts w:ascii="Lucida Console" w:eastAsia="Times New Roman" w:hAnsi="Lucida Console" w:cs="Courier New"/>
+          <w:color w:val="000000"/>
+          <w:kern w:val="0"/>
+          <w:sz w:val="20"/>
+          <w:szCs w:val="20"/>
+          <w:bdr w:val="none" w:sz="0" w:space="0" w:color="auto" w:frame="1"/>
+          <w14:ligatures w14:val="none"/>
+        </w:rPr>
+        <w:t>Pr</w:t>
+      </w:r>
+      <w:proofErr w:type="spellEnd"/>
+      <w:r>
+        <w:rPr>
+          <w:rFonts w:ascii="Lucida Console" w:eastAsia="Times New Roman" w:hAnsi="Lucida Console" w:cs="Courier New"/>
+          <w:color w:val="000000"/>
+          <w:kern w:val="0"/>
+          <w:sz w:val="20"/>
+          <w:szCs w:val="20"/>
+          <w:bdr w:val="none" w:sz="0" w:space="0" w:color="auto" w:frame="1"/>
+          <w14:ligatures w14:val="none"/>
+        </w:rPr>
+        <w:t xml:space="preserve">(&gt;|t|)    </w:t>
       </w:r>
     </w:p>
     <w:p>
@@ -4640,7 +5088,59 @@
           <w:bdr w:val="none" w:sz="0" w:space="0" w:color="auto" w:frame="1"/>
           <w14:ligatures w14:val="none"/>
         </w:rPr>
-        <w:t>(Intercept)        17.9614     3.9252   4.576    2e-05 ***</w:t>
+        <w:t>(</w:t>
+      </w:r>
+      <w:proofErr w:type="gramStart"/>
+      <w:r>
+        <w:rPr>
+          <w:rFonts w:ascii="Lucida Console" w:eastAsia="Times New Roman" w:hAnsi="Lucida Console" w:cs="Courier New"/>
+          <w:color w:val="000000"/>
+          <w:kern w:val="0"/>
+          <w:sz w:val="20"/>
+          <w:szCs w:val="20"/>
+          <w:bdr w:val="none" w:sz="0" w:space="0" w:color="auto" w:frame="1"/>
+          <w14:ligatures w14:val="none"/>
+        </w:rPr>
+        <w:t xml:space="preserve">Intercept)   </w:t>
+      </w:r>
+      <w:proofErr w:type="gramEnd"/>
+      <w:r>
+        <w:rPr>
+          <w:rFonts w:ascii="Lucida Console" w:eastAsia="Times New Roman" w:hAnsi="Lucida Console" w:cs="Courier New"/>
+          <w:color w:val="000000"/>
+          <w:kern w:val="0"/>
+          <w:sz w:val="20"/>
+          <w:szCs w:val="20"/>
+          <w:bdr w:val="none" w:sz="0" w:space="0" w:color="auto" w:frame="1"/>
+          <w14:ligatures w14:val="none"/>
+        </w:rPr>
+        <w:t xml:space="preserve">     17.9614     3.9252   4.576 </w:t>
+      </w:r>
+      <w:proofErr w:type="gramStart"/>
+      <w:r>
+        <w:rPr>
+          <w:rFonts w:ascii="Lucida Console" w:eastAsia="Times New Roman" w:hAnsi="Lucida Console" w:cs="Courier New"/>
+          <w:color w:val="000000"/>
+          <w:kern w:val="0"/>
+          <w:sz w:val="20"/>
+          <w:szCs w:val="20"/>
+          <w:bdr w:val="none" w:sz="0" w:space="0" w:color="auto" w:frame="1"/>
+          <w14:ligatures w14:val="none"/>
+        </w:rPr>
+        <w:t xml:space="preserve">   2e</w:t>
+      </w:r>
+      <w:proofErr w:type="gramEnd"/>
+      <w:r>
+        <w:rPr>
+          <w:rFonts w:ascii="Lucida Console" w:eastAsia="Times New Roman" w:hAnsi="Lucida Console" w:cs="Courier New"/>
+          <w:color w:val="000000"/>
+          <w:kern w:val="0"/>
+          <w:sz w:val="20"/>
+          <w:szCs w:val="20"/>
+          <w:bdr w:val="none" w:sz="0" w:space="0" w:color="auto" w:frame="1"/>
+          <w14:ligatures w14:val="none"/>
+        </w:rPr>
+        <w:t>-05 ***</w:t>
       </w:r>
     </w:p>
     <w:p>
@@ -4732,7 +5232,33 @@
           <w:bdr w:val="none" w:sz="0" w:space="0" w:color="auto" w:frame="1"/>
           <w14:ligatures w14:val="none"/>
         </w:rPr>
-        <w:t>BLOCK.F3          -14.7355     3.5916  -4.103 0.000109 ***</w:t>
+        <w:t xml:space="preserve">BLOCK.F3          -14.7355     </w:t>
+      </w:r>
+      <w:proofErr w:type="gramStart"/>
+      <w:r>
+        <w:rPr>
+          <w:rFonts w:ascii="Lucida Console" w:eastAsia="Times New Roman" w:hAnsi="Lucida Console" w:cs="Courier New"/>
+          <w:color w:val="000000"/>
+          <w:kern w:val="0"/>
+          <w:sz w:val="20"/>
+          <w:szCs w:val="20"/>
+          <w:bdr w:val="none" w:sz="0" w:space="0" w:color="auto" w:frame="1"/>
+          <w14:ligatures w14:val="none"/>
+        </w:rPr>
+        <w:t>3.5916  -</w:t>
+      </w:r>
+      <w:proofErr w:type="gramEnd"/>
+      <w:r>
+        <w:rPr>
+          <w:rFonts w:ascii="Lucida Console" w:eastAsia="Times New Roman" w:hAnsi="Lucida Console" w:cs="Courier New"/>
+          <w:color w:val="000000"/>
+          <w:kern w:val="0"/>
+          <w:sz w:val="20"/>
+          <w:szCs w:val="20"/>
+          <w:bdr w:val="none" w:sz="0" w:space="0" w:color="auto" w:frame="1"/>
+          <w14:ligatures w14:val="none"/>
+        </w:rPr>
+        <w:t>4.103 0.000109 ***</w:t>
       </w:r>
     </w:p>
     <w:p>
@@ -4778,7 +5304,33 @@
           <w:bdr w:val="none" w:sz="0" w:space="0" w:color="auto" w:frame="1"/>
           <w14:ligatures w14:val="none"/>
         </w:rPr>
-        <w:t xml:space="preserve">BLOCK.F4          -12.3094     3.5916  -3.427 0.001025 ** </w:t>
+        <w:t xml:space="preserve">BLOCK.F4          -12.3094     </w:t>
+      </w:r>
+      <w:proofErr w:type="gramStart"/>
+      <w:r>
+        <w:rPr>
+          <w:rFonts w:ascii="Lucida Console" w:eastAsia="Times New Roman" w:hAnsi="Lucida Console" w:cs="Courier New"/>
+          <w:color w:val="000000"/>
+          <w:kern w:val="0"/>
+          <w:sz w:val="20"/>
+          <w:szCs w:val="20"/>
+          <w:bdr w:val="none" w:sz="0" w:space="0" w:color="auto" w:frame="1"/>
+          <w14:ligatures w14:val="none"/>
+        </w:rPr>
+        <w:t>3.5916  -</w:t>
+      </w:r>
+      <w:proofErr w:type="gramEnd"/>
+      <w:r>
+        <w:rPr>
+          <w:rFonts w:ascii="Lucida Console" w:eastAsia="Times New Roman" w:hAnsi="Lucida Console" w:cs="Courier New"/>
+          <w:color w:val="000000"/>
+          <w:kern w:val="0"/>
+          <w:sz w:val="20"/>
+          <w:szCs w:val="20"/>
+          <w:bdr w:val="none" w:sz="0" w:space="0" w:color="auto" w:frame="1"/>
+          <w14:ligatures w14:val="none"/>
+        </w:rPr>
+        <w:t xml:space="preserve">3.427 0.001025 ** </w:t>
       </w:r>
     </w:p>
     <w:p>
@@ -4824,7 +5376,59 @@
           <w:bdr w:val="none" w:sz="0" w:space="0" w:color="auto" w:frame="1"/>
           <w14:ligatures w14:val="none"/>
         </w:rPr>
-        <w:t>Sampling.Year2022  -9.7553     2.5396  -3.841 0.000266 ***</w:t>
+        <w:t>Sampling.Year</w:t>
+      </w:r>
+      <w:proofErr w:type="gramStart"/>
+      <w:r>
+        <w:rPr>
+          <w:rFonts w:ascii="Lucida Console" w:eastAsia="Times New Roman" w:hAnsi="Lucida Console" w:cs="Courier New"/>
+          <w:color w:val="000000"/>
+          <w:kern w:val="0"/>
+          <w:sz w:val="20"/>
+          <w:szCs w:val="20"/>
+          <w:bdr w:val="none" w:sz="0" w:space="0" w:color="auto" w:frame="1"/>
+          <w14:ligatures w14:val="none"/>
+        </w:rPr>
+        <w:t>2022  -</w:t>
+      </w:r>
+      <w:proofErr w:type="gramEnd"/>
+      <w:r>
+        <w:rPr>
+          <w:rFonts w:ascii="Lucida Console" w:eastAsia="Times New Roman" w:hAnsi="Lucida Console" w:cs="Courier New"/>
+          <w:color w:val="000000"/>
+          <w:kern w:val="0"/>
+          <w:sz w:val="20"/>
+          <w:szCs w:val="20"/>
+          <w:bdr w:val="none" w:sz="0" w:space="0" w:color="auto" w:frame="1"/>
+          <w14:ligatures w14:val="none"/>
+        </w:rPr>
+        <w:t xml:space="preserve">9.7553     </w:t>
+      </w:r>
+      <w:proofErr w:type="gramStart"/>
+      <w:r>
+        <w:rPr>
+          <w:rFonts w:ascii="Lucida Console" w:eastAsia="Times New Roman" w:hAnsi="Lucida Console" w:cs="Courier New"/>
+          <w:color w:val="000000"/>
+          <w:kern w:val="0"/>
+          <w:sz w:val="20"/>
+          <w:szCs w:val="20"/>
+          <w:bdr w:val="none" w:sz="0" w:space="0" w:color="auto" w:frame="1"/>
+          <w14:ligatures w14:val="none"/>
+        </w:rPr>
+        <w:t>2.5396  -</w:t>
+      </w:r>
+      <w:proofErr w:type="gramEnd"/>
+      <w:r>
+        <w:rPr>
+          <w:rFonts w:ascii="Lucida Console" w:eastAsia="Times New Roman" w:hAnsi="Lucida Console" w:cs="Courier New"/>
+          <w:color w:val="000000"/>
+          <w:kern w:val="0"/>
+          <w:sz w:val="20"/>
+          <w:szCs w:val="20"/>
+          <w:bdr w:val="none" w:sz="0" w:space="0" w:color="auto" w:frame="1"/>
+          <w14:ligatures w14:val="none"/>
+        </w:rPr>
+        <w:t>3.841 0.000266 ***</w:t>
       </w:r>
     </w:p>
     <w:p>
@@ -4860,6 +5464,7 @@
           <w14:ligatures w14:val="none"/>
         </w:rPr>
       </w:pPr>
+      <w:proofErr w:type="spellStart"/>
       <w:r>
         <w:rPr>
           <w:rFonts w:ascii="Lucida Console" w:eastAsia="Times New Roman" w:hAnsi="Lucida Console" w:cs="Courier New"/>
@@ -4870,7 +5475,20 @@
           <w:bdr w:val="none" w:sz="0" w:space="0" w:color="auto" w:frame="1"/>
           <w14:ligatures w14:val="none"/>
         </w:rPr>
-        <w:t xml:space="preserve">CoverCrop.FClover   3.1667     3.2786   0.966 0.337437    </w:t>
+        <w:t>CoverCrop.FClover</w:t>
+      </w:r>
+      <w:proofErr w:type="spellEnd"/>
+      <w:r>
+        <w:rPr>
+          <w:rFonts w:ascii="Lucida Console" w:eastAsia="Times New Roman" w:hAnsi="Lucida Console" w:cs="Courier New"/>
+          <w:color w:val="000000"/>
+          <w:kern w:val="0"/>
+          <w:sz w:val="20"/>
+          <w:szCs w:val="20"/>
+          <w:bdr w:val="none" w:sz="0" w:space="0" w:color="auto" w:frame="1"/>
+          <w14:ligatures w14:val="none"/>
+        </w:rPr>
+        <w:t xml:space="preserve">   3.1667     3.2786   0.966 0.337437    </w:t>
       </w:r>
     </w:p>
     <w:p>
@@ -4906,6 +5524,7 @@
           <w14:ligatures w14:val="none"/>
         </w:rPr>
       </w:pPr>
+      <w:proofErr w:type="spellStart"/>
       <w:r>
         <w:rPr>
           <w:rFonts w:ascii="Lucida Console" w:eastAsia="Times New Roman" w:hAnsi="Lucida Console" w:cs="Courier New"/>
@@ -4916,7 +5535,46 @@
           <w:bdr w:val="none" w:sz="0" w:space="0" w:color="auto" w:frame="1"/>
           <w14:ligatures w14:val="none"/>
         </w:rPr>
-        <w:t xml:space="preserve">CoverCrop.FTrit    -0.4087     3.2786  -0.125 0.901165    </w:t>
+        <w:t>CoverCrop.FTrit</w:t>
+      </w:r>
+      <w:proofErr w:type="spellEnd"/>
+      <w:r>
+        <w:rPr>
+          <w:rFonts w:ascii="Lucida Console" w:eastAsia="Times New Roman" w:hAnsi="Lucida Console" w:cs="Courier New"/>
+          <w:color w:val="000000"/>
+          <w:kern w:val="0"/>
+          <w:sz w:val="20"/>
+          <w:szCs w:val="20"/>
+          <w:bdr w:val="none" w:sz="0" w:space="0" w:color="auto" w:frame="1"/>
+          <w14:ligatures w14:val="none"/>
+        </w:rPr>
+        <w:t xml:space="preserve">    -0.4087     </w:t>
+      </w:r>
+      <w:proofErr w:type="gramStart"/>
+      <w:r>
+        <w:rPr>
+          <w:rFonts w:ascii="Lucida Console" w:eastAsia="Times New Roman" w:hAnsi="Lucida Console" w:cs="Courier New"/>
+          <w:color w:val="000000"/>
+          <w:kern w:val="0"/>
+          <w:sz w:val="20"/>
+          <w:szCs w:val="20"/>
+          <w:bdr w:val="none" w:sz="0" w:space="0" w:color="auto" w:frame="1"/>
+          <w14:ligatures w14:val="none"/>
+        </w:rPr>
+        <w:t>3.2786  -</w:t>
+      </w:r>
+      <w:proofErr w:type="gramEnd"/>
+      <w:r>
+        <w:rPr>
+          <w:rFonts w:ascii="Lucida Console" w:eastAsia="Times New Roman" w:hAnsi="Lucida Console" w:cs="Courier New"/>
+          <w:color w:val="000000"/>
+          <w:kern w:val="0"/>
+          <w:sz w:val="20"/>
+          <w:szCs w:val="20"/>
+          <w:bdr w:val="none" w:sz="0" w:space="0" w:color="auto" w:frame="1"/>
+          <w14:ligatures w14:val="none"/>
+        </w:rPr>
+        <w:t xml:space="preserve">0.125 0.901165    </w:t>
       </w:r>
     </w:p>
     <w:p>
@@ -4952,6 +5610,7 @@
           <w14:ligatures w14:val="none"/>
         </w:rPr>
       </w:pPr>
+      <w:proofErr w:type="spellStart"/>
       <w:r>
         <w:rPr>
           <w:rFonts w:ascii="Lucida Console" w:eastAsia="Times New Roman" w:hAnsi="Lucida Console" w:cs="Courier New"/>
@@ -4962,7 +5621,46 @@
           <w:bdr w:val="none" w:sz="0" w:space="0" w:color="auto" w:frame="1"/>
           <w14:ligatures w14:val="none"/>
         </w:rPr>
-        <w:t xml:space="preserve">Treatment.FB        6.2892     3.2786   1.918 0.059162 .  </w:t>
+        <w:t>Treatment.FB</w:t>
+      </w:r>
+      <w:proofErr w:type="spellEnd"/>
+      <w:r>
+        <w:rPr>
+          <w:rFonts w:ascii="Lucida Console" w:eastAsia="Times New Roman" w:hAnsi="Lucida Console" w:cs="Courier New"/>
+          <w:color w:val="000000"/>
+          <w:kern w:val="0"/>
+          <w:sz w:val="20"/>
+          <w:szCs w:val="20"/>
+          <w:bdr w:val="none" w:sz="0" w:space="0" w:color="auto" w:frame="1"/>
+          <w14:ligatures w14:val="none"/>
+        </w:rPr>
+        <w:t xml:space="preserve">        6.2892     3.2786   1.918 0.</w:t>
+      </w:r>
+      <w:proofErr w:type="gramStart"/>
+      <w:r>
+        <w:rPr>
+          <w:rFonts w:ascii="Lucida Console" w:eastAsia="Times New Roman" w:hAnsi="Lucida Console" w:cs="Courier New"/>
+          <w:color w:val="000000"/>
+          <w:kern w:val="0"/>
+          <w:sz w:val="20"/>
+          <w:szCs w:val="20"/>
+          <w:bdr w:val="none" w:sz="0" w:space="0" w:color="auto" w:frame="1"/>
+          <w14:ligatures w14:val="none"/>
+        </w:rPr>
+        <w:t>059162 .</w:t>
+      </w:r>
+      <w:proofErr w:type="gramEnd"/>
+      <w:r>
+        <w:rPr>
+          <w:rFonts w:ascii="Lucida Console" w:eastAsia="Times New Roman" w:hAnsi="Lucida Console" w:cs="Courier New"/>
+          <w:color w:val="000000"/>
+          <w:kern w:val="0"/>
+          <w:sz w:val="20"/>
+          <w:szCs w:val="20"/>
+          <w:bdr w:val="none" w:sz="0" w:space="0" w:color="auto" w:frame="1"/>
+          <w14:ligatures w14:val="none"/>
+        </w:rPr>
+        <w:t xml:space="preserve">  </w:t>
       </w:r>
     </w:p>
     <w:p>
@@ -4998,6 +5696,7 @@
           <w14:ligatures w14:val="none"/>
         </w:rPr>
       </w:pPr>
+      <w:proofErr w:type="spellStart"/>
       <w:r>
         <w:rPr>
           <w:rFonts w:ascii="Lucida Console" w:eastAsia="Times New Roman" w:hAnsi="Lucida Console" w:cs="Courier New"/>
@@ -5008,7 +5707,20 @@
           <w:bdr w:val="none" w:sz="0" w:space="0" w:color="auto" w:frame="1"/>
           <w14:ligatures w14:val="none"/>
         </w:rPr>
-        <w:t xml:space="preserve">Treatment.FC        4.1102     3.2786   1.254 0.214146    </w:t>
+        <w:t>Treatment.FC</w:t>
+      </w:r>
+      <w:proofErr w:type="spellEnd"/>
+      <w:r>
+        <w:rPr>
+          <w:rFonts w:ascii="Lucida Console" w:eastAsia="Times New Roman" w:hAnsi="Lucida Console" w:cs="Courier New"/>
+          <w:color w:val="000000"/>
+          <w:kern w:val="0"/>
+          <w:sz w:val="20"/>
+          <w:szCs w:val="20"/>
+          <w:bdr w:val="none" w:sz="0" w:space="0" w:color="auto" w:frame="1"/>
+          <w14:ligatures w14:val="none"/>
+        </w:rPr>
+        <w:t xml:space="preserve">        4.1102     3.2786   1.254 0.214146    </w:t>
       </w:r>
     </w:p>
     <w:p>
@@ -5044,6 +5756,7 @@
           <w14:ligatures w14:val="none"/>
         </w:rPr>
       </w:pPr>
+      <w:proofErr w:type="spellStart"/>
       <w:r>
         <w:rPr>
           <w:rFonts w:ascii="Lucida Console" w:eastAsia="Times New Roman" w:hAnsi="Lucida Console" w:cs="Courier New"/>
@@ -5054,7 +5767,46 @@
           <w:bdr w:val="none" w:sz="0" w:space="0" w:color="auto" w:frame="1"/>
           <w14:ligatures w14:val="none"/>
         </w:rPr>
-        <w:t xml:space="preserve">Treatment.FD       -0.8080     5.0082  -0.161 0.872300    </w:t>
+        <w:t>Treatment.FD</w:t>
+      </w:r>
+      <w:proofErr w:type="spellEnd"/>
+      <w:r>
+        <w:rPr>
+          <w:rFonts w:ascii="Lucida Console" w:eastAsia="Times New Roman" w:hAnsi="Lucida Console" w:cs="Courier New"/>
+          <w:color w:val="000000"/>
+          <w:kern w:val="0"/>
+          <w:sz w:val="20"/>
+          <w:szCs w:val="20"/>
+          <w:bdr w:val="none" w:sz="0" w:space="0" w:color="auto" w:frame="1"/>
+          <w14:ligatures w14:val="none"/>
+        </w:rPr>
+        <w:t xml:space="preserve">       -0.8080     </w:t>
+      </w:r>
+      <w:proofErr w:type="gramStart"/>
+      <w:r>
+        <w:rPr>
+          <w:rFonts w:ascii="Lucida Console" w:eastAsia="Times New Roman" w:hAnsi="Lucida Console" w:cs="Courier New"/>
+          <w:color w:val="000000"/>
+          <w:kern w:val="0"/>
+          <w:sz w:val="20"/>
+          <w:szCs w:val="20"/>
+          <w:bdr w:val="none" w:sz="0" w:space="0" w:color="auto" w:frame="1"/>
+          <w14:ligatures w14:val="none"/>
+        </w:rPr>
+        <w:t>5.0082  -</w:t>
+      </w:r>
+      <w:proofErr w:type="gramEnd"/>
+      <w:r>
+        <w:rPr>
+          <w:rFonts w:ascii="Lucida Console" w:eastAsia="Times New Roman" w:hAnsi="Lucida Console" w:cs="Courier New"/>
+          <w:color w:val="000000"/>
+          <w:kern w:val="0"/>
+          <w:sz w:val="20"/>
+          <w:szCs w:val="20"/>
+          <w:bdr w:val="none" w:sz="0" w:space="0" w:color="auto" w:frame="1"/>
+          <w14:ligatures w14:val="none"/>
+        </w:rPr>
+        <w:t xml:space="preserve">0.161 0.872300    </w:t>
       </w:r>
     </w:p>
     <w:p>
@@ -5136,6 +5888,7 @@
           <w14:ligatures w14:val="none"/>
         </w:rPr>
       </w:pPr>
+      <w:proofErr w:type="spellStart"/>
       <w:r>
         <w:rPr>
           <w:rFonts w:ascii="Lucida Console" w:eastAsia="Times New Roman" w:hAnsi="Lucida Console" w:cs="Courier New"/>
@@ -5146,7 +5899,124 @@
           <w:bdr w:val="none" w:sz="0" w:space="0" w:color="auto" w:frame="1"/>
           <w14:ligatures w14:val="none"/>
         </w:rPr>
-        <w:t>Signif. codes:  0 ‘***’ 0.001 ‘**’ 0.01 ‘*’ 0.05 ‘.’ 0.1 ‘ ’ 1</w:t>
+        <w:t>Signif</w:t>
+      </w:r>
+      <w:proofErr w:type="spellEnd"/>
+      <w:r>
+        <w:rPr>
+          <w:rFonts w:ascii="Lucida Console" w:eastAsia="Times New Roman" w:hAnsi="Lucida Console" w:cs="Courier New"/>
+          <w:color w:val="000000"/>
+          <w:kern w:val="0"/>
+          <w:sz w:val="20"/>
+          <w:szCs w:val="20"/>
+          <w:bdr w:val="none" w:sz="0" w:space="0" w:color="auto" w:frame="1"/>
+          <w14:ligatures w14:val="none"/>
+        </w:rPr>
+        <w:t>. codes</w:t>
+      </w:r>
+      <w:proofErr w:type="gramStart"/>
+      <w:r>
+        <w:rPr>
+          <w:rFonts w:ascii="Lucida Console" w:eastAsia="Times New Roman" w:hAnsi="Lucida Console" w:cs="Courier New"/>
+          <w:color w:val="000000"/>
+          <w:kern w:val="0"/>
+          <w:sz w:val="20"/>
+          <w:szCs w:val="20"/>
+          <w:bdr w:val="none" w:sz="0" w:space="0" w:color="auto" w:frame="1"/>
+          <w14:ligatures w14:val="none"/>
+        </w:rPr>
+        <w:t>:  0 ‘</w:t>
+      </w:r>
+      <w:proofErr w:type="gramEnd"/>
+      <w:r>
+        <w:rPr>
+          <w:rFonts w:ascii="Lucida Console" w:eastAsia="Times New Roman" w:hAnsi="Lucida Console" w:cs="Courier New"/>
+          <w:color w:val="000000"/>
+          <w:kern w:val="0"/>
+          <w:sz w:val="20"/>
+          <w:szCs w:val="20"/>
+          <w:bdr w:val="none" w:sz="0" w:space="0" w:color="auto" w:frame="1"/>
+          <w14:ligatures w14:val="none"/>
+        </w:rPr>
+        <w:t xml:space="preserve">***’ </w:t>
+      </w:r>
+      <w:proofErr w:type="gramStart"/>
+      <w:r>
+        <w:rPr>
+          <w:rFonts w:ascii="Lucida Console" w:eastAsia="Times New Roman" w:hAnsi="Lucida Console" w:cs="Courier New"/>
+          <w:color w:val="000000"/>
+          <w:kern w:val="0"/>
+          <w:sz w:val="20"/>
+          <w:szCs w:val="20"/>
+          <w:bdr w:val="none" w:sz="0" w:space="0" w:color="auto" w:frame="1"/>
+          <w14:ligatures w14:val="none"/>
+        </w:rPr>
+        <w:t>0.001 ‘*</w:t>
+      </w:r>
+      <w:proofErr w:type="gramEnd"/>
+      <w:r>
+        <w:rPr>
+          <w:rFonts w:ascii="Lucida Console" w:eastAsia="Times New Roman" w:hAnsi="Lucida Console" w:cs="Courier New"/>
+          <w:color w:val="000000"/>
+          <w:kern w:val="0"/>
+          <w:sz w:val="20"/>
+          <w:szCs w:val="20"/>
+          <w:bdr w:val="none" w:sz="0" w:space="0" w:color="auto" w:frame="1"/>
+          <w14:ligatures w14:val="none"/>
+        </w:rPr>
+        <w:t xml:space="preserve">*’ </w:t>
+      </w:r>
+      <w:proofErr w:type="gramStart"/>
+      <w:r>
+        <w:rPr>
+          <w:rFonts w:ascii="Lucida Console" w:eastAsia="Times New Roman" w:hAnsi="Lucida Console" w:cs="Courier New"/>
+          <w:color w:val="000000"/>
+          <w:kern w:val="0"/>
+          <w:sz w:val="20"/>
+          <w:szCs w:val="20"/>
+          <w:bdr w:val="none" w:sz="0" w:space="0" w:color="auto" w:frame="1"/>
+          <w14:ligatures w14:val="none"/>
+        </w:rPr>
+        <w:t>0.01 ‘*</w:t>
+      </w:r>
+      <w:proofErr w:type="gramEnd"/>
+      <w:r>
+        <w:rPr>
+          <w:rFonts w:ascii="Lucida Console" w:eastAsia="Times New Roman" w:hAnsi="Lucida Console" w:cs="Courier New"/>
+          <w:color w:val="000000"/>
+          <w:kern w:val="0"/>
+          <w:sz w:val="20"/>
+          <w:szCs w:val="20"/>
+          <w:bdr w:val="none" w:sz="0" w:space="0" w:color="auto" w:frame="1"/>
+          <w14:ligatures w14:val="none"/>
+        </w:rPr>
+        <w:t xml:space="preserve">’ 0.05 ‘.’ 0.1 </w:t>
+      </w:r>
+      <w:proofErr w:type="gramStart"/>
+      <w:r>
+        <w:rPr>
+          <w:rFonts w:ascii="Lucida Console" w:eastAsia="Times New Roman" w:hAnsi="Lucida Console" w:cs="Courier New"/>
+          <w:color w:val="000000"/>
+          <w:kern w:val="0"/>
+          <w:sz w:val="20"/>
+          <w:szCs w:val="20"/>
+          <w:bdr w:val="none" w:sz="0" w:space="0" w:color="auto" w:frame="1"/>
+          <w14:ligatures w14:val="none"/>
+        </w:rPr>
+        <w:t>‘ ’</w:t>
+      </w:r>
+      <w:proofErr w:type="gramEnd"/>
+      <w:r>
+        <w:rPr>
+          <w:rFonts w:ascii="Lucida Console" w:eastAsia="Times New Roman" w:hAnsi="Lucida Console" w:cs="Courier New"/>
+          <w:color w:val="000000"/>
+          <w:kern w:val="0"/>
+          <w:sz w:val="20"/>
+          <w:szCs w:val="20"/>
+          <w:bdr w:val="none" w:sz="0" w:space="0" w:color="auto" w:frame="1"/>
+          <w14:ligatures w14:val="none"/>
+        </w:rPr>
+        <w:t xml:space="preserve"> 1</w:t>
       </w:r>
     </w:p>
     <w:p>
@@ -5272,8 +6142,9 @@
           <w:bdr w:val="none" w:sz="0" w:space="0" w:color="auto" w:frame="1"/>
           <w14:ligatures w14:val="none"/>
         </w:rPr>
-        <w:t>Multiple R-squared:  0.4307,</w:t>
-      </w:r>
+        <w:t>Multiple R-squared</w:t>
+      </w:r>
+      <w:proofErr w:type="gramStart"/>
       <w:r>
         <w:rPr>
           <w:rFonts w:ascii="Lucida Console" w:eastAsia="Times New Roman" w:hAnsi="Lucida Console" w:cs="Courier New"/>
@@ -5284,8 +6155,59 @@
           <w:bdr w:val="none" w:sz="0" w:space="0" w:color="auto" w:frame="1"/>
           <w14:ligatures w14:val="none"/>
         </w:rPr>
+        <w:t>:  0.4307</w:t>
+      </w:r>
+      <w:proofErr w:type="gramEnd"/>
+      <w:r>
+        <w:rPr>
+          <w:rFonts w:ascii="Lucida Console" w:eastAsia="Times New Roman" w:hAnsi="Lucida Console" w:cs="Courier New"/>
+          <w:color w:val="000000"/>
+          <w:kern w:val="0"/>
+          <w:sz w:val="20"/>
+          <w:szCs w:val="20"/>
+          <w:bdr w:val="none" w:sz="0" w:space="0" w:color="auto" w:frame="1"/>
+          <w14:ligatures w14:val="none"/>
+        </w:rPr>
+        <w:t>,</w:t>
+      </w:r>
+      <w:r>
+        <w:rPr>
+          <w:rFonts w:ascii="Lucida Console" w:eastAsia="Times New Roman" w:hAnsi="Lucida Console" w:cs="Courier New"/>
+          <w:color w:val="000000"/>
+          <w:kern w:val="0"/>
+          <w:sz w:val="20"/>
+          <w:szCs w:val="20"/>
+          <w:bdr w:val="none" w:sz="0" w:space="0" w:color="auto" w:frame="1"/>
+          <w14:ligatures w14:val="none"/>
+        </w:rPr>
         <w:tab/>
-        <w:t xml:space="preserve">Adjusted R-squared:  0.3575 </w:t>
+        <w:t>Adjusted R-squared</w:t>
+      </w:r>
+      <w:proofErr w:type="gramStart"/>
+      <w:r>
+        <w:rPr>
+          <w:rFonts w:ascii="Lucida Console" w:eastAsia="Times New Roman" w:hAnsi="Lucida Console" w:cs="Courier New"/>
+          <w:color w:val="000000"/>
+          <w:kern w:val="0"/>
+          <w:sz w:val="20"/>
+          <w:szCs w:val="20"/>
+          <w:bdr w:val="none" w:sz="0" w:space="0" w:color="auto" w:frame="1"/>
+          <w14:ligatures w14:val="none"/>
+        </w:rPr>
+        <w:t>:  0.3575</w:t>
+      </w:r>
+      <w:proofErr w:type="gramEnd"/>
+      <w:r>
+        <w:rPr>
+          <w:rFonts w:ascii="Lucida Console" w:eastAsia="Times New Roman" w:hAnsi="Lucida Console" w:cs="Courier New"/>
+          <w:color w:val="000000"/>
+          <w:kern w:val="0"/>
+          <w:sz w:val="20"/>
+          <w:szCs w:val="20"/>
+          <w:bdr w:val="none" w:sz="0" w:space="0" w:color="auto" w:frame="1"/>
+          <w14:ligatures w14:val="none"/>
+        </w:rPr>
+        <w:t xml:space="preserve"> </w:t>
       </w:r>
     </w:p>
     <w:p>
@@ -5331,7 +6253,33 @@
           <w:bdr w:val="none" w:sz="0" w:space="0" w:color="auto" w:frame="1"/>
           <w14:ligatures w14:val="none"/>
         </w:rPr>
-        <w:t>F-statistic: 5.883 on 9 and 70 DF,  p-value: 4.438e-06</w:t>
+        <w:t xml:space="preserve">F-statistic: 5.883 on 9 and 70 </w:t>
+      </w:r>
+      <w:proofErr w:type="gramStart"/>
+      <w:r>
+        <w:rPr>
+          <w:rFonts w:ascii="Lucida Console" w:eastAsia="Times New Roman" w:hAnsi="Lucida Console" w:cs="Courier New"/>
+          <w:color w:val="000000"/>
+          <w:kern w:val="0"/>
+          <w:sz w:val="20"/>
+          <w:szCs w:val="20"/>
+          <w:bdr w:val="none" w:sz="0" w:space="0" w:color="auto" w:frame="1"/>
+          <w14:ligatures w14:val="none"/>
+        </w:rPr>
+        <w:t>DF,  p</w:t>
+      </w:r>
+      <w:proofErr w:type="gramEnd"/>
+      <w:r>
+        <w:rPr>
+          <w:rFonts w:ascii="Lucida Console" w:eastAsia="Times New Roman" w:hAnsi="Lucida Console" w:cs="Courier New"/>
+          <w:color w:val="000000"/>
+          <w:kern w:val="0"/>
+          <w:sz w:val="20"/>
+          <w:szCs w:val="20"/>
+          <w:bdr w:val="none" w:sz="0" w:space="0" w:color="auto" w:frame="1"/>
+          <w14:ligatures w14:val="none"/>
+        </w:rPr>
+        <w:t>-value: 4.438e-06</w:t>
       </w:r>
     </w:p>
     <w:p>
@@ -5413,13 +6361,43 @@
           <w:color w:val="0000FF"/>
         </w:rPr>
       </w:pPr>
+      <w:proofErr w:type="spellStart"/>
+      <w:proofErr w:type="gramStart"/>
       <w:r>
         <w:rPr>
           <w:rStyle w:val="gnvwddmdb3b"/>
           <w:rFonts w:ascii="Lucida Console" w:hAnsi="Lucida Console"/>
           <w:color w:val="0000FF"/>
         </w:rPr>
-        <w:t>anova(Cumm.Stat.Anal)</w:t>
+        <w:t>anova</w:t>
+      </w:r>
+      <w:proofErr w:type="spellEnd"/>
+      <w:r>
+        <w:rPr>
+          <w:rStyle w:val="gnvwddmdb3b"/>
+          <w:rFonts w:ascii="Lucida Console" w:hAnsi="Lucida Console"/>
+          <w:color w:val="0000FF"/>
+        </w:rPr>
+        <w:t>(</w:t>
+      </w:r>
+      <w:proofErr w:type="spellStart"/>
+      <w:r>
+        <w:rPr>
+          <w:rStyle w:val="gnvwddmdb3b"/>
+          <w:rFonts w:ascii="Lucida Console" w:hAnsi="Lucida Console"/>
+          <w:color w:val="0000FF"/>
+        </w:rPr>
+        <w:t>Cumm.Stat.Anal</w:t>
+      </w:r>
+      <w:proofErr w:type="spellEnd"/>
+      <w:proofErr w:type="gramEnd"/>
+      <w:r>
+        <w:rPr>
+          <w:rStyle w:val="gnvwddmdb3b"/>
+          <w:rFonts w:ascii="Lucida Console" w:hAnsi="Lucida Console"/>
+          <w:color w:val="0000FF"/>
+        </w:rPr>
+        <w:t>)</w:t>
       </w:r>
     </w:p>
     <w:p>
@@ -5476,8 +6454,21 @@
           <w:color w:val="000000"/>
           <w:bdr w:val="none" w:sz="0" w:space="0" w:color="auto" w:frame="1"/>
         </w:rPr>
-        <w:t>Response: Total.Cum.Emissions</w:t>
-      </w:r>
+        <w:t xml:space="preserve">Response: </w:t>
+      </w:r>
+      <w:proofErr w:type="spellStart"/>
+      <w:proofErr w:type="gramStart"/>
+      <w:r>
+        <w:rPr>
+          <w:rStyle w:val="gnvwddmdl3b"/>
+          <w:rFonts w:ascii="Lucida Console" w:hAnsi="Lucida Console"/>
+          <w:color w:val="000000"/>
+          <w:bdr w:val="none" w:sz="0" w:space="0" w:color="auto" w:frame="1"/>
+        </w:rPr>
+        <w:t>Total.Cum.Emissions</w:t>
+      </w:r>
+      <w:proofErr w:type="spellEnd"/>
+      <w:proofErr w:type="gramEnd"/>
     </w:p>
     <w:p>
       <w:pPr>
@@ -5498,7 +6489,67 @@
           <w:color w:val="000000"/>
           <w:bdr w:val="none" w:sz="0" w:space="0" w:color="auto" w:frame="1"/>
         </w:rPr>
-        <w:t xml:space="preserve">              Df Sum Sq Mean Sq F value    Pr(&gt;F)    </w:t>
+        <w:t xml:space="preserve">              </w:t>
+      </w:r>
+      <w:proofErr w:type="spellStart"/>
+      <w:r>
+        <w:rPr>
+          <w:rStyle w:val="gnvwddmdl3b"/>
+          <w:rFonts w:ascii="Lucida Console" w:hAnsi="Lucida Console"/>
+          <w:color w:val="000000"/>
+          <w:bdr w:val="none" w:sz="0" w:space="0" w:color="auto" w:frame="1"/>
+        </w:rPr>
+        <w:t>Df</w:t>
+      </w:r>
+      <w:proofErr w:type="spellEnd"/>
+      <w:r>
+        <w:rPr>
+          <w:rStyle w:val="gnvwddmdl3b"/>
+          <w:rFonts w:ascii="Lucida Console" w:hAnsi="Lucida Console"/>
+          <w:color w:val="000000"/>
+          <w:bdr w:val="none" w:sz="0" w:space="0" w:color="auto" w:frame="1"/>
+        </w:rPr>
+        <w:t xml:space="preserve"> Sum Sq Mean Sq F </w:t>
+      </w:r>
+      <w:proofErr w:type="gramStart"/>
+      <w:r>
+        <w:rPr>
+          <w:rStyle w:val="gnvwddmdl3b"/>
+          <w:rFonts w:ascii="Lucida Console" w:hAnsi="Lucida Console"/>
+          <w:color w:val="000000"/>
+          <w:bdr w:val="none" w:sz="0" w:space="0" w:color="auto" w:frame="1"/>
+        </w:rPr>
+        <w:t>value</w:t>
+      </w:r>
+      <w:proofErr w:type="gramEnd"/>
+      <w:r>
+        <w:rPr>
+          <w:rStyle w:val="gnvwddmdl3b"/>
+          <w:rFonts w:ascii="Lucida Console" w:hAnsi="Lucida Console"/>
+          <w:color w:val="000000"/>
+          <w:bdr w:val="none" w:sz="0" w:space="0" w:color="auto" w:frame="1"/>
+        </w:rPr>
+        <w:t xml:space="preserve">    </w:t>
+      </w:r>
+      <w:proofErr w:type="spellStart"/>
+      <w:r>
+        <w:rPr>
+          <w:rStyle w:val="gnvwddmdl3b"/>
+          <w:rFonts w:ascii="Lucida Console" w:hAnsi="Lucida Console"/>
+          <w:color w:val="000000"/>
+          <w:bdr w:val="none" w:sz="0" w:space="0" w:color="auto" w:frame="1"/>
+        </w:rPr>
+        <w:t>Pr</w:t>
+      </w:r>
+      <w:proofErr w:type="spellEnd"/>
+      <w:r>
+        <w:rPr>
+          <w:rStyle w:val="gnvwddmdl3b"/>
+          <w:rFonts w:ascii="Lucida Console" w:hAnsi="Lucida Console"/>
+          <w:color w:val="000000"/>
+          <w:bdr w:val="none" w:sz="0" w:space="0" w:color="auto" w:frame="1"/>
+        </w:rPr>
+        <w:t xml:space="preserve">(&gt;F)    </w:t>
       </w:r>
     </w:p>
     <w:p>
@@ -5535,6 +6586,8 @@
           <w:bdr w:val="none" w:sz="0" w:space="0" w:color="auto" w:frame="1"/>
         </w:rPr>
       </w:pPr>
+      <w:proofErr w:type="spellStart"/>
+      <w:proofErr w:type="gramStart"/>
       <w:r>
         <w:rPr>
           <w:rStyle w:val="gnvwddmdl3b"/>
@@ -5542,7 +6595,27 @@
           <w:color w:val="000000"/>
           <w:bdr w:val="none" w:sz="0" w:space="0" w:color="auto" w:frame="1"/>
         </w:rPr>
-        <w:t>Sampling.Year  1 1903.3 1903.32 14.7553 0.0002661 ***</w:t>
+        <w:t>Sampling.Year</w:t>
+      </w:r>
+      <w:proofErr w:type="spellEnd"/>
+      <w:r>
+        <w:rPr>
+          <w:rStyle w:val="gnvwddmdl3b"/>
+          <w:rFonts w:ascii="Lucida Console" w:hAnsi="Lucida Console"/>
+          <w:color w:val="000000"/>
+          <w:bdr w:val="none" w:sz="0" w:space="0" w:color="auto" w:frame="1"/>
+        </w:rPr>
+        <w:t xml:space="preserve">  1</w:t>
+      </w:r>
+      <w:proofErr w:type="gramEnd"/>
+      <w:r>
+        <w:rPr>
+          <w:rStyle w:val="gnvwddmdl3b"/>
+          <w:rFonts w:ascii="Lucida Console" w:hAnsi="Lucida Console"/>
+          <w:color w:val="000000"/>
+          <w:bdr w:val="none" w:sz="0" w:space="0" w:color="auto" w:frame="1"/>
+        </w:rPr>
+        <w:t xml:space="preserve"> 1903.3 1903.32 14.7553 0.0002661 ***</w:t>
       </w:r>
     </w:p>
     <w:p>
@@ -5557,6 +6630,7 @@
           <w:bdr w:val="none" w:sz="0" w:space="0" w:color="auto" w:frame="1"/>
         </w:rPr>
       </w:pPr>
+      <w:proofErr w:type="spellStart"/>
       <w:r>
         <w:rPr>
           <w:rStyle w:val="gnvwddmdl3b"/>
@@ -5564,7 +6638,57 @@
           <w:color w:val="000000"/>
           <w:bdr w:val="none" w:sz="0" w:space="0" w:color="auto" w:frame="1"/>
         </w:rPr>
-        <w:t xml:space="preserve">CoverCrop.F    2  103.8   51.89  0.4023 0.6703176    </w:t>
+        <w:t>CoverCrop.F</w:t>
+      </w:r>
+      <w:proofErr w:type="spellEnd"/>
+      <w:r>
+        <w:rPr>
+          <w:rStyle w:val="gnvwddmdl3b"/>
+          <w:rFonts w:ascii="Lucida Console" w:hAnsi="Lucida Console"/>
+          <w:color w:val="000000"/>
+          <w:bdr w:val="none" w:sz="0" w:space="0" w:color="auto" w:frame="1"/>
+        </w:rPr>
+        <w:t xml:space="preserve">    </w:t>
+      </w:r>
+      <w:proofErr w:type="gramStart"/>
+      <w:r>
+        <w:rPr>
+          <w:rStyle w:val="gnvwddmdl3b"/>
+          <w:rFonts w:ascii="Lucida Console" w:hAnsi="Lucida Console"/>
+          <w:color w:val="000000"/>
+          <w:bdr w:val="none" w:sz="0" w:space="0" w:color="auto" w:frame="1"/>
+        </w:rPr>
+        <w:t>2  103.8</w:t>
+      </w:r>
+      <w:proofErr w:type="gramEnd"/>
+      <w:r>
+        <w:rPr>
+          <w:rStyle w:val="gnvwddmdl3b"/>
+          <w:rFonts w:ascii="Lucida Console" w:hAnsi="Lucida Console"/>
+          <w:color w:val="000000"/>
+          <w:bdr w:val="none" w:sz="0" w:space="0" w:color="auto" w:frame="1"/>
+        </w:rPr>
+        <w:t xml:space="preserve">   </w:t>
+      </w:r>
+      <w:proofErr w:type="gramStart"/>
+      <w:r>
+        <w:rPr>
+          <w:rStyle w:val="gnvwddmdl3b"/>
+          <w:rFonts w:ascii="Lucida Console" w:hAnsi="Lucida Console"/>
+          <w:color w:val="000000"/>
+          <w:bdr w:val="none" w:sz="0" w:space="0" w:color="auto" w:frame="1"/>
+        </w:rPr>
+        <w:t>51.89  0.4023</w:t>
+      </w:r>
+      <w:proofErr w:type="gramEnd"/>
+      <w:r>
+        <w:rPr>
+          <w:rStyle w:val="gnvwddmdl3b"/>
+          <w:rFonts w:ascii="Lucida Console" w:hAnsi="Lucida Console"/>
+          <w:color w:val="000000"/>
+          <w:bdr w:val="none" w:sz="0" w:space="0" w:color="auto" w:frame="1"/>
+        </w:rPr>
+        <w:t xml:space="preserve"> 0.6703176    </w:t>
       </w:r>
     </w:p>
     <w:p>
@@ -5579,6 +6703,7 @@
           <w:bdr w:val="none" w:sz="0" w:space="0" w:color="auto" w:frame="1"/>
         </w:rPr>
       </w:pPr>
+      <w:proofErr w:type="spellStart"/>
       <w:r>
         <w:rPr>
           <w:rStyle w:val="gnvwddmdl3b"/>
@@ -5586,7 +6711,57 @@
           <w:color w:val="000000"/>
           <w:bdr w:val="none" w:sz="0" w:space="0" w:color="auto" w:frame="1"/>
         </w:rPr>
-        <w:t xml:space="preserve">Treatment.F    3  599.2  199.73  1.5484 0.2096975    </w:t>
+        <w:t>Treatment.F</w:t>
+      </w:r>
+      <w:proofErr w:type="spellEnd"/>
+      <w:r>
+        <w:rPr>
+          <w:rStyle w:val="gnvwddmdl3b"/>
+          <w:rFonts w:ascii="Lucida Console" w:hAnsi="Lucida Console"/>
+          <w:color w:val="000000"/>
+          <w:bdr w:val="none" w:sz="0" w:space="0" w:color="auto" w:frame="1"/>
+        </w:rPr>
+        <w:t xml:space="preserve">    </w:t>
+      </w:r>
+      <w:proofErr w:type="gramStart"/>
+      <w:r>
+        <w:rPr>
+          <w:rStyle w:val="gnvwddmdl3b"/>
+          <w:rFonts w:ascii="Lucida Console" w:hAnsi="Lucida Console"/>
+          <w:color w:val="000000"/>
+          <w:bdr w:val="none" w:sz="0" w:space="0" w:color="auto" w:frame="1"/>
+        </w:rPr>
+        <w:t>3  599.2</w:t>
+      </w:r>
+      <w:proofErr w:type="gramEnd"/>
+      <w:r>
+        <w:rPr>
+          <w:rStyle w:val="gnvwddmdl3b"/>
+          <w:rFonts w:ascii="Lucida Console" w:hAnsi="Lucida Console"/>
+          <w:color w:val="000000"/>
+          <w:bdr w:val="none" w:sz="0" w:space="0" w:color="auto" w:frame="1"/>
+        </w:rPr>
+        <w:t xml:space="preserve">  </w:t>
+      </w:r>
+      <w:proofErr w:type="gramStart"/>
+      <w:r>
+        <w:rPr>
+          <w:rStyle w:val="gnvwddmdl3b"/>
+          <w:rFonts w:ascii="Lucida Console" w:hAnsi="Lucida Console"/>
+          <w:color w:val="000000"/>
+          <w:bdr w:val="none" w:sz="0" w:space="0" w:color="auto" w:frame="1"/>
+        </w:rPr>
+        <w:t>199.73  1.5484</w:t>
+      </w:r>
+      <w:proofErr w:type="gramEnd"/>
+      <w:r>
+        <w:rPr>
+          <w:rStyle w:val="gnvwddmdl3b"/>
+          <w:rFonts w:ascii="Lucida Console" w:hAnsi="Lucida Console"/>
+          <w:color w:val="000000"/>
+          <w:bdr w:val="none" w:sz="0" w:space="0" w:color="auto" w:frame="1"/>
+        </w:rPr>
+        <w:t xml:space="preserve"> 0.2096975    </w:t>
       </w:r>
     </w:p>
     <w:p>
@@ -5608,7 +6783,27 @@
           <w:color w:val="000000"/>
           <w:bdr w:val="none" w:sz="0" w:space="0" w:color="auto" w:frame="1"/>
         </w:rPr>
-        <w:t xml:space="preserve">Residuals     70 9029.5  128.99                      </w:t>
+        <w:t xml:space="preserve">Residuals     70 </w:t>
+      </w:r>
+      <w:proofErr w:type="gramStart"/>
+      <w:r>
+        <w:rPr>
+          <w:rStyle w:val="gnvwddmdl3b"/>
+          <w:rFonts w:ascii="Lucida Console" w:hAnsi="Lucida Console"/>
+          <w:color w:val="000000"/>
+          <w:bdr w:val="none" w:sz="0" w:space="0" w:color="auto" w:frame="1"/>
+        </w:rPr>
+        <w:t>9029.5  128.99</w:t>
+      </w:r>
+      <w:proofErr w:type="gramEnd"/>
+      <w:r>
+        <w:rPr>
+          <w:rStyle w:val="gnvwddmdl3b"/>
+          <w:rFonts w:ascii="Lucida Console" w:hAnsi="Lucida Console"/>
+          <w:color w:val="000000"/>
+          <w:bdr w:val="none" w:sz="0" w:space="0" w:color="auto" w:frame="1"/>
+        </w:rPr>
+        <w:t xml:space="preserve">                      </w:t>
       </w:r>
     </w:p>
     <w:p>
@@ -5643,6 +6838,7 @@
           <w:color w:val="000000"/>
         </w:rPr>
       </w:pPr>
+      <w:proofErr w:type="spellStart"/>
       <w:r>
         <w:rPr>
           <w:rStyle w:val="gnvwddmdl3b"/>
@@ -5650,7 +6846,97 @@
           <w:color w:val="000000"/>
           <w:bdr w:val="none" w:sz="0" w:space="0" w:color="auto" w:frame="1"/>
         </w:rPr>
-        <w:t>Signif. codes:  0 ‘***’ 0.001 ‘**’ 0.01 ‘*’ 0.05 ‘.’ 0.1 ‘ ’ 1</w:t>
+        <w:t>Signif</w:t>
+      </w:r>
+      <w:proofErr w:type="spellEnd"/>
+      <w:r>
+        <w:rPr>
+          <w:rStyle w:val="gnvwddmdl3b"/>
+          <w:rFonts w:ascii="Lucida Console" w:hAnsi="Lucida Console"/>
+          <w:color w:val="000000"/>
+          <w:bdr w:val="none" w:sz="0" w:space="0" w:color="auto" w:frame="1"/>
+        </w:rPr>
+        <w:t>. codes</w:t>
+      </w:r>
+      <w:proofErr w:type="gramStart"/>
+      <w:r>
+        <w:rPr>
+          <w:rStyle w:val="gnvwddmdl3b"/>
+          <w:rFonts w:ascii="Lucida Console" w:hAnsi="Lucida Console"/>
+          <w:color w:val="000000"/>
+          <w:bdr w:val="none" w:sz="0" w:space="0" w:color="auto" w:frame="1"/>
+        </w:rPr>
+        <w:t>:  0 ‘</w:t>
+      </w:r>
+      <w:proofErr w:type="gramEnd"/>
+      <w:r>
+        <w:rPr>
+          <w:rStyle w:val="gnvwddmdl3b"/>
+          <w:rFonts w:ascii="Lucida Console" w:hAnsi="Lucida Console"/>
+          <w:color w:val="000000"/>
+          <w:bdr w:val="none" w:sz="0" w:space="0" w:color="auto" w:frame="1"/>
+        </w:rPr>
+        <w:t xml:space="preserve">***’ </w:t>
+      </w:r>
+      <w:proofErr w:type="gramStart"/>
+      <w:r>
+        <w:rPr>
+          <w:rStyle w:val="gnvwddmdl3b"/>
+          <w:rFonts w:ascii="Lucida Console" w:hAnsi="Lucida Console"/>
+          <w:color w:val="000000"/>
+          <w:bdr w:val="none" w:sz="0" w:space="0" w:color="auto" w:frame="1"/>
+        </w:rPr>
+        <w:t>0.001 ‘*</w:t>
+      </w:r>
+      <w:proofErr w:type="gramEnd"/>
+      <w:r>
+        <w:rPr>
+          <w:rStyle w:val="gnvwddmdl3b"/>
+          <w:rFonts w:ascii="Lucida Console" w:hAnsi="Lucida Console"/>
+          <w:color w:val="000000"/>
+          <w:bdr w:val="none" w:sz="0" w:space="0" w:color="auto" w:frame="1"/>
+        </w:rPr>
+        <w:t xml:space="preserve">*’ </w:t>
+      </w:r>
+      <w:proofErr w:type="gramStart"/>
+      <w:r>
+        <w:rPr>
+          <w:rStyle w:val="gnvwddmdl3b"/>
+          <w:rFonts w:ascii="Lucida Console" w:hAnsi="Lucida Console"/>
+          <w:color w:val="000000"/>
+          <w:bdr w:val="none" w:sz="0" w:space="0" w:color="auto" w:frame="1"/>
+        </w:rPr>
+        <w:t>0.01 ‘*</w:t>
+      </w:r>
+      <w:proofErr w:type="gramEnd"/>
+      <w:r>
+        <w:rPr>
+          <w:rStyle w:val="gnvwddmdl3b"/>
+          <w:rFonts w:ascii="Lucida Console" w:hAnsi="Lucida Console"/>
+          <w:color w:val="000000"/>
+          <w:bdr w:val="none" w:sz="0" w:space="0" w:color="auto" w:frame="1"/>
+        </w:rPr>
+        <w:t xml:space="preserve">’ 0.05 ‘.’ 0.1 </w:t>
+      </w:r>
+      <w:proofErr w:type="gramStart"/>
+      <w:r>
+        <w:rPr>
+          <w:rStyle w:val="gnvwddmdl3b"/>
+          <w:rFonts w:ascii="Lucida Console" w:hAnsi="Lucida Console"/>
+          <w:color w:val="000000"/>
+          <w:bdr w:val="none" w:sz="0" w:space="0" w:color="auto" w:frame="1"/>
+        </w:rPr>
+        <w:t>‘ ’</w:t>
+      </w:r>
+      <w:proofErr w:type="gramEnd"/>
+      <w:r>
+        <w:rPr>
+          <w:rStyle w:val="gnvwddmdl3b"/>
+          <w:rFonts w:ascii="Lucida Console" w:hAnsi="Lucida Console"/>
+          <w:color w:val="000000"/>
+          <w:bdr w:val="none" w:sz="0" w:space="0" w:color="auto" w:frame="1"/>
+        </w:rPr>
+        <w:t xml:space="preserve"> 1</w:t>
       </w:r>
     </w:p>
     <w:p>
@@ -5801,8 +7087,13 @@
       </w:r>
     </w:p>
     <w:p>
-      <w:r>
-        <w:t>Daily  emission analysis</w:t>
+      <w:proofErr w:type="gramStart"/>
+      <w:r>
+        <w:t>Daily  emission</w:t>
+      </w:r>
+      <w:proofErr w:type="gramEnd"/>
+      <w:r>
+        <w:t xml:space="preserve"> analysis</w:t>
       </w:r>
     </w:p>
     <w:p>
@@ -6258,6 +7549,7 @@
                 <w14:ligatures w14:val="none"/>
               </w:rPr>
             </w:pPr>
+            <w:proofErr w:type="spellStart"/>
             <w:r>
               <w:rPr>
                 <w:rFonts w:ascii="Calibri" w:eastAsia="Times New Roman" w:hAnsi="Calibri" w:cs="Calibri"/>
@@ -6266,8 +7558,31 @@
                 <w:szCs w:val="24"/>
                 <w14:ligatures w14:val="none"/>
               </w:rPr>
-              <w:t>uL/Lgas</w:t>
+              <w:t>uL</w:t>
             </w:r>
+            <w:proofErr w:type="spellEnd"/>
+            <w:r>
+              <w:rPr>
+                <w:rFonts w:ascii="Calibri" w:eastAsia="Times New Roman" w:hAnsi="Calibri" w:cs="Calibri"/>
+                <w:kern w:val="0"/>
+                <w:sz w:val="24"/>
+                <w:szCs w:val="24"/>
+                <w14:ligatures w14:val="none"/>
+              </w:rPr>
+              <w:t>/</w:t>
+            </w:r>
+            <w:proofErr w:type="spellStart"/>
+            <w:r>
+              <w:rPr>
+                <w:rFonts w:ascii="Calibri" w:eastAsia="Times New Roman" w:hAnsi="Calibri" w:cs="Calibri"/>
+                <w:kern w:val="0"/>
+                <w:sz w:val="24"/>
+                <w:szCs w:val="24"/>
+                <w14:ligatures w14:val="none"/>
+              </w:rPr>
+              <w:t>Lgas</w:t>
+            </w:r>
+            <w:proofErr w:type="spellEnd"/>
           </w:p>
         </w:tc>
         <w:tc>
@@ -6482,6 +7797,7 @@
                 <w14:ligatures w14:val="none"/>
               </w:rPr>
             </w:pPr>
+            <w:proofErr w:type="spellStart"/>
             <w:r>
               <w:rPr>
                 <w:rFonts w:ascii="Calibri" w:eastAsia="Times New Roman" w:hAnsi="Calibri" w:cs="Calibri"/>
@@ -6490,8 +7806,31 @@
                 <w:szCs w:val="24"/>
                 <w14:ligatures w14:val="none"/>
               </w:rPr>
-              <w:t>uL/Lgas</w:t>
+              <w:t>uL</w:t>
             </w:r>
+            <w:proofErr w:type="spellEnd"/>
+            <w:r>
+              <w:rPr>
+                <w:rFonts w:ascii="Calibri" w:eastAsia="Times New Roman" w:hAnsi="Calibri" w:cs="Calibri"/>
+                <w:kern w:val="0"/>
+                <w:sz w:val="24"/>
+                <w:szCs w:val="24"/>
+                <w14:ligatures w14:val="none"/>
+              </w:rPr>
+              <w:t>/</w:t>
+            </w:r>
+            <w:proofErr w:type="spellStart"/>
+            <w:r>
+              <w:rPr>
+                <w:rFonts w:ascii="Calibri" w:eastAsia="Times New Roman" w:hAnsi="Calibri" w:cs="Calibri"/>
+                <w:kern w:val="0"/>
+                <w:sz w:val="24"/>
+                <w:szCs w:val="24"/>
+                <w14:ligatures w14:val="none"/>
+              </w:rPr>
+              <w:t>Lgas</w:t>
+            </w:r>
+            <w:proofErr w:type="spellEnd"/>
           </w:p>
         </w:tc>
         <w:tc>
@@ -6706,6 +8045,7 @@
                 <w14:ligatures w14:val="none"/>
               </w:rPr>
             </w:pPr>
+            <w:proofErr w:type="spellStart"/>
             <w:r>
               <w:rPr>
                 <w:rFonts w:ascii="Calibri" w:eastAsia="Times New Roman" w:hAnsi="Calibri" w:cs="Calibri"/>
@@ -6714,8 +8054,31 @@
                 <w:szCs w:val="24"/>
                 <w14:ligatures w14:val="none"/>
               </w:rPr>
-              <w:t>uL/Lgas</w:t>
+              <w:t>uL</w:t>
             </w:r>
+            <w:proofErr w:type="spellEnd"/>
+            <w:r>
+              <w:rPr>
+                <w:rFonts w:ascii="Calibri" w:eastAsia="Times New Roman" w:hAnsi="Calibri" w:cs="Calibri"/>
+                <w:kern w:val="0"/>
+                <w:sz w:val="24"/>
+                <w:szCs w:val="24"/>
+                <w14:ligatures w14:val="none"/>
+              </w:rPr>
+              <w:t>/</w:t>
+            </w:r>
+            <w:proofErr w:type="spellStart"/>
+            <w:r>
+              <w:rPr>
+                <w:rFonts w:ascii="Calibri" w:eastAsia="Times New Roman" w:hAnsi="Calibri" w:cs="Calibri"/>
+                <w:kern w:val="0"/>
+                <w:sz w:val="24"/>
+                <w:szCs w:val="24"/>
+                <w14:ligatures w14:val="none"/>
+              </w:rPr>
+              <w:t>Lgas</w:t>
+            </w:r>
+            <w:proofErr w:type="spellEnd"/>
           </w:p>
         </w:tc>
         <w:tc>
@@ -6930,6 +8293,7 @@
                 <w14:ligatures w14:val="none"/>
               </w:rPr>
             </w:pPr>
+            <w:proofErr w:type="spellStart"/>
             <w:r>
               <w:rPr>
                 <w:rFonts w:ascii="Calibri" w:eastAsia="Times New Roman" w:hAnsi="Calibri" w:cs="Calibri"/>
@@ -6938,8 +8302,31 @@
                 <w:szCs w:val="24"/>
                 <w14:ligatures w14:val="none"/>
               </w:rPr>
-              <w:t>uL/Lgas</w:t>
+              <w:t>uL</w:t>
             </w:r>
+            <w:proofErr w:type="spellEnd"/>
+            <w:r>
+              <w:rPr>
+                <w:rFonts w:ascii="Calibri" w:eastAsia="Times New Roman" w:hAnsi="Calibri" w:cs="Calibri"/>
+                <w:kern w:val="0"/>
+                <w:sz w:val="24"/>
+                <w:szCs w:val="24"/>
+                <w14:ligatures w14:val="none"/>
+              </w:rPr>
+              <w:t>/</w:t>
+            </w:r>
+            <w:proofErr w:type="spellStart"/>
+            <w:r>
+              <w:rPr>
+                <w:rFonts w:ascii="Calibri" w:eastAsia="Times New Roman" w:hAnsi="Calibri" w:cs="Calibri"/>
+                <w:kern w:val="0"/>
+                <w:sz w:val="24"/>
+                <w:szCs w:val="24"/>
+                <w14:ligatures w14:val="none"/>
+              </w:rPr>
+              <w:t>Lgas</w:t>
+            </w:r>
+            <w:proofErr w:type="spellEnd"/>
           </w:p>
         </w:tc>
         <w:tc>
@@ -7151,6 +8538,7 @@
                 <w14:ligatures w14:val="none"/>
               </w:rPr>
             </w:pPr>
+            <w:proofErr w:type="spellStart"/>
             <w:r>
               <w:rPr>
                 <w:rFonts w:ascii="Calibri" w:eastAsia="Times New Roman" w:hAnsi="Calibri" w:cs="Calibri"/>
@@ -7159,8 +8547,31 @@
                 <w:szCs w:val="24"/>
                 <w14:ligatures w14:val="none"/>
               </w:rPr>
-              <w:t>uL/Lgas</w:t>
+              <w:t>uL</w:t>
             </w:r>
+            <w:proofErr w:type="spellEnd"/>
+            <w:r>
+              <w:rPr>
+                <w:rFonts w:ascii="Calibri" w:eastAsia="Times New Roman" w:hAnsi="Calibri" w:cs="Calibri"/>
+                <w:kern w:val="0"/>
+                <w:sz w:val="24"/>
+                <w:szCs w:val="24"/>
+                <w14:ligatures w14:val="none"/>
+              </w:rPr>
+              <w:t>/</w:t>
+            </w:r>
+            <w:proofErr w:type="spellStart"/>
+            <w:r>
+              <w:rPr>
+                <w:rFonts w:ascii="Calibri" w:eastAsia="Times New Roman" w:hAnsi="Calibri" w:cs="Calibri"/>
+                <w:kern w:val="0"/>
+                <w:sz w:val="24"/>
+                <w:szCs w:val="24"/>
+                <w14:ligatures w14:val="none"/>
+              </w:rPr>
+              <w:t>Lgas</w:t>
+            </w:r>
+            <w:proofErr w:type="spellEnd"/>
           </w:p>
         </w:tc>
         <w:tc>
@@ -7372,6 +8783,7 @@
                 <w14:ligatures w14:val="none"/>
               </w:rPr>
             </w:pPr>
+            <w:proofErr w:type="spellStart"/>
             <w:r>
               <w:rPr>
                 <w:rFonts w:ascii="Calibri" w:eastAsia="Times New Roman" w:hAnsi="Calibri" w:cs="Calibri"/>
@@ -7380,8 +8792,31 @@
                 <w:szCs w:val="24"/>
                 <w14:ligatures w14:val="none"/>
               </w:rPr>
-              <w:t>uL/Lgas</w:t>
+              <w:t>uL</w:t>
             </w:r>
+            <w:proofErr w:type="spellEnd"/>
+            <w:r>
+              <w:rPr>
+                <w:rFonts w:ascii="Calibri" w:eastAsia="Times New Roman" w:hAnsi="Calibri" w:cs="Calibri"/>
+                <w:kern w:val="0"/>
+                <w:sz w:val="24"/>
+                <w:szCs w:val="24"/>
+                <w14:ligatures w14:val="none"/>
+              </w:rPr>
+              <w:t>/</w:t>
+            </w:r>
+            <w:proofErr w:type="spellStart"/>
+            <w:r>
+              <w:rPr>
+                <w:rFonts w:ascii="Calibri" w:eastAsia="Times New Roman" w:hAnsi="Calibri" w:cs="Calibri"/>
+                <w:kern w:val="0"/>
+                <w:sz w:val="24"/>
+                <w:szCs w:val="24"/>
+                <w14:ligatures w14:val="none"/>
+              </w:rPr>
+              <w:t>Lgas</w:t>
+            </w:r>
+            <w:proofErr w:type="spellEnd"/>
           </w:p>
         </w:tc>
         <w:tc>
@@ -7596,6 +9031,7 @@
                 <w14:ligatures w14:val="none"/>
               </w:rPr>
             </w:pPr>
+            <w:proofErr w:type="spellStart"/>
             <w:r>
               <w:rPr>
                 <w:rFonts w:ascii="Calibri" w:eastAsia="Times New Roman" w:hAnsi="Calibri" w:cs="Calibri"/>
@@ -7604,8 +9040,31 @@
                 <w:szCs w:val="24"/>
                 <w14:ligatures w14:val="none"/>
               </w:rPr>
-              <w:t>uL/Lgas</w:t>
+              <w:t>uL</w:t>
             </w:r>
+            <w:proofErr w:type="spellEnd"/>
+            <w:r>
+              <w:rPr>
+                <w:rFonts w:ascii="Calibri" w:eastAsia="Times New Roman" w:hAnsi="Calibri" w:cs="Calibri"/>
+                <w:kern w:val="0"/>
+                <w:sz w:val="24"/>
+                <w:szCs w:val="24"/>
+                <w14:ligatures w14:val="none"/>
+              </w:rPr>
+              <w:t>/</w:t>
+            </w:r>
+            <w:proofErr w:type="spellStart"/>
+            <w:r>
+              <w:rPr>
+                <w:rFonts w:ascii="Calibri" w:eastAsia="Times New Roman" w:hAnsi="Calibri" w:cs="Calibri"/>
+                <w:kern w:val="0"/>
+                <w:sz w:val="24"/>
+                <w:szCs w:val="24"/>
+                <w14:ligatures w14:val="none"/>
+              </w:rPr>
+              <w:t>Lgas</w:t>
+            </w:r>
+            <w:proofErr w:type="spellEnd"/>
           </w:p>
         </w:tc>
         <w:tc>
@@ -9088,6 +10547,7 @@
         </w:rPr>
         <w:t xml:space="preserve">The Standards Names </w:t>
       </w:r>
+      <w:proofErr w:type="spellStart"/>
       <w:r>
         <w:rPr>
           <w:b/>
@@ -9095,7 +10555,59 @@
           <w:sz w:val="40"/>
           <w:szCs w:val="40"/>
         </w:rPr>
-        <w:t xml:space="preserve">PerSTDA and PerSTD are not consistent through out 2021, therefore </w:t>
+        <w:t>PerSTDA</w:t>
+      </w:r>
+      <w:proofErr w:type="spellEnd"/>
+      <w:r>
+        <w:rPr>
+          <w:b/>
+          <w:bCs/>
+          <w:sz w:val="40"/>
+          <w:szCs w:val="40"/>
+        </w:rPr>
+        <w:t xml:space="preserve"> and </w:t>
+      </w:r>
+      <w:proofErr w:type="spellStart"/>
+      <w:r>
+        <w:rPr>
+          <w:b/>
+          <w:bCs/>
+          <w:sz w:val="40"/>
+          <w:szCs w:val="40"/>
+        </w:rPr>
+        <w:t>PerSTD</w:t>
+      </w:r>
+      <w:proofErr w:type="spellEnd"/>
+      <w:r>
+        <w:rPr>
+          <w:b/>
+          <w:bCs/>
+          <w:sz w:val="40"/>
+          <w:szCs w:val="40"/>
+        </w:rPr>
+        <w:t xml:space="preserve"> are not consistent </w:t>
+      </w:r>
+      <w:proofErr w:type="spellStart"/>
+      <w:proofErr w:type="gramStart"/>
+      <w:r>
+        <w:rPr>
+          <w:b/>
+          <w:bCs/>
+          <w:sz w:val="40"/>
+          <w:szCs w:val="40"/>
+        </w:rPr>
+        <w:t>through out</w:t>
+      </w:r>
+      <w:proofErr w:type="spellEnd"/>
+      <w:proofErr w:type="gramEnd"/>
+      <w:r>
+        <w:rPr>
+          <w:b/>
+          <w:bCs/>
+          <w:sz w:val="40"/>
+          <w:szCs w:val="40"/>
+        </w:rPr>
+        <w:t xml:space="preserve"> 2021, therefore </w:t>
       </w:r>
       <w:r>
         <w:rPr>
@@ -10083,12 +11595,21 @@
         </w:rPr>
         <w:t xml:space="preserve">Outliers </w:t>
       </w:r>
+      <w:proofErr w:type="gramStart"/>
       <w:r>
         <w:rPr>
           <w:sz w:val="24"/>
           <w:szCs w:val="24"/>
         </w:rPr>
-        <w:t>1091 , 1113</w:t>
+        <w:t>1091 ,</w:t>
+      </w:r>
+      <w:proofErr w:type="gramEnd"/>
+      <w:r>
+        <w:rPr>
+          <w:sz w:val="24"/>
+          <w:szCs w:val="24"/>
+        </w:rPr>
+        <w:t xml:space="preserve"> 1113</w:t>
       </w:r>
     </w:p>
     <w:p>
@@ -10389,8 +11910,21 @@
     </w:p>
     <w:p>
       <w:r>
-        <w:t>2021-07-07  Missing 20210702b3b407b2peakareas.pdf ????</w:t>
-      </w:r>
+        <w:t>2021-07-</w:t>
+      </w:r>
+      <w:proofErr w:type="gramStart"/>
+      <w:r>
+        <w:t>07  Missing</w:t>
+      </w:r>
+      <w:proofErr w:type="gramEnd"/>
+      <w:r>
+        <w:t xml:space="preserve"> </w:t>
+      </w:r>
+      <w:proofErr w:type="gramStart"/>
+      <w:r>
+        <w:t>20210702b3b407b2peakareas.pdf ????</w:t>
+      </w:r>
+      <w:proofErr w:type="gramEnd"/>
     </w:p>
     <w:p>
       <w:r>
@@ -10501,7 +12035,15 @@
         <w:t xml:space="preserve">Records 1424 and 1435 are </w:t>
       </w:r>
       <w:r>
-        <w:t>strange. They are from a new standard. And are strangely consistent</w:t>
+        <w:t xml:space="preserve">strange. They are </w:t>
+      </w:r>
+      <w:proofErr w:type="gramStart"/>
+      <w:r>
+        <w:t>from</w:t>
+      </w:r>
+      <w:proofErr w:type="gramEnd"/>
+      <w:r>
+        <w:t xml:space="preserve"> a new standard. And are strangely consistent</w:t>
       </w:r>
     </w:p>
     <w:p>
@@ -10624,10 +12166,26 @@
         <w:t xml:space="preserve">Records 1510, </w:t>
       </w:r>
       <w:r>
-        <w:t xml:space="preserve">1521, 1596 , 1607 </w:t>
-      </w:r>
-      <w:r>
-        <w:t>and 1435 are strange. They are from a new standard. And are strangely consistent</w:t>
+        <w:t xml:space="preserve">1521, </w:t>
+      </w:r>
+      <w:proofErr w:type="gramStart"/>
+      <w:r>
+        <w:t>1596 ,</w:t>
+      </w:r>
+      <w:proofErr w:type="gramEnd"/>
+      <w:r>
+        <w:t xml:space="preserve"> 1607 </w:t>
+      </w:r>
+      <w:r>
+        <w:t xml:space="preserve">and 1435 are strange. They are </w:t>
+      </w:r>
+      <w:proofErr w:type="gramStart"/>
+      <w:r>
+        <w:t>from</w:t>
+      </w:r>
+      <w:proofErr w:type="gramEnd"/>
+      <w:r>
+        <w:t xml:space="preserve"> a new standard. And are strangely consistent</w:t>
       </w:r>
       <w:r>
         <w:t>.</w:t>
@@ -10750,7 +12308,15 @@
     </w:p>
     <w:p>
       <w:r>
-        <w:t>1768 and 1779 seemed  switched; 50 is 100 and 100 is 50.</w:t>
+        <w:t xml:space="preserve">1768 and 1779 </w:t>
+      </w:r>
+      <w:proofErr w:type="gramStart"/>
+      <w:r>
+        <w:t>seemed  switched</w:t>
+      </w:r>
+      <w:proofErr w:type="gramEnd"/>
+      <w:r>
+        <w:t>; 50 is 100 and 100 is 50.</w:t>
       </w:r>
     </w:p>
     <w:p>
@@ -11478,7 +13044,23 @@
     </w:p>
     <w:p>
       <w:r>
-        <w:t>Switch records  2810, 2724,  2799 and 2713</w:t>
+        <w:t xml:space="preserve">Switch </w:t>
+      </w:r>
+      <w:proofErr w:type="gramStart"/>
+      <w:r>
+        <w:t>records  2810</w:t>
+      </w:r>
+      <w:proofErr w:type="gramEnd"/>
+      <w:r>
+        <w:t xml:space="preserve">, </w:t>
+      </w:r>
+      <w:proofErr w:type="gramStart"/>
+      <w:r>
+        <w:t>2724,  2799</w:t>
+      </w:r>
+      <w:proofErr w:type="gramEnd"/>
+      <w:r>
+        <w:t xml:space="preserve"> and 2713</w:t>
       </w:r>
     </w:p>
     <w:p>
@@ -11734,6 +13316,11 @@
     <w:p>
       <w:r>
         <w:t>OK</w:t>
+      </w:r>
+    </w:p>
+    <w:p>
+      <w:r>
+        <w:br w:type="page"/>
       </w:r>
     </w:p>
     <w:p/>

</xml_diff>